<commit_message>
Update 1.1.2_LyDoChonDeTai - 1.1.3_MoiLienHeMonHoc
</commit_message>
<xml_diff>
--- a/He_thong_thong_tin_giai_quyet_hanh_chinh/NGUYEN TRUONG PHI_25410281/25410281_NguyenTruongPhi.docx
+++ b/He_thong_thong_tin_giai_quyet_hanh_chinh/NGUYEN TRUONG PHI_25410281/25410281_NguyenTruongPhi.docx
@@ -79,7 +79,7 @@
           <w:szCs w:val="26"/>
         </w:rPr>
         <w:drawing>
-          <wp:inline distT="0" distB="0" distL="0" distR="0" wp14:anchorId="61AA30EF" wp14:editId="17768AC8">
+          <wp:inline distT="0" distB="0" distL="0" distR="0" wp14:anchorId="61AA30EF" wp14:editId="127C60D4">
             <wp:extent cx="1948539" cy="1606164"/>
             <wp:effectExtent l="0" t="0" r="0" b="0"/>
             <wp:docPr id="990850389" name="Picture 1"/>
@@ -1933,252 +1933,89 @@
       <w:pPr>
         <w:pStyle w:val="Heading1"/>
       </w:pPr>
-      <w:bookmarkStart w:id="2" w:name="_Toc162996926"/>
       <w:r>
         <w:lastRenderedPageBreak/>
         <w:t>TÓM TẮT</w:t>
       </w:r>
-      <w:bookmarkEnd w:id="2"/>
-    </w:p>
-    <w:p>
-      <w:pPr>
-        <w:rPr>
-          <w:rFonts w:cs="Times New Roman"/>
-          <w:szCs w:val="26"/>
-        </w:rPr>
-      </w:pPr>
-      <w:r>
-        <w:rPr>
-          <w:rFonts w:cs="Times New Roman"/>
-          <w:szCs w:val="26"/>
-        </w:rPr>
-        <w:tab/>
-      </w:r>
-      <w:r>
-        <w:rPr>
-          <w:rFonts w:cs="Times New Roman"/>
-          <w:szCs w:val="26"/>
-        </w:rPr>
-        <w:t xml:space="preserve">Trong những năm gần đây, nhu cầu thực hiện thủ tục hành chính của người dân và tổ chức ngày càng tăng. Tuy nhiên, quá trình tiếp nhận và giải quyết hồ sơ tại một số cơ quan vẫn còn gặp nhiều khó khăn như thời gian xử lý kéo dài, hồ sơ bị thiếu hoặc sai thông tin, người dân khó theo dõi tiến độ và cán bộ mất nhiều thời gian trong việc quản lý giấy tờ. Vì vậy, việc xây dựng </w:t>
-      </w:r>
-      <w:r>
-        <w:rPr>
-          <w:rFonts w:cs="Times New Roman"/>
-          <w:b/>
-          <w:bCs/>
-          <w:szCs w:val="26"/>
-        </w:rPr>
-        <w:t>Hệ thống thông tin giải quyết thủ tục hành chính</w:t>
-      </w:r>
-      <w:r>
-        <w:rPr>
-          <w:rFonts w:cs="Times New Roman"/>
-          <w:szCs w:val="26"/>
-        </w:rPr>
-        <w:t xml:space="preserve"> là cần thiết nhằm hỗ trợ đơn giản hóa quy trình, nâng cao hiệu quả xử lý hồ sơ và cải thiện chất lượng phục vụ người dân.</w:t>
-      </w:r>
     </w:p>
     <w:p>
       <w:pPr>
         <w:ind w:firstLine="720"/>
-        <w:rPr>
-          <w:rFonts w:cs="Times New Roman"/>
-          <w:szCs w:val="26"/>
-        </w:rPr>
-      </w:pPr>
-      <w:r>
-        <w:rPr>
-          <w:rFonts w:cs="Times New Roman"/>
-          <w:szCs w:val="26"/>
-        </w:rPr>
-        <w:t>Đồ án này tập trung nghiên cứu và phân tích quy trình giải quyết thủ tục hành chính, từ khi người dân tra cứu thông tin, chuẩn bị và nộp hồ sơ cho đến khi cơ quan tiếp nhận, kiểm tra, xử lý và trả kết quả. Thông qua việc tìm hiểu tài liệu, khảo sát quy trình thực tế và sử dụng mô hình BPMN để mô hình hóa quy trình, nhóm tiến hành xác định các đối tượng tham gia, các bước xử lý, thông tin cần quản lý và những vấn đề còn tồn tại trong quá trình thực hiện thủ tục hành chính.</w:t>
+      </w:pPr>
+      <w:r>
+        <w:t>Trong những năm gần đây, việc ứng dụng công nghệ thông tin và chuyển đổi số trong hoạt động hành chính nhà nước ngày càng được chú trọng. Người dân và tổ chức có nhu cầu thực hiện thủ tục hành chính nhanh chóng, thuận tiện, dễ theo dõi và hạn chế phải đi lại nhiều lần. Tuy nhiên, tại một số cơ quan, việc tiếp nhận và quản lý hồ sơ vẫn còn phụ thuộc nhiều vào giấy tờ, gây khó khăn trong việc kiểm soát tiến độ, dễ xảy ra thiếu sót thông tin và làm mất nhiều thời gian cho cả người dân lẫn cán bộ.</w:t>
       </w:r>
     </w:p>
     <w:p>
       <w:pPr>
         <w:ind w:firstLine="720"/>
-        <w:rPr>
-          <w:rFonts w:cs="Times New Roman"/>
-          <w:szCs w:val="26"/>
-        </w:rPr>
-      </w:pPr>
-      <w:r>
-        <w:rPr>
-          <w:rFonts w:cs="Times New Roman"/>
-          <w:szCs w:val="26"/>
-        </w:rPr>
-        <w:t>Kết quả nghiên cứu cho thấy hệ thống có thể hỗ trợ người dân tra cứu thủ tục, nộp hồ sơ trực tuyến, bổ sung giấy tờ, theo dõi trạng thái xử lý và nhận thông báo kết quả. Đối với cán bộ, hệ thống hỗ trợ tiếp nhận, kiểm tra, phân loại, chuyển hồ sơ đến bộ phận phụ trách, cập nhật tiến độ và trả kết quả cho người dân. Ngoài ra, hệ thống còn hỗ trợ quản lý tài khoản, lưu trữ hồ sơ, thống kê số lượng hồ sơ và lập báo cáo phục vụ công tác quản lý.</w:t>
+      </w:pPr>
+      <w:r>
+        <w:t>Xuất phát từ thực tế trên, nhóm lựa chọn thực hiện đề tài “Hệ thống thông tin giải quyết thủ tục hành chính tại phường Tân Hải”. Đề tài tập trung tìm hiểu và phân tích quy trình từ khi người dân tra cứu thủ tục, chuẩn bị và nộp hồ sơ cho đến khi cán bộ tiếp nhận, kiểm tra, chuyển xử lý, phê duyệt và trả kết quả. Nhóm sử dụng các tài liệu nghiệp vụ và tài liệu môn học để xác định các tác nhân tham gia, các bước công việc, trạng thái hồ sơ, dữ liệu cần quản lý và những trường hợp có thể phát sinh trong quá trình giải quyết thủ tục hành chính.</w:t>
       </w:r>
     </w:p>
     <w:p>
       <w:pPr>
         <w:ind w:firstLine="720"/>
-        <w:rPr>
-          <w:rFonts w:cs="Times New Roman"/>
-          <w:szCs w:val="26"/>
-        </w:rPr>
-      </w:pPr>
-      <w:r>
-        <w:rPr>
-          <w:rFonts w:cs="Times New Roman"/>
-          <w:szCs w:val="26"/>
-        </w:rPr>
-        <w:t>Thông qua đồ án, nhóm mong muốn đề xuất một hệ thống có tính ứng dụng thực tế, góp phần giảm bớt các công việc thủ công, hạn chế sai sót và rút ngắn thời gian giải quyết hồ sơ. Hệ thống không chỉ giúp nâng cao tính minh bạch trong quá trình xử lý thủ tục hành chính mà còn tạo điều kiện thuận lợi cho người dân, tổ chức và cán bộ trong quá trình sử dụng. Kết quả của đồ án cũng có thể được sử dụng làm tài liệu tham khảo cho việc nghiên cứu, xây dựng và cải tiến các hệ thống thông tin hành chính trong tương lai.</w:t>
-      </w:r>
-    </w:p>
-    <w:p>
-      <w:pPr>
-        <w:rPr>
-          <w:rFonts w:cs="Times New Roman"/>
-          <w:szCs w:val="26"/>
-        </w:rPr>
-      </w:pPr>
-    </w:p>
-    <w:p>
-      <w:pPr>
-        <w:rPr>
-          <w:rFonts w:cs="Times New Roman"/>
-          <w:szCs w:val="26"/>
-        </w:rPr>
-      </w:pPr>
-    </w:p>
-    <w:p>
-      <w:pPr>
-        <w:rPr>
-          <w:rFonts w:cs="Times New Roman"/>
-          <w:szCs w:val="26"/>
-        </w:rPr>
-      </w:pPr>
-    </w:p>
-    <w:p>
-      <w:pPr>
-        <w:rPr>
-          <w:rFonts w:cs="Times New Roman"/>
-          <w:szCs w:val="26"/>
-        </w:rPr>
-      </w:pPr>
-    </w:p>
-    <w:p>
-      <w:pPr>
-        <w:rPr>
-          <w:rFonts w:cs="Times New Roman"/>
-          <w:szCs w:val="26"/>
-        </w:rPr>
-      </w:pPr>
-    </w:p>
-    <w:p>
-      <w:pPr>
-        <w:rPr>
-          <w:rFonts w:cs="Times New Roman"/>
-          <w:szCs w:val="26"/>
-        </w:rPr>
-      </w:pPr>
+      </w:pPr>
+      <w:r>
+        <w:t>Trên cơ sở kết quả phân tích, nhóm phân loại các quy trình của hệ thống thành ba nhóm gồm quy trình quản trị, quy trình cốt lõi và quy trình hỗ trợ. Đồng thời, nhóm sử dụng ký pháp BPMN để mô hình hóa trình tự thực hiện, trách nhiệm của từng tác nhân và sự trao đổi thông tin giữa người dân, cán bộ tiếp nhận, cán bộ chuyên môn, lãnh đạo phê duyệt và các hệ thống liên quan. Các nội dung được xem xét bao gồm tiếp nhận hồ sơ, yêu cầu bổ sung, xử lý chuyên môn, phê duyệt, ký số, thanh toán trực tuyến, theo dõi trạng thái và trả kết quả.</w:t>
+      </w:r>
+    </w:p>
+    <w:p>
+      <w:pPr>
+        <w:ind w:firstLine="720"/>
+      </w:pPr>
+      <w:r>
+        <w:t xml:space="preserve">Kết quả của đồ án giúp mô tả rõ hơn cách thức tổ chức và vận hành quy trình giải quyết thủ tục hành chính trong môi trường số. Hệ thống được đề xuất có thể hỗ trợ người dân tra cứu, nộp và bổ sung hồ sơ, theo dõi tiến độ và nhận thông báo kết quả. Đối với cán bộ, hệ thống hỗ trợ tiếp nhận, kiểm tra, phân loại, chuyển hồ sơ, cập nhật trạng thái, quản lý kết quả, thống kê và lập báo cáo. Do giới hạn về thời gian và phạm vi tài liệu, đồ án chủ yếu tập trung vào phân </w:t>
+      </w:r>
+    </w:p>
+    <w:p>
+      <w:pPr>
+        <w:ind w:firstLine="720"/>
+      </w:pPr>
+      <w:r>
+        <w:t>.</w:t>
+      </w:r>
+    </w:p>
+    <w:p/>
+    <w:p>
+      <w:pPr>
+        <w:jc w:val="center"/>
+        <w:rPr>
+          <w:rFonts w:cs="Times New Roman"/>
+          <w:szCs w:val="26"/>
+        </w:rPr>
+      </w:pPr>
+    </w:p>
+    <w:p>
+      <w:pPr>
+        <w:rPr>
+          <w:rFonts w:cs="Times New Roman"/>
+          <w:szCs w:val="26"/>
+        </w:rPr>
+      </w:pPr>
+    </w:p>
+    <w:p>
+      <w:pPr>
+        <w:rPr>
+          <w:rFonts w:cs="Times New Roman"/>
+          <w:szCs w:val="26"/>
+        </w:rPr>
+      </w:pPr>
+      <w:r>
+        <w:rPr>
+          <w:rFonts w:cs="Times New Roman"/>
+          <w:szCs w:val="26"/>
+        </w:rPr>
+        <w:br w:type="page"/>
+      </w:r>
     </w:p>
     <w:p>
       <w:pPr>
         <w:pStyle w:val="Heading1"/>
       </w:pPr>
-      <w:r>
-        <w:lastRenderedPageBreak/>
-        <w:t>MỞ ĐẦU</w:t>
-      </w:r>
-    </w:p>
-    <w:p>
-      <w:pPr>
-        <w:ind w:firstLine="720"/>
-      </w:pPr>
-      <w:r>
-        <w:t>Trong quá trình thực hiện các thủ tục hành chính, người dân và tổ chức thường phải cung cấp nhiều loại giấy tờ, trải qua nhiều bước kiểm tra và chờ đợi kết quả từ cơ quan có thẩm quyền. Nếu quá trình tiếp nhận và xử lý hồ sơ chưa được quản lý hiệu quả, người dân có thể gặp khó khăn trong việc tra cứu thông tin, theo dõi tiến độ và bổ sung hồ sơ khi có yêu cầu.</w:t>
-      </w:r>
-    </w:p>
-    <w:p>
-      <w:pPr>
-        <w:ind w:firstLine="720"/>
-      </w:pPr>
-      <w:r>
-        <w:t>Bên cạnh đó, cán bộ phụ trách cũng phải thực hiện nhiều công việc như tiếp nhận, kiểm tra, phân loại, chuyển hồ sơ và cập nhật kết quả xử lý. Việc quản lý hồ sơ bằng các phương pháp thủ công có thể gây mất nhiều thời gian, khó kiểm soát tiến độ và dễ xảy ra sai sót trong quá trình thực hiện.</w:t>
-      </w:r>
-    </w:p>
-    <w:p>
-      <w:pPr>
-        <w:ind w:firstLine="720"/>
-      </w:pPr>
-      <w:r>
-        <w:t xml:space="preserve">Từ thực tế đó, nhóm lựa chọn đề tài </w:t>
-      </w:r>
-      <w:r>
-        <w:rPr>
-          <w:b/>
-          <w:bCs/>
-        </w:rPr>
-        <w:t>“Hệ thống thông tin giải quyết thủ tục hành chính”</w:t>
-      </w:r>
-      <w:r>
-        <w:t xml:space="preserve"> để nghiên cứu cách tổ chức và quản lý quy trình giải quyết hồ sơ. Đề tài hướng đến việc xây dựng mô hình thể hiện rõ các bước công việc, các đối tượng tham gia và sự trao đổi thông tin giữa người dân với cơ quan hành chính.</w:t>
-      </w:r>
-    </w:p>
-    <w:p>
-      <w:pPr>
-        <w:ind w:firstLine="720"/>
-      </w:pPr>
-      <w:r>
-        <w:t>Mục tiêu chính của đồ án là tìm hiểu quy trình giải quyết thủ tục hành chính, xác định các yêu cầu của hệ thống và mô hình hóa quy trình nghiệp vụ bằng BPMN. Trên cơ sở đó, nhóm đề xuất các chức năng phù hợp nhằm hỗ trợ việc tiếp nhận, xử lý, theo dõi và trả kết quả hồ sơ.</w:t>
-      </w:r>
-    </w:p>
-    <w:p>
-      <w:pPr>
-        <w:ind w:firstLine="720"/>
-      </w:pPr>
-      <w:r>
-        <w:t>Phạm vi của đề tài tập trung vào quá trình giải quyết một hồ sơ hành chính, bắt đầu từ khi người dân tra cứu và nộp hồ sơ cho đến khi nhận được kết quả. Trong quá trình thực hiện, nhóm sử dụng các phương pháp như nghiên cứu tài liệu, khảo sát quy trình, phân tích yêu cầu và mô hình hóa nghiệp vụ.</w:t>
-      </w:r>
-    </w:p>
-    <w:p>
-      <w:pPr>
-        <w:ind w:firstLine="720"/>
-      </w:pPr>
-      <w:r>
-        <w:t>.</w:t>
-      </w:r>
-    </w:p>
-    <w:p/>
-    <w:p>
-      <w:pPr>
-        <w:jc w:val="center"/>
-        <w:rPr>
-          <w:rFonts w:cs="Times New Roman"/>
-          <w:szCs w:val="26"/>
-        </w:rPr>
-      </w:pPr>
-    </w:p>
-    <w:p>
-      <w:pPr>
-        <w:rPr>
-          <w:rFonts w:cs="Times New Roman"/>
-          <w:szCs w:val="26"/>
-        </w:rPr>
-      </w:pPr>
-    </w:p>
-    <w:p>
-      <w:pPr>
-        <w:rPr>
-          <w:rFonts w:cs="Times New Roman"/>
-          <w:szCs w:val="26"/>
-        </w:rPr>
-      </w:pPr>
-      <w:r>
-        <w:rPr>
-          <w:rFonts w:cs="Times New Roman"/>
-          <w:szCs w:val="26"/>
-        </w:rPr>
-        <w:br w:type="page"/>
-      </w:r>
-    </w:p>
-    <w:p>
-      <w:pPr>
-        <w:pStyle w:val="Heading1"/>
-      </w:pPr>
-      <w:bookmarkStart w:id="3" w:name="_Toc162996927"/>
+      <w:bookmarkStart w:id="2" w:name="_Toc162996927"/>
       <w:r>
         <w:lastRenderedPageBreak/>
         <w:t xml:space="preserve">Chương I. </w:t>
@@ -2189,39 +2026,154 @@
       <w:r>
         <w:t>.</w:t>
       </w:r>
+      <w:bookmarkEnd w:id="2"/>
+    </w:p>
+    <w:p>
+      <w:pPr>
+        <w:pStyle w:val="Heading2"/>
+      </w:pPr>
+      <w:bookmarkStart w:id="3" w:name="_Toc162996928"/>
+      <w:r>
+        <w:t xml:space="preserve">1. </w:t>
+      </w:r>
+      <w:r>
+        <w:t>Giới thiệu</w:t>
+      </w:r>
+      <w:r>
+        <w:t xml:space="preserve"> đề tài</w:t>
+      </w:r>
+      <w:r>
+        <w:t>.</w:t>
+      </w:r>
       <w:bookmarkEnd w:id="3"/>
     </w:p>
     <w:p>
       <w:pPr>
+        <w:pStyle w:val="Heading3"/>
+      </w:pPr>
+      <w:bookmarkStart w:id="4" w:name="_Toc162996929"/>
+      <w:r>
+        <w:t xml:space="preserve">1.1. </w:t>
+      </w:r>
+      <w:r>
+        <w:t>Tổng quan về Hệ thống thông tin giải quyết thủ tục hành chính tại phường Tân Hải</w:t>
+      </w:r>
+      <w:r>
+        <w:t>.</w:t>
+      </w:r>
+      <w:bookmarkEnd w:id="4"/>
+    </w:p>
+    <w:p>
+      <w:pPr>
+        <w:pStyle w:val="Heading4"/>
+      </w:pPr>
+      <w:r>
+        <w:t>1.1.1. Nội dung chính của đề tài</w:t>
+      </w:r>
+    </w:p>
+    <w:p>
+      <w:pPr>
+        <w:pStyle w:val="Heading4"/>
+      </w:pPr>
+      <w:r>
+        <w:t>1.1.2. Lý do lựa chọn đề tài</w:t>
+      </w:r>
+    </w:p>
+    <w:p>
+      <w:pPr>
+        <w:ind w:firstLine="720"/>
+      </w:pPr>
+      <w:r>
+        <w:t>Thủ tục hành chính là hoạt động diễn ra thường xuyên và có liên quan trực tiếp đến người dân, tổ chức và cơ quan nhà nước. Trong quá trình thực hiện thủ tục, người dân thường phải chuẩn bị nhiều loại giấy tờ và trải qua nhiều bước kiểm tra trước khi nhận được kết quả.</w:t>
+      </w:r>
+    </w:p>
+    <w:p>
+      <w:pPr>
+        <w:ind w:firstLine="720"/>
+      </w:pPr>
+      <w:r>
+        <w:t>Nếu hồ sơ bị thiếu hoặc có thông tin chưa chính xác, người dân có thể phải bổ sung và chỉnh sửa nhiều lần. Bên cạnh đó, nếu chưa có công cụ quản lý phù hợp, người dân sẽ khó theo dõi hồ sơ đang được xử lý ở bước nào, do bộ phận nào phụ trách và khi nào có thể nhận kết quả.</w:t>
+      </w:r>
+    </w:p>
+    <w:p>
+      <w:pPr>
+        <w:ind w:firstLine="720"/>
+      </w:pPr>
+      <w:r>
+        <w:t>Đối với cán bộ, việc tiếp nhận và xử lý hồ sơ cũng bao gồm nhiều công việc như kiểm tra thành phần hồ sơ, xác định tính hợp lệ, phân loại, chuyển bộ phận chuyên môn, cập nhật trạng thái và lưu trữ kết quả. Việc thực hiện các công việc này bằng phương pháp thủ công có thể làm mất nhiều thời gian, khó kiểm soát tiến độ và dễ xảy ra sai sót.</w:t>
+      </w:r>
+    </w:p>
+    <w:p>
+      <w:pPr>
+        <w:ind w:firstLine="720"/>
+      </w:pPr>
+      <w:r>
+        <w:t>Trong bối cảnh chuyển đổi số hiện nay, việc xây dựng hệ thống thông tin hỗ trợ giải quyết thủ tục hành chính là cần thiết. Chuyển đổi số không chỉ là chuyển hồ sơ giấy sang hồ sơ điện tử mà còn bao gồm việc chuẩn hóa quy trình, giảm nhập lại thông tin, tăng khả năng theo dõi và hỗ trợ trao đổi dữ liệu giữa các bộ phận.</w:t>
+      </w:r>
+    </w:p>
+    <w:p>
+      <w:pPr>
+        <w:ind w:firstLine="720"/>
+      </w:pPr>
+      <w:r>
+        <w:t>Từ những lý do trên, nhóm lựa chọn đề tài này vì có tính thực tế, gần gũi với đời sống và phù hợp với nội dung môn học. Thông qua đề tài, nhóm có thể tìm hiểu rõ hơn cách tổ chức một quy trình hành chính và cách ứng dụng công nghệ thông tin để hỗ trợ hoạt động quản lý.</w:t>
+      </w:r>
+    </w:p>
+    <w:p>
+      <w:pPr>
+        <w:pStyle w:val="Heading4"/>
+      </w:pPr>
+      <w:r>
+        <w:t>1.1.3. Mối liên hệ với môn học</w:t>
+      </w:r>
+    </w:p>
+    <w:p>
+      <w:pPr>
+        <w:ind w:firstLine="720"/>
+      </w:pPr>
+      <w:r>
+        <w:t>Đề tài có mối liên hệ trực tiếp với môn Hệ thống quản trị quy trình nghiệp vụ. Trong quá trình thực hiện, nhóm áp dụng kiến thức về nhận diện, phân tích, phân loại và mô hình hóa quy trình nghiệp vụ.</w:t>
+      </w:r>
+    </w:p>
+    <w:p>
+      <w:pPr>
+        <w:ind w:firstLine="720"/>
+      </w:pPr>
+      <w:r>
+        <w:t xml:space="preserve">Trước hết, nhóm xác định các hoạt động, sự kiện, tác nhân, dữ liệu đầu vào, dữ liệu đầu ra và các điểm ra quyết định trong quá trình giải quyết hồ sơ. Các quy trình </w:t>
+      </w:r>
+      <w:r>
+        <w:lastRenderedPageBreak/>
+        <w:t>của hệ thống được phân thành ba nhóm gồm quy trình quản trị, quy trình cốt lõi và quy trình hỗ trợ.</w:t>
+      </w:r>
+    </w:p>
+    <w:p>
+      <w:pPr>
+        <w:ind w:firstLine="720"/>
+      </w:pPr>
+      <w:r>
+        <w:t>Quy trình cốt lõi bao gồm tiếp nhận hồ sơ, kiểm tra và xử lý hồ sơ, phê duyệt và ban hành kết quả, trả kết quả cho người dân. Quy trình quản trị bao gồm quản lý quy trình, giám sát tiến độ, quản trị hệ thống và báo cáo thống kê. Quy trình hỗ trợ bao gồm thanh toán trực tuyến, quản lý tài liệu điện tử, hỗ trợ người dùng và tiếp nhận phản ánh kiến nghị.</w:t>
+      </w:r>
+    </w:p>
+    <w:p>
+      <w:pPr>
+        <w:pStyle w:val="Heading3"/>
+      </w:pPr>
+      <w:bookmarkStart w:id="5" w:name="_Toc162996930"/>
+      <w:r>
+        <w:t>1.2. Tiểu mục khác.</w:t>
+      </w:r>
+      <w:bookmarkEnd w:id="5"/>
+    </w:p>
+    <w:p>
+      <w:pPr>
         <w:pStyle w:val="Heading2"/>
       </w:pPr>
-      <w:bookmarkStart w:id="4" w:name="_Toc162996928"/>
-      <w:r>
-        <w:t xml:space="preserve">1. </w:t>
-      </w:r>
-      <w:r>
-        <w:t>Giới thiệu</w:t>
-      </w:r>
-      <w:r>
-        <w:t xml:space="preserve"> đề tài</w:t>
-      </w:r>
-      <w:r>
-        <w:t>.</w:t>
-      </w:r>
-      <w:bookmarkEnd w:id="4"/>
-    </w:p>
-    <w:p>
-      <w:pPr>
-        <w:pStyle w:val="Heading3"/>
-      </w:pPr>
-      <w:bookmarkStart w:id="5" w:name="_Toc162996929"/>
-      <w:r>
-        <w:t>1.1. Tiểu mục</w:t>
-      </w:r>
-      <w:r>
-        <w:t xml:space="preserve"> nếu cần thiết.</w:t>
-      </w:r>
-      <w:bookmarkEnd w:id="5"/>
+      <w:bookmarkStart w:id="6" w:name="_Toc162996931"/>
+      <w:r>
+        <w:t>2. Cơ sở lý thuyết.</w:t>
+      </w:r>
+      <w:bookmarkEnd w:id="6"/>
     </w:p>
     <w:p>
       <w:pPr>
@@ -2237,162 +2189,101 @@
           <w:rFonts w:cs="Times New Roman"/>
           <w:szCs w:val="26"/>
         </w:rPr>
-        <w:t>Các nội dung</w:t>
-      </w:r>
-      <w:r>
-        <w:rPr>
-          <w:rFonts w:cs="Times New Roman"/>
-          <w:szCs w:val="26"/>
-        </w:rPr>
-        <w:t xml:space="preserve"> trong mục này nên trả lời được cho các câu hỏi:</w:t>
-      </w:r>
-    </w:p>
-    <w:p>
-      <w:pPr>
-        <w:pStyle w:val="ListParagraph"/>
-        <w:numPr>
-          <w:ilvl w:val="0"/>
-          <w:numId w:val="3"/>
-        </w:numPr>
-        <w:rPr>
-          <w:rFonts w:cs="Times New Roman"/>
-          <w:szCs w:val="26"/>
-        </w:rPr>
-      </w:pPr>
-      <w:r>
-        <w:rPr>
-          <w:rFonts w:cs="Times New Roman"/>
-          <w:szCs w:val="26"/>
-        </w:rPr>
-        <w:t>Nội dung chính của đề tài đồ án là gì?</w:t>
-      </w:r>
-    </w:p>
-    <w:p>
-      <w:pPr>
-        <w:pStyle w:val="ListParagraph"/>
-        <w:numPr>
-          <w:ilvl w:val="0"/>
-          <w:numId w:val="3"/>
-        </w:numPr>
-        <w:rPr>
-          <w:rFonts w:cs="Times New Roman"/>
-          <w:szCs w:val="26"/>
-        </w:rPr>
-      </w:pPr>
-      <w:r>
-        <w:rPr>
-          <w:rFonts w:cs="Times New Roman"/>
-          <w:szCs w:val="26"/>
-        </w:rPr>
-        <w:t xml:space="preserve">Lý do </w:t>
-      </w:r>
-      <w:r>
-        <w:rPr>
-          <w:rFonts w:cs="Times New Roman"/>
-          <w:szCs w:val="26"/>
-        </w:rPr>
-        <w:t>nhóm chọn thực hiện đề tài là gì?</w:t>
-      </w:r>
-    </w:p>
-    <w:p>
-      <w:pPr>
-        <w:pStyle w:val="ListParagraph"/>
-        <w:numPr>
-          <w:ilvl w:val="0"/>
-          <w:numId w:val="3"/>
-        </w:numPr>
-        <w:rPr>
-          <w:rFonts w:cs="Times New Roman"/>
-          <w:szCs w:val="26"/>
-        </w:rPr>
-      </w:pPr>
-      <w:r>
-        <w:rPr>
-          <w:rFonts w:cs="Times New Roman"/>
-          <w:szCs w:val="26"/>
-        </w:rPr>
-        <w:t>Đề tài có liên quan đến nội dung môn học như thế nào?</w:t>
-      </w:r>
-    </w:p>
-    <w:p>
-      <w:pPr>
-        <w:pStyle w:val="Heading3"/>
-      </w:pPr>
-      <w:bookmarkStart w:id="6" w:name="_Toc162996930"/>
-      <w:r>
-        <w:t>1.2. Tiểu mục khác.</w:t>
-      </w:r>
-      <w:bookmarkEnd w:id="6"/>
+        <w:t>Các công nghệ</w:t>
+      </w:r>
+      <w:r>
+        <w:rPr>
+          <w:rFonts w:cs="Times New Roman"/>
+          <w:szCs w:val="26"/>
+        </w:rPr>
+        <w:t>, công cụ</w:t>
+      </w:r>
+      <w:r>
+        <w:rPr>
+          <w:rFonts w:cs="Times New Roman"/>
+          <w:szCs w:val="26"/>
+        </w:rPr>
+        <w:t xml:space="preserve"> hoặc kỹ thuật</w:t>
+      </w:r>
+      <w:r>
+        <w:rPr>
+          <w:rFonts w:cs="Times New Roman"/>
+          <w:szCs w:val="26"/>
+        </w:rPr>
+        <w:t xml:space="preserve"> mà nhóm sử dụng trong đồ án là gì?</w:t>
+      </w:r>
+      <w:r>
+        <w:rPr>
+          <w:rFonts w:cs="Times New Roman"/>
+          <w:szCs w:val="26"/>
+        </w:rPr>
+        <w:t xml:space="preserve"> Nên giải thích khái niệm, trình bày lý thuyết </w:t>
+      </w:r>
+      <w:r>
+        <w:rPr>
+          <w:rFonts w:cs="Times New Roman"/>
+          <w:szCs w:val="26"/>
+        </w:rPr>
+        <w:t>về chúng trong từng tiểu mục riêng</w:t>
+      </w:r>
+      <w:r>
+        <w:rPr>
+          <w:rFonts w:cs="Times New Roman"/>
+          <w:szCs w:val="26"/>
+        </w:rPr>
+        <w:t>.</w:t>
+      </w:r>
+    </w:p>
+    <w:p>
+      <w:pPr>
+        <w:rPr>
+          <w:rFonts w:cs="Times New Roman"/>
+          <w:szCs w:val="26"/>
+        </w:rPr>
+      </w:pPr>
+      <w:r>
+        <w:rPr>
+          <w:rFonts w:cs="Times New Roman"/>
+          <w:szCs w:val="26"/>
+        </w:rPr>
+        <w:br w:type="page"/>
+      </w:r>
+    </w:p>
+    <w:p>
+      <w:pPr>
+        <w:pStyle w:val="Heading1"/>
+      </w:pPr>
+      <w:bookmarkStart w:id="7" w:name="_Toc162996932"/>
+      <w:r>
+        <w:lastRenderedPageBreak/>
+        <w:t>Chương II.</w:t>
+      </w:r>
+      <w:r>
+        <w:rPr>
+          <w:rFonts w:eastAsiaTheme="minorHAnsi" w:cstheme="minorBidi"/>
+          <w:b w:val="0"/>
+          <w:sz w:val="26"/>
+          <w:szCs w:val="22"/>
+        </w:rPr>
+        <w:t xml:space="preserve"> </w:t>
+      </w:r>
+      <w:r>
+        <w:t>HỆ THỐNG QUY TRÌNH NGHIỆP VỤ</w:t>
+      </w:r>
+      <w:r>
+        <w:t>.</w:t>
+      </w:r>
+      <w:bookmarkEnd w:id="7"/>
     </w:p>
     <w:p>
       <w:pPr>
         <w:pStyle w:val="Heading2"/>
       </w:pPr>
-      <w:bookmarkStart w:id="7" w:name="_Toc162996931"/>
-      <w:r>
-        <w:t>2. Cơ sở lý thuyết.</w:t>
-      </w:r>
-      <w:bookmarkEnd w:id="7"/>
-    </w:p>
-    <w:p>
-      <w:pPr>
-        <w:ind w:firstLine="720"/>
-        <w:jc w:val="both"/>
-        <w:rPr>
-          <w:rFonts w:cs="Times New Roman"/>
-          <w:szCs w:val="26"/>
-        </w:rPr>
-      </w:pPr>
-      <w:r>
-        <w:rPr>
-          <w:rFonts w:cs="Times New Roman"/>
-          <w:szCs w:val="26"/>
-        </w:rPr>
-        <w:t>Các công nghệ</w:t>
-      </w:r>
-      <w:r>
-        <w:rPr>
-          <w:rFonts w:cs="Times New Roman"/>
-          <w:szCs w:val="26"/>
-        </w:rPr>
-        <w:t>, công cụ</w:t>
-      </w:r>
-      <w:r>
-        <w:rPr>
-          <w:rFonts w:cs="Times New Roman"/>
-          <w:szCs w:val="26"/>
-        </w:rPr>
-        <w:t xml:space="preserve"> hoặc kỹ thuật</w:t>
-      </w:r>
-      <w:r>
-        <w:rPr>
-          <w:rFonts w:cs="Times New Roman"/>
-          <w:szCs w:val="26"/>
-        </w:rPr>
-        <w:t xml:space="preserve"> mà nhóm sử dụng trong đồ án là gì?</w:t>
-      </w:r>
-      <w:r>
-        <w:rPr>
-          <w:rFonts w:cs="Times New Roman"/>
-          <w:szCs w:val="26"/>
-        </w:rPr>
-        <w:t xml:space="preserve"> Nên giải thích khái niệm, trình bày lý thuyết </w:t>
-      </w:r>
-      <w:r>
-        <w:rPr>
-          <w:rFonts w:cs="Times New Roman"/>
-          <w:szCs w:val="26"/>
-        </w:rPr>
-        <w:t>về chúng trong từng tiểu mục riêng</w:t>
-      </w:r>
-      <w:r>
-        <w:rPr>
-          <w:rFonts w:cs="Times New Roman"/>
-          <w:szCs w:val="26"/>
-        </w:rPr>
-        <w:t>.</w:t>
-      </w:r>
-    </w:p>
+      <w:r>
+        <w:t>2.1. Kiến trúc quy trình nghiệp vụ của CellphoneS</w:t>
+      </w:r>
+    </w:p>
+    <w:p/>
     <w:p>
       <w:pPr>
         <w:rPr>
@@ -2412,39 +2303,7 @@
       <w:pPr>
         <w:pStyle w:val="Heading1"/>
       </w:pPr>
-      <w:bookmarkStart w:id="8" w:name="_Toc162996932"/>
-      <w:r>
-        <w:lastRenderedPageBreak/>
-        <w:t xml:space="preserve">Chương II. </w:t>
-      </w:r>
-      <w:r>
-        <w:t>THIẾT KẾ HỆ THỐNG</w:t>
-      </w:r>
-      <w:r>
-        <w:t>.</w:t>
-      </w:r>
-      <w:bookmarkEnd w:id="8"/>
-    </w:p>
-    <w:p>
-      <w:pPr>
-        <w:rPr>
-          <w:rFonts w:cs="Times New Roman"/>
-          <w:szCs w:val="26"/>
-        </w:rPr>
-      </w:pPr>
-      <w:r>
-        <w:rPr>
-          <w:rFonts w:cs="Times New Roman"/>
-          <w:szCs w:val="26"/>
-        </w:rPr>
-        <w:br w:type="page"/>
-      </w:r>
-    </w:p>
-    <w:p>
-      <w:pPr>
-        <w:pStyle w:val="Heading1"/>
-      </w:pPr>
-      <w:bookmarkStart w:id="9" w:name="_Toc162996933"/>
+      <w:bookmarkStart w:id="8" w:name="_Toc162996933"/>
       <w:r>
         <w:lastRenderedPageBreak/>
         <w:t xml:space="preserve">Chương III. </w:t>
@@ -2455,13 +2314,13 @@
       <w:r>
         <w:t>.</w:t>
       </w:r>
-      <w:bookmarkEnd w:id="9"/>
+      <w:bookmarkEnd w:id="8"/>
     </w:p>
     <w:p>
       <w:pPr>
         <w:pStyle w:val="Heading1"/>
       </w:pPr>
-      <w:bookmarkStart w:id="10" w:name="_Toc162996934"/>
+      <w:bookmarkStart w:id="9" w:name="_Toc162996934"/>
     </w:p>
     <w:p>
       <w:pPr>
@@ -2532,7 +2391,7 @@
       <w:r>
         <w:t>.</w:t>
       </w:r>
-      <w:bookmarkEnd w:id="10"/>
+      <w:bookmarkEnd w:id="9"/>
     </w:p>
     <w:p>
       <w:pPr>
@@ -2640,12 +2499,12 @@
       <w:pPr>
         <w:pStyle w:val="Heading1"/>
       </w:pPr>
-      <w:bookmarkStart w:id="11" w:name="_Toc162996935"/>
+      <w:bookmarkStart w:id="10" w:name="_Toc162996935"/>
       <w:r>
         <w:lastRenderedPageBreak/>
         <w:t>NGUỒN THAM KHẢO</w:t>
       </w:r>
-      <w:bookmarkEnd w:id="11"/>
+      <w:bookmarkEnd w:id="10"/>
     </w:p>
     <w:p>
       <w:pPr>
@@ -4087,10 +3946,9 @@
     <w:next w:val="Normal"/>
     <w:link w:val="Heading4Char"/>
     <w:uiPriority w:val="9"/>
-    <w:semiHidden/>
     <w:unhideWhenUsed/>
     <w:qFormat/>
-    <w:rsid w:val="003300AD"/>
+    <w:rsid w:val="00CC6BF3"/>
     <w:pPr>
       <w:keepNext/>
       <w:keepLines/>
@@ -4099,9 +3957,9 @@
     </w:pPr>
     <w:rPr>
       <w:rFonts w:eastAsiaTheme="majorEastAsia" w:cstheme="majorBidi"/>
-      <w:i/>
+      <w:b/>
       <w:iCs/>
-      <w:color w:val="0F4761" w:themeColor="accent1" w:themeShade="BF"/>
+      <w:color w:val="000000" w:themeColor="text1"/>
     </w:rPr>
   </w:style>
   <w:style w:type="paragraph" w:styleId="Heading5">
@@ -4283,13 +4141,13 @@
     <w:basedOn w:val="DefaultParagraphFont"/>
     <w:link w:val="Heading4"/>
     <w:uiPriority w:val="9"/>
-    <w:semiHidden/>
-    <w:rsid w:val="003300AD"/>
+    <w:rsid w:val="00CC6BF3"/>
     <w:rPr>
-      <w:rFonts w:eastAsiaTheme="majorEastAsia" w:cstheme="majorBidi"/>
-      <w:i/>
+      <w:rFonts w:ascii="Times New Roman" w:eastAsiaTheme="majorEastAsia" w:hAnsi="Times New Roman" w:cstheme="majorBidi"/>
+      <w:b/>
       <w:iCs/>
-      <w:color w:val="0F4761" w:themeColor="accent1" w:themeShade="BF"/>
+      <w:color w:val="000000" w:themeColor="text1"/>
+      <w:sz w:val="26"/>
     </w:rPr>
   </w:style>
   <w:style w:type="character" w:customStyle="1" w:styleId="Heading5Char">

</xml_diff>

<commit_message>
Update 2.1.3.3_QuyTrinhXuLy - 2.1.3.4_QuyTrinhTraKetQua
</commit_message>
<xml_diff>
--- a/He_thong_thong_tin_giai_quyet_hanh_chinh/NGUYEN TRUONG PHI_25410281/25410281_NguyenTruongPhi.docx
+++ b/He_thong_thong_tin_giai_quyet_hanh_chinh/NGUYEN TRUONG PHI_25410281/25410281_NguyenTruongPhi.docx
@@ -79,7 +79,7 @@
           <w:szCs w:val="26"/>
         </w:rPr>
         <w:drawing>
-          <wp:inline distT="0" distB="0" distL="0" distR="0" wp14:anchorId="61AA30EF" wp14:editId="29B81CDF">
+          <wp:inline distT="0" distB="0" distL="0" distR="0" wp14:anchorId="61AA30EF" wp14:editId="37C4DA40">
             <wp:extent cx="1948539" cy="1606164"/>
             <wp:effectExtent l="0" t="0" r="0" b="0"/>
             <wp:docPr id="990850389" name="Picture 1"/>
@@ -761,7 +761,7 @@
         <w:br w:type="page"/>
       </w:r>
     </w:p>
-    <w:bookmarkStart w:id="0" w:name="_Toc236231635" w:displacedByCustomXml="next"/>
+    <w:bookmarkStart w:id="0" w:name="_Toc236264108" w:displacedByCustomXml="next"/>
     <w:sdt>
       <w:sdtPr>
         <w:rPr>
@@ -809,12 +809,12 @@
             <w:fldChar w:fldCharType="begin"/>
           </w:r>
           <w:r>
-            <w:instrText xml:space="preserve"> TOC \o "1-4" \h \z \u </w:instrText>
+            <w:instrText xml:space="preserve"> TOC \o "1-6" \h \z \u </w:instrText>
           </w:r>
           <w:r>
             <w:fldChar w:fldCharType="separate"/>
           </w:r>
-          <w:hyperlink w:anchor="_Toc236231635" w:history="1">
+          <w:hyperlink w:anchor="_Toc236264108" w:history="1">
             <w:r>
               <w:rPr>
                 <w:rStyle w:val="Hyperlink"/>
@@ -841,7 +841,7 @@
                 <w:noProof/>
                 <w:webHidden/>
               </w:rPr>
-              <w:instrText xml:space="preserve"> PAGEREF _Toc236231635 \h </w:instrText>
+              <w:instrText xml:space="preserve"> PAGEREF _Toc236264108 \h </w:instrText>
             </w:r>
             <w:r>
               <w:rPr>
@@ -885,7 +885,7 @@
               <w:szCs w:val="24"/>
             </w:rPr>
           </w:pPr>
-          <w:hyperlink w:anchor="_Toc236231636" w:history="1">
+          <w:hyperlink w:anchor="_Toc236264109" w:history="1">
             <w:r>
               <w:rPr>
                 <w:rStyle w:val="Hyperlink"/>
@@ -912,7 +912,7 @@
                 <w:noProof/>
                 <w:webHidden/>
               </w:rPr>
-              <w:instrText xml:space="preserve"> PAGEREF _Toc236231636 \h </w:instrText>
+              <w:instrText xml:space="preserve"> PAGEREF _Toc236264109 \h </w:instrText>
             </w:r>
             <w:r>
               <w:rPr>
@@ -932,7 +932,7 @@
                 <w:noProof/>
                 <w:webHidden/>
               </w:rPr>
-              <w:t>3</w:t>
+              <w:t>4</w:t>
             </w:r>
             <w:r>
               <w:rPr>
@@ -956,7 +956,7 @@
               <w:szCs w:val="24"/>
             </w:rPr>
           </w:pPr>
-          <w:hyperlink w:anchor="_Toc236231637" w:history="1">
+          <w:hyperlink w:anchor="_Toc236264110" w:history="1">
             <w:r>
               <w:rPr>
                 <w:rStyle w:val="Hyperlink"/>
@@ -983,7 +983,7 @@
                 <w:noProof/>
                 <w:webHidden/>
               </w:rPr>
-              <w:instrText xml:space="preserve"> PAGEREF _Toc236231637 \h </w:instrText>
+              <w:instrText xml:space="preserve"> PAGEREF _Toc236264110 \h </w:instrText>
             </w:r>
             <w:r>
               <w:rPr>
@@ -1003,7 +1003,7 @@
                 <w:noProof/>
                 <w:webHidden/>
               </w:rPr>
-              <w:t>4</w:t>
+              <w:t>5</w:t>
             </w:r>
             <w:r>
               <w:rPr>
@@ -1027,7 +1027,7 @@
               <w:szCs w:val="24"/>
             </w:rPr>
           </w:pPr>
-          <w:hyperlink w:anchor="_Toc236231638" w:history="1">
+          <w:hyperlink w:anchor="_Toc236264111" w:history="1">
             <w:r>
               <w:rPr>
                 <w:rStyle w:val="Hyperlink"/>
@@ -1054,7 +1054,7 @@
                 <w:noProof/>
                 <w:webHidden/>
               </w:rPr>
-              <w:instrText xml:space="preserve"> PAGEREF _Toc236231638 \h </w:instrText>
+              <w:instrText xml:space="preserve"> PAGEREF _Toc236264111 \h </w:instrText>
             </w:r>
             <w:r>
               <w:rPr>
@@ -1074,7 +1074,7 @@
                 <w:noProof/>
                 <w:webHidden/>
               </w:rPr>
-              <w:t>5</w:t>
+              <w:t>6</w:t>
             </w:r>
             <w:r>
               <w:rPr>
@@ -1098,7 +1098,7 @@
               <w:szCs w:val="24"/>
             </w:rPr>
           </w:pPr>
-          <w:hyperlink w:anchor="_Toc236231639" w:history="1">
+          <w:hyperlink w:anchor="_Toc236264112" w:history="1">
             <w:r>
               <w:rPr>
                 <w:rStyle w:val="Hyperlink"/>
@@ -1125,7 +1125,7 @@
                 <w:noProof/>
                 <w:webHidden/>
               </w:rPr>
-              <w:instrText xml:space="preserve"> PAGEREF _Toc236231639 \h </w:instrText>
+              <w:instrText xml:space="preserve"> PAGEREF _Toc236264112 \h </w:instrText>
             </w:r>
             <w:r>
               <w:rPr>
@@ -1145,7 +1145,7 @@
                 <w:noProof/>
                 <w:webHidden/>
               </w:rPr>
-              <w:t>5</w:t>
+              <w:t>6</w:t>
             </w:r>
             <w:r>
               <w:rPr>
@@ -1169,7 +1169,7 @@
               <w:szCs w:val="24"/>
             </w:rPr>
           </w:pPr>
-          <w:hyperlink w:anchor="_Toc236231640" w:history="1">
+          <w:hyperlink w:anchor="_Toc236264113" w:history="1">
             <w:r>
               <w:rPr>
                 <w:rStyle w:val="Hyperlink"/>
@@ -1196,7 +1196,7 @@
                 <w:noProof/>
                 <w:webHidden/>
               </w:rPr>
-              <w:instrText xml:space="preserve"> PAGEREF _Toc236231640 \h </w:instrText>
+              <w:instrText xml:space="preserve"> PAGEREF _Toc236264113 \h </w:instrText>
             </w:r>
             <w:r>
               <w:rPr>
@@ -1216,7 +1216,7 @@
                 <w:noProof/>
                 <w:webHidden/>
               </w:rPr>
-              <w:t>5</w:t>
+              <w:t>6</w:t>
             </w:r>
             <w:r>
               <w:rPr>
@@ -1240,7 +1240,7 @@
               <w:szCs w:val="24"/>
             </w:rPr>
           </w:pPr>
-          <w:hyperlink w:anchor="_Toc236231641" w:history="1">
+          <w:hyperlink w:anchor="_Toc236264114" w:history="1">
             <w:r>
               <w:rPr>
                 <w:rStyle w:val="Hyperlink"/>
@@ -1267,7 +1267,7 @@
                 <w:noProof/>
                 <w:webHidden/>
               </w:rPr>
-              <w:instrText xml:space="preserve"> PAGEREF _Toc236231641 \h </w:instrText>
+              <w:instrText xml:space="preserve"> PAGEREF _Toc236264114 \h </w:instrText>
             </w:r>
             <w:r>
               <w:rPr>
@@ -1287,7 +1287,7 @@
                 <w:noProof/>
                 <w:webHidden/>
               </w:rPr>
-              <w:t>5</w:t>
+              <w:t>6</w:t>
             </w:r>
             <w:r>
               <w:rPr>
@@ -1311,7 +1311,7 @@
               <w:szCs w:val="24"/>
             </w:rPr>
           </w:pPr>
-          <w:hyperlink w:anchor="_Toc236231642" w:history="1">
+          <w:hyperlink w:anchor="_Toc236264115" w:history="1">
             <w:r>
               <w:rPr>
                 <w:rStyle w:val="Hyperlink"/>
@@ -1338,7 +1338,7 @@
                 <w:noProof/>
                 <w:webHidden/>
               </w:rPr>
-              <w:instrText xml:space="preserve"> PAGEREF _Toc236231642 \h </w:instrText>
+              <w:instrText xml:space="preserve"> PAGEREF _Toc236264115 \h </w:instrText>
             </w:r>
             <w:r>
               <w:rPr>
@@ -1358,7 +1358,7 @@
                 <w:noProof/>
                 <w:webHidden/>
               </w:rPr>
-              <w:t>5</w:t>
+              <w:t>6</w:t>
             </w:r>
             <w:r>
               <w:rPr>
@@ -1382,7 +1382,7 @@
               <w:szCs w:val="24"/>
             </w:rPr>
           </w:pPr>
-          <w:hyperlink w:anchor="_Toc236231643" w:history="1">
+          <w:hyperlink w:anchor="_Toc236264116" w:history="1">
             <w:r>
               <w:rPr>
                 <w:rStyle w:val="Hyperlink"/>
@@ -1409,7 +1409,7 @@
                 <w:noProof/>
                 <w:webHidden/>
               </w:rPr>
-              <w:instrText xml:space="preserve"> PAGEREF _Toc236231643 \h </w:instrText>
+              <w:instrText xml:space="preserve"> PAGEREF _Toc236264116 \h </w:instrText>
             </w:r>
             <w:r>
               <w:rPr>
@@ -1429,7 +1429,7 @@
                 <w:noProof/>
                 <w:webHidden/>
               </w:rPr>
-              <w:t>6</w:t>
+              <w:t>7</w:t>
             </w:r>
             <w:r>
               <w:rPr>
@@ -1453,7 +1453,7 @@
               <w:szCs w:val="24"/>
             </w:rPr>
           </w:pPr>
-          <w:hyperlink w:anchor="_Toc236231644" w:history="1">
+          <w:hyperlink w:anchor="_Toc236264117" w:history="1">
             <w:r>
               <w:rPr>
                 <w:rStyle w:val="Hyperlink"/>
@@ -1480,7 +1480,7 @@
                 <w:noProof/>
                 <w:webHidden/>
               </w:rPr>
-              <w:instrText xml:space="preserve"> PAGEREF _Toc236231644 \h </w:instrText>
+              <w:instrText xml:space="preserve"> PAGEREF _Toc236264117 \h </w:instrText>
             </w:r>
             <w:r>
               <w:rPr>
@@ -1500,7 +1500,7 @@
                 <w:noProof/>
                 <w:webHidden/>
               </w:rPr>
-              <w:t>6</w:t>
+              <w:t>7</w:t>
             </w:r>
             <w:r>
               <w:rPr>
@@ -1524,7 +1524,7 @@
               <w:szCs w:val="24"/>
             </w:rPr>
           </w:pPr>
-          <w:hyperlink w:anchor="_Toc236231645" w:history="1">
+          <w:hyperlink w:anchor="_Toc236264118" w:history="1">
             <w:r>
               <w:rPr>
                 <w:rStyle w:val="Hyperlink"/>
@@ -1551,7 +1551,7 @@
                 <w:noProof/>
                 <w:webHidden/>
               </w:rPr>
-              <w:instrText xml:space="preserve"> PAGEREF _Toc236231645 \h </w:instrText>
+              <w:instrText xml:space="preserve"> PAGEREF _Toc236264118 \h </w:instrText>
             </w:r>
             <w:r>
               <w:rPr>
@@ -1571,7 +1571,7 @@
                 <w:noProof/>
                 <w:webHidden/>
               </w:rPr>
-              <w:t>8</w:t>
+              <w:t>9</w:t>
             </w:r>
             <w:r>
               <w:rPr>
@@ -1595,7 +1595,7 @@
               <w:szCs w:val="24"/>
             </w:rPr>
           </w:pPr>
-          <w:hyperlink w:anchor="_Toc236231646" w:history="1">
+          <w:hyperlink w:anchor="_Toc236264119" w:history="1">
             <w:r>
               <w:rPr>
                 <w:rStyle w:val="Hyperlink"/>
@@ -1622,7 +1622,7 @@
                 <w:noProof/>
                 <w:webHidden/>
               </w:rPr>
-              <w:instrText xml:space="preserve"> PAGEREF _Toc236231646 \h </w:instrText>
+              <w:instrText xml:space="preserve"> PAGEREF _Toc236264119 \h </w:instrText>
             </w:r>
             <w:r>
               <w:rPr>
@@ -1642,7 +1642,7 @@
                 <w:noProof/>
                 <w:webHidden/>
               </w:rPr>
-              <w:t>8</w:t>
+              <w:t>9</w:t>
             </w:r>
             <w:r>
               <w:rPr>
@@ -1666,7 +1666,7 @@
               <w:szCs w:val="24"/>
             </w:rPr>
           </w:pPr>
-          <w:hyperlink w:anchor="_Toc236231647" w:history="1">
+          <w:hyperlink w:anchor="_Toc236264120" w:history="1">
             <w:r>
               <w:rPr>
                 <w:rStyle w:val="Hyperlink"/>
@@ -1693,7 +1693,7 @@
                 <w:noProof/>
                 <w:webHidden/>
               </w:rPr>
-              <w:instrText xml:space="preserve"> PAGEREF _Toc236231647 \h </w:instrText>
+              <w:instrText xml:space="preserve"> PAGEREF _Toc236264120 \h </w:instrText>
             </w:r>
             <w:r>
               <w:rPr>
@@ -1713,7 +1713,7 @@
                 <w:noProof/>
                 <w:webHidden/>
               </w:rPr>
-              <w:t>8</w:t>
+              <w:t>9</w:t>
             </w:r>
             <w:r>
               <w:rPr>
@@ -1737,7 +1737,7 @@
               <w:szCs w:val="24"/>
             </w:rPr>
           </w:pPr>
-          <w:hyperlink w:anchor="_Toc236231648" w:history="1">
+          <w:hyperlink w:anchor="_Toc236264121" w:history="1">
             <w:r>
               <w:rPr>
                 <w:rStyle w:val="Hyperlink"/>
@@ -1764,7 +1764,7 @@
                 <w:noProof/>
                 <w:webHidden/>
               </w:rPr>
-              <w:instrText xml:space="preserve"> PAGEREF _Toc236231648 \h </w:instrText>
+              <w:instrText xml:space="preserve"> PAGEREF _Toc236264121 \h </w:instrText>
             </w:r>
             <w:r>
               <w:rPr>
@@ -1784,7 +1784,7 @@
                 <w:noProof/>
                 <w:webHidden/>
               </w:rPr>
-              <w:t>8</w:t>
+              <w:t>9</w:t>
             </w:r>
             <w:r>
               <w:rPr>
@@ -1808,7 +1808,7 @@
               <w:szCs w:val="24"/>
             </w:rPr>
           </w:pPr>
-          <w:hyperlink w:anchor="_Toc236231649" w:history="1">
+          <w:hyperlink w:anchor="_Toc236264122" w:history="1">
             <w:r>
               <w:rPr>
                 <w:rStyle w:val="Hyperlink"/>
@@ -1835,7 +1835,7 @@
                 <w:noProof/>
                 <w:webHidden/>
               </w:rPr>
-              <w:instrText xml:space="preserve"> PAGEREF _Toc236231649 \h </w:instrText>
+              <w:instrText xml:space="preserve"> PAGEREF _Toc236264122 \h </w:instrText>
             </w:r>
             <w:r>
               <w:rPr>
@@ -1855,7 +1855,7 @@
                 <w:noProof/>
                 <w:webHidden/>
               </w:rPr>
-              <w:t>9</w:t>
+              <w:t>10</w:t>
             </w:r>
             <w:r>
               <w:rPr>
@@ -1879,7 +1879,7 @@
               <w:szCs w:val="24"/>
             </w:rPr>
           </w:pPr>
-          <w:hyperlink w:anchor="_Toc236231650" w:history="1">
+          <w:hyperlink w:anchor="_Toc236264123" w:history="1">
             <w:r>
               <w:rPr>
                 <w:rStyle w:val="Hyperlink"/>
@@ -1906,7 +1906,7 @@
                 <w:noProof/>
                 <w:webHidden/>
               </w:rPr>
-              <w:instrText xml:space="preserve"> PAGEREF _Toc236231650 \h </w:instrText>
+              <w:instrText xml:space="preserve"> PAGEREF _Toc236264123 \h </w:instrText>
             </w:r>
             <w:r>
               <w:rPr>
@@ -1926,7 +1926,293 @@
                 <w:noProof/>
                 <w:webHidden/>
               </w:rPr>
-              <w:t>9</w:t>
+              <w:t>10</w:t>
+            </w:r>
+            <w:r>
+              <w:rPr>
+                <w:noProof/>
+                <w:webHidden/>
+              </w:rPr>
+              <w:fldChar w:fldCharType="end"/>
+            </w:r>
+          </w:hyperlink>
+        </w:p>
+        <w:p>
+          <w:pPr>
+            <w:pStyle w:val="TOC5"/>
+            <w:tabs>
+              <w:tab w:val="right" w:leader="dot" w:pos="9016"/>
+            </w:tabs>
+            <w:rPr>
+              <w:noProof/>
+            </w:rPr>
+          </w:pPr>
+          <w:hyperlink w:anchor="_Toc236264124" w:history="1">
+            <w:r>
+              <w:rPr>
+                <w:rStyle w:val="Hyperlink"/>
+                <w:noProof/>
+              </w:rPr>
+              <w:t>2.1.3.1 Quy trình tiếp nhận hồ sơ</w:t>
+            </w:r>
+            <w:r>
+              <w:rPr>
+                <w:noProof/>
+                <w:webHidden/>
+              </w:rPr>
+              <w:tab/>
+            </w:r>
+            <w:r>
+              <w:rPr>
+                <w:noProof/>
+                <w:webHidden/>
+              </w:rPr>
+              <w:fldChar w:fldCharType="begin"/>
+            </w:r>
+            <w:r>
+              <w:rPr>
+                <w:noProof/>
+                <w:webHidden/>
+              </w:rPr>
+              <w:instrText xml:space="preserve"> PAGEREF _Toc236264124 \h </w:instrText>
+            </w:r>
+            <w:r>
+              <w:rPr>
+                <w:noProof/>
+                <w:webHidden/>
+              </w:rPr>
+            </w:r>
+            <w:r>
+              <w:rPr>
+                <w:noProof/>
+                <w:webHidden/>
+              </w:rPr>
+              <w:fldChar w:fldCharType="separate"/>
+            </w:r>
+            <w:r>
+              <w:rPr>
+                <w:noProof/>
+                <w:webHidden/>
+              </w:rPr>
+              <w:t>10</w:t>
+            </w:r>
+            <w:r>
+              <w:rPr>
+                <w:noProof/>
+                <w:webHidden/>
+              </w:rPr>
+              <w:fldChar w:fldCharType="end"/>
+            </w:r>
+          </w:hyperlink>
+        </w:p>
+        <w:p>
+          <w:pPr>
+            <w:pStyle w:val="TOC5"/>
+            <w:tabs>
+              <w:tab w:val="right" w:leader="dot" w:pos="9016"/>
+            </w:tabs>
+            <w:rPr>
+              <w:noProof/>
+            </w:rPr>
+          </w:pPr>
+          <w:hyperlink w:anchor="_Toc236264125" w:history="1">
+            <w:r>
+              <w:rPr>
+                <w:rStyle w:val="Hyperlink"/>
+                <w:noProof/>
+              </w:rPr>
+              <w:t>2.1.3.2 Quy trình tiếp nhậ</w:t>
+            </w:r>
+            <w:r>
+              <w:rPr>
+                <w:rStyle w:val="Hyperlink"/>
+                <w:noProof/>
+              </w:rPr>
+              <w:t>n</w:t>
+            </w:r>
+            <w:r>
+              <w:rPr>
+                <w:rStyle w:val="Hyperlink"/>
+                <w:noProof/>
+              </w:rPr>
+              <w:t xml:space="preserve"> hồ sơ</w:t>
+            </w:r>
+            <w:r>
+              <w:rPr>
+                <w:noProof/>
+                <w:webHidden/>
+              </w:rPr>
+              <w:tab/>
+            </w:r>
+            <w:r>
+              <w:rPr>
+                <w:noProof/>
+                <w:webHidden/>
+              </w:rPr>
+              <w:fldChar w:fldCharType="begin"/>
+            </w:r>
+            <w:r>
+              <w:rPr>
+                <w:noProof/>
+                <w:webHidden/>
+              </w:rPr>
+              <w:instrText xml:space="preserve"> PAGEREF _Toc236264125 \h </w:instrText>
+            </w:r>
+            <w:r>
+              <w:rPr>
+                <w:noProof/>
+                <w:webHidden/>
+              </w:rPr>
+            </w:r>
+            <w:r>
+              <w:rPr>
+                <w:noProof/>
+                <w:webHidden/>
+              </w:rPr>
+              <w:fldChar w:fldCharType="separate"/>
+            </w:r>
+            <w:r>
+              <w:rPr>
+                <w:noProof/>
+                <w:webHidden/>
+              </w:rPr>
+              <w:t>10</w:t>
+            </w:r>
+            <w:r>
+              <w:rPr>
+                <w:noProof/>
+                <w:webHidden/>
+              </w:rPr>
+              <w:fldChar w:fldCharType="end"/>
+            </w:r>
+          </w:hyperlink>
+        </w:p>
+        <w:p>
+          <w:pPr>
+            <w:pStyle w:val="TOC5"/>
+            <w:tabs>
+              <w:tab w:val="right" w:leader="dot" w:pos="9016"/>
+            </w:tabs>
+            <w:rPr>
+              <w:noProof/>
+            </w:rPr>
+          </w:pPr>
+          <w:hyperlink w:anchor="_Toc236264126" w:history="1">
+            <w:r>
+              <w:rPr>
+                <w:rStyle w:val="Hyperlink"/>
+                <w:noProof/>
+              </w:rPr>
+              <w:t>2.1.3.3 Quy trình kiểm tra, thẩm định và xử lý hồ sơ</w:t>
+            </w:r>
+            <w:r>
+              <w:rPr>
+                <w:noProof/>
+                <w:webHidden/>
+              </w:rPr>
+              <w:tab/>
+            </w:r>
+            <w:r>
+              <w:rPr>
+                <w:noProof/>
+                <w:webHidden/>
+              </w:rPr>
+              <w:fldChar w:fldCharType="begin"/>
+            </w:r>
+            <w:r>
+              <w:rPr>
+                <w:noProof/>
+                <w:webHidden/>
+              </w:rPr>
+              <w:instrText xml:space="preserve"> PAGEREF _Toc236264126 \h </w:instrText>
+            </w:r>
+            <w:r>
+              <w:rPr>
+                <w:noProof/>
+                <w:webHidden/>
+              </w:rPr>
+            </w:r>
+            <w:r>
+              <w:rPr>
+                <w:noProof/>
+                <w:webHidden/>
+              </w:rPr>
+              <w:fldChar w:fldCharType="separate"/>
+            </w:r>
+            <w:r>
+              <w:rPr>
+                <w:noProof/>
+                <w:webHidden/>
+              </w:rPr>
+              <w:t>10</w:t>
+            </w:r>
+            <w:r>
+              <w:rPr>
+                <w:noProof/>
+                <w:webHidden/>
+              </w:rPr>
+              <w:fldChar w:fldCharType="end"/>
+            </w:r>
+          </w:hyperlink>
+        </w:p>
+        <w:p>
+          <w:pPr>
+            <w:pStyle w:val="TOC5"/>
+            <w:tabs>
+              <w:tab w:val="right" w:leader="dot" w:pos="9016"/>
+            </w:tabs>
+            <w:rPr>
+              <w:noProof/>
+            </w:rPr>
+          </w:pPr>
+          <w:hyperlink w:anchor="_Toc236264127" w:history="1">
+            <w:r>
+              <w:rPr>
+                <w:rStyle w:val="Hyperlink"/>
+                <w:noProof/>
+              </w:rPr>
+              <w:t>2.1.3.4 Quy trình trả kết và thông báo</w:t>
+            </w:r>
+            <w:r>
+              <w:rPr>
+                <w:noProof/>
+                <w:webHidden/>
+              </w:rPr>
+              <w:tab/>
+            </w:r>
+            <w:r>
+              <w:rPr>
+                <w:noProof/>
+                <w:webHidden/>
+              </w:rPr>
+              <w:fldChar w:fldCharType="begin"/>
+            </w:r>
+            <w:r>
+              <w:rPr>
+                <w:noProof/>
+                <w:webHidden/>
+              </w:rPr>
+              <w:instrText xml:space="preserve"> PAGEREF _Toc236264127 \h </w:instrText>
+            </w:r>
+            <w:r>
+              <w:rPr>
+                <w:noProof/>
+                <w:webHidden/>
+              </w:rPr>
+            </w:r>
+            <w:r>
+              <w:rPr>
+                <w:noProof/>
+                <w:webHidden/>
+              </w:rPr>
+              <w:fldChar w:fldCharType="separate"/>
+            </w:r>
+            <w:r>
+              <w:rPr>
+                <w:noProof/>
+                <w:webHidden/>
+              </w:rPr>
+              <w:t>10</w:t>
             </w:r>
             <w:r>
               <w:rPr>
@@ -1950,7 +2236,7 @@
               <w:szCs w:val="24"/>
             </w:rPr>
           </w:pPr>
-          <w:hyperlink w:anchor="_Toc236231651" w:history="1">
+          <w:hyperlink w:anchor="_Toc236264128" w:history="1">
             <w:r>
               <w:rPr>
                 <w:rStyle w:val="Hyperlink"/>
@@ -1977,7 +2263,7 @@
                 <w:noProof/>
                 <w:webHidden/>
               </w:rPr>
-              <w:instrText xml:space="preserve"> PAGEREF _Toc236231651 \h </w:instrText>
+              <w:instrText xml:space="preserve"> PAGEREF _Toc236264128 \h </w:instrText>
             </w:r>
             <w:r>
               <w:rPr>
@@ -1997,7 +2283,7 @@
                 <w:noProof/>
                 <w:webHidden/>
               </w:rPr>
-              <w:t>9</w:t>
+              <w:t>11</w:t>
             </w:r>
             <w:r>
               <w:rPr>
@@ -2021,7 +2307,7 @@
               <w:szCs w:val="24"/>
             </w:rPr>
           </w:pPr>
-          <w:hyperlink w:anchor="_Toc236231652" w:history="1">
+          <w:hyperlink w:anchor="_Toc236264129" w:history="1">
             <w:r>
               <w:rPr>
                 <w:rStyle w:val="Hyperlink"/>
@@ -2048,7 +2334,7 @@
                 <w:noProof/>
                 <w:webHidden/>
               </w:rPr>
-              <w:instrText xml:space="preserve"> PAGEREF _Toc236231652 \h </w:instrText>
+              <w:instrText xml:space="preserve"> PAGEREF _Toc236264129 \h </w:instrText>
             </w:r>
             <w:r>
               <w:rPr>
@@ -2068,7 +2354,7 @@
                 <w:noProof/>
                 <w:webHidden/>
               </w:rPr>
-              <w:t>9</w:t>
+              <w:t>11</w:t>
             </w:r>
             <w:r>
               <w:rPr>
@@ -2092,7 +2378,7 @@
               <w:szCs w:val="24"/>
             </w:rPr>
           </w:pPr>
-          <w:hyperlink w:anchor="_Toc236231653" w:history="1">
+          <w:hyperlink w:anchor="_Toc236264130" w:history="1">
             <w:r>
               <w:rPr>
                 <w:rStyle w:val="Hyperlink"/>
@@ -2119,7 +2405,7 @@
                 <w:noProof/>
                 <w:webHidden/>
               </w:rPr>
-              <w:instrText xml:space="preserve"> PAGEREF _Toc236231653 \h </w:instrText>
+              <w:instrText xml:space="preserve"> PAGEREF _Toc236264130 \h </w:instrText>
             </w:r>
             <w:r>
               <w:rPr>
@@ -2139,7 +2425,7 @@
                 <w:noProof/>
                 <w:webHidden/>
               </w:rPr>
-              <w:t>9</w:t>
+              <w:t>11</w:t>
             </w:r>
             <w:r>
               <w:rPr>
@@ -2163,7 +2449,7 @@
               <w:szCs w:val="24"/>
             </w:rPr>
           </w:pPr>
-          <w:hyperlink w:anchor="_Toc236231654" w:history="1">
+          <w:hyperlink w:anchor="_Toc236264131" w:history="1">
             <w:r>
               <w:rPr>
                 <w:rStyle w:val="Hyperlink"/>
@@ -2190,7 +2476,7 @@
                 <w:noProof/>
                 <w:webHidden/>
               </w:rPr>
-              <w:instrText xml:space="preserve"> PAGEREF _Toc236231654 \h </w:instrText>
+              <w:instrText xml:space="preserve"> PAGEREF _Toc236264131 \h </w:instrText>
             </w:r>
             <w:r>
               <w:rPr>
@@ -2210,7 +2496,7 @@
                 <w:noProof/>
                 <w:webHidden/>
               </w:rPr>
-              <w:t>9</w:t>
+              <w:t>11</w:t>
             </w:r>
             <w:r>
               <w:rPr>
@@ -2234,7 +2520,7 @@
               <w:szCs w:val="24"/>
             </w:rPr>
           </w:pPr>
-          <w:hyperlink w:anchor="_Toc236231655" w:history="1">
+          <w:hyperlink w:anchor="_Toc236264132" w:history="1">
             <w:r>
               <w:rPr>
                 <w:rStyle w:val="Hyperlink"/>
@@ -2261,7 +2547,7 @@
                 <w:noProof/>
                 <w:webHidden/>
               </w:rPr>
-              <w:instrText xml:space="preserve"> PAGEREF _Toc236231655 \h </w:instrText>
+              <w:instrText xml:space="preserve"> PAGEREF _Toc236264132 \h </w:instrText>
             </w:r>
             <w:r>
               <w:rPr>
@@ -2281,7 +2567,7 @@
                 <w:noProof/>
                 <w:webHidden/>
               </w:rPr>
-              <w:t>10</w:t>
+              <w:t>12</w:t>
             </w:r>
             <w:r>
               <w:rPr>
@@ -2305,7 +2591,7 @@
               <w:szCs w:val="24"/>
             </w:rPr>
           </w:pPr>
-          <w:hyperlink w:anchor="_Toc236231656" w:history="1">
+          <w:hyperlink w:anchor="_Toc236264133" w:history="1">
             <w:r>
               <w:rPr>
                 <w:rStyle w:val="Hyperlink"/>
@@ -2332,7 +2618,7 @@
                 <w:noProof/>
                 <w:webHidden/>
               </w:rPr>
-              <w:instrText xml:space="preserve"> PAGEREF _Toc236231656 \h </w:instrText>
+              <w:instrText xml:space="preserve"> PAGEREF _Toc236264133 \h </w:instrText>
             </w:r>
             <w:r>
               <w:rPr>
@@ -2352,7 +2638,7 @@
                 <w:noProof/>
                 <w:webHidden/>
               </w:rPr>
-              <w:t>11</w:t>
+              <w:t>13</w:t>
             </w:r>
             <w:r>
               <w:rPr>
@@ -2376,7 +2662,7 @@
               <w:szCs w:val="24"/>
             </w:rPr>
           </w:pPr>
-          <w:hyperlink w:anchor="_Toc236231657" w:history="1">
+          <w:hyperlink w:anchor="_Toc236264134" w:history="1">
             <w:r>
               <w:rPr>
                 <w:rStyle w:val="Hyperlink"/>
@@ -2403,7 +2689,7 @@
                 <w:noProof/>
                 <w:webHidden/>
               </w:rPr>
-              <w:instrText xml:space="preserve"> PAGEREF _Toc236231657 \h </w:instrText>
+              <w:instrText xml:space="preserve"> PAGEREF _Toc236264134 \h </w:instrText>
             </w:r>
             <w:r>
               <w:rPr>
@@ -2423,7 +2709,7 @@
                 <w:noProof/>
                 <w:webHidden/>
               </w:rPr>
-              <w:t>12</w:t>
+              <w:t>14</w:t>
             </w:r>
             <w:r>
               <w:rPr>
@@ -2469,7 +2755,7 @@
       <w:pPr>
         <w:pStyle w:val="Heading1"/>
       </w:pPr>
-      <w:bookmarkStart w:id="1" w:name="_Toc236231636"/>
+      <w:bookmarkStart w:id="1" w:name="_Toc236264109"/>
       <w:r>
         <w:lastRenderedPageBreak/>
         <w:t>DANH SÁCH HÌNH</w:t>
@@ -2513,7 +2799,7 @@
         </w:rPr>
         <w:fldChar w:fldCharType="separate"/>
       </w:r>
-      <w:hyperlink w:anchor="_Toc236242614" w:history="1">
+      <w:hyperlink w:anchor="_Toc236263980" w:history="1">
         <w:r>
           <w:rPr>
             <w:rStyle w:val="Hyperlink"/>
@@ -2540,7 +2826,7 @@
             <w:noProof/>
             <w:webHidden/>
           </w:rPr>
-          <w:instrText xml:space="preserve"> PAGEREF _Toc236242614 \h </w:instrText>
+          <w:instrText xml:space="preserve"> PAGEREF _Toc236263980 \h </w:instrText>
         </w:r>
         <w:r>
           <w:rPr>
@@ -2584,7 +2870,7 @@
           <w:szCs w:val="24"/>
         </w:rPr>
       </w:pPr>
-      <w:hyperlink w:anchor="_Toc236242615" w:history="1">
+      <w:hyperlink w:anchor="_Toc236263981" w:history="1">
         <w:r>
           <w:rPr>
             <w:rStyle w:val="Hyperlink"/>
@@ -2611,7 +2897,7 @@
             <w:noProof/>
             <w:webHidden/>
           </w:rPr>
-          <w:instrText xml:space="preserve"> PAGEREF _Toc236242615 \h </w:instrText>
+          <w:instrText xml:space="preserve"> PAGEREF _Toc236263981 \h </w:instrText>
         </w:r>
         <w:r>
           <w:rPr>
@@ -2655,7 +2941,7 @@
           <w:szCs w:val="24"/>
         </w:rPr>
       </w:pPr>
-      <w:hyperlink w:anchor="_Toc236242616" w:history="1">
+      <w:hyperlink w:anchor="_Toc236263982" w:history="1">
         <w:r>
           <w:rPr>
             <w:rStyle w:val="Hyperlink"/>
@@ -2682,7 +2968,7 @@
             <w:noProof/>
             <w:webHidden/>
           </w:rPr>
-          <w:instrText xml:space="preserve"> PAGEREF _Toc236242616 \h </w:instrText>
+          <w:instrText xml:space="preserve"> PAGEREF _Toc236263982 \h </w:instrText>
         </w:r>
         <w:r>
           <w:rPr>
@@ -2726,7 +3012,7 @@
           <w:szCs w:val="24"/>
         </w:rPr>
       </w:pPr>
-      <w:hyperlink w:anchor="_Toc236242617" w:history="1">
+      <w:hyperlink w:anchor="_Toc236263983" w:history="1">
         <w:r>
           <w:rPr>
             <w:rStyle w:val="Hyperlink"/>
@@ -2753,7 +3039,7 @@
             <w:noProof/>
             <w:webHidden/>
           </w:rPr>
-          <w:instrText xml:space="preserve"> PAGEREF _Toc236242617 \h </w:instrText>
+          <w:instrText xml:space="preserve"> PAGEREF _Toc236263983 \h </w:instrText>
         </w:r>
         <w:r>
           <w:rPr>
@@ -2851,7 +3137,7 @@
       <w:pPr>
         <w:pStyle w:val="Heading1"/>
       </w:pPr>
-      <w:bookmarkStart w:id="2" w:name="_Toc236231637"/>
+      <w:bookmarkStart w:id="2" w:name="_Toc236264110"/>
       <w:r>
         <w:lastRenderedPageBreak/>
         <w:t>TÓM TẮT</w:t>
@@ -2930,7 +3216,7 @@
       <w:pPr>
         <w:pStyle w:val="Heading1"/>
       </w:pPr>
-      <w:bookmarkStart w:id="3" w:name="_Toc236231638"/>
+      <w:bookmarkStart w:id="3" w:name="_Toc236264111"/>
       <w:r>
         <w:lastRenderedPageBreak/>
         <w:t xml:space="preserve">Chương I. </w:t>
@@ -2947,7 +3233,7 @@
       <w:pPr>
         <w:pStyle w:val="Heading2"/>
       </w:pPr>
-      <w:bookmarkStart w:id="4" w:name="_Toc236231639"/>
+      <w:bookmarkStart w:id="4" w:name="_Toc236264112"/>
       <w:r>
         <w:t xml:space="preserve">1. </w:t>
       </w:r>
@@ -2966,7 +3252,7 @@
       <w:pPr>
         <w:pStyle w:val="Heading3"/>
       </w:pPr>
-      <w:bookmarkStart w:id="5" w:name="_Toc236231640"/>
+      <w:bookmarkStart w:id="5" w:name="_Toc236264113"/>
       <w:r>
         <w:t xml:space="preserve">1.1. </w:t>
       </w:r>
@@ -2982,7 +3268,7 @@
       <w:pPr>
         <w:pStyle w:val="Heading4"/>
       </w:pPr>
-      <w:bookmarkStart w:id="6" w:name="_Toc236231641"/>
+      <w:bookmarkStart w:id="6" w:name="_Toc236264114"/>
       <w:r>
         <w:t>1.1.1. Nội dung chính của đề tài</w:t>
       </w:r>
@@ -3036,7 +3322,7 @@
       <w:pPr>
         <w:pStyle w:val="Heading4"/>
       </w:pPr>
-      <w:bookmarkStart w:id="7" w:name="_Toc236231642"/>
+      <w:bookmarkStart w:id="7" w:name="_Toc236264115"/>
       <w:r>
         <w:t>1.1.2. Lý do lựa chọn đề tài</w:t>
       </w:r>
@@ -3090,7 +3376,7 @@
       <w:pPr>
         <w:pStyle w:val="Heading4"/>
       </w:pPr>
-      <w:bookmarkStart w:id="8" w:name="_Toc236231643"/>
+      <w:bookmarkStart w:id="8" w:name="_Toc236264116"/>
       <w:r>
         <w:t>1.1.3. Mối liên hệ với môn học</w:t>
       </w:r>
@@ -3124,7 +3410,7 @@
       <w:pPr>
         <w:pStyle w:val="Heading4"/>
       </w:pPr>
-      <w:bookmarkStart w:id="9" w:name="_Toc236231644"/>
+      <w:bookmarkStart w:id="9" w:name="_Toc236264117"/>
       <w:r>
         <w:t>1.1.4. Mục tiêu nghiên cứu</w:t>
       </w:r>
@@ -3262,7 +3548,7 @@
       <w:pPr>
         <w:pStyle w:val="Heading1"/>
       </w:pPr>
-      <w:bookmarkStart w:id="10" w:name="_Toc236231645"/>
+      <w:bookmarkStart w:id="10" w:name="_Toc236264118"/>
       <w:r>
         <w:lastRenderedPageBreak/>
         <w:t>Chương II.</w:t>
@@ -3288,7 +3574,7 @@
       <w:pPr>
         <w:pStyle w:val="Heading2"/>
       </w:pPr>
-      <w:bookmarkStart w:id="11" w:name="_Toc236231646"/>
+      <w:bookmarkStart w:id="11" w:name="_Toc236264119"/>
       <w:r>
         <w:t xml:space="preserve">2. </w:t>
       </w:r>
@@ -3301,7 +3587,7 @@
       <w:pPr>
         <w:pStyle w:val="Heading3"/>
       </w:pPr>
-      <w:bookmarkStart w:id="12" w:name="_Toc236231647"/>
+      <w:bookmarkStart w:id="12" w:name="_Toc236264120"/>
       <w:r>
         <w:t xml:space="preserve">2.1. </w:t>
       </w:r>
@@ -3317,7 +3603,7 @@
       <w:pPr>
         <w:pStyle w:val="Heading4"/>
       </w:pPr>
-      <w:bookmarkStart w:id="13" w:name="_Toc236231648"/>
+      <w:bookmarkStart w:id="13" w:name="_Toc236264121"/>
       <w:r>
         <w:t>2.1.1 Phân loại quy trình</w:t>
       </w:r>
@@ -5512,7 +5798,7 @@
       <w:pPr>
         <w:pStyle w:val="Heading4"/>
       </w:pPr>
-      <w:bookmarkStart w:id="14" w:name="_Toc236231649"/>
+      <w:bookmarkStart w:id="14" w:name="_Toc236264122"/>
       <w:r>
         <w:lastRenderedPageBreak/>
         <w:t>2.</w:t>
@@ -5532,7 +5818,7 @@
       <w:pPr>
         <w:pStyle w:val="Heading4"/>
       </w:pPr>
-      <w:bookmarkStart w:id="15" w:name="_Toc236231650"/>
+      <w:bookmarkStart w:id="15" w:name="_Toc236264123"/>
       <w:r>
         <w:t>2.</w:t>
       </w:r>
@@ -5546,6 +5832,19 @@
         <w:t>.</w:t>
       </w:r>
       <w:bookmarkEnd w:id="15"/>
+    </w:p>
+    <w:p>
+      <w:pPr>
+        <w:pStyle w:val="Heading5"/>
+      </w:pPr>
+      <w:bookmarkStart w:id="16" w:name="_Toc236264124"/>
+      <w:r>
+        <w:t xml:space="preserve">2.1.3.1 </w:t>
+      </w:r>
+      <w:r>
+        <w:t>Quy trình tiếp nhận hồ sơ</w:t>
+      </w:r>
+      <w:bookmarkEnd w:id="16"/>
     </w:p>
     <w:p>
       <w:pPr>
@@ -5609,22 +5908,51 @@
       <w:pPr>
         <w:pStyle w:val="Caption"/>
       </w:pPr>
-      <w:bookmarkStart w:id="16" w:name="_Toc236242614"/>
+      <w:bookmarkStart w:id="17" w:name="_Toc236263980"/>
       <w:r>
         <w:t xml:space="preserve">Hình </w:t>
       </w:r>
-      <w:fldSimple w:instr=" SEQ Hình \* ARABIC ">
-        <w:r>
-          <w:rPr>
-            <w:noProof/>
-          </w:rPr>
-          <w:t>1</w:t>
-        </w:r>
-      </w:fldSimple>
+      <w:r>
+        <w:fldChar w:fldCharType="begin"/>
+      </w:r>
+      <w:r>
+        <w:instrText xml:space="preserve"> SEQ Hình \* ARABIC </w:instrText>
+      </w:r>
+      <w:r>
+        <w:fldChar w:fldCharType="separate"/>
+      </w:r>
+      <w:r>
+        <w:rPr>
+          <w:noProof/>
+        </w:rPr>
+        <w:t>1</w:t>
+      </w:r>
+      <w:r>
+        <w:rPr>
+          <w:noProof/>
+        </w:rPr>
+        <w:fldChar w:fldCharType="end"/>
+      </w:r>
       <w:r>
         <w:t>. Quy trình tiếp nhận hồ sơ</w:t>
       </w:r>
-      <w:bookmarkEnd w:id="16"/>
+      <w:bookmarkEnd w:id="17"/>
+    </w:p>
+    <w:p>
+      <w:pPr>
+        <w:pStyle w:val="Heading5"/>
+      </w:pPr>
+      <w:bookmarkStart w:id="18" w:name="_Toc236264125"/>
+      <w:r>
+        <w:t>2.1.3.</w:t>
+      </w:r>
+      <w:r>
+        <w:t>2</w:t>
+      </w:r>
+      <w:r>
+        <w:t xml:space="preserve"> Quy trình tiếp nhận hồ sơ</w:t>
+      </w:r>
+      <w:bookmarkEnd w:id="18"/>
     </w:p>
     <w:p>
       <w:pPr>
@@ -5688,22 +6016,51 @@
       <w:pPr>
         <w:pStyle w:val="Caption"/>
       </w:pPr>
-      <w:bookmarkStart w:id="17" w:name="_Toc236242615"/>
+      <w:bookmarkStart w:id="19" w:name="_Toc236263981"/>
       <w:r>
         <w:t xml:space="preserve">Hình </w:t>
       </w:r>
-      <w:fldSimple w:instr=" SEQ Hình \* ARABIC ">
-        <w:r>
-          <w:rPr>
-            <w:noProof/>
-          </w:rPr>
-          <w:t>2</w:t>
-        </w:r>
-      </w:fldSimple>
+      <w:r>
+        <w:fldChar w:fldCharType="begin"/>
+      </w:r>
+      <w:r>
+        <w:instrText xml:space="preserve"> SEQ Hình \* ARABIC </w:instrText>
+      </w:r>
+      <w:r>
+        <w:fldChar w:fldCharType="separate"/>
+      </w:r>
+      <w:r>
+        <w:rPr>
+          <w:noProof/>
+        </w:rPr>
+        <w:t>2</w:t>
+      </w:r>
+      <w:r>
+        <w:rPr>
+          <w:noProof/>
+        </w:rPr>
+        <w:fldChar w:fldCharType="end"/>
+      </w:r>
       <w:r>
         <w:t>. Quy trình kiểm tra, thẩm định và xử lý hồ sơ</w:t>
       </w:r>
-      <w:bookmarkEnd w:id="17"/>
+      <w:bookmarkEnd w:id="19"/>
+    </w:p>
+    <w:p>
+      <w:pPr>
+        <w:pStyle w:val="Heading5"/>
+      </w:pPr>
+      <w:bookmarkStart w:id="20" w:name="_Toc236264126"/>
+      <w:r>
+        <w:t>2.1.3.</w:t>
+      </w:r>
+      <w:r>
+        <w:t>3</w:t>
+      </w:r>
+      <w:r>
+        <w:t xml:space="preserve"> Quy trình kiểm tra, thẩm định và xử lý hồ sơ</w:t>
+      </w:r>
+      <w:bookmarkEnd w:id="20"/>
     </w:p>
     <w:p>
       <w:pPr>
@@ -5767,22 +6124,189 @@
       <w:pPr>
         <w:pStyle w:val="Caption"/>
       </w:pPr>
-      <w:bookmarkStart w:id="18" w:name="_Toc236242616"/>
+      <w:bookmarkStart w:id="21" w:name="_Toc236263982"/>
       <w:r>
         <w:t xml:space="preserve">Hình </w:t>
       </w:r>
-      <w:fldSimple w:instr=" SEQ Hình \* ARABIC ">
-        <w:r>
-          <w:rPr>
-            <w:noProof/>
-          </w:rPr>
-          <w:t>3</w:t>
-        </w:r>
-      </w:fldSimple>
+      <w:r>
+        <w:fldChar w:fldCharType="begin"/>
+      </w:r>
+      <w:r>
+        <w:instrText xml:space="preserve"> SEQ Hình \* ARABIC </w:instrText>
+      </w:r>
+      <w:r>
+        <w:fldChar w:fldCharType="separate"/>
+      </w:r>
+      <w:r>
+        <w:rPr>
+          <w:noProof/>
+        </w:rPr>
+        <w:t>3</w:t>
+      </w:r>
+      <w:r>
+        <w:rPr>
+          <w:noProof/>
+        </w:rPr>
+        <w:fldChar w:fldCharType="end"/>
+      </w:r>
       <w:r>
         <w:t>. Quy trình phê duyệt và ban hành kết quả</w:t>
       </w:r>
-      <w:bookmarkEnd w:id="18"/>
+      <w:bookmarkEnd w:id="21"/>
+    </w:p>
+    <w:p>
+      <w:pPr>
+        <w:jc w:val="both"/>
+      </w:pPr>
+      <w:r>
+        <w:t>TÁC NHÂN THỰC HIỆN</w:t>
+      </w:r>
+    </w:p>
+    <w:p>
+      <w:pPr>
+        <w:ind w:firstLine="720"/>
+        <w:jc w:val="both"/>
+      </w:pPr>
+      <w:r>
+        <w:t>Cán bộ chuyên môn, lãnh đạo hoặc người có thẩm quyền phê duyệt, hệ thống ký số và hệ thống thông tin giải quyết thủ tục hành chính.</w:t>
+      </w:r>
+    </w:p>
+    <w:p>
+      <w:pPr>
+        <w:jc w:val="both"/>
+      </w:pPr>
+      <w:r>
+        <w:t>MÔ TẢ QUY TRÌNH</w:t>
+      </w:r>
+    </w:p>
+    <w:p>
+      <w:pPr>
+        <w:pStyle w:val="ListParagraph"/>
+        <w:numPr>
+          <w:ilvl w:val="0"/>
+          <w:numId w:val="10"/>
+        </w:numPr>
+        <w:jc w:val="both"/>
+      </w:pPr>
+      <w:r>
+        <w:t xml:space="preserve">Tiếp nhận kết quả xử lý: Bộ phận hoặc người có thẩm quyền nhận dự thảo kết quả do cán bộ chuyên môn chuyển đến. </w:t>
+      </w:r>
+    </w:p>
+    <w:p>
+      <w:pPr>
+        <w:pStyle w:val="ListParagraph"/>
+        <w:numPr>
+          <w:ilvl w:val="0"/>
+          <w:numId w:val="10"/>
+        </w:numPr>
+        <w:jc w:val="both"/>
+      </w:pPr>
+      <w:r>
+        <w:t xml:space="preserve">Kiểm tra nội dung: Nội dung dự thảo, thông tin hồ sơ và căn cứ xử lý được kiểm tra trước khi trình phê duyệt. </w:t>
+      </w:r>
+    </w:p>
+    <w:p>
+      <w:pPr>
+        <w:pStyle w:val="ListParagraph"/>
+        <w:numPr>
+          <w:ilvl w:val="0"/>
+          <w:numId w:val="10"/>
+        </w:numPr>
+        <w:jc w:val="both"/>
+      </w:pPr>
+      <w:r>
+        <w:t xml:space="preserve">Trình phê duyệt: Dự thảo kết quả được chuyển đến lãnh đạo hoặc người có thẩm quyền xem xét. </w:t>
+      </w:r>
+    </w:p>
+    <w:p>
+      <w:pPr>
+        <w:pStyle w:val="ListParagraph"/>
+        <w:numPr>
+          <w:ilvl w:val="0"/>
+          <w:numId w:val="10"/>
+        </w:numPr>
+        <w:jc w:val="both"/>
+      </w:pPr>
+      <w:r>
+        <w:t xml:space="preserve">Xem xét phê duyệt: Người có thẩm quyền đánh giá nội dung và quyết định chấp thuận hoặc trả lại để chỉnh sửa. </w:t>
+      </w:r>
+    </w:p>
+    <w:p>
+      <w:pPr>
+        <w:pStyle w:val="ListParagraph"/>
+        <w:numPr>
+          <w:ilvl w:val="0"/>
+          <w:numId w:val="10"/>
+        </w:numPr>
+        <w:jc w:val="both"/>
+      </w:pPr>
+      <w:r>
+        <w:t xml:space="preserve">Ký số hoặc ký duyệt: Trường hợp được chấp thuận, kết quả được ký số hoặc ký duyệt theo quy định. </w:t>
+      </w:r>
+    </w:p>
+    <w:p>
+      <w:pPr>
+        <w:pStyle w:val="ListParagraph"/>
+        <w:numPr>
+          <w:ilvl w:val="0"/>
+          <w:numId w:val="10"/>
+        </w:numPr>
+        <w:jc w:val="both"/>
+      </w:pPr>
+      <w:r>
+        <w:t>Ban hành kết quả: Hệ thống ghi nhận kết quả đã được ban hành và chuyển đến bộ phận trả kết quả.</w:t>
+      </w:r>
+    </w:p>
+    <w:p>
+      <w:pPr>
+        <w:jc w:val="both"/>
+      </w:pPr>
+      <w:r>
+        <w:lastRenderedPageBreak/>
+        <w:t>ĐỐI TƯỢNG KHÁCH HÀNG</w:t>
+      </w:r>
+    </w:p>
+    <w:p>
+      <w:pPr>
+        <w:ind w:firstLine="720"/>
+        <w:jc w:val="both"/>
+      </w:pPr>
+      <w:r>
+        <w:t xml:space="preserve">Người dân hoặc tổ chức đang chờ nhận kết quả giải quyết thủ tục hành chính. </w:t>
+      </w:r>
+    </w:p>
+    <w:p>
+      <w:pPr>
+        <w:jc w:val="both"/>
+      </w:pPr>
+      <w:r>
+        <w:t>CÁC KẾT QUẢ CÓ THỂ XẢY RA</w:t>
+      </w:r>
+    </w:p>
+    <w:p>
+      <w:pPr>
+        <w:ind w:firstLine="720"/>
+        <w:jc w:val="both"/>
+      </w:pPr>
+      <w:r>
+        <w:t>Kết quả được phê duyệt, ký và ban hành; dự thảo bị trả lại để chỉnh sửa; hồ sơ cần xử lý lại; hoặc ban hành thông báo từ chối giải quyết nếu hồ sơ không đáp ứng điều kiện.</w:t>
+      </w:r>
+    </w:p>
+    <w:p>
+      <w:pPr>
+        <w:pStyle w:val="Heading5"/>
+      </w:pPr>
+      <w:bookmarkStart w:id="22" w:name="_Toc236264127"/>
+      <w:r>
+        <w:t>2.1.3.</w:t>
+      </w:r>
+      <w:r>
+        <w:t>4</w:t>
+      </w:r>
+      <w:r>
+        <w:t xml:space="preserve"> Quy trình trả kết và thông báo</w:t>
+      </w:r>
+      <w:bookmarkEnd w:id="22"/>
     </w:p>
     <w:p>
       <w:pPr>
@@ -5846,28 +6370,179 @@
       <w:pPr>
         <w:pStyle w:val="Caption"/>
       </w:pPr>
-      <w:bookmarkStart w:id="19" w:name="_Toc236242617"/>
+      <w:bookmarkStart w:id="23" w:name="_Toc236263983"/>
       <w:r>
         <w:t xml:space="preserve">Hình </w:t>
       </w:r>
-      <w:fldSimple w:instr=" SEQ Hình \* ARABIC ">
-        <w:r>
-          <w:rPr>
-            <w:noProof/>
-          </w:rPr>
-          <w:t>4</w:t>
-        </w:r>
-      </w:fldSimple>
+      <w:r>
+        <w:fldChar w:fldCharType="begin"/>
+      </w:r>
+      <w:r>
+        <w:instrText xml:space="preserve"> SEQ Hình \* ARABIC </w:instrText>
+      </w:r>
+      <w:r>
+        <w:fldChar w:fldCharType="separate"/>
+      </w:r>
+      <w:r>
+        <w:rPr>
+          <w:noProof/>
+        </w:rPr>
+        <w:t>4</w:t>
+      </w:r>
+      <w:r>
+        <w:rPr>
+          <w:noProof/>
+        </w:rPr>
+        <w:fldChar w:fldCharType="end"/>
+      </w:r>
       <w:r>
         <w:t>. Quy trình trả kết và thông báo</w:t>
       </w:r>
-      <w:bookmarkEnd w:id="19"/>
+      <w:bookmarkEnd w:id="23"/>
+    </w:p>
+    <w:p>
+      <w:pPr>
+        <w:jc w:val="both"/>
+      </w:pPr>
+      <w:r>
+        <w:t>TÁC NHÂN THỰC HIỆN</w:t>
+      </w:r>
+    </w:p>
+    <w:p>
+      <w:pPr>
+        <w:ind w:firstLine="720"/>
+        <w:jc w:val="both"/>
+      </w:pPr>
+      <w:r>
+        <w:t>Cán bộ tiếp nhận và trả kết quả, người dân hoặc tổ chức, hệ thống thông tin giải quyết thủ tục hành chính, hệ thống thanh toán và đơn vị bưu chính nếu có.</w:t>
+      </w:r>
+    </w:p>
+    <w:p>
+      <w:pPr>
+        <w:jc w:val="both"/>
+      </w:pPr>
+      <w:r>
+        <w:t>MÔ TẢ QUY TRÌNH</w:t>
+      </w:r>
+    </w:p>
+    <w:p>
+      <w:pPr>
+        <w:pStyle w:val="ListParagraph"/>
+        <w:numPr>
+          <w:ilvl w:val="0"/>
+          <w:numId w:val="11"/>
+        </w:numPr>
+        <w:jc w:val="both"/>
+      </w:pPr>
+      <w:r>
+        <w:t xml:space="preserve">Nhận kết quả: Bộ phận tiếp nhận và trả kết quả nhận kết quả đã được phê duyệt và ban hành. </w:t>
+      </w:r>
+    </w:p>
+    <w:p>
+      <w:pPr>
+        <w:pStyle w:val="ListParagraph"/>
+        <w:numPr>
+          <w:ilvl w:val="0"/>
+          <w:numId w:val="11"/>
+        </w:numPr>
+        <w:jc w:val="both"/>
+      </w:pPr>
+      <w:r>
+        <w:t xml:space="preserve">Cập nhật trạng thái: Hệ thống cập nhật trạng thái hồ sơ sang đã có kết quả hoặc chờ trả kết quả. </w:t>
+      </w:r>
+    </w:p>
+    <w:p>
+      <w:pPr>
+        <w:pStyle w:val="ListParagraph"/>
+        <w:numPr>
+          <w:ilvl w:val="0"/>
+          <w:numId w:val="11"/>
+        </w:numPr>
+        <w:jc w:val="both"/>
+      </w:pPr>
+      <w:r>
+        <w:t xml:space="preserve">Thông báo kết quả: Hệ thống gửi thông báo cho người dân về tình trạng hồ sơ, thời gian và hình thức nhận kết quả. </w:t>
+      </w:r>
+    </w:p>
+    <w:p>
+      <w:pPr>
+        <w:pStyle w:val="ListParagraph"/>
+        <w:numPr>
+          <w:ilvl w:val="0"/>
+          <w:numId w:val="11"/>
+        </w:numPr>
+        <w:jc w:val="both"/>
+      </w:pPr>
+      <w:r>
+        <w:t xml:space="preserve">Xác nhận thanh toán: Trường hợp thủ tục có phí hoặc lệ phí, hệ thống hoặc cán bộ kiểm tra việc hoàn thành nghĩa vụ thanh toán. </w:t>
+      </w:r>
+    </w:p>
+    <w:p>
+      <w:pPr>
+        <w:pStyle w:val="ListParagraph"/>
+        <w:numPr>
+          <w:ilvl w:val="0"/>
+          <w:numId w:val="11"/>
+        </w:numPr>
+        <w:jc w:val="both"/>
+      </w:pPr>
+      <w:r>
+        <w:t xml:space="preserve">Trả kết quả: Kết quả được trả trực tuyến, trực tiếp tại Bộ phận Một cửa hoặc thông qua dịch vụ bưu chính. </w:t>
+      </w:r>
+    </w:p>
+    <w:p>
+      <w:pPr>
+        <w:pStyle w:val="ListParagraph"/>
+        <w:numPr>
+          <w:ilvl w:val="0"/>
+          <w:numId w:val="11"/>
+        </w:numPr>
+        <w:jc w:val="both"/>
+      </w:pPr>
+      <w:r>
+        <w:t>Lưu hồ sơ: Sau khi hoàn thành việc trả kết quả, hệ thống cập nhật trạng thái kết thúc và lưu trữ hồ sơ.</w:t>
+      </w:r>
+    </w:p>
+    <w:p>
+      <w:pPr>
+        <w:jc w:val="both"/>
+      </w:pPr>
+      <w:r>
+        <w:t>ĐỐI TƯỢNG KHÁCH HÀNG</w:t>
+      </w:r>
+    </w:p>
+    <w:p>
+      <w:pPr>
+        <w:ind w:firstLine="720"/>
+        <w:jc w:val="both"/>
+      </w:pPr>
+      <w:r>
+        <w:t>Người dân hoặc tổ chức có hồ sơ đã được giải quyết và đang chờ nhận kết quả.</w:t>
+      </w:r>
+    </w:p>
+    <w:p>
+      <w:pPr>
+        <w:jc w:val="both"/>
+      </w:pPr>
+      <w:r>
+        <w:t>CÁC KẾT QUẢ CÓ THỂ XẢY RA</w:t>
+      </w:r>
+    </w:p>
+    <w:p>
+      <w:pPr>
+        <w:ind w:firstLine="720"/>
+        <w:jc w:val="both"/>
+      </w:pPr>
+      <w:r>
+        <w:lastRenderedPageBreak/>
+        <w:t>Kết quả được trả thành công; hồ sơ chờ người dân đến nhận; hồ sơ chưa được trả do chưa hoàn thành thanh toán; việc giao kết quả qua bưu chính không thành công; hoặc hồ sơ được đóng và lưu trữ sau khi hoàn tất.</w:t>
+      </w:r>
     </w:p>
     <w:p>
       <w:pPr>
         <w:pStyle w:val="Heading4"/>
       </w:pPr>
-      <w:bookmarkStart w:id="20" w:name="_Toc236231651"/>
+      <w:bookmarkStart w:id="24" w:name="_Toc236264128"/>
       <w:r>
         <w:t>2.</w:t>
       </w:r>
@@ -5880,43 +6555,43 @@
       <w:r>
         <w:t>.</w:t>
       </w:r>
-      <w:bookmarkEnd w:id="20"/>
+      <w:bookmarkEnd w:id="24"/>
     </w:p>
     <w:p>
       <w:pPr>
         <w:pStyle w:val="Heading3"/>
       </w:pPr>
-      <w:bookmarkStart w:id="21" w:name="_Toc236231652"/>
+      <w:bookmarkStart w:id="25" w:name="_Toc236264129"/>
       <w:r>
         <w:t>2.2 Mô hình hóa quy trình quản lý (Processs Management)</w:t>
       </w:r>
       <w:r>
         <w:t>.</w:t>
       </w:r>
-      <w:bookmarkEnd w:id="21"/>
+      <w:bookmarkEnd w:id="25"/>
     </w:p>
     <w:p>
       <w:pPr>
         <w:pStyle w:val="Heading3"/>
       </w:pPr>
-      <w:bookmarkStart w:id="22" w:name="_Toc236231653"/>
+      <w:bookmarkStart w:id="26" w:name="_Toc236264130"/>
       <w:r>
         <w:t>2.3 Mô hình hóa quy trình cốt lõi (Processs Core)</w:t>
       </w:r>
       <w:r>
         <w:t>.</w:t>
       </w:r>
-      <w:bookmarkEnd w:id="22"/>
+      <w:bookmarkEnd w:id="26"/>
     </w:p>
     <w:p>
       <w:pPr>
         <w:pStyle w:val="Heading3"/>
       </w:pPr>
-      <w:bookmarkStart w:id="23" w:name="_Toc236231654"/>
+      <w:bookmarkStart w:id="27" w:name="_Toc236264131"/>
       <w:r>
         <w:t>2.4 Mô hình hóa quy trình hỗ trợ (Processs Support)</w:t>
       </w:r>
-      <w:bookmarkEnd w:id="23"/>
+      <w:bookmarkEnd w:id="27"/>
     </w:p>
     <w:p/>
     <w:p/>
@@ -5940,7 +6615,7 @@
       <w:pPr>
         <w:pStyle w:val="Heading1"/>
       </w:pPr>
-      <w:bookmarkStart w:id="24" w:name="_Toc236231655"/>
+      <w:bookmarkStart w:id="28" w:name="_Toc236264132"/>
       <w:r>
         <w:lastRenderedPageBreak/>
         <w:t xml:space="preserve">Chương III. </w:t>
@@ -5951,7 +6626,7 @@
       <w:r>
         <w:t>.</w:t>
       </w:r>
-      <w:bookmarkEnd w:id="24"/>
+      <w:bookmarkEnd w:id="28"/>
     </w:p>
     <w:p>
       <w:pPr>
@@ -6017,7 +6692,7 @@
       <w:pPr>
         <w:pStyle w:val="Heading1"/>
       </w:pPr>
-      <w:bookmarkStart w:id="25" w:name="_Toc236231656"/>
+      <w:bookmarkStart w:id="29" w:name="_Toc236264133"/>
       <w:r>
         <w:lastRenderedPageBreak/>
         <w:t xml:space="preserve">Chương IV. </w:t>
@@ -6028,7 +6703,7 @@
       <w:r>
         <w:t>.</w:t>
       </w:r>
-      <w:bookmarkEnd w:id="25"/>
+      <w:bookmarkEnd w:id="29"/>
     </w:p>
     <w:p>
       <w:pPr>
@@ -6136,12 +6811,12 @@
       <w:pPr>
         <w:pStyle w:val="Heading1"/>
       </w:pPr>
-      <w:bookmarkStart w:id="26" w:name="_Toc236231657"/>
+      <w:bookmarkStart w:id="30" w:name="_Toc236264134"/>
       <w:r>
         <w:lastRenderedPageBreak/>
         <w:t>NGUỒN THAM KHẢO</w:t>
       </w:r>
-      <w:bookmarkEnd w:id="26"/>
+      <w:bookmarkEnd w:id="30"/>
     </w:p>
     <w:p>
       <w:pPr>
@@ -6791,6 +7466,232 @@
     </w:lvl>
   </w:abstractNum>
   <w:abstractNum w:abstractNumId="4" w15:restartNumberingAfterBreak="0">
+    <w:nsid w:val="5ED84B0F"/>
+    <w:multiLevelType w:val="hybridMultilevel"/>
+    <w:tmpl w:val="74FECAAE"/>
+    <w:lvl w:ilvl="0" w:tplc="04090001">
+      <w:start w:val="1"/>
+      <w:numFmt w:val="bullet"/>
+      <w:lvlText w:val=""/>
+      <w:lvlJc w:val="left"/>
+      <w:pPr>
+        <w:ind w:left="720" w:hanging="360"/>
+      </w:pPr>
+      <w:rPr>
+        <w:rFonts w:ascii="Symbol" w:hAnsi="Symbol" w:hint="default"/>
+      </w:rPr>
+    </w:lvl>
+    <w:lvl w:ilvl="1" w:tplc="FFFFFFFF">
+      <w:start w:val="1"/>
+      <w:numFmt w:val="bullet"/>
+      <w:lvlText w:val="o"/>
+      <w:lvlJc w:val="left"/>
+      <w:pPr>
+        <w:ind w:left="1440" w:hanging="360"/>
+      </w:pPr>
+      <w:rPr>
+        <w:rFonts w:ascii="Courier New" w:hAnsi="Courier New" w:cs="Courier New" w:hint="default"/>
+      </w:rPr>
+    </w:lvl>
+    <w:lvl w:ilvl="2" w:tplc="FFFFFFFF">
+      <w:start w:val="1"/>
+      <w:numFmt w:val="bullet"/>
+      <w:lvlText w:val=""/>
+      <w:lvlJc w:val="left"/>
+      <w:pPr>
+        <w:ind w:left="2160" w:hanging="360"/>
+      </w:pPr>
+      <w:rPr>
+        <w:rFonts w:ascii="Wingdings" w:hAnsi="Wingdings" w:hint="default"/>
+      </w:rPr>
+    </w:lvl>
+    <w:lvl w:ilvl="3" w:tplc="FFFFFFFF">
+      <w:start w:val="1"/>
+      <w:numFmt w:val="bullet"/>
+      <w:lvlText w:val=""/>
+      <w:lvlJc w:val="left"/>
+      <w:pPr>
+        <w:ind w:left="2880" w:hanging="360"/>
+      </w:pPr>
+      <w:rPr>
+        <w:rFonts w:ascii="Symbol" w:hAnsi="Symbol" w:hint="default"/>
+      </w:rPr>
+    </w:lvl>
+    <w:lvl w:ilvl="4" w:tplc="FFFFFFFF">
+      <w:start w:val="1"/>
+      <w:numFmt w:val="bullet"/>
+      <w:lvlText w:val="o"/>
+      <w:lvlJc w:val="left"/>
+      <w:pPr>
+        <w:ind w:left="3600" w:hanging="360"/>
+      </w:pPr>
+      <w:rPr>
+        <w:rFonts w:ascii="Courier New" w:hAnsi="Courier New" w:cs="Courier New" w:hint="default"/>
+      </w:rPr>
+    </w:lvl>
+    <w:lvl w:ilvl="5" w:tplc="FFFFFFFF">
+      <w:start w:val="1"/>
+      <w:numFmt w:val="bullet"/>
+      <w:lvlText w:val=""/>
+      <w:lvlJc w:val="left"/>
+      <w:pPr>
+        <w:ind w:left="4320" w:hanging="360"/>
+      </w:pPr>
+      <w:rPr>
+        <w:rFonts w:ascii="Wingdings" w:hAnsi="Wingdings" w:hint="default"/>
+      </w:rPr>
+    </w:lvl>
+    <w:lvl w:ilvl="6" w:tplc="FFFFFFFF">
+      <w:start w:val="1"/>
+      <w:numFmt w:val="bullet"/>
+      <w:lvlText w:val=""/>
+      <w:lvlJc w:val="left"/>
+      <w:pPr>
+        <w:ind w:left="5040" w:hanging="360"/>
+      </w:pPr>
+      <w:rPr>
+        <w:rFonts w:ascii="Symbol" w:hAnsi="Symbol" w:hint="default"/>
+      </w:rPr>
+    </w:lvl>
+    <w:lvl w:ilvl="7" w:tplc="FFFFFFFF">
+      <w:start w:val="1"/>
+      <w:numFmt w:val="bullet"/>
+      <w:lvlText w:val="o"/>
+      <w:lvlJc w:val="left"/>
+      <w:pPr>
+        <w:ind w:left="5760" w:hanging="360"/>
+      </w:pPr>
+      <w:rPr>
+        <w:rFonts w:ascii="Courier New" w:hAnsi="Courier New" w:cs="Courier New" w:hint="default"/>
+      </w:rPr>
+    </w:lvl>
+    <w:lvl w:ilvl="8" w:tplc="FFFFFFFF">
+      <w:start w:val="1"/>
+      <w:numFmt w:val="bullet"/>
+      <w:lvlText w:val=""/>
+      <w:lvlJc w:val="left"/>
+      <w:pPr>
+        <w:ind w:left="6480" w:hanging="360"/>
+      </w:pPr>
+      <w:rPr>
+        <w:rFonts w:ascii="Wingdings" w:hAnsi="Wingdings" w:hint="default"/>
+      </w:rPr>
+    </w:lvl>
+  </w:abstractNum>
+  <w:abstractNum w:abstractNumId="5" w15:restartNumberingAfterBreak="0">
+    <w:nsid w:val="63B60C33"/>
+    <w:multiLevelType w:val="hybridMultilevel"/>
+    <w:tmpl w:val="635C44DE"/>
+    <w:lvl w:ilvl="0" w:tplc="04090001">
+      <w:start w:val="1"/>
+      <w:numFmt w:val="bullet"/>
+      <w:lvlText w:val=""/>
+      <w:lvlJc w:val="left"/>
+      <w:pPr>
+        <w:ind w:left="720" w:hanging="360"/>
+      </w:pPr>
+      <w:rPr>
+        <w:rFonts w:ascii="Symbol" w:hAnsi="Symbol" w:hint="default"/>
+      </w:rPr>
+    </w:lvl>
+    <w:lvl w:ilvl="1" w:tplc="04090003" w:tentative="1">
+      <w:start w:val="1"/>
+      <w:numFmt w:val="bullet"/>
+      <w:lvlText w:val="o"/>
+      <w:lvlJc w:val="left"/>
+      <w:pPr>
+        <w:ind w:left="1440" w:hanging="360"/>
+      </w:pPr>
+      <w:rPr>
+        <w:rFonts w:ascii="Courier New" w:hAnsi="Courier New" w:cs="Courier New" w:hint="default"/>
+      </w:rPr>
+    </w:lvl>
+    <w:lvl w:ilvl="2" w:tplc="04090005" w:tentative="1">
+      <w:start w:val="1"/>
+      <w:numFmt w:val="bullet"/>
+      <w:lvlText w:val=""/>
+      <w:lvlJc w:val="left"/>
+      <w:pPr>
+        <w:ind w:left="2160" w:hanging="360"/>
+      </w:pPr>
+      <w:rPr>
+        <w:rFonts w:ascii="Wingdings" w:hAnsi="Wingdings" w:hint="default"/>
+      </w:rPr>
+    </w:lvl>
+    <w:lvl w:ilvl="3" w:tplc="04090001" w:tentative="1">
+      <w:start w:val="1"/>
+      <w:numFmt w:val="bullet"/>
+      <w:lvlText w:val=""/>
+      <w:lvlJc w:val="left"/>
+      <w:pPr>
+        <w:ind w:left="2880" w:hanging="360"/>
+      </w:pPr>
+      <w:rPr>
+        <w:rFonts w:ascii="Symbol" w:hAnsi="Symbol" w:hint="default"/>
+      </w:rPr>
+    </w:lvl>
+    <w:lvl w:ilvl="4" w:tplc="04090003" w:tentative="1">
+      <w:start w:val="1"/>
+      <w:numFmt w:val="bullet"/>
+      <w:lvlText w:val="o"/>
+      <w:lvlJc w:val="left"/>
+      <w:pPr>
+        <w:ind w:left="3600" w:hanging="360"/>
+      </w:pPr>
+      <w:rPr>
+        <w:rFonts w:ascii="Courier New" w:hAnsi="Courier New" w:cs="Courier New" w:hint="default"/>
+      </w:rPr>
+    </w:lvl>
+    <w:lvl w:ilvl="5" w:tplc="04090005" w:tentative="1">
+      <w:start w:val="1"/>
+      <w:numFmt w:val="bullet"/>
+      <w:lvlText w:val=""/>
+      <w:lvlJc w:val="left"/>
+      <w:pPr>
+        <w:ind w:left="4320" w:hanging="360"/>
+      </w:pPr>
+      <w:rPr>
+        <w:rFonts w:ascii="Wingdings" w:hAnsi="Wingdings" w:hint="default"/>
+      </w:rPr>
+    </w:lvl>
+    <w:lvl w:ilvl="6" w:tplc="04090001" w:tentative="1">
+      <w:start w:val="1"/>
+      <w:numFmt w:val="bullet"/>
+      <w:lvlText w:val=""/>
+      <w:lvlJc w:val="left"/>
+      <w:pPr>
+        <w:ind w:left="5040" w:hanging="360"/>
+      </w:pPr>
+      <w:rPr>
+        <w:rFonts w:ascii="Symbol" w:hAnsi="Symbol" w:hint="default"/>
+      </w:rPr>
+    </w:lvl>
+    <w:lvl w:ilvl="7" w:tplc="04090003" w:tentative="1">
+      <w:start w:val="1"/>
+      <w:numFmt w:val="bullet"/>
+      <w:lvlText w:val="o"/>
+      <w:lvlJc w:val="left"/>
+      <w:pPr>
+        <w:ind w:left="5760" w:hanging="360"/>
+      </w:pPr>
+      <w:rPr>
+        <w:rFonts w:ascii="Courier New" w:hAnsi="Courier New" w:cs="Courier New" w:hint="default"/>
+      </w:rPr>
+    </w:lvl>
+    <w:lvl w:ilvl="8" w:tplc="04090005" w:tentative="1">
+      <w:start w:val="1"/>
+      <w:numFmt w:val="bullet"/>
+      <w:lvlText w:val=""/>
+      <w:lvlJc w:val="left"/>
+      <w:pPr>
+        <w:ind w:left="6480" w:hanging="360"/>
+      </w:pPr>
+      <w:rPr>
+        <w:rFonts w:ascii="Wingdings" w:hAnsi="Wingdings" w:hint="default"/>
+      </w:rPr>
+    </w:lvl>
+  </w:abstractNum>
+  <w:abstractNum w:abstractNumId="6" w15:restartNumberingAfterBreak="0">
     <w:nsid w:val="686F2D3F"/>
     <w:multiLevelType w:val="hybridMultilevel"/>
     <w:tmpl w:val="E4CE448E"/>
@@ -6879,7 +7780,120 @@
       </w:pPr>
     </w:lvl>
   </w:abstractNum>
-  <w:abstractNum w:abstractNumId="5" w15:restartNumberingAfterBreak="0">
+  <w:abstractNum w:abstractNumId="7" w15:restartNumberingAfterBreak="0">
+    <w:nsid w:val="6B3C3847"/>
+    <w:multiLevelType w:val="hybridMultilevel"/>
+    <w:tmpl w:val="564E730E"/>
+    <w:lvl w:ilvl="0" w:tplc="04090001">
+      <w:start w:val="1"/>
+      <w:numFmt w:val="bullet"/>
+      <w:lvlText w:val=""/>
+      <w:lvlJc w:val="left"/>
+      <w:pPr>
+        <w:ind w:left="720" w:hanging="360"/>
+      </w:pPr>
+      <w:rPr>
+        <w:rFonts w:ascii="Symbol" w:hAnsi="Symbol" w:hint="default"/>
+      </w:rPr>
+    </w:lvl>
+    <w:lvl w:ilvl="1" w:tplc="04090003" w:tentative="1">
+      <w:start w:val="1"/>
+      <w:numFmt w:val="bullet"/>
+      <w:lvlText w:val="o"/>
+      <w:lvlJc w:val="left"/>
+      <w:pPr>
+        <w:ind w:left="1440" w:hanging="360"/>
+      </w:pPr>
+      <w:rPr>
+        <w:rFonts w:ascii="Courier New" w:hAnsi="Courier New" w:cs="Courier New" w:hint="default"/>
+      </w:rPr>
+    </w:lvl>
+    <w:lvl w:ilvl="2" w:tplc="04090005" w:tentative="1">
+      <w:start w:val="1"/>
+      <w:numFmt w:val="bullet"/>
+      <w:lvlText w:val=""/>
+      <w:lvlJc w:val="left"/>
+      <w:pPr>
+        <w:ind w:left="2160" w:hanging="360"/>
+      </w:pPr>
+      <w:rPr>
+        <w:rFonts w:ascii="Wingdings" w:hAnsi="Wingdings" w:hint="default"/>
+      </w:rPr>
+    </w:lvl>
+    <w:lvl w:ilvl="3" w:tplc="04090001" w:tentative="1">
+      <w:start w:val="1"/>
+      <w:numFmt w:val="bullet"/>
+      <w:lvlText w:val=""/>
+      <w:lvlJc w:val="left"/>
+      <w:pPr>
+        <w:ind w:left="2880" w:hanging="360"/>
+      </w:pPr>
+      <w:rPr>
+        <w:rFonts w:ascii="Symbol" w:hAnsi="Symbol" w:hint="default"/>
+      </w:rPr>
+    </w:lvl>
+    <w:lvl w:ilvl="4" w:tplc="04090003" w:tentative="1">
+      <w:start w:val="1"/>
+      <w:numFmt w:val="bullet"/>
+      <w:lvlText w:val="o"/>
+      <w:lvlJc w:val="left"/>
+      <w:pPr>
+        <w:ind w:left="3600" w:hanging="360"/>
+      </w:pPr>
+      <w:rPr>
+        <w:rFonts w:ascii="Courier New" w:hAnsi="Courier New" w:cs="Courier New" w:hint="default"/>
+      </w:rPr>
+    </w:lvl>
+    <w:lvl w:ilvl="5" w:tplc="04090005" w:tentative="1">
+      <w:start w:val="1"/>
+      <w:numFmt w:val="bullet"/>
+      <w:lvlText w:val=""/>
+      <w:lvlJc w:val="left"/>
+      <w:pPr>
+        <w:ind w:left="4320" w:hanging="360"/>
+      </w:pPr>
+      <w:rPr>
+        <w:rFonts w:ascii="Wingdings" w:hAnsi="Wingdings" w:hint="default"/>
+      </w:rPr>
+    </w:lvl>
+    <w:lvl w:ilvl="6" w:tplc="04090001" w:tentative="1">
+      <w:start w:val="1"/>
+      <w:numFmt w:val="bullet"/>
+      <w:lvlText w:val=""/>
+      <w:lvlJc w:val="left"/>
+      <w:pPr>
+        <w:ind w:left="5040" w:hanging="360"/>
+      </w:pPr>
+      <w:rPr>
+        <w:rFonts w:ascii="Symbol" w:hAnsi="Symbol" w:hint="default"/>
+      </w:rPr>
+    </w:lvl>
+    <w:lvl w:ilvl="7" w:tplc="04090003" w:tentative="1">
+      <w:start w:val="1"/>
+      <w:numFmt w:val="bullet"/>
+      <w:lvlText w:val="o"/>
+      <w:lvlJc w:val="left"/>
+      <w:pPr>
+        <w:ind w:left="5760" w:hanging="360"/>
+      </w:pPr>
+      <w:rPr>
+        <w:rFonts w:ascii="Courier New" w:hAnsi="Courier New" w:cs="Courier New" w:hint="default"/>
+      </w:rPr>
+    </w:lvl>
+    <w:lvl w:ilvl="8" w:tplc="04090005" w:tentative="1">
+      <w:start w:val="1"/>
+      <w:numFmt w:val="bullet"/>
+      <w:lvlText w:val=""/>
+      <w:lvlJc w:val="left"/>
+      <w:pPr>
+        <w:ind w:left="6480" w:hanging="360"/>
+      </w:pPr>
+      <w:rPr>
+        <w:rFonts w:ascii="Wingdings" w:hAnsi="Wingdings" w:hint="default"/>
+      </w:rPr>
+    </w:lvl>
+  </w:abstractNum>
+  <w:abstractNum w:abstractNumId="8" w15:restartNumberingAfterBreak="0">
     <w:nsid w:val="6C833018"/>
     <w:multiLevelType w:val="hybridMultilevel"/>
     <w:tmpl w:val="1FD45FEA"/>
@@ -6968,7 +7982,7 @@
       </w:pPr>
     </w:lvl>
   </w:abstractNum>
-  <w:abstractNum w:abstractNumId="6" w15:restartNumberingAfterBreak="0">
+  <w:abstractNum w:abstractNumId="9" w15:restartNumberingAfterBreak="0">
     <w:nsid w:val="7577240C"/>
     <w:multiLevelType w:val="hybridMultilevel"/>
     <w:tmpl w:val="4B768118"/>
@@ -7081,7 +8095,7 @@
       </w:rPr>
     </w:lvl>
   </w:abstractNum>
-  <w:abstractNum w:abstractNumId="7" w15:restartNumberingAfterBreak="0">
+  <w:abstractNum w:abstractNumId="10" w15:restartNumberingAfterBreak="0">
     <w:nsid w:val="7E6B179C"/>
     <w:multiLevelType w:val="hybridMultilevel"/>
     <w:tmpl w:val="1D828BC2"/>
@@ -7204,19 +8218,28 @@
     <w:abstractNumId w:val="0"/>
   </w:num>
   <w:num w:numId="4" w16cid:durableId="959531810">
-    <w:abstractNumId w:val="5"/>
+    <w:abstractNumId w:val="8"/>
   </w:num>
   <w:num w:numId="5" w16cid:durableId="893854713">
     <w:abstractNumId w:val="1"/>
   </w:num>
   <w:num w:numId="6" w16cid:durableId="985860105">
+    <w:abstractNumId w:val="6"/>
+  </w:num>
+  <w:num w:numId="7" w16cid:durableId="504787989">
+    <w:abstractNumId w:val="9"/>
+  </w:num>
+  <w:num w:numId="8" w16cid:durableId="1805653140">
+    <w:abstractNumId w:val="10"/>
+  </w:num>
+  <w:num w:numId="9" w16cid:durableId="1366711880">
     <w:abstractNumId w:val="4"/>
   </w:num>
-  <w:num w:numId="7" w16cid:durableId="504787989">
-    <w:abstractNumId w:val="6"/>
+  <w:num w:numId="10" w16cid:durableId="1389844745">
+    <w:abstractNumId w:val="7"/>
   </w:num>
-  <w:num w:numId="8" w16cid:durableId="1805653140">
-    <w:abstractNumId w:val="7"/>
+  <w:num w:numId="11" w16cid:durableId="275254084">
+    <w:abstractNumId w:val="5"/>
   </w:num>
 </w:numbering>
 </file>
@@ -7721,10 +8744,9 @@
     <w:next w:val="Normal"/>
     <w:link w:val="Heading5Char"/>
     <w:uiPriority w:val="9"/>
-    <w:semiHidden/>
     <w:unhideWhenUsed/>
     <w:qFormat/>
-    <w:rsid w:val="003300AD"/>
+    <w:rsid w:val="00C049F6"/>
     <w:pPr>
       <w:keepNext/>
       <w:keepLines/>
@@ -7733,7 +8755,8 @@
     </w:pPr>
     <w:rPr>
       <w:rFonts w:eastAsiaTheme="majorEastAsia" w:cstheme="majorBidi"/>
-      <w:color w:val="0F4761" w:themeColor="accent1" w:themeShade="BF"/>
+      <w:b/>
+      <w:color w:val="000000" w:themeColor="text1"/>
     </w:rPr>
   </w:style>
   <w:style w:type="paragraph" w:styleId="Heading6">
@@ -7909,11 +8932,12 @@
     <w:basedOn w:val="DefaultParagraphFont"/>
     <w:link w:val="Heading5"/>
     <w:uiPriority w:val="9"/>
-    <w:semiHidden/>
-    <w:rsid w:val="003300AD"/>
+    <w:rsid w:val="00C049F6"/>
     <w:rPr>
-      <w:rFonts w:eastAsiaTheme="majorEastAsia" w:cstheme="majorBidi"/>
-      <w:color w:val="0F4761" w:themeColor="accent1" w:themeShade="BF"/>
+      <w:rFonts w:ascii="Times New Roman" w:eastAsiaTheme="majorEastAsia" w:hAnsi="Times New Roman" w:cstheme="majorBidi"/>
+      <w:b/>
+      <w:color w:val="000000" w:themeColor="text1"/>
+      <w:sz w:val="26"/>
     </w:rPr>
   </w:style>
   <w:style w:type="character" w:customStyle="1" w:styleId="Heading6Char">
@@ -8462,6 +9486,19 @@
       <w:ind w:left="1300"/>
     </w:pPr>
   </w:style>
+  <w:style w:type="paragraph" w:styleId="TOC5">
+    <w:name w:val="toc 5"/>
+    <w:basedOn w:val="Normal"/>
+    <w:next w:val="Normal"/>
+    <w:autoRedefine/>
+    <w:uiPriority w:val="39"/>
+    <w:unhideWhenUsed/>
+    <w:rsid w:val="00785E7D"/>
+    <w:pPr>
+      <w:spacing w:after="100"/>
+      <w:ind w:left="1040"/>
+    </w:pPr>
+  </w:style>
 </w:styles>
 </file>
 

</xml_diff>

<commit_message>
2.3.1.1 Mo ta mo hinh hoa quy trinh tiep nhan ho so
</commit_message>
<xml_diff>
--- a/He_thong_thong_tin_giai_quyet_hanh_chinh/NGUYEN TRUONG PHI_25410281/25410281_NguyenTruongPhi.docx
+++ b/He_thong_thong_tin_giai_quyet_hanh_chinh/NGUYEN TRUONG PHI_25410281/25410281_NguyenTruongPhi.docx
@@ -1,6 +1,6 @@
 
 <file path=word/document.xml><?xml version="1.0" encoding="utf-8"?>
-<w:document xmlns:wpc="http://schemas.microsoft.com/office/word/2010/wordprocessingCanvas" xmlns:cx="http://schemas.microsoft.com/office/drawing/2014/chartex" xmlns:cx1="http://schemas.microsoft.com/office/drawing/2015/9/8/chartex" xmlns:cx2="http://schemas.microsoft.com/office/drawing/2015/10/21/chartex" xmlns:cx3="http://schemas.microsoft.com/office/drawing/2016/5/9/chartex" xmlns:cx4="http://schemas.microsoft.com/office/drawing/2016/5/10/chartex" xmlns:cx5="http://schemas.microsoft.com/office/drawing/2016/5/11/chartex" xmlns:cx6="http://schemas.microsoft.com/office/drawing/2016/5/12/chartex" xmlns:cx7="http://schemas.microsoft.com/office/drawing/2016/5/13/chartex" xmlns:cx8="http://schemas.microsoft.com/office/drawing/2016/5/14/chartex" xmlns:mc="http://schemas.openxmlformats.org/markup-compatibility/2006" xmlns:aink="http://schemas.microsoft.com/office/drawing/2016/ink" xmlns:am3d="http://schemas.microsoft.com/office/drawing/2017/model3d" xmlns:o="urn:schemas-microsoft-com:office:office" xmlns:oel="http://schemas.microsoft.com/office/2019/extlst" xmlns:r="http://schemas.openxmlformats.org/officeDocument/2006/relationships" xmlns:m="http://schemas.openxmlformats.org/officeDocument/2006/math" xmlns:v="urn:schemas-microsoft-com:vml" xmlns:wp14="http://schemas.microsoft.com/office/word/2010/wordprocessingDrawing" xmlns:wp="http://schemas.openxmlformats.org/drawingml/2006/wordprocessingDrawing" xmlns:w10="urn:schemas-microsoft-com:office:word" xmlns:w="http://schemas.openxmlformats.org/wordprocessingml/2006/main" xmlns:w14="http://schemas.microsoft.com/office/word/2010/wordml" xmlns:w15="http://schemas.microsoft.com/office/word/2012/wordml" xmlns:w16cex="http://schemas.microsoft.com/office/word/2018/wordml/cex" xmlns:w16cid="http://schemas.microsoft.com/office/word/2016/wordml/cid" xmlns:w16="http://schemas.microsoft.com/office/word/2018/wordml" xmlns:w16du="http://schemas.microsoft.com/office/word/2023/wordml/word16du" xmlns:w16sdtdh="http://schemas.microsoft.com/office/word/2020/wordml/sdtdatahash" xmlns:w16sdtfl="http://schemas.microsoft.com/office/word/2024/wordml/sdtformatlock" xmlns:w16se="http://schemas.microsoft.com/office/word/2015/wordml/symex" xmlns:wpg="http://schemas.microsoft.com/office/word/2010/wordprocessingGroup" xmlns:wpi="http://schemas.microsoft.com/office/word/2010/wordprocessingInk" xmlns:wne="http://schemas.microsoft.com/office/word/2006/wordml" xmlns:wps="http://schemas.microsoft.com/office/word/2010/wordprocessingShape" mc:Ignorable="w14 w15 w16se w16cid w16 w16cex w16sdtdh w16sdtfl w16du wp14">
+<w:document xmlns:wpc="http://schemas.microsoft.com/office/word/2010/wordprocessingCanvas" xmlns:cx="http://schemas.microsoft.com/office/drawing/2014/chartex" xmlns:cx1="http://schemas.microsoft.com/office/drawing/2015/9/8/chartex" xmlns:cx2="http://schemas.microsoft.com/office/drawing/2015/10/21/chartex" xmlns:cx3="http://schemas.microsoft.com/office/drawing/2016/5/9/chartex" xmlns:cx4="http://schemas.microsoft.com/office/drawing/2016/5/10/chartex" xmlns:cx5="http://schemas.microsoft.com/office/drawing/2016/5/11/chartex" xmlns:cx6="http://schemas.microsoft.com/office/drawing/2016/5/12/chartex" xmlns:cx7="http://schemas.microsoft.com/office/drawing/2016/5/13/chartex" xmlns:cx8="http://schemas.microsoft.com/office/drawing/2016/5/14/chartex" xmlns:mc="http://schemas.openxmlformats.org/markup-compatibility/2006" xmlns:aink="http://schemas.microsoft.com/office/drawing/2016/ink" xmlns:am3d="http://schemas.microsoft.com/office/drawing/2017/model3d" xmlns:o="urn:schemas-microsoft-com:office:office" xmlns:oel="http://schemas.microsoft.com/office/2019/extlst" xmlns:r="http://schemas.openxmlformats.org/officeDocument/2006/relationships" xmlns:m="http://schemas.openxmlformats.org/officeDocument/2006/math" xmlns:v="urn:schemas-microsoft-com:vml" xmlns:wp14="http://schemas.microsoft.com/office/word/2010/wordprocessingDrawing" xmlns:wp="http://schemas.openxmlformats.org/drawingml/2006/wordprocessingDrawing" xmlns:w10="urn:schemas-microsoft-com:office:word" xmlns:w="http://schemas.openxmlformats.org/wordprocessingml/2006/main" xmlns:w14="http://schemas.microsoft.com/office/word/2010/wordml" xmlns:w15="http://schemas.microsoft.com/office/word/2012/wordml" xmlns:w16cei="http://schemas.microsoft.com/office/word/2026/wordml/cei" xmlns:w16cex="http://schemas.microsoft.com/office/word/2018/wordml/cex" xmlns:w16cid="http://schemas.microsoft.com/office/word/2016/wordml/cid" xmlns:w16="http://schemas.microsoft.com/office/word/2018/wordml" xmlns:w16du="http://schemas.microsoft.com/office/word/2023/wordml/word16du" xmlns:w16sdtdh="http://schemas.microsoft.com/office/word/2020/wordml/sdtdatahash" xmlns:w16sdtfl="http://schemas.microsoft.com/office/word/2024/wordml/sdtformatlock" xmlns:w16se="http://schemas.microsoft.com/office/word/2015/wordml/symex" xmlns:wpg="http://schemas.microsoft.com/office/word/2010/wordprocessingGroup" xmlns:wpi="http://schemas.microsoft.com/office/word/2010/wordprocessingInk" xmlns:wne="http://schemas.microsoft.com/office/word/2006/wordml" xmlns:wps="http://schemas.microsoft.com/office/word/2010/wordprocessingShape" mc:Ignorable="w14 w15 w16se w16cid w16 w16cex w16sdtdh w16sdtfl w16du wp14">
   <w:body>
     <w:p>
       <w:pPr>
@@ -79,7 +79,7 @@
           <w:szCs w:val="26"/>
         </w:rPr>
         <w:drawing>
-          <wp:inline distT="0" distB="0" distL="0" distR="0" wp14:anchorId="61AA30EF" wp14:editId="37C4DA40">
+          <wp:inline distT="0" distB="0" distL="0" distR="0" wp14:anchorId="61AA30EF" wp14:editId="3DF2A466">
             <wp:extent cx="1948539" cy="1606164"/>
             <wp:effectExtent l="0" t="0" r="0" b="0"/>
             <wp:docPr id="990850389" name="Picture 1"/>
@@ -2021,21 +2021,7 @@
                 <w:rStyle w:val="Hyperlink"/>
                 <w:noProof/>
               </w:rPr>
-              <w:t>2.1.3.2 Quy trình tiếp nhậ</w:t>
-            </w:r>
-            <w:r>
-              <w:rPr>
-                <w:rStyle w:val="Hyperlink"/>
-                <w:noProof/>
-              </w:rPr>
-              <w:t>n</w:t>
-            </w:r>
-            <w:r>
-              <w:rPr>
-                <w:rStyle w:val="Hyperlink"/>
-                <w:noProof/>
-              </w:rPr>
-              <w:t xml:space="preserve"> hồ sơ</w:t>
+              <w:t>2.1.3.2 Quy trình tiếp nhận hồ sơ</w:t>
             </w:r>
             <w:r>
               <w:rPr>
@@ -2727,30 +2713,6 @@
         </w:p>
       </w:sdtContent>
     </w:sdt>
-    <w:p>
-      <w:pPr>
-        <w:jc w:val="both"/>
-        <w:rPr>
-          <w:rFonts w:cs="Times New Roman"/>
-          <w:szCs w:val="26"/>
-        </w:rPr>
-      </w:pPr>
-    </w:p>
-    <w:p>
-      <w:pPr>
-        <w:rPr>
-          <w:rFonts w:cs="Times New Roman"/>
-          <w:szCs w:val="26"/>
-        </w:rPr>
-      </w:pPr>
-      <w:r>
-        <w:rPr>
-          <w:rFonts w:cs="Times New Roman"/>
-          <w:szCs w:val="26"/>
-        </w:rPr>
-        <w:br w:type="page"/>
-      </w:r>
-    </w:p>
     <w:p>
       <w:pPr>
         <w:pStyle w:val="Heading1"/>
@@ -5839,10 +5801,7 @@
       </w:pPr>
       <w:bookmarkStart w:id="16" w:name="_Toc236264124"/>
       <w:r>
-        <w:t xml:space="preserve">2.1.3.1 </w:t>
-      </w:r>
-      <w:r>
-        <w:t>Quy trình tiếp nhận hồ sơ</w:t>
+        <w:t>2.1.3.1 Quy trình tiếp nhận hồ sơ</w:t>
       </w:r>
       <w:bookmarkEnd w:id="16"/>
     </w:p>
@@ -5944,20 +5903,18 @@
       </w:pPr>
       <w:bookmarkStart w:id="18" w:name="_Toc236264125"/>
       <w:r>
-        <w:t>2.1.3.</w:t>
-      </w:r>
-      <w:r>
-        <w:t>2</w:t>
-      </w:r>
-      <w:r>
-        <w:t xml:space="preserve"> Quy trình tiếp nhận hồ sơ</w:t>
+        <w:t xml:space="preserve">2.1.3.2 </w:t>
       </w:r>
       <w:bookmarkEnd w:id="18"/>
-    </w:p>
-    <w:p>
-      <w:pPr>
-        <w:keepNext/>
-      </w:pPr>
+      <w:r>
+        <w:t>Quy trình kiểm tra, thẩm định và xử lý hồ sơ</w:t>
+      </w:r>
+      <w:r>
+        <w:rPr>
+          <w:noProof/>
+        </w:rPr>
+        <w:t xml:space="preserve"> </w:t>
+      </w:r>
       <w:r>
         <w:rPr>
           <w:noProof/>
@@ -6052,15 +6009,12 @@
       </w:pPr>
       <w:bookmarkStart w:id="20" w:name="_Toc236264126"/>
       <w:r>
-        <w:t>2.1.3.</w:t>
-      </w:r>
-      <w:r>
-        <w:t>3</w:t>
-      </w:r>
-      <w:r>
-        <w:t xml:space="preserve"> Quy trình kiểm tra, thẩm định và xử lý hồ sơ</w:t>
+        <w:t xml:space="preserve">2.1.3.3 </w:t>
       </w:r>
       <w:bookmarkEnd w:id="20"/>
+      <w:r>
+        <w:t>Quy trình phê duyệt và ban hành kết quả</w:t>
+      </w:r>
     </w:p>
     <w:p>
       <w:pPr>
@@ -6298,13 +6252,13 @@
       </w:pPr>
       <w:bookmarkStart w:id="22" w:name="_Toc236264127"/>
       <w:r>
-        <w:t>2.1.3.</w:t>
-      </w:r>
-      <w:r>
-        <w:t>4</w:t>
-      </w:r>
-      <w:r>
-        <w:t xml:space="preserve"> Quy trình trả kết và thông báo</w:t>
+        <w:t>2.1.3.4 Quy trình trả kết</w:t>
+      </w:r>
+      <w:r>
+        <w:t xml:space="preserve"> quả</w:t>
+      </w:r>
+      <w:r>
+        <w:t xml:space="preserve"> và thông báo</w:t>
       </w:r>
       <w:bookmarkEnd w:id="22"/>
     </w:p>
@@ -6396,7 +6350,13 @@
         <w:fldChar w:fldCharType="end"/>
       </w:r>
       <w:r>
-        <w:t>. Quy trình trả kết và thông báo</w:t>
+        <w:t>. Quy trình trả kết</w:t>
+      </w:r>
+      <w:r>
+        <w:t xml:space="preserve"> quả</w:t>
+      </w:r>
+      <w:r>
+        <w:t xml:space="preserve"> và thông báo</w:t>
       </w:r>
       <w:bookmarkEnd w:id="23"/>
     </w:p>
@@ -6585,6 +6545,2364 @@
     </w:p>
     <w:p>
       <w:pPr>
+        <w:pStyle w:val="Heading4"/>
+      </w:pPr>
+      <w:r>
+        <w:t>2.3.1 Mô hình hóa quy trình tiếp nhận hồ sơ</w:t>
+      </w:r>
+    </w:p>
+    <w:p>
+      <w:r>
+        <w:rPr>
+          <w:noProof/>
+        </w:rPr>
+        <w:drawing>
+          <wp:inline distT="0" distB="0" distL="0" distR="0" wp14:anchorId="5429ADB0" wp14:editId="5CFBA753">
+            <wp:extent cx="5731510" cy="1784350"/>
+            <wp:effectExtent l="0" t="0" r="2540" b="6350"/>
+            <wp:docPr id="864215819" name="Picture 1"/>
+            <wp:cNvGraphicFramePr>
+              <a:graphicFrameLocks xmlns:a="http://schemas.openxmlformats.org/drawingml/2006/main" noChangeAspect="1"/>
+            </wp:cNvGraphicFramePr>
+            <a:graphic xmlns:a="http://schemas.openxmlformats.org/drawingml/2006/main">
+              <a:graphicData uri="http://schemas.openxmlformats.org/drawingml/2006/picture">
+                <pic:pic xmlns:pic="http://schemas.openxmlformats.org/drawingml/2006/picture">
+                  <pic:nvPicPr>
+                    <pic:cNvPr id="864215819" name=""/>
+                    <pic:cNvPicPr/>
+                  </pic:nvPicPr>
+                  <pic:blipFill>
+                    <a:blip r:embed="rId13"/>
+                    <a:stretch>
+                      <a:fillRect/>
+                    </a:stretch>
+                  </pic:blipFill>
+                  <pic:spPr>
+                    <a:xfrm>
+                      <a:off x="0" y="0"/>
+                      <a:ext cx="5731510" cy="1784350"/>
+                    </a:xfrm>
+                    <a:prstGeom prst="rect">
+                      <a:avLst/>
+                    </a:prstGeom>
+                  </pic:spPr>
+                </pic:pic>
+              </a:graphicData>
+            </a:graphic>
+          </wp:inline>
+        </w:drawing>
+      </w:r>
+    </w:p>
+    <w:p>
+      <w:pPr>
+        <w:pStyle w:val="Caption"/>
+      </w:pPr>
+      <w:r>
+        <w:t xml:space="preserve">Hình </w:t>
+      </w:r>
+      <w:r>
+        <w:fldChar w:fldCharType="begin"/>
+      </w:r>
+      <w:r>
+        <w:instrText xml:space="preserve"> SEQ Hình \* ARABIC </w:instrText>
+      </w:r>
+      <w:r>
+        <w:fldChar w:fldCharType="separate"/>
+      </w:r>
+      <w:r>
+        <w:rPr>
+          <w:noProof/>
+        </w:rPr>
+        <w:t>5</w:t>
+      </w:r>
+      <w:r>
+        <w:fldChar w:fldCharType="end"/>
+      </w:r>
+      <w:r>
+        <w:t xml:space="preserve">. </w:t>
+      </w:r>
+      <w:r>
+        <w:t>Mô hình hóa q</w:t>
+      </w:r>
+      <w:r>
+        <w:t>uy trình tiếp nhận hồ sơ trực tiếp tại BNĐP</w:t>
+      </w:r>
+    </w:p>
+    <w:p>
+      <w:pPr>
+        <w:pStyle w:val="Heading5"/>
+      </w:pPr>
+      <w:r>
+        <w:t>2.3.1.1 Mô tả quy trình hiện có</w:t>
+      </w:r>
+    </w:p>
+    <w:p>
+      <w:r>
+        <w:tab/>
+        <w:t>Bảng 2. Mô tả mô hình quy trình tiếp nhận hồ trực tiếp BNĐP</w:t>
+      </w:r>
+    </w:p>
+    <w:tbl>
+      <w:tblPr>
+        <w:tblStyle w:val="TableGrid"/>
+        <w:tblW w:w="10729" w:type="dxa"/>
+        <w:jc w:val="center"/>
+        <w:tblLayout w:type="fixed"/>
+        <w:tblLook w:val="04A0" w:firstRow="1" w:lastRow="0" w:firstColumn="1" w:lastColumn="0" w:noHBand="0" w:noVBand="1"/>
+      </w:tblPr>
+      <w:tblGrid>
+        <w:gridCol w:w="708"/>
+        <w:gridCol w:w="3247"/>
+        <w:gridCol w:w="2110"/>
+        <w:gridCol w:w="4664"/>
+      </w:tblGrid>
+      <w:tr>
+        <w:trPr>
+          <w:cantSplit/>
+          <w:tblHeader/>
+          <w:jc w:val="center"/>
+        </w:trPr>
+        <w:tc>
+          <w:tcPr>
+            <w:tcW w:w="708" w:type="dxa"/>
+            <w:shd w:val="clear" w:color="auto" w:fill="D9D9D9"/>
+            <w:tcMar>
+              <w:top w:w="110" w:type="dxa"/>
+              <w:left w:w="90" w:type="dxa"/>
+              <w:bottom w:w="110" w:type="dxa"/>
+              <w:right w:w="90" w:type="dxa"/>
+            </w:tcMar>
+            <w:vAlign w:val="center"/>
+          </w:tcPr>
+          <w:p>
+            <w:pPr>
+              <w:jc w:val="center"/>
+            </w:pPr>
+            <w:r>
+              <w:rPr>
+                <w:rFonts w:eastAsia="Times New Roman"/>
+                <w:b/>
+                <w:color w:val="000000"/>
+                <w:sz w:val="28"/>
+              </w:rPr>
+              <w:t>STT</w:t>
+            </w:r>
+          </w:p>
+        </w:tc>
+        <w:tc>
+          <w:tcPr>
+            <w:tcW w:w="3247" w:type="dxa"/>
+            <w:shd w:val="clear" w:color="auto" w:fill="D9D9D9"/>
+            <w:tcMar>
+              <w:top w:w="110" w:type="dxa"/>
+              <w:left w:w="90" w:type="dxa"/>
+              <w:bottom w:w="110" w:type="dxa"/>
+              <w:right w:w="90" w:type="dxa"/>
+            </w:tcMar>
+            <w:vAlign w:val="center"/>
+          </w:tcPr>
+          <w:p>
+            <w:pPr>
+              <w:jc w:val="center"/>
+            </w:pPr>
+            <w:r>
+              <w:rPr>
+                <w:rFonts w:eastAsia="Times New Roman"/>
+                <w:b/>
+                <w:color w:val="000000"/>
+                <w:sz w:val="28"/>
+              </w:rPr>
+              <w:t>Bước</w:t>
+            </w:r>
+          </w:p>
+        </w:tc>
+        <w:tc>
+          <w:tcPr>
+            <w:tcW w:w="2110" w:type="dxa"/>
+            <w:shd w:val="clear" w:color="auto" w:fill="D9D9D9"/>
+            <w:tcMar>
+              <w:top w:w="110" w:type="dxa"/>
+              <w:left w:w="90" w:type="dxa"/>
+              <w:bottom w:w="110" w:type="dxa"/>
+              <w:right w:w="90" w:type="dxa"/>
+            </w:tcMar>
+            <w:vAlign w:val="center"/>
+          </w:tcPr>
+          <w:p>
+            <w:pPr>
+              <w:jc w:val="center"/>
+            </w:pPr>
+            <w:r>
+              <w:rPr>
+                <w:rFonts w:eastAsia="Times New Roman"/>
+                <w:b/>
+                <w:color w:val="000000"/>
+                <w:sz w:val="28"/>
+              </w:rPr>
+              <w:t>Tác nhân</w:t>
+            </w:r>
+          </w:p>
+        </w:tc>
+        <w:tc>
+          <w:tcPr>
+            <w:tcW w:w="4664" w:type="dxa"/>
+            <w:shd w:val="clear" w:color="auto" w:fill="D9D9D9"/>
+            <w:tcMar>
+              <w:top w:w="110" w:type="dxa"/>
+              <w:left w:w="90" w:type="dxa"/>
+              <w:bottom w:w="110" w:type="dxa"/>
+              <w:right w:w="90" w:type="dxa"/>
+            </w:tcMar>
+            <w:vAlign w:val="center"/>
+          </w:tcPr>
+          <w:p>
+            <w:pPr>
+              <w:jc w:val="center"/>
+            </w:pPr>
+            <w:r>
+              <w:rPr>
+                <w:rFonts w:eastAsia="Times New Roman"/>
+                <w:b/>
+                <w:color w:val="000000"/>
+                <w:sz w:val="28"/>
+              </w:rPr>
+              <w:t>Mô tả</w:t>
+            </w:r>
+          </w:p>
+        </w:tc>
+      </w:tr>
+      <w:tr>
+        <w:trPr>
+          <w:cantSplit/>
+          <w:jc w:val="center"/>
+        </w:trPr>
+        <w:tc>
+          <w:tcPr>
+            <w:tcW w:w="708" w:type="dxa"/>
+            <w:tcMar>
+              <w:top w:w="95" w:type="dxa"/>
+              <w:left w:w="95" w:type="dxa"/>
+              <w:bottom w:w="95" w:type="dxa"/>
+              <w:right w:w="95" w:type="dxa"/>
+            </w:tcMar>
+          </w:tcPr>
+          <w:p>
+            <w:pPr>
+              <w:jc w:val="center"/>
+            </w:pPr>
+            <w:r>
+              <w:rPr>
+                <w:rFonts w:eastAsia="Times New Roman"/>
+                <w:color w:val="000000"/>
+                <w:sz w:val="23"/>
+              </w:rPr>
+              <w:t>1</w:t>
+            </w:r>
+          </w:p>
+        </w:tc>
+        <w:tc>
+          <w:tcPr>
+            <w:tcW w:w="3247" w:type="dxa"/>
+            <w:tcMar>
+              <w:top w:w="95" w:type="dxa"/>
+              <w:left w:w="95" w:type="dxa"/>
+              <w:bottom w:w="95" w:type="dxa"/>
+              <w:right w:w="95" w:type="dxa"/>
+            </w:tcMar>
+          </w:tcPr>
+          <w:p>
+            <w:pPr>
+              <w:spacing w:line="264" w:lineRule="auto"/>
+            </w:pPr>
+            <w:r>
+              <w:rPr>
+                <w:rFonts w:eastAsia="Times New Roman"/>
+                <w:color w:val="000000"/>
+                <w:sz w:val="23"/>
+              </w:rPr>
+              <w:t>B1: Cá nhân/tổ chức nộp hồ sơ</w:t>
+            </w:r>
+          </w:p>
+        </w:tc>
+        <w:tc>
+          <w:tcPr>
+            <w:tcW w:w="2110" w:type="dxa"/>
+            <w:tcMar>
+              <w:top w:w="95" w:type="dxa"/>
+              <w:left w:w="95" w:type="dxa"/>
+              <w:bottom w:w="95" w:type="dxa"/>
+              <w:right w:w="95" w:type="dxa"/>
+            </w:tcMar>
+          </w:tcPr>
+          <w:p>
+            <w:pPr>
+              <w:spacing w:line="264" w:lineRule="auto"/>
+            </w:pPr>
+            <w:r>
+              <w:rPr>
+                <w:rFonts w:eastAsia="Times New Roman"/>
+                <w:color w:val="000000"/>
+                <w:sz w:val="23"/>
+              </w:rPr>
+              <w:t>Cá nhân/Tổ chức</w:t>
+            </w:r>
+          </w:p>
+        </w:tc>
+        <w:tc>
+          <w:tcPr>
+            <w:tcW w:w="4664" w:type="dxa"/>
+            <w:tcMar>
+              <w:top w:w="95" w:type="dxa"/>
+              <w:left w:w="95" w:type="dxa"/>
+              <w:bottom w:w="95" w:type="dxa"/>
+              <w:right w:w="95" w:type="dxa"/>
+            </w:tcMar>
+          </w:tcPr>
+          <w:p>
+            <w:pPr>
+              <w:spacing w:line="269" w:lineRule="auto"/>
+              <w:jc w:val="both"/>
+            </w:pPr>
+            <w:r>
+              <w:rPr>
+                <w:rFonts w:eastAsia="Times New Roman"/>
+                <w:color w:val="000000"/>
+                <w:sz w:val="23"/>
+              </w:rPr>
+              <w:t>Cá nhân hoặc tổ chức chuẩn bị hồ sơ theo thành phần quy định và nộp trực tiếp tại Bộ phận Một cửa. Hồ sơ bao gồm đơn đề nghị, giấy tờ pháp lý và các tài liệu chuyên ngành có liên quan đến thủ tục hành chính cần giải quyết.</w:t>
+            </w:r>
+          </w:p>
+        </w:tc>
+      </w:tr>
+      <w:tr>
+        <w:trPr>
+          <w:cantSplit/>
+          <w:jc w:val="center"/>
+        </w:trPr>
+        <w:tc>
+          <w:tcPr>
+            <w:tcW w:w="708" w:type="dxa"/>
+            <w:tcMar>
+              <w:top w:w="95" w:type="dxa"/>
+              <w:left w:w="95" w:type="dxa"/>
+              <w:bottom w:w="95" w:type="dxa"/>
+              <w:right w:w="95" w:type="dxa"/>
+            </w:tcMar>
+          </w:tcPr>
+          <w:p>
+            <w:pPr>
+              <w:jc w:val="center"/>
+            </w:pPr>
+            <w:r>
+              <w:rPr>
+                <w:rFonts w:eastAsia="Times New Roman"/>
+                <w:color w:val="000000"/>
+                <w:sz w:val="23"/>
+              </w:rPr>
+              <w:t>2</w:t>
+            </w:r>
+          </w:p>
+        </w:tc>
+        <w:tc>
+          <w:tcPr>
+            <w:tcW w:w="3247" w:type="dxa"/>
+            <w:tcMar>
+              <w:top w:w="95" w:type="dxa"/>
+              <w:left w:w="95" w:type="dxa"/>
+              <w:bottom w:w="95" w:type="dxa"/>
+              <w:right w:w="95" w:type="dxa"/>
+            </w:tcMar>
+          </w:tcPr>
+          <w:p>
+            <w:pPr>
+              <w:spacing w:line="264" w:lineRule="auto"/>
+            </w:pPr>
+            <w:r>
+              <w:rPr>
+                <w:rFonts w:eastAsia="Times New Roman"/>
+                <w:color w:val="000000"/>
+                <w:sz w:val="23"/>
+              </w:rPr>
+              <w:t>B2: Tiếp nhận hồ sơ và thông tin người nộp</w:t>
+            </w:r>
+          </w:p>
+        </w:tc>
+        <w:tc>
+          <w:tcPr>
+            <w:tcW w:w="2110" w:type="dxa"/>
+            <w:tcMar>
+              <w:top w:w="95" w:type="dxa"/>
+              <w:left w:w="95" w:type="dxa"/>
+              <w:bottom w:w="95" w:type="dxa"/>
+              <w:right w:w="95" w:type="dxa"/>
+            </w:tcMar>
+          </w:tcPr>
+          <w:p>
+            <w:pPr>
+              <w:spacing w:line="264" w:lineRule="auto"/>
+            </w:pPr>
+            <w:r>
+              <w:rPr>
+                <w:rFonts w:eastAsia="Times New Roman"/>
+                <w:color w:val="000000"/>
+                <w:sz w:val="23"/>
+              </w:rPr>
+              <w:t>Cán bộ một cửa</w:t>
+            </w:r>
+          </w:p>
+        </w:tc>
+        <w:tc>
+          <w:tcPr>
+            <w:tcW w:w="4664" w:type="dxa"/>
+            <w:tcMar>
+              <w:top w:w="95" w:type="dxa"/>
+              <w:left w:w="95" w:type="dxa"/>
+              <w:bottom w:w="95" w:type="dxa"/>
+              <w:right w:w="95" w:type="dxa"/>
+            </w:tcMar>
+          </w:tcPr>
+          <w:p>
+            <w:pPr>
+              <w:spacing w:line="269" w:lineRule="auto"/>
+              <w:jc w:val="both"/>
+            </w:pPr>
+            <w:r>
+              <w:rPr>
+                <w:rFonts w:eastAsia="Times New Roman"/>
+                <w:color w:val="000000"/>
+                <w:sz w:val="23"/>
+              </w:rPr>
+              <w:t>Cán bộ một cửa tiếp nhận hồ sơ, kiểm tra sơ bộ thông tin người nộp và xác định thủ tục hành chính mà cá nhân hoặc tổ chức yêu cầu giải quyết. Thông tin liên hệ của người nộp được ghi nhận để phục vụ việc thông báo và trả kết quả.</w:t>
+            </w:r>
+          </w:p>
+        </w:tc>
+      </w:tr>
+      <w:tr>
+        <w:trPr>
+          <w:cantSplit/>
+          <w:jc w:val="center"/>
+        </w:trPr>
+        <w:tc>
+          <w:tcPr>
+            <w:tcW w:w="708" w:type="dxa"/>
+            <w:tcMar>
+              <w:top w:w="95" w:type="dxa"/>
+              <w:left w:w="95" w:type="dxa"/>
+              <w:bottom w:w="95" w:type="dxa"/>
+              <w:right w:w="95" w:type="dxa"/>
+            </w:tcMar>
+          </w:tcPr>
+          <w:p>
+            <w:pPr>
+              <w:jc w:val="center"/>
+            </w:pPr>
+            <w:r>
+              <w:rPr>
+                <w:rFonts w:eastAsia="Times New Roman"/>
+                <w:color w:val="000000"/>
+                <w:sz w:val="23"/>
+              </w:rPr>
+              <w:t>3</w:t>
+            </w:r>
+          </w:p>
+        </w:tc>
+        <w:tc>
+          <w:tcPr>
+            <w:tcW w:w="3247" w:type="dxa"/>
+            <w:tcMar>
+              <w:top w:w="95" w:type="dxa"/>
+              <w:left w:w="95" w:type="dxa"/>
+              <w:bottom w:w="95" w:type="dxa"/>
+              <w:right w:w="95" w:type="dxa"/>
+            </w:tcMar>
+          </w:tcPr>
+          <w:p>
+            <w:pPr>
+              <w:spacing w:line="264" w:lineRule="auto"/>
+            </w:pPr>
+            <w:r>
+              <w:rPr>
+                <w:rFonts w:eastAsia="Times New Roman"/>
+                <w:color w:val="000000"/>
+                <w:sz w:val="23"/>
+              </w:rPr>
+              <w:t>B3: Kiểm tra tài khoản Cổng DVCQG</w:t>
+            </w:r>
+          </w:p>
+        </w:tc>
+        <w:tc>
+          <w:tcPr>
+            <w:tcW w:w="2110" w:type="dxa"/>
+            <w:tcMar>
+              <w:top w:w="95" w:type="dxa"/>
+              <w:left w:w="95" w:type="dxa"/>
+              <w:bottom w:w="95" w:type="dxa"/>
+              <w:right w:w="95" w:type="dxa"/>
+            </w:tcMar>
+          </w:tcPr>
+          <w:p>
+            <w:pPr>
+              <w:spacing w:line="264" w:lineRule="auto"/>
+            </w:pPr>
+            <w:r>
+              <w:rPr>
+                <w:rFonts w:eastAsia="Times New Roman"/>
+                <w:color w:val="000000"/>
+                <w:sz w:val="23"/>
+              </w:rPr>
+              <w:t>Cán bộ một cửa; Hệ thống</w:t>
+            </w:r>
+          </w:p>
+        </w:tc>
+        <w:tc>
+          <w:tcPr>
+            <w:tcW w:w="4664" w:type="dxa"/>
+            <w:tcMar>
+              <w:top w:w="95" w:type="dxa"/>
+              <w:left w:w="95" w:type="dxa"/>
+              <w:bottom w:w="95" w:type="dxa"/>
+              <w:right w:w="95" w:type="dxa"/>
+            </w:tcMar>
+          </w:tcPr>
+          <w:p>
+            <w:pPr>
+              <w:spacing w:line="269" w:lineRule="auto"/>
+              <w:jc w:val="both"/>
+            </w:pPr>
+            <w:r>
+              <w:rPr>
+                <w:rFonts w:eastAsia="Times New Roman"/>
+                <w:color w:val="000000"/>
+                <w:sz w:val="23"/>
+              </w:rPr>
+              <w:t>Cán bộ sử dụng số định danh cá nhân, số căn cước công dân, số hộ chiếu, mã số thuế hoặc mã số doanh nghiệp để kiểm tra cá nhân hoặc tổ chức đã có tài khoản trên Cổng Dịch vụ công quốc gia hay chưa.</w:t>
+            </w:r>
+          </w:p>
+        </w:tc>
+      </w:tr>
+      <w:tr>
+        <w:trPr>
+          <w:cantSplit/>
+          <w:jc w:val="center"/>
+        </w:trPr>
+        <w:tc>
+          <w:tcPr>
+            <w:tcW w:w="708" w:type="dxa"/>
+            <w:tcMar>
+              <w:top w:w="95" w:type="dxa"/>
+              <w:left w:w="95" w:type="dxa"/>
+              <w:bottom w:w="95" w:type="dxa"/>
+              <w:right w:w="95" w:type="dxa"/>
+            </w:tcMar>
+          </w:tcPr>
+          <w:p>
+            <w:pPr>
+              <w:jc w:val="center"/>
+            </w:pPr>
+            <w:r>
+              <w:rPr>
+                <w:rFonts w:eastAsia="Times New Roman"/>
+                <w:color w:val="000000"/>
+                <w:sz w:val="23"/>
+              </w:rPr>
+              <w:lastRenderedPageBreak/>
+              <w:t>4</w:t>
+            </w:r>
+          </w:p>
+        </w:tc>
+        <w:tc>
+          <w:tcPr>
+            <w:tcW w:w="3247" w:type="dxa"/>
+            <w:tcMar>
+              <w:top w:w="95" w:type="dxa"/>
+              <w:left w:w="95" w:type="dxa"/>
+              <w:bottom w:w="95" w:type="dxa"/>
+              <w:right w:w="95" w:type="dxa"/>
+            </w:tcMar>
+          </w:tcPr>
+          <w:p>
+            <w:pPr>
+              <w:spacing w:line="264" w:lineRule="auto"/>
+            </w:pPr>
+            <w:r>
+              <w:rPr>
+                <w:rFonts w:eastAsia="Times New Roman"/>
+                <w:color w:val="000000"/>
+                <w:sz w:val="23"/>
+              </w:rPr>
+              <w:t>B4: Hỗ trợ tạo tài khoản Cổng DVCQG</w:t>
+            </w:r>
+          </w:p>
+        </w:tc>
+        <w:tc>
+          <w:tcPr>
+            <w:tcW w:w="2110" w:type="dxa"/>
+            <w:tcMar>
+              <w:top w:w="95" w:type="dxa"/>
+              <w:left w:w="95" w:type="dxa"/>
+              <w:bottom w:w="95" w:type="dxa"/>
+              <w:right w:w="95" w:type="dxa"/>
+            </w:tcMar>
+          </w:tcPr>
+          <w:p>
+            <w:pPr>
+              <w:spacing w:line="264" w:lineRule="auto"/>
+            </w:pPr>
+            <w:r>
+              <w:rPr>
+                <w:rFonts w:eastAsia="Times New Roman"/>
+                <w:color w:val="000000"/>
+                <w:sz w:val="23"/>
+              </w:rPr>
+              <w:t>Cán bộ một cửa; Cá nhân/Tổ chức</w:t>
+            </w:r>
+          </w:p>
+        </w:tc>
+        <w:tc>
+          <w:tcPr>
+            <w:tcW w:w="4664" w:type="dxa"/>
+            <w:tcMar>
+              <w:top w:w="95" w:type="dxa"/>
+              <w:left w:w="95" w:type="dxa"/>
+              <w:bottom w:w="95" w:type="dxa"/>
+              <w:right w:w="95" w:type="dxa"/>
+            </w:tcMar>
+          </w:tcPr>
+          <w:p>
+            <w:pPr>
+              <w:spacing w:line="269" w:lineRule="auto"/>
+              <w:jc w:val="both"/>
+            </w:pPr>
+            <w:r>
+              <w:rPr>
+                <w:rFonts w:eastAsia="Times New Roman"/>
+                <w:color w:val="000000"/>
+                <w:sz w:val="23"/>
+              </w:rPr>
+              <w:t>Trường hợp người nộp chưa có tài khoản, cán bộ hướng dẫn hoặc hỗ trợ đăng ký tài khoản trên Cổng Dịch vụ công quốc gia. Tài khoản được sử dụng để theo dõi trạng thái hồ sơ, nhận thông báo và khai thác các dịch vụ công trực tuyến.</w:t>
+            </w:r>
+          </w:p>
+        </w:tc>
+      </w:tr>
+      <w:tr>
+        <w:trPr>
+          <w:cantSplit/>
+          <w:jc w:val="center"/>
+        </w:trPr>
+        <w:tc>
+          <w:tcPr>
+            <w:tcW w:w="708" w:type="dxa"/>
+            <w:tcMar>
+              <w:top w:w="95" w:type="dxa"/>
+              <w:left w:w="95" w:type="dxa"/>
+              <w:bottom w:w="95" w:type="dxa"/>
+              <w:right w:w="95" w:type="dxa"/>
+            </w:tcMar>
+          </w:tcPr>
+          <w:p>
+            <w:pPr>
+              <w:jc w:val="center"/>
+            </w:pPr>
+            <w:r>
+              <w:rPr>
+                <w:rFonts w:eastAsia="Times New Roman"/>
+                <w:color w:val="000000"/>
+                <w:sz w:val="23"/>
+              </w:rPr>
+              <w:t>5</w:t>
+            </w:r>
+          </w:p>
+        </w:tc>
+        <w:tc>
+          <w:tcPr>
+            <w:tcW w:w="3247" w:type="dxa"/>
+            <w:tcMar>
+              <w:top w:w="95" w:type="dxa"/>
+              <w:left w:w="95" w:type="dxa"/>
+              <w:bottom w:w="95" w:type="dxa"/>
+              <w:right w:w="95" w:type="dxa"/>
+            </w:tcMar>
+          </w:tcPr>
+          <w:p>
+            <w:pPr>
+              <w:spacing w:line="264" w:lineRule="auto"/>
+            </w:pPr>
+            <w:r>
+              <w:rPr>
+                <w:rFonts w:eastAsia="Times New Roman"/>
+                <w:color w:val="000000"/>
+                <w:sz w:val="23"/>
+              </w:rPr>
+              <w:t>B5: Kiểm tra tài khoản trên HTTT giải quyết TTHC</w:t>
+            </w:r>
+          </w:p>
+        </w:tc>
+        <w:tc>
+          <w:tcPr>
+            <w:tcW w:w="2110" w:type="dxa"/>
+            <w:tcMar>
+              <w:top w:w="95" w:type="dxa"/>
+              <w:left w:w="95" w:type="dxa"/>
+              <w:bottom w:w="95" w:type="dxa"/>
+              <w:right w:w="95" w:type="dxa"/>
+            </w:tcMar>
+          </w:tcPr>
+          <w:p>
+            <w:pPr>
+              <w:spacing w:line="264" w:lineRule="auto"/>
+            </w:pPr>
+            <w:r>
+              <w:rPr>
+                <w:rFonts w:eastAsia="Times New Roman"/>
+                <w:color w:val="000000"/>
+                <w:sz w:val="23"/>
+              </w:rPr>
+              <w:t>Cán bộ một cửa; Hệ thống</w:t>
+            </w:r>
+          </w:p>
+        </w:tc>
+        <w:tc>
+          <w:tcPr>
+            <w:tcW w:w="4664" w:type="dxa"/>
+            <w:tcMar>
+              <w:top w:w="95" w:type="dxa"/>
+              <w:left w:w="95" w:type="dxa"/>
+              <w:bottom w:w="95" w:type="dxa"/>
+              <w:right w:w="95" w:type="dxa"/>
+            </w:tcMar>
+          </w:tcPr>
+          <w:p>
+            <w:pPr>
+              <w:spacing w:line="269" w:lineRule="auto"/>
+              <w:jc w:val="both"/>
+            </w:pPr>
+            <w:r>
+              <w:rPr>
+                <w:rFonts w:eastAsia="Times New Roman"/>
+                <w:color w:val="000000"/>
+                <w:sz w:val="23"/>
+              </w:rPr>
+              <w:t>Sau khi kiểm tra tài khoản Cổng Dịch vụ công quốc gia, cán bộ hoặc hệ thống tiếp tục xác định cá nhân, tổ chức đã có tài khoản trên Hệ thống thông tin giải quyết thủ tục hành chính của Bộ, ngành, địa phương hay chưa.</w:t>
+            </w:r>
+          </w:p>
+        </w:tc>
+      </w:tr>
+      <w:tr>
+        <w:trPr>
+          <w:cantSplit/>
+          <w:jc w:val="center"/>
+        </w:trPr>
+        <w:tc>
+          <w:tcPr>
+            <w:tcW w:w="708" w:type="dxa"/>
+            <w:tcMar>
+              <w:top w:w="95" w:type="dxa"/>
+              <w:left w:w="95" w:type="dxa"/>
+              <w:bottom w:w="95" w:type="dxa"/>
+              <w:right w:w="95" w:type="dxa"/>
+            </w:tcMar>
+          </w:tcPr>
+          <w:p>
+            <w:pPr>
+              <w:jc w:val="center"/>
+            </w:pPr>
+            <w:r>
+              <w:rPr>
+                <w:rFonts w:eastAsia="Times New Roman"/>
+                <w:color w:val="000000"/>
+                <w:sz w:val="23"/>
+              </w:rPr>
+              <w:t>6</w:t>
+            </w:r>
+          </w:p>
+        </w:tc>
+        <w:tc>
+          <w:tcPr>
+            <w:tcW w:w="3247" w:type="dxa"/>
+            <w:tcMar>
+              <w:top w:w="95" w:type="dxa"/>
+              <w:left w:w="95" w:type="dxa"/>
+              <w:bottom w:w="95" w:type="dxa"/>
+              <w:right w:w="95" w:type="dxa"/>
+            </w:tcMar>
+          </w:tcPr>
+          <w:p>
+            <w:pPr>
+              <w:spacing w:line="264" w:lineRule="auto"/>
+            </w:pPr>
+            <w:r>
+              <w:rPr>
+                <w:rFonts w:eastAsia="Times New Roman"/>
+                <w:color w:val="000000"/>
+                <w:sz w:val="23"/>
+              </w:rPr>
+              <w:t>B6: Tạo và liên kết tài khoản</w:t>
+            </w:r>
+          </w:p>
+        </w:tc>
+        <w:tc>
+          <w:tcPr>
+            <w:tcW w:w="2110" w:type="dxa"/>
+            <w:tcMar>
+              <w:top w:w="95" w:type="dxa"/>
+              <w:left w:w="95" w:type="dxa"/>
+              <w:bottom w:w="95" w:type="dxa"/>
+              <w:right w:w="95" w:type="dxa"/>
+            </w:tcMar>
+          </w:tcPr>
+          <w:p>
+            <w:pPr>
+              <w:spacing w:line="264" w:lineRule="auto"/>
+            </w:pPr>
+            <w:r>
+              <w:rPr>
+                <w:rFonts w:eastAsia="Times New Roman"/>
+                <w:color w:val="000000"/>
+                <w:sz w:val="23"/>
+              </w:rPr>
+              <w:t>Hệ thống; Cán bộ một cửa</w:t>
+            </w:r>
+          </w:p>
+        </w:tc>
+        <w:tc>
+          <w:tcPr>
+            <w:tcW w:w="4664" w:type="dxa"/>
+            <w:tcMar>
+              <w:top w:w="95" w:type="dxa"/>
+              <w:left w:w="95" w:type="dxa"/>
+              <w:bottom w:w="95" w:type="dxa"/>
+              <w:right w:w="95" w:type="dxa"/>
+            </w:tcMar>
+          </w:tcPr>
+          <w:p>
+            <w:pPr>
+              <w:spacing w:line="269" w:lineRule="auto"/>
+              <w:jc w:val="both"/>
+            </w:pPr>
+            <w:r>
+              <w:rPr>
+                <w:rFonts w:eastAsia="Times New Roman"/>
+                <w:color w:val="000000"/>
+                <w:sz w:val="23"/>
+              </w:rPr>
+              <w:t>Nếu người nộp chưa có tài khoản trên hệ thống của Bộ, ngành, địa phương, hệ thống tạo tài khoản tương ứng và liên kết với tài khoản Cổng Dịch vụ công quốc gia thông qua thông tin định danh duy nhất của cá nhân hoặc tổ chức.</w:t>
+            </w:r>
+          </w:p>
+        </w:tc>
+      </w:tr>
+      <w:tr>
+        <w:trPr>
+          <w:cantSplit/>
+          <w:jc w:val="center"/>
+        </w:trPr>
+        <w:tc>
+          <w:tcPr>
+            <w:tcW w:w="708" w:type="dxa"/>
+            <w:tcMar>
+              <w:top w:w="95" w:type="dxa"/>
+              <w:left w:w="95" w:type="dxa"/>
+              <w:bottom w:w="95" w:type="dxa"/>
+              <w:right w:w="95" w:type="dxa"/>
+            </w:tcMar>
+          </w:tcPr>
+          <w:p>
+            <w:pPr>
+              <w:jc w:val="center"/>
+            </w:pPr>
+            <w:r>
+              <w:rPr>
+                <w:rFonts w:eastAsia="Times New Roman"/>
+                <w:color w:val="000000"/>
+                <w:sz w:val="23"/>
+              </w:rPr>
+              <w:t>7</w:t>
+            </w:r>
+          </w:p>
+        </w:tc>
+        <w:tc>
+          <w:tcPr>
+            <w:tcW w:w="3247" w:type="dxa"/>
+            <w:tcMar>
+              <w:top w:w="95" w:type="dxa"/>
+              <w:left w:w="95" w:type="dxa"/>
+              <w:bottom w:w="95" w:type="dxa"/>
+              <w:right w:w="95" w:type="dxa"/>
+            </w:tcMar>
+          </w:tcPr>
+          <w:p>
+            <w:pPr>
+              <w:spacing w:line="264" w:lineRule="auto"/>
+            </w:pPr>
+            <w:r>
+              <w:rPr>
+                <w:rFonts w:eastAsia="Times New Roman"/>
+                <w:color w:val="000000"/>
+                <w:sz w:val="23"/>
+              </w:rPr>
+              <w:t>B7: Nhập thông tin hồ sơ vào hệ thống</w:t>
+            </w:r>
+          </w:p>
+        </w:tc>
+        <w:tc>
+          <w:tcPr>
+            <w:tcW w:w="2110" w:type="dxa"/>
+            <w:tcMar>
+              <w:top w:w="95" w:type="dxa"/>
+              <w:left w:w="95" w:type="dxa"/>
+              <w:bottom w:w="95" w:type="dxa"/>
+              <w:right w:w="95" w:type="dxa"/>
+            </w:tcMar>
+          </w:tcPr>
+          <w:p>
+            <w:pPr>
+              <w:spacing w:line="264" w:lineRule="auto"/>
+            </w:pPr>
+            <w:r>
+              <w:rPr>
+                <w:rFonts w:eastAsia="Times New Roman"/>
+                <w:color w:val="000000"/>
+                <w:sz w:val="23"/>
+              </w:rPr>
+              <w:t>Cán bộ một cửa</w:t>
+            </w:r>
+          </w:p>
+        </w:tc>
+        <w:tc>
+          <w:tcPr>
+            <w:tcW w:w="4664" w:type="dxa"/>
+            <w:tcMar>
+              <w:top w:w="95" w:type="dxa"/>
+              <w:left w:w="95" w:type="dxa"/>
+              <w:bottom w:w="95" w:type="dxa"/>
+              <w:right w:w="95" w:type="dxa"/>
+            </w:tcMar>
+          </w:tcPr>
+          <w:p>
+            <w:pPr>
+              <w:spacing w:line="269" w:lineRule="auto"/>
+              <w:jc w:val="both"/>
+            </w:pPr>
+            <w:r>
+              <w:rPr>
+                <w:rFonts w:eastAsia="Times New Roman"/>
+                <w:color w:val="000000"/>
+                <w:sz w:val="23"/>
+              </w:rPr>
+              <w:t>Cán bộ nhập các thông tin cơ bản của hồ sơ như người nộp, chủ hồ sơ, tên thủ tục hành chính, thời gian tiếp nhận, hình thức nộp hồ sơ, thông tin liên hệ và các dữ liệu cần thiết khác.</w:t>
+            </w:r>
+          </w:p>
+        </w:tc>
+      </w:tr>
+      <w:tr>
+        <w:trPr>
+          <w:cantSplit/>
+          <w:jc w:val="center"/>
+        </w:trPr>
+        <w:tc>
+          <w:tcPr>
+            <w:tcW w:w="708" w:type="dxa"/>
+            <w:tcMar>
+              <w:top w:w="95" w:type="dxa"/>
+              <w:left w:w="95" w:type="dxa"/>
+              <w:bottom w:w="95" w:type="dxa"/>
+              <w:right w:w="95" w:type="dxa"/>
+            </w:tcMar>
+          </w:tcPr>
+          <w:p>
+            <w:pPr>
+              <w:jc w:val="center"/>
+            </w:pPr>
+            <w:r>
+              <w:rPr>
+                <w:rFonts w:eastAsia="Times New Roman"/>
+                <w:color w:val="000000"/>
+                <w:sz w:val="23"/>
+              </w:rPr>
+              <w:t>8</w:t>
+            </w:r>
+          </w:p>
+        </w:tc>
+        <w:tc>
+          <w:tcPr>
+            <w:tcW w:w="3247" w:type="dxa"/>
+            <w:tcMar>
+              <w:top w:w="95" w:type="dxa"/>
+              <w:left w:w="95" w:type="dxa"/>
+              <w:bottom w:w="95" w:type="dxa"/>
+              <w:right w:w="95" w:type="dxa"/>
+            </w:tcMar>
+          </w:tcPr>
+          <w:p>
+            <w:pPr>
+              <w:spacing w:line="264" w:lineRule="auto"/>
+            </w:pPr>
+            <w:r>
+              <w:rPr>
+                <w:rFonts w:eastAsia="Times New Roman"/>
+                <w:color w:val="000000"/>
+                <w:sz w:val="23"/>
+              </w:rPr>
+              <w:t>B8: Kiểm tra thành phần, số lượng và tính hợp lệ</w:t>
+            </w:r>
+          </w:p>
+        </w:tc>
+        <w:tc>
+          <w:tcPr>
+            <w:tcW w:w="2110" w:type="dxa"/>
+            <w:tcMar>
+              <w:top w:w="95" w:type="dxa"/>
+              <w:left w:w="95" w:type="dxa"/>
+              <w:bottom w:w="95" w:type="dxa"/>
+              <w:right w:w="95" w:type="dxa"/>
+            </w:tcMar>
+          </w:tcPr>
+          <w:p>
+            <w:pPr>
+              <w:spacing w:line="264" w:lineRule="auto"/>
+            </w:pPr>
+            <w:r>
+              <w:rPr>
+                <w:rFonts w:eastAsia="Times New Roman"/>
+                <w:color w:val="000000"/>
+                <w:sz w:val="23"/>
+              </w:rPr>
+              <w:t>Cán bộ một cửa</w:t>
+            </w:r>
+          </w:p>
+        </w:tc>
+        <w:tc>
+          <w:tcPr>
+            <w:tcW w:w="4664" w:type="dxa"/>
+            <w:tcMar>
+              <w:top w:w="95" w:type="dxa"/>
+              <w:left w:w="95" w:type="dxa"/>
+              <w:bottom w:w="95" w:type="dxa"/>
+              <w:right w:w="95" w:type="dxa"/>
+            </w:tcMar>
+          </w:tcPr>
+          <w:p>
+            <w:pPr>
+              <w:spacing w:line="269" w:lineRule="auto"/>
+              <w:jc w:val="both"/>
+            </w:pPr>
+            <w:r>
+              <w:rPr>
+                <w:rFonts w:eastAsia="Times New Roman"/>
+                <w:color w:val="000000"/>
+                <w:sz w:val="23"/>
+              </w:rPr>
+              <w:t>Cán bộ đối chiếu hồ sơ thực tế với thành phần hồ sơ theo quy định. Nội dung kiểm tra bao gồm số lượng tài liệu, mức độ đầy đủ, tính chính xác, tính hợp lệ và việc hồ sơ có thuộc thẩm quyền giải quyết của cơ quan hay không.</w:t>
+            </w:r>
+          </w:p>
+        </w:tc>
+      </w:tr>
+      <w:tr>
+        <w:trPr>
+          <w:cantSplit/>
+          <w:jc w:val="center"/>
+        </w:trPr>
+        <w:tc>
+          <w:tcPr>
+            <w:tcW w:w="708" w:type="dxa"/>
+            <w:tcMar>
+              <w:top w:w="95" w:type="dxa"/>
+              <w:left w:w="95" w:type="dxa"/>
+              <w:bottom w:w="95" w:type="dxa"/>
+              <w:right w:w="95" w:type="dxa"/>
+            </w:tcMar>
+          </w:tcPr>
+          <w:p>
+            <w:pPr>
+              <w:jc w:val="center"/>
+            </w:pPr>
+            <w:r>
+              <w:rPr>
+                <w:rFonts w:eastAsia="Times New Roman"/>
+                <w:color w:val="000000"/>
+                <w:sz w:val="23"/>
+              </w:rPr>
+              <w:t>9</w:t>
+            </w:r>
+          </w:p>
+        </w:tc>
+        <w:tc>
+          <w:tcPr>
+            <w:tcW w:w="3247" w:type="dxa"/>
+            <w:tcMar>
+              <w:top w:w="95" w:type="dxa"/>
+              <w:left w:w="95" w:type="dxa"/>
+              <w:bottom w:w="95" w:type="dxa"/>
+              <w:right w:w="95" w:type="dxa"/>
+            </w:tcMar>
+          </w:tcPr>
+          <w:p>
+            <w:pPr>
+              <w:spacing w:line="264" w:lineRule="auto"/>
+            </w:pPr>
+            <w:r>
+              <w:rPr>
+                <w:rFonts w:eastAsia="Times New Roman"/>
+                <w:color w:val="000000"/>
+                <w:sz w:val="23"/>
+              </w:rPr>
+              <w:t>B9: Xử lý kết quả kiểm tra hồ sơ</w:t>
+            </w:r>
+          </w:p>
+        </w:tc>
+        <w:tc>
+          <w:tcPr>
+            <w:tcW w:w="2110" w:type="dxa"/>
+            <w:tcMar>
+              <w:top w:w="95" w:type="dxa"/>
+              <w:left w:w="95" w:type="dxa"/>
+              <w:bottom w:w="95" w:type="dxa"/>
+              <w:right w:w="95" w:type="dxa"/>
+            </w:tcMar>
+          </w:tcPr>
+          <w:p>
+            <w:pPr>
+              <w:spacing w:line="264" w:lineRule="auto"/>
+            </w:pPr>
+            <w:r>
+              <w:rPr>
+                <w:rFonts w:eastAsia="Times New Roman"/>
+                <w:color w:val="000000"/>
+                <w:sz w:val="23"/>
+              </w:rPr>
+              <w:t>Cán bộ một cửa; Cá nhân/Tổ chức</w:t>
+            </w:r>
+          </w:p>
+        </w:tc>
+        <w:tc>
+          <w:tcPr>
+            <w:tcW w:w="4664" w:type="dxa"/>
+            <w:tcMar>
+              <w:top w:w="95" w:type="dxa"/>
+              <w:left w:w="95" w:type="dxa"/>
+              <w:bottom w:w="95" w:type="dxa"/>
+              <w:right w:w="95" w:type="dxa"/>
+            </w:tcMar>
+          </w:tcPr>
+          <w:p>
+            <w:pPr>
+              <w:spacing w:after="40" w:line="269" w:lineRule="auto"/>
+              <w:jc w:val="both"/>
+            </w:pPr>
+            <w:r>
+              <w:rPr>
+                <w:rFonts w:eastAsia="Times New Roman"/>
+                <w:color w:val="000000"/>
+                <w:sz w:val="23"/>
+              </w:rPr>
+              <w:t>Sau khi kiểm tra, hồ sơ được xử lý theo một trong ba trường hợp:</w:t>
+            </w:r>
+          </w:p>
+          <w:p>
+            <w:pPr>
+              <w:pStyle w:val="CellBullet"/>
+              <w:jc w:val="both"/>
+            </w:pPr>
+            <w:r>
+              <w:rPr>
+                <w:b/>
+                <w:color w:val="000000"/>
+              </w:rPr>
+              <w:t xml:space="preserve">Hồ sơ đầy đủ, hợp lệ: </w:t>
+            </w:r>
+            <w:r>
+              <w:rPr>
+                <w:color w:val="000000"/>
+              </w:rPr>
+              <w:t>Cán bộ xác nhận hồ sơ đủ điều kiện tiếp nhận và chuyển sang bước kiểm tra chứng thực điện tử.</w:t>
+            </w:r>
+          </w:p>
+          <w:p>
+            <w:pPr>
+              <w:pStyle w:val="CellBullet"/>
+              <w:jc w:val="both"/>
+            </w:pPr>
+            <w:r>
+              <w:rPr>
+                <w:b/>
+                <w:color w:val="000000"/>
+              </w:rPr>
+              <w:t xml:space="preserve">Hồ sơ cần bổ sung, hoàn thiện: </w:t>
+            </w:r>
+            <w:r>
+              <w:rPr>
+                <w:color w:val="000000"/>
+              </w:rPr>
+              <w:t>Cán bộ ghi rõ nội dung còn thiếu, lập Phiếu yêu cầu bổ sung và thông báo cho cá nhân hoặc tổ chức. Sau khi bổ sung, hồ sơ quay lại bước 8 để kiểm tra lại.</w:t>
+            </w:r>
+          </w:p>
+          <w:p>
+            <w:pPr>
+              <w:pStyle w:val="CellBullet"/>
+              <w:jc w:val="both"/>
+            </w:pPr>
+            <w:r>
+              <w:rPr>
+                <w:b/>
+                <w:color w:val="000000"/>
+              </w:rPr>
+              <w:t xml:space="preserve">Hồ sơ không hợp lệ hoặc không thuộc thẩm quyền: </w:t>
+            </w:r>
+            <w:r>
+              <w:rPr>
+                <w:color w:val="000000"/>
+              </w:rPr>
+              <w:t>Cán bộ lập Phiếu từ chối tiếp nhận, ghi rõ lý do hoặc hướng dẫn người nộp đến cơ quan có thẩm quyền; quy trình kết thúc tại nhánh này.</w:t>
+            </w:r>
+          </w:p>
+        </w:tc>
+      </w:tr>
+      <w:tr>
+        <w:trPr>
+          <w:cantSplit/>
+          <w:jc w:val="center"/>
+        </w:trPr>
+        <w:tc>
+          <w:tcPr>
+            <w:tcW w:w="708" w:type="dxa"/>
+            <w:tcMar>
+              <w:top w:w="95" w:type="dxa"/>
+              <w:left w:w="95" w:type="dxa"/>
+              <w:bottom w:w="95" w:type="dxa"/>
+              <w:right w:w="95" w:type="dxa"/>
+            </w:tcMar>
+          </w:tcPr>
+          <w:p>
+            <w:pPr>
+              <w:jc w:val="center"/>
+            </w:pPr>
+            <w:r>
+              <w:rPr>
+                <w:rFonts w:eastAsia="Times New Roman"/>
+                <w:color w:val="000000"/>
+                <w:sz w:val="23"/>
+              </w:rPr>
+              <w:lastRenderedPageBreak/>
+              <w:t>10</w:t>
+            </w:r>
+          </w:p>
+        </w:tc>
+        <w:tc>
+          <w:tcPr>
+            <w:tcW w:w="3247" w:type="dxa"/>
+            <w:tcMar>
+              <w:top w:w="95" w:type="dxa"/>
+              <w:left w:w="95" w:type="dxa"/>
+              <w:bottom w:w="95" w:type="dxa"/>
+              <w:right w:w="95" w:type="dxa"/>
+            </w:tcMar>
+          </w:tcPr>
+          <w:p>
+            <w:pPr>
+              <w:spacing w:line="264" w:lineRule="auto"/>
+            </w:pPr>
+            <w:r>
+              <w:rPr>
+                <w:rFonts w:eastAsia="Times New Roman"/>
+                <w:color w:val="000000"/>
+                <w:sz w:val="23"/>
+              </w:rPr>
+              <w:t>B10: Kiểm tra chứng thực điện tử</w:t>
+            </w:r>
+          </w:p>
+        </w:tc>
+        <w:tc>
+          <w:tcPr>
+            <w:tcW w:w="2110" w:type="dxa"/>
+            <w:tcMar>
+              <w:top w:w="95" w:type="dxa"/>
+              <w:left w:w="95" w:type="dxa"/>
+              <w:bottom w:w="95" w:type="dxa"/>
+              <w:right w:w="95" w:type="dxa"/>
+            </w:tcMar>
+          </w:tcPr>
+          <w:p>
+            <w:pPr>
+              <w:spacing w:line="264" w:lineRule="auto"/>
+            </w:pPr>
+            <w:r>
+              <w:rPr>
+                <w:rFonts w:eastAsia="Times New Roman"/>
+                <w:color w:val="000000"/>
+                <w:sz w:val="23"/>
+              </w:rPr>
+              <w:t>Cán bộ một cửa</w:t>
+            </w:r>
+          </w:p>
+        </w:tc>
+        <w:tc>
+          <w:tcPr>
+            <w:tcW w:w="4664" w:type="dxa"/>
+            <w:tcMar>
+              <w:top w:w="95" w:type="dxa"/>
+              <w:left w:w="95" w:type="dxa"/>
+              <w:bottom w:w="95" w:type="dxa"/>
+              <w:right w:w="95" w:type="dxa"/>
+            </w:tcMar>
+          </w:tcPr>
+          <w:p>
+            <w:pPr>
+              <w:spacing w:line="269" w:lineRule="auto"/>
+              <w:jc w:val="both"/>
+            </w:pPr>
+            <w:r>
+              <w:rPr>
+                <w:rFonts w:eastAsia="Times New Roman"/>
+                <w:color w:val="000000"/>
+                <w:sz w:val="23"/>
+              </w:rPr>
+              <w:t>Đối với hồ sơ đầy đủ và hợp lệ, cán bộ kiểm tra các giấy tờ, tài liệu đã có dữ liệu điện tử hoặc đã được chứng thực điện tử hay chưa. Tài liệu điện tử hợp lệ có thể được khai thác, tái sử dụng mà người nộp không phải cung cấp lại.</w:t>
+            </w:r>
+          </w:p>
+        </w:tc>
+      </w:tr>
+      <w:tr>
+        <w:trPr>
+          <w:cantSplit/>
+          <w:jc w:val="center"/>
+        </w:trPr>
+        <w:tc>
+          <w:tcPr>
+            <w:tcW w:w="708" w:type="dxa"/>
+            <w:tcMar>
+              <w:top w:w="95" w:type="dxa"/>
+              <w:left w:w="95" w:type="dxa"/>
+              <w:bottom w:w="95" w:type="dxa"/>
+              <w:right w:w="95" w:type="dxa"/>
+            </w:tcMar>
+          </w:tcPr>
+          <w:p>
+            <w:pPr>
+              <w:jc w:val="center"/>
+            </w:pPr>
+            <w:r>
+              <w:rPr>
+                <w:rFonts w:eastAsia="Times New Roman"/>
+                <w:color w:val="000000"/>
+                <w:sz w:val="23"/>
+              </w:rPr>
+              <w:t>11</w:t>
+            </w:r>
+          </w:p>
+        </w:tc>
+        <w:tc>
+          <w:tcPr>
+            <w:tcW w:w="3247" w:type="dxa"/>
+            <w:tcMar>
+              <w:top w:w="95" w:type="dxa"/>
+              <w:left w:w="95" w:type="dxa"/>
+              <w:bottom w:w="95" w:type="dxa"/>
+              <w:right w:w="95" w:type="dxa"/>
+            </w:tcMar>
+          </w:tcPr>
+          <w:p>
+            <w:pPr>
+              <w:spacing w:line="264" w:lineRule="auto"/>
+            </w:pPr>
+            <w:r>
+              <w:rPr>
+                <w:rFonts w:eastAsia="Times New Roman"/>
+                <w:color w:val="000000"/>
+                <w:sz w:val="23"/>
+              </w:rPr>
+              <w:t>B11: Scan, số hóa và chứng thực điện tử</w:t>
+            </w:r>
+          </w:p>
+        </w:tc>
+        <w:tc>
+          <w:tcPr>
+            <w:tcW w:w="2110" w:type="dxa"/>
+            <w:tcMar>
+              <w:top w:w="95" w:type="dxa"/>
+              <w:left w:w="95" w:type="dxa"/>
+              <w:bottom w:w="95" w:type="dxa"/>
+              <w:right w:w="95" w:type="dxa"/>
+            </w:tcMar>
+          </w:tcPr>
+          <w:p>
+            <w:pPr>
+              <w:spacing w:line="264" w:lineRule="auto"/>
+            </w:pPr>
+            <w:r>
+              <w:rPr>
+                <w:rFonts w:eastAsia="Times New Roman"/>
+                <w:color w:val="000000"/>
+                <w:sz w:val="23"/>
+              </w:rPr>
+              <w:t>Cán bộ một cửa; Cán bộ chứng thực</w:t>
+            </w:r>
+          </w:p>
+        </w:tc>
+        <w:tc>
+          <w:tcPr>
+            <w:tcW w:w="4664" w:type="dxa"/>
+            <w:tcMar>
+              <w:top w:w="95" w:type="dxa"/>
+              <w:left w:w="95" w:type="dxa"/>
+              <w:bottom w:w="95" w:type="dxa"/>
+              <w:right w:w="95" w:type="dxa"/>
+            </w:tcMar>
+          </w:tcPr>
+          <w:p>
+            <w:pPr>
+              <w:spacing w:line="269" w:lineRule="auto"/>
+              <w:jc w:val="both"/>
+            </w:pPr>
+            <w:r>
+              <w:rPr>
+                <w:rFonts w:eastAsia="Times New Roman"/>
+                <w:color w:val="000000"/>
+                <w:sz w:val="23"/>
+              </w:rPr>
+              <w:t>Đối với giấy tờ chưa có dữ liệu điện tử, cán bộ thực hiện scan hoặc sao chụp, tải tệp lên hệ thống và chuyển chứng thực điện tử khi cần thiết. Tài liệu số hóa phải bảo đảm đầy đủ, toàn vẹn, chính xác và thống nhất với bản giấy.</w:t>
+            </w:r>
+          </w:p>
+        </w:tc>
+      </w:tr>
+      <w:tr>
+        <w:trPr>
+          <w:cantSplit/>
+          <w:jc w:val="center"/>
+        </w:trPr>
+        <w:tc>
+          <w:tcPr>
+            <w:tcW w:w="708" w:type="dxa"/>
+            <w:tcMar>
+              <w:top w:w="95" w:type="dxa"/>
+              <w:left w:w="95" w:type="dxa"/>
+              <w:bottom w:w="95" w:type="dxa"/>
+              <w:right w:w="95" w:type="dxa"/>
+            </w:tcMar>
+          </w:tcPr>
+          <w:p>
+            <w:pPr>
+              <w:jc w:val="center"/>
+            </w:pPr>
+            <w:r>
+              <w:rPr>
+                <w:rFonts w:eastAsia="Times New Roman"/>
+                <w:color w:val="000000"/>
+                <w:sz w:val="23"/>
+              </w:rPr>
+              <w:t>12</w:t>
+            </w:r>
+          </w:p>
+        </w:tc>
+        <w:tc>
+          <w:tcPr>
+            <w:tcW w:w="3247" w:type="dxa"/>
+            <w:tcMar>
+              <w:top w:w="95" w:type="dxa"/>
+              <w:left w:w="95" w:type="dxa"/>
+              <w:bottom w:w="95" w:type="dxa"/>
+              <w:right w:w="95" w:type="dxa"/>
+            </w:tcMar>
+          </w:tcPr>
+          <w:p>
+            <w:pPr>
+              <w:spacing w:line="264" w:lineRule="auto"/>
+            </w:pPr>
+            <w:r>
+              <w:rPr>
+                <w:rFonts w:eastAsia="Times New Roman"/>
+                <w:color w:val="000000"/>
+                <w:sz w:val="23"/>
+              </w:rPr>
+              <w:t>B12: Ghi nhận hình thức nhận kết quả</w:t>
+            </w:r>
+          </w:p>
+        </w:tc>
+        <w:tc>
+          <w:tcPr>
+            <w:tcW w:w="2110" w:type="dxa"/>
+            <w:tcMar>
+              <w:top w:w="95" w:type="dxa"/>
+              <w:left w:w="95" w:type="dxa"/>
+              <w:bottom w:w="95" w:type="dxa"/>
+              <w:right w:w="95" w:type="dxa"/>
+            </w:tcMar>
+          </w:tcPr>
+          <w:p>
+            <w:pPr>
+              <w:spacing w:line="264" w:lineRule="auto"/>
+            </w:pPr>
+            <w:r>
+              <w:rPr>
+                <w:rFonts w:eastAsia="Times New Roman"/>
+                <w:color w:val="000000"/>
+                <w:sz w:val="23"/>
+              </w:rPr>
+              <w:t>Cá nhân/Tổ chức; Cán bộ một cửa</w:t>
+            </w:r>
+          </w:p>
+        </w:tc>
+        <w:tc>
+          <w:tcPr>
+            <w:tcW w:w="4664" w:type="dxa"/>
+            <w:tcMar>
+              <w:top w:w="95" w:type="dxa"/>
+              <w:left w:w="95" w:type="dxa"/>
+              <w:bottom w:w="95" w:type="dxa"/>
+              <w:right w:w="95" w:type="dxa"/>
+            </w:tcMar>
+          </w:tcPr>
+          <w:p>
+            <w:pPr>
+              <w:spacing w:line="269" w:lineRule="auto"/>
+              <w:jc w:val="both"/>
+            </w:pPr>
+            <w:r>
+              <w:rPr>
+                <w:rFonts w:eastAsia="Times New Roman"/>
+                <w:color w:val="000000"/>
+                <w:sz w:val="23"/>
+              </w:rPr>
+              <w:t>Cá nhân hoặc tổ chức lựa chọn nhận kết quả trực tiếp tại Bộ phận Một cửa, nhận trực tuyến hoặc nhận tại nhà qua dịch vụ bưu chính công ích. Cán bộ ghi nhận hình thức đã lựa chọn và cập nhật thông tin người nhận trên hệ thống.</w:t>
+            </w:r>
+          </w:p>
+        </w:tc>
+      </w:tr>
+      <w:tr>
+        <w:trPr>
+          <w:cantSplit/>
+          <w:jc w:val="center"/>
+        </w:trPr>
+        <w:tc>
+          <w:tcPr>
+            <w:tcW w:w="708" w:type="dxa"/>
+            <w:tcMar>
+              <w:top w:w="95" w:type="dxa"/>
+              <w:left w:w="95" w:type="dxa"/>
+              <w:bottom w:w="95" w:type="dxa"/>
+              <w:right w:w="95" w:type="dxa"/>
+            </w:tcMar>
+          </w:tcPr>
+          <w:p>
+            <w:pPr>
+              <w:jc w:val="center"/>
+            </w:pPr>
+            <w:r>
+              <w:rPr>
+                <w:rFonts w:eastAsia="Times New Roman"/>
+                <w:color w:val="000000"/>
+                <w:sz w:val="23"/>
+              </w:rPr>
+              <w:t>13</w:t>
+            </w:r>
+          </w:p>
+        </w:tc>
+        <w:tc>
+          <w:tcPr>
+            <w:tcW w:w="3247" w:type="dxa"/>
+            <w:tcMar>
+              <w:top w:w="95" w:type="dxa"/>
+              <w:left w:w="95" w:type="dxa"/>
+              <w:bottom w:w="95" w:type="dxa"/>
+              <w:right w:w="95" w:type="dxa"/>
+            </w:tcMar>
+          </w:tcPr>
+          <w:p>
+            <w:pPr>
+              <w:spacing w:line="264" w:lineRule="auto"/>
+            </w:pPr>
+            <w:r>
+              <w:rPr>
+                <w:rFonts w:eastAsia="Times New Roman"/>
+                <w:color w:val="000000"/>
+                <w:sz w:val="23"/>
+              </w:rPr>
+              <w:t>B13: Lưu hồ sơ, cấp mã và cập nhật trạng thái</w:t>
+            </w:r>
+          </w:p>
+        </w:tc>
+        <w:tc>
+          <w:tcPr>
+            <w:tcW w:w="2110" w:type="dxa"/>
+            <w:tcMar>
+              <w:top w:w="95" w:type="dxa"/>
+              <w:left w:w="95" w:type="dxa"/>
+              <w:bottom w:w="95" w:type="dxa"/>
+              <w:right w:w="95" w:type="dxa"/>
+            </w:tcMar>
+          </w:tcPr>
+          <w:p>
+            <w:pPr>
+              <w:spacing w:line="264" w:lineRule="auto"/>
+            </w:pPr>
+            <w:r>
+              <w:rPr>
+                <w:rFonts w:eastAsia="Times New Roman"/>
+                <w:color w:val="000000"/>
+                <w:sz w:val="23"/>
+              </w:rPr>
+              <w:t>Cán bộ một cửa; Hệ thống</w:t>
+            </w:r>
+          </w:p>
+        </w:tc>
+        <w:tc>
+          <w:tcPr>
+            <w:tcW w:w="4664" w:type="dxa"/>
+            <w:tcMar>
+              <w:top w:w="95" w:type="dxa"/>
+              <w:left w:w="95" w:type="dxa"/>
+              <w:bottom w:w="95" w:type="dxa"/>
+              <w:right w:w="95" w:type="dxa"/>
+            </w:tcMar>
+          </w:tcPr>
+          <w:p>
+            <w:pPr>
+              <w:spacing w:line="269" w:lineRule="auto"/>
+              <w:jc w:val="both"/>
+            </w:pPr>
+            <w:r>
+              <w:rPr>
+                <w:rFonts w:eastAsia="Times New Roman"/>
+                <w:color w:val="000000"/>
+                <w:sz w:val="23"/>
+              </w:rPr>
+              <w:t>Cán bộ kiểm tra lại các thông tin đã nhập và thực hiện lưu hồ sơ. Hệ thống cấp mã hồ sơ để phục vụ tra cứu, theo dõi; đồng thời cập nhật trạng thái của hồ sơ trong quá trình tiếp nhận và giải quyết.</w:t>
+            </w:r>
+          </w:p>
+        </w:tc>
+      </w:tr>
+      <w:tr>
+        <w:trPr>
+          <w:cantSplit/>
+          <w:jc w:val="center"/>
+        </w:trPr>
+        <w:tc>
+          <w:tcPr>
+            <w:tcW w:w="708" w:type="dxa"/>
+            <w:tcMar>
+              <w:top w:w="95" w:type="dxa"/>
+              <w:left w:w="95" w:type="dxa"/>
+              <w:bottom w:w="95" w:type="dxa"/>
+              <w:right w:w="95" w:type="dxa"/>
+            </w:tcMar>
+          </w:tcPr>
+          <w:p>
+            <w:pPr>
+              <w:jc w:val="center"/>
+            </w:pPr>
+            <w:r>
+              <w:rPr>
+                <w:rFonts w:eastAsia="Times New Roman"/>
+                <w:color w:val="000000"/>
+                <w:sz w:val="23"/>
+              </w:rPr>
+              <w:t>14</w:t>
+            </w:r>
+          </w:p>
+        </w:tc>
+        <w:tc>
+          <w:tcPr>
+            <w:tcW w:w="3247" w:type="dxa"/>
+            <w:tcMar>
+              <w:top w:w="95" w:type="dxa"/>
+              <w:left w:w="95" w:type="dxa"/>
+              <w:bottom w:w="95" w:type="dxa"/>
+              <w:right w:w="95" w:type="dxa"/>
+            </w:tcMar>
+          </w:tcPr>
+          <w:p>
+            <w:pPr>
+              <w:spacing w:line="264" w:lineRule="auto"/>
+            </w:pPr>
+            <w:r>
+              <w:rPr>
+                <w:rFonts w:eastAsia="Times New Roman"/>
+                <w:color w:val="000000"/>
+                <w:sz w:val="23"/>
+              </w:rPr>
+              <w:t>B14: In hoặc gửi Phiếu tiếp nhận và hẹn trả kết quả</w:t>
+            </w:r>
+          </w:p>
+        </w:tc>
+        <w:tc>
+          <w:tcPr>
+            <w:tcW w:w="2110" w:type="dxa"/>
+            <w:tcMar>
+              <w:top w:w="95" w:type="dxa"/>
+              <w:left w:w="95" w:type="dxa"/>
+              <w:bottom w:w="95" w:type="dxa"/>
+              <w:right w:w="95" w:type="dxa"/>
+            </w:tcMar>
+          </w:tcPr>
+          <w:p>
+            <w:pPr>
+              <w:spacing w:line="264" w:lineRule="auto"/>
+            </w:pPr>
+            <w:r>
+              <w:rPr>
+                <w:rFonts w:eastAsia="Times New Roman"/>
+                <w:color w:val="000000"/>
+                <w:sz w:val="23"/>
+              </w:rPr>
+              <w:t>Cán bộ một cửa; Hệ thống</w:t>
+            </w:r>
+          </w:p>
+        </w:tc>
+        <w:tc>
+          <w:tcPr>
+            <w:tcW w:w="4664" w:type="dxa"/>
+            <w:tcMar>
+              <w:top w:w="95" w:type="dxa"/>
+              <w:left w:w="95" w:type="dxa"/>
+              <w:bottom w:w="95" w:type="dxa"/>
+              <w:right w:w="95" w:type="dxa"/>
+            </w:tcMar>
+          </w:tcPr>
+          <w:p>
+            <w:pPr>
+              <w:spacing w:line="269" w:lineRule="auto"/>
+              <w:jc w:val="both"/>
+            </w:pPr>
+            <w:r>
+              <w:rPr>
+                <w:rFonts w:eastAsia="Times New Roman"/>
+                <w:color w:val="000000"/>
+                <w:sz w:val="23"/>
+              </w:rPr>
+              <w:t>Sau khi lưu hồ sơ thành công, cán bộ in hoặc gửi Phiếu tiếp nhận và hẹn trả kết quả cho người nộp. Phiếu thể hiện mã hồ sơ, ngày tiếp nhận, thời hạn giải quyết, cơ quan xử lý và hình thức nhận kết quả.</w:t>
+            </w:r>
+          </w:p>
+        </w:tc>
+      </w:tr>
+      <w:tr>
+        <w:trPr>
+          <w:cantSplit/>
+          <w:jc w:val="center"/>
+        </w:trPr>
+        <w:tc>
+          <w:tcPr>
+            <w:tcW w:w="708" w:type="dxa"/>
+            <w:tcMar>
+              <w:top w:w="95" w:type="dxa"/>
+              <w:left w:w="95" w:type="dxa"/>
+              <w:bottom w:w="95" w:type="dxa"/>
+              <w:right w:w="95" w:type="dxa"/>
+            </w:tcMar>
+          </w:tcPr>
+          <w:p>
+            <w:pPr>
+              <w:jc w:val="center"/>
+            </w:pPr>
+            <w:r>
+              <w:rPr>
+                <w:rFonts w:eastAsia="Times New Roman"/>
+                <w:color w:val="000000"/>
+                <w:sz w:val="23"/>
+              </w:rPr>
+              <w:t>15</w:t>
+            </w:r>
+          </w:p>
+        </w:tc>
+        <w:tc>
+          <w:tcPr>
+            <w:tcW w:w="3247" w:type="dxa"/>
+            <w:tcMar>
+              <w:top w:w="95" w:type="dxa"/>
+              <w:left w:w="95" w:type="dxa"/>
+              <w:bottom w:w="95" w:type="dxa"/>
+              <w:right w:w="95" w:type="dxa"/>
+            </w:tcMar>
+          </w:tcPr>
+          <w:p>
+            <w:pPr>
+              <w:spacing w:line="264" w:lineRule="auto"/>
+            </w:pPr>
+            <w:r>
+              <w:rPr>
+                <w:rFonts w:eastAsia="Times New Roman"/>
+                <w:color w:val="000000"/>
+                <w:sz w:val="23"/>
+              </w:rPr>
+              <w:t>B15: Chuyển hồ sơ đến đơn vị chuyên môn</w:t>
+            </w:r>
+          </w:p>
+        </w:tc>
+        <w:tc>
+          <w:tcPr>
+            <w:tcW w:w="2110" w:type="dxa"/>
+            <w:tcMar>
+              <w:top w:w="95" w:type="dxa"/>
+              <w:left w:w="95" w:type="dxa"/>
+              <w:bottom w:w="95" w:type="dxa"/>
+              <w:right w:w="95" w:type="dxa"/>
+            </w:tcMar>
+          </w:tcPr>
+          <w:p>
+            <w:pPr>
+              <w:spacing w:line="264" w:lineRule="auto"/>
+            </w:pPr>
+            <w:r>
+              <w:rPr>
+                <w:rFonts w:eastAsia="Times New Roman"/>
+                <w:color w:val="000000"/>
+                <w:sz w:val="23"/>
+              </w:rPr>
+              <w:t>Cán bộ một cửa; Hệ thống</w:t>
+            </w:r>
+          </w:p>
+        </w:tc>
+        <w:tc>
+          <w:tcPr>
+            <w:tcW w:w="4664" w:type="dxa"/>
+            <w:tcMar>
+              <w:top w:w="95" w:type="dxa"/>
+              <w:left w:w="95" w:type="dxa"/>
+              <w:bottom w:w="95" w:type="dxa"/>
+              <w:right w:w="95" w:type="dxa"/>
+            </w:tcMar>
+          </w:tcPr>
+          <w:p>
+            <w:pPr>
+              <w:spacing w:line="269" w:lineRule="auto"/>
+              <w:jc w:val="both"/>
+            </w:pPr>
+            <w:r>
+              <w:rPr>
+                <w:rFonts w:eastAsia="Times New Roman"/>
+                <w:color w:val="000000"/>
+                <w:sz w:val="23"/>
+              </w:rPr>
+              <w:t>Cán bộ một cửa chuyển hồ sơ điện tử và các tài liệu có liên quan đến cán bộ hoặc đơn vị chuyên môn có trách nhiệm xử lý. Hệ thống ghi nhận việc chuyển hồ sơ và cập nhật hồ sơ sang trạng thái đang xử lý.</w:t>
+            </w:r>
+          </w:p>
+        </w:tc>
+      </w:tr>
+      <w:tr>
+        <w:trPr>
+          <w:cantSplit/>
+          <w:jc w:val="center"/>
+        </w:trPr>
+        <w:tc>
+          <w:tcPr>
+            <w:tcW w:w="708" w:type="dxa"/>
+            <w:tcMar>
+              <w:top w:w="95" w:type="dxa"/>
+              <w:left w:w="95" w:type="dxa"/>
+              <w:bottom w:w="95" w:type="dxa"/>
+              <w:right w:w="95" w:type="dxa"/>
+            </w:tcMar>
+          </w:tcPr>
+          <w:p>
+            <w:pPr>
+              <w:jc w:val="center"/>
+            </w:pPr>
+            <w:r>
+              <w:rPr>
+                <w:rFonts w:eastAsia="Times New Roman"/>
+                <w:color w:val="000000"/>
+                <w:sz w:val="23"/>
+              </w:rPr>
+              <w:t>16</w:t>
+            </w:r>
+          </w:p>
+        </w:tc>
+        <w:tc>
+          <w:tcPr>
+            <w:tcW w:w="3247" w:type="dxa"/>
+            <w:tcMar>
+              <w:top w:w="95" w:type="dxa"/>
+              <w:left w:w="95" w:type="dxa"/>
+              <w:bottom w:w="95" w:type="dxa"/>
+              <w:right w:w="95" w:type="dxa"/>
+            </w:tcMar>
+          </w:tcPr>
+          <w:p>
+            <w:pPr>
+              <w:spacing w:line="264" w:lineRule="auto"/>
+            </w:pPr>
+            <w:r>
+              <w:rPr>
+                <w:rFonts w:eastAsia="Times New Roman"/>
+                <w:color w:val="000000"/>
+                <w:sz w:val="23"/>
+              </w:rPr>
+              <w:t>B16: Kiểm tra, thẩm định và xử lý hồ sơ</w:t>
+            </w:r>
+          </w:p>
+        </w:tc>
+        <w:tc>
+          <w:tcPr>
+            <w:tcW w:w="2110" w:type="dxa"/>
+            <w:tcMar>
+              <w:top w:w="95" w:type="dxa"/>
+              <w:left w:w="95" w:type="dxa"/>
+              <w:bottom w:w="95" w:type="dxa"/>
+              <w:right w:w="95" w:type="dxa"/>
+            </w:tcMar>
+          </w:tcPr>
+          <w:p>
+            <w:pPr>
+              <w:spacing w:line="264" w:lineRule="auto"/>
+            </w:pPr>
+            <w:r>
+              <w:rPr>
+                <w:rFonts w:eastAsia="Times New Roman"/>
+                <w:color w:val="000000"/>
+                <w:sz w:val="23"/>
+              </w:rPr>
+              <w:t>Cán bộ/Đơn vị chuyên môn</w:t>
+            </w:r>
+          </w:p>
+        </w:tc>
+        <w:tc>
+          <w:tcPr>
+            <w:tcW w:w="4664" w:type="dxa"/>
+            <w:tcMar>
+              <w:top w:w="95" w:type="dxa"/>
+              <w:left w:w="95" w:type="dxa"/>
+              <w:bottom w:w="95" w:type="dxa"/>
+              <w:right w:w="95" w:type="dxa"/>
+            </w:tcMar>
+          </w:tcPr>
+          <w:p>
+            <w:pPr>
+              <w:spacing w:line="269" w:lineRule="auto"/>
+              <w:jc w:val="both"/>
+            </w:pPr>
+            <w:r>
+              <w:rPr>
+                <w:rFonts w:eastAsia="Times New Roman"/>
+                <w:color w:val="000000"/>
+                <w:sz w:val="23"/>
+              </w:rPr>
+              <w:t>Cán bộ chuyên môn kiểm tra nội dung hồ sơ, đối chiếu với các quy định chuyên ngành và đánh giá điều kiện giải quyết thủ tục hành chính. Kết quả thẩm định và các nội dung xử lý được ghi nhận, lưu trữ trên hệ thống.</w:t>
+            </w:r>
+          </w:p>
+        </w:tc>
+      </w:tr>
+      <w:tr>
+        <w:trPr>
+          <w:cantSplit/>
+          <w:jc w:val="center"/>
+        </w:trPr>
+        <w:tc>
+          <w:tcPr>
+            <w:tcW w:w="708" w:type="dxa"/>
+            <w:tcMar>
+              <w:top w:w="95" w:type="dxa"/>
+              <w:left w:w="95" w:type="dxa"/>
+              <w:bottom w:w="95" w:type="dxa"/>
+              <w:right w:w="95" w:type="dxa"/>
+            </w:tcMar>
+          </w:tcPr>
+          <w:p>
+            <w:pPr>
+              <w:jc w:val="center"/>
+            </w:pPr>
+            <w:r>
+              <w:rPr>
+                <w:rFonts w:eastAsia="Times New Roman"/>
+                <w:color w:val="000000"/>
+                <w:sz w:val="23"/>
+              </w:rPr>
+              <w:lastRenderedPageBreak/>
+              <w:t>17</w:t>
+            </w:r>
+          </w:p>
+        </w:tc>
+        <w:tc>
+          <w:tcPr>
+            <w:tcW w:w="3247" w:type="dxa"/>
+            <w:tcMar>
+              <w:top w:w="95" w:type="dxa"/>
+              <w:left w:w="95" w:type="dxa"/>
+              <w:bottom w:w="95" w:type="dxa"/>
+              <w:right w:w="95" w:type="dxa"/>
+            </w:tcMar>
+          </w:tcPr>
+          <w:p>
+            <w:pPr>
+              <w:spacing w:line="264" w:lineRule="auto"/>
+            </w:pPr>
+            <w:r>
+              <w:rPr>
+                <w:rFonts w:eastAsia="Times New Roman"/>
+                <w:color w:val="000000"/>
+                <w:sz w:val="23"/>
+              </w:rPr>
+              <w:t>B17: Thẩm tra, xác minh hoặc lấy ý kiến</w:t>
+            </w:r>
+          </w:p>
+        </w:tc>
+        <w:tc>
+          <w:tcPr>
+            <w:tcW w:w="2110" w:type="dxa"/>
+            <w:tcMar>
+              <w:top w:w="95" w:type="dxa"/>
+              <w:left w:w="95" w:type="dxa"/>
+              <w:bottom w:w="95" w:type="dxa"/>
+              <w:right w:w="95" w:type="dxa"/>
+            </w:tcMar>
+          </w:tcPr>
+          <w:p>
+            <w:pPr>
+              <w:spacing w:line="264" w:lineRule="auto"/>
+            </w:pPr>
+            <w:r>
+              <w:rPr>
+                <w:rFonts w:eastAsia="Times New Roman"/>
+                <w:color w:val="000000"/>
+                <w:sz w:val="23"/>
+              </w:rPr>
+              <w:t>Cán bộ chuyên môn; Cơ quan phối hợp</w:t>
+            </w:r>
+          </w:p>
+        </w:tc>
+        <w:tc>
+          <w:tcPr>
+            <w:tcW w:w="4664" w:type="dxa"/>
+            <w:tcMar>
+              <w:top w:w="95" w:type="dxa"/>
+              <w:left w:w="95" w:type="dxa"/>
+              <w:bottom w:w="95" w:type="dxa"/>
+              <w:right w:w="95" w:type="dxa"/>
+            </w:tcMar>
+          </w:tcPr>
+          <w:p>
+            <w:pPr>
+              <w:spacing w:line="269" w:lineRule="auto"/>
+              <w:jc w:val="both"/>
+            </w:pPr>
+            <w:r>
+              <w:rPr>
+                <w:rFonts w:eastAsia="Times New Roman"/>
+                <w:color w:val="000000"/>
+                <w:sz w:val="23"/>
+              </w:rPr>
+              <w:t>Khi cần thêm căn cứ, cán bộ chuyên môn thực hiện thẩm tra, xác minh hoặc gửi yêu cầu lấy ý kiến cơ quan phối hợp. Kết quả xác minh và ý kiến phản hồi được số hóa, cập nhật và lưu cùng hồ sơ để làm căn cứ xử lý.</w:t>
+            </w:r>
+          </w:p>
+        </w:tc>
+      </w:tr>
+      <w:tr>
+        <w:trPr>
+          <w:cantSplit/>
+          <w:jc w:val="center"/>
+        </w:trPr>
+        <w:tc>
+          <w:tcPr>
+            <w:tcW w:w="708" w:type="dxa"/>
+            <w:tcMar>
+              <w:top w:w="95" w:type="dxa"/>
+              <w:left w:w="95" w:type="dxa"/>
+              <w:bottom w:w="95" w:type="dxa"/>
+              <w:right w:w="95" w:type="dxa"/>
+            </w:tcMar>
+          </w:tcPr>
+          <w:p>
+            <w:pPr>
+              <w:jc w:val="center"/>
+            </w:pPr>
+            <w:r>
+              <w:rPr>
+                <w:rFonts w:eastAsia="Times New Roman"/>
+                <w:color w:val="000000"/>
+                <w:sz w:val="23"/>
+              </w:rPr>
+              <w:t>18</w:t>
+            </w:r>
+          </w:p>
+        </w:tc>
+        <w:tc>
+          <w:tcPr>
+            <w:tcW w:w="3247" w:type="dxa"/>
+            <w:tcMar>
+              <w:top w:w="95" w:type="dxa"/>
+              <w:left w:w="95" w:type="dxa"/>
+              <w:bottom w:w="95" w:type="dxa"/>
+              <w:right w:w="95" w:type="dxa"/>
+            </w:tcMar>
+          </w:tcPr>
+          <w:p>
+            <w:pPr>
+              <w:spacing w:line="264" w:lineRule="auto"/>
+            </w:pPr>
+            <w:r>
+              <w:rPr>
+                <w:rFonts w:eastAsia="Times New Roman"/>
+                <w:color w:val="000000"/>
+                <w:sz w:val="23"/>
+              </w:rPr>
+              <w:t>B18: Lập dự thảo kết quả hoặc văn bản không giải quyết</w:t>
+            </w:r>
+          </w:p>
+        </w:tc>
+        <w:tc>
+          <w:tcPr>
+            <w:tcW w:w="2110" w:type="dxa"/>
+            <w:tcMar>
+              <w:top w:w="95" w:type="dxa"/>
+              <w:left w:w="95" w:type="dxa"/>
+              <w:bottom w:w="95" w:type="dxa"/>
+              <w:right w:w="95" w:type="dxa"/>
+            </w:tcMar>
+          </w:tcPr>
+          <w:p>
+            <w:pPr>
+              <w:spacing w:line="264" w:lineRule="auto"/>
+            </w:pPr>
+            <w:r>
+              <w:rPr>
+                <w:rFonts w:eastAsia="Times New Roman"/>
+                <w:color w:val="000000"/>
+                <w:sz w:val="23"/>
+              </w:rPr>
+              <w:t>Cán bộ chuyên môn</w:t>
+            </w:r>
+          </w:p>
+        </w:tc>
+        <w:tc>
+          <w:tcPr>
+            <w:tcW w:w="4664" w:type="dxa"/>
+            <w:tcMar>
+              <w:top w:w="95" w:type="dxa"/>
+              <w:left w:w="95" w:type="dxa"/>
+              <w:bottom w:w="95" w:type="dxa"/>
+              <w:right w:w="95" w:type="dxa"/>
+            </w:tcMar>
+          </w:tcPr>
+          <w:p>
+            <w:pPr>
+              <w:spacing w:line="269" w:lineRule="auto"/>
+              <w:jc w:val="both"/>
+            </w:pPr>
+            <w:r>
+              <w:rPr>
+                <w:rFonts w:eastAsia="Times New Roman"/>
+                <w:color w:val="000000"/>
+                <w:sz w:val="23"/>
+              </w:rPr>
+              <w:t>Căn cứ kết quả thẩm định, cán bộ chuyên môn lập dự thảo kết quả giải quyết thủ tục hành chính. Nếu hồ sơ không đáp ứng điều kiện chuyên môn, cán bộ lập dự thảo văn bản không giải quyết và nêu rõ căn cứ, lý do.</w:t>
+            </w:r>
+          </w:p>
+        </w:tc>
+      </w:tr>
+      <w:tr>
+        <w:trPr>
+          <w:cantSplit/>
+          <w:jc w:val="center"/>
+        </w:trPr>
+        <w:tc>
+          <w:tcPr>
+            <w:tcW w:w="708" w:type="dxa"/>
+            <w:tcMar>
+              <w:top w:w="95" w:type="dxa"/>
+              <w:left w:w="95" w:type="dxa"/>
+              <w:bottom w:w="95" w:type="dxa"/>
+              <w:right w:w="95" w:type="dxa"/>
+            </w:tcMar>
+          </w:tcPr>
+          <w:p>
+            <w:pPr>
+              <w:jc w:val="center"/>
+            </w:pPr>
+            <w:r>
+              <w:rPr>
+                <w:rFonts w:eastAsia="Times New Roman"/>
+                <w:color w:val="000000"/>
+                <w:sz w:val="23"/>
+              </w:rPr>
+              <w:t>19</w:t>
+            </w:r>
+          </w:p>
+        </w:tc>
+        <w:tc>
+          <w:tcPr>
+            <w:tcW w:w="3247" w:type="dxa"/>
+            <w:tcMar>
+              <w:top w:w="95" w:type="dxa"/>
+              <w:left w:w="95" w:type="dxa"/>
+              <w:bottom w:w="95" w:type="dxa"/>
+              <w:right w:w="95" w:type="dxa"/>
+            </w:tcMar>
+          </w:tcPr>
+          <w:p>
+            <w:pPr>
+              <w:spacing w:line="264" w:lineRule="auto"/>
+            </w:pPr>
+            <w:r>
+              <w:rPr>
+                <w:rFonts w:eastAsia="Times New Roman"/>
+                <w:color w:val="000000"/>
+                <w:sz w:val="23"/>
+              </w:rPr>
+              <w:t>B19: Trình lãnh đạo phê duyệt</w:t>
+            </w:r>
+          </w:p>
+        </w:tc>
+        <w:tc>
+          <w:tcPr>
+            <w:tcW w:w="2110" w:type="dxa"/>
+            <w:tcMar>
+              <w:top w:w="95" w:type="dxa"/>
+              <w:left w:w="95" w:type="dxa"/>
+              <w:bottom w:w="95" w:type="dxa"/>
+              <w:right w:w="95" w:type="dxa"/>
+            </w:tcMar>
+          </w:tcPr>
+          <w:p>
+            <w:pPr>
+              <w:spacing w:line="264" w:lineRule="auto"/>
+            </w:pPr>
+            <w:r>
+              <w:rPr>
+                <w:rFonts w:eastAsia="Times New Roman"/>
+                <w:color w:val="000000"/>
+                <w:sz w:val="23"/>
+              </w:rPr>
+              <w:t>Cán bộ chuyên môn; Lãnh đạo/Người có thẩm quyền</w:t>
+            </w:r>
+          </w:p>
+        </w:tc>
+        <w:tc>
+          <w:tcPr>
+            <w:tcW w:w="4664" w:type="dxa"/>
+            <w:tcMar>
+              <w:top w:w="95" w:type="dxa"/>
+              <w:left w:w="95" w:type="dxa"/>
+              <w:bottom w:w="95" w:type="dxa"/>
+              <w:right w:w="95" w:type="dxa"/>
+            </w:tcMar>
+          </w:tcPr>
+          <w:p>
+            <w:pPr>
+              <w:spacing w:line="269" w:lineRule="auto"/>
+              <w:jc w:val="both"/>
+            </w:pPr>
+            <w:r>
+              <w:rPr>
+                <w:rFonts w:eastAsia="Times New Roman"/>
+                <w:color w:val="000000"/>
+                <w:sz w:val="23"/>
+              </w:rPr>
+              <w:t>Dự thảo kết quả được trình lãnh đạo hoặc người có thẩm quyền xem xét. Nếu nội dung chưa đạt yêu cầu, hồ sơ được trả lại đơn vị chuyên môn để chỉnh sửa; nếu đạt yêu cầu, lãnh đạo thực hiện phê duyệt.</w:t>
+            </w:r>
+          </w:p>
+        </w:tc>
+      </w:tr>
+      <w:tr>
+        <w:trPr>
+          <w:cantSplit/>
+          <w:jc w:val="center"/>
+        </w:trPr>
+        <w:tc>
+          <w:tcPr>
+            <w:tcW w:w="708" w:type="dxa"/>
+            <w:tcMar>
+              <w:top w:w="95" w:type="dxa"/>
+              <w:left w:w="95" w:type="dxa"/>
+              <w:bottom w:w="95" w:type="dxa"/>
+              <w:right w:w="95" w:type="dxa"/>
+            </w:tcMar>
+          </w:tcPr>
+          <w:p>
+            <w:pPr>
+              <w:jc w:val="center"/>
+            </w:pPr>
+            <w:r>
+              <w:rPr>
+                <w:rFonts w:eastAsia="Times New Roman"/>
+                <w:color w:val="000000"/>
+                <w:sz w:val="23"/>
+              </w:rPr>
+              <w:t>20</w:t>
+            </w:r>
+          </w:p>
+        </w:tc>
+        <w:tc>
+          <w:tcPr>
+            <w:tcW w:w="3247" w:type="dxa"/>
+            <w:tcMar>
+              <w:top w:w="95" w:type="dxa"/>
+              <w:left w:w="95" w:type="dxa"/>
+              <w:bottom w:w="95" w:type="dxa"/>
+              <w:right w:w="95" w:type="dxa"/>
+            </w:tcMar>
+          </w:tcPr>
+          <w:p>
+            <w:pPr>
+              <w:spacing w:line="264" w:lineRule="auto"/>
+            </w:pPr>
+            <w:r>
+              <w:rPr>
+                <w:rFonts w:eastAsia="Times New Roman"/>
+                <w:color w:val="000000"/>
+                <w:sz w:val="23"/>
+              </w:rPr>
+              <w:t>B20: Ký số, ban hành và chuyển chờ trả kết quả</w:t>
+            </w:r>
+          </w:p>
+        </w:tc>
+        <w:tc>
+          <w:tcPr>
+            <w:tcW w:w="2110" w:type="dxa"/>
+            <w:tcMar>
+              <w:top w:w="95" w:type="dxa"/>
+              <w:left w:w="95" w:type="dxa"/>
+              <w:bottom w:w="95" w:type="dxa"/>
+              <w:right w:w="95" w:type="dxa"/>
+            </w:tcMar>
+          </w:tcPr>
+          <w:p>
+            <w:pPr>
+              <w:spacing w:line="264" w:lineRule="auto"/>
+            </w:pPr>
+            <w:r>
+              <w:rPr>
+                <w:rFonts w:eastAsia="Times New Roman"/>
+                <w:color w:val="000000"/>
+                <w:sz w:val="23"/>
+              </w:rPr>
+              <w:t>Lãnh đạo/Người có thẩm quyền; Hệ thống</w:t>
+            </w:r>
+          </w:p>
+        </w:tc>
+        <w:tc>
+          <w:tcPr>
+            <w:tcW w:w="4664" w:type="dxa"/>
+            <w:tcMar>
+              <w:top w:w="95" w:type="dxa"/>
+              <w:left w:w="95" w:type="dxa"/>
+              <w:bottom w:w="95" w:type="dxa"/>
+              <w:right w:w="95" w:type="dxa"/>
+            </w:tcMar>
+          </w:tcPr>
+          <w:p>
+            <w:pPr>
+              <w:spacing w:line="269" w:lineRule="auto"/>
+              <w:jc w:val="both"/>
+            </w:pPr>
+            <w:r>
+              <w:rPr>
+                <w:rFonts w:eastAsia="Times New Roman"/>
+                <w:color w:val="000000"/>
+                <w:sz w:val="23"/>
+              </w:rPr>
+              <w:t>Kết quả được ký số, ban hành và lưu trên hệ thống. Hệ thống cập nhật hồ sơ sang trạng thái chờ trả kết quả để Bộ phận Một cửa tiếp tục trả kết quả cho cá nhân hoặc tổ chức theo hình thức đã đăng ký.</w:t>
+            </w:r>
+          </w:p>
+        </w:tc>
+      </w:tr>
+    </w:tbl>
+    <w:p/>
+    <w:p>
+      <w:pPr>
+        <w:pStyle w:val="Heading4"/>
+      </w:pPr>
+      <w:r>
+        <w:t>2.3.2 Mô hình hóa quy trình kiểm tra, thẩm định và xử lý hồ sơ</w:t>
+      </w:r>
+    </w:p>
+    <w:p>
+      <w:pPr>
         <w:pStyle w:val="Heading3"/>
       </w:pPr>
       <w:bookmarkStart w:id="27" w:name="_Toc236264131"/>
@@ -6593,7 +8911,6 @@
       </w:r>
       <w:bookmarkEnd w:id="27"/>
     </w:p>
-    <w:p/>
     <w:p/>
     <w:p/>
     <w:p>
@@ -6827,7 +9144,7 @@
         </w:numPr>
         <w:jc w:val="both"/>
       </w:pPr>
-      <w:hyperlink r:id="rId13" w:anchor="ID0EBBF=Getting_started" w:history="1">
+      <w:hyperlink r:id="rId14" w:anchor="ID0EBBF=Getting_started" w:history="1">
         <w:r>
           <w:rPr>
             <w:rStyle w:val="Hyperlink"/>
@@ -6901,8 +9218,8 @@
     <w:p/>
     <w:p/>
     <w:sectPr>
-      <w:headerReference w:type="default" r:id="rId14"/>
-      <w:footerReference w:type="default" r:id="rId15"/>
+      <w:headerReference w:type="default" r:id="rId15"/>
+      <w:footerReference w:type="default" r:id="rId16"/>
       <w:pgSz w:w="11906" w:h="16838" w:code="9"/>
       <w:pgMar w:top="1440" w:right="1440" w:bottom="1440" w:left="1440" w:header="720" w:footer="720" w:gutter="0"/>
       <w:pgBorders w:display="firstPage" w:offsetFrom="page">
@@ -6921,7 +9238,7 @@
 </file>
 
 <file path=word/endnotes.xml><?xml version="1.0" encoding="utf-8"?>
-<w:endnotes xmlns:wpc="http://schemas.microsoft.com/office/word/2010/wordprocessingCanvas" xmlns:cx="http://schemas.microsoft.com/office/drawing/2014/chartex" xmlns:cx1="http://schemas.microsoft.com/office/drawing/2015/9/8/chartex" xmlns:cx2="http://schemas.microsoft.com/office/drawing/2015/10/21/chartex" xmlns:cx3="http://schemas.microsoft.com/office/drawing/2016/5/9/chartex" xmlns:cx4="http://schemas.microsoft.com/office/drawing/2016/5/10/chartex" xmlns:cx5="http://schemas.microsoft.com/office/drawing/2016/5/11/chartex" xmlns:cx6="http://schemas.microsoft.com/office/drawing/2016/5/12/chartex" xmlns:cx7="http://schemas.microsoft.com/office/drawing/2016/5/13/chartex" xmlns:cx8="http://schemas.microsoft.com/office/drawing/2016/5/14/chartex" xmlns:mc="http://schemas.openxmlformats.org/markup-compatibility/2006" xmlns:aink="http://schemas.microsoft.com/office/drawing/2016/ink" xmlns:am3d="http://schemas.microsoft.com/office/drawing/2017/model3d" xmlns:o="urn:schemas-microsoft-com:office:office" xmlns:oel="http://schemas.microsoft.com/office/2019/extlst" xmlns:r="http://schemas.openxmlformats.org/officeDocument/2006/relationships" xmlns:m="http://schemas.openxmlformats.org/officeDocument/2006/math" xmlns:v="urn:schemas-microsoft-com:vml" xmlns:wp14="http://schemas.microsoft.com/office/word/2010/wordprocessingDrawing" xmlns:wp="http://schemas.openxmlformats.org/drawingml/2006/wordprocessingDrawing" xmlns:w10="urn:schemas-microsoft-com:office:word" xmlns:w="http://schemas.openxmlformats.org/wordprocessingml/2006/main" xmlns:w14="http://schemas.microsoft.com/office/word/2010/wordml" xmlns:w15="http://schemas.microsoft.com/office/word/2012/wordml" xmlns:w16cex="http://schemas.microsoft.com/office/word/2018/wordml/cex" xmlns:w16cid="http://schemas.microsoft.com/office/word/2016/wordml/cid" xmlns:w16="http://schemas.microsoft.com/office/word/2018/wordml" xmlns:w16du="http://schemas.microsoft.com/office/word/2023/wordml/word16du" xmlns:w16sdtdh="http://schemas.microsoft.com/office/word/2020/wordml/sdtdatahash" xmlns:w16sdtfl="http://schemas.microsoft.com/office/word/2024/wordml/sdtformatlock" xmlns:w16se="http://schemas.microsoft.com/office/word/2015/wordml/symex" xmlns:wpg="http://schemas.microsoft.com/office/word/2010/wordprocessingGroup" xmlns:wpi="http://schemas.microsoft.com/office/word/2010/wordprocessingInk" xmlns:wne="http://schemas.microsoft.com/office/word/2006/wordml" xmlns:wps="http://schemas.microsoft.com/office/word/2010/wordprocessingShape" mc:Ignorable="w14 w15 w16se w16cid w16 w16cex w16sdtdh w16sdtfl w16du wp14">
+<w:endnotes xmlns:wpc="http://schemas.microsoft.com/office/word/2010/wordprocessingCanvas" xmlns:cx="http://schemas.microsoft.com/office/drawing/2014/chartex" xmlns:cx1="http://schemas.microsoft.com/office/drawing/2015/9/8/chartex" xmlns:cx2="http://schemas.microsoft.com/office/drawing/2015/10/21/chartex" xmlns:cx3="http://schemas.microsoft.com/office/drawing/2016/5/9/chartex" xmlns:cx4="http://schemas.microsoft.com/office/drawing/2016/5/10/chartex" xmlns:cx5="http://schemas.microsoft.com/office/drawing/2016/5/11/chartex" xmlns:cx6="http://schemas.microsoft.com/office/drawing/2016/5/12/chartex" xmlns:cx7="http://schemas.microsoft.com/office/drawing/2016/5/13/chartex" xmlns:cx8="http://schemas.microsoft.com/office/drawing/2016/5/14/chartex" xmlns:mc="http://schemas.openxmlformats.org/markup-compatibility/2006" xmlns:aink="http://schemas.microsoft.com/office/drawing/2016/ink" xmlns:am3d="http://schemas.microsoft.com/office/drawing/2017/model3d" xmlns:o="urn:schemas-microsoft-com:office:office" xmlns:oel="http://schemas.microsoft.com/office/2019/extlst" xmlns:r="http://schemas.openxmlformats.org/officeDocument/2006/relationships" xmlns:m="http://schemas.openxmlformats.org/officeDocument/2006/math" xmlns:v="urn:schemas-microsoft-com:vml" xmlns:wp14="http://schemas.microsoft.com/office/word/2010/wordprocessingDrawing" xmlns:wp="http://schemas.openxmlformats.org/drawingml/2006/wordprocessingDrawing" xmlns:w10="urn:schemas-microsoft-com:office:word" xmlns:w="http://schemas.openxmlformats.org/wordprocessingml/2006/main" xmlns:w14="http://schemas.microsoft.com/office/word/2010/wordml" xmlns:w15="http://schemas.microsoft.com/office/word/2012/wordml" xmlns:w16cei="http://schemas.microsoft.com/office/word/2026/wordml/cei" xmlns:w16cex="http://schemas.microsoft.com/office/word/2018/wordml/cex" xmlns:w16cid="http://schemas.microsoft.com/office/word/2016/wordml/cid" xmlns:w16="http://schemas.microsoft.com/office/word/2018/wordml" xmlns:w16du="http://schemas.microsoft.com/office/word/2023/wordml/word16du" xmlns:w16sdtdh="http://schemas.microsoft.com/office/word/2020/wordml/sdtdatahash" xmlns:w16sdtfl="http://schemas.microsoft.com/office/word/2024/wordml/sdtformatlock" xmlns:w16se="http://schemas.microsoft.com/office/word/2015/wordml/symex" xmlns:wpg="http://schemas.microsoft.com/office/word/2010/wordprocessingGroup" xmlns:wpi="http://schemas.microsoft.com/office/word/2010/wordprocessingInk" xmlns:wne="http://schemas.microsoft.com/office/word/2006/wordml" xmlns:wps="http://schemas.microsoft.com/office/word/2010/wordprocessingShape" mc:Ignorable="w14 w15 w16se w16cid w16 w16cex w16sdtdh w16sdtfl w16du wp14">
   <w:endnote w:type="separator" w:id="-1">
     <w:p>
       <w:pPr>
@@ -6946,7 +9263,7 @@
 </file>
 
 <file path=word/footer1.xml><?xml version="1.0" encoding="utf-8"?>
-<w:ftr xmlns:wpc="http://schemas.microsoft.com/office/word/2010/wordprocessingCanvas" xmlns:cx="http://schemas.microsoft.com/office/drawing/2014/chartex" xmlns:cx1="http://schemas.microsoft.com/office/drawing/2015/9/8/chartex" xmlns:cx2="http://schemas.microsoft.com/office/drawing/2015/10/21/chartex" xmlns:cx3="http://schemas.microsoft.com/office/drawing/2016/5/9/chartex" xmlns:cx4="http://schemas.microsoft.com/office/drawing/2016/5/10/chartex" xmlns:cx5="http://schemas.microsoft.com/office/drawing/2016/5/11/chartex" xmlns:cx6="http://schemas.microsoft.com/office/drawing/2016/5/12/chartex" xmlns:cx7="http://schemas.microsoft.com/office/drawing/2016/5/13/chartex" xmlns:cx8="http://schemas.microsoft.com/office/drawing/2016/5/14/chartex" xmlns:mc="http://schemas.openxmlformats.org/markup-compatibility/2006" xmlns:aink="http://schemas.microsoft.com/office/drawing/2016/ink" xmlns:am3d="http://schemas.microsoft.com/office/drawing/2017/model3d" xmlns:o="urn:schemas-microsoft-com:office:office" xmlns:oel="http://schemas.microsoft.com/office/2019/extlst" xmlns:r="http://schemas.openxmlformats.org/officeDocument/2006/relationships" xmlns:m="http://schemas.openxmlformats.org/officeDocument/2006/math" xmlns:v="urn:schemas-microsoft-com:vml" xmlns:wp14="http://schemas.microsoft.com/office/word/2010/wordprocessingDrawing" xmlns:wp="http://schemas.openxmlformats.org/drawingml/2006/wordprocessingDrawing" xmlns:w10="urn:schemas-microsoft-com:office:word" xmlns:w="http://schemas.openxmlformats.org/wordprocessingml/2006/main" xmlns:w14="http://schemas.microsoft.com/office/word/2010/wordml" xmlns:w15="http://schemas.microsoft.com/office/word/2012/wordml" xmlns:w16cex="http://schemas.microsoft.com/office/word/2018/wordml/cex" xmlns:w16cid="http://schemas.microsoft.com/office/word/2016/wordml/cid" xmlns:w16="http://schemas.microsoft.com/office/word/2018/wordml" xmlns:w16du="http://schemas.microsoft.com/office/word/2023/wordml/word16du" xmlns:w16sdtdh="http://schemas.microsoft.com/office/word/2020/wordml/sdtdatahash" xmlns:w16sdtfl="http://schemas.microsoft.com/office/word/2024/wordml/sdtformatlock" xmlns:w16se="http://schemas.microsoft.com/office/word/2015/wordml/symex" xmlns:wpg="http://schemas.microsoft.com/office/word/2010/wordprocessingGroup" xmlns:wpi="http://schemas.microsoft.com/office/word/2010/wordprocessingInk" xmlns:wne="http://schemas.microsoft.com/office/word/2006/wordml" xmlns:wps="http://schemas.microsoft.com/office/word/2010/wordprocessingShape" mc:Ignorable="w14 w15 w16se w16cid w16 w16cex w16sdtdh w16sdtfl w16du wp14">
+<w:ftr xmlns:wpc="http://schemas.microsoft.com/office/word/2010/wordprocessingCanvas" xmlns:cx="http://schemas.microsoft.com/office/drawing/2014/chartex" xmlns:cx1="http://schemas.microsoft.com/office/drawing/2015/9/8/chartex" xmlns:cx2="http://schemas.microsoft.com/office/drawing/2015/10/21/chartex" xmlns:cx3="http://schemas.microsoft.com/office/drawing/2016/5/9/chartex" xmlns:cx4="http://schemas.microsoft.com/office/drawing/2016/5/10/chartex" xmlns:cx5="http://schemas.microsoft.com/office/drawing/2016/5/11/chartex" xmlns:cx6="http://schemas.microsoft.com/office/drawing/2016/5/12/chartex" xmlns:cx7="http://schemas.microsoft.com/office/drawing/2016/5/13/chartex" xmlns:cx8="http://schemas.microsoft.com/office/drawing/2016/5/14/chartex" xmlns:mc="http://schemas.openxmlformats.org/markup-compatibility/2006" xmlns:aink="http://schemas.microsoft.com/office/drawing/2016/ink" xmlns:am3d="http://schemas.microsoft.com/office/drawing/2017/model3d" xmlns:o="urn:schemas-microsoft-com:office:office" xmlns:oel="http://schemas.microsoft.com/office/2019/extlst" xmlns:r="http://schemas.openxmlformats.org/officeDocument/2006/relationships" xmlns:m="http://schemas.openxmlformats.org/officeDocument/2006/math" xmlns:v="urn:schemas-microsoft-com:vml" xmlns:wp14="http://schemas.microsoft.com/office/word/2010/wordprocessingDrawing" xmlns:wp="http://schemas.openxmlformats.org/drawingml/2006/wordprocessingDrawing" xmlns:w10="urn:schemas-microsoft-com:office:word" xmlns:w="http://schemas.openxmlformats.org/wordprocessingml/2006/main" xmlns:w14="http://schemas.microsoft.com/office/word/2010/wordml" xmlns:w15="http://schemas.microsoft.com/office/word/2012/wordml" xmlns:w16cei="http://schemas.microsoft.com/office/word/2026/wordml/cei" xmlns:w16cex="http://schemas.microsoft.com/office/word/2018/wordml/cex" xmlns:w16cid="http://schemas.microsoft.com/office/word/2016/wordml/cid" xmlns:w16="http://schemas.microsoft.com/office/word/2018/wordml" xmlns:w16du="http://schemas.microsoft.com/office/word/2023/wordml/word16du" xmlns:w16sdtdh="http://schemas.microsoft.com/office/word/2020/wordml/sdtdatahash" xmlns:w16sdtfl="http://schemas.microsoft.com/office/word/2024/wordml/sdtformatlock" xmlns:w16se="http://schemas.microsoft.com/office/word/2015/wordml/symex" xmlns:wpg="http://schemas.microsoft.com/office/word/2010/wordprocessingGroup" xmlns:wpi="http://schemas.microsoft.com/office/word/2010/wordprocessingInk" xmlns:wne="http://schemas.microsoft.com/office/word/2006/wordml" xmlns:wps="http://schemas.microsoft.com/office/word/2010/wordprocessingShape" mc:Ignorable="w14 w15 w16se w16cid w16 w16cex w16sdtdh w16sdtfl w16du wp14">
   <w:sdt>
     <w:sdtPr>
       <w:id w:val="365795399"/>
@@ -7014,7 +9331,7 @@
 </file>
 
 <file path=word/footnotes.xml><?xml version="1.0" encoding="utf-8"?>
-<w:footnotes xmlns:wpc="http://schemas.microsoft.com/office/word/2010/wordprocessingCanvas" xmlns:cx="http://schemas.microsoft.com/office/drawing/2014/chartex" xmlns:cx1="http://schemas.microsoft.com/office/drawing/2015/9/8/chartex" xmlns:cx2="http://schemas.microsoft.com/office/drawing/2015/10/21/chartex" xmlns:cx3="http://schemas.microsoft.com/office/drawing/2016/5/9/chartex" xmlns:cx4="http://schemas.microsoft.com/office/drawing/2016/5/10/chartex" xmlns:cx5="http://schemas.microsoft.com/office/drawing/2016/5/11/chartex" xmlns:cx6="http://schemas.microsoft.com/office/drawing/2016/5/12/chartex" xmlns:cx7="http://schemas.microsoft.com/office/drawing/2016/5/13/chartex" xmlns:cx8="http://schemas.microsoft.com/office/drawing/2016/5/14/chartex" xmlns:mc="http://schemas.openxmlformats.org/markup-compatibility/2006" xmlns:aink="http://schemas.microsoft.com/office/drawing/2016/ink" xmlns:am3d="http://schemas.microsoft.com/office/drawing/2017/model3d" xmlns:o="urn:schemas-microsoft-com:office:office" xmlns:oel="http://schemas.microsoft.com/office/2019/extlst" xmlns:r="http://schemas.openxmlformats.org/officeDocument/2006/relationships" xmlns:m="http://schemas.openxmlformats.org/officeDocument/2006/math" xmlns:v="urn:schemas-microsoft-com:vml" xmlns:wp14="http://schemas.microsoft.com/office/word/2010/wordprocessingDrawing" xmlns:wp="http://schemas.openxmlformats.org/drawingml/2006/wordprocessingDrawing" xmlns:w10="urn:schemas-microsoft-com:office:word" xmlns:w="http://schemas.openxmlformats.org/wordprocessingml/2006/main" xmlns:w14="http://schemas.microsoft.com/office/word/2010/wordml" xmlns:w15="http://schemas.microsoft.com/office/word/2012/wordml" xmlns:w16cex="http://schemas.microsoft.com/office/word/2018/wordml/cex" xmlns:w16cid="http://schemas.microsoft.com/office/word/2016/wordml/cid" xmlns:w16="http://schemas.microsoft.com/office/word/2018/wordml" xmlns:w16du="http://schemas.microsoft.com/office/word/2023/wordml/word16du" xmlns:w16sdtdh="http://schemas.microsoft.com/office/word/2020/wordml/sdtdatahash" xmlns:w16sdtfl="http://schemas.microsoft.com/office/word/2024/wordml/sdtformatlock" xmlns:w16se="http://schemas.microsoft.com/office/word/2015/wordml/symex" xmlns:wpg="http://schemas.microsoft.com/office/word/2010/wordprocessingGroup" xmlns:wpi="http://schemas.microsoft.com/office/word/2010/wordprocessingInk" xmlns:wne="http://schemas.microsoft.com/office/word/2006/wordml" xmlns:wps="http://schemas.microsoft.com/office/word/2010/wordprocessingShape" mc:Ignorable="w14 w15 w16se w16cid w16 w16cex w16sdtdh w16sdtfl w16du wp14">
+<w:footnotes xmlns:wpc="http://schemas.microsoft.com/office/word/2010/wordprocessingCanvas" xmlns:cx="http://schemas.microsoft.com/office/drawing/2014/chartex" xmlns:cx1="http://schemas.microsoft.com/office/drawing/2015/9/8/chartex" xmlns:cx2="http://schemas.microsoft.com/office/drawing/2015/10/21/chartex" xmlns:cx3="http://schemas.microsoft.com/office/drawing/2016/5/9/chartex" xmlns:cx4="http://schemas.microsoft.com/office/drawing/2016/5/10/chartex" xmlns:cx5="http://schemas.microsoft.com/office/drawing/2016/5/11/chartex" xmlns:cx6="http://schemas.microsoft.com/office/drawing/2016/5/12/chartex" xmlns:cx7="http://schemas.microsoft.com/office/drawing/2016/5/13/chartex" xmlns:cx8="http://schemas.microsoft.com/office/drawing/2016/5/14/chartex" xmlns:mc="http://schemas.openxmlformats.org/markup-compatibility/2006" xmlns:aink="http://schemas.microsoft.com/office/drawing/2016/ink" xmlns:am3d="http://schemas.microsoft.com/office/drawing/2017/model3d" xmlns:o="urn:schemas-microsoft-com:office:office" xmlns:oel="http://schemas.microsoft.com/office/2019/extlst" xmlns:r="http://schemas.openxmlformats.org/officeDocument/2006/relationships" xmlns:m="http://schemas.openxmlformats.org/officeDocument/2006/math" xmlns:v="urn:schemas-microsoft-com:vml" xmlns:wp14="http://schemas.microsoft.com/office/word/2010/wordprocessingDrawing" xmlns:wp="http://schemas.openxmlformats.org/drawingml/2006/wordprocessingDrawing" xmlns:w10="urn:schemas-microsoft-com:office:word" xmlns:w="http://schemas.openxmlformats.org/wordprocessingml/2006/main" xmlns:w14="http://schemas.microsoft.com/office/word/2010/wordml" xmlns:w15="http://schemas.microsoft.com/office/word/2012/wordml" xmlns:w16cei="http://schemas.microsoft.com/office/word/2026/wordml/cei" xmlns:w16cex="http://schemas.microsoft.com/office/word/2018/wordml/cex" xmlns:w16cid="http://schemas.microsoft.com/office/word/2016/wordml/cid" xmlns:w16="http://schemas.microsoft.com/office/word/2018/wordml" xmlns:w16du="http://schemas.microsoft.com/office/word/2023/wordml/word16du" xmlns:w16sdtdh="http://schemas.microsoft.com/office/word/2020/wordml/sdtdatahash" xmlns:w16sdtfl="http://schemas.microsoft.com/office/word/2024/wordml/sdtformatlock" xmlns:w16se="http://schemas.microsoft.com/office/word/2015/wordml/symex" xmlns:wpg="http://schemas.microsoft.com/office/word/2010/wordprocessingGroup" xmlns:wpi="http://schemas.microsoft.com/office/word/2010/wordprocessingInk" xmlns:wne="http://schemas.microsoft.com/office/word/2006/wordml" xmlns:wps="http://schemas.microsoft.com/office/word/2010/wordprocessingShape" mc:Ignorable="w14 w15 w16se w16cid w16 w16cex w16sdtdh w16sdtfl w16du wp14">
   <w:footnote w:type="separator" w:id="-1">
     <w:p>
       <w:pPr>
@@ -7039,7 +9356,7 @@
 </file>
 
 <file path=word/header1.xml><?xml version="1.0" encoding="utf-8"?>
-<w:hdr xmlns:wpc="http://schemas.microsoft.com/office/word/2010/wordprocessingCanvas" xmlns:cx="http://schemas.microsoft.com/office/drawing/2014/chartex" xmlns:cx1="http://schemas.microsoft.com/office/drawing/2015/9/8/chartex" xmlns:cx2="http://schemas.microsoft.com/office/drawing/2015/10/21/chartex" xmlns:cx3="http://schemas.microsoft.com/office/drawing/2016/5/9/chartex" xmlns:cx4="http://schemas.microsoft.com/office/drawing/2016/5/10/chartex" xmlns:cx5="http://schemas.microsoft.com/office/drawing/2016/5/11/chartex" xmlns:cx6="http://schemas.microsoft.com/office/drawing/2016/5/12/chartex" xmlns:cx7="http://schemas.microsoft.com/office/drawing/2016/5/13/chartex" xmlns:cx8="http://schemas.microsoft.com/office/drawing/2016/5/14/chartex" xmlns:mc="http://schemas.openxmlformats.org/markup-compatibility/2006" xmlns:aink="http://schemas.microsoft.com/office/drawing/2016/ink" xmlns:am3d="http://schemas.microsoft.com/office/drawing/2017/model3d" xmlns:o="urn:schemas-microsoft-com:office:office" xmlns:oel="http://schemas.microsoft.com/office/2019/extlst" xmlns:r="http://schemas.openxmlformats.org/officeDocument/2006/relationships" xmlns:m="http://schemas.openxmlformats.org/officeDocument/2006/math" xmlns:v="urn:schemas-microsoft-com:vml" xmlns:wp14="http://schemas.microsoft.com/office/word/2010/wordprocessingDrawing" xmlns:wp="http://schemas.openxmlformats.org/drawingml/2006/wordprocessingDrawing" xmlns:w10="urn:schemas-microsoft-com:office:word" xmlns:w="http://schemas.openxmlformats.org/wordprocessingml/2006/main" xmlns:w14="http://schemas.microsoft.com/office/word/2010/wordml" xmlns:w15="http://schemas.microsoft.com/office/word/2012/wordml" xmlns:w16cex="http://schemas.microsoft.com/office/word/2018/wordml/cex" xmlns:w16cid="http://schemas.microsoft.com/office/word/2016/wordml/cid" xmlns:w16="http://schemas.microsoft.com/office/word/2018/wordml" xmlns:w16du="http://schemas.microsoft.com/office/word/2023/wordml/word16du" xmlns:w16sdtdh="http://schemas.microsoft.com/office/word/2020/wordml/sdtdatahash" xmlns:w16sdtfl="http://schemas.microsoft.com/office/word/2024/wordml/sdtformatlock" xmlns:w16se="http://schemas.microsoft.com/office/word/2015/wordml/symex" xmlns:wpg="http://schemas.microsoft.com/office/word/2010/wordprocessingGroup" xmlns:wpi="http://schemas.microsoft.com/office/word/2010/wordprocessingInk" xmlns:wne="http://schemas.microsoft.com/office/word/2006/wordml" xmlns:wps="http://schemas.microsoft.com/office/word/2010/wordprocessingShape" mc:Ignorable="w14 w15 w16se w16cid w16 w16cex w16sdtdh w16sdtfl w16du wp14">
+<w:hdr xmlns:wpc="http://schemas.microsoft.com/office/word/2010/wordprocessingCanvas" xmlns:cx="http://schemas.microsoft.com/office/drawing/2014/chartex" xmlns:cx1="http://schemas.microsoft.com/office/drawing/2015/9/8/chartex" xmlns:cx2="http://schemas.microsoft.com/office/drawing/2015/10/21/chartex" xmlns:cx3="http://schemas.microsoft.com/office/drawing/2016/5/9/chartex" xmlns:cx4="http://schemas.microsoft.com/office/drawing/2016/5/10/chartex" xmlns:cx5="http://schemas.microsoft.com/office/drawing/2016/5/11/chartex" xmlns:cx6="http://schemas.microsoft.com/office/drawing/2016/5/12/chartex" xmlns:cx7="http://schemas.microsoft.com/office/drawing/2016/5/13/chartex" xmlns:cx8="http://schemas.microsoft.com/office/drawing/2016/5/14/chartex" xmlns:mc="http://schemas.openxmlformats.org/markup-compatibility/2006" xmlns:aink="http://schemas.microsoft.com/office/drawing/2016/ink" xmlns:am3d="http://schemas.microsoft.com/office/drawing/2017/model3d" xmlns:o="urn:schemas-microsoft-com:office:office" xmlns:oel="http://schemas.microsoft.com/office/2019/extlst" xmlns:r="http://schemas.openxmlformats.org/officeDocument/2006/relationships" xmlns:m="http://schemas.openxmlformats.org/officeDocument/2006/math" xmlns:v="urn:schemas-microsoft-com:vml" xmlns:wp14="http://schemas.microsoft.com/office/word/2010/wordprocessingDrawing" xmlns:wp="http://schemas.openxmlformats.org/drawingml/2006/wordprocessingDrawing" xmlns:w10="urn:schemas-microsoft-com:office:word" xmlns:w="http://schemas.openxmlformats.org/wordprocessingml/2006/main" xmlns:w14="http://schemas.microsoft.com/office/word/2010/wordml" xmlns:w15="http://schemas.microsoft.com/office/word/2012/wordml" xmlns:w16cei="http://schemas.microsoft.com/office/word/2026/wordml/cei" xmlns:w16cex="http://schemas.microsoft.com/office/word/2018/wordml/cex" xmlns:w16cid="http://schemas.microsoft.com/office/word/2016/wordml/cid" xmlns:w16="http://schemas.microsoft.com/office/word/2018/wordml" xmlns:w16du="http://schemas.microsoft.com/office/word/2023/wordml/word16du" xmlns:w16sdtdh="http://schemas.microsoft.com/office/word/2020/wordml/sdtdatahash" xmlns:w16sdtfl="http://schemas.microsoft.com/office/word/2024/wordml/sdtformatlock" xmlns:w16se="http://schemas.microsoft.com/office/word/2015/wordml/symex" xmlns:wpg="http://schemas.microsoft.com/office/word/2010/wordprocessingGroup" xmlns:wpi="http://schemas.microsoft.com/office/word/2010/wordprocessingInk" xmlns:wne="http://schemas.microsoft.com/office/word/2006/wordml" xmlns:wps="http://schemas.microsoft.com/office/word/2010/wordprocessingShape" mc:Ignorable="w14 w15 w16se w16cid w16 w16cex w16sdtdh w16sdtfl w16du wp14">
   <w:p>
     <w:pPr>
       <w:pStyle w:val="Header"/>
@@ -7088,8 +9405,157 @@
 </file>
 
 <file path=word/numbering.xml><?xml version="1.0" encoding="utf-8"?>
-<w:numbering xmlns:wpc="http://schemas.microsoft.com/office/word/2010/wordprocessingCanvas" xmlns:cx="http://schemas.microsoft.com/office/drawing/2014/chartex" xmlns:cx1="http://schemas.microsoft.com/office/drawing/2015/9/8/chartex" xmlns:cx2="http://schemas.microsoft.com/office/drawing/2015/10/21/chartex" xmlns:cx3="http://schemas.microsoft.com/office/drawing/2016/5/9/chartex" xmlns:cx4="http://schemas.microsoft.com/office/drawing/2016/5/10/chartex" xmlns:cx5="http://schemas.microsoft.com/office/drawing/2016/5/11/chartex" xmlns:cx6="http://schemas.microsoft.com/office/drawing/2016/5/12/chartex" xmlns:cx7="http://schemas.microsoft.com/office/drawing/2016/5/13/chartex" xmlns:cx8="http://schemas.microsoft.com/office/drawing/2016/5/14/chartex" xmlns:mc="http://schemas.openxmlformats.org/markup-compatibility/2006" xmlns:aink="http://schemas.microsoft.com/office/drawing/2016/ink" xmlns:am3d="http://schemas.microsoft.com/office/drawing/2017/model3d" xmlns:o="urn:schemas-microsoft-com:office:office" xmlns:oel="http://schemas.microsoft.com/office/2019/extlst" xmlns:r="http://schemas.openxmlformats.org/officeDocument/2006/relationships" xmlns:m="http://schemas.openxmlformats.org/officeDocument/2006/math" xmlns:v="urn:schemas-microsoft-com:vml" xmlns:wp14="http://schemas.microsoft.com/office/word/2010/wordprocessingDrawing" xmlns:wp="http://schemas.openxmlformats.org/drawingml/2006/wordprocessingDrawing" xmlns:w10="urn:schemas-microsoft-com:office:word" xmlns:w="http://schemas.openxmlformats.org/wordprocessingml/2006/main" xmlns:w14="http://schemas.microsoft.com/office/word/2010/wordml" xmlns:w15="http://schemas.microsoft.com/office/word/2012/wordml" xmlns:w16cex="http://schemas.microsoft.com/office/word/2018/wordml/cex" xmlns:w16cid="http://schemas.microsoft.com/office/word/2016/wordml/cid" xmlns:w16="http://schemas.microsoft.com/office/word/2018/wordml" xmlns:w16du="http://schemas.microsoft.com/office/word/2023/wordml/word16du" xmlns:w16sdtdh="http://schemas.microsoft.com/office/word/2020/wordml/sdtdatahash" xmlns:w16sdtfl="http://schemas.microsoft.com/office/word/2024/wordml/sdtformatlock" xmlns:w16se="http://schemas.microsoft.com/office/word/2015/wordml/symex" xmlns:wpg="http://schemas.microsoft.com/office/word/2010/wordprocessingGroup" xmlns:wpi="http://schemas.microsoft.com/office/word/2010/wordprocessingInk" xmlns:wne="http://schemas.microsoft.com/office/word/2006/wordml" xmlns:wps="http://schemas.microsoft.com/office/word/2010/wordprocessingShape" mc:Ignorable="w14 w15 w16se w16cid w16 w16cex w16sdtdh w16sdtfl w16du wp14">
+<w:numbering xmlns:wpc="http://schemas.microsoft.com/office/word/2010/wordprocessingCanvas" xmlns:cx="http://schemas.microsoft.com/office/drawing/2014/chartex" xmlns:cx1="http://schemas.microsoft.com/office/drawing/2015/9/8/chartex" xmlns:cx2="http://schemas.microsoft.com/office/drawing/2015/10/21/chartex" xmlns:cx3="http://schemas.microsoft.com/office/drawing/2016/5/9/chartex" xmlns:cx4="http://schemas.microsoft.com/office/drawing/2016/5/10/chartex" xmlns:cx5="http://schemas.microsoft.com/office/drawing/2016/5/11/chartex" xmlns:cx6="http://schemas.microsoft.com/office/drawing/2016/5/12/chartex" xmlns:cx7="http://schemas.microsoft.com/office/drawing/2016/5/13/chartex" xmlns:cx8="http://schemas.microsoft.com/office/drawing/2016/5/14/chartex" xmlns:mc="http://schemas.openxmlformats.org/markup-compatibility/2006" xmlns:aink="http://schemas.microsoft.com/office/drawing/2016/ink" xmlns:am3d="http://schemas.microsoft.com/office/drawing/2017/model3d" xmlns:o="urn:schemas-microsoft-com:office:office" xmlns:oel="http://schemas.microsoft.com/office/2019/extlst" xmlns:r="http://schemas.openxmlformats.org/officeDocument/2006/relationships" xmlns:m="http://schemas.openxmlformats.org/officeDocument/2006/math" xmlns:v="urn:schemas-microsoft-com:vml" xmlns:wp14="http://schemas.microsoft.com/office/word/2010/wordprocessingDrawing" xmlns:wp="http://schemas.openxmlformats.org/drawingml/2006/wordprocessingDrawing" xmlns:w10="urn:schemas-microsoft-com:office:word" xmlns:w="http://schemas.openxmlformats.org/wordprocessingml/2006/main" xmlns:w14="http://schemas.microsoft.com/office/word/2010/wordml" xmlns:w15="http://schemas.microsoft.com/office/word/2012/wordml" xmlns:w16cei="http://schemas.microsoft.com/office/word/2026/wordml/cei" xmlns:w16cex="http://schemas.microsoft.com/office/word/2018/wordml/cex" xmlns:w16cid="http://schemas.microsoft.com/office/word/2016/wordml/cid" xmlns:w16="http://schemas.microsoft.com/office/word/2018/wordml" xmlns:w16du="http://schemas.microsoft.com/office/word/2023/wordml/word16du" xmlns:w16sdtdh="http://schemas.microsoft.com/office/word/2020/wordml/sdtdatahash" xmlns:w16sdtfl="http://schemas.microsoft.com/office/word/2024/wordml/sdtformatlock" xmlns:w16se="http://schemas.microsoft.com/office/word/2015/wordml/symex" xmlns:wpg="http://schemas.microsoft.com/office/word/2010/wordprocessingGroup" xmlns:wpi="http://schemas.microsoft.com/office/word/2010/wordprocessingInk" xmlns:wne="http://schemas.microsoft.com/office/word/2006/wordml" xmlns:wps="http://schemas.microsoft.com/office/word/2010/wordprocessingShape" mc:Ignorable="w14 w15 w16se w16cid w16 w16cex w16sdtdh w16sdtfl w16du wp14">
   <w:abstractNum w:abstractNumId="0" w15:restartNumberingAfterBreak="0">
+    <w:nsid w:val="16EC1016"/>
+    <w:multiLevelType w:val="multilevel"/>
+    <w:tmpl w:val="AE6CE97E"/>
+    <w:lvl w:ilvl="0">
+      <w:start w:val="1"/>
+      <w:numFmt w:val="bullet"/>
+      <w:lvlText w:val=""/>
+      <w:lvlJc w:val="left"/>
+      <w:pPr>
+        <w:tabs>
+          <w:tab w:val="num" w:pos="720"/>
+        </w:tabs>
+        <w:ind w:left="720" w:hanging="360"/>
+      </w:pPr>
+      <w:rPr>
+        <w:rFonts w:ascii="Symbol" w:hAnsi="Symbol" w:hint="default"/>
+        <w:sz w:val="20"/>
+      </w:rPr>
+    </w:lvl>
+    <w:lvl w:ilvl="1" w:tentative="1">
+      <w:start w:val="1"/>
+      <w:numFmt w:val="bullet"/>
+      <w:lvlText w:val="o"/>
+      <w:lvlJc w:val="left"/>
+      <w:pPr>
+        <w:tabs>
+          <w:tab w:val="num" w:pos="1440"/>
+        </w:tabs>
+        <w:ind w:left="1440" w:hanging="360"/>
+      </w:pPr>
+      <w:rPr>
+        <w:rFonts w:ascii="Courier New" w:hAnsi="Courier New" w:hint="default"/>
+        <w:sz w:val="20"/>
+      </w:rPr>
+    </w:lvl>
+    <w:lvl w:ilvl="2" w:tentative="1">
+      <w:start w:val="1"/>
+      <w:numFmt w:val="bullet"/>
+      <w:lvlText w:val=""/>
+      <w:lvlJc w:val="left"/>
+      <w:pPr>
+        <w:tabs>
+          <w:tab w:val="num" w:pos="2160"/>
+        </w:tabs>
+        <w:ind w:left="2160" w:hanging="360"/>
+      </w:pPr>
+      <w:rPr>
+        <w:rFonts w:ascii="Wingdings" w:hAnsi="Wingdings" w:hint="default"/>
+        <w:sz w:val="20"/>
+      </w:rPr>
+    </w:lvl>
+    <w:lvl w:ilvl="3" w:tentative="1">
+      <w:start w:val="1"/>
+      <w:numFmt w:val="bullet"/>
+      <w:lvlText w:val=""/>
+      <w:lvlJc w:val="left"/>
+      <w:pPr>
+        <w:tabs>
+          <w:tab w:val="num" w:pos="2880"/>
+        </w:tabs>
+        <w:ind w:left="2880" w:hanging="360"/>
+      </w:pPr>
+      <w:rPr>
+        <w:rFonts w:ascii="Wingdings" w:hAnsi="Wingdings" w:hint="default"/>
+        <w:sz w:val="20"/>
+      </w:rPr>
+    </w:lvl>
+    <w:lvl w:ilvl="4" w:tentative="1">
+      <w:start w:val="1"/>
+      <w:numFmt w:val="bullet"/>
+      <w:lvlText w:val=""/>
+      <w:lvlJc w:val="left"/>
+      <w:pPr>
+        <w:tabs>
+          <w:tab w:val="num" w:pos="3600"/>
+        </w:tabs>
+        <w:ind w:left="3600" w:hanging="360"/>
+      </w:pPr>
+      <w:rPr>
+        <w:rFonts w:ascii="Wingdings" w:hAnsi="Wingdings" w:hint="default"/>
+        <w:sz w:val="20"/>
+      </w:rPr>
+    </w:lvl>
+    <w:lvl w:ilvl="5" w:tentative="1">
+      <w:start w:val="1"/>
+      <w:numFmt w:val="bullet"/>
+      <w:lvlText w:val=""/>
+      <w:lvlJc w:val="left"/>
+      <w:pPr>
+        <w:tabs>
+          <w:tab w:val="num" w:pos="4320"/>
+        </w:tabs>
+        <w:ind w:left="4320" w:hanging="360"/>
+      </w:pPr>
+      <w:rPr>
+        <w:rFonts w:ascii="Wingdings" w:hAnsi="Wingdings" w:hint="default"/>
+        <w:sz w:val="20"/>
+      </w:rPr>
+    </w:lvl>
+    <w:lvl w:ilvl="6" w:tentative="1">
+      <w:start w:val="1"/>
+      <w:numFmt w:val="bullet"/>
+      <w:lvlText w:val=""/>
+      <w:lvlJc w:val="left"/>
+      <w:pPr>
+        <w:tabs>
+          <w:tab w:val="num" w:pos="5040"/>
+        </w:tabs>
+        <w:ind w:left="5040" w:hanging="360"/>
+      </w:pPr>
+      <w:rPr>
+        <w:rFonts w:ascii="Wingdings" w:hAnsi="Wingdings" w:hint="default"/>
+        <w:sz w:val="20"/>
+      </w:rPr>
+    </w:lvl>
+    <w:lvl w:ilvl="7" w:tentative="1">
+      <w:start w:val="1"/>
+      <w:numFmt w:val="bullet"/>
+      <w:lvlText w:val=""/>
+      <w:lvlJc w:val="left"/>
+      <w:pPr>
+        <w:tabs>
+          <w:tab w:val="num" w:pos="5760"/>
+        </w:tabs>
+        <w:ind w:left="5760" w:hanging="360"/>
+      </w:pPr>
+      <w:rPr>
+        <w:rFonts w:ascii="Wingdings" w:hAnsi="Wingdings" w:hint="default"/>
+        <w:sz w:val="20"/>
+      </w:rPr>
+    </w:lvl>
+    <w:lvl w:ilvl="8" w:tentative="1">
+      <w:start w:val="1"/>
+      <w:numFmt w:val="bullet"/>
+      <w:lvlText w:val=""/>
+      <w:lvlJc w:val="left"/>
+      <w:pPr>
+        <w:tabs>
+          <w:tab w:val="num" w:pos="6480"/>
+        </w:tabs>
+        <w:ind w:left="6480" w:hanging="360"/>
+      </w:pPr>
+      <w:rPr>
+        <w:rFonts w:ascii="Wingdings" w:hAnsi="Wingdings" w:hint="default"/>
+        <w:sz w:val="20"/>
+      </w:rPr>
+    </w:lvl>
+  </w:abstractNum>
+  <w:abstractNum w:abstractNumId="1" w15:restartNumberingAfterBreak="0">
     <w:nsid w:val="17734325"/>
     <w:multiLevelType w:val="hybridMultilevel"/>
     <w:tmpl w:val="1FD45FEA"/>
@@ -7178,7 +9644,188 @@
       </w:pPr>
     </w:lvl>
   </w:abstractNum>
-  <w:abstractNum w:abstractNumId="1" w15:restartNumberingAfterBreak="0">
+  <w:abstractNum w:abstractNumId="2" w15:restartNumberingAfterBreak="0">
+    <w:nsid w:val="258A6B72"/>
+    <w:multiLevelType w:val="hybridMultilevel"/>
+    <w:tmpl w:val="93EEA88E"/>
+    <w:lvl w:ilvl="0" w:tplc="FFFFFFFF">
+      <w:start w:val="1"/>
+      <w:numFmt w:val="decimal"/>
+      <w:lvlText w:val="%1."/>
+      <w:lvlJc w:val="left"/>
+      <w:pPr>
+        <w:ind w:left="720" w:hanging="360"/>
+      </w:pPr>
+    </w:lvl>
+    <w:lvl w:ilvl="1" w:tplc="04090001">
+      <w:start w:val="1"/>
+      <w:numFmt w:val="bullet"/>
+      <w:lvlText w:val=""/>
+      <w:lvlJc w:val="left"/>
+      <w:pPr>
+        <w:ind w:left="720" w:hanging="360"/>
+      </w:pPr>
+      <w:rPr>
+        <w:rFonts w:ascii="Symbol" w:hAnsi="Symbol" w:hint="default"/>
+      </w:rPr>
+    </w:lvl>
+    <w:lvl w:ilvl="2" w:tplc="FFFFFFFF">
+      <w:start w:val="1"/>
+      <w:numFmt w:val="lowerRoman"/>
+      <w:lvlText w:val="%3."/>
+      <w:lvlJc w:val="right"/>
+      <w:pPr>
+        <w:ind w:left="2160" w:hanging="180"/>
+      </w:pPr>
+    </w:lvl>
+    <w:lvl w:ilvl="3" w:tplc="FFFFFFFF" w:tentative="1">
+      <w:start w:val="1"/>
+      <w:numFmt w:val="decimal"/>
+      <w:lvlText w:val="%4."/>
+      <w:lvlJc w:val="left"/>
+      <w:pPr>
+        <w:ind w:left="2880" w:hanging="360"/>
+      </w:pPr>
+    </w:lvl>
+    <w:lvl w:ilvl="4" w:tplc="FFFFFFFF" w:tentative="1">
+      <w:start w:val="1"/>
+      <w:numFmt w:val="lowerLetter"/>
+      <w:lvlText w:val="%5."/>
+      <w:lvlJc w:val="left"/>
+      <w:pPr>
+        <w:ind w:left="3600" w:hanging="360"/>
+      </w:pPr>
+    </w:lvl>
+    <w:lvl w:ilvl="5" w:tplc="FFFFFFFF" w:tentative="1">
+      <w:start w:val="1"/>
+      <w:numFmt w:val="lowerRoman"/>
+      <w:lvlText w:val="%6."/>
+      <w:lvlJc w:val="right"/>
+      <w:pPr>
+        <w:ind w:left="4320" w:hanging="180"/>
+      </w:pPr>
+    </w:lvl>
+    <w:lvl w:ilvl="6" w:tplc="FFFFFFFF" w:tentative="1">
+      <w:start w:val="1"/>
+      <w:numFmt w:val="decimal"/>
+      <w:lvlText w:val="%7."/>
+      <w:lvlJc w:val="left"/>
+      <w:pPr>
+        <w:ind w:left="5040" w:hanging="360"/>
+      </w:pPr>
+    </w:lvl>
+    <w:lvl w:ilvl="7" w:tplc="FFFFFFFF" w:tentative="1">
+      <w:start w:val="1"/>
+      <w:numFmt w:val="lowerLetter"/>
+      <w:lvlText w:val="%8."/>
+      <w:lvlJc w:val="left"/>
+      <w:pPr>
+        <w:ind w:left="5760" w:hanging="360"/>
+      </w:pPr>
+    </w:lvl>
+    <w:lvl w:ilvl="8" w:tplc="FFFFFFFF" w:tentative="1">
+      <w:start w:val="1"/>
+      <w:numFmt w:val="lowerRoman"/>
+      <w:lvlText w:val="%9."/>
+      <w:lvlJc w:val="right"/>
+      <w:pPr>
+        <w:ind w:left="6480" w:hanging="180"/>
+      </w:pPr>
+    </w:lvl>
+  </w:abstractNum>
+  <w:abstractNum w:abstractNumId="3" w15:restartNumberingAfterBreak="0">
+    <w:nsid w:val="284D3CE7"/>
+    <w:multiLevelType w:val="hybridMultilevel"/>
+    <w:tmpl w:val="616A90C8"/>
+    <w:lvl w:ilvl="0" w:tplc="FFFFFFFF">
+      <w:start w:val="1"/>
+      <w:numFmt w:val="decimal"/>
+      <w:lvlText w:val="%1."/>
+      <w:lvlJc w:val="left"/>
+      <w:pPr>
+        <w:ind w:left="720" w:hanging="360"/>
+      </w:pPr>
+    </w:lvl>
+    <w:lvl w:ilvl="1" w:tplc="FFFFFFFF">
+      <w:start w:val="1"/>
+      <w:numFmt w:val="bullet"/>
+      <w:lvlText w:val=""/>
+      <w:lvlJc w:val="left"/>
+      <w:pPr>
+        <w:ind w:left="720" w:hanging="360"/>
+      </w:pPr>
+      <w:rPr>
+        <w:rFonts w:ascii="Symbol" w:hAnsi="Symbol" w:hint="default"/>
+      </w:rPr>
+    </w:lvl>
+    <w:lvl w:ilvl="2" w:tplc="506471DE">
+      <w:start w:val="1"/>
+      <w:numFmt w:val="bullet"/>
+      <w:lvlText w:val="-"/>
+      <w:lvlJc w:val="left"/>
+      <w:pPr>
+        <w:ind w:left="2340" w:hanging="360"/>
+      </w:pPr>
+      <w:rPr>
+        <w:rFonts w:ascii="Times New Roman" w:eastAsiaTheme="minorHAnsi" w:hAnsi="Times New Roman" w:cs="Times New Roman" w:hint="default"/>
+      </w:rPr>
+    </w:lvl>
+    <w:lvl w:ilvl="3" w:tplc="FFFFFFFF" w:tentative="1">
+      <w:start w:val="1"/>
+      <w:numFmt w:val="decimal"/>
+      <w:lvlText w:val="%4."/>
+      <w:lvlJc w:val="left"/>
+      <w:pPr>
+        <w:ind w:left="2880" w:hanging="360"/>
+      </w:pPr>
+    </w:lvl>
+    <w:lvl w:ilvl="4" w:tplc="FFFFFFFF" w:tentative="1">
+      <w:start w:val="1"/>
+      <w:numFmt w:val="lowerLetter"/>
+      <w:lvlText w:val="%5."/>
+      <w:lvlJc w:val="left"/>
+      <w:pPr>
+        <w:ind w:left="3600" w:hanging="360"/>
+      </w:pPr>
+    </w:lvl>
+    <w:lvl w:ilvl="5" w:tplc="FFFFFFFF" w:tentative="1">
+      <w:start w:val="1"/>
+      <w:numFmt w:val="lowerRoman"/>
+      <w:lvlText w:val="%6."/>
+      <w:lvlJc w:val="right"/>
+      <w:pPr>
+        <w:ind w:left="4320" w:hanging="180"/>
+      </w:pPr>
+    </w:lvl>
+    <w:lvl w:ilvl="6" w:tplc="FFFFFFFF" w:tentative="1">
+      <w:start w:val="1"/>
+      <w:numFmt w:val="decimal"/>
+      <w:lvlText w:val="%7."/>
+      <w:lvlJc w:val="left"/>
+      <w:pPr>
+        <w:ind w:left="5040" w:hanging="360"/>
+      </w:pPr>
+    </w:lvl>
+    <w:lvl w:ilvl="7" w:tplc="FFFFFFFF" w:tentative="1">
+      <w:start w:val="1"/>
+      <w:numFmt w:val="lowerLetter"/>
+      <w:lvlText w:val="%8."/>
+      <w:lvlJc w:val="left"/>
+      <w:pPr>
+        <w:ind w:left="5760" w:hanging="360"/>
+      </w:pPr>
+    </w:lvl>
+    <w:lvl w:ilvl="8" w:tplc="FFFFFFFF" w:tentative="1">
+      <w:start w:val="1"/>
+      <w:numFmt w:val="lowerRoman"/>
+      <w:lvlText w:val="%9."/>
+      <w:lvlJc w:val="right"/>
+      <w:pPr>
+        <w:ind w:left="6480" w:hanging="180"/>
+      </w:pPr>
+    </w:lvl>
+  </w:abstractNum>
+  <w:abstractNum w:abstractNumId="4" w15:restartNumberingAfterBreak="0">
     <w:nsid w:val="40D8608A"/>
     <w:multiLevelType w:val="hybridMultilevel"/>
     <w:tmpl w:val="979CD868"/>
@@ -7267,7 +9914,7 @@
       </w:pPr>
     </w:lvl>
   </w:abstractNum>
-  <w:abstractNum w:abstractNumId="2" w15:restartNumberingAfterBreak="0">
+  <w:abstractNum w:abstractNumId="5" w15:restartNumberingAfterBreak="0">
     <w:nsid w:val="46A44212"/>
     <w:multiLevelType w:val="hybridMultilevel"/>
     <w:tmpl w:val="B42A62EC"/>
@@ -7379,7 +10026,7 @@
       </w:rPr>
     </w:lvl>
   </w:abstractNum>
-  <w:abstractNum w:abstractNumId="3" w15:restartNumberingAfterBreak="0">
+  <w:abstractNum w:abstractNumId="6" w15:restartNumberingAfterBreak="0">
     <w:nsid w:val="46EB5F37"/>
     <w:multiLevelType w:val="hybridMultilevel"/>
     <w:tmpl w:val="FC529674"/>
@@ -7465,7 +10112,93 @@
       </w:pPr>
     </w:lvl>
   </w:abstractNum>
-  <w:abstractNum w:abstractNumId="4" w15:restartNumberingAfterBreak="0">
+  <w:abstractNum w:abstractNumId="7" w15:restartNumberingAfterBreak="0">
+    <w:nsid w:val="5B226599"/>
+    <w:multiLevelType w:val="hybridMultilevel"/>
+    <w:tmpl w:val="C89A6CD0"/>
+    <w:lvl w:ilvl="0" w:tplc="0409000F">
+      <w:start w:val="1"/>
+      <w:numFmt w:val="decimal"/>
+      <w:lvlText w:val="%1."/>
+      <w:lvlJc w:val="left"/>
+      <w:pPr>
+        <w:ind w:left="720" w:hanging="360"/>
+      </w:pPr>
+    </w:lvl>
+    <w:lvl w:ilvl="1" w:tplc="04090019">
+      <w:start w:val="1"/>
+      <w:numFmt w:val="lowerLetter"/>
+      <w:lvlText w:val="%2."/>
+      <w:lvlJc w:val="left"/>
+      <w:pPr>
+        <w:ind w:left="1440" w:hanging="360"/>
+      </w:pPr>
+    </w:lvl>
+    <w:lvl w:ilvl="2" w:tplc="0409001B" w:tentative="1">
+      <w:start w:val="1"/>
+      <w:numFmt w:val="lowerRoman"/>
+      <w:lvlText w:val="%3."/>
+      <w:lvlJc w:val="right"/>
+      <w:pPr>
+        <w:ind w:left="2160" w:hanging="180"/>
+      </w:pPr>
+    </w:lvl>
+    <w:lvl w:ilvl="3" w:tplc="0409000F" w:tentative="1">
+      <w:start w:val="1"/>
+      <w:numFmt w:val="decimal"/>
+      <w:lvlText w:val="%4."/>
+      <w:lvlJc w:val="left"/>
+      <w:pPr>
+        <w:ind w:left="2880" w:hanging="360"/>
+      </w:pPr>
+    </w:lvl>
+    <w:lvl w:ilvl="4" w:tplc="04090019" w:tentative="1">
+      <w:start w:val="1"/>
+      <w:numFmt w:val="lowerLetter"/>
+      <w:lvlText w:val="%5."/>
+      <w:lvlJc w:val="left"/>
+      <w:pPr>
+        <w:ind w:left="3600" w:hanging="360"/>
+      </w:pPr>
+    </w:lvl>
+    <w:lvl w:ilvl="5" w:tplc="0409001B" w:tentative="1">
+      <w:start w:val="1"/>
+      <w:numFmt w:val="lowerRoman"/>
+      <w:lvlText w:val="%6."/>
+      <w:lvlJc w:val="right"/>
+      <w:pPr>
+        <w:ind w:left="4320" w:hanging="180"/>
+      </w:pPr>
+    </w:lvl>
+    <w:lvl w:ilvl="6" w:tplc="0409000F" w:tentative="1">
+      <w:start w:val="1"/>
+      <w:numFmt w:val="decimal"/>
+      <w:lvlText w:val="%7."/>
+      <w:lvlJc w:val="left"/>
+      <w:pPr>
+        <w:ind w:left="5040" w:hanging="360"/>
+      </w:pPr>
+    </w:lvl>
+    <w:lvl w:ilvl="7" w:tplc="04090019" w:tentative="1">
+      <w:start w:val="1"/>
+      <w:numFmt w:val="lowerLetter"/>
+      <w:lvlText w:val="%8."/>
+      <w:lvlJc w:val="left"/>
+      <w:pPr>
+        <w:ind w:left="5760" w:hanging="360"/>
+      </w:pPr>
+    </w:lvl>
+    <w:lvl w:ilvl="8" w:tplc="0409001B" w:tentative="1">
+      <w:start w:val="1"/>
+      <w:numFmt w:val="lowerRoman"/>
+      <w:lvlText w:val="%9."/>
+      <w:lvlJc w:val="right"/>
+      <w:pPr>
+        <w:ind w:left="6480" w:hanging="180"/>
+      </w:pPr>
+    </w:lvl>
+  </w:abstractNum>
+  <w:abstractNum w:abstractNumId="8" w15:restartNumberingAfterBreak="0">
     <w:nsid w:val="5ED84B0F"/>
     <w:multiLevelType w:val="hybridMultilevel"/>
     <w:tmpl w:val="74FECAAE"/>
@@ -7578,7 +10311,120 @@
       </w:rPr>
     </w:lvl>
   </w:abstractNum>
-  <w:abstractNum w:abstractNumId="5" w15:restartNumberingAfterBreak="0">
+  <w:abstractNum w:abstractNumId="9" w15:restartNumberingAfterBreak="0">
+    <w:nsid w:val="60893970"/>
+    <w:multiLevelType w:val="hybridMultilevel"/>
+    <w:tmpl w:val="90464F62"/>
+    <w:lvl w:ilvl="0" w:tplc="506471DE">
+      <w:start w:val="1"/>
+      <w:numFmt w:val="bullet"/>
+      <w:lvlText w:val="-"/>
+      <w:lvlJc w:val="left"/>
+      <w:pPr>
+        <w:ind w:left="720" w:hanging="360"/>
+      </w:pPr>
+      <w:rPr>
+        <w:rFonts w:ascii="Times New Roman" w:eastAsiaTheme="minorHAnsi" w:hAnsi="Times New Roman" w:cs="Times New Roman" w:hint="default"/>
+      </w:rPr>
+    </w:lvl>
+    <w:lvl w:ilvl="1" w:tplc="04090003" w:tentative="1">
+      <w:start w:val="1"/>
+      <w:numFmt w:val="bullet"/>
+      <w:lvlText w:val="o"/>
+      <w:lvlJc w:val="left"/>
+      <w:pPr>
+        <w:ind w:left="1440" w:hanging="360"/>
+      </w:pPr>
+      <w:rPr>
+        <w:rFonts w:ascii="Courier New" w:hAnsi="Courier New" w:cs="Courier New" w:hint="default"/>
+      </w:rPr>
+    </w:lvl>
+    <w:lvl w:ilvl="2" w:tplc="04090005">
+      <w:start w:val="1"/>
+      <w:numFmt w:val="bullet"/>
+      <w:lvlText w:val=""/>
+      <w:lvlJc w:val="left"/>
+      <w:pPr>
+        <w:ind w:left="2160" w:hanging="360"/>
+      </w:pPr>
+      <w:rPr>
+        <w:rFonts w:ascii="Wingdings" w:hAnsi="Wingdings" w:hint="default"/>
+      </w:rPr>
+    </w:lvl>
+    <w:lvl w:ilvl="3" w:tplc="04090001" w:tentative="1">
+      <w:start w:val="1"/>
+      <w:numFmt w:val="bullet"/>
+      <w:lvlText w:val=""/>
+      <w:lvlJc w:val="left"/>
+      <w:pPr>
+        <w:ind w:left="2880" w:hanging="360"/>
+      </w:pPr>
+      <w:rPr>
+        <w:rFonts w:ascii="Symbol" w:hAnsi="Symbol" w:hint="default"/>
+      </w:rPr>
+    </w:lvl>
+    <w:lvl w:ilvl="4" w:tplc="04090003" w:tentative="1">
+      <w:start w:val="1"/>
+      <w:numFmt w:val="bullet"/>
+      <w:lvlText w:val="o"/>
+      <w:lvlJc w:val="left"/>
+      <w:pPr>
+        <w:ind w:left="3600" w:hanging="360"/>
+      </w:pPr>
+      <w:rPr>
+        <w:rFonts w:ascii="Courier New" w:hAnsi="Courier New" w:cs="Courier New" w:hint="default"/>
+      </w:rPr>
+    </w:lvl>
+    <w:lvl w:ilvl="5" w:tplc="04090005" w:tentative="1">
+      <w:start w:val="1"/>
+      <w:numFmt w:val="bullet"/>
+      <w:lvlText w:val=""/>
+      <w:lvlJc w:val="left"/>
+      <w:pPr>
+        <w:ind w:left="4320" w:hanging="360"/>
+      </w:pPr>
+      <w:rPr>
+        <w:rFonts w:ascii="Wingdings" w:hAnsi="Wingdings" w:hint="default"/>
+      </w:rPr>
+    </w:lvl>
+    <w:lvl w:ilvl="6" w:tplc="04090001" w:tentative="1">
+      <w:start w:val="1"/>
+      <w:numFmt w:val="bullet"/>
+      <w:lvlText w:val=""/>
+      <w:lvlJc w:val="left"/>
+      <w:pPr>
+        <w:ind w:left="5040" w:hanging="360"/>
+      </w:pPr>
+      <w:rPr>
+        <w:rFonts w:ascii="Symbol" w:hAnsi="Symbol" w:hint="default"/>
+      </w:rPr>
+    </w:lvl>
+    <w:lvl w:ilvl="7" w:tplc="04090003" w:tentative="1">
+      <w:start w:val="1"/>
+      <w:numFmt w:val="bullet"/>
+      <w:lvlText w:val="o"/>
+      <w:lvlJc w:val="left"/>
+      <w:pPr>
+        <w:ind w:left="5760" w:hanging="360"/>
+      </w:pPr>
+      <w:rPr>
+        <w:rFonts w:ascii="Courier New" w:hAnsi="Courier New" w:cs="Courier New" w:hint="default"/>
+      </w:rPr>
+    </w:lvl>
+    <w:lvl w:ilvl="8" w:tplc="04090005" w:tentative="1">
+      <w:start w:val="1"/>
+      <w:numFmt w:val="bullet"/>
+      <w:lvlText w:val=""/>
+      <w:lvlJc w:val="left"/>
+      <w:pPr>
+        <w:ind w:left="6480" w:hanging="360"/>
+      </w:pPr>
+      <w:rPr>
+        <w:rFonts w:ascii="Wingdings" w:hAnsi="Wingdings" w:hint="default"/>
+      </w:rPr>
+    </w:lvl>
+  </w:abstractNum>
+  <w:abstractNum w:abstractNumId="10" w15:restartNumberingAfterBreak="0">
     <w:nsid w:val="63B60C33"/>
     <w:multiLevelType w:val="hybridMultilevel"/>
     <w:tmpl w:val="635C44DE"/>
@@ -7691,7 +10537,120 @@
       </w:rPr>
     </w:lvl>
   </w:abstractNum>
-  <w:abstractNum w:abstractNumId="6" w15:restartNumberingAfterBreak="0">
+  <w:abstractNum w:abstractNumId="11" w15:restartNumberingAfterBreak="0">
+    <w:nsid w:val="66D2450A"/>
+    <w:multiLevelType w:val="hybridMultilevel"/>
+    <w:tmpl w:val="A278871C"/>
+    <w:lvl w:ilvl="0" w:tplc="FFFFFFFF">
+      <w:start w:val="1"/>
+      <w:numFmt w:val="bullet"/>
+      <w:lvlText w:val="-"/>
+      <w:lvlJc w:val="left"/>
+      <w:pPr>
+        <w:ind w:left="720" w:hanging="360"/>
+      </w:pPr>
+      <w:rPr>
+        <w:rFonts w:ascii="Times New Roman" w:eastAsiaTheme="minorHAnsi" w:hAnsi="Times New Roman" w:cs="Times New Roman" w:hint="default"/>
+      </w:rPr>
+    </w:lvl>
+    <w:lvl w:ilvl="1" w:tplc="FFFFFFFF" w:tentative="1">
+      <w:start w:val="1"/>
+      <w:numFmt w:val="bullet"/>
+      <w:lvlText w:val="o"/>
+      <w:lvlJc w:val="left"/>
+      <w:pPr>
+        <w:ind w:left="1440" w:hanging="360"/>
+      </w:pPr>
+      <w:rPr>
+        <w:rFonts w:ascii="Courier New" w:hAnsi="Courier New" w:cs="Courier New" w:hint="default"/>
+      </w:rPr>
+    </w:lvl>
+    <w:lvl w:ilvl="2" w:tplc="506471DE">
+      <w:start w:val="1"/>
+      <w:numFmt w:val="bullet"/>
+      <w:lvlText w:val="-"/>
+      <w:lvlJc w:val="left"/>
+      <w:pPr>
+        <w:ind w:left="2160" w:hanging="360"/>
+      </w:pPr>
+      <w:rPr>
+        <w:rFonts w:ascii="Times New Roman" w:eastAsiaTheme="minorHAnsi" w:hAnsi="Times New Roman" w:cs="Times New Roman" w:hint="default"/>
+      </w:rPr>
+    </w:lvl>
+    <w:lvl w:ilvl="3" w:tplc="FFFFFFFF" w:tentative="1">
+      <w:start w:val="1"/>
+      <w:numFmt w:val="bullet"/>
+      <w:lvlText w:val=""/>
+      <w:lvlJc w:val="left"/>
+      <w:pPr>
+        <w:ind w:left="2880" w:hanging="360"/>
+      </w:pPr>
+      <w:rPr>
+        <w:rFonts w:ascii="Symbol" w:hAnsi="Symbol" w:hint="default"/>
+      </w:rPr>
+    </w:lvl>
+    <w:lvl w:ilvl="4" w:tplc="FFFFFFFF" w:tentative="1">
+      <w:start w:val="1"/>
+      <w:numFmt w:val="bullet"/>
+      <w:lvlText w:val="o"/>
+      <w:lvlJc w:val="left"/>
+      <w:pPr>
+        <w:ind w:left="3600" w:hanging="360"/>
+      </w:pPr>
+      <w:rPr>
+        <w:rFonts w:ascii="Courier New" w:hAnsi="Courier New" w:cs="Courier New" w:hint="default"/>
+      </w:rPr>
+    </w:lvl>
+    <w:lvl w:ilvl="5" w:tplc="FFFFFFFF" w:tentative="1">
+      <w:start w:val="1"/>
+      <w:numFmt w:val="bullet"/>
+      <w:lvlText w:val=""/>
+      <w:lvlJc w:val="left"/>
+      <w:pPr>
+        <w:ind w:left="4320" w:hanging="360"/>
+      </w:pPr>
+      <w:rPr>
+        <w:rFonts w:ascii="Wingdings" w:hAnsi="Wingdings" w:hint="default"/>
+      </w:rPr>
+    </w:lvl>
+    <w:lvl w:ilvl="6" w:tplc="FFFFFFFF" w:tentative="1">
+      <w:start w:val="1"/>
+      <w:numFmt w:val="bullet"/>
+      <w:lvlText w:val=""/>
+      <w:lvlJc w:val="left"/>
+      <w:pPr>
+        <w:ind w:left="5040" w:hanging="360"/>
+      </w:pPr>
+      <w:rPr>
+        <w:rFonts w:ascii="Symbol" w:hAnsi="Symbol" w:hint="default"/>
+      </w:rPr>
+    </w:lvl>
+    <w:lvl w:ilvl="7" w:tplc="FFFFFFFF" w:tentative="1">
+      <w:start w:val="1"/>
+      <w:numFmt w:val="bullet"/>
+      <w:lvlText w:val="o"/>
+      <w:lvlJc w:val="left"/>
+      <w:pPr>
+        <w:ind w:left="5760" w:hanging="360"/>
+      </w:pPr>
+      <w:rPr>
+        <w:rFonts w:ascii="Courier New" w:hAnsi="Courier New" w:cs="Courier New" w:hint="default"/>
+      </w:rPr>
+    </w:lvl>
+    <w:lvl w:ilvl="8" w:tplc="FFFFFFFF" w:tentative="1">
+      <w:start w:val="1"/>
+      <w:numFmt w:val="bullet"/>
+      <w:lvlText w:val=""/>
+      <w:lvlJc w:val="left"/>
+      <w:pPr>
+        <w:ind w:left="6480" w:hanging="360"/>
+      </w:pPr>
+      <w:rPr>
+        <w:rFonts w:ascii="Wingdings" w:hAnsi="Wingdings" w:hint="default"/>
+      </w:rPr>
+    </w:lvl>
+  </w:abstractNum>
+  <w:abstractNum w:abstractNumId="12" w15:restartNumberingAfterBreak="0">
     <w:nsid w:val="686F2D3F"/>
     <w:multiLevelType w:val="hybridMultilevel"/>
     <w:tmpl w:val="E4CE448E"/>
@@ -7780,7 +10739,7 @@
       </w:pPr>
     </w:lvl>
   </w:abstractNum>
-  <w:abstractNum w:abstractNumId="7" w15:restartNumberingAfterBreak="0">
+  <w:abstractNum w:abstractNumId="13" w15:restartNumberingAfterBreak="0">
     <w:nsid w:val="6B3C3847"/>
     <w:multiLevelType w:val="hybridMultilevel"/>
     <w:tmpl w:val="564E730E"/>
@@ -7893,7 +10852,7 @@
       </w:rPr>
     </w:lvl>
   </w:abstractNum>
-  <w:abstractNum w:abstractNumId="8" w15:restartNumberingAfterBreak="0">
+  <w:abstractNum w:abstractNumId="14" w15:restartNumberingAfterBreak="0">
     <w:nsid w:val="6C833018"/>
     <w:multiLevelType w:val="hybridMultilevel"/>
     <w:tmpl w:val="1FD45FEA"/>
@@ -7982,7 +10941,7 @@
       </w:pPr>
     </w:lvl>
   </w:abstractNum>
-  <w:abstractNum w:abstractNumId="9" w15:restartNumberingAfterBreak="0">
+  <w:abstractNum w:abstractNumId="15" w15:restartNumberingAfterBreak="0">
     <w:nsid w:val="7577240C"/>
     <w:multiLevelType w:val="hybridMultilevel"/>
     <w:tmpl w:val="4B768118"/>
@@ -8095,7 +11054,7 @@
       </w:rPr>
     </w:lvl>
   </w:abstractNum>
-  <w:abstractNum w:abstractNumId="10" w15:restartNumberingAfterBreak="0">
+  <w:abstractNum w:abstractNumId="16" w15:restartNumberingAfterBreak="0">
     <w:nsid w:val="7E6B179C"/>
     <w:multiLevelType w:val="hybridMultilevel"/>
     <w:tmpl w:val="1D828BC2"/>
@@ -8209,37 +11168,55 @@
     </w:lvl>
   </w:abstractNum>
   <w:num w:numId="1" w16cid:durableId="1521703667">
+    <w:abstractNumId w:val="5"/>
+  </w:num>
+  <w:num w:numId="2" w16cid:durableId="1192451426">
+    <w:abstractNumId w:val="6"/>
+  </w:num>
+  <w:num w:numId="3" w16cid:durableId="1769034931">
+    <w:abstractNumId w:val="1"/>
+  </w:num>
+  <w:num w:numId="4" w16cid:durableId="959531810">
+    <w:abstractNumId w:val="14"/>
+  </w:num>
+  <w:num w:numId="5" w16cid:durableId="893854713">
+    <w:abstractNumId w:val="4"/>
+  </w:num>
+  <w:num w:numId="6" w16cid:durableId="985860105">
+    <w:abstractNumId w:val="12"/>
+  </w:num>
+  <w:num w:numId="7" w16cid:durableId="504787989">
+    <w:abstractNumId w:val="15"/>
+  </w:num>
+  <w:num w:numId="8" w16cid:durableId="1805653140">
+    <w:abstractNumId w:val="16"/>
+  </w:num>
+  <w:num w:numId="9" w16cid:durableId="1366711880">
+    <w:abstractNumId w:val="8"/>
+  </w:num>
+  <w:num w:numId="10" w16cid:durableId="1389844745">
+    <w:abstractNumId w:val="13"/>
+  </w:num>
+  <w:num w:numId="11" w16cid:durableId="275254084">
+    <w:abstractNumId w:val="10"/>
+  </w:num>
+  <w:num w:numId="12" w16cid:durableId="423577270">
+    <w:abstractNumId w:val="0"/>
+  </w:num>
+  <w:num w:numId="13" w16cid:durableId="1209799539">
+    <w:abstractNumId w:val="7"/>
+  </w:num>
+  <w:num w:numId="14" w16cid:durableId="1172064986">
     <w:abstractNumId w:val="2"/>
   </w:num>
-  <w:num w:numId="2" w16cid:durableId="1192451426">
+  <w:num w:numId="15" w16cid:durableId="458647446">
     <w:abstractNumId w:val="3"/>
   </w:num>
-  <w:num w:numId="3" w16cid:durableId="1769034931">
-    <w:abstractNumId w:val="0"/>
-  </w:num>
-  <w:num w:numId="4" w16cid:durableId="959531810">
-    <w:abstractNumId w:val="8"/>
-  </w:num>
-  <w:num w:numId="5" w16cid:durableId="893854713">
-    <w:abstractNumId w:val="1"/>
-  </w:num>
-  <w:num w:numId="6" w16cid:durableId="985860105">
-    <w:abstractNumId w:val="6"/>
-  </w:num>
-  <w:num w:numId="7" w16cid:durableId="504787989">
+  <w:num w:numId="16" w16cid:durableId="1661427877">
     <w:abstractNumId w:val="9"/>
   </w:num>
-  <w:num w:numId="8" w16cid:durableId="1805653140">
-    <w:abstractNumId w:val="10"/>
-  </w:num>
-  <w:num w:numId="9" w16cid:durableId="1366711880">
-    <w:abstractNumId w:val="4"/>
-  </w:num>
-  <w:num w:numId="10" w16cid:durableId="1389844745">
-    <w:abstractNumId w:val="7"/>
-  </w:num>
-  <w:num w:numId="11" w16cid:durableId="275254084">
-    <w:abstractNumId w:val="5"/>
+  <w:num w:numId="17" w16cid:durableId="1556114144">
+    <w:abstractNumId w:val="11"/>
   </w:num>
 </w:numbering>
 </file>
@@ -8418,7 +11395,7 @@
     <w:lsdException w:name="Table Web 2" w:semiHidden="1" w:unhideWhenUsed="1"/>
     <w:lsdException w:name="Table Web 3" w:semiHidden="1" w:unhideWhenUsed="1"/>
     <w:lsdException w:name="Balloon Text" w:semiHidden="1" w:unhideWhenUsed="1"/>
-    <w:lsdException w:name="Table Grid" w:uiPriority="39"/>
+    <w:lsdException w:name="Table Grid" w:uiPriority="59"/>
     <w:lsdException w:name="Table Theme" w:semiHidden="1" w:unhideWhenUsed="1"/>
     <w:lsdException w:name="Placeholder Text" w:semiHidden="1"/>
     <w:lsdException w:name="No Spacing" w:uiPriority="1" w:qFormat="1"/>
@@ -8850,7 +11827,6 @@
   <w:style w:type="character" w:default="1" w:styleId="DefaultParagraphFont">
     <w:name w:val="Default Paragraph Font"/>
     <w:uiPriority w:val="1"/>
-    <w:semiHidden/>
     <w:unhideWhenUsed/>
   </w:style>
   <w:style w:type="table" w:default="1" w:styleId="TableNormal">
@@ -9443,7 +12419,7 @@
   <w:style w:type="table" w:styleId="TableGrid">
     <w:name w:val="Table Grid"/>
     <w:basedOn w:val="TableNormal"/>
-    <w:uiPriority w:val="39"/>
+    <w:uiPriority w:val="59"/>
     <w:rsid w:val="00AD5F24"/>
     <w:pPr>
       <w:spacing w:after="0" w:line="240" w:lineRule="auto"/>
@@ -9498,6 +12474,20 @@
       <w:spacing w:after="100"/>
       <w:ind w:left="1040"/>
     </w:pPr>
+  </w:style>
+  <w:style w:type="paragraph" w:customStyle="1" w:styleId="CellBullet">
+    <w:name w:val="Cell Bullet"/>
+    <w:rsid w:val="00E83BD3"/>
+    <w:pPr>
+      <w:spacing w:after="0" w:line="264" w:lineRule="auto"/>
+      <w:ind w:left="255" w:hanging="142"/>
+    </w:pPr>
+    <w:rPr>
+      <w:rFonts w:ascii="Times New Roman" w:eastAsia="Times New Roman" w:hAnsi="Times New Roman"/>
+      <w:kern w:val="0"/>
+      <w:sz w:val="23"/>
+      <w14:ligatures w14:val="none"/>
+    </w:rPr>
   </w:style>
 </w:styles>
 </file>

</xml_diff>

<commit_message>
sửa quy trình tiếp nhận, quy trình xử lý và mô hình hóa quy trình tiếp nhận
</commit_message>
<xml_diff>
--- a/He_thong_thong_tin_giai_quyet_hanh_chinh/NGUYEN TRUONG PHI_25410281/25410281_NguyenTruongPhi.docx
+++ b/He_thong_thong_tin_giai_quyet_hanh_chinh/NGUYEN TRUONG PHI_25410281/25410281_NguyenTruongPhi.docx
@@ -79,7 +79,7 @@
           <w:szCs w:val="26"/>
         </w:rPr>
         <w:drawing>
-          <wp:inline distT="0" distB="0" distL="0" distR="0" wp14:anchorId="61AA30EF" wp14:editId="6DAF63B5">
+          <wp:inline distT="0" distB="0" distL="0" distR="0" wp14:anchorId="61AA30EF" wp14:editId="25F65445">
             <wp:extent cx="1948539" cy="1606164"/>
             <wp:effectExtent l="0" t="0" r="0" b="0"/>
             <wp:docPr id="990850389" name="Picture 1"/>
@@ -339,7 +339,6 @@
         <w:tabs>
           <w:tab w:val="left" w:pos="3969"/>
         </w:tabs>
-        <w:jc w:val="both"/>
         <w:rPr>
           <w:rFonts w:cs="Times New Roman"/>
           <w:b/>
@@ -393,7 +392,6 @@
         <w:tabs>
           <w:tab w:val="left" w:pos="3969"/>
         </w:tabs>
-        <w:jc w:val="both"/>
         <w:rPr>
           <w:rFonts w:cs="Times New Roman"/>
           <w:b/>
@@ -447,7 +445,6 @@
         <w:tabs>
           <w:tab w:val="left" w:pos="3969"/>
         </w:tabs>
-        <w:jc w:val="both"/>
         <w:rPr>
           <w:rFonts w:cs="Times New Roman"/>
           <w:b/>
@@ -501,7 +498,6 @@
         <w:tabs>
           <w:tab w:val="left" w:pos="3969"/>
         </w:tabs>
-        <w:jc w:val="both"/>
         <w:rPr>
           <w:rFonts w:cs="Times New Roman"/>
           <w:b/>
@@ -555,7 +551,6 @@
         <w:tabs>
           <w:tab w:val="left" w:pos="3969"/>
         </w:tabs>
-        <w:jc w:val="both"/>
         <w:rPr>
           <w:rFonts w:cs="Times New Roman"/>
           <w:b/>
@@ -609,7 +604,6 @@
         <w:tabs>
           <w:tab w:val="left" w:pos="3969"/>
         </w:tabs>
-        <w:jc w:val="both"/>
         <w:rPr>
           <w:rFonts w:cs="Times New Roman"/>
           <w:b/>
@@ -663,7 +657,6 @@
         <w:tabs>
           <w:tab w:val="left" w:pos="3969"/>
         </w:tabs>
-        <w:jc w:val="both"/>
         <w:rPr>
           <w:rFonts w:cs="Times New Roman"/>
           <w:b/>
@@ -709,7 +702,6 @@
     </w:p>
     <w:p>
       <w:pPr>
-        <w:jc w:val="both"/>
         <w:rPr>
           <w:rFonts w:cs="Times New Roman"/>
           <w:szCs w:val="26"/>
@@ -3050,7 +3042,6 @@
     <w:p>
       <w:pPr>
         <w:ind w:firstLine="720"/>
-        <w:jc w:val="both"/>
         <w:rPr>
           <w:rFonts w:cs="Times New Roman"/>
           <w:szCs w:val="26"/>
@@ -3242,7 +3233,6 @@
     <w:p>
       <w:pPr>
         <w:ind w:firstLine="720"/>
-        <w:jc w:val="both"/>
       </w:pPr>
       <w:r>
         <w:t>Đề tài “Hệ thống thông tin giải quyết thủ tục hành chính tại phường Tân Hải” tập trung tìm hiểu, phân tích và mô hình hóa quá trình tiếp nhận, xử lý và trả kết quả hồ sơ hành chính cho người dân và tổ chức. Quy trình được nghiên cứu từ khi người dân tra cứu thông tin, chuẩn bị thành phần hồ sơ và thực hiện nộp hồ sơ cho đến khi cán bộ tiếp nhận, kiểm tra, chuyển xử lý, phê duyệt và trả kết quả.</w:t>
@@ -3251,7 +3241,6 @@
     <w:p>
       <w:pPr>
         <w:ind w:firstLine="720"/>
-        <w:jc w:val="both"/>
       </w:pPr>
       <w:r>
         <w:t>Trong đề tài, nhóm xác định các đối tượng chính tham gia vào quy trình gồm người dân hoặc tổ chức, cán bộ tiếp nhận hồ sơ, cán bộ chuyên môn, lãnh đạo phê duyệt và hệ thống thông tin. Mỗi đối tượng đảm nhận một vai trò khác nhau và có sự trao đổi thông tin trong suốt quá trình giải quyết hồ sơ.</w:t>
@@ -3260,7 +3249,6 @@
     <w:p>
       <w:pPr>
         <w:ind w:firstLine="720"/>
-        <w:jc w:val="both"/>
       </w:pPr>
       <w:r>
         <w:t>Đối với người dân và tổ chức, hệ thống hỗ trợ tra cứu thủ tục, xem thành phần hồ sơ cần chuẩn bị, nộp hồ sơ, bổ sung giấy tờ khi có yêu cầu, theo dõi trạng thái xử lý và nhận thông báo kết quả. Đối với cán bộ, hệ thống hỗ trợ tiếp nhận, kiểm tra, phân loại, chuyển hồ sơ đến bộ phận chuyên môn, cập nhật tiến độ và thực hiện trả kết quả.</w:t>
@@ -3269,7 +3257,6 @@
     <w:p>
       <w:pPr>
         <w:ind w:firstLine="720"/>
-        <w:jc w:val="both"/>
       </w:pPr>
       <w:r>
         <w:t>Bên cạnh quy trình giải quyết hồ sơ, đề tài còn xem xét một số hoạt động hỗ trợ như quản lý tài khoản người dùng, lưu trữ tài liệu điện tử, thanh toán trực tuyến, tiếp nhận phản ánh kiến nghị, hỗ trợ người dùng, thống kê hồ sơ và lập báo cáo. Các nội dung này giúp hệ thống hỗ trợ đầy đủ hơn cho hoạt động quản lý và giải quyết thủ tục hành chính tại địa phương.</w:t>
@@ -3306,11 +3293,11 @@
         <w:ind w:firstLine="720"/>
       </w:pPr>
       <w:r>
-        <w:t xml:space="preserve">Nếu hồ sơ bị thiếu hoặc có thông tin chưa chính xác, người dân có thể phải bổ sung và chỉnh sửa nhiều lần. Bên cạnh đó, nếu chưa có công cụ quản lý phù hợp, </w:t>
+        <w:t xml:space="preserve">Nếu hồ sơ bị thiếu hoặc có thông tin chưa chính xác, người dân có thể phải bổ sung và chỉnh sửa nhiều lần. Bên cạnh đó, nếu chưa có công cụ quản lý phù hợp, người </w:t>
       </w:r>
       <w:r>
         <w:lastRenderedPageBreak/>
-        <w:t>người dân sẽ khó theo dõi hồ sơ đang được xử lý ở bước nào, do bộ phận nào phụ trách và khi nào có thể nhận kết quả.</w:t>
+        <w:t>dân sẽ khó theo dõi hồ sơ đang được xử lý ở bước nào, do bộ phận nào phụ trách và khi nào có thể nhận kết quả.</w:t>
       </w:r>
     </w:p>
     <w:p>
@@ -3775,7 +3762,7 @@
           </mc:Choice>
           <mc:Fallback>
             <w:pict>
-              <v:roundrect w14:anchorId="5E9EF0A7" id="Rectangle: Rounded Corners 3" o:spid="_x0000_s1026" style="position:absolute;margin-left:128.3pt;margin-top:15.9pt;width:107.35pt;height:63.3pt;z-index:251660288;visibility:visible;mso-wrap-style:square;mso-width-percent:0;mso-height-percent:0;mso-wrap-distance-left:9pt;mso-wrap-distance-top:0;mso-wrap-distance-right:9pt;mso-wrap-distance-bottom:0;mso-position-horizontal:absolute;mso-position-horizontal-relative:margin;mso-position-vertical:absolute;mso-position-vertical-relative:text;mso-width-percent:0;mso-height-percent:0;mso-width-relative:margin;mso-height-relative:margin;v-text-anchor:middle" arcsize="10923f" o:gfxdata="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" fillcolor="white [3201]" strokecolor="#e97132 [3205]" strokeweight="1pt">
+              <v:roundrect w14:anchorId="5E9EF0A7" id="Rectangle: Rounded Corners 3" o:spid="_x0000_s1026" style="position:absolute;left:0;text-align:left;margin-left:128.3pt;margin-top:15.9pt;width:107.35pt;height:63.3pt;z-index:251660288;visibility:visible;mso-wrap-style:square;mso-width-percent:0;mso-height-percent:0;mso-wrap-distance-left:9pt;mso-wrap-distance-top:0;mso-wrap-distance-right:9pt;mso-wrap-distance-bottom:0;mso-position-horizontal:absolute;mso-position-horizontal-relative:margin;mso-position-vertical:absolute;mso-position-vertical-relative:text;mso-width-percent:0;mso-height-percent:0;mso-width-relative:margin;mso-height-relative:margin;v-text-anchor:middle" arcsize="10923f" o:gfxdata="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" fillcolor="white [3201]" strokecolor="#e97132 [3205]" strokeweight="1pt">
                 <v:stroke joinstyle="miter"/>
                 <v:textbox>
                   <w:txbxContent>
@@ -3883,7 +3870,7 @@
           </mc:Choice>
           <mc:Fallback>
             <w:pict>
-              <v:roundrect w14:anchorId="4D55EC45" id="_x0000_s1027" style="position:absolute;margin-left:238.75pt;margin-top:15.6pt;width:108pt;height:64.8pt;z-index:251661312;visibility:visible;mso-wrap-style:square;mso-width-percent:0;mso-height-percent:0;mso-wrap-distance-left:9pt;mso-wrap-distance-top:0;mso-wrap-distance-right:9pt;mso-wrap-distance-bottom:0;mso-position-horizontal:absolute;mso-position-horizontal-relative:margin;mso-position-vertical:absolute;mso-position-vertical-relative:text;mso-width-percent:0;mso-height-percent:0;mso-width-relative:margin;mso-height-relative:margin;v-text-anchor:middle" arcsize="10923f" o:gfxdata="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" fillcolor="white [3201]" strokecolor="#e97132 [3205]" strokeweight="1pt">
+              <v:roundrect w14:anchorId="4D55EC45" id="_x0000_s1027" style="position:absolute;left:0;text-align:left;margin-left:238.75pt;margin-top:15.6pt;width:108pt;height:64.8pt;z-index:251661312;visibility:visible;mso-wrap-style:square;mso-width-percent:0;mso-height-percent:0;mso-wrap-distance-left:9pt;mso-wrap-distance-top:0;mso-wrap-distance-right:9pt;mso-wrap-distance-bottom:0;mso-position-horizontal:absolute;mso-position-horizontal-relative:margin;mso-position-vertical:absolute;mso-position-vertical-relative:text;mso-width-percent:0;mso-height-percent:0;mso-width-relative:margin;mso-height-relative:margin;v-text-anchor:middle" arcsize="10923f" o:gfxdata="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" fillcolor="white [3201]" strokecolor="#e97132 [3205]" strokeweight="1pt">
                 <v:stroke joinstyle="miter"/>
                 <v:textbox>
                   <w:txbxContent>
@@ -3985,7 +3972,7 @@
           </mc:Choice>
           <mc:Fallback>
             <w:pict>
-              <v:roundrect w14:anchorId="22DDEA62" id="_x0000_s1028" style="position:absolute;margin-left:98.7pt;margin-top:27.4pt;width:136.8pt;height:50.4pt;z-index:251662336;visibility:visible;mso-wrap-style:square;mso-width-percent:0;mso-height-percent:0;mso-wrap-distance-left:9pt;mso-wrap-distance-top:0;mso-wrap-distance-right:9pt;mso-wrap-distance-bottom:0;mso-position-horizontal:absolute;mso-position-horizontal-relative:margin;mso-position-vertical:absolute;mso-position-vertical-relative:text;mso-width-percent:0;mso-height-percent:0;mso-width-relative:margin;mso-height-relative:margin;v-text-anchor:middle" arcsize="10923f" o:gfxdata="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" fillcolor="white [3201]" strokecolor="#e97132 [3205]" strokeweight="1pt">
+              <v:roundrect w14:anchorId="22DDEA62" id="_x0000_s1028" style="position:absolute;left:0;text-align:left;margin-left:98.7pt;margin-top:27.4pt;width:136.8pt;height:50.4pt;z-index:251662336;visibility:visible;mso-wrap-style:square;mso-width-percent:0;mso-height-percent:0;mso-wrap-distance-left:9pt;mso-wrap-distance-top:0;mso-wrap-distance-right:9pt;mso-wrap-distance-bottom:0;mso-position-horizontal:absolute;mso-position-horizontal-relative:margin;mso-position-vertical:absolute;mso-position-vertical-relative:text;mso-width-percent:0;mso-height-percent:0;mso-width-relative:margin;mso-height-relative:margin;v-text-anchor:middle" arcsize="10923f" o:gfxdata="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" fillcolor="white [3201]" strokecolor="#e97132 [3205]" strokeweight="1pt">
                 <v:stroke joinstyle="miter"/>
                 <v:textbox>
                   <w:txbxContent>
@@ -4086,7 +4073,7 @@
           </mc:Choice>
           <mc:Fallback>
             <w:pict>
-              <v:roundrect w14:anchorId="515FFA2D" id="_x0000_s1029" style="position:absolute;margin-left:238.25pt;margin-top:.7pt;width:136.8pt;height:50.4pt;z-index:251664384;visibility:visible;mso-wrap-style:square;mso-width-percent:0;mso-height-percent:0;mso-wrap-distance-left:9pt;mso-wrap-distance-top:0;mso-wrap-distance-right:9pt;mso-wrap-distance-bottom:0;mso-position-horizontal:absolute;mso-position-horizontal-relative:margin;mso-position-vertical:absolute;mso-position-vertical-relative:text;mso-width-percent:0;mso-height-percent:0;mso-width-relative:margin;mso-height-relative:margin;v-text-anchor:middle" arcsize="10923f" o:gfxdata="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" fillcolor="white [3201]" strokecolor="#e97132 [3205]" strokeweight="1pt">
+              <v:roundrect w14:anchorId="515FFA2D" id="_x0000_s1029" style="position:absolute;left:0;text-align:left;margin-left:238.25pt;margin-top:.7pt;width:136.8pt;height:50.4pt;z-index:251664384;visibility:visible;mso-wrap-style:square;mso-width-percent:0;mso-height-percent:0;mso-wrap-distance-left:9pt;mso-wrap-distance-top:0;mso-wrap-distance-right:9pt;mso-wrap-distance-bottom:0;mso-position-horizontal:absolute;mso-position-horizontal-relative:margin;mso-position-vertical:absolute;mso-position-vertical-relative:text;mso-width-percent:0;mso-height-percent:0;mso-width-relative:margin;mso-height-relative:margin;v-text-anchor:middle" arcsize="10923f" o:gfxdata="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" fillcolor="white [3201]" strokecolor="#e97132 [3205]" strokeweight="1pt">
                 <v:stroke joinstyle="miter"/>
                 <v:textbox>
                   <w:txbxContent>
@@ -4200,7 +4187,7 @@
           </mc:Choice>
           <mc:Fallback>
             <w:pict>
-              <v:rect w14:anchorId="22CEA129" id="Rectangle 9" o:spid="_x0000_s1030" style="position:absolute;margin-left:0;margin-top:17pt;width:148.2pt;height:26.25pt;z-index:251663360;visibility:visible;mso-wrap-style:square;mso-width-percent:0;mso-height-percent:0;mso-wrap-distance-left:9pt;mso-wrap-distance-top:0;mso-wrap-distance-right:9pt;mso-wrap-distance-bottom:0;mso-position-horizontal:absolute;mso-position-horizontal-relative:margin;mso-position-vertical:absolute;mso-position-vertical-relative:text;mso-width-percent:0;mso-height-percent:0;mso-width-relative:margin;mso-height-relative:margin;v-text-anchor:middle" o:gfxdata="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" filled="f" stroked="f">
+              <v:rect w14:anchorId="22CEA129" id="Rectangle 9" o:spid="_x0000_s1030" style="position:absolute;left:0;text-align:left;margin-left:0;margin-top:17pt;width:148.2pt;height:26.25pt;z-index:251663360;visibility:visible;mso-wrap-style:square;mso-width-percent:0;mso-height-percent:0;mso-wrap-distance-left:9pt;mso-wrap-distance-top:0;mso-wrap-distance-right:9pt;mso-wrap-distance-bottom:0;mso-position-horizontal:absolute;mso-position-horizontal-relative:margin;mso-position-vertical:absolute;mso-position-vertical-relative:text;mso-width-percent:0;mso-height-percent:0;mso-width-relative:margin;mso-height-relative:margin;v-text-anchor:middle" o:gfxdata="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" filled="f" stroked="f">
                 <v:textbox>
                   <w:txbxContent>
                     <w:p>
@@ -4319,7 +4306,7 @@
           </mc:Choice>
           <mc:Fallback>
             <w:pict>
-              <v:rect w14:anchorId="3DD4E6E8" id="Rectangle 10" o:spid="_x0000_s1031" style="position:absolute;margin-left:-17pt;margin-top:16.5pt;width:507.2pt;height:145.5pt;z-index:251665408;visibility:visible;mso-wrap-style:square;mso-width-percent:0;mso-height-percent:0;mso-wrap-distance-left:9pt;mso-wrap-distance-top:0;mso-wrap-distance-right:9pt;mso-wrap-distance-bottom:0;mso-position-horizontal:absolute;mso-position-horizontal-relative:margin;mso-position-vertical:absolute;mso-position-vertical-relative:text;mso-width-percent:0;mso-height-percent:0;mso-width-relative:margin;mso-height-relative:margin;v-text-anchor:middle" o:gfxdata="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" fillcolor="#8dd873 [1945]" strokecolor="white [3212]" strokeweight=".5pt">
+              <v:rect w14:anchorId="3DD4E6E8" id="Rectangle 10" o:spid="_x0000_s1031" style="position:absolute;left:0;text-align:left;margin-left:-17pt;margin-top:16.5pt;width:507.2pt;height:145.5pt;z-index:251665408;visibility:visible;mso-wrap-style:square;mso-width-percent:0;mso-height-percent:0;mso-wrap-distance-left:9pt;mso-wrap-distance-top:0;mso-wrap-distance-right:9pt;mso-wrap-distance-bottom:0;mso-position-horizontal:absolute;mso-position-horizontal-relative:margin;mso-position-vertical:absolute;mso-position-vertical-relative:text;mso-width-percent:0;mso-height-percent:0;mso-width-relative:margin;mso-height-relative:margin;v-text-anchor:middle" o:gfxdata="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" fillcolor="#8dd873 [1945]" strokecolor="white [3212]" strokeweight=".5pt">
                 <v:textbox>
                   <w:txbxContent>
                     <w:p>
@@ -4421,7 +4408,7 @@
           </mc:Choice>
           <mc:Fallback>
             <w:pict>
-              <v:roundrect w14:anchorId="6174EB2C" id="_x0000_s1032" style="position:absolute;margin-left:241.9pt;margin-top:25.7pt;width:136.8pt;height:50.4pt;z-index:251667456;visibility:visible;mso-wrap-style:square;mso-width-percent:0;mso-height-percent:0;mso-wrap-distance-left:9pt;mso-wrap-distance-top:0;mso-wrap-distance-right:9pt;mso-wrap-distance-bottom:0;mso-position-horizontal:absolute;mso-position-horizontal-relative:margin;mso-position-vertical:absolute;mso-position-vertical-relative:text;mso-width-percent:0;mso-height-percent:0;mso-width-relative:margin;mso-height-relative:margin;v-text-anchor:middle" arcsize="10923f" o:gfxdata="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" fillcolor="white [3201]" strokecolor="white [3212]" strokeweight="1pt">
+              <v:roundrect w14:anchorId="6174EB2C" id="_x0000_s1032" style="position:absolute;left:0;text-align:left;margin-left:241.9pt;margin-top:25.7pt;width:136.8pt;height:50.4pt;z-index:251667456;visibility:visible;mso-wrap-style:square;mso-width-percent:0;mso-height-percent:0;mso-wrap-distance-left:9pt;mso-wrap-distance-top:0;mso-wrap-distance-right:9pt;mso-wrap-distance-bottom:0;mso-position-horizontal:absolute;mso-position-horizontal-relative:margin;mso-position-vertical:absolute;mso-position-vertical-relative:text;mso-width-percent:0;mso-height-percent:0;mso-width-relative:margin;mso-height-relative:margin;v-text-anchor:middle" arcsize="10923f" o:gfxdata="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" fillcolor="white [3201]" strokecolor="white [3212]" strokeweight="1pt">
                 <v:stroke joinstyle="miter"/>
                 <v:textbox>
                   <w:txbxContent>
@@ -4543,7 +4530,7 @@
           </mc:Choice>
           <mc:Fallback>
             <w:pict>
-              <v:roundrect w14:anchorId="026D1C60" id="_x0000_s1033" style="position:absolute;margin-left:94.6pt;margin-top:25.15pt;width:136.8pt;height:50.4pt;z-index:251666432;visibility:visible;mso-wrap-style:square;mso-width-percent:0;mso-height-percent:0;mso-wrap-distance-left:9pt;mso-wrap-distance-top:0;mso-wrap-distance-right:9pt;mso-wrap-distance-bottom:0;mso-position-horizontal:absolute;mso-position-horizontal-relative:margin;mso-position-vertical:absolute;mso-position-vertical-relative:text;mso-width-percent:0;mso-height-percent:0;mso-width-relative:margin;mso-height-relative:margin;v-text-anchor:middle" arcsize="10923f" o:gfxdata="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" fillcolor="white [3201]" strokecolor="white [3212]" strokeweight="1pt">
+              <v:roundrect w14:anchorId="026D1C60" id="_x0000_s1033" style="position:absolute;left:0;text-align:left;margin-left:94.6pt;margin-top:25.15pt;width:136.8pt;height:50.4pt;z-index:251666432;visibility:visible;mso-wrap-style:square;mso-width-percent:0;mso-height-percent:0;mso-wrap-distance-left:9pt;mso-wrap-distance-top:0;mso-wrap-distance-right:9pt;mso-wrap-distance-bottom:0;mso-position-horizontal:absolute;mso-position-horizontal-relative:margin;mso-position-vertical:absolute;mso-position-vertical-relative:text;mso-width-percent:0;mso-height-percent:0;mso-width-relative:margin;mso-height-relative:margin;v-text-anchor:middle" arcsize="10923f" o:gfxdata="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" fillcolor="white [3201]" strokecolor="white [3212]" strokeweight="1pt">
                 <v:stroke joinstyle="miter"/>
                 <v:textbox>
                   <w:txbxContent>
@@ -4676,7 +4663,7 @@
           </mc:Choice>
           <mc:Fallback>
             <w:pict>
-              <v:roundrect w14:anchorId="53444017" id="_x0000_s1034" style="position:absolute;margin-left:240.45pt;margin-top:1.45pt;width:136.8pt;height:64.8pt;z-index:251672576;visibility:visible;mso-wrap-style:square;mso-width-percent:0;mso-height-percent:0;mso-wrap-distance-left:9pt;mso-wrap-distance-top:0;mso-wrap-distance-right:9pt;mso-wrap-distance-bottom:0;mso-position-horizontal:absolute;mso-position-horizontal-relative:margin;mso-position-vertical:absolute;mso-position-vertical-relative:text;mso-width-percent:0;mso-height-percent:0;mso-width-relative:margin;mso-height-relative:margin;v-text-anchor:middle" arcsize="10923f" o:gfxdata="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" fillcolor="white [3201]" strokecolor="white [3212]" strokeweight="1pt">
+              <v:roundrect w14:anchorId="53444017" id="_x0000_s1034" style="position:absolute;left:0;text-align:left;margin-left:240.45pt;margin-top:1.45pt;width:136.8pt;height:64.8pt;z-index:251672576;visibility:visible;mso-wrap-style:square;mso-width-percent:0;mso-height-percent:0;mso-wrap-distance-left:9pt;mso-wrap-distance-top:0;mso-wrap-distance-right:9pt;mso-wrap-distance-bottom:0;mso-position-horizontal:absolute;mso-position-horizontal-relative:margin;mso-position-vertical:absolute;mso-position-vertical-relative:text;mso-width-percent:0;mso-height-percent:0;mso-width-relative:margin;mso-height-relative:margin;v-text-anchor:middle" arcsize="10923f" o:gfxdata="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" fillcolor="white [3201]" strokecolor="white [3212]" strokeweight="1pt">
                 <v:stroke joinstyle="miter"/>
                 <v:textbox>
                   <w:txbxContent>
@@ -4787,7 +4774,7 @@
           </mc:Choice>
           <mc:Fallback>
             <w:pict>
-              <v:roundrect w14:anchorId="63375CA1" id="_x0000_s1035" style="position:absolute;margin-left:94.5pt;margin-top:.8pt;width:136.8pt;height:64.8pt;z-index:251668480;visibility:visible;mso-wrap-style:square;mso-width-percent:0;mso-height-percent:0;mso-wrap-distance-left:9pt;mso-wrap-distance-top:0;mso-wrap-distance-right:9pt;mso-wrap-distance-bottom:0;mso-position-horizontal:absolute;mso-position-horizontal-relative:margin;mso-position-vertical:absolute;mso-position-vertical-relative:text;mso-width-percent:0;mso-height-percent:0;mso-width-relative:margin;mso-height-relative:margin;v-text-anchor:middle" arcsize="10923f" o:gfxdata="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" fillcolor="white [3201]" strokecolor="white [3212]" strokeweight="1pt">
+              <v:roundrect w14:anchorId="63375CA1" id="_x0000_s1035" style="position:absolute;left:0;text-align:left;margin-left:94.5pt;margin-top:.8pt;width:136.8pt;height:64.8pt;z-index:251668480;visibility:visible;mso-wrap-style:square;mso-width-percent:0;mso-height-percent:0;mso-wrap-distance-left:9pt;mso-wrap-distance-top:0;mso-wrap-distance-right:9pt;mso-wrap-distance-bottom:0;mso-position-horizontal:absolute;mso-position-horizontal-relative:margin;mso-position-vertical:absolute;mso-position-vertical-relative:text;mso-width-percent:0;mso-height-percent:0;mso-width-relative:margin;mso-height-relative:margin;v-text-anchor:middle" arcsize="10923f" o:gfxdata="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" fillcolor="white [3201]" strokecolor="white [3212]" strokeweight="1pt">
                 <v:stroke joinstyle="miter"/>
                 <v:textbox>
                   <w:txbxContent>
@@ -4903,7 +4890,7 @@
           </mc:Choice>
           <mc:Fallback>
             <w:pict>
-              <v:rect w14:anchorId="62854275" id="Rectangle 15" o:spid="_x0000_s1036" style="position:absolute;margin-left:-17.95pt;margin-top:31.05pt;width:507.85pt;height:139.85pt;z-index:251669504;visibility:visible;mso-wrap-style:square;mso-width-percent:0;mso-height-percent:0;mso-wrap-distance-left:9pt;mso-wrap-distance-top:0;mso-wrap-distance-right:9pt;mso-wrap-distance-bottom:0;mso-position-horizontal:absolute;mso-position-horizontal-relative:margin;mso-position-vertical:absolute;mso-position-vertical-relative:text;mso-width-percent:0;mso-height-percent:0;mso-width-relative:margin;mso-height-relative:margin;v-text-anchor:middle" o:gfxdata="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" fillcolor="#4e95d9 [1631]" strokecolor="white [3212]">
+              <v:rect w14:anchorId="62854275" id="Rectangle 15" o:spid="_x0000_s1036" style="position:absolute;left:0;text-align:left;margin-left:-17.95pt;margin-top:31.05pt;width:507.85pt;height:139.85pt;z-index:251669504;visibility:visible;mso-wrap-style:square;mso-width-percent:0;mso-height-percent:0;mso-wrap-distance-left:9pt;mso-wrap-distance-top:0;mso-wrap-distance-right:9pt;mso-wrap-distance-bottom:0;mso-position-horizontal:absolute;mso-position-horizontal-relative:margin;mso-position-vertical:absolute;mso-position-vertical-relative:text;mso-width-percent:0;mso-height-percent:0;mso-width-relative:margin;mso-height-relative:margin;v-text-anchor:middle" o:gfxdata="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" fillcolor="#4e95d9 [1631]" strokecolor="white [3212]">
                 <v:stroke joinstyle="round"/>
                 <v:textbox>
                   <w:txbxContent>
@@ -5014,7 +5001,7 @@
           </mc:Choice>
           <mc:Fallback>
             <w:pict>
-              <v:rect w14:anchorId="72272C58" id="_x0000_s1037" style="position:absolute;margin-left:0;margin-top:6pt;width:128.35pt;height:26.25pt;z-index:251673600;visibility:visible;mso-wrap-style:square;mso-width-percent:0;mso-height-percent:0;mso-wrap-distance-left:9pt;mso-wrap-distance-top:0;mso-wrap-distance-right:9pt;mso-wrap-distance-bottom:0;mso-position-horizontal:left;mso-position-horizontal-relative:margin;mso-position-vertical:absolute;mso-position-vertical-relative:text;mso-width-percent:0;mso-height-percent:0;mso-width-relative:margin;mso-height-relative:margin;v-text-anchor:middle" o:gfxdata="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" filled="f" stroked="f">
+              <v:rect w14:anchorId="72272C58" id="_x0000_s1037" style="position:absolute;left:0;text-align:left;margin-left:0;margin-top:6pt;width:128.35pt;height:26.25pt;z-index:251673600;visibility:visible;mso-wrap-style:square;mso-width-percent:0;mso-height-percent:0;mso-wrap-distance-left:9pt;mso-wrap-distance-top:0;mso-wrap-distance-right:9pt;mso-wrap-distance-bottom:0;mso-position-horizontal:left;mso-position-horizontal-relative:margin;mso-position-vertical:absolute;mso-position-vertical-relative:text;mso-width-percent:0;mso-height-percent:0;mso-width-relative:margin;mso-height-relative:margin;v-text-anchor:middle" o:gfxdata="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" filled="f" stroked="f">
                 <v:textbox>
                   <w:txbxContent>
                     <w:p>
@@ -5145,7 +5132,7 @@
           </mc:Choice>
           <mc:Fallback>
             <w:pict>
-              <v:roundrect w14:anchorId="3675EB6C" id="_x0000_s1038" style="position:absolute;margin-left:13.85pt;margin-top:13.5pt;width:136.8pt;height:50.4pt;z-index:251676672;visibility:visible;mso-wrap-style:square;mso-width-percent:0;mso-height-percent:0;mso-wrap-distance-left:9pt;mso-wrap-distance-top:0;mso-wrap-distance-right:9pt;mso-wrap-distance-bottom:0;mso-position-horizontal:absolute;mso-position-horizontal-relative:margin;mso-position-vertical:absolute;mso-position-vertical-relative:text;mso-width-percent:0;mso-height-percent:0;mso-width-relative:margin;mso-height-relative:margin;v-text-anchor:middle" arcsize="10923f" o:gfxdata="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" fillcolor="white [3212]" strokecolor="white [3212]" strokeweight="1pt">
+              <v:roundrect w14:anchorId="3675EB6C" id="_x0000_s1038" style="position:absolute;left:0;text-align:left;margin-left:13.85pt;margin-top:13.5pt;width:136.8pt;height:50.4pt;z-index:251676672;visibility:visible;mso-wrap-style:square;mso-width-percent:0;mso-height-percent:0;mso-wrap-distance-left:9pt;mso-wrap-distance-top:0;mso-wrap-distance-right:9pt;mso-wrap-distance-bottom:0;mso-position-horizontal:absolute;mso-position-horizontal-relative:margin;mso-position-vertical:absolute;mso-position-vertical-relative:text;mso-width-percent:0;mso-height-percent:0;mso-width-relative:margin;mso-height-relative:margin;v-text-anchor:middle" arcsize="10923f" o:gfxdata="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" fillcolor="white [3212]" strokecolor="white [3212]" strokeweight="1pt">
                 <v:stroke joinstyle="miter"/>
                 <v:textbox>
                   <w:txbxContent>
@@ -5263,7 +5250,7 @@
           </mc:Choice>
           <mc:Fallback>
             <w:pict>
-              <v:roundrect w14:anchorId="696E196D" id="_x0000_s1039" style="position:absolute;margin-left:320.35pt;margin-top:13.5pt;width:136.8pt;height:50.4pt;z-index:251677696;visibility:visible;mso-wrap-style:square;mso-width-percent:0;mso-height-percent:0;mso-wrap-distance-left:9pt;mso-wrap-distance-top:0;mso-wrap-distance-right:9pt;mso-wrap-distance-bottom:0;mso-position-horizontal:absolute;mso-position-horizontal-relative:margin;mso-position-vertical:absolute;mso-position-vertical-relative:text;mso-width-percent:0;mso-height-percent:0;mso-width-relative:margin;mso-height-relative:margin;v-text-anchor:middle" arcsize="10923f" o:gfxdata="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" fillcolor="white [3201]" strokecolor="white [3212]" strokeweight="1pt">
+              <v:roundrect w14:anchorId="696E196D" id="_x0000_s1039" style="position:absolute;left:0;text-align:left;margin-left:320.35pt;margin-top:13.5pt;width:136.8pt;height:50.4pt;z-index:251677696;visibility:visible;mso-wrap-style:square;mso-width-percent:0;mso-height-percent:0;mso-wrap-distance-left:9pt;mso-wrap-distance-top:0;mso-wrap-distance-right:9pt;mso-wrap-distance-bottom:0;mso-position-horizontal:absolute;mso-position-horizontal-relative:margin;mso-position-vertical:absolute;mso-position-vertical-relative:text;mso-width-percent:0;mso-height-percent:0;mso-width-relative:margin;mso-height-relative:margin;v-text-anchor:middle" arcsize="10923f" o:gfxdata="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" fillcolor="white [3201]" strokecolor="white [3212]" strokeweight="1pt">
                 <v:stroke joinstyle="miter"/>
                 <v:textbox>
                   <w:txbxContent>
@@ -5374,7 +5361,7 @@
           </mc:Choice>
           <mc:Fallback>
             <w:pict>
-              <v:roundrect w14:anchorId="0483813B" id="_x0000_s1040" style="position:absolute;margin-left:167.55pt;margin-top:13.5pt;width:136.8pt;height:50.4pt;z-index:251671552;visibility:visible;mso-wrap-style:square;mso-width-percent:0;mso-height-percent:0;mso-wrap-distance-left:9pt;mso-wrap-distance-top:0;mso-wrap-distance-right:9pt;mso-wrap-distance-bottom:0;mso-position-horizontal:absolute;mso-position-horizontal-relative:margin;mso-position-vertical:absolute;mso-position-vertical-relative:text;mso-width-percent:0;mso-height-percent:0;mso-width-relative:margin;mso-height-relative:margin;v-text-anchor:middle" arcsize="10923f" o:gfxdata="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" fillcolor="white [3212]" strokecolor="white [3212]" strokeweight="1pt">
+              <v:roundrect w14:anchorId="0483813B" id="_x0000_s1040" style="position:absolute;left:0;text-align:left;margin-left:167.55pt;margin-top:13.5pt;width:136.8pt;height:50.4pt;z-index:251671552;visibility:visible;mso-wrap-style:square;mso-width-percent:0;mso-height-percent:0;mso-wrap-distance-left:9pt;mso-wrap-distance-top:0;mso-wrap-distance-right:9pt;mso-wrap-distance-bottom:0;mso-position-horizontal:absolute;mso-position-horizontal-relative:margin;mso-position-vertical:absolute;mso-position-vertical-relative:text;mso-width-percent:0;mso-height-percent:0;mso-width-relative:margin;mso-height-relative:margin;v-text-anchor:middle" arcsize="10923f" o:gfxdata="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" fillcolor="white [3212]" strokecolor="white [3212]" strokeweight="1pt">
                 <v:stroke joinstyle="miter"/>
                 <v:textbox>
                   <w:txbxContent>
@@ -5485,7 +5472,7 @@
           </mc:Choice>
           <mc:Fallback>
             <w:pict>
-              <v:roundrect w14:anchorId="0219688F" id="_x0000_s1041" style="position:absolute;margin-left:249.25pt;margin-top:17.25pt;width:136.8pt;height:50.4pt;z-index:251670528;visibility:visible;mso-wrap-style:square;mso-width-percent:0;mso-height-percent:0;mso-wrap-distance-left:9pt;mso-wrap-distance-top:0;mso-wrap-distance-right:9pt;mso-wrap-distance-bottom:0;mso-position-horizontal:absolute;mso-position-horizontal-relative:margin;mso-position-vertical:absolute;mso-position-vertical-relative:text;mso-width-percent:0;mso-height-percent:0;mso-width-relative:margin;mso-height-relative:margin;v-text-anchor:middle" arcsize="10923f" o:gfxdata="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" fillcolor="white [3201]" strokecolor="white [3212]" strokeweight="1pt">
+              <v:roundrect w14:anchorId="0219688F" id="_x0000_s1041" style="position:absolute;left:0;text-align:left;margin-left:249.25pt;margin-top:17.25pt;width:136.8pt;height:50.4pt;z-index:251670528;visibility:visible;mso-wrap-style:square;mso-width-percent:0;mso-height-percent:0;mso-wrap-distance-left:9pt;mso-wrap-distance-top:0;mso-wrap-distance-right:9pt;mso-wrap-distance-bottom:0;mso-position-horizontal:absolute;mso-position-horizontal-relative:margin;mso-position-vertical:absolute;mso-position-vertical-relative:text;mso-width-percent:0;mso-height-percent:0;mso-width-relative:margin;mso-height-relative:margin;v-text-anchor:middle" arcsize="10923f" o:gfxdata="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" fillcolor="white [3201]" strokecolor="white [3212]" strokeweight="1pt">
                 <v:stroke joinstyle="miter"/>
                 <v:textbox>
                   <w:txbxContent>
@@ -5596,7 +5583,7 @@
           </mc:Choice>
           <mc:Fallback>
             <w:pict>
-              <v:roundrect w14:anchorId="04D0C70C" id="_x0000_s1042" style="position:absolute;margin-left:93.25pt;margin-top:17.25pt;width:136.8pt;height:50.4pt;z-index:251675648;visibility:visible;mso-wrap-style:square;mso-width-percent:0;mso-height-percent:0;mso-wrap-distance-left:9pt;mso-wrap-distance-top:0;mso-wrap-distance-right:9pt;mso-wrap-distance-bottom:0;mso-position-horizontal:absolute;mso-position-horizontal-relative:margin;mso-position-vertical:absolute;mso-position-vertical-relative:text;mso-width-percent:0;mso-height-percent:0;mso-width-relative:margin;mso-height-relative:margin;v-text-anchor:middle" arcsize="10923f" o:gfxdata="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" fillcolor="white [3212]" strokecolor="white [3212]" strokeweight="1pt">
+              <v:roundrect w14:anchorId="04D0C70C" id="_x0000_s1042" style="position:absolute;left:0;text-align:left;margin-left:93.25pt;margin-top:17.25pt;width:136.8pt;height:50.4pt;z-index:251675648;visibility:visible;mso-wrap-style:square;mso-width-percent:0;mso-height-percent:0;mso-wrap-distance-left:9pt;mso-wrap-distance-top:0;mso-wrap-distance-right:9pt;mso-wrap-distance-bottom:0;mso-position-horizontal:absolute;mso-position-horizontal-relative:margin;mso-position-vertical:absolute;mso-position-vertical-relative:text;mso-width-percent:0;mso-height-percent:0;mso-width-relative:margin;mso-height-relative:margin;v-text-anchor:middle" arcsize="10923f" o:gfxdata="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" fillcolor="white [3212]" strokecolor="white [3212]" strokeweight="1pt">
                 <v:stroke joinstyle="miter"/>
                 <v:textbox>
                   <w:txbxContent>
@@ -5630,7 +5617,6 @@
     </w:p>
     <w:p>
       <w:pPr>
-        <w:jc w:val="both"/>
         <w:rPr>
           <w:rFonts w:cs="Times New Roman"/>
           <w:szCs w:val="26"/>
@@ -5868,6 +5854,57 @@
     </w:p>
     <w:p>
       <w:pPr>
+        <w:keepNext/>
+      </w:pPr>
+      <w:r>
+        <w:rPr>
+          <w:b/>
+          <w:bCs/>
+        </w:rPr>
+        <w:t>Tác nhân thực hiện:</w:t>
+      </w:r>
+      <w:r>
+        <w:t> </w:t>
+      </w:r>
+    </w:p>
+    <w:p>
+      <w:pPr>
+        <w:keepNext/>
+        <w:ind w:firstLine="720"/>
+      </w:pPr>
+      <w:r>
+        <w:t>Người nộp hồ sơ: Tra cứu thủ tục, chuẩn bị hồ sơ, nộp hồ sơ và nhận phiếu hẹn trả kết quả. </w:t>
+      </w:r>
+    </w:p>
+    <w:p>
+      <w:pPr>
+        <w:keepNext/>
+        <w:ind w:firstLine="720"/>
+      </w:pPr>
+      <w:r>
+        <w:t>Công chức Bộ phận Một cửa: Tiếp nhận hồ sơ, kiểm tra thành phần và tính hợp lệ ban đầu, nhập thông tin hồ sơ vào hệ thống, xác nhận tiếp nhận và lập Phiếu kiểm soát quá trình giải quyết hồ sơ.  </w:t>
+      </w:r>
+    </w:p>
+    <w:p>
+      <w:pPr>
+        <w:keepNext/>
+        <w:ind w:firstLine="720"/>
+      </w:pPr>
+      <w:r>
+        <w:t>Hệ thống thông tin giải quyết TTHC: Lưu thông tin hồ sơ, cấp mã hồ sơ, cập nhật trạng thái và hỗ trợ lập/in/gửi Phiếu tiếp nhận hồ sơ và hẹn trả kết quả.  </w:t>
+      </w:r>
+    </w:p>
+    <w:p>
+      <w:pPr>
+        <w:keepNext/>
+        <w:ind w:firstLine="720"/>
+      </w:pPr>
+      <w:r>
+        <w:t>Công chức/Đơn vị chuyên môn: Nhận hồ sơ sau khi được Bộ phận Một cửa tiếp nhận để tiếp tục kiểm tra, thẩm định và xử lý theo quy định.</w:t>
+      </w:r>
+    </w:p>
+    <w:p>
+      <w:pPr>
         <w:pStyle w:val="Caption"/>
       </w:pPr>
       <w:bookmarkStart w:id="17" w:name="_Toc236263980"/>
@@ -5899,6 +5936,397 @@
         <w:t>. Quy trình tiếp nhận hồ sơ</w:t>
       </w:r>
       <w:bookmarkEnd w:id="17"/>
+    </w:p>
+    <w:p>
+      <w:pPr>
+        <w:keepNext/>
+        <w:rPr>
+          <w:b/>
+          <w:bCs/>
+        </w:rPr>
+      </w:pPr>
+      <w:r>
+        <w:rPr>
+          <w:b/>
+          <w:bCs/>
+        </w:rPr>
+        <w:t>Mô tả quy trình:</w:t>
+      </w:r>
+    </w:p>
+    <w:p>
+      <w:pPr>
+        <w:keepNext/>
+        <w:ind w:firstLine="720"/>
+        <w:rPr>
+          <w:b/>
+          <w:bCs/>
+        </w:rPr>
+      </w:pPr>
+      <w:r>
+        <w:t>Bước 1. Tra cứu thủ tục</w:t>
+      </w:r>
+    </w:p>
+    <w:p>
+      <w:pPr>
+        <w:keepNext/>
+        <w:ind w:left="720" w:firstLine="720"/>
+      </w:pPr>
+      <w:r>
+        <w:t>Người nộp hồ sơ tra cứu thông tin về thủ tục hành chính cần thực hiện. Nội dung tra cứu bao gồm thành phần hồ sơ, số lượng giấy tờ, hình thức nộp, thời hạn giải quyết, phí hoặc lệ phí và cơ quan có thẩm quyền tiếp nhận.</w:t>
+      </w:r>
+    </w:p>
+    <w:p>
+      <w:pPr>
+        <w:keepNext/>
+        <w:ind w:left="720" w:firstLine="720"/>
+      </w:pPr>
+      <w:r>
+        <w:t>Việc tra cứu có thể thực hiện trên Cổng dịch vụ công, tại Bộ phận Một cửa hoặc thông qua hướng dẫn của cán bộ.</w:t>
+      </w:r>
+    </w:p>
+    <w:p>
+      <w:pPr>
+        <w:keepNext/>
+        <w:ind w:firstLine="720"/>
+        <w:rPr>
+          <w:b/>
+          <w:bCs/>
+        </w:rPr>
+      </w:pPr>
+      <w:r>
+        <w:t>Bước 2. Chuẩn bị hồ sơ</w:t>
+      </w:r>
+    </w:p>
+    <w:p>
+      <w:pPr>
+        <w:keepNext/>
+        <w:ind w:left="720" w:firstLine="720"/>
+      </w:pPr>
+      <w:r>
+        <w:t>Sau khi xác định đúng thủ tục, Người nộp hồ sơ tra chuẩn bị các tờ khai, giấy tờ và tài liệu theo quy định.</w:t>
+      </w:r>
+    </w:p>
+    <w:p>
+      <w:pPr>
+        <w:keepNext/>
+        <w:ind w:left="720" w:firstLine="720"/>
+      </w:pPr>
+      <w:r>
+        <w:t>Người nộp cần kiểm tra các thông tin bắt buộc, ký xác nhận khi cần và chuẩn bị bản chính, bản sao hoặc tệp điện tử tương ứng với hình thức nộp hồ sơ.</w:t>
+      </w:r>
+    </w:p>
+    <w:p>
+      <w:r>
+        <w:tab/>
+      </w:r>
+      <w:r>
+        <w:t>Bước 3. Nộp hồ sơ</w:t>
+      </w:r>
+    </w:p>
+    <w:p>
+      <w:pPr>
+        <w:ind w:left="1440"/>
+      </w:pPr>
+      <w:r>
+        <w:t>Người nộp hồ sơ tra nộp hồ sơ cho cơ quan có thẩm quyền.</w:t>
+      </w:r>
+    </w:p>
+    <w:p>
+      <w:pPr>
+        <w:ind w:left="1440"/>
+      </w:pPr>
+      <w:r>
+        <w:lastRenderedPageBreak/>
+        <w:t>Hồ sơ có thể được nộp:</w:t>
+      </w:r>
+    </w:p>
+    <w:p>
+      <w:pPr>
+        <w:pStyle w:val="ListParagraph"/>
+        <w:numPr>
+          <w:ilvl w:val="0"/>
+          <w:numId w:val="32"/>
+        </w:numPr>
+      </w:pPr>
+      <w:r>
+        <w:t>Trực tiếp tại Bộ phận Một cửa;</w:t>
+      </w:r>
+    </w:p>
+    <w:p>
+      <w:pPr>
+        <w:pStyle w:val="ListParagraph"/>
+        <w:numPr>
+          <w:ilvl w:val="0"/>
+          <w:numId w:val="32"/>
+        </w:numPr>
+      </w:pPr>
+      <w:r>
+        <w:t>Trực tuyến trên hệ thống;</w:t>
+      </w:r>
+    </w:p>
+    <w:p>
+      <w:pPr>
+        <w:pStyle w:val="ListParagraph"/>
+        <w:numPr>
+          <w:ilvl w:val="0"/>
+          <w:numId w:val="32"/>
+        </w:numPr>
+        <w:tabs>
+          <w:tab w:val="num" w:pos="2160"/>
+        </w:tabs>
+      </w:pPr>
+      <w:r>
+        <w:t>Qua dịch vụ bưu chính, nếu thủ tục cho phép.</w:t>
+      </w:r>
+    </w:p>
+    <w:p>
+      <w:pPr>
+        <w:pStyle w:val="NormalWeb"/>
+        <w:spacing w:before="0" w:beforeAutospacing="0" w:after="200" w:afterAutospacing="0"/>
+        <w:ind w:left="720" w:firstLine="720"/>
+        <w:rPr>
+          <w:color w:val="000000"/>
+          <w:sz w:val="26"/>
+          <w:szCs w:val="26"/>
+        </w:rPr>
+      </w:pPr>
+      <w:r>
+        <w:rPr>
+          <w:color w:val="000000"/>
+          <w:sz w:val="26"/>
+          <w:szCs w:val="26"/>
+        </w:rPr>
+        <w:t>Sau khi nhận hồ sơ, cán bộ Một cửa ghi nhận thông tin người nộp và nội dung yêu cầu giải quyết.</w:t>
+      </w:r>
+    </w:p>
+    <w:p>
+      <w:pPr>
+        <w:ind w:left="720"/>
+        <w:rPr>
+          <w:b/>
+          <w:bCs/>
+        </w:rPr>
+      </w:pPr>
+      <w:r>
+        <w:t>Bước 4. Tiếp nhận hồ sơ</w:t>
+      </w:r>
+    </w:p>
+    <w:p>
+      <w:pPr>
+        <w:ind w:left="720" w:firstLine="720"/>
+      </w:pPr>
+      <w:r>
+        <w:t>Cán bộ Bộ phận Một cửa tiếp nhận hồ sơ do cá nhân/tổ chức nộp và ghi nhận các thông tin ban đầu của người nộp, thủ tục hành chính yêu cầu giải quyết và hình thức nộp hồ sơ.</w:t>
+      </w:r>
+    </w:p>
+    <w:p>
+      <w:pPr>
+        <w:ind w:left="720" w:firstLine="720"/>
+      </w:pPr>
+      <w:r>
+        <w:t>Trường hợp cần thiết, cán bộ kiểm tra hoặc hỗ trợ người nộp về tài khoản trên Cổng Dịch vụ công và hệ thống giải quyết thủ tục hành chính.</w:t>
+      </w:r>
+    </w:p>
+    <w:p>
+      <w:pPr>
+        <w:ind w:left="720" w:firstLine="720"/>
+      </w:pPr>
+      <w:r>
+        <w:t>Sau đó hồ sơ được chuyển sang bước kiểm tra thành phần, tính đầy đủ, hợp lệ và thẩm quyền tiếp nhận.</w:t>
+      </w:r>
+    </w:p>
+    <w:p>
+      <w:pPr>
+        <w:ind w:firstLine="720"/>
+        <w:rPr>
+          <w:b/>
+          <w:bCs/>
+        </w:rPr>
+      </w:pPr>
+      <w:r>
+        <w:t>Bước 5. Kiểm tra hồ sơ</w:t>
+      </w:r>
+    </w:p>
+    <w:p>
+      <w:pPr>
+        <w:ind w:left="720" w:firstLine="720"/>
+      </w:pPr>
+      <w:r>
+        <w:t>Cán bộ Bộ phận Một cửa kiểm tra thành phần, số lượng và nội dung hồ sơ đã được người nộp cung cấp.</w:t>
+      </w:r>
+    </w:p>
+    <w:p>
+      <w:pPr>
+        <w:ind w:left="720" w:firstLine="720"/>
+      </w:pPr>
+      <w:r>
+        <w:t>Nội dung kiểm tra bao gồm sự đầy đủ của giấy tờ, các trường thông tin bắt buộc, tính rõ ràng và thống nhất của thông tin, tình trạng bản chính, bản sao hoặc tệp điện tử và thẩm quyền tiếp nhận của cơ quan.</w:t>
+      </w:r>
+    </w:p>
+    <w:p>
+      <w:pPr>
+        <w:pStyle w:val="ListParagraph"/>
+        <w:numPr>
+          <w:ilvl w:val="0"/>
+          <w:numId w:val="31"/>
+        </w:numPr>
+      </w:pPr>
+      <w:r>
+        <w:t>Nếu hồ sơ đầy đủ, hợp lệ và thuộc thẩm quyền, hồ sơ được tiếp tục tiếp nhận để giải quyết.</w:t>
+      </w:r>
+    </w:p>
+    <w:p>
+      <w:pPr>
+        <w:pStyle w:val="ListParagraph"/>
+        <w:numPr>
+          <w:ilvl w:val="0"/>
+          <w:numId w:val="31"/>
+        </w:numPr>
+      </w:pPr>
+      <w:r>
+        <w:t>Nếu hồ sơ chưa đầy đủ hoặc cần bổ sung, cán bộ hướng dẫn người nộp bổ sung, hoàn thiện hồ sơ.</w:t>
+      </w:r>
+    </w:p>
+    <w:p>
+      <w:pPr>
+        <w:pStyle w:val="ListParagraph"/>
+        <w:numPr>
+          <w:ilvl w:val="0"/>
+          <w:numId w:val="31"/>
+        </w:numPr>
+        <w:tabs>
+          <w:tab w:val="num" w:pos="720"/>
+        </w:tabs>
+      </w:pPr>
+      <w:r>
+        <w:t>Nếu hồ sơ không hợp lệ hoặc không thuộc thẩm quyền giải quyết, cán bộ thông báo và hướng dẫn người nộp thực hiện theo quy định.</w:t>
+      </w:r>
+    </w:p>
+    <w:p>
+      <w:pPr>
+        <w:ind w:firstLine="720"/>
+        <w:rPr>
+          <w:sz w:val="27"/>
+        </w:rPr>
+      </w:pPr>
+      <w:r>
+        <w:t>Bước 6. Cấp phiếu hẹn</w:t>
+      </w:r>
+    </w:p>
+    <w:p>
+      <w:pPr>
+        <w:ind w:left="720" w:firstLine="720"/>
+      </w:pPr>
+      <w:r>
+        <w:t>Đối với hồ sơ đầy đủ, hợp lệ và thuộc thẩm quyền, cán bộ Bộ phận Một cửa xác nhận tiếp nhận hồ sơ.</w:t>
+      </w:r>
+    </w:p>
+    <w:p>
+      <w:pPr>
+        <w:ind w:left="720" w:firstLine="720"/>
+      </w:pPr>
+      <w:r>
+        <w:t>Cán bộ thực hiện cập nhật thông tin hồ sơ trên hệ thống, cấp mã hồ sơ, lưu thông tin cần thiết và in hoặc gửi điện tử Phiếu tiếp nhận hồ sơ và hẹn trả kết quả cho người nộp.</w:t>
+      </w:r>
+    </w:p>
+    <w:p>
+      <w:pPr>
+        <w:ind w:left="720" w:firstLine="720"/>
+      </w:pPr>
+      <w:r>
+        <w:lastRenderedPageBreak/>
+        <w:t>Sau khi hoàn tất việc tiếp nhận, hồ sơ được chuyển đến bộ phận chuyên môn hoặc đơn vị có trách nhiệm để tiếp tục xử lý theo quy định.</w:t>
+      </w:r>
+    </w:p>
+    <w:p>
+      <w:r>
+        <w:rPr>
+          <w:b/>
+          <w:bCs/>
+        </w:rPr>
+        <w:t>Đối tượng khách hàng:</w:t>
+      </w:r>
+    </w:p>
+    <w:p>
+      <w:pPr>
+        <w:ind w:firstLine="720"/>
+      </w:pPr>
+      <w:r>
+        <w:t>Đối tượng khách hàng của quy trình là cá nhân hoặc tổ chức có nhu cầu thực hiện thủ tục hành chính. Khách hàng là người kích hoạt quy trình thông qua việc tra cứu thủ tục, chuẩn bị và nộp hồ sơ đến Bộ phận Một cửa. </w:t>
+      </w:r>
+    </w:p>
+    <w:p>
+      <w:pPr>
+        <w:ind w:firstLine="720"/>
+      </w:pPr>
+      <w:r>
+        <w:t>Giá trị quy trình này mang lại cho khách mang chủ yếu ở việc giúp nộp hồ sơ đúng ngay từ đầu, giảm thời gian chờ và tăng tính minh bạch</w:t>
+      </w:r>
+    </w:p>
+    <w:p>
+      <w:pPr>
+        <w:rPr>
+          <w:b/>
+          <w:bCs/>
+        </w:rPr>
+      </w:pPr>
+      <w:r>
+        <w:rPr>
+          <w:b/>
+          <w:bCs/>
+        </w:rPr>
+        <w:t>Các kết quả có thể xảy ra:</w:t>
+      </w:r>
+    </w:p>
+    <w:p>
+      <w:pPr>
+        <w:ind w:firstLine="720"/>
+      </w:pPr>
+      <w:r>
+        <w:t>Hồ sơ được tiếp nhận: Hồ sơ đầy đủ, hợp lệ và thuộc thẩm quyền. Hệ thống cấp mã hồ sơ và Phiếu tiếp nhận, hẹn trả kết quả. </w:t>
+      </w:r>
+    </w:p>
+    <w:p>
+      <w:pPr>
+        <w:ind w:firstLine="720"/>
+      </w:pPr>
+      <w:r>
+        <w:t>Hồ sơ cần bổ sung: Hồ sơ còn thiếu giấy tờ hoặc điền thông tin kê khai còn thiếu. Sau khi đầy đủ Công chức có thể kiểm tra lại và tiếp nhận.</w:t>
+      </w:r>
+    </w:p>
+    <w:p>
+      <w:pPr>
+        <w:ind w:firstLine="720"/>
+      </w:pPr>
+      <w:r>
+        <w:t>Hồ sơ bị từ chối tiếp nhận: Hồ sơ không hợp lệ, không đáp ứng điều kiện hoặc không thể hoàn thiện tại thời điểm tiếp nhận. </w:t>
+      </w:r>
+    </w:p>
+    <w:p>
+      <w:pPr>
+        <w:ind w:firstLine="720"/>
+      </w:pPr>
+      <w:r>
+        <w:t>Hồ sơ bị từ chối tiếp nhận</w:t>
+      </w:r>
+      <w:r>
+        <w:rPr>
+          <w:b/>
+          <w:bCs/>
+        </w:rPr>
+        <w:t>:</w:t>
+      </w:r>
+      <w:r>
+        <w:t xml:space="preserve"> Hồ sơ chưa đúng quy định pháp luật, sai biểu mẫu, lỗi trực tuyến hoặc cơ quan không đủ thẩm quyền tiếp nhận (ví dụ: Làm giấy căn cước phải qua bộ công an).</w:t>
+      </w:r>
+    </w:p>
+    <w:p>
+      <w:pPr>
+        <w:ind w:firstLine="720"/>
+      </w:pPr>
+      <w:r>
+        <w:t>Người nộp rút hồ sơ: Người nộp hồ sơ tra không tiếp tục thực hiện thủ tục và đề nghị rút hồ sơ.</w:t>
+      </w:r>
     </w:p>
     <w:p>
       <w:pPr>
@@ -6008,10 +6436,664 @@
     </w:p>
     <w:p>
       <w:pPr>
+        <w:jc w:val="left"/>
+        <w:rPr>
+          <w:b/>
+          <w:bCs/>
+        </w:rPr>
+      </w:pPr>
+      <w:r>
+        <w:rPr>
+          <w:b/>
+          <w:bCs/>
+        </w:rPr>
+        <w:t>Tác nhân thực hiện</w:t>
+      </w:r>
+    </w:p>
+    <w:p>
+      <w:pPr>
+        <w:ind w:firstLine="720"/>
+        <w:jc w:val="left"/>
+      </w:pPr>
+      <w:r>
+        <w:t>Công chức Bộ phận Một cửa: Chuyển hồ sơ đã được tiếp nhận đến công chức hoặc đơn vị chuyên môn có trách nhiệm xử lý; tiếp nhận lại hồ sơ bổ sung nếu có.</w:t>
+      </w:r>
+    </w:p>
+    <w:p>
+      <w:pPr>
+        <w:ind w:firstLine="720"/>
+        <w:jc w:val="left"/>
+      </w:pPr>
+      <w:r>
+        <w:t>Công chức/Đơn vị chuyên môn: Rà soát, kiểm tra, thẩm định và xử lý hồ sơ; đề xuất kết quả; lập dự thảo kết quả giải quyết hoặc văn bản không giải quyết.</w:t>
+      </w:r>
+    </w:p>
+    <w:p>
+      <w:pPr>
+        <w:ind w:firstLine="720"/>
+        <w:jc w:val="left"/>
+      </w:pPr>
+      <w:r>
+        <w:t>Cơ quan/Bộ phận phối hợp: Cung cấp thông tin, ý kiến chuyên môn hoặc hỗ trợ xác minh khi hồ sơ có nội dung cần làm rõ.</w:t>
+      </w:r>
+    </w:p>
+    <w:p>
+      <w:pPr>
+        <w:ind w:firstLine="720"/>
+        <w:jc w:val="left"/>
+      </w:pPr>
+      <w:r>
+        <w:lastRenderedPageBreak/>
+        <w:t>Lãnh đạo/Người có thẩm quyền: Xem xét đề xuất, kiểm tra dự thảo và phê duyệt kết quả xử lý theo thẩm quyền.</w:t>
+      </w:r>
+    </w:p>
+    <w:p>
+      <w:pPr>
+        <w:ind w:left="720" w:firstLine="720"/>
+        <w:jc w:val="left"/>
+      </w:pPr>
+      <w:r>
+        <w:t>Hệ thống thông tin giải quyết TTHC: Chuyển hồ sơ giữa các bộ phận, lưu tài liệu, cập nhật trạng thái, ghi nhận tiến trình và hỗ trợ gửi thông báo.</w:t>
+      </w:r>
+    </w:p>
+    <w:p>
+      <w:pPr>
+        <w:jc w:val="left"/>
+      </w:pPr>
+      <w:r>
+        <w:t>Người nộp hồ sơ: Bổ sung, chỉnh sửa hoặc cung cấp thêm thông tin khi nhận được yêu cầu từ cơ quan xử lý.</w:t>
+      </w:r>
+    </w:p>
+    <w:p>
+      <w:pPr>
+        <w:jc w:val="left"/>
+      </w:pPr>
+      <w:r>
+        <w:rPr>
+          <w:b/>
+          <w:bCs/>
+        </w:rPr>
+        <w:t>Mô tả quy trình</w:t>
+      </w:r>
+    </w:p>
+    <w:p>
+      <w:pPr>
+        <w:ind w:firstLine="720"/>
+        <w:jc w:val="left"/>
+      </w:pPr>
+      <w:r>
+        <w:t>Bước 1. Chuyển hồ sơ xử lý</w:t>
+      </w:r>
+    </w:p>
+    <w:p>
+      <w:pPr>
+        <w:ind w:left="720" w:firstLine="720"/>
+        <w:jc w:val="left"/>
+      </w:pPr>
+      <w:r>
+        <w:t>Sau khi hồ sơ đã được Bộ phận Một cửa tiếp nhận, hồ sơ được chuyển đến công chức hoặc đơn vị chuyên môn có trách nhiệm giải quyết.</w:t>
+      </w:r>
+    </w:p>
+    <w:p>
+      <w:pPr>
+        <w:ind w:left="720" w:firstLine="720"/>
+        <w:jc w:val="left"/>
+      </w:pPr>
+      <w:r>
+        <w:t>Hệ thống ghi nhận việc chuyển hồ sơ và cập nhật trạng thái để đơn vị chuyên môn biết hồ sơ đang chờ xử lý.</w:t>
+      </w:r>
+    </w:p>
+    <w:p>
+      <w:pPr>
+        <w:ind w:firstLine="720"/>
+        <w:jc w:val="left"/>
+      </w:pPr>
+      <w:r>
+        <w:t>Bước 2. Rà soát hồ sơ</w:t>
+      </w:r>
+    </w:p>
+    <w:p>
+      <w:pPr>
+        <w:ind w:left="720" w:firstLine="720"/>
+        <w:jc w:val="left"/>
+      </w:pPr>
+      <w:r>
+        <w:t>Công chức chuyên môn tiếp nhận và xem lại toàn bộ hồ sơ. Nội dung rà soát bao gồm:</w:t>
+      </w:r>
+    </w:p>
+    <w:p>
+      <w:pPr>
+        <w:pStyle w:val="ListParagraph"/>
+        <w:numPr>
+          <w:ilvl w:val="0"/>
+          <w:numId w:val="30"/>
+        </w:numPr>
+      </w:pPr>
+      <w:r>
+        <w:t>Thành phần giấy tờ trong hồ sơ;</w:t>
+      </w:r>
+    </w:p>
+    <w:p>
+      <w:pPr>
+        <w:pStyle w:val="ListParagraph"/>
+        <w:numPr>
+          <w:ilvl w:val="0"/>
+          <w:numId w:val="30"/>
+        </w:numPr>
+      </w:pPr>
+      <w:r>
+        <w:t>Thông tin kê khai của người nộp;</w:t>
+      </w:r>
+    </w:p>
+    <w:p>
+      <w:pPr>
+        <w:pStyle w:val="ListParagraph"/>
+        <w:numPr>
+          <w:ilvl w:val="0"/>
+          <w:numId w:val="30"/>
+        </w:numPr>
+      </w:pPr>
+      <w:r>
+        <w:t>Tính thống nhất giữa các giấy tờ;</w:t>
+      </w:r>
+    </w:p>
+    <w:p>
+      <w:pPr>
+        <w:pStyle w:val="ListParagraph"/>
+        <w:numPr>
+          <w:ilvl w:val="0"/>
+          <w:numId w:val="30"/>
+        </w:numPr>
+      </w:pPr>
+      <w:r>
+        <w:t>Tệp điện tử và tài liệu đính kèm;</w:t>
+      </w:r>
+    </w:p>
+    <w:p>
+      <w:pPr>
+        <w:pStyle w:val="ListParagraph"/>
+        <w:numPr>
+          <w:ilvl w:val="0"/>
+          <w:numId w:val="30"/>
+        </w:numPr>
+      </w:pPr>
+      <w:r>
+        <w:t>Thẩm quyền và điều kiện giải quyết;</w:t>
+      </w:r>
+    </w:p>
+    <w:p>
+      <w:pPr>
+        <w:ind w:left="720" w:firstLine="720"/>
+        <w:jc w:val="left"/>
+      </w:pPr>
+      <w:r>
+        <w:t>Các yêu cầu bổ sung trước đó, nếu có.</w:t>
+      </w:r>
+    </w:p>
+    <w:p>
+      <w:pPr>
+        <w:ind w:left="720" w:firstLine="720"/>
+        <w:jc w:val="left"/>
+      </w:pPr>
+      <w:r>
+        <w:t>Kết quả rà soát giúp xác định hồ sơ có đủ điều kiện để tiếp tục thẩm định hay cần bổ sung, xác minh hoặc dừng xử lý.</w:t>
+      </w:r>
+    </w:p>
+    <w:p>
+      <w:pPr>
+        <w:ind w:firstLine="720"/>
+        <w:jc w:val="left"/>
+      </w:pPr>
+      <w:r>
+        <w:t>Bước 3. Thẩm định hồ sơ</w:t>
+      </w:r>
+    </w:p>
+    <w:p>
+      <w:pPr>
+        <w:ind w:left="720" w:firstLine="720"/>
+        <w:jc w:val="left"/>
+      </w:pPr>
+      <w:r>
+        <w:t>Nếu hồ sơ cơ bản đầy đủ, công chức chuyên môn tiến hành thẩm định.</w:t>
+      </w:r>
+    </w:p>
+    <w:p>
+      <w:pPr>
+        <w:ind w:left="720" w:firstLine="720"/>
+        <w:jc w:val="left"/>
+      </w:pPr>
+      <w:r>
+        <w:t>Ở bước này, công chức kiểm tra kỹ hơn về nội dung, căn cứ pháp lý, tính chính xác và mức độ đáp ứng điều kiện của hồ sơ.</w:t>
+      </w:r>
+    </w:p>
+    <w:p>
+      <w:pPr>
+        <w:pStyle w:val="ListParagraph"/>
+        <w:numPr>
+          <w:ilvl w:val="0"/>
+          <w:numId w:val="33"/>
+        </w:numPr>
+      </w:pPr>
+      <w:r>
+        <w:t>Trường hợp cần làm rõ thêm, đơn vị chuyên môn có thể:</w:t>
+      </w:r>
+    </w:p>
+    <w:p>
+      <w:pPr>
+        <w:pStyle w:val="ListParagraph"/>
+        <w:numPr>
+          <w:ilvl w:val="0"/>
+          <w:numId w:val="33"/>
+        </w:numPr>
+      </w:pPr>
+      <w:r>
+        <w:t>Yêu cầu người nộp bổ sung;</w:t>
+      </w:r>
+    </w:p>
+    <w:p>
+      <w:pPr>
+        <w:pStyle w:val="ListParagraph"/>
+        <w:numPr>
+          <w:ilvl w:val="0"/>
+          <w:numId w:val="33"/>
+        </w:numPr>
+      </w:pPr>
+      <w:r>
+        <w:t>Gửi yêu cầu xác minh;</w:t>
+      </w:r>
+    </w:p>
+    <w:p>
+      <w:pPr>
+        <w:pStyle w:val="ListParagraph"/>
+        <w:numPr>
+          <w:ilvl w:val="0"/>
+          <w:numId w:val="33"/>
+        </w:numPr>
+      </w:pPr>
+      <w:r>
+        <w:t>Lấy ý kiến cơ quan hoặc bộ phận phối hợp;</w:t>
+      </w:r>
+    </w:p>
+    <w:p>
+      <w:pPr>
+        <w:ind w:left="720" w:firstLine="720"/>
+        <w:jc w:val="left"/>
+      </w:pPr>
+      <w:r>
+        <w:lastRenderedPageBreak/>
+        <w:t>Đối chiếu với dữ liệu có liên quan.</w:t>
+      </w:r>
+    </w:p>
+    <w:p>
+      <w:pPr>
+        <w:ind w:left="720" w:firstLine="720"/>
+        <w:jc w:val="left"/>
+      </w:pPr>
+      <w:r>
+        <w:t>Sau khi có đủ thông tin, công chức đưa ra kết luận hồ sơ đạt hay không đạt yêu cầu.</w:t>
+      </w:r>
+    </w:p>
+    <w:p>
+      <w:pPr>
+        <w:ind w:firstLine="720"/>
+        <w:jc w:val="left"/>
+      </w:pPr>
+      <w:r>
+        <w:t>Bước 4. Đề xuất kết quả</w:t>
+      </w:r>
+    </w:p>
+    <w:p>
+      <w:pPr>
+        <w:ind w:left="1440"/>
+        <w:jc w:val="left"/>
+      </w:pPr>
+      <w:r>
+        <w:t>Dựa trên kết quả thẩm định, công chức chuyên môn đề xuất hướng xử lý hồ sơ.</w:t>
+      </w:r>
+    </w:p>
+    <w:p>
+      <w:pPr>
+        <w:ind w:left="1440"/>
+        <w:jc w:val="left"/>
+      </w:pPr>
+      <w:r>
+        <w:t>Các hướng đề xuất có thể gồm:</w:t>
+      </w:r>
+    </w:p>
+    <w:p>
+      <w:pPr>
+        <w:pStyle w:val="ListParagraph"/>
+        <w:numPr>
+          <w:ilvl w:val="0"/>
+          <w:numId w:val="34"/>
+        </w:numPr>
+      </w:pPr>
+      <w:r>
+        <w:t>Đề xuất giải quyết hồ sơ;</w:t>
+      </w:r>
+    </w:p>
+    <w:p>
+      <w:pPr>
+        <w:pStyle w:val="ListParagraph"/>
+        <w:numPr>
+          <w:ilvl w:val="0"/>
+          <w:numId w:val="34"/>
+        </w:numPr>
+      </w:pPr>
+      <w:r>
+        <w:t>Đề xuất yêu cầu bổ sung;</w:t>
+      </w:r>
+    </w:p>
+    <w:p>
+      <w:pPr>
+        <w:pStyle w:val="ListParagraph"/>
+        <w:numPr>
+          <w:ilvl w:val="0"/>
+          <w:numId w:val="34"/>
+        </w:numPr>
+      </w:pPr>
+      <w:r>
+        <w:t>Đề xuất không giải quyết;</w:t>
+      </w:r>
+    </w:p>
+    <w:p>
+      <w:pPr>
+        <w:pStyle w:val="ListParagraph"/>
+        <w:numPr>
+          <w:ilvl w:val="0"/>
+          <w:numId w:val="34"/>
+        </w:numPr>
+      </w:pPr>
+      <w:r>
+        <w:t>Đề xuất dừng xử lý;</w:t>
+      </w:r>
+    </w:p>
+    <w:p>
+      <w:pPr>
+        <w:ind w:left="720" w:firstLine="720"/>
+        <w:jc w:val="left"/>
+      </w:pPr>
+      <w:r>
+        <w:t>Đề xuất chuyển cơ quan có thẩm quyền nếu phát hiện hồ sơ không thuộc phạm vi giải quyết.</w:t>
+      </w:r>
+    </w:p>
+    <w:p>
+      <w:pPr>
+        <w:ind w:left="720" w:firstLine="720"/>
+        <w:jc w:val="left"/>
+      </w:pPr>
+      <w:r>
+        <w:t>Đây chưa phải kết quả chính thức mà chỉ là ý kiến chuyên môn để làm căn cứ cho bước tiếp theo.</w:t>
+      </w:r>
+    </w:p>
+    <w:p>
+      <w:pPr>
+        <w:ind w:left="720"/>
+        <w:jc w:val="left"/>
+      </w:pPr>
+      <w:r>
+        <w:t>Bước 5. Xử lý hồ sơ</w:t>
+      </w:r>
+    </w:p>
+    <w:p>
+      <w:pPr>
+        <w:ind w:left="720" w:firstLine="720"/>
+        <w:jc w:val="left"/>
+      </w:pPr>
+      <w:r>
+        <w:t>Công chức chuyên môn thực hiện việc xử lý theo kết quả đã đề xuất.</w:t>
+      </w:r>
+    </w:p>
+    <w:p>
+      <w:pPr>
+        <w:ind w:left="720" w:firstLine="720"/>
+        <w:jc w:val="left"/>
+      </w:pPr>
+      <w:r>
+        <w:t>Nếu hồ sơ đạt yêu cầu, công chức lập dự thảo kết quả giải quyết. Nếu hồ sơ không đạt, công chức lập dự thảo văn bản không giải quyết và ghi rõ lý do.</w:t>
+      </w:r>
+    </w:p>
+    <w:p>
+      <w:pPr>
+        <w:ind w:left="720" w:firstLine="720"/>
+        <w:jc w:val="left"/>
+      </w:pPr>
+      <w:r>
+        <w:t>Trường hợp dự thảo chưa phù hợp, hồ sơ được hiệu chỉnh và rà soát lại trước khi trình người có thẩm quyền.</w:t>
+      </w:r>
+    </w:p>
+    <w:p>
+      <w:pPr>
+        <w:ind w:firstLine="720"/>
+        <w:jc w:val="left"/>
+      </w:pPr>
+      <w:r>
+        <w:t>Bước 6. Hoàn tất xử lý</w:t>
+      </w:r>
+    </w:p>
+    <w:p>
+      <w:pPr>
+        <w:ind w:left="720" w:firstLine="720"/>
+        <w:jc w:val="left"/>
+      </w:pPr>
+      <w:r>
+        <w:t>Sau khi hồ sơ và dự thảo đã được kiểm tra đầy đủ, kết quả được chuyển sang bước phê duyệt hoặc ký ban hành.</w:t>
+      </w:r>
+    </w:p>
+    <w:p>
+      <w:pPr>
+        <w:ind w:left="720" w:firstLine="720"/>
+        <w:jc w:val="left"/>
+      </w:pPr>
+      <w:r>
+        <w:t>Hệ thống cập nhật trạng thái hồ sơ, lưu lại các tài liệu liên quan và kết thúc giai đoạn thẩm định, xử lý.</w:t>
+      </w:r>
+    </w:p>
+    <w:p>
+      <w:pPr>
+        <w:pStyle w:val="ListParagraph"/>
+        <w:numPr>
+          <w:ilvl w:val="0"/>
+          <w:numId w:val="35"/>
+        </w:numPr>
+      </w:pPr>
+      <w:r>
+        <w:t>Đầu ra của quy trình có thể là:</w:t>
+      </w:r>
+    </w:p>
+    <w:p>
+      <w:pPr>
+        <w:pStyle w:val="ListParagraph"/>
+        <w:numPr>
+          <w:ilvl w:val="0"/>
+          <w:numId w:val="35"/>
+        </w:numPr>
+      </w:pPr>
+      <w:r>
+        <w:t>Dự thảo kết quả giải quyết;</w:t>
+      </w:r>
+    </w:p>
+    <w:p>
+      <w:pPr>
+        <w:pStyle w:val="ListParagraph"/>
+        <w:numPr>
+          <w:ilvl w:val="0"/>
+          <w:numId w:val="35"/>
+        </w:numPr>
+      </w:pPr>
+      <w:r>
+        <w:t>Dự thảo văn bản không giải quyết;</w:t>
+      </w:r>
+    </w:p>
+    <w:p>
+      <w:pPr>
+        <w:pStyle w:val="ListParagraph"/>
+        <w:numPr>
+          <w:ilvl w:val="0"/>
+          <w:numId w:val="35"/>
+        </w:numPr>
+      </w:pPr>
+      <w:r>
+        <w:t>Yêu cầu bổ sung hồ sơ;</w:t>
+      </w:r>
+    </w:p>
+    <w:p>
+      <w:pPr>
+        <w:pStyle w:val="ListParagraph"/>
+        <w:numPr>
+          <w:ilvl w:val="0"/>
+          <w:numId w:val="35"/>
+        </w:numPr>
+      </w:pPr>
+      <w:r>
+        <w:t>Đề xuất dừng xử lý;</w:t>
+      </w:r>
+    </w:p>
+    <w:p>
+      <w:pPr>
+        <w:ind w:left="720" w:firstLine="720"/>
+        <w:jc w:val="left"/>
+      </w:pPr>
+      <w:r>
+        <w:lastRenderedPageBreak/>
+        <w:t>Hồ sơ chuyển sang bước phê duyệt.</w:t>
+      </w:r>
+    </w:p>
+    <w:p>
+      <w:pPr>
+        <w:jc w:val="left"/>
+      </w:pPr>
+      <w:r>
+        <w:rPr>
+          <w:b/>
+          <w:bCs/>
+        </w:rPr>
+        <w:t>Đối tượng khách hàng</w:t>
+      </w:r>
+    </w:p>
+    <w:p>
+      <w:pPr>
+        <w:ind w:firstLine="720"/>
+        <w:jc w:val="left"/>
+      </w:pPr>
+      <w:r>
+        <w:t>Đối tượng khách hàng của quy trình là cá nhân hoặc tổ chức đã nộp hồ sơ và có nhu cầu được cơ quan nhà nước xem xét, giải quyết thủ tục hành chính.</w:t>
+      </w:r>
+    </w:p>
+    <w:p>
+      <w:pPr>
+        <w:ind w:firstLine="720"/>
+        <w:jc w:val="left"/>
+      </w:pPr>
+      <w:r>
+        <w:t>Khách hàng không trực tiếp thực hiện các bước rà soát và thẩm định, nhưng là người nhận giá trị cuối cùng từ quy trình. Khách hàng cũng có trách nhiệm bổ sung hoặc giải trình thêm khi cơ quan chuyên môn yêu cầu.</w:t>
+      </w:r>
+    </w:p>
+    <w:p>
+      <w:pPr>
+        <w:ind w:firstLine="720"/>
+        <w:jc w:val="left"/>
+      </w:pPr>
+      <w:r>
+        <w:t>Quy trình này giúp hồ sơ được kiểm tra và xử lý rõ ràng, hạn chế sai sót, bảo đảm đúng quy định và giúp người dân dễ theo dõi tình trạng hồ sơ.</w:t>
+      </w:r>
+    </w:p>
+    <w:p>
+      <w:pPr>
+        <w:jc w:val="left"/>
+        <w:rPr>
+          <w:b/>
+          <w:bCs/>
+        </w:rPr>
+      </w:pPr>
+      <w:r>
+        <w:rPr>
+          <w:b/>
+          <w:bCs/>
+        </w:rPr>
+        <w:t>Các kết quả có thể xảy ra</w:t>
+      </w:r>
+    </w:p>
+    <w:p>
+      <w:pPr>
+        <w:ind w:firstLine="720"/>
+        <w:jc w:val="left"/>
+      </w:pPr>
+      <w:r>
+        <w:t>Hồ sơ đạt yêu cầu: Hồ sơ đầy đủ, thông tin chính xác và đáp ứng điều kiện giải quyết. Công chức chuyên môn lập dự thảo kết quả và chuyển sang bước phê duyệt.</w:t>
+      </w:r>
+    </w:p>
+    <w:p>
+      <w:pPr>
+        <w:ind w:firstLine="720"/>
+        <w:jc w:val="left"/>
+      </w:pPr>
+      <w:r>
+        <w:t>Hồ sơ cần bổ sung: Hồ sơ còn thiếu giấy tờ, thông tin chưa đầy đủ, chưa chính xác hoặc chưa thống nhất. Công chức lập yêu cầu bổ sung và gửi cho người nộp hoàn thiện.</w:t>
+      </w:r>
+    </w:p>
+    <w:p>
+      <w:pPr>
+        <w:ind w:firstLine="720"/>
+        <w:jc w:val="left"/>
+      </w:pPr>
+      <w:r>
+        <w:t>Hồ sơ cần xác minh hoặc phối hợp: Hồ sơ có nội dung chưa rõ hoặc cần đối chiếu thêm. Đơn vị chuyên môn gửi yêu cầu đến cơ quan hoặc bộ phận liên quan để lấy ý kiến, dữ liệu hoặc kết quả xác minh.</w:t>
+      </w:r>
+    </w:p>
+    <w:p>
+      <w:pPr>
+        <w:ind w:firstLine="720"/>
+        <w:jc w:val="left"/>
+      </w:pPr>
+      <w:r>
+        <w:t>Hồ sơ không đạt yêu cầu: Qua thẩm định, hồ sơ không đáp ứng điều kiện giải quyết. Công chức lập dự thảo văn bản không giải quyết và nêu rõ lý do.</w:t>
+      </w:r>
+    </w:p>
+    <w:p>
+      <w:pPr>
+        <w:ind w:firstLine="720"/>
+        <w:jc w:val="left"/>
+      </w:pPr>
+      <w:r>
+        <w:t>Hồ sơ bị dừng xử lý: Hồ sơ không thể tiếp tục giải quyết do không đủ điều kiện, người nộp không bổ sung theo yêu cầu hoặc có căn cứ phải dừng xử lý.</w:t>
+      </w:r>
+    </w:p>
+    <w:p>
+      <w:pPr>
+        <w:ind w:firstLine="720"/>
+        <w:jc w:val="left"/>
+      </w:pPr>
+      <w:r>
+        <w:t>Dự thảo cần hiệu chỉnh: Nội dung dự thảo còn sai sót, thiếu căn cứ hoặc chưa đúng hình thức nên được trả lại để chỉnh sửa và rà soát lại.</w:t>
+      </w:r>
+    </w:p>
+    <w:p>
+      <w:pPr>
+        <w:ind w:firstLine="720"/>
+        <w:jc w:val="left"/>
+      </w:pPr>
+      <w:r>
+        <w:t>Hồ sơ được chuyển phê duyệt: Hồ sơ và dự thảo đã hoàn chỉnh, được chuyển đến lãnh đạo hoặc người có thẩm quyền xem xét.</w:t>
+      </w:r>
+    </w:p>
+    <w:p>
+      <w:pPr>
+        <w:ind w:firstLine="720"/>
+        <w:jc w:val="left"/>
+      </w:pPr>
+      <w:r>
+        <w:t>Hồ sơ không thuộc thẩm quyền: Trong quá trình rà soát hoặc thẩm định, cơ quan phát hiện hồ sơ không thuộc phạm vi giải quyết nên hướng dẫn hoặc chuyển đến đúng cơ quan có thẩm quyền.</w:t>
+      </w:r>
+    </w:p>
+    <w:p/>
+    <w:p>
+      <w:pPr>
         <w:pStyle w:val="Heading5"/>
       </w:pPr>
       <w:bookmarkStart w:id="20" w:name="_Toc236264126"/>
       <w:r>
+        <w:lastRenderedPageBreak/>
         <w:t xml:space="preserve">2.1.3.3 </w:t>
       </w:r>
       <w:bookmarkEnd w:id="20"/>
@@ -6081,189 +7163,37 @@
       <w:pPr>
         <w:pStyle w:val="Caption"/>
       </w:pPr>
-      <w:bookmarkStart w:id="21" w:name="_Toc236263982"/>
       <w:r>
         <w:t xml:space="preserve">Hình </w:t>
       </w:r>
       <w:r>
-        <w:fldChar w:fldCharType="begin"/>
-      </w:r>
-      <w:r>
-        <w:instrText xml:space="preserve"> SEQ Hình \* ARABIC </w:instrText>
-      </w:r>
-      <w:r>
-        <w:fldChar w:fldCharType="separate"/>
-      </w:r>
-      <w:r>
-        <w:rPr>
-          <w:noProof/>
-        </w:rPr>
         <w:t>3</w:t>
       </w:r>
       <w:r>
-        <w:rPr>
-          <w:noProof/>
-        </w:rPr>
-        <w:fldChar w:fldCharType="end"/>
-      </w:r>
-      <w:r>
         <w:t>. Quy trình phê duyệt và ban hành kết quả</w:t>
       </w:r>
+    </w:p>
+    <w:p>
+      <w:pPr>
+        <w:keepNext/>
+        <w:jc w:val="center"/>
+      </w:pPr>
+    </w:p>
+    <w:p>
+      <w:pPr>
+        <w:pStyle w:val="Heading5"/>
+      </w:pPr>
+      <w:bookmarkStart w:id="21" w:name="_Toc236264127"/>
+      <w:r>
+        <w:t>2.1.3.4 Quy trình trả kết</w:t>
+      </w:r>
+      <w:r>
+        <w:t xml:space="preserve"> quả</w:t>
+      </w:r>
+      <w:r>
+        <w:t xml:space="preserve"> và thông báo</w:t>
+      </w:r>
       <w:bookmarkEnd w:id="21"/>
-    </w:p>
-    <w:p>
-      <w:pPr>
-        <w:jc w:val="both"/>
-      </w:pPr>
-      <w:r>
-        <w:t>TÁC NHÂN THỰC HIỆN</w:t>
-      </w:r>
-    </w:p>
-    <w:p>
-      <w:pPr>
-        <w:ind w:firstLine="720"/>
-        <w:jc w:val="both"/>
-      </w:pPr>
-      <w:r>
-        <w:t>Cán bộ chuyên môn, lãnh đạo hoặc người có thẩm quyền phê duyệt, hệ thống ký số và hệ thống thông tin giải quyết thủ tục hành chính.</w:t>
-      </w:r>
-    </w:p>
-    <w:p>
-      <w:pPr>
-        <w:jc w:val="both"/>
-      </w:pPr>
-      <w:r>
-        <w:t>MÔ TẢ QUY TRÌNH</w:t>
-      </w:r>
-    </w:p>
-    <w:p>
-      <w:pPr>
-        <w:pStyle w:val="ListParagraph"/>
-        <w:numPr>
-          <w:ilvl w:val="0"/>
-          <w:numId w:val="10"/>
-        </w:numPr>
-        <w:jc w:val="both"/>
-      </w:pPr>
-      <w:r>
-        <w:t xml:space="preserve">Tiếp nhận kết quả xử lý: Bộ phận hoặc người có thẩm quyền nhận dự thảo kết quả do cán bộ chuyên môn chuyển đến. </w:t>
-      </w:r>
-    </w:p>
-    <w:p>
-      <w:pPr>
-        <w:pStyle w:val="ListParagraph"/>
-        <w:numPr>
-          <w:ilvl w:val="0"/>
-          <w:numId w:val="10"/>
-        </w:numPr>
-        <w:jc w:val="both"/>
-      </w:pPr>
-      <w:r>
-        <w:t xml:space="preserve">Kiểm tra nội dung: Nội dung dự thảo, thông tin hồ sơ và căn cứ xử lý được kiểm tra trước khi trình phê duyệt. </w:t>
-      </w:r>
-    </w:p>
-    <w:p>
-      <w:pPr>
-        <w:pStyle w:val="ListParagraph"/>
-        <w:numPr>
-          <w:ilvl w:val="0"/>
-          <w:numId w:val="10"/>
-        </w:numPr>
-        <w:jc w:val="both"/>
-      </w:pPr>
-      <w:r>
-        <w:t xml:space="preserve">Trình phê duyệt: Dự thảo kết quả được chuyển đến lãnh đạo hoặc người có thẩm quyền xem xét. </w:t>
-      </w:r>
-    </w:p>
-    <w:p>
-      <w:pPr>
-        <w:pStyle w:val="ListParagraph"/>
-        <w:numPr>
-          <w:ilvl w:val="0"/>
-          <w:numId w:val="10"/>
-        </w:numPr>
-        <w:jc w:val="both"/>
-      </w:pPr>
-      <w:r>
-        <w:t xml:space="preserve">Xem xét phê duyệt: Người có thẩm quyền đánh giá nội dung và quyết định chấp thuận hoặc trả lại để chỉnh sửa. </w:t>
-      </w:r>
-    </w:p>
-    <w:p>
-      <w:pPr>
-        <w:pStyle w:val="ListParagraph"/>
-        <w:numPr>
-          <w:ilvl w:val="0"/>
-          <w:numId w:val="10"/>
-        </w:numPr>
-        <w:jc w:val="both"/>
-      </w:pPr>
-      <w:r>
-        <w:t xml:space="preserve">Ký số hoặc ký duyệt: Trường hợp được chấp thuận, kết quả được ký số hoặc ký duyệt theo quy định. </w:t>
-      </w:r>
-    </w:p>
-    <w:p>
-      <w:pPr>
-        <w:pStyle w:val="ListParagraph"/>
-        <w:numPr>
-          <w:ilvl w:val="0"/>
-          <w:numId w:val="10"/>
-        </w:numPr>
-        <w:jc w:val="both"/>
-      </w:pPr>
-      <w:r>
-        <w:t>Ban hành kết quả: Hệ thống ghi nhận kết quả đã được ban hành và chuyển đến bộ phận trả kết quả.</w:t>
-      </w:r>
-    </w:p>
-    <w:p>
-      <w:pPr>
-        <w:jc w:val="both"/>
-      </w:pPr>
-      <w:r>
-        <w:lastRenderedPageBreak/>
-        <w:t>ĐỐI TƯỢNG KHÁCH HÀNG</w:t>
-      </w:r>
-    </w:p>
-    <w:p>
-      <w:pPr>
-        <w:ind w:firstLine="720"/>
-        <w:jc w:val="both"/>
-      </w:pPr>
-      <w:r>
-        <w:t xml:space="preserve">Người dân hoặc tổ chức đang chờ nhận kết quả giải quyết thủ tục hành chính. </w:t>
-      </w:r>
-    </w:p>
-    <w:p>
-      <w:pPr>
-        <w:jc w:val="both"/>
-      </w:pPr>
-      <w:r>
-        <w:t>CÁC KẾT QUẢ CÓ THỂ XẢY RA</w:t>
-      </w:r>
-    </w:p>
-    <w:p>
-      <w:pPr>
-        <w:ind w:firstLine="720"/>
-        <w:jc w:val="both"/>
-      </w:pPr>
-      <w:r>
-        <w:t>Kết quả được phê duyệt, ký và ban hành; dự thảo bị trả lại để chỉnh sửa; hồ sơ cần xử lý lại; hoặc ban hành thông báo từ chối giải quyết nếu hồ sơ không đáp ứng điều kiện.</w:t>
-      </w:r>
-    </w:p>
-    <w:p>
-      <w:pPr>
-        <w:pStyle w:val="Heading5"/>
-      </w:pPr>
-      <w:bookmarkStart w:id="22" w:name="_Toc236264127"/>
-      <w:r>
-        <w:t>2.1.3.4 Quy trình trả kết</w:t>
-      </w:r>
-      <w:r>
-        <w:t xml:space="preserve"> quả</w:t>
-      </w:r>
-      <w:r>
-        <w:t xml:space="preserve"> và thông báo</w:t>
-      </w:r>
-      <w:bookmarkEnd w:id="22"/>
     </w:p>
     <w:p>
       <w:pPr>
@@ -6327,7 +7257,7 @@
       <w:pPr>
         <w:pStyle w:val="Caption"/>
       </w:pPr>
-      <w:bookmarkStart w:id="23" w:name="_Toc236263983"/>
+      <w:bookmarkStart w:id="22" w:name="_Toc236263983"/>
       <w:r>
         <w:t xml:space="preserve">Hình </w:t>
       </w:r>
@@ -6361,209 +7291,242 @@
       <w:r>
         <w:t xml:space="preserve"> và thông báo</w:t>
       </w:r>
+      <w:bookmarkEnd w:id="22"/>
+    </w:p>
+    <w:p>
+      <w:pPr>
+        <w:rPr>
+          <w:b/>
+          <w:bCs/>
+        </w:rPr>
+      </w:pPr>
+      <w:r>
+        <w:rPr>
+          <w:b/>
+          <w:bCs/>
+        </w:rPr>
+        <w:t>T</w:t>
+      </w:r>
+      <w:r>
+        <w:rPr>
+          <w:b/>
+          <w:bCs/>
+        </w:rPr>
+        <w:t>ác nhân thực hiện</w:t>
+      </w:r>
+    </w:p>
+    <w:p>
+      <w:pPr>
+        <w:spacing w:before="240" w:after="240"/>
+        <w:ind w:firstLine="720"/>
+      </w:pPr>
+      <w:r>
+        <w:t>Công chức chuyên môn; lãnh đạo hoặc người có thẩm quyền phê duyệt; hệ thống ký số; hệ thống thông tin giải quyết thủ tục hành chính.</w:t>
+      </w:r>
+    </w:p>
+    <w:p>
+      <w:pPr>
+        <w:rPr>
+          <w:b/>
+          <w:bCs/>
+        </w:rPr>
+      </w:pPr>
+      <w:r>
+        <w:rPr>
+          <w:b/>
+          <w:bCs/>
+        </w:rPr>
+        <w:t xml:space="preserve">Mô tả quy trình </w:t>
+      </w:r>
+    </w:p>
+    <w:p>
+      <w:pPr>
+        <w:ind w:firstLine="720"/>
+      </w:pPr>
+      <w:r>
+        <w:t>Bước</w:t>
+      </w:r>
+      <w:r>
+        <w:t xml:space="preserve"> 1. Trình phê duyệt </w:t>
+      </w:r>
+    </w:p>
+    <w:p>
+      <w:pPr>
+        <w:spacing w:before="240" w:after="240"/>
+        <w:ind w:left="720"/>
+      </w:pPr>
+      <w:r>
+        <w:tab/>
+      </w:r>
+      <w:r>
+        <w:t>Sau khi hoàn tất quá trình xử lý hồ sơ và chuẩn bị dự thảo kết quả, công chức chuyên môn chuyển hồ sơ cùng dự thảo kết quả đến cấp có thẩm quyền để thực hiện quy trình phê duyệt.</w:t>
+      </w:r>
+    </w:p>
+    <w:p>
+      <w:pPr>
+        <w:ind w:firstLine="720"/>
+      </w:pPr>
+      <w:r>
+        <w:t>Bước 2.  Tiếp nhận hồ sơ trình duyệt</w:t>
+      </w:r>
+    </w:p>
+    <w:p>
+      <w:pPr>
+        <w:ind w:left="720" w:firstLine="720"/>
+      </w:pPr>
+      <w:r>
+        <w:t xml:space="preserve">Bộ phận hoặc người có thẩm quyền tiếp nhận hồ sơ, dự thảo kết quả và các tài liệu liên quan được chuyển từ công chức chuyên môn. </w:t>
+      </w:r>
+    </w:p>
+    <w:p>
+      <w:pPr>
+        <w:ind w:firstLine="720"/>
+      </w:pPr>
+      <w:r>
+        <w:t>Bước 3.  Rà soát dự thảo</w:t>
+      </w:r>
+    </w:p>
+    <w:p>
+      <w:pPr>
+        <w:ind w:left="720" w:firstLine="720"/>
+      </w:pPr>
+      <w:r>
+        <w:t xml:space="preserve">Dự thảo kết quả được rà soát về nội dung, thông tin hồ sơ, căn cứ pháp lý và tính đầy đủ trước khi đưa ra quyết định phê duyệt. </w:t>
+      </w:r>
+    </w:p>
+    <w:p>
+      <w:pPr>
+        <w:ind w:firstLine="720"/>
+      </w:pPr>
+      <w:r>
+        <w:t xml:space="preserve">Bước 4. Xem xét phê duyệt </w:t>
+      </w:r>
+    </w:p>
+    <w:p>
+      <w:pPr>
+        <w:ind w:left="720" w:firstLine="720"/>
+      </w:pPr>
+      <w:r>
+        <w:t xml:space="preserve">Lãnh đạo hoặc người có thẩm quyền xem xét hồ sơ và dự thảo kết quả để quyết định chấp thuận, yêu cầu chỉnh sửa hoặc trả lại để xử lý bổ sung. </w:t>
+      </w:r>
+    </w:p>
+    <w:p>
+      <w:pPr>
+        <w:ind w:firstLine="720"/>
+      </w:pPr>
+      <w:r>
+        <w:t>Bước 5.  Ký số/Ký duyệt</w:t>
+      </w:r>
+    </w:p>
+    <w:p>
+      <w:pPr>
+        <w:ind w:left="720" w:firstLine="720"/>
+      </w:pPr>
+      <w:r>
+        <w:lastRenderedPageBreak/>
+        <w:t xml:space="preserve">Đối với dự thảo được chấp thuận, người có thẩm quyền thực hiện ký số hoặc ký duyệt theo quy định để xác nhận giá trị pháp lý của kết quả giải quyết. </w:t>
+      </w:r>
+    </w:p>
+    <w:p>
+      <w:pPr>
+        <w:ind w:firstLine="720"/>
+      </w:pPr>
+      <w:r>
+        <w:t xml:space="preserve">Bước 6. Ban hành kết quả </w:t>
+      </w:r>
+    </w:p>
+    <w:p>
+      <w:pPr>
+        <w:ind w:left="720" w:firstLine="720"/>
+      </w:pPr>
+      <w:r>
+        <w:t>Kết quả sau khi được ký được ghi nhận chính thức trên hệ thống, cập nhật trạng thái và chuyển sang quy trình trả kết quả cho người nộp hồ sơ.</w:t>
+      </w:r>
+      <w:r>
+        <w:t>ĐỐI TƯỢNG KHÁCH HÀNG</w:t>
+      </w:r>
+    </w:p>
+    <w:p>
+      <w:pPr>
+        <w:ind w:firstLine="720"/>
+      </w:pPr>
+      <w:r>
+        <w:t>Người dân hoặc tổ chức có hồ sơ đã được giải quyết và đang chờ nhận kết quả.</w:t>
+      </w:r>
+    </w:p>
+    <w:p>
+      <w:r>
+        <w:t>CÁC KẾT QUẢ CÓ THỂ XẢY RA</w:t>
+      </w:r>
+    </w:p>
+    <w:p>
+      <w:pPr>
+        <w:ind w:firstLine="720"/>
+      </w:pPr>
+      <w:r>
+        <w:t>Kết quả được trả thành công; hồ sơ chờ người dân đến nhận; hồ sơ chưa được trả do chưa hoàn thành thanh toán; việc giao kết quả qua bưu chính không thành công; hoặc hồ sơ được đóng và lưu trữ sau khi hoàn tất.</w:t>
+      </w:r>
+    </w:p>
+    <w:p>
+      <w:pPr>
+        <w:pStyle w:val="Heading4"/>
+      </w:pPr>
+      <w:bookmarkStart w:id="23" w:name="_Toc236264128"/>
+      <w:r>
+        <w:t>2.</w:t>
+      </w:r>
+      <w:r>
+        <w:t>1</w:t>
+      </w:r>
+      <w:r>
+        <w:t>.4 Quy trình hỗ trợ (Processs Support)</w:t>
+      </w:r>
+      <w:r>
+        <w:t>.</w:t>
+      </w:r>
       <w:bookmarkEnd w:id="23"/>
     </w:p>
     <w:p>
       <w:pPr>
-        <w:jc w:val="both"/>
-      </w:pPr>
-      <w:r>
-        <w:t>TÁC NHÂN THỰC HIỆN</w:t>
-      </w:r>
-    </w:p>
-    <w:p>
-      <w:pPr>
-        <w:ind w:firstLine="720"/>
-        <w:jc w:val="both"/>
-      </w:pPr>
-      <w:r>
-        <w:t>Cán bộ tiếp nhận và trả kết quả, người dân hoặc tổ chức, hệ thống thông tin giải quyết thủ tục hành chính, hệ thống thanh toán và đơn vị bưu chính nếu có.</w:t>
-      </w:r>
-    </w:p>
-    <w:p>
-      <w:pPr>
-        <w:jc w:val="both"/>
-      </w:pPr>
-      <w:r>
-        <w:t>MÔ TẢ QUY TRÌNH</w:t>
-      </w:r>
-    </w:p>
-    <w:p>
-      <w:pPr>
-        <w:pStyle w:val="ListParagraph"/>
-        <w:numPr>
-          <w:ilvl w:val="0"/>
-          <w:numId w:val="11"/>
-        </w:numPr>
-        <w:jc w:val="both"/>
-      </w:pPr>
-      <w:r>
-        <w:t xml:space="preserve">Nhận kết quả: Bộ phận tiếp nhận và trả kết quả nhận kết quả đã được phê duyệt và ban hành. </w:t>
-      </w:r>
-    </w:p>
-    <w:p>
-      <w:pPr>
-        <w:pStyle w:val="ListParagraph"/>
-        <w:numPr>
-          <w:ilvl w:val="0"/>
-          <w:numId w:val="11"/>
-        </w:numPr>
-        <w:jc w:val="both"/>
-      </w:pPr>
-      <w:r>
-        <w:t xml:space="preserve">Cập nhật trạng thái: Hệ thống cập nhật trạng thái hồ sơ sang đã có kết quả hoặc chờ trả kết quả. </w:t>
-      </w:r>
-    </w:p>
-    <w:p>
-      <w:pPr>
-        <w:pStyle w:val="ListParagraph"/>
-        <w:numPr>
-          <w:ilvl w:val="0"/>
-          <w:numId w:val="11"/>
-        </w:numPr>
-        <w:jc w:val="both"/>
-      </w:pPr>
-      <w:r>
-        <w:t xml:space="preserve">Thông báo kết quả: Hệ thống gửi thông báo cho người dân về tình trạng hồ sơ, thời gian và hình thức nhận kết quả. </w:t>
-      </w:r>
-    </w:p>
-    <w:p>
-      <w:pPr>
-        <w:pStyle w:val="ListParagraph"/>
-        <w:numPr>
-          <w:ilvl w:val="0"/>
-          <w:numId w:val="11"/>
-        </w:numPr>
-        <w:jc w:val="both"/>
-      </w:pPr>
-      <w:r>
-        <w:t xml:space="preserve">Xác nhận thanh toán: Trường hợp thủ tục có phí hoặc lệ phí, hệ thống hoặc cán bộ kiểm tra việc hoàn thành nghĩa vụ thanh toán. </w:t>
-      </w:r>
-    </w:p>
-    <w:p>
-      <w:pPr>
-        <w:pStyle w:val="ListParagraph"/>
-        <w:numPr>
-          <w:ilvl w:val="0"/>
-          <w:numId w:val="11"/>
-        </w:numPr>
-        <w:jc w:val="both"/>
-      </w:pPr>
-      <w:r>
-        <w:t xml:space="preserve">Trả kết quả: Kết quả được trả trực tuyến, trực tiếp tại Bộ phận Một cửa hoặc thông qua dịch vụ bưu chính. </w:t>
-      </w:r>
-    </w:p>
-    <w:p>
-      <w:pPr>
-        <w:pStyle w:val="ListParagraph"/>
-        <w:numPr>
-          <w:ilvl w:val="0"/>
-          <w:numId w:val="11"/>
-        </w:numPr>
-        <w:jc w:val="both"/>
-      </w:pPr>
-      <w:r>
-        <w:t>Lưu hồ sơ: Sau khi hoàn thành việc trả kết quả, hệ thống cập nhật trạng thái kết thúc và lưu trữ hồ sơ.</w:t>
-      </w:r>
-    </w:p>
-    <w:p>
-      <w:pPr>
-        <w:jc w:val="both"/>
-      </w:pPr>
-      <w:r>
-        <w:t>ĐỐI TƯỢNG KHÁCH HÀNG</w:t>
-      </w:r>
-    </w:p>
-    <w:p>
-      <w:pPr>
-        <w:ind w:firstLine="720"/>
-        <w:jc w:val="both"/>
-      </w:pPr>
-      <w:r>
-        <w:t>Người dân hoặc tổ chức có hồ sơ đã được giải quyết và đang chờ nhận kết quả.</w:t>
-      </w:r>
-    </w:p>
-    <w:p>
-      <w:pPr>
-        <w:jc w:val="both"/>
-      </w:pPr>
-      <w:r>
-        <w:t>CÁC KẾT QUẢ CÓ THỂ XẢY RA</w:t>
-      </w:r>
-    </w:p>
-    <w:p>
-      <w:pPr>
-        <w:ind w:firstLine="720"/>
-        <w:jc w:val="both"/>
-      </w:pPr>
-      <w:r>
-        <w:lastRenderedPageBreak/>
-        <w:t>Kết quả được trả thành công; hồ sơ chờ người dân đến nhận; hồ sơ chưa được trả do chưa hoàn thành thanh toán; việc giao kết quả qua bưu chính không thành công; hoặc hồ sơ được đóng và lưu trữ sau khi hoàn tất.</w:t>
-      </w:r>
+        <w:pStyle w:val="Heading3"/>
+      </w:pPr>
+      <w:bookmarkStart w:id="24" w:name="_Toc236264129"/>
+      <w:r>
+        <w:t>2.2 Mô hình hóa quy trình quản lý (Processs Management)</w:t>
+      </w:r>
+      <w:r>
+        <w:t>.</w:t>
+      </w:r>
+      <w:bookmarkEnd w:id="24"/>
+    </w:p>
+    <w:p>
+      <w:pPr>
+        <w:pStyle w:val="Heading3"/>
+      </w:pPr>
+      <w:bookmarkStart w:id="25" w:name="_Toc236264130"/>
+      <w:r>
+        <w:t>2.3 Mô hình hóa quy trình cốt lõi (Processs Core)</w:t>
+      </w:r>
+      <w:r>
+        <w:t>.</w:t>
+      </w:r>
+      <w:bookmarkEnd w:id="25"/>
     </w:p>
     <w:p>
       <w:pPr>
         <w:pStyle w:val="Heading4"/>
       </w:pPr>
-      <w:bookmarkStart w:id="24" w:name="_Toc236264128"/>
-      <w:r>
-        <w:t>2.</w:t>
-      </w:r>
-      <w:r>
-        <w:t>1</w:t>
-      </w:r>
-      <w:r>
-        <w:t>.4 Quy trình hỗ trợ (Processs Support)</w:t>
-      </w:r>
-      <w:r>
-        <w:t>.</w:t>
-      </w:r>
-      <w:bookmarkEnd w:id="24"/>
-    </w:p>
-    <w:p>
-      <w:pPr>
-        <w:pStyle w:val="Heading3"/>
-      </w:pPr>
-      <w:bookmarkStart w:id="25" w:name="_Toc236264129"/>
-      <w:r>
-        <w:t>2.2 Mô hình hóa quy trình quản lý (Processs Management)</w:t>
-      </w:r>
-      <w:r>
-        <w:t>.</w:t>
-      </w:r>
-      <w:bookmarkEnd w:id="25"/>
-    </w:p>
-    <w:p>
-      <w:pPr>
-        <w:pStyle w:val="Heading3"/>
-      </w:pPr>
-      <w:bookmarkStart w:id="26" w:name="_Toc236264130"/>
-      <w:r>
-        <w:t>2.3 Mô hình hóa quy trình cốt lõi (Processs Core)</w:t>
-      </w:r>
-      <w:r>
-        <w:t>.</w:t>
-      </w:r>
-      <w:bookmarkEnd w:id="26"/>
-    </w:p>
-    <w:p>
-      <w:pPr>
-        <w:pStyle w:val="Heading4"/>
-      </w:pPr>
       <w:r>
         <w:t>2.3.1 Mô hình hóa quy trình tiếp nhận hồ sơ</w:t>
       </w:r>
     </w:p>
     <w:p>
       <w:r>
-        <w:rPr>
-          <w:noProof/>
-        </w:rPr>
         <w:drawing>
-          <wp:inline distT="0" distB="0" distL="0" distR="0" wp14:anchorId="5429ADB0" wp14:editId="5CFBA753">
-            <wp:extent cx="5731510" cy="1784350"/>
-            <wp:effectExtent l="0" t="0" r="2540" b="6350"/>
-            <wp:docPr id="864215819" name="Picture 1"/>
+          <wp:inline distT="0" distB="0" distL="0" distR="0" wp14:anchorId="78827D8D" wp14:editId="1B1CA3A0">
+            <wp:extent cx="5731510" cy="2157730"/>
+            <wp:effectExtent l="0" t="0" r="2540" b="0"/>
+            <wp:docPr id="628094679" name="Picture 23"/>
             <wp:cNvGraphicFramePr>
               <a:graphicFrameLocks xmlns:a="http://schemas.openxmlformats.org/drawingml/2006/main" noChangeAspect="1"/>
             </wp:cNvGraphicFramePr>
@@ -6571,23 +7534,36 @@
               <a:graphicData uri="http://schemas.openxmlformats.org/drawingml/2006/picture">
                 <pic:pic xmlns:pic="http://schemas.openxmlformats.org/drawingml/2006/picture">
                   <pic:nvPicPr>
-                    <pic:cNvPr id="864215819" name=""/>
-                    <pic:cNvPicPr/>
+                    <pic:cNvPr id="0" name="Picture 16"/>
+                    <pic:cNvPicPr>
+                      <a:picLocks noChangeAspect="1" noChangeArrowheads="1"/>
+                    </pic:cNvPicPr>
                   </pic:nvPicPr>
                   <pic:blipFill>
-                    <a:blip r:embed="rId13"/>
+                    <a:blip r:embed="rId13" cstate="print">
+                      <a:extLst>
+                        <a:ext uri="{28A0092B-C50C-407E-A947-70E740481C1C}">
+                          <a14:useLocalDpi xmlns:a14="http://schemas.microsoft.com/office/drawing/2010/main" val="0"/>
+                        </a:ext>
+                      </a:extLst>
+                    </a:blip>
+                    <a:srcRect/>
                     <a:stretch>
                       <a:fillRect/>
                     </a:stretch>
                   </pic:blipFill>
-                  <pic:spPr>
+                  <pic:spPr bwMode="auto">
                     <a:xfrm>
                       <a:off x="0" y="0"/>
-                      <a:ext cx="5731510" cy="1784350"/>
+                      <a:ext cx="5731510" cy="2157730"/>
                     </a:xfrm>
                     <a:prstGeom prst="rect">
                       <a:avLst/>
                     </a:prstGeom>
+                    <a:noFill/>
+                    <a:ln>
+                      <a:noFill/>
+                    </a:ln>
                   </pic:spPr>
                 </pic:pic>
               </a:graphicData>
@@ -6898,7 +7874,11 @@
           </w:tcPr>
           <w:p>
             <w:r>
-              <w:t>Cá nhân hoặc tổ chức chuẩn bị hồ sơ theo thành phần quy định và nộp trực tiếp tại Bộ phận Một cửa. Hồ sơ bao gồm đơn đề nghị, giấy tờ pháp lý và các tài liệu chuyên ngành có liên quan đến thủ tục hành chính cần giải quyết.</w:t>
+              <w:t xml:space="preserve">Cá nhân hoặc tổ chức chuẩn bị hồ sơ theo thành phần quy định và nộp trực tiếp tại Bộ phận Một cửa. Hồ sơ bao gồm đơn đề </w:t>
+            </w:r>
+            <w:r>
+              <w:lastRenderedPageBreak/>
+              <w:t>nghị, giấy tờ pháp lý và các tài liệu chuyên ngành có liên quan đến thủ tục hành chính cần giải quyết.</w:t>
             </w:r>
           </w:p>
         </w:tc>
@@ -6923,6 +7903,7 @@
           </w:tcPr>
           <w:p>
             <w:r>
+              <w:lastRenderedPageBreak/>
               <w:t>2</w:t>
             </w:r>
           </w:p>
@@ -7017,7 +7998,6 @@
           </w:tcPr>
           <w:p>
             <w:r>
-              <w:lastRenderedPageBreak/>
               <w:t>3</w:t>
             </w:r>
           </w:p>
@@ -7369,7 +8349,11 @@
           </w:tcPr>
           <w:p>
             <w:r>
-              <w:t>Nếu người nộp chưa có tài khoản trên hệ thống của Bộ, ngành, địa phương, hệ thống tạo tài khoản tương ứng và liên kết với tài khoản Cổng Dịch vụ công quốc gia thông qua thông tin định danh duy nhất của cá nhân hoặc tổ chức.</w:t>
+              <w:t xml:space="preserve">Nếu người nộp chưa có tài khoản trên hệ thống của Bộ, ngành, địa phương, hệ thống tạo tài khoản tương ứng và liên kết với tài khoản Cổng Dịch vụ công quốc gia </w:t>
+            </w:r>
+            <w:r>
+              <w:lastRenderedPageBreak/>
+              <w:t>thông qua thông tin định danh duy nhất của cá nhân hoặc tổ chức.</w:t>
             </w:r>
           </w:p>
         </w:tc>
@@ -7394,6 +8378,7 @@
           </w:tcPr>
           <w:p>
             <w:r>
+              <w:lastRenderedPageBreak/>
               <w:t>7</w:t>
             </w:r>
           </w:p>
@@ -7511,11 +8496,7 @@
           </w:tcPr>
           <w:p>
             <w:r>
-              <w:t xml:space="preserve">B8: Kiểm tra thành phần, số </w:t>
-            </w:r>
-            <w:r>
-              <w:lastRenderedPageBreak/>
-              <w:t>lượng và tính hợp lệ</w:t>
+              <w:t>B8: Kiểm tra thành phần, số lượng và tính hợp lệ</w:t>
             </w:r>
           </w:p>
         </w:tc>
@@ -7538,7 +8519,6 @@
           </w:tcPr>
           <w:p>
             <w:r>
-              <w:lastRenderedPageBreak/>
               <w:t>Cán bộ một cửa</w:t>
             </w:r>
           </w:p>
@@ -7562,11 +8542,7 @@
           </w:tcPr>
           <w:p>
             <w:r>
-              <w:t xml:space="preserve">Cán bộ đối chiếu hồ sơ thực tế với thành phần hồ sơ theo quy định. Nội dung kiểm </w:t>
-            </w:r>
-            <w:r>
-              <w:lastRenderedPageBreak/>
-              <w:t>tra bao gồm số lượng tài liệu, mức độ đầy đủ, tính chính xác, tính hợp lệ và việc hồ sơ có thuộc thẩm quyền giải quyết của cơ quan hay không.</w:t>
+              <w:t>Cán bộ đối chiếu hồ sơ thực tế với thành phần hồ sơ theo quy định. Nội dung kiểm tra bao gồm số lượng tài liệu, mức độ đầy đủ, tính chính xác, tính hợp lệ và việc hồ sơ có thuộc thẩm quyền giải quyết của cơ quan hay không.</w:t>
             </w:r>
           </w:p>
         </w:tc>
@@ -7591,7 +8567,6 @@
           </w:tcPr>
           <w:p>
             <w:r>
-              <w:lastRenderedPageBreak/>
               <w:t>9</w:t>
             </w:r>
           </w:p>
@@ -7722,6 +8697,7 @@
           </w:tcPr>
           <w:p>
             <w:r>
+              <w:lastRenderedPageBreak/>
               <w:t>10</w:t>
             </w:r>
           </w:p>
@@ -7910,7 +8886,6 @@
           </w:tcPr>
           <w:p>
             <w:r>
-              <w:lastRenderedPageBreak/>
               <w:t>12</w:t>
             </w:r>
           </w:p>
@@ -8262,7 +9237,11 @@
           </w:tcPr>
           <w:p>
             <w:r>
-              <w:t>Cán bộ một cửa chuyển hồ sơ điện tử và các tài liệu có liên quan đến cán bộ hoặc đơn vị chuyên môn có trách nhiệm xử lý. Hệ thống ghi nhận việc chuyển hồ sơ và cập nhật hồ sơ sang trạng thái đang xử lý.</w:t>
+              <w:t xml:space="preserve">Cán bộ một cửa chuyển hồ sơ điện tử và các tài liệu có liên quan đến cán bộ hoặc đơn vị chuyên môn có trách nhiệm xử lý. </w:t>
+            </w:r>
+            <w:r>
+              <w:lastRenderedPageBreak/>
+              <w:t>Hệ thống ghi nhận việc chuyển hồ sơ và cập nhật hồ sơ sang trạng thái đang xử lý.</w:t>
             </w:r>
           </w:p>
         </w:tc>
@@ -8287,6 +9266,7 @@
           </w:tcPr>
           <w:p>
             <w:r>
+              <w:lastRenderedPageBreak/>
               <w:t>16</w:t>
             </w:r>
           </w:p>
@@ -8450,11 +9430,7 @@
           </w:tcPr>
           <w:p>
             <w:r>
-              <w:t xml:space="preserve">Khi cần thêm căn cứ, cán bộ chuyên môn thực hiện thẩm tra, xác minh hoặc gửi yêu cầu lấy ý kiến cơ quan phối hợp. Kết quả xác minh và ý kiến phản hồi được số </w:t>
-            </w:r>
-            <w:r>
-              <w:lastRenderedPageBreak/>
-              <w:t>hóa, cập nhật và lưu cùng hồ sơ để làm căn cứ xử lý.</w:t>
+              <w:t>Khi cần thêm căn cứ, cán bộ chuyên môn thực hiện thẩm tra, xác minh hoặc gửi yêu cầu lấy ý kiến cơ quan phối hợp. Kết quả xác minh và ý kiến phản hồi được số hóa, cập nhật và lưu cùng hồ sơ để làm căn cứ xử lý.</w:t>
             </w:r>
           </w:p>
         </w:tc>
@@ -8479,7 +9455,6 @@
           </w:tcPr>
           <w:p>
             <w:r>
-              <w:lastRenderedPageBreak/>
               <w:t>18</w:t>
             </w:r>
           </w:p>
@@ -9548,11 +10523,11 @@
       <w:pPr>
         <w:pStyle w:val="Heading3"/>
       </w:pPr>
-      <w:bookmarkStart w:id="27" w:name="_Toc236264131"/>
+      <w:bookmarkStart w:id="26" w:name="_Toc236264131"/>
       <w:r>
         <w:t>2.4 Mô hình hóa quy trình hỗ trợ (Processs Support)</w:t>
       </w:r>
-      <w:bookmarkEnd w:id="27"/>
+      <w:bookmarkEnd w:id="26"/>
     </w:p>
     <w:p/>
     <w:p/>
@@ -9575,7 +10550,7 @@
       <w:pPr>
         <w:pStyle w:val="Heading1"/>
       </w:pPr>
-      <w:bookmarkStart w:id="28" w:name="_Toc236264132"/>
+      <w:bookmarkStart w:id="27" w:name="_Toc236264132"/>
       <w:r>
         <w:lastRenderedPageBreak/>
         <w:t xml:space="preserve">Chương III. </w:t>
@@ -9586,7 +10561,7 @@
       <w:r>
         <w:t>.</w:t>
       </w:r>
-      <w:bookmarkEnd w:id="28"/>
+      <w:bookmarkEnd w:id="27"/>
     </w:p>
     <w:p>
       <w:pPr>
@@ -9652,7 +10627,7 @@
       <w:pPr>
         <w:pStyle w:val="Heading1"/>
       </w:pPr>
-      <w:bookmarkStart w:id="29" w:name="_Toc236264133"/>
+      <w:bookmarkStart w:id="28" w:name="_Toc236264133"/>
       <w:r>
         <w:lastRenderedPageBreak/>
         <w:t xml:space="preserve">Chương IV. </w:t>
@@ -9663,11 +10638,10 @@
       <w:r>
         <w:t>.</w:t>
       </w:r>
-      <w:bookmarkEnd w:id="29"/>
-    </w:p>
-    <w:p>
-      <w:pPr>
-        <w:jc w:val="both"/>
+      <w:bookmarkEnd w:id="28"/>
+    </w:p>
+    <w:p>
+      <w:pPr>
         <w:rPr>
           <w:rFonts w:cs="Times New Roman"/>
           <w:szCs w:val="26"/>
@@ -9771,12 +10745,12 @@
       <w:pPr>
         <w:pStyle w:val="Heading1"/>
       </w:pPr>
-      <w:bookmarkStart w:id="30" w:name="_Toc236264134"/>
+      <w:bookmarkStart w:id="29" w:name="_Toc236264134"/>
       <w:r>
         <w:lastRenderedPageBreak/>
         <w:t>NGUỒN THAM KHẢO</w:t>
       </w:r>
-      <w:bookmarkEnd w:id="30"/>
+      <w:bookmarkEnd w:id="29"/>
     </w:p>
     <w:p>
       <w:pPr>
@@ -9785,7 +10759,6 @@
           <w:ilvl w:val="0"/>
           <w:numId w:val="6"/>
         </w:numPr>
-        <w:jc w:val="both"/>
       </w:pPr>
       <w:hyperlink r:id="rId15" w:anchor="ID0EBBF=Getting_started" w:history="1">
         <w:r>
@@ -9815,7 +10788,6 @@
           <w:ilvl w:val="0"/>
           <w:numId w:val="6"/>
         </w:numPr>
-        <w:jc w:val="both"/>
       </w:pPr>
       <w:r>
         <w:t>J. Kim, C. Ko, A. Frenzel, S. Ramanathan, and J. E. Homan, Nanoscale imaging and control of resistance switching in VO2 at room temperature, Applied Physics Letters 96, 213106 (2010)</w:t>
@@ -9840,7 +10812,6 @@
           <w:ilvl w:val="0"/>
           <w:numId w:val="6"/>
         </w:numPr>
-        <w:jc w:val="both"/>
       </w:pPr>
       <w:r>
         <w:t>Giáo trình</w:t>
@@ -10348,6 +11319,119 @@
     </w:lvl>
   </w:abstractNum>
   <w:abstractNum w:abstractNumId="2" w15:restartNumberingAfterBreak="0">
+    <w:nsid w:val="037A0B8C"/>
+    <w:multiLevelType w:val="hybridMultilevel"/>
+    <w:tmpl w:val="3220468C"/>
+    <w:lvl w:ilvl="0" w:tplc="04090001">
+      <w:start w:val="1"/>
+      <w:numFmt w:val="bullet"/>
+      <w:lvlText w:val=""/>
+      <w:lvlJc w:val="left"/>
+      <w:pPr>
+        <w:ind w:left="1800" w:hanging="360"/>
+      </w:pPr>
+      <w:rPr>
+        <w:rFonts w:ascii="Symbol" w:hAnsi="Symbol" w:hint="default"/>
+      </w:rPr>
+    </w:lvl>
+    <w:lvl w:ilvl="1" w:tplc="04090003" w:tentative="1">
+      <w:start w:val="1"/>
+      <w:numFmt w:val="bullet"/>
+      <w:lvlText w:val="o"/>
+      <w:lvlJc w:val="left"/>
+      <w:pPr>
+        <w:ind w:left="2520" w:hanging="360"/>
+      </w:pPr>
+      <w:rPr>
+        <w:rFonts w:ascii="Courier New" w:hAnsi="Courier New" w:cs="Courier New" w:hint="default"/>
+      </w:rPr>
+    </w:lvl>
+    <w:lvl w:ilvl="2" w:tplc="04090005" w:tentative="1">
+      <w:start w:val="1"/>
+      <w:numFmt w:val="bullet"/>
+      <w:lvlText w:val=""/>
+      <w:lvlJc w:val="left"/>
+      <w:pPr>
+        <w:ind w:left="3240" w:hanging="360"/>
+      </w:pPr>
+      <w:rPr>
+        <w:rFonts w:ascii="Wingdings" w:hAnsi="Wingdings" w:hint="default"/>
+      </w:rPr>
+    </w:lvl>
+    <w:lvl w:ilvl="3" w:tplc="04090001" w:tentative="1">
+      <w:start w:val="1"/>
+      <w:numFmt w:val="bullet"/>
+      <w:lvlText w:val=""/>
+      <w:lvlJc w:val="left"/>
+      <w:pPr>
+        <w:ind w:left="3960" w:hanging="360"/>
+      </w:pPr>
+      <w:rPr>
+        <w:rFonts w:ascii="Symbol" w:hAnsi="Symbol" w:hint="default"/>
+      </w:rPr>
+    </w:lvl>
+    <w:lvl w:ilvl="4" w:tplc="04090003" w:tentative="1">
+      <w:start w:val="1"/>
+      <w:numFmt w:val="bullet"/>
+      <w:lvlText w:val="o"/>
+      <w:lvlJc w:val="left"/>
+      <w:pPr>
+        <w:ind w:left="4680" w:hanging="360"/>
+      </w:pPr>
+      <w:rPr>
+        <w:rFonts w:ascii="Courier New" w:hAnsi="Courier New" w:cs="Courier New" w:hint="default"/>
+      </w:rPr>
+    </w:lvl>
+    <w:lvl w:ilvl="5" w:tplc="04090005" w:tentative="1">
+      <w:start w:val="1"/>
+      <w:numFmt w:val="bullet"/>
+      <w:lvlText w:val=""/>
+      <w:lvlJc w:val="left"/>
+      <w:pPr>
+        <w:ind w:left="5400" w:hanging="360"/>
+      </w:pPr>
+      <w:rPr>
+        <w:rFonts w:ascii="Wingdings" w:hAnsi="Wingdings" w:hint="default"/>
+      </w:rPr>
+    </w:lvl>
+    <w:lvl w:ilvl="6" w:tplc="04090001" w:tentative="1">
+      <w:start w:val="1"/>
+      <w:numFmt w:val="bullet"/>
+      <w:lvlText w:val=""/>
+      <w:lvlJc w:val="left"/>
+      <w:pPr>
+        <w:ind w:left="6120" w:hanging="360"/>
+      </w:pPr>
+      <w:rPr>
+        <w:rFonts w:ascii="Symbol" w:hAnsi="Symbol" w:hint="default"/>
+      </w:rPr>
+    </w:lvl>
+    <w:lvl w:ilvl="7" w:tplc="04090003" w:tentative="1">
+      <w:start w:val="1"/>
+      <w:numFmt w:val="bullet"/>
+      <w:lvlText w:val="o"/>
+      <w:lvlJc w:val="left"/>
+      <w:pPr>
+        <w:ind w:left="6840" w:hanging="360"/>
+      </w:pPr>
+      <w:rPr>
+        <w:rFonts w:ascii="Courier New" w:hAnsi="Courier New" w:cs="Courier New" w:hint="default"/>
+      </w:rPr>
+    </w:lvl>
+    <w:lvl w:ilvl="8" w:tplc="04090005" w:tentative="1">
+      <w:start w:val="1"/>
+      <w:numFmt w:val="bullet"/>
+      <w:lvlText w:val=""/>
+      <w:lvlJc w:val="left"/>
+      <w:pPr>
+        <w:ind w:left="7560" w:hanging="360"/>
+      </w:pPr>
+      <w:rPr>
+        <w:rFonts w:ascii="Wingdings" w:hAnsi="Wingdings" w:hint="default"/>
+      </w:rPr>
+    </w:lvl>
+  </w:abstractNum>
+  <w:abstractNum w:abstractNumId="3" w15:restartNumberingAfterBreak="0">
     <w:nsid w:val="0A674874"/>
     <w:multiLevelType w:val="multilevel"/>
     <w:tmpl w:val="BF526570"/>
@@ -10496,7 +11580,7 @@
       </w:rPr>
     </w:lvl>
   </w:abstractNum>
-  <w:abstractNum w:abstractNumId="3" w15:restartNumberingAfterBreak="0">
+  <w:abstractNum w:abstractNumId="4" w15:restartNumberingAfterBreak="0">
     <w:nsid w:val="109017F3"/>
     <w:multiLevelType w:val="multilevel"/>
     <w:tmpl w:val="0DAE3936"/>
@@ -10645,7 +11729,7 @@
       </w:rPr>
     </w:lvl>
   </w:abstractNum>
-  <w:abstractNum w:abstractNumId="4" w15:restartNumberingAfterBreak="0">
+  <w:abstractNum w:abstractNumId="5" w15:restartNumberingAfterBreak="0">
     <w:nsid w:val="15B91047"/>
     <w:multiLevelType w:val="multilevel"/>
     <w:tmpl w:val="35E4E3CE"/>
@@ -10794,7 +11878,7 @@
       </w:rPr>
     </w:lvl>
   </w:abstractNum>
-  <w:abstractNum w:abstractNumId="5" w15:restartNumberingAfterBreak="0">
+  <w:abstractNum w:abstractNumId="6" w15:restartNumberingAfterBreak="0">
     <w:nsid w:val="16EC1016"/>
     <w:multiLevelType w:val="multilevel"/>
     <w:tmpl w:val="AE6CE97E"/>
@@ -10943,7 +12027,7 @@
       </w:rPr>
     </w:lvl>
   </w:abstractNum>
-  <w:abstractNum w:abstractNumId="6" w15:restartNumberingAfterBreak="0">
+  <w:abstractNum w:abstractNumId="7" w15:restartNumberingAfterBreak="0">
     <w:nsid w:val="17734325"/>
     <w:multiLevelType w:val="hybridMultilevel"/>
     <w:tmpl w:val="1FD45FEA"/>
@@ -11032,7 +12116,156 @@
       </w:pPr>
     </w:lvl>
   </w:abstractNum>
-  <w:abstractNum w:abstractNumId="7" w15:restartNumberingAfterBreak="0">
+  <w:abstractNum w:abstractNumId="8" w15:restartNumberingAfterBreak="0">
+    <w:nsid w:val="230E01F4"/>
+    <w:multiLevelType w:val="multilevel"/>
+    <w:tmpl w:val="1292C18C"/>
+    <w:lvl w:ilvl="0">
+      <w:start w:val="1"/>
+      <w:numFmt w:val="bullet"/>
+      <w:lvlText w:val=""/>
+      <w:lvlJc w:val="left"/>
+      <w:pPr>
+        <w:tabs>
+          <w:tab w:val="num" w:pos="720"/>
+        </w:tabs>
+        <w:ind w:left="720" w:hanging="360"/>
+      </w:pPr>
+      <w:rPr>
+        <w:rFonts w:ascii="Symbol" w:hAnsi="Symbol" w:hint="default"/>
+        <w:sz w:val="20"/>
+      </w:rPr>
+    </w:lvl>
+    <w:lvl w:ilvl="1" w:tentative="1">
+      <w:start w:val="1"/>
+      <w:numFmt w:val="bullet"/>
+      <w:lvlText w:val="o"/>
+      <w:lvlJc w:val="left"/>
+      <w:pPr>
+        <w:tabs>
+          <w:tab w:val="num" w:pos="1440"/>
+        </w:tabs>
+        <w:ind w:left="1440" w:hanging="360"/>
+      </w:pPr>
+      <w:rPr>
+        <w:rFonts w:ascii="Courier New" w:hAnsi="Courier New" w:hint="default"/>
+        <w:sz w:val="20"/>
+      </w:rPr>
+    </w:lvl>
+    <w:lvl w:ilvl="2" w:tentative="1">
+      <w:start w:val="1"/>
+      <w:numFmt w:val="bullet"/>
+      <w:lvlText w:val=""/>
+      <w:lvlJc w:val="left"/>
+      <w:pPr>
+        <w:tabs>
+          <w:tab w:val="num" w:pos="2160"/>
+        </w:tabs>
+        <w:ind w:left="2160" w:hanging="360"/>
+      </w:pPr>
+      <w:rPr>
+        <w:rFonts w:ascii="Wingdings" w:hAnsi="Wingdings" w:hint="default"/>
+        <w:sz w:val="20"/>
+      </w:rPr>
+    </w:lvl>
+    <w:lvl w:ilvl="3" w:tentative="1">
+      <w:start w:val="1"/>
+      <w:numFmt w:val="bullet"/>
+      <w:lvlText w:val=""/>
+      <w:lvlJc w:val="left"/>
+      <w:pPr>
+        <w:tabs>
+          <w:tab w:val="num" w:pos="2880"/>
+        </w:tabs>
+        <w:ind w:left="2880" w:hanging="360"/>
+      </w:pPr>
+      <w:rPr>
+        <w:rFonts w:ascii="Wingdings" w:hAnsi="Wingdings" w:hint="default"/>
+        <w:sz w:val="20"/>
+      </w:rPr>
+    </w:lvl>
+    <w:lvl w:ilvl="4" w:tentative="1">
+      <w:start w:val="1"/>
+      <w:numFmt w:val="bullet"/>
+      <w:lvlText w:val=""/>
+      <w:lvlJc w:val="left"/>
+      <w:pPr>
+        <w:tabs>
+          <w:tab w:val="num" w:pos="3600"/>
+        </w:tabs>
+        <w:ind w:left="3600" w:hanging="360"/>
+      </w:pPr>
+      <w:rPr>
+        <w:rFonts w:ascii="Wingdings" w:hAnsi="Wingdings" w:hint="default"/>
+        <w:sz w:val="20"/>
+      </w:rPr>
+    </w:lvl>
+    <w:lvl w:ilvl="5" w:tentative="1">
+      <w:start w:val="1"/>
+      <w:numFmt w:val="bullet"/>
+      <w:lvlText w:val=""/>
+      <w:lvlJc w:val="left"/>
+      <w:pPr>
+        <w:tabs>
+          <w:tab w:val="num" w:pos="4320"/>
+        </w:tabs>
+        <w:ind w:left="4320" w:hanging="360"/>
+      </w:pPr>
+      <w:rPr>
+        <w:rFonts w:ascii="Wingdings" w:hAnsi="Wingdings" w:hint="default"/>
+        <w:sz w:val="20"/>
+      </w:rPr>
+    </w:lvl>
+    <w:lvl w:ilvl="6" w:tentative="1">
+      <w:start w:val="1"/>
+      <w:numFmt w:val="bullet"/>
+      <w:lvlText w:val=""/>
+      <w:lvlJc w:val="left"/>
+      <w:pPr>
+        <w:tabs>
+          <w:tab w:val="num" w:pos="5040"/>
+        </w:tabs>
+        <w:ind w:left="5040" w:hanging="360"/>
+      </w:pPr>
+      <w:rPr>
+        <w:rFonts w:ascii="Wingdings" w:hAnsi="Wingdings" w:hint="default"/>
+        <w:sz w:val="20"/>
+      </w:rPr>
+    </w:lvl>
+    <w:lvl w:ilvl="7" w:tentative="1">
+      <w:start w:val="1"/>
+      <w:numFmt w:val="bullet"/>
+      <w:lvlText w:val=""/>
+      <w:lvlJc w:val="left"/>
+      <w:pPr>
+        <w:tabs>
+          <w:tab w:val="num" w:pos="5760"/>
+        </w:tabs>
+        <w:ind w:left="5760" w:hanging="360"/>
+      </w:pPr>
+      <w:rPr>
+        <w:rFonts w:ascii="Wingdings" w:hAnsi="Wingdings" w:hint="default"/>
+        <w:sz w:val="20"/>
+      </w:rPr>
+    </w:lvl>
+    <w:lvl w:ilvl="8" w:tentative="1">
+      <w:start w:val="1"/>
+      <w:numFmt w:val="bullet"/>
+      <w:lvlText w:val=""/>
+      <w:lvlJc w:val="left"/>
+      <w:pPr>
+        <w:tabs>
+          <w:tab w:val="num" w:pos="6480"/>
+        </w:tabs>
+        <w:ind w:left="6480" w:hanging="360"/>
+      </w:pPr>
+      <w:rPr>
+        <w:rFonts w:ascii="Wingdings" w:hAnsi="Wingdings" w:hint="default"/>
+        <w:sz w:val="20"/>
+      </w:rPr>
+    </w:lvl>
+  </w:abstractNum>
+  <w:abstractNum w:abstractNumId="9" w15:restartNumberingAfterBreak="0">
     <w:nsid w:val="258A6B72"/>
     <w:multiLevelType w:val="hybridMultilevel"/>
     <w:tmpl w:val="93EEA88E"/>
@@ -11121,7 +12354,7 @@
       </w:pPr>
     </w:lvl>
   </w:abstractNum>
-  <w:abstractNum w:abstractNumId="8" w15:restartNumberingAfterBreak="0">
+  <w:abstractNum w:abstractNumId="10" w15:restartNumberingAfterBreak="0">
     <w:nsid w:val="284D3CE7"/>
     <w:multiLevelType w:val="hybridMultilevel"/>
     <w:tmpl w:val="616A90C8"/>
@@ -11213,7 +12446,7 @@
       </w:pPr>
     </w:lvl>
   </w:abstractNum>
-  <w:abstractNum w:abstractNumId="9" w15:restartNumberingAfterBreak="0">
+  <w:abstractNum w:abstractNumId="11" w15:restartNumberingAfterBreak="0">
     <w:nsid w:val="3B0A358A"/>
     <w:multiLevelType w:val="multilevel"/>
     <w:tmpl w:val="39B8C2D8"/>
@@ -11362,7 +12595,7 @@
       </w:rPr>
     </w:lvl>
   </w:abstractNum>
-  <w:abstractNum w:abstractNumId="10" w15:restartNumberingAfterBreak="0">
+  <w:abstractNum w:abstractNumId="12" w15:restartNumberingAfterBreak="0">
     <w:nsid w:val="40D8608A"/>
     <w:multiLevelType w:val="hybridMultilevel"/>
     <w:tmpl w:val="979CD868"/>
@@ -11451,7 +12684,7 @@
       </w:pPr>
     </w:lvl>
   </w:abstractNum>
-  <w:abstractNum w:abstractNumId="11" w15:restartNumberingAfterBreak="0">
+  <w:abstractNum w:abstractNumId="13" w15:restartNumberingAfterBreak="0">
     <w:nsid w:val="46A44212"/>
     <w:multiLevelType w:val="hybridMultilevel"/>
     <w:tmpl w:val="B42A62EC"/>
@@ -11563,7 +12796,7 @@
       </w:rPr>
     </w:lvl>
   </w:abstractNum>
-  <w:abstractNum w:abstractNumId="12" w15:restartNumberingAfterBreak="0">
+  <w:abstractNum w:abstractNumId="14" w15:restartNumberingAfterBreak="0">
     <w:nsid w:val="46EB5F37"/>
     <w:multiLevelType w:val="hybridMultilevel"/>
     <w:tmpl w:val="FC529674"/>
@@ -11649,7 +12882,7 @@
       </w:pPr>
     </w:lvl>
   </w:abstractNum>
-  <w:abstractNum w:abstractNumId="13" w15:restartNumberingAfterBreak="0">
+  <w:abstractNum w:abstractNumId="15" w15:restartNumberingAfterBreak="0">
     <w:nsid w:val="49481468"/>
     <w:multiLevelType w:val="multilevel"/>
     <w:tmpl w:val="161484C8"/>
@@ -11798,7 +13031,120 @@
       </w:rPr>
     </w:lvl>
   </w:abstractNum>
-  <w:abstractNum w:abstractNumId="14" w15:restartNumberingAfterBreak="0">
+  <w:abstractNum w:abstractNumId="16" w15:restartNumberingAfterBreak="0">
+    <w:nsid w:val="495041CA"/>
+    <w:multiLevelType w:val="hybridMultilevel"/>
+    <w:tmpl w:val="692C1A52"/>
+    <w:lvl w:ilvl="0" w:tplc="04090001">
+      <w:start w:val="1"/>
+      <w:numFmt w:val="bullet"/>
+      <w:lvlText w:val=""/>
+      <w:lvlJc w:val="left"/>
+      <w:pPr>
+        <w:ind w:left="1800" w:hanging="360"/>
+      </w:pPr>
+      <w:rPr>
+        <w:rFonts w:ascii="Symbol" w:hAnsi="Symbol" w:hint="default"/>
+      </w:rPr>
+    </w:lvl>
+    <w:lvl w:ilvl="1" w:tplc="04090003" w:tentative="1">
+      <w:start w:val="1"/>
+      <w:numFmt w:val="bullet"/>
+      <w:lvlText w:val="o"/>
+      <w:lvlJc w:val="left"/>
+      <w:pPr>
+        <w:ind w:left="2520" w:hanging="360"/>
+      </w:pPr>
+      <w:rPr>
+        <w:rFonts w:ascii="Courier New" w:hAnsi="Courier New" w:cs="Courier New" w:hint="default"/>
+      </w:rPr>
+    </w:lvl>
+    <w:lvl w:ilvl="2" w:tplc="04090005" w:tentative="1">
+      <w:start w:val="1"/>
+      <w:numFmt w:val="bullet"/>
+      <w:lvlText w:val=""/>
+      <w:lvlJc w:val="left"/>
+      <w:pPr>
+        <w:ind w:left="3240" w:hanging="360"/>
+      </w:pPr>
+      <w:rPr>
+        <w:rFonts w:ascii="Wingdings" w:hAnsi="Wingdings" w:hint="default"/>
+      </w:rPr>
+    </w:lvl>
+    <w:lvl w:ilvl="3" w:tplc="04090001" w:tentative="1">
+      <w:start w:val="1"/>
+      <w:numFmt w:val="bullet"/>
+      <w:lvlText w:val=""/>
+      <w:lvlJc w:val="left"/>
+      <w:pPr>
+        <w:ind w:left="3960" w:hanging="360"/>
+      </w:pPr>
+      <w:rPr>
+        <w:rFonts w:ascii="Symbol" w:hAnsi="Symbol" w:hint="default"/>
+      </w:rPr>
+    </w:lvl>
+    <w:lvl w:ilvl="4" w:tplc="04090003" w:tentative="1">
+      <w:start w:val="1"/>
+      <w:numFmt w:val="bullet"/>
+      <w:lvlText w:val="o"/>
+      <w:lvlJc w:val="left"/>
+      <w:pPr>
+        <w:ind w:left="4680" w:hanging="360"/>
+      </w:pPr>
+      <w:rPr>
+        <w:rFonts w:ascii="Courier New" w:hAnsi="Courier New" w:cs="Courier New" w:hint="default"/>
+      </w:rPr>
+    </w:lvl>
+    <w:lvl w:ilvl="5" w:tplc="04090005" w:tentative="1">
+      <w:start w:val="1"/>
+      <w:numFmt w:val="bullet"/>
+      <w:lvlText w:val=""/>
+      <w:lvlJc w:val="left"/>
+      <w:pPr>
+        <w:ind w:left="5400" w:hanging="360"/>
+      </w:pPr>
+      <w:rPr>
+        <w:rFonts w:ascii="Wingdings" w:hAnsi="Wingdings" w:hint="default"/>
+      </w:rPr>
+    </w:lvl>
+    <w:lvl w:ilvl="6" w:tplc="04090001" w:tentative="1">
+      <w:start w:val="1"/>
+      <w:numFmt w:val="bullet"/>
+      <w:lvlText w:val=""/>
+      <w:lvlJc w:val="left"/>
+      <w:pPr>
+        <w:ind w:left="6120" w:hanging="360"/>
+      </w:pPr>
+      <w:rPr>
+        <w:rFonts w:ascii="Symbol" w:hAnsi="Symbol" w:hint="default"/>
+      </w:rPr>
+    </w:lvl>
+    <w:lvl w:ilvl="7" w:tplc="04090003" w:tentative="1">
+      <w:start w:val="1"/>
+      <w:numFmt w:val="bullet"/>
+      <w:lvlText w:val="o"/>
+      <w:lvlJc w:val="left"/>
+      <w:pPr>
+        <w:ind w:left="6840" w:hanging="360"/>
+      </w:pPr>
+      <w:rPr>
+        <w:rFonts w:ascii="Courier New" w:hAnsi="Courier New" w:cs="Courier New" w:hint="default"/>
+      </w:rPr>
+    </w:lvl>
+    <w:lvl w:ilvl="8" w:tplc="04090005" w:tentative="1">
+      <w:start w:val="1"/>
+      <w:numFmt w:val="bullet"/>
+      <w:lvlText w:val=""/>
+      <w:lvlJc w:val="left"/>
+      <w:pPr>
+        <w:ind w:left="7560" w:hanging="360"/>
+      </w:pPr>
+      <w:rPr>
+        <w:rFonts w:ascii="Wingdings" w:hAnsi="Wingdings" w:hint="default"/>
+      </w:rPr>
+    </w:lvl>
+  </w:abstractNum>
+  <w:abstractNum w:abstractNumId="17" w15:restartNumberingAfterBreak="0">
     <w:nsid w:val="4B775142"/>
     <w:multiLevelType w:val="hybridMultilevel"/>
     <w:tmpl w:val="86AE5CE4"/>
@@ -11911,7 +13257,156 @@
       </w:rPr>
     </w:lvl>
   </w:abstractNum>
-  <w:abstractNum w:abstractNumId="15" w15:restartNumberingAfterBreak="0">
+  <w:abstractNum w:abstractNumId="18" w15:restartNumberingAfterBreak="0">
+    <w:nsid w:val="4D7C63B1"/>
+    <w:multiLevelType w:val="multilevel"/>
+    <w:tmpl w:val="B1964CE6"/>
+    <w:lvl w:ilvl="0">
+      <w:start w:val="1"/>
+      <w:numFmt w:val="bullet"/>
+      <w:lvlText w:val=""/>
+      <w:lvlJc w:val="left"/>
+      <w:pPr>
+        <w:tabs>
+          <w:tab w:val="num" w:pos="1800"/>
+        </w:tabs>
+        <w:ind w:left="1800" w:hanging="360"/>
+      </w:pPr>
+      <w:rPr>
+        <w:rFonts w:ascii="Symbol" w:hAnsi="Symbol" w:hint="default"/>
+        <w:sz w:val="20"/>
+      </w:rPr>
+    </w:lvl>
+    <w:lvl w:ilvl="1" w:tentative="1">
+      <w:start w:val="1"/>
+      <w:numFmt w:val="bullet"/>
+      <w:lvlText w:val="o"/>
+      <w:lvlJc w:val="left"/>
+      <w:pPr>
+        <w:tabs>
+          <w:tab w:val="num" w:pos="2520"/>
+        </w:tabs>
+        <w:ind w:left="2520" w:hanging="360"/>
+      </w:pPr>
+      <w:rPr>
+        <w:rFonts w:ascii="Courier New" w:hAnsi="Courier New" w:hint="default"/>
+        <w:sz w:val="20"/>
+      </w:rPr>
+    </w:lvl>
+    <w:lvl w:ilvl="2" w:tentative="1">
+      <w:start w:val="1"/>
+      <w:numFmt w:val="bullet"/>
+      <w:lvlText w:val=""/>
+      <w:lvlJc w:val="left"/>
+      <w:pPr>
+        <w:tabs>
+          <w:tab w:val="num" w:pos="3240"/>
+        </w:tabs>
+        <w:ind w:left="3240" w:hanging="360"/>
+      </w:pPr>
+      <w:rPr>
+        <w:rFonts w:ascii="Wingdings" w:hAnsi="Wingdings" w:hint="default"/>
+        <w:sz w:val="20"/>
+      </w:rPr>
+    </w:lvl>
+    <w:lvl w:ilvl="3" w:tentative="1">
+      <w:start w:val="1"/>
+      <w:numFmt w:val="bullet"/>
+      <w:lvlText w:val=""/>
+      <w:lvlJc w:val="left"/>
+      <w:pPr>
+        <w:tabs>
+          <w:tab w:val="num" w:pos="3960"/>
+        </w:tabs>
+        <w:ind w:left="3960" w:hanging="360"/>
+      </w:pPr>
+      <w:rPr>
+        <w:rFonts w:ascii="Wingdings" w:hAnsi="Wingdings" w:hint="default"/>
+        <w:sz w:val="20"/>
+      </w:rPr>
+    </w:lvl>
+    <w:lvl w:ilvl="4" w:tentative="1">
+      <w:start w:val="1"/>
+      <w:numFmt w:val="bullet"/>
+      <w:lvlText w:val=""/>
+      <w:lvlJc w:val="left"/>
+      <w:pPr>
+        <w:tabs>
+          <w:tab w:val="num" w:pos="4680"/>
+        </w:tabs>
+        <w:ind w:left="4680" w:hanging="360"/>
+      </w:pPr>
+      <w:rPr>
+        <w:rFonts w:ascii="Wingdings" w:hAnsi="Wingdings" w:hint="default"/>
+        <w:sz w:val="20"/>
+      </w:rPr>
+    </w:lvl>
+    <w:lvl w:ilvl="5" w:tentative="1">
+      <w:start w:val="1"/>
+      <w:numFmt w:val="bullet"/>
+      <w:lvlText w:val=""/>
+      <w:lvlJc w:val="left"/>
+      <w:pPr>
+        <w:tabs>
+          <w:tab w:val="num" w:pos="5400"/>
+        </w:tabs>
+        <w:ind w:left="5400" w:hanging="360"/>
+      </w:pPr>
+      <w:rPr>
+        <w:rFonts w:ascii="Wingdings" w:hAnsi="Wingdings" w:hint="default"/>
+        <w:sz w:val="20"/>
+      </w:rPr>
+    </w:lvl>
+    <w:lvl w:ilvl="6" w:tentative="1">
+      <w:start w:val="1"/>
+      <w:numFmt w:val="bullet"/>
+      <w:lvlText w:val=""/>
+      <w:lvlJc w:val="left"/>
+      <w:pPr>
+        <w:tabs>
+          <w:tab w:val="num" w:pos="6120"/>
+        </w:tabs>
+        <w:ind w:left="6120" w:hanging="360"/>
+      </w:pPr>
+      <w:rPr>
+        <w:rFonts w:ascii="Wingdings" w:hAnsi="Wingdings" w:hint="default"/>
+        <w:sz w:val="20"/>
+      </w:rPr>
+    </w:lvl>
+    <w:lvl w:ilvl="7" w:tentative="1">
+      <w:start w:val="1"/>
+      <w:numFmt w:val="bullet"/>
+      <w:lvlText w:val=""/>
+      <w:lvlJc w:val="left"/>
+      <w:pPr>
+        <w:tabs>
+          <w:tab w:val="num" w:pos="6840"/>
+        </w:tabs>
+        <w:ind w:left="6840" w:hanging="360"/>
+      </w:pPr>
+      <w:rPr>
+        <w:rFonts w:ascii="Wingdings" w:hAnsi="Wingdings" w:hint="default"/>
+        <w:sz w:val="20"/>
+      </w:rPr>
+    </w:lvl>
+    <w:lvl w:ilvl="8" w:tentative="1">
+      <w:start w:val="1"/>
+      <w:numFmt w:val="bullet"/>
+      <w:lvlText w:val=""/>
+      <w:lvlJc w:val="left"/>
+      <w:pPr>
+        <w:tabs>
+          <w:tab w:val="num" w:pos="7560"/>
+        </w:tabs>
+        <w:ind w:left="7560" w:hanging="360"/>
+      </w:pPr>
+      <w:rPr>
+        <w:rFonts w:ascii="Wingdings" w:hAnsi="Wingdings" w:hint="default"/>
+        <w:sz w:val="20"/>
+      </w:rPr>
+    </w:lvl>
+  </w:abstractNum>
+  <w:abstractNum w:abstractNumId="19" w15:restartNumberingAfterBreak="0">
     <w:nsid w:val="4DCF32C6"/>
     <w:multiLevelType w:val="multilevel"/>
     <w:tmpl w:val="4BEE554E"/>
@@ -12060,7 +13555,7 @@
       </w:rPr>
     </w:lvl>
   </w:abstractNum>
-  <w:abstractNum w:abstractNumId="16" w15:restartNumberingAfterBreak="0">
+  <w:abstractNum w:abstractNumId="20" w15:restartNumberingAfterBreak="0">
     <w:nsid w:val="5B226599"/>
     <w:multiLevelType w:val="hybridMultilevel"/>
     <w:tmpl w:val="C89A6CD0"/>
@@ -12146,7 +13641,7 @@
       </w:pPr>
     </w:lvl>
   </w:abstractNum>
-  <w:abstractNum w:abstractNumId="17" w15:restartNumberingAfterBreak="0">
+  <w:abstractNum w:abstractNumId="21" w15:restartNumberingAfterBreak="0">
     <w:nsid w:val="5ED84B0F"/>
     <w:multiLevelType w:val="hybridMultilevel"/>
     <w:tmpl w:val="74FECAAE"/>
@@ -12259,7 +13754,7 @@
       </w:rPr>
     </w:lvl>
   </w:abstractNum>
-  <w:abstractNum w:abstractNumId="18" w15:restartNumberingAfterBreak="0">
+  <w:abstractNum w:abstractNumId="22" w15:restartNumberingAfterBreak="0">
     <w:nsid w:val="60893970"/>
     <w:multiLevelType w:val="hybridMultilevel"/>
     <w:tmpl w:val="90464F62"/>
@@ -12372,7 +13867,120 @@
       </w:rPr>
     </w:lvl>
   </w:abstractNum>
-  <w:abstractNum w:abstractNumId="19" w15:restartNumberingAfterBreak="0">
+  <w:abstractNum w:abstractNumId="23" w15:restartNumberingAfterBreak="0">
+    <w:nsid w:val="60DA4BDD"/>
+    <w:multiLevelType w:val="hybridMultilevel"/>
+    <w:tmpl w:val="3E7C9FF8"/>
+    <w:lvl w:ilvl="0" w:tplc="04090001">
+      <w:start w:val="1"/>
+      <w:numFmt w:val="bullet"/>
+      <w:lvlText w:val=""/>
+      <w:lvlJc w:val="left"/>
+      <w:pPr>
+        <w:ind w:left="1800" w:hanging="360"/>
+      </w:pPr>
+      <w:rPr>
+        <w:rFonts w:ascii="Symbol" w:hAnsi="Symbol" w:hint="default"/>
+      </w:rPr>
+    </w:lvl>
+    <w:lvl w:ilvl="1" w:tplc="04090003" w:tentative="1">
+      <w:start w:val="1"/>
+      <w:numFmt w:val="bullet"/>
+      <w:lvlText w:val="o"/>
+      <w:lvlJc w:val="left"/>
+      <w:pPr>
+        <w:ind w:left="2520" w:hanging="360"/>
+      </w:pPr>
+      <w:rPr>
+        <w:rFonts w:ascii="Courier New" w:hAnsi="Courier New" w:cs="Courier New" w:hint="default"/>
+      </w:rPr>
+    </w:lvl>
+    <w:lvl w:ilvl="2" w:tplc="04090005" w:tentative="1">
+      <w:start w:val="1"/>
+      <w:numFmt w:val="bullet"/>
+      <w:lvlText w:val=""/>
+      <w:lvlJc w:val="left"/>
+      <w:pPr>
+        <w:ind w:left="3240" w:hanging="360"/>
+      </w:pPr>
+      <w:rPr>
+        <w:rFonts w:ascii="Wingdings" w:hAnsi="Wingdings" w:hint="default"/>
+      </w:rPr>
+    </w:lvl>
+    <w:lvl w:ilvl="3" w:tplc="04090001" w:tentative="1">
+      <w:start w:val="1"/>
+      <w:numFmt w:val="bullet"/>
+      <w:lvlText w:val=""/>
+      <w:lvlJc w:val="left"/>
+      <w:pPr>
+        <w:ind w:left="3960" w:hanging="360"/>
+      </w:pPr>
+      <w:rPr>
+        <w:rFonts w:ascii="Symbol" w:hAnsi="Symbol" w:hint="default"/>
+      </w:rPr>
+    </w:lvl>
+    <w:lvl w:ilvl="4" w:tplc="04090003" w:tentative="1">
+      <w:start w:val="1"/>
+      <w:numFmt w:val="bullet"/>
+      <w:lvlText w:val="o"/>
+      <w:lvlJc w:val="left"/>
+      <w:pPr>
+        <w:ind w:left="4680" w:hanging="360"/>
+      </w:pPr>
+      <w:rPr>
+        <w:rFonts w:ascii="Courier New" w:hAnsi="Courier New" w:cs="Courier New" w:hint="default"/>
+      </w:rPr>
+    </w:lvl>
+    <w:lvl w:ilvl="5" w:tplc="04090005" w:tentative="1">
+      <w:start w:val="1"/>
+      <w:numFmt w:val="bullet"/>
+      <w:lvlText w:val=""/>
+      <w:lvlJc w:val="left"/>
+      <w:pPr>
+        <w:ind w:left="5400" w:hanging="360"/>
+      </w:pPr>
+      <w:rPr>
+        <w:rFonts w:ascii="Wingdings" w:hAnsi="Wingdings" w:hint="default"/>
+      </w:rPr>
+    </w:lvl>
+    <w:lvl w:ilvl="6" w:tplc="04090001" w:tentative="1">
+      <w:start w:val="1"/>
+      <w:numFmt w:val="bullet"/>
+      <w:lvlText w:val=""/>
+      <w:lvlJc w:val="left"/>
+      <w:pPr>
+        <w:ind w:left="6120" w:hanging="360"/>
+      </w:pPr>
+      <w:rPr>
+        <w:rFonts w:ascii="Symbol" w:hAnsi="Symbol" w:hint="default"/>
+      </w:rPr>
+    </w:lvl>
+    <w:lvl w:ilvl="7" w:tplc="04090003" w:tentative="1">
+      <w:start w:val="1"/>
+      <w:numFmt w:val="bullet"/>
+      <w:lvlText w:val="o"/>
+      <w:lvlJc w:val="left"/>
+      <w:pPr>
+        <w:ind w:left="6840" w:hanging="360"/>
+      </w:pPr>
+      <w:rPr>
+        <w:rFonts w:ascii="Courier New" w:hAnsi="Courier New" w:cs="Courier New" w:hint="default"/>
+      </w:rPr>
+    </w:lvl>
+    <w:lvl w:ilvl="8" w:tplc="04090005" w:tentative="1">
+      <w:start w:val="1"/>
+      <w:numFmt w:val="bullet"/>
+      <w:lvlText w:val=""/>
+      <w:lvlJc w:val="left"/>
+      <w:pPr>
+        <w:ind w:left="7560" w:hanging="360"/>
+      </w:pPr>
+      <w:rPr>
+        <w:rFonts w:ascii="Wingdings" w:hAnsi="Wingdings" w:hint="default"/>
+      </w:rPr>
+    </w:lvl>
+  </w:abstractNum>
+  <w:abstractNum w:abstractNumId="24" w15:restartNumberingAfterBreak="0">
     <w:nsid w:val="63B60C33"/>
     <w:multiLevelType w:val="hybridMultilevel"/>
     <w:tmpl w:val="635C44DE"/>
@@ -12485,7 +14093,7 @@
       </w:rPr>
     </w:lvl>
   </w:abstractNum>
-  <w:abstractNum w:abstractNumId="20" w15:restartNumberingAfterBreak="0">
+  <w:abstractNum w:abstractNumId="25" w15:restartNumberingAfterBreak="0">
     <w:nsid w:val="66D2450A"/>
     <w:multiLevelType w:val="hybridMultilevel"/>
     <w:tmpl w:val="A278871C"/>
@@ -12598,7 +14206,7 @@
       </w:rPr>
     </w:lvl>
   </w:abstractNum>
-  <w:abstractNum w:abstractNumId="21" w15:restartNumberingAfterBreak="0">
+  <w:abstractNum w:abstractNumId="26" w15:restartNumberingAfterBreak="0">
     <w:nsid w:val="686F2D3F"/>
     <w:multiLevelType w:val="hybridMultilevel"/>
     <w:tmpl w:val="DFEA9C70"/>
@@ -12687,7 +14295,120 @@
       </w:pPr>
     </w:lvl>
   </w:abstractNum>
-  <w:abstractNum w:abstractNumId="22" w15:restartNumberingAfterBreak="0">
+  <w:abstractNum w:abstractNumId="27" w15:restartNumberingAfterBreak="0">
+    <w:nsid w:val="6A0B05E3"/>
+    <w:multiLevelType w:val="hybridMultilevel"/>
+    <w:tmpl w:val="0EB0BBC2"/>
+    <w:lvl w:ilvl="0" w:tplc="04090001">
+      <w:start w:val="1"/>
+      <w:numFmt w:val="bullet"/>
+      <w:lvlText w:val=""/>
+      <w:lvlJc w:val="left"/>
+      <w:pPr>
+        <w:ind w:left="1800" w:hanging="360"/>
+      </w:pPr>
+      <w:rPr>
+        <w:rFonts w:ascii="Symbol" w:hAnsi="Symbol" w:hint="default"/>
+      </w:rPr>
+    </w:lvl>
+    <w:lvl w:ilvl="1" w:tplc="04090003" w:tentative="1">
+      <w:start w:val="1"/>
+      <w:numFmt w:val="bullet"/>
+      <w:lvlText w:val="o"/>
+      <w:lvlJc w:val="left"/>
+      <w:pPr>
+        <w:ind w:left="2520" w:hanging="360"/>
+      </w:pPr>
+      <w:rPr>
+        <w:rFonts w:ascii="Courier New" w:hAnsi="Courier New" w:cs="Courier New" w:hint="default"/>
+      </w:rPr>
+    </w:lvl>
+    <w:lvl w:ilvl="2" w:tplc="04090005" w:tentative="1">
+      <w:start w:val="1"/>
+      <w:numFmt w:val="bullet"/>
+      <w:lvlText w:val=""/>
+      <w:lvlJc w:val="left"/>
+      <w:pPr>
+        <w:ind w:left="3240" w:hanging="360"/>
+      </w:pPr>
+      <w:rPr>
+        <w:rFonts w:ascii="Wingdings" w:hAnsi="Wingdings" w:hint="default"/>
+      </w:rPr>
+    </w:lvl>
+    <w:lvl w:ilvl="3" w:tplc="04090001" w:tentative="1">
+      <w:start w:val="1"/>
+      <w:numFmt w:val="bullet"/>
+      <w:lvlText w:val=""/>
+      <w:lvlJc w:val="left"/>
+      <w:pPr>
+        <w:ind w:left="3960" w:hanging="360"/>
+      </w:pPr>
+      <w:rPr>
+        <w:rFonts w:ascii="Symbol" w:hAnsi="Symbol" w:hint="default"/>
+      </w:rPr>
+    </w:lvl>
+    <w:lvl w:ilvl="4" w:tplc="04090003" w:tentative="1">
+      <w:start w:val="1"/>
+      <w:numFmt w:val="bullet"/>
+      <w:lvlText w:val="o"/>
+      <w:lvlJc w:val="left"/>
+      <w:pPr>
+        <w:ind w:left="4680" w:hanging="360"/>
+      </w:pPr>
+      <w:rPr>
+        <w:rFonts w:ascii="Courier New" w:hAnsi="Courier New" w:cs="Courier New" w:hint="default"/>
+      </w:rPr>
+    </w:lvl>
+    <w:lvl w:ilvl="5" w:tplc="04090005" w:tentative="1">
+      <w:start w:val="1"/>
+      <w:numFmt w:val="bullet"/>
+      <w:lvlText w:val=""/>
+      <w:lvlJc w:val="left"/>
+      <w:pPr>
+        <w:ind w:left="5400" w:hanging="360"/>
+      </w:pPr>
+      <w:rPr>
+        <w:rFonts w:ascii="Wingdings" w:hAnsi="Wingdings" w:hint="default"/>
+      </w:rPr>
+    </w:lvl>
+    <w:lvl w:ilvl="6" w:tplc="04090001" w:tentative="1">
+      <w:start w:val="1"/>
+      <w:numFmt w:val="bullet"/>
+      <w:lvlText w:val=""/>
+      <w:lvlJc w:val="left"/>
+      <w:pPr>
+        <w:ind w:left="6120" w:hanging="360"/>
+      </w:pPr>
+      <w:rPr>
+        <w:rFonts w:ascii="Symbol" w:hAnsi="Symbol" w:hint="default"/>
+      </w:rPr>
+    </w:lvl>
+    <w:lvl w:ilvl="7" w:tplc="04090003" w:tentative="1">
+      <w:start w:val="1"/>
+      <w:numFmt w:val="bullet"/>
+      <w:lvlText w:val="o"/>
+      <w:lvlJc w:val="left"/>
+      <w:pPr>
+        <w:ind w:left="6840" w:hanging="360"/>
+      </w:pPr>
+      <w:rPr>
+        <w:rFonts w:ascii="Courier New" w:hAnsi="Courier New" w:cs="Courier New" w:hint="default"/>
+      </w:rPr>
+    </w:lvl>
+    <w:lvl w:ilvl="8" w:tplc="04090005" w:tentative="1">
+      <w:start w:val="1"/>
+      <w:numFmt w:val="bullet"/>
+      <w:lvlText w:val=""/>
+      <w:lvlJc w:val="left"/>
+      <w:pPr>
+        <w:ind w:left="7560" w:hanging="360"/>
+      </w:pPr>
+      <w:rPr>
+        <w:rFonts w:ascii="Wingdings" w:hAnsi="Wingdings" w:hint="default"/>
+      </w:rPr>
+    </w:lvl>
+  </w:abstractNum>
+  <w:abstractNum w:abstractNumId="28" w15:restartNumberingAfterBreak="0">
     <w:nsid w:val="6B3C3847"/>
     <w:multiLevelType w:val="hybridMultilevel"/>
     <w:tmpl w:val="564E730E"/>
@@ -12800,7 +14521,7 @@
       </w:rPr>
     </w:lvl>
   </w:abstractNum>
-  <w:abstractNum w:abstractNumId="23" w15:restartNumberingAfterBreak="0">
+  <w:abstractNum w:abstractNumId="29" w15:restartNumberingAfterBreak="0">
     <w:nsid w:val="6C833018"/>
     <w:multiLevelType w:val="hybridMultilevel"/>
     <w:tmpl w:val="1FD45FEA"/>
@@ -12889,7 +14610,120 @@
       </w:pPr>
     </w:lvl>
   </w:abstractNum>
-  <w:abstractNum w:abstractNumId="24" w15:restartNumberingAfterBreak="0">
+  <w:abstractNum w:abstractNumId="30" w15:restartNumberingAfterBreak="0">
+    <w:nsid w:val="71D30917"/>
+    <w:multiLevelType w:val="hybridMultilevel"/>
+    <w:tmpl w:val="D44CE134"/>
+    <w:lvl w:ilvl="0" w:tplc="04090001">
+      <w:start w:val="1"/>
+      <w:numFmt w:val="bullet"/>
+      <w:lvlText w:val=""/>
+      <w:lvlJc w:val="left"/>
+      <w:pPr>
+        <w:ind w:left="1800" w:hanging="360"/>
+      </w:pPr>
+      <w:rPr>
+        <w:rFonts w:ascii="Symbol" w:hAnsi="Symbol" w:hint="default"/>
+      </w:rPr>
+    </w:lvl>
+    <w:lvl w:ilvl="1" w:tplc="04090003" w:tentative="1">
+      <w:start w:val="1"/>
+      <w:numFmt w:val="bullet"/>
+      <w:lvlText w:val="o"/>
+      <w:lvlJc w:val="left"/>
+      <w:pPr>
+        <w:ind w:left="2520" w:hanging="360"/>
+      </w:pPr>
+      <w:rPr>
+        <w:rFonts w:ascii="Courier New" w:hAnsi="Courier New" w:cs="Courier New" w:hint="default"/>
+      </w:rPr>
+    </w:lvl>
+    <w:lvl w:ilvl="2" w:tplc="04090005" w:tentative="1">
+      <w:start w:val="1"/>
+      <w:numFmt w:val="bullet"/>
+      <w:lvlText w:val=""/>
+      <w:lvlJc w:val="left"/>
+      <w:pPr>
+        <w:ind w:left="3240" w:hanging="360"/>
+      </w:pPr>
+      <w:rPr>
+        <w:rFonts w:ascii="Wingdings" w:hAnsi="Wingdings" w:hint="default"/>
+      </w:rPr>
+    </w:lvl>
+    <w:lvl w:ilvl="3" w:tplc="04090001" w:tentative="1">
+      <w:start w:val="1"/>
+      <w:numFmt w:val="bullet"/>
+      <w:lvlText w:val=""/>
+      <w:lvlJc w:val="left"/>
+      <w:pPr>
+        <w:ind w:left="3960" w:hanging="360"/>
+      </w:pPr>
+      <w:rPr>
+        <w:rFonts w:ascii="Symbol" w:hAnsi="Symbol" w:hint="default"/>
+      </w:rPr>
+    </w:lvl>
+    <w:lvl w:ilvl="4" w:tplc="04090003" w:tentative="1">
+      <w:start w:val="1"/>
+      <w:numFmt w:val="bullet"/>
+      <w:lvlText w:val="o"/>
+      <w:lvlJc w:val="left"/>
+      <w:pPr>
+        <w:ind w:left="4680" w:hanging="360"/>
+      </w:pPr>
+      <w:rPr>
+        <w:rFonts w:ascii="Courier New" w:hAnsi="Courier New" w:cs="Courier New" w:hint="default"/>
+      </w:rPr>
+    </w:lvl>
+    <w:lvl w:ilvl="5" w:tplc="04090005" w:tentative="1">
+      <w:start w:val="1"/>
+      <w:numFmt w:val="bullet"/>
+      <w:lvlText w:val=""/>
+      <w:lvlJc w:val="left"/>
+      <w:pPr>
+        <w:ind w:left="5400" w:hanging="360"/>
+      </w:pPr>
+      <w:rPr>
+        <w:rFonts w:ascii="Wingdings" w:hAnsi="Wingdings" w:hint="default"/>
+      </w:rPr>
+    </w:lvl>
+    <w:lvl w:ilvl="6" w:tplc="04090001" w:tentative="1">
+      <w:start w:val="1"/>
+      <w:numFmt w:val="bullet"/>
+      <w:lvlText w:val=""/>
+      <w:lvlJc w:val="left"/>
+      <w:pPr>
+        <w:ind w:left="6120" w:hanging="360"/>
+      </w:pPr>
+      <w:rPr>
+        <w:rFonts w:ascii="Symbol" w:hAnsi="Symbol" w:hint="default"/>
+      </w:rPr>
+    </w:lvl>
+    <w:lvl w:ilvl="7" w:tplc="04090003" w:tentative="1">
+      <w:start w:val="1"/>
+      <w:numFmt w:val="bullet"/>
+      <w:lvlText w:val="o"/>
+      <w:lvlJc w:val="left"/>
+      <w:pPr>
+        <w:ind w:left="6840" w:hanging="360"/>
+      </w:pPr>
+      <w:rPr>
+        <w:rFonts w:ascii="Courier New" w:hAnsi="Courier New" w:cs="Courier New" w:hint="default"/>
+      </w:rPr>
+    </w:lvl>
+    <w:lvl w:ilvl="8" w:tplc="04090005" w:tentative="1">
+      <w:start w:val="1"/>
+      <w:numFmt w:val="bullet"/>
+      <w:lvlText w:val=""/>
+      <w:lvlJc w:val="left"/>
+      <w:pPr>
+        <w:ind w:left="7560" w:hanging="360"/>
+      </w:pPr>
+      <w:rPr>
+        <w:rFonts w:ascii="Wingdings" w:hAnsi="Wingdings" w:hint="default"/>
+      </w:rPr>
+    </w:lvl>
+  </w:abstractNum>
+  <w:abstractNum w:abstractNumId="31" w15:restartNumberingAfterBreak="0">
     <w:nsid w:val="7577240C"/>
     <w:multiLevelType w:val="hybridMultilevel"/>
     <w:tmpl w:val="4B768118"/>
@@ -13002,7 +14836,7 @@
       </w:rPr>
     </w:lvl>
   </w:abstractNum>
-  <w:abstractNum w:abstractNumId="25" w15:restartNumberingAfterBreak="0">
+  <w:abstractNum w:abstractNumId="32" w15:restartNumberingAfterBreak="0">
     <w:nsid w:val="76932F7E"/>
     <w:multiLevelType w:val="hybridMultilevel"/>
     <w:tmpl w:val="BC2EA5F8"/>
@@ -13091,7 +14925,120 @@
       </w:pPr>
     </w:lvl>
   </w:abstractNum>
-  <w:abstractNum w:abstractNumId="26" w15:restartNumberingAfterBreak="0">
+  <w:abstractNum w:abstractNumId="33" w15:restartNumberingAfterBreak="0">
+    <w:nsid w:val="77EF6E4A"/>
+    <w:multiLevelType w:val="hybridMultilevel"/>
+    <w:tmpl w:val="C6089EA6"/>
+    <w:lvl w:ilvl="0" w:tplc="04090001">
+      <w:start w:val="1"/>
+      <w:numFmt w:val="bullet"/>
+      <w:lvlText w:val=""/>
+      <w:lvlJc w:val="left"/>
+      <w:pPr>
+        <w:ind w:left="1800" w:hanging="360"/>
+      </w:pPr>
+      <w:rPr>
+        <w:rFonts w:ascii="Symbol" w:hAnsi="Symbol" w:hint="default"/>
+      </w:rPr>
+    </w:lvl>
+    <w:lvl w:ilvl="1" w:tplc="04090003" w:tentative="1">
+      <w:start w:val="1"/>
+      <w:numFmt w:val="bullet"/>
+      <w:lvlText w:val="o"/>
+      <w:lvlJc w:val="left"/>
+      <w:pPr>
+        <w:ind w:left="2520" w:hanging="360"/>
+      </w:pPr>
+      <w:rPr>
+        <w:rFonts w:ascii="Courier New" w:hAnsi="Courier New" w:cs="Courier New" w:hint="default"/>
+      </w:rPr>
+    </w:lvl>
+    <w:lvl w:ilvl="2" w:tplc="04090005" w:tentative="1">
+      <w:start w:val="1"/>
+      <w:numFmt w:val="bullet"/>
+      <w:lvlText w:val=""/>
+      <w:lvlJc w:val="left"/>
+      <w:pPr>
+        <w:ind w:left="3240" w:hanging="360"/>
+      </w:pPr>
+      <w:rPr>
+        <w:rFonts w:ascii="Wingdings" w:hAnsi="Wingdings" w:hint="default"/>
+      </w:rPr>
+    </w:lvl>
+    <w:lvl w:ilvl="3" w:tplc="04090001" w:tentative="1">
+      <w:start w:val="1"/>
+      <w:numFmt w:val="bullet"/>
+      <w:lvlText w:val=""/>
+      <w:lvlJc w:val="left"/>
+      <w:pPr>
+        <w:ind w:left="3960" w:hanging="360"/>
+      </w:pPr>
+      <w:rPr>
+        <w:rFonts w:ascii="Symbol" w:hAnsi="Symbol" w:hint="default"/>
+      </w:rPr>
+    </w:lvl>
+    <w:lvl w:ilvl="4" w:tplc="04090003" w:tentative="1">
+      <w:start w:val="1"/>
+      <w:numFmt w:val="bullet"/>
+      <w:lvlText w:val="o"/>
+      <w:lvlJc w:val="left"/>
+      <w:pPr>
+        <w:ind w:left="4680" w:hanging="360"/>
+      </w:pPr>
+      <w:rPr>
+        <w:rFonts w:ascii="Courier New" w:hAnsi="Courier New" w:cs="Courier New" w:hint="default"/>
+      </w:rPr>
+    </w:lvl>
+    <w:lvl w:ilvl="5" w:tplc="04090005" w:tentative="1">
+      <w:start w:val="1"/>
+      <w:numFmt w:val="bullet"/>
+      <w:lvlText w:val=""/>
+      <w:lvlJc w:val="left"/>
+      <w:pPr>
+        <w:ind w:left="5400" w:hanging="360"/>
+      </w:pPr>
+      <w:rPr>
+        <w:rFonts w:ascii="Wingdings" w:hAnsi="Wingdings" w:hint="default"/>
+      </w:rPr>
+    </w:lvl>
+    <w:lvl w:ilvl="6" w:tplc="04090001" w:tentative="1">
+      <w:start w:val="1"/>
+      <w:numFmt w:val="bullet"/>
+      <w:lvlText w:val=""/>
+      <w:lvlJc w:val="left"/>
+      <w:pPr>
+        <w:ind w:left="6120" w:hanging="360"/>
+      </w:pPr>
+      <w:rPr>
+        <w:rFonts w:ascii="Symbol" w:hAnsi="Symbol" w:hint="default"/>
+      </w:rPr>
+    </w:lvl>
+    <w:lvl w:ilvl="7" w:tplc="04090003" w:tentative="1">
+      <w:start w:val="1"/>
+      <w:numFmt w:val="bullet"/>
+      <w:lvlText w:val="o"/>
+      <w:lvlJc w:val="left"/>
+      <w:pPr>
+        <w:ind w:left="6840" w:hanging="360"/>
+      </w:pPr>
+      <w:rPr>
+        <w:rFonts w:ascii="Courier New" w:hAnsi="Courier New" w:cs="Courier New" w:hint="default"/>
+      </w:rPr>
+    </w:lvl>
+    <w:lvl w:ilvl="8" w:tplc="04090005" w:tentative="1">
+      <w:start w:val="1"/>
+      <w:numFmt w:val="bullet"/>
+      <w:lvlText w:val=""/>
+      <w:lvlJc w:val="left"/>
+      <w:pPr>
+        <w:ind w:left="7560" w:hanging="360"/>
+      </w:pPr>
+      <w:rPr>
+        <w:rFonts w:ascii="Wingdings" w:hAnsi="Wingdings" w:hint="default"/>
+      </w:rPr>
+    </w:lvl>
+  </w:abstractNum>
+  <w:abstractNum w:abstractNumId="34" w15:restartNumberingAfterBreak="0">
     <w:nsid w:val="7E6B179C"/>
     <w:multiLevelType w:val="hybridMultilevel"/>
     <w:tmpl w:val="1D828BC2"/>
@@ -13205,85 +15152,109 @@
     </w:lvl>
   </w:abstractNum>
   <w:num w:numId="1" w16cid:durableId="1521703667">
+    <w:abstractNumId w:val="13"/>
+  </w:num>
+  <w:num w:numId="2" w16cid:durableId="1192451426">
+    <w:abstractNumId w:val="14"/>
+  </w:num>
+  <w:num w:numId="3" w16cid:durableId="1769034931">
+    <w:abstractNumId w:val="7"/>
+  </w:num>
+  <w:num w:numId="4" w16cid:durableId="959531810">
+    <w:abstractNumId w:val="29"/>
+  </w:num>
+  <w:num w:numId="5" w16cid:durableId="893854713">
+    <w:abstractNumId w:val="12"/>
+  </w:num>
+  <w:num w:numId="6" w16cid:durableId="985860105">
+    <w:abstractNumId w:val="26"/>
+  </w:num>
+  <w:num w:numId="7" w16cid:durableId="504787989">
+    <w:abstractNumId w:val="31"/>
+  </w:num>
+  <w:num w:numId="8" w16cid:durableId="1805653140">
+    <w:abstractNumId w:val="34"/>
+  </w:num>
+  <w:num w:numId="9" w16cid:durableId="1366711880">
+    <w:abstractNumId w:val="21"/>
+  </w:num>
+  <w:num w:numId="10" w16cid:durableId="1389844745">
+    <w:abstractNumId w:val="28"/>
+  </w:num>
+  <w:num w:numId="11" w16cid:durableId="275254084">
+    <w:abstractNumId w:val="24"/>
+  </w:num>
+  <w:num w:numId="12" w16cid:durableId="423577270">
+    <w:abstractNumId w:val="6"/>
+  </w:num>
+  <w:num w:numId="13" w16cid:durableId="1209799539">
+    <w:abstractNumId w:val="20"/>
+  </w:num>
+  <w:num w:numId="14" w16cid:durableId="1172064986">
+    <w:abstractNumId w:val="9"/>
+  </w:num>
+  <w:num w:numId="15" w16cid:durableId="458647446">
+    <w:abstractNumId w:val="10"/>
+  </w:num>
+  <w:num w:numId="16" w16cid:durableId="1661427877">
+    <w:abstractNumId w:val="22"/>
+  </w:num>
+  <w:num w:numId="17" w16cid:durableId="1556114144">
+    <w:abstractNumId w:val="25"/>
+  </w:num>
+  <w:num w:numId="18" w16cid:durableId="1816797135">
+    <w:abstractNumId w:val="17"/>
+  </w:num>
+  <w:num w:numId="19" w16cid:durableId="707801841">
+    <w:abstractNumId w:val="32"/>
+  </w:num>
+  <w:num w:numId="20" w16cid:durableId="816800813">
     <w:abstractNumId w:val="11"/>
   </w:num>
-  <w:num w:numId="2" w16cid:durableId="1192451426">
-    <w:abstractNumId w:val="12"/>
-  </w:num>
-  <w:num w:numId="3" w16cid:durableId="1769034931">
-    <w:abstractNumId w:val="6"/>
-  </w:num>
-  <w:num w:numId="4" w16cid:durableId="959531810">
-    <w:abstractNumId w:val="23"/>
-  </w:num>
-  <w:num w:numId="5" w16cid:durableId="893854713">
-    <w:abstractNumId w:val="10"/>
-  </w:num>
-  <w:num w:numId="6" w16cid:durableId="985860105">
-    <w:abstractNumId w:val="21"/>
-  </w:num>
-  <w:num w:numId="7" w16cid:durableId="504787989">
-    <w:abstractNumId w:val="24"/>
-  </w:num>
-  <w:num w:numId="8" w16cid:durableId="1805653140">
-    <w:abstractNumId w:val="26"/>
-  </w:num>
-  <w:num w:numId="9" w16cid:durableId="1366711880">
-    <w:abstractNumId w:val="17"/>
-  </w:num>
-  <w:num w:numId="10" w16cid:durableId="1389844745">
-    <w:abstractNumId w:val="22"/>
-  </w:num>
-  <w:num w:numId="11" w16cid:durableId="275254084">
+  <w:num w:numId="21" w16cid:durableId="332143602">
     <w:abstractNumId w:val="19"/>
   </w:num>
-  <w:num w:numId="12" w16cid:durableId="423577270">
-    <w:abstractNumId w:val="5"/>
-  </w:num>
-  <w:num w:numId="13" w16cid:durableId="1209799539">
-    <w:abstractNumId w:val="16"/>
-  </w:num>
-  <w:num w:numId="14" w16cid:durableId="1172064986">
-    <w:abstractNumId w:val="7"/>
-  </w:num>
-  <w:num w:numId="15" w16cid:durableId="458647446">
-    <w:abstractNumId w:val="8"/>
-  </w:num>
-  <w:num w:numId="16" w16cid:durableId="1661427877">
-    <w:abstractNumId w:val="18"/>
-  </w:num>
-  <w:num w:numId="17" w16cid:durableId="1556114144">
-    <w:abstractNumId w:val="20"/>
-  </w:num>
-  <w:num w:numId="18" w16cid:durableId="1816797135">
-    <w:abstractNumId w:val="14"/>
-  </w:num>
-  <w:num w:numId="19" w16cid:durableId="707801841">
-    <w:abstractNumId w:val="25"/>
-  </w:num>
-  <w:num w:numId="20" w16cid:durableId="816800813">
-    <w:abstractNumId w:val="9"/>
-  </w:num>
-  <w:num w:numId="21" w16cid:durableId="332143602">
+  <w:num w:numId="22" w16cid:durableId="933788029">
     <w:abstractNumId w:val="15"/>
-  </w:num>
-  <w:num w:numId="22" w16cid:durableId="933788029">
-    <w:abstractNumId w:val="13"/>
   </w:num>
   <w:num w:numId="23" w16cid:durableId="1132290454">
     <w:abstractNumId w:val="0"/>
   </w:num>
   <w:num w:numId="24" w16cid:durableId="450786322">
-    <w:abstractNumId w:val="3"/>
+    <w:abstractNumId w:val="4"/>
   </w:num>
   <w:num w:numId="25" w16cid:durableId="1896160003">
-    <w:abstractNumId w:val="4"/>
+    <w:abstractNumId w:val="5"/>
   </w:num>
   <w:num w:numId="26" w16cid:durableId="13925971">
     <w:abstractNumId w:val="1"/>
   </w:num>
   <w:num w:numId="27" w16cid:durableId="198009268">
+    <w:abstractNumId w:val="3"/>
+  </w:num>
+  <w:num w:numId="28" w16cid:durableId="1318454072">
+    <w:abstractNumId w:val="8"/>
+  </w:num>
+  <w:num w:numId="29" w16cid:durableId="1235049470">
+    <w:abstractNumId w:val="18"/>
+  </w:num>
+  <w:num w:numId="30" w16cid:durableId="1039862789">
+    <w:abstractNumId w:val="16"/>
+  </w:num>
+  <w:num w:numId="31" w16cid:durableId="1567834612">
+    <w:abstractNumId w:val="23"/>
+  </w:num>
+  <w:num w:numId="32" w16cid:durableId="1456562084">
+    <w:abstractNumId w:val="30"/>
+  </w:num>
+  <w:num w:numId="33" w16cid:durableId="393355011">
+    <w:abstractNumId w:val="33"/>
+  </w:num>
+  <w:num w:numId="34" w16cid:durableId="1397044333">
     <w:abstractNumId w:val="2"/>
+  </w:num>
+  <w:num w:numId="35" w16cid:durableId="1886017260">
+    <w:abstractNumId w:val="27"/>
   </w:num>
 </w:numbering>
 </file>
@@ -13688,7 +15659,10 @@
   <w:style w:type="paragraph" w:default="1" w:styleId="Normal">
     <w:name w:val="Normal"/>
     <w:qFormat/>
-    <w:rsid w:val="003714C7"/>
+    <w:rsid w:val="00A553C5"/>
+    <w:pPr>
+      <w:jc w:val="both"/>
+    </w:pPr>
     <w:rPr>
       <w:rFonts w:ascii="Times New Roman" w:hAnsi="Times New Roman"/>
       <w:sz w:val="26"/>
@@ -14723,6 +16697,24 @@
       </w:tcPr>
     </w:tblStylePr>
   </w:style>
+  <w:style w:type="paragraph" w:styleId="NormalWeb">
+    <w:name w:val="Normal (Web)"/>
+    <w:basedOn w:val="Normal"/>
+    <w:uiPriority w:val="99"/>
+    <w:semiHidden/>
+    <w:unhideWhenUsed/>
+    <w:rsid w:val="00FD2ECC"/>
+    <w:pPr>
+      <w:spacing w:before="100" w:beforeAutospacing="1" w:after="100" w:afterAutospacing="1" w:line="240" w:lineRule="auto"/>
+    </w:pPr>
+    <w:rPr>
+      <w:rFonts w:eastAsia="Times New Roman" w:cs="Times New Roman"/>
+      <w:kern w:val="0"/>
+      <w:sz w:val="24"/>
+      <w:szCs w:val="24"/>
+      <w14:ligatures w14:val="none"/>
+    </w:rPr>
+  </w:style>
 </w:styles>
 </file>
 

</xml_diff>

<commit_message>
upload phân tích định tính - giá trị gia tăng
</commit_message>
<xml_diff>
--- a/He_thong_thong_tin_giai_quyet_hanh_chinh/NGUYEN TRUONG PHI_25410281/25410281_NguyenTruongPhi.docx
+++ b/He_thong_thong_tin_giai_quyet_hanh_chinh/NGUYEN TRUONG PHI_25410281/25410281_NguyenTruongPhi.docx
@@ -79,7 +79,7 @@
           <w:szCs w:val="26"/>
         </w:rPr>
         <w:drawing>
-          <wp:inline distT="0" distB="0" distL="0" distR="0" wp14:anchorId="61AA30EF" wp14:editId="25F65445">
+          <wp:inline distT="0" distB="0" distL="0" distR="0" wp14:anchorId="61AA30EF" wp14:editId="30271F88">
             <wp:extent cx="1948539" cy="1606164"/>
             <wp:effectExtent l="0" t="0" r="0" b="0"/>
             <wp:docPr id="990850389" name="Picture 1"/>
@@ -5854,6 +5854,27 @@
     </w:p>
     <w:p>
       <w:pPr>
+        <w:pStyle w:val="Caption"/>
+      </w:pPr>
+      <w:bookmarkStart w:id="17" w:name="_Toc236263980"/>
+      <w:r>
+        <w:t xml:space="preserve">Hình </w:t>
+      </w:r>
+      <w:fldSimple w:instr=" SEQ Hình \* ARABIC ">
+        <w:r>
+          <w:rPr>
+            <w:noProof/>
+          </w:rPr>
+          <w:t>1</w:t>
+        </w:r>
+      </w:fldSimple>
+      <w:r>
+        <w:t>. Quy trình tiếp nhận hồ sơ</w:t>
+      </w:r>
+      <w:bookmarkEnd w:id="17"/>
+    </w:p>
+    <w:p>
+      <w:pPr>
         <w:keepNext/>
       </w:pPr>
       <w:r>
@@ -5902,40 +5923,6 @@
       <w:r>
         <w:t>Công chức/Đơn vị chuyên môn: Nhận hồ sơ sau khi được Bộ phận Một cửa tiếp nhận để tiếp tục kiểm tra, thẩm định và xử lý theo quy định.</w:t>
       </w:r>
-    </w:p>
-    <w:p>
-      <w:pPr>
-        <w:pStyle w:val="Caption"/>
-      </w:pPr>
-      <w:bookmarkStart w:id="17" w:name="_Toc236263980"/>
-      <w:r>
-        <w:t xml:space="preserve">Hình </w:t>
-      </w:r>
-      <w:r>
-        <w:fldChar w:fldCharType="begin"/>
-      </w:r>
-      <w:r>
-        <w:instrText xml:space="preserve"> SEQ Hình \* ARABIC </w:instrText>
-      </w:r>
-      <w:r>
-        <w:fldChar w:fldCharType="separate"/>
-      </w:r>
-      <w:r>
-        <w:rPr>
-          <w:noProof/>
-        </w:rPr>
-        <w:t>1</w:t>
-      </w:r>
-      <w:r>
-        <w:rPr>
-          <w:noProof/>
-        </w:rPr>
-        <w:fldChar w:fldCharType="end"/>
-      </w:r>
-      <w:r>
-        <w:t>. Quy trình tiếp nhận hồ sơ</w:t>
-      </w:r>
-      <w:bookmarkEnd w:id="17"/>
     </w:p>
     <w:p>
       <w:pPr>
@@ -6351,10 +6338,10 @@
           <w:noProof/>
         </w:rPr>
         <w:drawing>
-          <wp:inline distT="0" distB="0" distL="0" distR="0" wp14:anchorId="2450D02D" wp14:editId="6727EE28">
-            <wp:extent cx="5731510" cy="767715"/>
+          <wp:inline distT="0" distB="0" distL="0" distR="0" wp14:anchorId="459ED25B" wp14:editId="7CD9C6C0">
+            <wp:extent cx="5731510" cy="614045"/>
             <wp:effectExtent l="0" t="0" r="2540" b="0"/>
-            <wp:docPr id="1035055498" name="Picture 23"/>
+            <wp:docPr id="1030713368" name="Picture 1"/>
             <wp:cNvGraphicFramePr>
               <a:graphicFrameLocks xmlns:a="http://schemas.openxmlformats.org/drawingml/2006/main" noChangeAspect="1"/>
             </wp:cNvGraphicFramePr>
@@ -6362,36 +6349,23 @@
               <a:graphicData uri="http://schemas.openxmlformats.org/drawingml/2006/picture">
                 <pic:pic xmlns:pic="http://schemas.openxmlformats.org/drawingml/2006/picture">
                   <pic:nvPicPr>
-                    <pic:cNvPr id="0" name="Picture 13"/>
-                    <pic:cNvPicPr>
-                      <a:picLocks noChangeAspect="1" noChangeArrowheads="1"/>
-                    </pic:cNvPicPr>
+                    <pic:cNvPr id="1030713368" name=""/>
+                    <pic:cNvPicPr/>
                   </pic:nvPicPr>
                   <pic:blipFill>
-                    <a:blip r:embed="rId10">
-                      <a:extLst>
-                        <a:ext uri="{28A0092B-C50C-407E-A947-70E740481C1C}">
-                          <a14:useLocalDpi xmlns:a14="http://schemas.microsoft.com/office/drawing/2010/main" val="0"/>
-                        </a:ext>
-                      </a:extLst>
-                    </a:blip>
-                    <a:srcRect/>
+                    <a:blip r:embed="rId10"/>
                     <a:stretch>
                       <a:fillRect/>
                     </a:stretch>
                   </pic:blipFill>
-                  <pic:spPr bwMode="auto">
+                  <pic:spPr>
                     <a:xfrm>
                       <a:off x="0" y="0"/>
-                      <a:ext cx="5731510" cy="767715"/>
+                      <a:ext cx="5731510" cy="614045"/>
                     </a:xfrm>
                     <a:prstGeom prst="rect">
                       <a:avLst/>
                     </a:prstGeom>
-                    <a:noFill/>
-                    <a:ln>
-                      <a:noFill/>
-                    </a:ln>
                   </pic:spPr>
                 </pic:pic>
               </a:graphicData>
@@ -6408,27 +6382,14 @@
       <w:r>
         <w:t xml:space="preserve">Hình </w:t>
       </w:r>
-      <w:r>
-        <w:fldChar w:fldCharType="begin"/>
-      </w:r>
-      <w:r>
-        <w:instrText xml:space="preserve"> SEQ Hình \* ARABIC </w:instrText>
-      </w:r>
-      <w:r>
-        <w:fldChar w:fldCharType="separate"/>
-      </w:r>
-      <w:r>
-        <w:rPr>
-          <w:noProof/>
-        </w:rPr>
-        <w:t>2</w:t>
-      </w:r>
-      <w:r>
-        <w:rPr>
-          <w:noProof/>
-        </w:rPr>
-        <w:fldChar w:fldCharType="end"/>
-      </w:r>
+      <w:fldSimple w:instr=" SEQ Hình \* ARABIC ">
+        <w:r>
+          <w:rPr>
+            <w:noProof/>
+          </w:rPr>
+          <w:t>2</w:t>
+        </w:r>
+      </w:fldSimple>
       <w:r>
         <w:t>. Quy trình kiểm tra, thẩm định và xử lý hồ sơ</w:t>
       </w:r>
@@ -7164,13 +7125,7 @@
         <w:pStyle w:val="Caption"/>
       </w:pPr>
       <w:r>
-        <w:t xml:space="preserve">Hình </w:t>
-      </w:r>
-      <w:r>
-        <w:t>3</w:t>
-      </w:r>
-      <w:r>
-        <w:t>. Quy trình phê duyệt và ban hành kết quả</w:t>
+        <w:t>Hình 3. Quy trình phê duyệt và ban hành kết quả</w:t>
       </w:r>
     </w:p>
     <w:p>
@@ -7261,27 +7216,14 @@
       <w:r>
         <w:t xml:space="preserve">Hình </w:t>
       </w:r>
-      <w:r>
-        <w:fldChar w:fldCharType="begin"/>
-      </w:r>
-      <w:r>
-        <w:instrText xml:space="preserve"> SEQ Hình \* ARABIC </w:instrText>
-      </w:r>
-      <w:r>
-        <w:fldChar w:fldCharType="separate"/>
-      </w:r>
-      <w:r>
-        <w:rPr>
-          <w:noProof/>
-        </w:rPr>
-        <w:t>4</w:t>
-      </w:r>
-      <w:r>
-        <w:rPr>
-          <w:noProof/>
-        </w:rPr>
-        <w:fldChar w:fldCharType="end"/>
-      </w:r>
+      <w:fldSimple w:instr=" SEQ Hình \* ARABIC ">
+        <w:r>
+          <w:rPr>
+            <w:noProof/>
+          </w:rPr>
+          <w:t>4</w:t>
+        </w:r>
+      </w:fldSimple>
       <w:r>
         <w:t>. Quy trình trả kết</w:t>
       </w:r>
@@ -7305,14 +7247,7 @@
           <w:b/>
           <w:bCs/>
         </w:rPr>
-        <w:t>T</w:t>
-      </w:r>
-      <w:r>
-        <w:rPr>
-          <w:b/>
-          <w:bCs/>
-        </w:rPr>
-        <w:t>ác nhân thực hiện</w:t>
+        <w:t>Tác nhân thực hiện</w:t>
       </w:r>
     </w:p>
     <w:p>
@@ -7440,10 +7375,18 @@
         <w:ind w:left="720" w:firstLine="720"/>
       </w:pPr>
       <w:r>
-        <w:t>Kết quả sau khi được ký được ghi nhận chính thức trên hệ thống, cập nhật trạng thái và chuyển sang quy trình trả kết quả cho người nộp hồ sơ.</w:t>
-      </w:r>
-      <w:r>
-        <w:t>ĐỐI TƯỢNG KHÁCH HÀNG</w:t>
+        <w:t xml:space="preserve">Kết quả sau khi được ký được ghi nhận chính thức trên hệ thống, cập nhật trạng thái và chuyển sang quy trình trả kết quả cho người nộp hồ </w:t>
+      </w:r>
+      <w:proofErr w:type="gramStart"/>
+      <w:r>
+        <w:t>sơ.</w:t>
+      </w:r>
+      <w:r>
+        <w:t>ĐỐI</w:t>
+      </w:r>
+      <w:proofErr w:type="gramEnd"/>
+      <w:r>
+        <w:t xml:space="preserve"> TƯỢNG KHÁCH HÀNG</w:t>
       </w:r>
     </w:p>
     <w:p>
@@ -7522,6 +7465,9 @@
     </w:p>
     <w:p>
       <w:r>
+        <w:rPr>
+          <w:noProof/>
+        </w:rPr>
         <w:drawing>
           <wp:inline distT="0" distB="0" distL="0" distR="0" wp14:anchorId="78827D8D" wp14:editId="1B1CA3A0">
             <wp:extent cx="5731510" cy="2157730"/>
@@ -7579,24 +7525,14 @@
       <w:r>
         <w:t xml:space="preserve">Hình </w:t>
       </w:r>
-      <w:r>
-        <w:fldChar w:fldCharType="begin"/>
-      </w:r>
-      <w:r>
-        <w:instrText xml:space="preserve"> SEQ Hình \* ARABIC </w:instrText>
-      </w:r>
-      <w:r>
-        <w:fldChar w:fldCharType="separate"/>
-      </w:r>
-      <w:r>
-        <w:rPr>
-          <w:noProof/>
-        </w:rPr>
-        <w:t>5</w:t>
-      </w:r>
-      <w:r>
-        <w:fldChar w:fldCharType="end"/>
-      </w:r>
+      <w:fldSimple w:instr=" SEQ Hình \* ARABIC ">
+        <w:r>
+          <w:rPr>
+            <w:noProof/>
+          </w:rPr>
+          <w:t>5</w:t>
+        </w:r>
+      </w:fldSimple>
       <w:r>
         <w:t xml:space="preserve">. </w:t>
       </w:r>
@@ -9799,24 +9735,14 @@
       <w:r>
         <w:t xml:space="preserve">Hình </w:t>
       </w:r>
-      <w:r>
-        <w:fldChar w:fldCharType="begin"/>
-      </w:r>
-      <w:r>
-        <w:instrText xml:space="preserve"> SEQ Hình \* ARABIC </w:instrText>
-      </w:r>
-      <w:r>
-        <w:fldChar w:fldCharType="separate"/>
-      </w:r>
-      <w:r>
-        <w:rPr>
-          <w:noProof/>
-        </w:rPr>
-        <w:t>6</w:t>
-      </w:r>
-      <w:r>
-        <w:fldChar w:fldCharType="end"/>
-      </w:r>
+      <w:fldSimple w:instr=" SEQ Hình \* ARABIC ">
+        <w:r>
+          <w:rPr>
+            <w:noProof/>
+          </w:rPr>
+          <w:t>6</w:t>
+        </w:r>
+      </w:fldSimple>
       <w:r>
         <w:t xml:space="preserve"> Sơ tổ chức tiếp nhận hồ sơ</w:t>
       </w:r>
@@ -10043,7 +9969,15 @@
         <w:ind w:left="1440"/>
       </w:pPr>
       <w:r>
-        <w:t>Tham gia xem xét, xử lý các hồ sơ cần ý kiến chỉ đạo.</w:t>
+        <w:t xml:space="preserve">Tham gia xem xét, </w:t>
+      </w:r>
+      <w:proofErr w:type="gramStart"/>
+      <w:r>
+        <w:t>xử lý các hồ sơ cần ý kiến chỉ đạo</w:t>
+      </w:r>
+      <w:proofErr w:type="gramEnd"/>
+      <w:r>
+        <w:t>.</w:t>
       </w:r>
     </w:p>
     <w:p>
@@ -10565,71 +10499,1845 @@
     </w:p>
     <w:p>
       <w:pPr>
+        <w:pStyle w:val="Heading3"/>
+      </w:pPr>
+      <w:r>
+        <w:t xml:space="preserve">3.1 Phân tích </w:t>
+      </w:r>
+      <w:r>
+        <w:t>quy trình tiếp nhận hồ sơ</w:t>
+      </w:r>
+    </w:p>
+    <w:p>
+      <w:pPr>
+        <w:pStyle w:val="Heading3"/>
+        <w:numPr>
+          <w:ilvl w:val="2"/>
+          <w:numId w:val="37"/>
+        </w:numPr>
+      </w:pPr>
+      <w:r>
+        <w:t>Phân tích định tính</w:t>
+      </w:r>
+    </w:p>
+    <w:p>
+      <w:pPr>
+        <w:pStyle w:val="Heading3"/>
+      </w:pPr>
+      <w:r>
+        <w:t>3.1.1.1 Phân tích giá trị gia tăng</w:t>
+      </w:r>
+    </w:p>
+    <w:p>
+      <w:pPr>
+        <w:pStyle w:val="ListParagraph"/>
+        <w:spacing w:before="240" w:after="240" w:line="240" w:lineRule="auto"/>
+        <w:ind w:left="780"/>
+        <w:jc w:val="left"/>
+        <w:rPr>
+          <w:rFonts w:eastAsia="Times New Roman" w:cs="Times New Roman"/>
+          <w:kern w:val="0"/>
+          <w:sz w:val="24"/>
+          <w:szCs w:val="24"/>
+          <w14:ligatures w14:val="none"/>
+        </w:rPr>
+      </w:pPr>
+      <w:r>
+        <w:rPr>
+          <w:rFonts w:eastAsia="Times New Roman" w:cs="Times New Roman"/>
+          <w:color w:val="000000"/>
+          <w:kern w:val="0"/>
+          <w:szCs w:val="26"/>
+          <w14:ligatures w14:val="none"/>
+        </w:rPr>
+        <w:t>Bảng</w:t>
+      </w:r>
+      <w:r>
+        <w:rPr>
+          <w:rFonts w:eastAsia="Times New Roman" w:cs="Times New Roman"/>
+          <w:color w:val="000000"/>
+          <w:kern w:val="0"/>
+          <w:szCs w:val="26"/>
+          <w14:ligatures w14:val="none"/>
+        </w:rPr>
+        <w:t xml:space="preserve"> 3.</w:t>
+      </w:r>
+      <w:r>
+        <w:rPr>
+          <w:rFonts w:eastAsia="Times New Roman" w:cs="Times New Roman"/>
+          <w:color w:val="000000"/>
+          <w:kern w:val="0"/>
+          <w:szCs w:val="26"/>
+          <w14:ligatures w14:val="none"/>
+        </w:rPr>
+        <w:t xml:space="preserve"> phân tích định tính </w:t>
+      </w:r>
+    </w:p>
+    <w:tbl>
+      <w:tblPr>
+        <w:tblStyle w:val="TableGrid"/>
+        <w:tblW w:w="0" w:type="auto"/>
+        <w:tblLook w:val="04A0" w:firstRow="1" w:lastRow="0" w:firstColumn="1" w:lastColumn="0" w:noHBand="0" w:noVBand="1"/>
+      </w:tblPr>
+      <w:tblGrid>
+        <w:gridCol w:w="679"/>
+        <w:gridCol w:w="1611"/>
+        <w:gridCol w:w="801"/>
+        <w:gridCol w:w="1815"/>
+        <w:gridCol w:w="1623"/>
+        <w:gridCol w:w="2487"/>
+      </w:tblGrid>
+      <w:tr>
+        <w:trPr>
+          <w:trHeight w:val="785"/>
+        </w:trPr>
+        <w:tc>
+          <w:tcPr>
+            <w:tcW w:w="0" w:type="auto"/>
+            <w:hideMark/>
+          </w:tcPr>
+          <w:p>
+            <w:r>
+              <w:t>STT</w:t>
+            </w:r>
+          </w:p>
+        </w:tc>
+        <w:tc>
+          <w:tcPr>
+            <w:tcW w:w="0" w:type="auto"/>
+            <w:hideMark/>
+          </w:tcPr>
+          <w:p>
+            <w:r>
+              <w:t>Task</w:t>
+            </w:r>
+          </w:p>
+        </w:tc>
+        <w:tc>
+          <w:tcPr>
+            <w:tcW w:w="0" w:type="auto"/>
+            <w:hideMark/>
+          </w:tcPr>
+          <w:p>
+            <w:r>
+              <w:t>Phân loại</w:t>
+            </w:r>
+          </w:p>
+        </w:tc>
+        <w:tc>
+          <w:tcPr>
+            <w:tcW w:w="0" w:type="auto"/>
+            <w:hideMark/>
+          </w:tcPr>
+          <w:p>
+            <w:r>
+              <w:t>Vấn đề / điểm cần phân tích</w:t>
+            </w:r>
+          </w:p>
+        </w:tc>
+        <w:tc>
+          <w:tcPr>
+            <w:tcW w:w="0" w:type="auto"/>
+            <w:hideMark/>
+          </w:tcPr>
+          <w:p>
+            <w:r>
+              <w:t>Tác động</w:t>
+            </w:r>
+          </w:p>
+        </w:tc>
+        <w:tc>
+          <w:tcPr>
+            <w:tcW w:w="0" w:type="auto"/>
+            <w:hideMark/>
+          </w:tcPr>
+          <w:p>
+            <w:r>
+              <w:t>Cách khắc phục / cải tiến</w:t>
+            </w:r>
+          </w:p>
+        </w:tc>
+      </w:tr>
+      <w:tr>
+        <w:trPr>
+          <w:trHeight w:val="1610"/>
+        </w:trPr>
+        <w:tc>
+          <w:tcPr>
+            <w:tcW w:w="0" w:type="auto"/>
+            <w:hideMark/>
+          </w:tcPr>
+          <w:p>
+            <w:r>
+              <w:t>1</w:t>
+            </w:r>
+          </w:p>
+        </w:tc>
+        <w:tc>
+          <w:tcPr>
+            <w:tcW w:w="0" w:type="auto"/>
+            <w:hideMark/>
+          </w:tcPr>
+          <w:p>
+            <w:r>
+              <w:t>Tra cứu thủ tục</w:t>
+            </w:r>
+          </w:p>
+        </w:tc>
+        <w:tc>
+          <w:tcPr>
+            <w:tcW w:w="0" w:type="auto"/>
+            <w:hideMark/>
+          </w:tcPr>
+          <w:p>
+            <w:r>
+              <w:t>VA</w:t>
+            </w:r>
+          </w:p>
+        </w:tc>
+        <w:tc>
+          <w:tcPr>
+            <w:tcW w:w="0" w:type="auto"/>
+            <w:hideMark/>
+          </w:tcPr>
+          <w:p>
+            <w:r>
+              <w:t>Người dân có thể tra cứu sai thủ tục hoặc không hiểu yêu cầu hồ sơ</w:t>
+            </w:r>
+          </w:p>
+        </w:tc>
+        <w:tc>
+          <w:tcPr>
+            <w:tcW w:w="0" w:type="auto"/>
+            <w:hideMark/>
+          </w:tcPr>
+          <w:p>
+            <w:r>
+              <w:t>Chuẩn bị sai, phải làm lại</w:t>
+            </w:r>
+          </w:p>
+        </w:tc>
+        <w:tc>
+          <w:tcPr>
+            <w:tcW w:w="0" w:type="auto"/>
+            <w:hideMark/>
+          </w:tcPr>
+          <w:p>
+            <w:r>
+              <w:t>Chuẩn hóa hướng dẫn trên Cổng DVC; bổ sung checklist hồ sơ và chức năng tìm kiếm theo nhu cầu</w:t>
+            </w:r>
+          </w:p>
+        </w:tc>
+      </w:tr>
+      <w:tr>
+        <w:trPr>
+          <w:trHeight w:val="1340"/>
+        </w:trPr>
+        <w:tc>
+          <w:tcPr>
+            <w:tcW w:w="0" w:type="auto"/>
+            <w:hideMark/>
+          </w:tcPr>
+          <w:p>
+            <w:r>
+              <w:t>2</w:t>
+            </w:r>
+          </w:p>
+        </w:tc>
+        <w:tc>
+          <w:tcPr>
+            <w:tcW w:w="0" w:type="auto"/>
+            <w:hideMark/>
+          </w:tcPr>
+          <w:p>
+            <w:r>
+              <w:t>Chuẩn bị hồ sơ</w:t>
+            </w:r>
+          </w:p>
+        </w:tc>
+        <w:tc>
+          <w:tcPr>
+            <w:tcW w:w="0" w:type="auto"/>
+            <w:hideMark/>
+          </w:tcPr>
+          <w:p>
+            <w:r>
+              <w:t>VA</w:t>
+            </w:r>
+          </w:p>
+        </w:tc>
+        <w:tc>
+          <w:tcPr>
+            <w:tcW w:w="0" w:type="auto"/>
+            <w:hideMark/>
+          </w:tcPr>
+          <w:p>
+            <w:r>
+              <w:t>Có thể thiếu giấy tờ, sai biểu mẫu hoặc kê khai chưa đầy đủ</w:t>
+            </w:r>
+          </w:p>
+        </w:tc>
+        <w:tc>
+          <w:tcPr>
+            <w:tcW w:w="0" w:type="auto"/>
+            <w:hideMark/>
+          </w:tcPr>
+          <w:p>
+            <w:r>
+              <w:t>Dẫn đến yêu cầu bổ sung</w:t>
+            </w:r>
+          </w:p>
+        </w:tc>
+        <w:tc>
+          <w:tcPr>
+            <w:tcW w:w="0" w:type="auto"/>
+            <w:hideMark/>
+          </w:tcPr>
+          <w:p>
+            <w:r>
+              <w:t>Cung cấp biểu mẫu điện tử, checklist và cảnh báo thành phần bắt buộc trước khi nộp</w:t>
+            </w:r>
+          </w:p>
+        </w:tc>
+      </w:tr>
+      <w:tr>
+        <w:trPr>
+          <w:trHeight w:val="1340"/>
+        </w:trPr>
+        <w:tc>
+          <w:tcPr>
+            <w:tcW w:w="0" w:type="auto"/>
+            <w:hideMark/>
+          </w:tcPr>
+          <w:p>
+            <w:r>
+              <w:t>3</w:t>
+            </w:r>
+          </w:p>
+        </w:tc>
+        <w:tc>
+          <w:tcPr>
+            <w:tcW w:w="0" w:type="auto"/>
+            <w:hideMark/>
+          </w:tcPr>
+          <w:p>
+            <w:r>
+              <w:t>Nộp hồ sơ</w:t>
+            </w:r>
+          </w:p>
+        </w:tc>
+        <w:tc>
+          <w:tcPr>
+            <w:tcW w:w="0" w:type="auto"/>
+            <w:hideMark/>
+          </w:tcPr>
+          <w:p>
+            <w:r>
+              <w:t>VA</w:t>
+            </w:r>
+          </w:p>
+        </w:tc>
+        <w:tc>
+          <w:tcPr>
+            <w:tcW w:w="0" w:type="auto"/>
+            <w:hideMark/>
+          </w:tcPr>
+          <w:p>
+            <w:r>
+              <w:t>Người dân có thể chọn sai cơ quan hoặc sai hình thức nộp</w:t>
+            </w:r>
+          </w:p>
+        </w:tc>
+        <w:tc>
+          <w:tcPr>
+            <w:tcW w:w="0" w:type="auto"/>
+            <w:hideMark/>
+          </w:tcPr>
+          <w:p>
+            <w:r>
+              <w:t>Mất thời gian chuyển/từ chối hồ sơ</w:t>
+            </w:r>
+          </w:p>
+        </w:tc>
+        <w:tc>
+          <w:tcPr>
+            <w:tcW w:w="0" w:type="auto"/>
+            <w:hideMark/>
+          </w:tcPr>
+          <w:p>
+            <w:r>
+              <w:t>Hệ thống tự xác định cơ quan có thẩm quyền dựa trên loại thủ tục và thông tin người nộp</w:t>
+            </w:r>
+          </w:p>
+        </w:tc>
+      </w:tr>
+      <w:tr>
+        <w:trPr>
+          <w:trHeight w:val="1610"/>
+        </w:trPr>
+        <w:tc>
+          <w:tcPr>
+            <w:tcW w:w="0" w:type="auto"/>
+            <w:hideMark/>
+          </w:tcPr>
+          <w:p>
+            <w:r>
+              <w:t>4</w:t>
+            </w:r>
+          </w:p>
+        </w:tc>
+        <w:tc>
+          <w:tcPr>
+            <w:tcW w:w="0" w:type="auto"/>
+            <w:hideMark/>
+          </w:tcPr>
+          <w:p>
+            <w:r>
+              <w:t>Tiếp nhận hồ sơ</w:t>
+            </w:r>
+          </w:p>
+        </w:tc>
+        <w:tc>
+          <w:tcPr>
+            <w:tcW w:w="0" w:type="auto"/>
+            <w:hideMark/>
+          </w:tcPr>
+          <w:p>
+            <w:r>
+              <w:t>VA</w:t>
+            </w:r>
+          </w:p>
+        </w:tc>
+        <w:tc>
+          <w:tcPr>
+            <w:tcW w:w="0" w:type="auto"/>
+            <w:hideMark/>
+          </w:tcPr>
+          <w:p>
+            <w:r>
+              <w:t>Có thể phát sinh thời gian chờ khi đông người hoặc hồ sơ đến cùng lúc</w:t>
+            </w:r>
+          </w:p>
+        </w:tc>
+        <w:tc>
+          <w:tcPr>
+            <w:tcW w:w="0" w:type="auto"/>
+            <w:hideMark/>
+          </w:tcPr>
+          <w:p>
+            <w:r>
+              <w:t>Tăng thời gian chờ</w:t>
+            </w:r>
+          </w:p>
+        </w:tc>
+        <w:tc>
+          <w:tcPr>
+            <w:tcW w:w="0" w:type="auto"/>
+            <w:hideMark/>
+          </w:tcPr>
+          <w:p>
+            <w:r>
+              <w:t>Phân luồng hồ sơ, lấy số tự động, đặt lịch và ưu tiên hồ sơ trực tuyến</w:t>
+            </w:r>
+          </w:p>
+        </w:tc>
+      </w:tr>
+      <w:tr>
+        <w:trPr>
+          <w:trHeight w:val="1610"/>
+        </w:trPr>
+        <w:tc>
+          <w:tcPr>
+            <w:tcW w:w="0" w:type="auto"/>
+            <w:hideMark/>
+          </w:tcPr>
+          <w:p>
+            <w:r>
+              <w:t>5</w:t>
+            </w:r>
+          </w:p>
+        </w:tc>
+        <w:tc>
+          <w:tcPr>
+            <w:tcW w:w="0" w:type="auto"/>
+            <w:hideMark/>
+          </w:tcPr>
+          <w:p>
+            <w:r>
+              <w:t>Cấp mã hồ sơ</w:t>
+            </w:r>
+          </w:p>
+        </w:tc>
+        <w:tc>
+          <w:tcPr>
+            <w:tcW w:w="0" w:type="auto"/>
+            <w:hideMark/>
+          </w:tcPr>
+          <w:p>
+            <w:r>
+              <w:t>VA</w:t>
+            </w:r>
+          </w:p>
+        </w:tc>
+        <w:tc>
+          <w:tcPr>
+            <w:tcW w:w="0" w:type="auto"/>
+            <w:hideMark/>
+          </w:tcPr>
+          <w:p>
+            <w:r>
+              <w:t>Nếu cán bộ phải thao tác thủ công có thể mất thời gian hoặc nhập sai</w:t>
+            </w:r>
+          </w:p>
+        </w:tc>
+        <w:tc>
+          <w:tcPr>
+            <w:tcW w:w="0" w:type="auto"/>
+            <w:hideMark/>
+          </w:tcPr>
+          <w:p>
+            <w:r>
+              <w:t>Khó tra cứu, sai thông tin hồ sơ</w:t>
+            </w:r>
+          </w:p>
+        </w:tc>
+        <w:tc>
+          <w:tcPr>
+            <w:tcW w:w="0" w:type="auto"/>
+            <w:hideMark/>
+          </w:tcPr>
+          <w:p>
+            <w:r>
+              <w:t>Hệ thống tự động cấp mã ngay khi hồ sơ được ghi nhận</w:t>
+            </w:r>
+          </w:p>
+        </w:tc>
+      </w:tr>
+      <w:tr>
+        <w:trPr>
+          <w:trHeight w:val="1055"/>
+        </w:trPr>
+        <w:tc>
+          <w:tcPr>
+            <w:tcW w:w="0" w:type="auto"/>
+            <w:hideMark/>
+          </w:tcPr>
+          <w:p>
+            <w:r>
+              <w:t>6</w:t>
+            </w:r>
+          </w:p>
+        </w:tc>
+        <w:tc>
+          <w:tcPr>
+            <w:tcW w:w="0" w:type="auto"/>
+            <w:hideMark/>
+          </w:tcPr>
+          <w:p>
+            <w:r>
+              <w:t>Kiểm tra tài khoản DVCQG</w:t>
+            </w:r>
+          </w:p>
+        </w:tc>
+        <w:tc>
+          <w:tcPr>
+            <w:tcW w:w="0" w:type="auto"/>
+            <w:hideMark/>
+          </w:tcPr>
+          <w:p>
+            <w:r>
+              <w:t>VBA</w:t>
+            </w:r>
+          </w:p>
+        </w:tc>
+        <w:tc>
+          <w:tcPr>
+            <w:tcW w:w="0" w:type="auto"/>
+            <w:hideMark/>
+          </w:tcPr>
+          <w:p>
+            <w:r>
+              <w:t>Phải tra cứu tài khoản trước khi tiếp tục xử lý</w:t>
+            </w:r>
+          </w:p>
+        </w:tc>
+        <w:tc>
+          <w:tcPr>
+            <w:tcW w:w="0" w:type="auto"/>
+            <w:hideMark/>
+          </w:tcPr>
+          <w:p>
+            <w:r>
+              <w:t>Tăng thao tác hành chính</w:t>
+            </w:r>
+          </w:p>
+        </w:tc>
+        <w:tc>
+          <w:tcPr>
+            <w:tcW w:w="0" w:type="auto"/>
+            <w:hideMark/>
+          </w:tcPr>
+          <w:p>
+            <w:r>
+              <w:t>Tích hợp đăng nhập/định danh một lần và tự động kiểm tra tài khoản</w:t>
+            </w:r>
+          </w:p>
+        </w:tc>
+      </w:tr>
+      <w:tr>
+        <w:trPr>
+          <w:trHeight w:val="1055"/>
+        </w:trPr>
+        <w:tc>
+          <w:tcPr>
+            <w:tcW w:w="0" w:type="auto"/>
+            <w:hideMark/>
+          </w:tcPr>
+          <w:p>
+            <w:r>
+              <w:lastRenderedPageBreak/>
+              <w:t>7</w:t>
+            </w:r>
+          </w:p>
+        </w:tc>
+        <w:tc>
+          <w:tcPr>
+            <w:tcW w:w="0" w:type="auto"/>
+            <w:hideMark/>
+          </w:tcPr>
+          <w:p>
+            <w:r>
+              <w:t>Hỗ trợ tạo tài khoản DVCQG</w:t>
+            </w:r>
+          </w:p>
+        </w:tc>
+        <w:tc>
+          <w:tcPr>
+            <w:tcW w:w="0" w:type="auto"/>
+            <w:hideMark/>
+          </w:tcPr>
+          <w:p>
+            <w:r>
+              <w:t>VBA</w:t>
+            </w:r>
+          </w:p>
+        </w:tc>
+        <w:tc>
+          <w:tcPr>
+            <w:tcW w:w="0" w:type="auto"/>
+            <w:hideMark/>
+          </w:tcPr>
+          <w:p>
+            <w:r>
+              <w:t>Người chưa có tài khoản cần cán bộ hỗ trợ</w:t>
+            </w:r>
+          </w:p>
+        </w:tc>
+        <w:tc>
+          <w:tcPr>
+            <w:tcW w:w="0" w:type="auto"/>
+            <w:hideMark/>
+          </w:tcPr>
+          <w:p>
+            <w:r>
+              <w:t>Làm tăng thời gian tại quầy</w:t>
+            </w:r>
+          </w:p>
+        </w:tc>
+        <w:tc>
+          <w:tcPr>
+            <w:tcW w:w="0" w:type="auto"/>
+            <w:hideMark/>
+          </w:tcPr>
+          <w:p>
+            <w:r>
+              <w:t>Hướng dẫn người dân tạo tài khoản trước; hỗ trợ QR/link đăng ký nhanh</w:t>
+            </w:r>
+          </w:p>
+        </w:tc>
+      </w:tr>
+      <w:tr>
+        <w:trPr>
+          <w:trHeight w:val="1610"/>
+        </w:trPr>
+        <w:tc>
+          <w:tcPr>
+            <w:tcW w:w="0" w:type="auto"/>
+            <w:hideMark/>
+          </w:tcPr>
+          <w:p>
+            <w:r>
+              <w:t>8</w:t>
+            </w:r>
+          </w:p>
+        </w:tc>
+        <w:tc>
+          <w:tcPr>
+            <w:tcW w:w="0" w:type="auto"/>
+            <w:hideMark/>
+          </w:tcPr>
+          <w:p>
+            <w:r>
+              <w:t>Kiểm tra tài khoản HTTT giải quyết TTHC</w:t>
+            </w:r>
+          </w:p>
+        </w:tc>
+        <w:tc>
+          <w:tcPr>
+            <w:tcW w:w="0" w:type="auto"/>
+            <w:hideMark/>
+          </w:tcPr>
+          <w:p>
+            <w:r>
+              <w:t>VBA</w:t>
+            </w:r>
+          </w:p>
+        </w:tc>
+        <w:tc>
+          <w:tcPr>
+            <w:tcW w:w="0" w:type="auto"/>
+            <w:hideMark/>
+          </w:tcPr>
+          <w:p>
+            <w:r>
+              <w:t>Kiểm tra lại tài khoản trên hệ thống thứ hai có thể trùng với bước trước</w:t>
+            </w:r>
+          </w:p>
+        </w:tc>
+        <w:tc>
+          <w:tcPr>
+            <w:tcW w:w="0" w:type="auto"/>
+            <w:hideMark/>
+          </w:tcPr>
+          <w:p>
+            <w:r>
+              <w:t>Tăng thao tác, có nguy cơ dữ liệu không đồng bộ</w:t>
+            </w:r>
+          </w:p>
+        </w:tc>
+        <w:tc>
+          <w:tcPr>
+            <w:tcW w:w="0" w:type="auto"/>
+            <w:hideMark/>
+          </w:tcPr>
+          <w:p>
+            <w:r>
+              <w:t>Đồng bộ tài khoản DVCQG và HTTT TTHC bằng mã định danh duy nhất</w:t>
+            </w:r>
+          </w:p>
+        </w:tc>
+      </w:tr>
+      <w:tr>
+        <w:trPr>
+          <w:trHeight w:val="1340"/>
+        </w:trPr>
+        <w:tc>
+          <w:tcPr>
+            <w:tcW w:w="0" w:type="auto"/>
+            <w:hideMark/>
+          </w:tcPr>
+          <w:p>
+            <w:r>
+              <w:t>9</w:t>
+            </w:r>
+          </w:p>
+        </w:tc>
+        <w:tc>
+          <w:tcPr>
+            <w:tcW w:w="0" w:type="auto"/>
+            <w:hideMark/>
+          </w:tcPr>
+          <w:p>
+            <w:r>
+              <w:t>Cấp quyền/Tạo và liên kết tài khoản</w:t>
+            </w:r>
+          </w:p>
+        </w:tc>
+        <w:tc>
+          <w:tcPr>
+            <w:tcW w:w="0" w:type="auto"/>
+            <w:hideMark/>
+          </w:tcPr>
+          <w:p>
+            <w:r>
+              <w:t>VBA</w:t>
+            </w:r>
+          </w:p>
+        </w:tc>
+        <w:tc>
+          <w:tcPr>
+            <w:tcW w:w="0" w:type="auto"/>
+            <w:hideMark/>
+          </w:tcPr>
+          <w:p>
+            <w:r>
+              <w:t>Có thể phải tạo thêm tài khoản hoặc cấp quyền thủ công</w:t>
+            </w:r>
+          </w:p>
+        </w:tc>
+        <w:tc>
+          <w:tcPr>
+            <w:tcW w:w="0" w:type="auto"/>
+            <w:hideMark/>
+          </w:tcPr>
+          <w:p>
+            <w:r>
+              <w:t>Tốn thời gian và dễ sai</w:t>
+            </w:r>
+          </w:p>
+        </w:tc>
+        <w:tc>
+          <w:tcPr>
+            <w:tcW w:w="0" w:type="auto"/>
+            <w:hideMark/>
+          </w:tcPr>
+          <w:p>
+            <w:r>
+              <w:t>Tự động tạo/liên kết tài khoản khi xác thực định danh thành công</w:t>
+            </w:r>
+          </w:p>
+        </w:tc>
+      </w:tr>
+      <w:tr>
+        <w:trPr>
+          <w:trHeight w:val="1340"/>
+        </w:trPr>
+        <w:tc>
+          <w:tcPr>
+            <w:tcW w:w="0" w:type="auto"/>
+            <w:hideMark/>
+          </w:tcPr>
+          <w:p>
+            <w:r>
+              <w:t>10</w:t>
+            </w:r>
+          </w:p>
+        </w:tc>
+        <w:tc>
+          <w:tcPr>
+            <w:tcW w:w="0" w:type="auto"/>
+            <w:hideMark/>
+          </w:tcPr>
+          <w:p>
+            <w:r>
+              <w:t>Nhập thông tin hồ sơ</w:t>
+            </w:r>
+          </w:p>
+        </w:tc>
+        <w:tc>
+          <w:tcPr>
+            <w:tcW w:w="0" w:type="auto"/>
+            <w:hideMark/>
+          </w:tcPr>
+          <w:p>
+            <w:r>
+              <w:t>VBA</w:t>
+            </w:r>
+          </w:p>
+        </w:tc>
+        <w:tc>
+          <w:tcPr>
+            <w:tcW w:w="0" w:type="auto"/>
+            <w:hideMark/>
+          </w:tcPr>
+          <w:p>
+            <w:r>
+              <w:t>Dữ liệu người dân đã khai có thể bị cán bộ nhập lại</w:t>
+            </w:r>
+          </w:p>
+        </w:tc>
+        <w:tc>
+          <w:tcPr>
+            <w:tcW w:w="0" w:type="auto"/>
+            <w:hideMark/>
+          </w:tcPr>
+          <w:p>
+            <w:r>
+              <w:t>Lãng phí nhập liệu, dễ sai thông tin</w:t>
+            </w:r>
+          </w:p>
+        </w:tc>
+        <w:tc>
+          <w:tcPr>
+            <w:tcW w:w="0" w:type="auto"/>
+            <w:hideMark/>
+          </w:tcPr>
+          <w:p>
+            <w:r>
+              <w:t>Tự động lấy dữ liệu từ hồ sơ điện tử, CSDL dân cư và tài khoản người dùng</w:t>
+            </w:r>
+          </w:p>
+        </w:tc>
+      </w:tr>
+      <w:tr>
+        <w:trPr>
+          <w:trHeight w:val="1340"/>
+        </w:trPr>
+        <w:tc>
+          <w:tcPr>
+            <w:tcW w:w="0" w:type="auto"/>
+            <w:hideMark/>
+          </w:tcPr>
+          <w:p>
+            <w:r>
+              <w:t>11</w:t>
+            </w:r>
+          </w:p>
+        </w:tc>
+        <w:tc>
+          <w:tcPr>
+            <w:tcW w:w="0" w:type="auto"/>
+            <w:hideMark/>
+          </w:tcPr>
+          <w:p>
+            <w:r>
+              <w:t>Kiểm tra hồ sơ</w:t>
+            </w:r>
+          </w:p>
+        </w:tc>
+        <w:tc>
+          <w:tcPr>
+            <w:tcW w:w="0" w:type="auto"/>
+            <w:hideMark/>
+          </w:tcPr>
+          <w:p>
+            <w:r>
+              <w:t>VBA</w:t>
+            </w:r>
+          </w:p>
+        </w:tc>
+        <w:tc>
+          <w:tcPr>
+            <w:tcW w:w="0" w:type="auto"/>
+            <w:hideMark/>
+          </w:tcPr>
+          <w:p>
+            <w:r>
+              <w:t>Cán bộ phải đối chiếu nhiều giấy tờ và nguồn dữ liệu</w:t>
+            </w:r>
+          </w:p>
+        </w:tc>
+        <w:tc>
+          <w:tcPr>
+            <w:tcW w:w="0" w:type="auto"/>
+            <w:hideMark/>
+          </w:tcPr>
+          <w:p>
+            <w:r>
+              <w:t>Tốn thời gian kiểm tra</w:t>
+            </w:r>
+          </w:p>
+        </w:tc>
+        <w:tc>
+          <w:tcPr>
+            <w:tcW w:w="0" w:type="auto"/>
+            <w:hideMark/>
+          </w:tcPr>
+          <w:p>
+            <w:r>
+              <w:t>Xây dựng checklist điện tử; hệ thống tự kiểm tra trường bắt buộc và đối chiếu dữ liệu có sẵn</w:t>
+            </w:r>
+          </w:p>
+        </w:tc>
+      </w:tr>
+      <w:tr>
+        <w:trPr>
+          <w:trHeight w:val="1055"/>
+        </w:trPr>
+        <w:tc>
+          <w:tcPr>
+            <w:tcW w:w="0" w:type="auto"/>
+            <w:hideMark/>
+          </w:tcPr>
+          <w:p>
+            <w:r>
+              <w:t>12</w:t>
+            </w:r>
+          </w:p>
+        </w:tc>
+        <w:tc>
+          <w:tcPr>
+            <w:tcW w:w="0" w:type="auto"/>
+            <w:hideMark/>
+          </w:tcPr>
+          <w:p>
+            <w:r>
+              <w:t>Yêu cầu bổ sung</w:t>
+            </w:r>
+          </w:p>
+        </w:tc>
+        <w:tc>
+          <w:tcPr>
+            <w:tcW w:w="0" w:type="auto"/>
+            <w:hideMark/>
+          </w:tcPr>
+          <w:p>
+            <w:r>
+              <w:t>NVA</w:t>
+            </w:r>
+          </w:p>
+        </w:tc>
+        <w:tc>
+          <w:tcPr>
+            <w:tcW w:w="0" w:type="auto"/>
+            <w:hideMark/>
+          </w:tcPr>
+          <w:p>
+            <w:r>
+              <w:t>Phát sinh vì hồ sơ chưa đầy đủ hoặc không chính xác</w:t>
+            </w:r>
+          </w:p>
+        </w:tc>
+        <w:tc>
+          <w:tcPr>
+            <w:tcW w:w="0" w:type="auto"/>
+            <w:hideMark/>
+          </w:tcPr>
+          <w:p>
+            <w:r>
+              <w:t>Làm tăng cycle time, người dân phải chờ/làm lại</w:t>
+            </w:r>
+          </w:p>
+        </w:tc>
+        <w:tc>
+          <w:tcPr>
+            <w:tcW w:w="0" w:type="auto"/>
+            <w:hideMark/>
+          </w:tcPr>
+          <w:p>
+            <w:r>
+              <w:t>Kiểm tra tự động trước khi cho phép nộp; hướng dẫn bổ sung đầy đủ một lần</w:t>
+            </w:r>
+          </w:p>
+        </w:tc>
+      </w:tr>
+      <w:tr>
+        <w:trPr>
+          <w:trHeight w:val="1055"/>
+        </w:trPr>
+        <w:tc>
+          <w:tcPr>
+            <w:tcW w:w="0" w:type="auto"/>
+            <w:hideMark/>
+          </w:tcPr>
+          <w:p>
+            <w:r>
+              <w:t>13</w:t>
+            </w:r>
+          </w:p>
+        </w:tc>
+        <w:tc>
+          <w:tcPr>
+            <w:tcW w:w="0" w:type="auto"/>
+            <w:hideMark/>
+          </w:tcPr>
+          <w:p>
+            <w:r>
+              <w:t>Bổ sung hồ sơ</w:t>
+            </w:r>
+          </w:p>
+        </w:tc>
+        <w:tc>
+          <w:tcPr>
+            <w:tcW w:w="0" w:type="auto"/>
+            <w:hideMark/>
+          </w:tcPr>
+          <w:p>
+            <w:r>
+              <w:t>NVA</w:t>
+            </w:r>
+          </w:p>
+        </w:tc>
+        <w:tc>
+          <w:tcPr>
+            <w:tcW w:w="0" w:type="auto"/>
+            <w:hideMark/>
+          </w:tcPr>
+          <w:p>
+            <w:r>
+              <w:t>Người dân phải quay lại hoặc gửi thêm giấy tờ</w:t>
+            </w:r>
+          </w:p>
+        </w:tc>
+        <w:tc>
+          <w:tcPr>
+            <w:tcW w:w="0" w:type="auto"/>
+            <w:hideMark/>
+          </w:tcPr>
+          <w:p>
+            <w:r>
+              <w:t>Rework, tăng thời gian và công sức</w:t>
+            </w:r>
+          </w:p>
+        </w:tc>
+        <w:tc>
+          <w:tcPr>
+            <w:tcW w:w="0" w:type="auto"/>
+            <w:hideMark/>
+          </w:tcPr>
+          <w:p>
+            <w:r>
+              <w:t>Cho phép bổ sung trực tuyến, thông báo rõ chính xác tài liệu còn thiếu</w:t>
+            </w:r>
+          </w:p>
+        </w:tc>
+      </w:tr>
+      <w:tr>
+        <w:trPr>
+          <w:trHeight w:val="1610"/>
+        </w:trPr>
+        <w:tc>
+          <w:tcPr>
+            <w:tcW w:w="0" w:type="auto"/>
+            <w:hideMark/>
+          </w:tcPr>
+          <w:p>
+            <w:r>
+              <w:t>14</w:t>
+            </w:r>
+          </w:p>
+        </w:tc>
+        <w:tc>
+          <w:tcPr>
+            <w:tcW w:w="0" w:type="auto"/>
+            <w:hideMark/>
+          </w:tcPr>
+          <w:p>
+            <w:r>
+              <w:t>Từ chối tiếp nhận</w:t>
+            </w:r>
+          </w:p>
+        </w:tc>
+        <w:tc>
+          <w:tcPr>
+            <w:tcW w:w="0" w:type="auto"/>
+            <w:hideMark/>
+          </w:tcPr>
+          <w:p>
+            <w:r>
+              <w:t>VBA</w:t>
+            </w:r>
+          </w:p>
+        </w:tc>
+        <w:tc>
+          <w:tcPr>
+            <w:tcW w:w="0" w:type="auto"/>
+            <w:hideMark/>
+          </w:tcPr>
+          <w:p>
+            <w:r>
+              <w:t>Có thể phát hiện sai thẩm quyền quá muộn, sau khi đã thực hiện nhiều thao tác</w:t>
+            </w:r>
+          </w:p>
+        </w:tc>
+        <w:tc>
+          <w:tcPr>
+            <w:tcW w:w="0" w:type="auto"/>
+            <w:hideMark/>
+          </w:tcPr>
+          <w:p>
+            <w:r>
+              <w:t>Lãng phí công sức cả người dân và cán bộ</w:t>
+            </w:r>
+          </w:p>
+        </w:tc>
+        <w:tc>
+          <w:tcPr>
+            <w:tcW w:w="0" w:type="auto"/>
+            <w:hideMark/>
+          </w:tcPr>
+          <w:p>
+            <w:r>
+              <w:t>Kiểm tra thẩm quyền ngay từ đầu; tự động hướng dẫn sang đúng cơ quan</w:t>
+            </w:r>
+          </w:p>
+        </w:tc>
+      </w:tr>
+      <w:tr>
+        <w:trPr>
+          <w:trHeight w:val="1055"/>
+        </w:trPr>
+        <w:tc>
+          <w:tcPr>
+            <w:tcW w:w="0" w:type="auto"/>
+            <w:hideMark/>
+          </w:tcPr>
+          <w:p>
+            <w:r>
+              <w:t>15</w:t>
+            </w:r>
+          </w:p>
+        </w:tc>
+        <w:tc>
+          <w:tcPr>
+            <w:tcW w:w="0" w:type="auto"/>
+            <w:hideMark/>
+          </w:tcPr>
+          <w:p>
+            <w:r>
+              <w:t>Kiểm tra chứng thực điện tử</w:t>
+            </w:r>
+          </w:p>
+        </w:tc>
+        <w:tc>
+          <w:tcPr>
+            <w:tcW w:w="0" w:type="auto"/>
+            <w:hideMark/>
+          </w:tcPr>
+          <w:p>
+            <w:r>
+              <w:t>VBA</w:t>
+            </w:r>
+          </w:p>
+        </w:tc>
+        <w:tc>
+          <w:tcPr>
+            <w:tcW w:w="0" w:type="auto"/>
+            <w:hideMark/>
+          </w:tcPr>
+          <w:p>
+            <w:r>
+              <w:t>Kiểm tra thủ công từng tài liệu mất thời gian</w:t>
+            </w:r>
+          </w:p>
+        </w:tc>
+        <w:tc>
+          <w:tcPr>
+            <w:tcW w:w="0" w:type="auto"/>
+            <w:hideMark/>
+          </w:tcPr>
+          <w:p>
+            <w:r>
+              <w:t>Làm chậm tiếp nhận</w:t>
+            </w:r>
+          </w:p>
+        </w:tc>
+        <w:tc>
+          <w:tcPr>
+            <w:tcW w:w="0" w:type="auto"/>
+            <w:hideMark/>
+          </w:tcPr>
+          <w:p>
+            <w:r>
+              <w:t>Kết nối hệ thống chứng thực/chữ ký số để tự xác thực tài liệu</w:t>
+            </w:r>
+          </w:p>
+        </w:tc>
+      </w:tr>
+      <w:tr>
+        <w:trPr>
+          <w:trHeight w:val="1055"/>
+        </w:trPr>
+        <w:tc>
+          <w:tcPr>
+            <w:tcW w:w="0" w:type="auto"/>
+            <w:hideMark/>
+          </w:tcPr>
+          <w:p>
+            <w:r>
+              <w:t>16</w:t>
+            </w:r>
+          </w:p>
+        </w:tc>
+        <w:tc>
+          <w:tcPr>
+            <w:tcW w:w="0" w:type="auto"/>
+            <w:hideMark/>
+          </w:tcPr>
+          <w:p>
+            <w:r>
+              <w:t>Scan hồ sơ và đính kèm tệp</w:t>
+            </w:r>
+          </w:p>
+        </w:tc>
+        <w:tc>
+          <w:tcPr>
+            <w:tcW w:w="0" w:type="auto"/>
+            <w:hideMark/>
+          </w:tcPr>
+          <w:p>
+            <w:r>
+              <w:t>VBA</w:t>
+            </w:r>
+          </w:p>
+        </w:tc>
+        <w:tc>
+          <w:tcPr>
+            <w:tcW w:w="0" w:type="auto"/>
+            <w:hideMark/>
+          </w:tcPr>
+          <w:p>
+            <w:r>
+              <w:t>Hồ sơ giấy phải scan lại, thao tác thủ công</w:t>
+            </w:r>
+          </w:p>
+        </w:tc>
+        <w:tc>
+          <w:tcPr>
+            <w:tcW w:w="0" w:type="auto"/>
+            <w:hideMark/>
+          </w:tcPr>
+          <w:p>
+            <w:r>
+              <w:t xml:space="preserve">Tốn thời gian, có thể </w:t>
+            </w:r>
+            <w:r>
+              <w:lastRenderedPageBreak/>
+              <w:t>sai tên/thiếu tệp</w:t>
+            </w:r>
+          </w:p>
+        </w:tc>
+        <w:tc>
+          <w:tcPr>
+            <w:tcW w:w="0" w:type="auto"/>
+            <w:hideMark/>
+          </w:tcPr>
+          <w:p>
+            <w:r>
+              <w:lastRenderedPageBreak/>
+              <w:t xml:space="preserve">Ưu tiên hồ sơ điện tử; scan tự động, nhận </w:t>
+            </w:r>
+            <w:r>
+              <w:lastRenderedPageBreak/>
+              <w:t>dạng và gắn tệp với đúng thành phần</w:t>
+            </w:r>
+          </w:p>
+        </w:tc>
+      </w:tr>
+      <w:tr>
+        <w:trPr>
+          <w:trHeight w:val="1340"/>
+        </w:trPr>
+        <w:tc>
+          <w:tcPr>
+            <w:tcW w:w="0" w:type="auto"/>
+            <w:hideMark/>
+          </w:tcPr>
+          <w:p>
+            <w:r>
+              <w:lastRenderedPageBreak/>
+              <w:t>17</w:t>
+            </w:r>
+          </w:p>
+        </w:tc>
+        <w:tc>
+          <w:tcPr>
+            <w:tcW w:w="0" w:type="auto"/>
+            <w:hideMark/>
+          </w:tcPr>
+          <w:p>
+            <w:r>
+              <w:t>Số hóa thành phần hồ sơ</w:t>
+            </w:r>
+          </w:p>
+        </w:tc>
+        <w:tc>
+          <w:tcPr>
+            <w:tcW w:w="0" w:type="auto"/>
+            <w:hideMark/>
+          </w:tcPr>
+          <w:p>
+            <w:r>
+              <w:t>VBA</w:t>
+            </w:r>
+          </w:p>
+        </w:tc>
+        <w:tc>
+          <w:tcPr>
+            <w:tcW w:w="0" w:type="auto"/>
+            <w:hideMark/>
+          </w:tcPr>
+          <w:p>
+            <w:r>
+              <w:t>Có khả năng trùng với scan/đính kèm</w:t>
+            </w:r>
+          </w:p>
+        </w:tc>
+        <w:tc>
+          <w:tcPr>
+            <w:tcW w:w="0" w:type="auto"/>
+            <w:hideMark/>
+          </w:tcPr>
+          <w:p>
+            <w:r>
+              <w:t>Tăng thao tác xử lý</w:t>
+            </w:r>
+          </w:p>
+        </w:tc>
+        <w:tc>
+          <w:tcPr>
+            <w:tcW w:w="0" w:type="auto"/>
+            <w:hideMark/>
+          </w:tcPr>
+          <w:p>
+            <w:r>
+              <w:t>Gộp scan và số hóa thành một công đoạn nếu nghiệp vụ cho phép; tái sử dụng dữ liệu đã số hóa</w:t>
+            </w:r>
+          </w:p>
+        </w:tc>
+      </w:tr>
+      <w:tr>
+        <w:trPr>
+          <w:trHeight w:val="1340"/>
+        </w:trPr>
+        <w:tc>
+          <w:tcPr>
+            <w:tcW w:w="0" w:type="auto"/>
+            <w:hideMark/>
+          </w:tcPr>
+          <w:p>
+            <w:r>
+              <w:t>18</w:t>
+            </w:r>
+          </w:p>
+        </w:tc>
+        <w:tc>
+          <w:tcPr>
+            <w:tcW w:w="0" w:type="auto"/>
+            <w:hideMark/>
+          </w:tcPr>
+          <w:p>
+            <w:r>
+              <w:t>Ghi nhận hình thức trả kết quả</w:t>
+            </w:r>
+          </w:p>
+        </w:tc>
+        <w:tc>
+          <w:tcPr>
+            <w:tcW w:w="0" w:type="auto"/>
+            <w:hideMark/>
+          </w:tcPr>
+          <w:p>
+            <w:r>
+              <w:t>VA</w:t>
+            </w:r>
+          </w:p>
+        </w:tc>
+        <w:tc>
+          <w:tcPr>
+            <w:tcW w:w="0" w:type="auto"/>
+            <w:hideMark/>
+          </w:tcPr>
+          <w:p>
+            <w:r>
+              <w:t>Cán bộ phải hỏi và nhập lại lựa chọn của người dân</w:t>
+            </w:r>
+          </w:p>
+        </w:tc>
+        <w:tc>
+          <w:tcPr>
+            <w:tcW w:w="0" w:type="auto"/>
+            <w:hideMark/>
+          </w:tcPr>
+          <w:p>
+            <w:r>
+              <w:t>Phát sinh thao tác nhỏ</w:t>
+            </w:r>
+          </w:p>
+        </w:tc>
+        <w:tc>
+          <w:tcPr>
+            <w:tcW w:w="0" w:type="auto"/>
+            <w:hideMark/>
+          </w:tcPr>
+          <w:p>
+            <w:r>
+              <w:t>Cho người dân chọn hình thức nhận ngay lúc nộp và tự động lưu lựa chọn</w:t>
+            </w:r>
+          </w:p>
+        </w:tc>
+      </w:tr>
+      <w:tr>
+        <w:trPr>
+          <w:trHeight w:val="1340"/>
+        </w:trPr>
+        <w:tc>
+          <w:tcPr>
+            <w:tcW w:w="0" w:type="auto"/>
+            <w:hideMark/>
+          </w:tcPr>
+          <w:p>
+            <w:r>
+              <w:t>19</w:t>
+            </w:r>
+          </w:p>
+        </w:tc>
+        <w:tc>
+          <w:tcPr>
+            <w:tcW w:w="0" w:type="auto"/>
+            <w:hideMark/>
+          </w:tcPr>
+          <w:p>
+            <w:r>
+              <w:t>Lưu hồ sơ</w:t>
+            </w:r>
+          </w:p>
+        </w:tc>
+        <w:tc>
+          <w:tcPr>
+            <w:tcW w:w="0" w:type="auto"/>
+            <w:hideMark/>
+          </w:tcPr>
+          <w:p>
+            <w:r>
+              <w:t>VBA</w:t>
+            </w:r>
+          </w:p>
+        </w:tc>
+        <w:tc>
+          <w:tcPr>
+            <w:tcW w:w="0" w:type="auto"/>
+            <w:hideMark/>
+          </w:tcPr>
+          <w:p>
+            <w:r>
+              <w:t>Nếu cần thao tác lưu thủ công nhiều bước có thể chậm</w:t>
+            </w:r>
+          </w:p>
+        </w:tc>
+        <w:tc>
+          <w:tcPr>
+            <w:tcW w:w="0" w:type="auto"/>
+            <w:hideMark/>
+          </w:tcPr>
+          <w:p>
+            <w:r>
+              <w:t>Tăng thời gian xử lý</w:t>
+            </w:r>
+          </w:p>
+        </w:tc>
+        <w:tc>
+          <w:tcPr>
+            <w:tcW w:w="0" w:type="auto"/>
+            <w:hideMark/>
+          </w:tcPr>
+          <w:p>
+            <w:r>
+              <w:t>Hệ thống tự lưu sau khi xác nhận tiếp nhận</w:t>
+            </w:r>
+          </w:p>
+        </w:tc>
+      </w:tr>
+      <w:tr>
+        <w:trPr>
+          <w:trHeight w:val="1340"/>
+        </w:trPr>
+        <w:tc>
+          <w:tcPr>
+            <w:tcW w:w="0" w:type="auto"/>
+            <w:hideMark/>
+          </w:tcPr>
+          <w:p>
+            <w:r>
+              <w:t>20</w:t>
+            </w:r>
+          </w:p>
+        </w:tc>
+        <w:tc>
+          <w:tcPr>
+            <w:tcW w:w="0" w:type="auto"/>
+            <w:hideMark/>
+          </w:tcPr>
+          <w:p>
+            <w:r>
+              <w:t>Cập nhật trạng thái hồ sơ</w:t>
+            </w:r>
+          </w:p>
+        </w:tc>
+        <w:tc>
+          <w:tcPr>
+            <w:tcW w:w="0" w:type="auto"/>
+            <w:hideMark/>
+          </w:tcPr>
+          <w:p>
+            <w:r>
+              <w:t>VBA</w:t>
+            </w:r>
+          </w:p>
+        </w:tc>
+        <w:tc>
+          <w:tcPr>
+            <w:tcW w:w="0" w:type="auto"/>
+            <w:hideMark/>
+          </w:tcPr>
+          <w:p>
+            <w:r>
+              <w:t>Cán bộ cập nhật thủ công dễ quên hoặc cập nhật chậm</w:t>
+            </w:r>
+          </w:p>
+        </w:tc>
+        <w:tc>
+          <w:tcPr>
+            <w:tcW w:w="0" w:type="auto"/>
+            <w:hideMark/>
+          </w:tcPr>
+          <w:p>
+            <w:r>
+              <w:t>Người dân không biết trạng thái thật</w:t>
+            </w:r>
+          </w:p>
+        </w:tc>
+        <w:tc>
+          <w:tcPr>
+            <w:tcW w:w="0" w:type="auto"/>
+            <w:hideMark/>
+          </w:tcPr>
+          <w:p>
+            <w:r>
+              <w:t>Tự động thay đổi trạng thái khi hoàn thành từng task</w:t>
+            </w:r>
+          </w:p>
+        </w:tc>
+      </w:tr>
+      <w:tr>
+        <w:trPr>
+          <w:trHeight w:val="1340"/>
+        </w:trPr>
+        <w:tc>
+          <w:tcPr>
+            <w:tcW w:w="0" w:type="auto"/>
+            <w:hideMark/>
+          </w:tcPr>
+          <w:p>
+            <w:r>
+              <w:t>21</w:t>
+            </w:r>
+          </w:p>
+        </w:tc>
+        <w:tc>
+          <w:tcPr>
+            <w:tcW w:w="0" w:type="auto"/>
+            <w:hideMark/>
+          </w:tcPr>
+          <w:p>
+            <w:r>
+              <w:t>In/gửi Phiếu tiếp nhận và hẹn trả kết quả</w:t>
+            </w:r>
+          </w:p>
+        </w:tc>
+        <w:tc>
+          <w:tcPr>
+            <w:tcW w:w="0" w:type="auto"/>
+            <w:hideMark/>
+          </w:tcPr>
+          <w:p>
+            <w:r>
+              <w:t>VA</w:t>
+            </w:r>
+          </w:p>
+        </w:tc>
+        <w:tc>
+          <w:tcPr>
+            <w:tcW w:w="0" w:type="auto"/>
+            <w:hideMark/>
+          </w:tcPr>
+          <w:p>
+            <w:r>
+              <w:t>In giấy gây tốn thời gian, giấy và chi phí</w:t>
+            </w:r>
+          </w:p>
+        </w:tc>
+        <w:tc>
+          <w:tcPr>
+            <w:tcW w:w="0" w:type="auto"/>
+            <w:hideMark/>
+          </w:tcPr>
+          <w:p>
+            <w:r>
+              <w:t>Tăng thao tác nhưng vẫn mang giá trị cho người dân</w:t>
+            </w:r>
+          </w:p>
+        </w:tc>
+        <w:tc>
+          <w:tcPr>
+            <w:tcW w:w="0" w:type="auto"/>
+            <w:hideMark/>
+          </w:tcPr>
+          <w:p>
+            <w:r>
+              <w:t>Ưu tiên gửi điện tử/SMS/email; chỉ in khi người dân yêu cầu</w:t>
+            </w:r>
+          </w:p>
+        </w:tc>
+      </w:tr>
+      <w:tr>
+        <w:trPr>
+          <w:trHeight w:val="1340"/>
+        </w:trPr>
+        <w:tc>
+          <w:tcPr>
+            <w:tcW w:w="0" w:type="auto"/>
+            <w:hideMark/>
+          </w:tcPr>
+          <w:p>
+            <w:r>
+              <w:t>22</w:t>
+            </w:r>
+          </w:p>
+        </w:tc>
+        <w:tc>
+          <w:tcPr>
+            <w:tcW w:w="0" w:type="auto"/>
+            <w:hideMark/>
+          </w:tcPr>
+          <w:p>
+            <w:r>
+              <w:t>In Phiếu kiểm soát quá trình xử lý</w:t>
+            </w:r>
+          </w:p>
+        </w:tc>
+        <w:tc>
+          <w:tcPr>
+            <w:tcW w:w="0" w:type="auto"/>
+            <w:hideMark/>
+          </w:tcPr>
+          <w:p>
+            <w:r>
+              <w:t>NVA</w:t>
+            </w:r>
+          </w:p>
+        </w:tc>
+        <w:tc>
+          <w:tcPr>
+            <w:tcW w:w="0" w:type="auto"/>
+            <w:hideMark/>
+          </w:tcPr>
+          <w:p>
+            <w:r>
+              <w:t>Chủ yếu phục vụ luân chuyển nội bộ, thông tin đã có trên hệ thống</w:t>
+            </w:r>
+          </w:p>
+        </w:tc>
+        <w:tc>
+          <w:tcPr>
+            <w:tcW w:w="0" w:type="auto"/>
+            <w:hideMark/>
+          </w:tcPr>
+          <w:p>
+            <w:r>
+              <w:t>In giấy, chuyển giấy, tăng thời gian</w:t>
+            </w:r>
+          </w:p>
+        </w:tc>
+        <w:tc>
+          <w:tcPr>
+            <w:tcW w:w="0" w:type="auto"/>
+            <w:hideMark/>
+          </w:tcPr>
+          <w:p>
+            <w:r>
+              <w:t>Loại bỏ bản giấy, thay bằng phiếu kiểm soát điện tử trên hệ thống</w:t>
+            </w:r>
+          </w:p>
+        </w:tc>
+      </w:tr>
+      <w:tr>
+        <w:trPr>
+          <w:trHeight w:val="1340"/>
+        </w:trPr>
+        <w:tc>
+          <w:tcPr>
+            <w:tcW w:w="0" w:type="auto"/>
+            <w:hideMark/>
+          </w:tcPr>
+          <w:p>
+            <w:r>
+              <w:t>23</w:t>
+            </w:r>
+          </w:p>
+        </w:tc>
+        <w:tc>
+          <w:tcPr>
+            <w:tcW w:w="0" w:type="auto"/>
+            <w:hideMark/>
+          </w:tcPr>
+          <w:p>
+            <w:r>
+              <w:t>Chuyển hồ sơ sang đơn vị chuyên môn</w:t>
+            </w:r>
+          </w:p>
+        </w:tc>
+        <w:tc>
+          <w:tcPr>
+            <w:tcW w:w="0" w:type="auto"/>
+            <w:hideMark/>
+          </w:tcPr>
+          <w:p>
+            <w:r>
+              <w:t>NVA</w:t>
+            </w:r>
+          </w:p>
+        </w:tc>
+        <w:tc>
+          <w:tcPr>
+            <w:tcW w:w="0" w:type="auto"/>
+            <w:hideMark/>
+          </w:tcPr>
+          <w:p>
+            <w:r>
+              <w:t>Nếu chuyển thủ công hoặc hồ sơ giấy sẽ tạo thời gian chờ</w:t>
+            </w:r>
+          </w:p>
+        </w:tc>
+        <w:tc>
+          <w:tcPr>
+            <w:tcW w:w="0" w:type="auto"/>
+            <w:hideMark/>
+          </w:tcPr>
+          <w:p>
+            <w:r>
+              <w:t>Không tạo giá trị trực tiếp, tăng handoff</w:t>
+            </w:r>
+          </w:p>
+        </w:tc>
+        <w:tc>
+          <w:tcPr>
+            <w:tcW w:w="0" w:type="auto"/>
+            <w:hideMark/>
+          </w:tcPr>
+          <w:p>
+            <w:r>
+              <w:t>Hệ thống tự động chuyển hồ sơ điện tử đến đúng công chức/đơn vị chuyên môn</w:t>
+            </w:r>
+          </w:p>
+        </w:tc>
+      </w:tr>
+    </w:tbl>
+    <w:p>
+      <w:pPr>
+        <w:pStyle w:val="ListParagraph"/>
+        <w:ind w:left="780"/>
+      </w:pPr>
+    </w:p>
+    <w:p>
+      <w:pPr>
+        <w:pStyle w:val="ListParagraph"/>
+        <w:ind w:left="780"/>
+      </w:pPr>
+    </w:p>
+    <w:p>
+      <w:pPr>
+        <w:pStyle w:val="Heading2"/>
+      </w:pPr>
+      <w:r>
+        <w:t>3.1.2 Phân tích định lượng</w:t>
+      </w:r>
+    </w:p>
+    <w:p/>
+    <w:p/>
+    <w:p>
+      <w:pPr>
         <w:pStyle w:val="Heading1"/>
-      </w:pPr>
+        <w:jc w:val="both"/>
+      </w:pPr>
+      <w:bookmarkStart w:id="28" w:name="_Toc236264133"/>
     </w:p>
     <w:p>
       <w:pPr>
         <w:pStyle w:val="Heading1"/>
-      </w:pPr>
-    </w:p>
-    <w:p>
-      <w:pPr>
-        <w:pStyle w:val="Heading1"/>
-      </w:pPr>
-    </w:p>
-    <w:p>
-      <w:pPr>
-        <w:pStyle w:val="Heading1"/>
-      </w:pPr>
-    </w:p>
-    <w:p>
-      <w:pPr>
-        <w:pStyle w:val="Heading1"/>
-      </w:pPr>
-    </w:p>
-    <w:p>
-      <w:pPr>
-        <w:pStyle w:val="Heading1"/>
-      </w:pPr>
-    </w:p>
-    <w:p>
-      <w:pPr>
-        <w:pStyle w:val="Heading1"/>
-      </w:pPr>
-    </w:p>
-    <w:p>
-      <w:pPr>
-        <w:pStyle w:val="Heading1"/>
-      </w:pPr>
-    </w:p>
-    <w:p>
-      <w:pPr>
-        <w:pStyle w:val="Heading1"/>
-      </w:pPr>
-    </w:p>
-    <w:p>
-      <w:pPr>
-        <w:pStyle w:val="Heading1"/>
-      </w:pPr>
-    </w:p>
-    <w:p>
-      <w:pPr>
-        <w:pStyle w:val="Heading1"/>
-      </w:pPr>
-    </w:p>
-    <w:p>
-      <w:pPr>
-        <w:pStyle w:val="Heading1"/>
-      </w:pPr>
-    </w:p>
-    <w:p>
-      <w:pPr>
-        <w:pStyle w:val="Heading1"/>
-      </w:pPr>
-      <w:bookmarkStart w:id="28" w:name="_Toc236264133"/>
-      <w:r>
-        <w:lastRenderedPageBreak/>
+        <w:jc w:val="both"/>
+      </w:pPr>
+      <w:r>
         <w:t xml:space="preserve">Chương IV. </w:t>
       </w:r>
       <w:r>
@@ -11581,6 +13289,119 @@
     </w:lvl>
   </w:abstractNum>
   <w:abstractNum w:abstractNumId="4" w15:restartNumberingAfterBreak="0">
+    <w:nsid w:val="0C9554B9"/>
+    <w:multiLevelType w:val="multilevel"/>
+    <w:tmpl w:val="293E7BE8"/>
+    <w:lvl w:ilvl="0">
+      <w:start w:val="3"/>
+      <w:numFmt w:val="decimal"/>
+      <w:lvlText w:val="%1"/>
+      <w:lvlJc w:val="left"/>
+      <w:pPr>
+        <w:ind w:left="600" w:hanging="600"/>
+      </w:pPr>
+      <w:rPr>
+        <w:rFonts w:hint="default"/>
+      </w:rPr>
+    </w:lvl>
+    <w:lvl w:ilvl="1">
+      <w:start w:val="1"/>
+      <w:numFmt w:val="decimal"/>
+      <w:lvlText w:val="%1.%2"/>
+      <w:lvlJc w:val="left"/>
+      <w:pPr>
+        <w:ind w:left="600" w:hanging="600"/>
+      </w:pPr>
+      <w:rPr>
+        <w:rFonts w:hint="default"/>
+      </w:rPr>
+    </w:lvl>
+    <w:lvl w:ilvl="2">
+      <w:start w:val="1"/>
+      <w:numFmt w:val="decimal"/>
+      <w:lvlText w:val="%1.%2.%3"/>
+      <w:lvlJc w:val="left"/>
+      <w:pPr>
+        <w:ind w:left="720" w:hanging="720"/>
+      </w:pPr>
+      <w:rPr>
+        <w:rFonts w:hint="default"/>
+      </w:rPr>
+    </w:lvl>
+    <w:lvl w:ilvl="3">
+      <w:start w:val="1"/>
+      <w:numFmt w:val="decimal"/>
+      <w:lvlText w:val="%1.%2.%3.%4"/>
+      <w:lvlJc w:val="left"/>
+      <w:pPr>
+        <w:ind w:left="720" w:hanging="720"/>
+      </w:pPr>
+      <w:rPr>
+        <w:rFonts w:hint="default"/>
+      </w:rPr>
+    </w:lvl>
+    <w:lvl w:ilvl="4">
+      <w:start w:val="1"/>
+      <w:numFmt w:val="decimal"/>
+      <w:lvlText w:val="%1.%2.%3.%4.%5"/>
+      <w:lvlJc w:val="left"/>
+      <w:pPr>
+        <w:ind w:left="1080" w:hanging="1080"/>
+      </w:pPr>
+      <w:rPr>
+        <w:rFonts w:hint="default"/>
+      </w:rPr>
+    </w:lvl>
+    <w:lvl w:ilvl="5">
+      <w:start w:val="1"/>
+      <w:numFmt w:val="decimal"/>
+      <w:lvlText w:val="%1.%2.%3.%4.%5.%6"/>
+      <w:lvlJc w:val="left"/>
+      <w:pPr>
+        <w:ind w:left="1440" w:hanging="1440"/>
+      </w:pPr>
+      <w:rPr>
+        <w:rFonts w:hint="default"/>
+      </w:rPr>
+    </w:lvl>
+    <w:lvl w:ilvl="6">
+      <w:start w:val="1"/>
+      <w:numFmt w:val="decimal"/>
+      <w:lvlText w:val="%1.%2.%3.%4.%5.%6.%7"/>
+      <w:lvlJc w:val="left"/>
+      <w:pPr>
+        <w:ind w:left="1440" w:hanging="1440"/>
+      </w:pPr>
+      <w:rPr>
+        <w:rFonts w:hint="default"/>
+      </w:rPr>
+    </w:lvl>
+    <w:lvl w:ilvl="7">
+      <w:start w:val="1"/>
+      <w:numFmt w:val="decimal"/>
+      <w:lvlText w:val="%1.%2.%3.%4.%5.%6.%7.%8"/>
+      <w:lvlJc w:val="left"/>
+      <w:pPr>
+        <w:ind w:left="1800" w:hanging="1800"/>
+      </w:pPr>
+      <w:rPr>
+        <w:rFonts w:hint="default"/>
+      </w:rPr>
+    </w:lvl>
+    <w:lvl w:ilvl="8">
+      <w:start w:val="1"/>
+      <w:numFmt w:val="decimal"/>
+      <w:lvlText w:val="%1.%2.%3.%4.%5.%6.%7.%8.%9"/>
+      <w:lvlJc w:val="left"/>
+      <w:pPr>
+        <w:ind w:left="1800" w:hanging="1800"/>
+      </w:pPr>
+      <w:rPr>
+        <w:rFonts w:hint="default"/>
+      </w:rPr>
+    </w:lvl>
+  </w:abstractNum>
+  <w:abstractNum w:abstractNumId="5" w15:restartNumberingAfterBreak="0">
     <w:nsid w:val="109017F3"/>
     <w:multiLevelType w:val="multilevel"/>
     <w:tmpl w:val="0DAE3936"/>
@@ -11729,7 +13550,7 @@
       </w:rPr>
     </w:lvl>
   </w:abstractNum>
-  <w:abstractNum w:abstractNumId="5" w15:restartNumberingAfterBreak="0">
+  <w:abstractNum w:abstractNumId="6" w15:restartNumberingAfterBreak="0">
     <w:nsid w:val="15B91047"/>
     <w:multiLevelType w:val="multilevel"/>
     <w:tmpl w:val="35E4E3CE"/>
@@ -11878,7 +13699,7 @@
       </w:rPr>
     </w:lvl>
   </w:abstractNum>
-  <w:abstractNum w:abstractNumId="6" w15:restartNumberingAfterBreak="0">
+  <w:abstractNum w:abstractNumId="7" w15:restartNumberingAfterBreak="0">
     <w:nsid w:val="16EC1016"/>
     <w:multiLevelType w:val="multilevel"/>
     <w:tmpl w:val="AE6CE97E"/>
@@ -12027,7 +13848,7 @@
       </w:rPr>
     </w:lvl>
   </w:abstractNum>
-  <w:abstractNum w:abstractNumId="7" w15:restartNumberingAfterBreak="0">
+  <w:abstractNum w:abstractNumId="8" w15:restartNumberingAfterBreak="0">
     <w:nsid w:val="17734325"/>
     <w:multiLevelType w:val="hybridMultilevel"/>
     <w:tmpl w:val="1FD45FEA"/>
@@ -12116,7 +13937,7 @@
       </w:pPr>
     </w:lvl>
   </w:abstractNum>
-  <w:abstractNum w:abstractNumId="8" w15:restartNumberingAfterBreak="0">
+  <w:abstractNum w:abstractNumId="9" w15:restartNumberingAfterBreak="0">
     <w:nsid w:val="230E01F4"/>
     <w:multiLevelType w:val="multilevel"/>
     <w:tmpl w:val="1292C18C"/>
@@ -12265,7 +14086,7 @@
       </w:rPr>
     </w:lvl>
   </w:abstractNum>
-  <w:abstractNum w:abstractNumId="9" w15:restartNumberingAfterBreak="0">
+  <w:abstractNum w:abstractNumId="10" w15:restartNumberingAfterBreak="0">
     <w:nsid w:val="258A6B72"/>
     <w:multiLevelType w:val="hybridMultilevel"/>
     <w:tmpl w:val="93EEA88E"/>
@@ -12354,7 +14175,7 @@
       </w:pPr>
     </w:lvl>
   </w:abstractNum>
-  <w:abstractNum w:abstractNumId="10" w15:restartNumberingAfterBreak="0">
+  <w:abstractNum w:abstractNumId="11" w15:restartNumberingAfterBreak="0">
     <w:nsid w:val="284D3CE7"/>
     <w:multiLevelType w:val="hybridMultilevel"/>
     <w:tmpl w:val="616A90C8"/>
@@ -12446,7 +14267,7 @@
       </w:pPr>
     </w:lvl>
   </w:abstractNum>
-  <w:abstractNum w:abstractNumId="11" w15:restartNumberingAfterBreak="0">
+  <w:abstractNum w:abstractNumId="12" w15:restartNumberingAfterBreak="0">
     <w:nsid w:val="3B0A358A"/>
     <w:multiLevelType w:val="multilevel"/>
     <w:tmpl w:val="39B8C2D8"/>
@@ -12595,7 +14416,7 @@
       </w:rPr>
     </w:lvl>
   </w:abstractNum>
-  <w:abstractNum w:abstractNumId="12" w15:restartNumberingAfterBreak="0">
+  <w:abstractNum w:abstractNumId="13" w15:restartNumberingAfterBreak="0">
     <w:nsid w:val="40D8608A"/>
     <w:multiLevelType w:val="hybridMultilevel"/>
     <w:tmpl w:val="979CD868"/>
@@ -12684,7 +14505,120 @@
       </w:pPr>
     </w:lvl>
   </w:abstractNum>
-  <w:abstractNum w:abstractNumId="13" w15:restartNumberingAfterBreak="0">
+  <w:abstractNum w:abstractNumId="14" w15:restartNumberingAfterBreak="0">
+    <w:nsid w:val="41B9237C"/>
+    <w:multiLevelType w:val="hybridMultilevel"/>
+    <w:tmpl w:val="192E8286"/>
+    <w:lvl w:ilvl="0" w:tplc="506471DE">
+      <w:start w:val="1"/>
+      <w:numFmt w:val="bullet"/>
+      <w:lvlText w:val="-"/>
+      <w:lvlJc w:val="left"/>
+      <w:pPr>
+        <w:ind w:left="780" w:hanging="360"/>
+      </w:pPr>
+      <w:rPr>
+        <w:rFonts w:ascii="Times New Roman" w:eastAsiaTheme="minorHAnsi" w:hAnsi="Times New Roman" w:cs="Times New Roman" w:hint="default"/>
+      </w:rPr>
+    </w:lvl>
+    <w:lvl w:ilvl="1" w:tplc="04090003" w:tentative="1">
+      <w:start w:val="1"/>
+      <w:numFmt w:val="bullet"/>
+      <w:lvlText w:val="o"/>
+      <w:lvlJc w:val="left"/>
+      <w:pPr>
+        <w:ind w:left="1500" w:hanging="360"/>
+      </w:pPr>
+      <w:rPr>
+        <w:rFonts w:ascii="Courier New" w:hAnsi="Courier New" w:cs="Courier New" w:hint="default"/>
+      </w:rPr>
+    </w:lvl>
+    <w:lvl w:ilvl="2" w:tplc="04090005" w:tentative="1">
+      <w:start w:val="1"/>
+      <w:numFmt w:val="bullet"/>
+      <w:lvlText w:val=""/>
+      <w:lvlJc w:val="left"/>
+      <w:pPr>
+        <w:ind w:left="2220" w:hanging="360"/>
+      </w:pPr>
+      <w:rPr>
+        <w:rFonts w:ascii="Wingdings" w:hAnsi="Wingdings" w:hint="default"/>
+      </w:rPr>
+    </w:lvl>
+    <w:lvl w:ilvl="3" w:tplc="04090001" w:tentative="1">
+      <w:start w:val="1"/>
+      <w:numFmt w:val="bullet"/>
+      <w:lvlText w:val=""/>
+      <w:lvlJc w:val="left"/>
+      <w:pPr>
+        <w:ind w:left="2940" w:hanging="360"/>
+      </w:pPr>
+      <w:rPr>
+        <w:rFonts w:ascii="Symbol" w:hAnsi="Symbol" w:hint="default"/>
+      </w:rPr>
+    </w:lvl>
+    <w:lvl w:ilvl="4" w:tplc="04090003" w:tentative="1">
+      <w:start w:val="1"/>
+      <w:numFmt w:val="bullet"/>
+      <w:lvlText w:val="o"/>
+      <w:lvlJc w:val="left"/>
+      <w:pPr>
+        <w:ind w:left="3660" w:hanging="360"/>
+      </w:pPr>
+      <w:rPr>
+        <w:rFonts w:ascii="Courier New" w:hAnsi="Courier New" w:cs="Courier New" w:hint="default"/>
+      </w:rPr>
+    </w:lvl>
+    <w:lvl w:ilvl="5" w:tplc="04090005" w:tentative="1">
+      <w:start w:val="1"/>
+      <w:numFmt w:val="bullet"/>
+      <w:lvlText w:val=""/>
+      <w:lvlJc w:val="left"/>
+      <w:pPr>
+        <w:ind w:left="4380" w:hanging="360"/>
+      </w:pPr>
+      <w:rPr>
+        <w:rFonts w:ascii="Wingdings" w:hAnsi="Wingdings" w:hint="default"/>
+      </w:rPr>
+    </w:lvl>
+    <w:lvl w:ilvl="6" w:tplc="04090001" w:tentative="1">
+      <w:start w:val="1"/>
+      <w:numFmt w:val="bullet"/>
+      <w:lvlText w:val=""/>
+      <w:lvlJc w:val="left"/>
+      <w:pPr>
+        <w:ind w:left="5100" w:hanging="360"/>
+      </w:pPr>
+      <w:rPr>
+        <w:rFonts w:ascii="Symbol" w:hAnsi="Symbol" w:hint="default"/>
+      </w:rPr>
+    </w:lvl>
+    <w:lvl w:ilvl="7" w:tplc="04090003" w:tentative="1">
+      <w:start w:val="1"/>
+      <w:numFmt w:val="bullet"/>
+      <w:lvlText w:val="o"/>
+      <w:lvlJc w:val="left"/>
+      <w:pPr>
+        <w:ind w:left="5820" w:hanging="360"/>
+      </w:pPr>
+      <w:rPr>
+        <w:rFonts w:ascii="Courier New" w:hAnsi="Courier New" w:cs="Courier New" w:hint="default"/>
+      </w:rPr>
+    </w:lvl>
+    <w:lvl w:ilvl="8" w:tplc="04090005" w:tentative="1">
+      <w:start w:val="1"/>
+      <w:numFmt w:val="bullet"/>
+      <w:lvlText w:val=""/>
+      <w:lvlJc w:val="left"/>
+      <w:pPr>
+        <w:ind w:left="6540" w:hanging="360"/>
+      </w:pPr>
+      <w:rPr>
+        <w:rFonts w:ascii="Wingdings" w:hAnsi="Wingdings" w:hint="default"/>
+      </w:rPr>
+    </w:lvl>
+  </w:abstractNum>
+  <w:abstractNum w:abstractNumId="15" w15:restartNumberingAfterBreak="0">
     <w:nsid w:val="46A44212"/>
     <w:multiLevelType w:val="hybridMultilevel"/>
     <w:tmpl w:val="B42A62EC"/>
@@ -12796,7 +14730,7 @@
       </w:rPr>
     </w:lvl>
   </w:abstractNum>
-  <w:abstractNum w:abstractNumId="14" w15:restartNumberingAfterBreak="0">
+  <w:abstractNum w:abstractNumId="16" w15:restartNumberingAfterBreak="0">
     <w:nsid w:val="46EB5F37"/>
     <w:multiLevelType w:val="hybridMultilevel"/>
     <w:tmpl w:val="FC529674"/>
@@ -12882,7 +14816,7 @@
       </w:pPr>
     </w:lvl>
   </w:abstractNum>
-  <w:abstractNum w:abstractNumId="15" w15:restartNumberingAfterBreak="0">
+  <w:abstractNum w:abstractNumId="17" w15:restartNumberingAfterBreak="0">
     <w:nsid w:val="49481468"/>
     <w:multiLevelType w:val="multilevel"/>
     <w:tmpl w:val="161484C8"/>
@@ -13031,7 +14965,7 @@
       </w:rPr>
     </w:lvl>
   </w:abstractNum>
-  <w:abstractNum w:abstractNumId="16" w15:restartNumberingAfterBreak="0">
+  <w:abstractNum w:abstractNumId="18" w15:restartNumberingAfterBreak="0">
     <w:nsid w:val="495041CA"/>
     <w:multiLevelType w:val="hybridMultilevel"/>
     <w:tmpl w:val="692C1A52"/>
@@ -13144,7 +15078,7 @@
       </w:rPr>
     </w:lvl>
   </w:abstractNum>
-  <w:abstractNum w:abstractNumId="17" w15:restartNumberingAfterBreak="0">
+  <w:abstractNum w:abstractNumId="19" w15:restartNumberingAfterBreak="0">
     <w:nsid w:val="4B775142"/>
     <w:multiLevelType w:val="hybridMultilevel"/>
     <w:tmpl w:val="86AE5CE4"/>
@@ -13257,7 +15191,7 @@
       </w:rPr>
     </w:lvl>
   </w:abstractNum>
-  <w:abstractNum w:abstractNumId="18" w15:restartNumberingAfterBreak="0">
+  <w:abstractNum w:abstractNumId="20" w15:restartNumberingAfterBreak="0">
     <w:nsid w:val="4D7C63B1"/>
     <w:multiLevelType w:val="multilevel"/>
     <w:tmpl w:val="B1964CE6"/>
@@ -13406,7 +15340,7 @@
       </w:rPr>
     </w:lvl>
   </w:abstractNum>
-  <w:abstractNum w:abstractNumId="19" w15:restartNumberingAfterBreak="0">
+  <w:abstractNum w:abstractNumId="21" w15:restartNumberingAfterBreak="0">
     <w:nsid w:val="4DCF32C6"/>
     <w:multiLevelType w:val="multilevel"/>
     <w:tmpl w:val="4BEE554E"/>
@@ -13555,7 +15489,7 @@
       </w:rPr>
     </w:lvl>
   </w:abstractNum>
-  <w:abstractNum w:abstractNumId="20" w15:restartNumberingAfterBreak="0">
+  <w:abstractNum w:abstractNumId="22" w15:restartNumberingAfterBreak="0">
     <w:nsid w:val="5B226599"/>
     <w:multiLevelType w:val="hybridMultilevel"/>
     <w:tmpl w:val="C89A6CD0"/>
@@ -13641,7 +15575,7 @@
       </w:pPr>
     </w:lvl>
   </w:abstractNum>
-  <w:abstractNum w:abstractNumId="21" w15:restartNumberingAfterBreak="0">
+  <w:abstractNum w:abstractNumId="23" w15:restartNumberingAfterBreak="0">
     <w:nsid w:val="5ED84B0F"/>
     <w:multiLevelType w:val="hybridMultilevel"/>
     <w:tmpl w:val="74FECAAE"/>
@@ -13754,7 +15688,7 @@
       </w:rPr>
     </w:lvl>
   </w:abstractNum>
-  <w:abstractNum w:abstractNumId="22" w15:restartNumberingAfterBreak="0">
+  <w:abstractNum w:abstractNumId="24" w15:restartNumberingAfterBreak="0">
     <w:nsid w:val="60893970"/>
     <w:multiLevelType w:val="hybridMultilevel"/>
     <w:tmpl w:val="90464F62"/>
@@ -13867,7 +15801,7 @@
       </w:rPr>
     </w:lvl>
   </w:abstractNum>
-  <w:abstractNum w:abstractNumId="23" w15:restartNumberingAfterBreak="0">
+  <w:abstractNum w:abstractNumId="25" w15:restartNumberingAfterBreak="0">
     <w:nsid w:val="60DA4BDD"/>
     <w:multiLevelType w:val="hybridMultilevel"/>
     <w:tmpl w:val="3E7C9FF8"/>
@@ -13980,7 +15914,7 @@
       </w:rPr>
     </w:lvl>
   </w:abstractNum>
-  <w:abstractNum w:abstractNumId="24" w15:restartNumberingAfterBreak="0">
+  <w:abstractNum w:abstractNumId="26" w15:restartNumberingAfterBreak="0">
     <w:nsid w:val="63B60C33"/>
     <w:multiLevelType w:val="hybridMultilevel"/>
     <w:tmpl w:val="635C44DE"/>
@@ -14093,7 +16027,7 @@
       </w:rPr>
     </w:lvl>
   </w:abstractNum>
-  <w:abstractNum w:abstractNumId="25" w15:restartNumberingAfterBreak="0">
+  <w:abstractNum w:abstractNumId="27" w15:restartNumberingAfterBreak="0">
     <w:nsid w:val="66D2450A"/>
     <w:multiLevelType w:val="hybridMultilevel"/>
     <w:tmpl w:val="A278871C"/>
@@ -14206,7 +16140,7 @@
       </w:rPr>
     </w:lvl>
   </w:abstractNum>
-  <w:abstractNum w:abstractNumId="26" w15:restartNumberingAfterBreak="0">
+  <w:abstractNum w:abstractNumId="28" w15:restartNumberingAfterBreak="0">
     <w:nsid w:val="686F2D3F"/>
     <w:multiLevelType w:val="hybridMultilevel"/>
     <w:tmpl w:val="DFEA9C70"/>
@@ -14295,7 +16229,7 @@
       </w:pPr>
     </w:lvl>
   </w:abstractNum>
-  <w:abstractNum w:abstractNumId="27" w15:restartNumberingAfterBreak="0">
+  <w:abstractNum w:abstractNumId="29" w15:restartNumberingAfterBreak="0">
     <w:nsid w:val="6A0B05E3"/>
     <w:multiLevelType w:val="hybridMultilevel"/>
     <w:tmpl w:val="0EB0BBC2"/>
@@ -14408,7 +16342,7 @@
       </w:rPr>
     </w:lvl>
   </w:abstractNum>
-  <w:abstractNum w:abstractNumId="28" w15:restartNumberingAfterBreak="0">
+  <w:abstractNum w:abstractNumId="30" w15:restartNumberingAfterBreak="0">
     <w:nsid w:val="6B3C3847"/>
     <w:multiLevelType w:val="hybridMultilevel"/>
     <w:tmpl w:val="564E730E"/>
@@ -14521,7 +16455,7 @@
       </w:rPr>
     </w:lvl>
   </w:abstractNum>
-  <w:abstractNum w:abstractNumId="29" w15:restartNumberingAfterBreak="0">
+  <w:abstractNum w:abstractNumId="31" w15:restartNumberingAfterBreak="0">
     <w:nsid w:val="6C833018"/>
     <w:multiLevelType w:val="hybridMultilevel"/>
     <w:tmpl w:val="1FD45FEA"/>
@@ -14610,7 +16544,7 @@
       </w:pPr>
     </w:lvl>
   </w:abstractNum>
-  <w:abstractNum w:abstractNumId="30" w15:restartNumberingAfterBreak="0">
+  <w:abstractNum w:abstractNumId="32" w15:restartNumberingAfterBreak="0">
     <w:nsid w:val="71D30917"/>
     <w:multiLevelType w:val="hybridMultilevel"/>
     <w:tmpl w:val="D44CE134"/>
@@ -14723,7 +16657,7 @@
       </w:rPr>
     </w:lvl>
   </w:abstractNum>
-  <w:abstractNum w:abstractNumId="31" w15:restartNumberingAfterBreak="0">
+  <w:abstractNum w:abstractNumId="33" w15:restartNumberingAfterBreak="0">
     <w:nsid w:val="7577240C"/>
     <w:multiLevelType w:val="hybridMultilevel"/>
     <w:tmpl w:val="4B768118"/>
@@ -14836,7 +16770,7 @@
       </w:rPr>
     </w:lvl>
   </w:abstractNum>
-  <w:abstractNum w:abstractNumId="32" w15:restartNumberingAfterBreak="0">
+  <w:abstractNum w:abstractNumId="34" w15:restartNumberingAfterBreak="0">
     <w:nsid w:val="76932F7E"/>
     <w:multiLevelType w:val="hybridMultilevel"/>
     <w:tmpl w:val="BC2EA5F8"/>
@@ -14925,7 +16859,7 @@
       </w:pPr>
     </w:lvl>
   </w:abstractNum>
-  <w:abstractNum w:abstractNumId="33" w15:restartNumberingAfterBreak="0">
+  <w:abstractNum w:abstractNumId="35" w15:restartNumberingAfterBreak="0">
     <w:nsid w:val="77EF6E4A"/>
     <w:multiLevelType w:val="hybridMultilevel"/>
     <w:tmpl w:val="C6089EA6"/>
@@ -15038,7 +16972,7 @@
       </w:rPr>
     </w:lvl>
   </w:abstractNum>
-  <w:abstractNum w:abstractNumId="34" w15:restartNumberingAfterBreak="0">
+  <w:abstractNum w:abstractNumId="36" w15:restartNumberingAfterBreak="0">
     <w:nsid w:val="7E6B179C"/>
     <w:multiLevelType w:val="hybridMultilevel"/>
     <w:tmpl w:val="1D828BC2"/>
@@ -15152,79 +17086,79 @@
     </w:lvl>
   </w:abstractNum>
   <w:num w:numId="1" w16cid:durableId="1521703667">
+    <w:abstractNumId w:val="15"/>
+  </w:num>
+  <w:num w:numId="2" w16cid:durableId="1192451426">
+    <w:abstractNumId w:val="16"/>
+  </w:num>
+  <w:num w:numId="3" w16cid:durableId="1769034931">
+    <w:abstractNumId w:val="8"/>
+  </w:num>
+  <w:num w:numId="4" w16cid:durableId="959531810">
+    <w:abstractNumId w:val="31"/>
+  </w:num>
+  <w:num w:numId="5" w16cid:durableId="893854713">
     <w:abstractNumId w:val="13"/>
   </w:num>
-  <w:num w:numId="2" w16cid:durableId="1192451426">
-    <w:abstractNumId w:val="14"/>
+  <w:num w:numId="6" w16cid:durableId="985860105">
+    <w:abstractNumId w:val="28"/>
   </w:num>
-  <w:num w:numId="3" w16cid:durableId="1769034931">
+  <w:num w:numId="7" w16cid:durableId="504787989">
+    <w:abstractNumId w:val="33"/>
+  </w:num>
+  <w:num w:numId="8" w16cid:durableId="1805653140">
+    <w:abstractNumId w:val="36"/>
+  </w:num>
+  <w:num w:numId="9" w16cid:durableId="1366711880">
+    <w:abstractNumId w:val="23"/>
+  </w:num>
+  <w:num w:numId="10" w16cid:durableId="1389844745">
+    <w:abstractNumId w:val="30"/>
+  </w:num>
+  <w:num w:numId="11" w16cid:durableId="275254084">
+    <w:abstractNumId w:val="26"/>
+  </w:num>
+  <w:num w:numId="12" w16cid:durableId="423577270">
     <w:abstractNumId w:val="7"/>
   </w:num>
-  <w:num w:numId="4" w16cid:durableId="959531810">
-    <w:abstractNumId w:val="29"/>
+  <w:num w:numId="13" w16cid:durableId="1209799539">
+    <w:abstractNumId w:val="22"/>
   </w:num>
-  <w:num w:numId="5" w16cid:durableId="893854713">
+  <w:num w:numId="14" w16cid:durableId="1172064986">
+    <w:abstractNumId w:val="10"/>
+  </w:num>
+  <w:num w:numId="15" w16cid:durableId="458647446">
+    <w:abstractNumId w:val="11"/>
+  </w:num>
+  <w:num w:numId="16" w16cid:durableId="1661427877">
+    <w:abstractNumId w:val="24"/>
+  </w:num>
+  <w:num w:numId="17" w16cid:durableId="1556114144">
+    <w:abstractNumId w:val="27"/>
+  </w:num>
+  <w:num w:numId="18" w16cid:durableId="1816797135">
+    <w:abstractNumId w:val="19"/>
+  </w:num>
+  <w:num w:numId="19" w16cid:durableId="707801841">
+    <w:abstractNumId w:val="34"/>
+  </w:num>
+  <w:num w:numId="20" w16cid:durableId="816800813">
     <w:abstractNumId w:val="12"/>
   </w:num>
-  <w:num w:numId="6" w16cid:durableId="985860105">
-    <w:abstractNumId w:val="26"/>
-  </w:num>
-  <w:num w:numId="7" w16cid:durableId="504787989">
-    <w:abstractNumId w:val="31"/>
-  </w:num>
-  <w:num w:numId="8" w16cid:durableId="1805653140">
-    <w:abstractNumId w:val="34"/>
-  </w:num>
-  <w:num w:numId="9" w16cid:durableId="1366711880">
+  <w:num w:numId="21" w16cid:durableId="332143602">
     <w:abstractNumId w:val="21"/>
   </w:num>
-  <w:num w:numId="10" w16cid:durableId="1389844745">
-    <w:abstractNumId w:val="28"/>
-  </w:num>
-  <w:num w:numId="11" w16cid:durableId="275254084">
-    <w:abstractNumId w:val="24"/>
-  </w:num>
-  <w:num w:numId="12" w16cid:durableId="423577270">
-    <w:abstractNumId w:val="6"/>
-  </w:num>
-  <w:num w:numId="13" w16cid:durableId="1209799539">
-    <w:abstractNumId w:val="20"/>
-  </w:num>
-  <w:num w:numId="14" w16cid:durableId="1172064986">
-    <w:abstractNumId w:val="9"/>
-  </w:num>
-  <w:num w:numId="15" w16cid:durableId="458647446">
-    <w:abstractNumId w:val="10"/>
-  </w:num>
-  <w:num w:numId="16" w16cid:durableId="1661427877">
-    <w:abstractNumId w:val="22"/>
-  </w:num>
-  <w:num w:numId="17" w16cid:durableId="1556114144">
-    <w:abstractNumId w:val="25"/>
-  </w:num>
-  <w:num w:numId="18" w16cid:durableId="1816797135">
+  <w:num w:numId="22" w16cid:durableId="933788029">
     <w:abstractNumId w:val="17"/>
-  </w:num>
-  <w:num w:numId="19" w16cid:durableId="707801841">
-    <w:abstractNumId w:val="32"/>
-  </w:num>
-  <w:num w:numId="20" w16cid:durableId="816800813">
-    <w:abstractNumId w:val="11"/>
-  </w:num>
-  <w:num w:numId="21" w16cid:durableId="332143602">
-    <w:abstractNumId w:val="19"/>
-  </w:num>
-  <w:num w:numId="22" w16cid:durableId="933788029">
-    <w:abstractNumId w:val="15"/>
   </w:num>
   <w:num w:numId="23" w16cid:durableId="1132290454">
     <w:abstractNumId w:val="0"/>
   </w:num>
   <w:num w:numId="24" w16cid:durableId="450786322">
-    <w:abstractNumId w:val="4"/>
+    <w:abstractNumId w:val="5"/>
   </w:num>
   <w:num w:numId="25" w16cid:durableId="1896160003">
-    <w:abstractNumId w:val="5"/>
+    <w:abstractNumId w:val="6"/>
   </w:num>
   <w:num w:numId="26" w16cid:durableId="13925971">
     <w:abstractNumId w:val="1"/>
@@ -15233,28 +17167,34 @@
     <w:abstractNumId w:val="3"/>
   </w:num>
   <w:num w:numId="28" w16cid:durableId="1318454072">
-    <w:abstractNumId w:val="8"/>
+    <w:abstractNumId w:val="9"/>
   </w:num>
   <w:num w:numId="29" w16cid:durableId="1235049470">
+    <w:abstractNumId w:val="20"/>
+  </w:num>
+  <w:num w:numId="30" w16cid:durableId="1039862789">
     <w:abstractNumId w:val="18"/>
   </w:num>
-  <w:num w:numId="30" w16cid:durableId="1039862789">
-    <w:abstractNumId w:val="16"/>
-  </w:num>
   <w:num w:numId="31" w16cid:durableId="1567834612">
-    <w:abstractNumId w:val="23"/>
+    <w:abstractNumId w:val="25"/>
   </w:num>
   <w:num w:numId="32" w16cid:durableId="1456562084">
-    <w:abstractNumId w:val="30"/>
+    <w:abstractNumId w:val="32"/>
   </w:num>
   <w:num w:numId="33" w16cid:durableId="393355011">
-    <w:abstractNumId w:val="33"/>
+    <w:abstractNumId w:val="35"/>
   </w:num>
   <w:num w:numId="34" w16cid:durableId="1397044333">
     <w:abstractNumId w:val="2"/>
   </w:num>
   <w:num w:numId="35" w16cid:durableId="1886017260">
-    <w:abstractNumId w:val="27"/>
+    <w:abstractNumId w:val="29"/>
+  </w:num>
+  <w:num w:numId="36" w16cid:durableId="909778036">
+    <w:abstractNumId w:val="14"/>
+  </w:num>
+  <w:num w:numId="37" w16cid:durableId="2019961552">
+    <w:abstractNumId w:val="4"/>
   </w:num>
 </w:numbering>
 </file>

</xml_diff>

<commit_message>
update Mô hình hóa quy trình kiểm tra, thẩm định, xử lý hồ sơ.
</commit_message>
<xml_diff>
--- a/He_thong_thong_tin_giai_quyet_hanh_chinh/NGUYEN TRUONG PHI_25410281/25410281_NguyenTruongPhi.docx
+++ b/He_thong_thong_tin_giai_quyet_hanh_chinh/NGUYEN TRUONG PHI_25410281/25410281_NguyenTruongPhi.docx
@@ -1,6 +1,6 @@
 
 <file path=word/document.xml><?xml version="1.0" encoding="utf-8"?>
-<w:document xmlns:wpc="http://schemas.microsoft.com/office/word/2010/wordprocessingCanvas" xmlns:cx="http://schemas.microsoft.com/office/drawing/2014/chartex" xmlns:cx1="http://schemas.microsoft.com/office/drawing/2015/9/8/chartex" xmlns:cx2="http://schemas.microsoft.com/office/drawing/2015/10/21/chartex" xmlns:cx3="http://schemas.microsoft.com/office/drawing/2016/5/9/chartex" xmlns:cx4="http://schemas.microsoft.com/office/drawing/2016/5/10/chartex" xmlns:cx5="http://schemas.microsoft.com/office/drawing/2016/5/11/chartex" xmlns:cx6="http://schemas.microsoft.com/office/drawing/2016/5/12/chartex" xmlns:cx7="http://schemas.microsoft.com/office/drawing/2016/5/13/chartex" xmlns:cx8="http://schemas.microsoft.com/office/drawing/2016/5/14/chartex" xmlns:mc="http://schemas.openxmlformats.org/markup-compatibility/2006" xmlns:aink="http://schemas.microsoft.com/office/drawing/2016/ink" xmlns:am3d="http://schemas.microsoft.com/office/drawing/2017/model3d" xmlns:o="urn:schemas-microsoft-com:office:office" xmlns:oel="http://schemas.microsoft.com/office/2019/extlst" xmlns:r="http://schemas.openxmlformats.org/officeDocument/2006/relationships" xmlns:m="http://schemas.openxmlformats.org/officeDocument/2006/math" xmlns:v="urn:schemas-microsoft-com:vml" xmlns:wp14="http://schemas.microsoft.com/office/word/2010/wordprocessingDrawing" xmlns:wp="http://schemas.openxmlformats.org/drawingml/2006/wordprocessingDrawing" xmlns:w10="urn:schemas-microsoft-com:office:word" xmlns:w="http://schemas.openxmlformats.org/wordprocessingml/2006/main" xmlns:w14="http://schemas.microsoft.com/office/word/2010/wordml" xmlns:w15="http://schemas.microsoft.com/office/word/2012/wordml" xmlns:w16cei="http://schemas.microsoft.com/office/word/2026/wordml/cei" xmlns:w16cex="http://schemas.microsoft.com/office/word/2018/wordml/cex" xmlns:w16cid="http://schemas.microsoft.com/office/word/2016/wordml/cid" xmlns:w16="http://schemas.microsoft.com/office/word/2018/wordml" xmlns:w16du="http://schemas.microsoft.com/office/word/2023/wordml/word16du" xmlns:w16sdtdh="http://schemas.microsoft.com/office/word/2020/wordml/sdtdatahash" xmlns:w16sdtfl="http://schemas.microsoft.com/office/word/2024/wordml/sdtformatlock" xmlns:w16se="http://schemas.microsoft.com/office/word/2015/wordml/symex" xmlns:wpg="http://schemas.microsoft.com/office/word/2010/wordprocessingGroup" xmlns:wpi="http://schemas.microsoft.com/office/word/2010/wordprocessingInk" xmlns:wne="http://schemas.microsoft.com/office/word/2006/wordml" xmlns:wps="http://schemas.microsoft.com/office/word/2010/wordprocessingShape" mc:Ignorable="w14 w15 w16se w16cid w16 w16cex w16sdtdh w16sdtfl w16du wp14">
+<w:document xmlns:wpc="http://schemas.microsoft.com/office/word/2010/wordprocessingCanvas" xmlns:cx="http://schemas.microsoft.com/office/drawing/2014/chartex" xmlns:cx1="http://schemas.microsoft.com/office/drawing/2015/9/8/chartex" xmlns:cx2="http://schemas.microsoft.com/office/drawing/2015/10/21/chartex" xmlns:cx3="http://schemas.microsoft.com/office/drawing/2016/5/9/chartex" xmlns:cx4="http://schemas.microsoft.com/office/drawing/2016/5/10/chartex" xmlns:cx5="http://schemas.microsoft.com/office/drawing/2016/5/11/chartex" xmlns:cx6="http://schemas.microsoft.com/office/drawing/2016/5/12/chartex" xmlns:cx7="http://schemas.microsoft.com/office/drawing/2016/5/13/chartex" xmlns:cx8="http://schemas.microsoft.com/office/drawing/2016/5/14/chartex" xmlns:mc="http://schemas.openxmlformats.org/markup-compatibility/2006" xmlns:aink="http://schemas.microsoft.com/office/drawing/2016/ink" xmlns:am3d="http://schemas.microsoft.com/office/drawing/2017/model3d" xmlns:o="urn:schemas-microsoft-com:office:office" xmlns:oel="http://schemas.microsoft.com/office/2019/extlst" xmlns:r="http://schemas.openxmlformats.org/officeDocument/2006/relationships" xmlns:m="http://schemas.openxmlformats.org/officeDocument/2006/math" xmlns:v="urn:schemas-microsoft-com:vml" xmlns:wp14="http://schemas.microsoft.com/office/word/2010/wordprocessingDrawing" xmlns:wp="http://schemas.openxmlformats.org/drawingml/2006/wordprocessingDrawing" xmlns:w10="urn:schemas-microsoft-com:office:word" xmlns:w="http://schemas.openxmlformats.org/wordprocessingml/2006/main" xmlns:w14="http://schemas.microsoft.com/office/word/2010/wordml" xmlns:w15="http://schemas.microsoft.com/office/word/2012/wordml" xmlns:w16cex="http://schemas.microsoft.com/office/word/2018/wordml/cex" xmlns:w16cid="http://schemas.microsoft.com/office/word/2016/wordml/cid" xmlns:w16="http://schemas.microsoft.com/office/word/2018/wordml" xmlns:w16du="http://schemas.microsoft.com/office/word/2023/wordml/word16du" xmlns:w16sdtdh="http://schemas.microsoft.com/office/word/2020/wordml/sdtdatahash" xmlns:w16sdtfl="http://schemas.microsoft.com/office/word/2024/wordml/sdtformatlock" xmlns:w16se="http://schemas.microsoft.com/office/word/2015/wordml/symex" xmlns:wpg="http://schemas.microsoft.com/office/word/2010/wordprocessingGroup" xmlns:wpi="http://schemas.microsoft.com/office/word/2010/wordprocessingInk" xmlns:wne="http://schemas.microsoft.com/office/word/2006/wordml" xmlns:wps="http://schemas.microsoft.com/office/word/2010/wordprocessingShape" mc:Ignorable="w14 w15 w16se w16cid w16 w16cex w16sdtdh w16sdtfl w16du wp14">
   <w:body>
     <w:p>
       <w:pPr>
@@ -79,7 +79,7 @@
           <w:szCs w:val="26"/>
         </w:rPr>
         <w:drawing>
-          <wp:inline distT="0" distB="0" distL="0" distR="0" wp14:anchorId="61AA30EF" wp14:editId="30271F88">
+          <wp:inline distT="0" distB="0" distL="0" distR="0" wp14:anchorId="61AA30EF" wp14:editId="03CC91B4">
             <wp:extent cx="1948539" cy="1606164"/>
             <wp:effectExtent l="0" t="0" r="0" b="0"/>
             <wp:docPr id="990850389" name="Picture 1"/>
@@ -3648,7 +3648,7 @@
               </wp:anchor>
             </w:drawing>
           </mc:Choice>
-          <mc:Fallback>
+          <mc:Fallback xmlns:w16cei="http://schemas.microsoft.com/office/word/2026/wordml/cei">
             <w:pict>
               <v:shapetype w14:anchorId="178D7F47" id="_x0000_t5" coordsize="21600,21600" o:spt="5" adj="10800" path="m@0,l,21600r21600,xe">
                 <v:stroke joinstyle="miter"/>
@@ -7221,7 +7221,7 @@
           <w:rPr>
             <w:noProof/>
           </w:rPr>
-          <w:t>4</w:t>
+          <w:t>3</w:t>
         </w:r>
       </w:fldSimple>
       <w:r>
@@ -7530,7 +7530,7 @@
           <w:rPr>
             <w:noProof/>
           </w:rPr>
-          <w:t>5</w:t>
+          <w:t>4</w:t>
         </w:r>
       </w:fldSimple>
       <w:r>
@@ -9740,7 +9740,7 @@
           <w:rPr>
             <w:noProof/>
           </w:rPr>
-          <w:t>6</w:t>
+          <w:t>5</w:t>
         </w:r>
       </w:fldSimple>
       <w:r>
@@ -10450,9 +10450,90 @@
         <w:pStyle w:val="Heading4"/>
       </w:pPr>
       <w:r>
+        <w:lastRenderedPageBreak/>
         <w:t>2.3.2 Mô hình hóa quy trình kiểm tra, thẩm định và xử lý hồ sơ</w:t>
       </w:r>
     </w:p>
+    <w:p>
+      <w:pPr>
+        <w:keepNext/>
+      </w:pPr>
+      <w:r>
+        <w:rPr>
+          <w:noProof/>
+          <w:color w:val="000000"/>
+          <w:szCs w:val="26"/>
+        </w:rPr>
+        <w:drawing>
+          <wp:inline distT="0" distB="0" distL="0" distR="0" wp14:anchorId="23CBA3B2" wp14:editId="497E0D2F">
+            <wp:extent cx="5731510" cy="4074795"/>
+            <wp:effectExtent l="0" t="0" r="2540" b="1905"/>
+            <wp:docPr id="165068456" name="Picture 20"/>
+            <wp:cNvGraphicFramePr>
+              <a:graphicFrameLocks xmlns:a="http://schemas.openxmlformats.org/drawingml/2006/main" noChangeAspect="1"/>
+            </wp:cNvGraphicFramePr>
+            <a:graphic xmlns:a="http://schemas.openxmlformats.org/drawingml/2006/main">
+              <a:graphicData uri="http://schemas.openxmlformats.org/drawingml/2006/picture">
+                <pic:pic xmlns:pic="http://schemas.openxmlformats.org/drawingml/2006/picture">
+                  <pic:nvPicPr>
+                    <pic:cNvPr id="0" name="Picture 1"/>
+                    <pic:cNvPicPr>
+                      <a:picLocks noChangeAspect="1" noChangeArrowheads="1"/>
+                    </pic:cNvPicPr>
+                  </pic:nvPicPr>
+                  <pic:blipFill>
+                    <a:blip r:embed="rId15" cstate="print">
+                      <a:extLst>
+                        <a:ext uri="{28A0092B-C50C-407E-A947-70E740481C1C}">
+                          <a14:useLocalDpi xmlns:a14="http://schemas.microsoft.com/office/drawing/2010/main" val="0"/>
+                        </a:ext>
+                      </a:extLst>
+                    </a:blip>
+                    <a:srcRect/>
+                    <a:stretch>
+                      <a:fillRect/>
+                    </a:stretch>
+                  </pic:blipFill>
+                  <pic:spPr bwMode="auto">
+                    <a:xfrm>
+                      <a:off x="0" y="0"/>
+                      <a:ext cx="5731510" cy="4074795"/>
+                    </a:xfrm>
+                    <a:prstGeom prst="rect">
+                      <a:avLst/>
+                    </a:prstGeom>
+                    <a:noFill/>
+                    <a:ln>
+                      <a:noFill/>
+                    </a:ln>
+                  </pic:spPr>
+                </pic:pic>
+              </a:graphicData>
+            </a:graphic>
+          </wp:inline>
+        </w:drawing>
+      </w:r>
+    </w:p>
+    <w:p>
+      <w:pPr>
+        <w:pStyle w:val="Caption"/>
+      </w:pPr>
+      <w:r>
+        <w:t xml:space="preserve">Hình </w:t>
+      </w:r>
+      <w:fldSimple w:instr=" SEQ Hình \* ARABIC ">
+        <w:r>
+          <w:rPr>
+            <w:noProof/>
+          </w:rPr>
+          <w:t>6</w:t>
+        </w:r>
+      </w:fldSimple>
+      <w:r>
+        <w:t>. Mô hình hóa quy trình kiểm tra, thẩm định, xử lý hồ sơ.</w:t>
+      </w:r>
+    </w:p>
+    <w:p/>
     <w:p>
       <w:pPr>
         <w:pStyle w:val="Heading3"/>
@@ -10525,7 +10606,86 @@
         <w:pStyle w:val="Heading3"/>
       </w:pPr>
       <w:r>
-        <w:t>3.1.1.1 Phân tích giá trị gia tăng</w:t>
+        <w:t xml:space="preserve">3.1.1.1 Phân tích giá trị gia tăng </w:t>
+      </w:r>
+    </w:p>
+    <w:p>
+      <w:pPr>
+        <w:keepNext/>
+      </w:pPr>
+      <w:r>
+        <w:rPr>
+          <w:noProof/>
+          <w:color w:val="000000"/>
+          <w:szCs w:val="26"/>
+        </w:rPr>
+        <w:drawing>
+          <wp:inline distT="0" distB="0" distL="0" distR="0" wp14:anchorId="41A495D2" wp14:editId="692848CF">
+            <wp:extent cx="5725795" cy="2461260"/>
+            <wp:effectExtent l="0" t="0" r="8255" b="0"/>
+            <wp:docPr id="1702479062" name="Picture 21"/>
+            <wp:cNvGraphicFramePr>
+              <a:graphicFrameLocks xmlns:a="http://schemas.openxmlformats.org/drawingml/2006/main" noChangeAspect="1"/>
+            </wp:cNvGraphicFramePr>
+            <a:graphic xmlns:a="http://schemas.openxmlformats.org/drawingml/2006/main">
+              <a:graphicData uri="http://schemas.openxmlformats.org/drawingml/2006/picture">
+                <pic:pic xmlns:pic="http://schemas.openxmlformats.org/drawingml/2006/picture">
+                  <pic:nvPicPr>
+                    <pic:cNvPr id="0" name="Picture 6"/>
+                    <pic:cNvPicPr>
+                      <a:picLocks noChangeAspect="1" noChangeArrowheads="1"/>
+                    </pic:cNvPicPr>
+                  </pic:nvPicPr>
+                  <pic:blipFill>
+                    <a:blip r:embed="rId16" cstate="print">
+                      <a:extLst>
+                        <a:ext uri="{28A0092B-C50C-407E-A947-70E740481C1C}">
+                          <a14:useLocalDpi xmlns:a14="http://schemas.microsoft.com/office/drawing/2010/main" val="0"/>
+                        </a:ext>
+                      </a:extLst>
+                    </a:blip>
+                    <a:srcRect/>
+                    <a:stretch>
+                      <a:fillRect/>
+                    </a:stretch>
+                  </pic:blipFill>
+                  <pic:spPr bwMode="auto">
+                    <a:xfrm>
+                      <a:off x="0" y="0"/>
+                      <a:ext cx="5725795" cy="2461260"/>
+                    </a:xfrm>
+                    <a:prstGeom prst="rect">
+                      <a:avLst/>
+                    </a:prstGeom>
+                    <a:noFill/>
+                    <a:ln>
+                      <a:noFill/>
+                    </a:ln>
+                  </pic:spPr>
+                </pic:pic>
+              </a:graphicData>
+            </a:graphic>
+          </wp:inline>
+        </w:drawing>
+      </w:r>
+    </w:p>
+    <w:p>
+      <w:pPr>
+        <w:pStyle w:val="Caption"/>
+      </w:pPr>
+      <w:r>
+        <w:t xml:space="preserve">Hình </w:t>
+      </w:r>
+      <w:fldSimple w:instr=" SEQ Hình \* ARABIC ">
+        <w:r>
+          <w:rPr>
+            <w:noProof/>
+          </w:rPr>
+          <w:t>7</w:t>
+        </w:r>
+      </w:fldSimple>
+      <w:r>
+        <w:t>. Phân tích giá trị gia tăng trên quy trình tiếp nhận</w:t>
       </w:r>
     </w:p>
     <w:p>
@@ -10882,6 +11042,7 @@
           </w:tcPr>
           <w:p>
             <w:r>
+              <w:lastRenderedPageBreak/>
               <w:t>4</w:t>
             </w:r>
           </w:p>
@@ -11095,7 +11256,6 @@
           </w:tcPr>
           <w:p>
             <w:r>
-              <w:lastRenderedPageBreak/>
               <w:t>7</w:t>
             </w:r>
           </w:p>
@@ -11522,6 +11682,7 @@
           </w:tcPr>
           <w:p>
             <w:r>
+              <w:lastRenderedPageBreak/>
               <w:t>13</w:t>
             </w:r>
           </w:p>
@@ -11779,27 +11940,18 @@
           </w:tcPr>
           <w:p>
             <w:r>
-              <w:t xml:space="preserve">Tốn thời gian, có thể </w:t>
-            </w:r>
-            <w:r>
-              <w:lastRenderedPageBreak/>
-              <w:t>sai tên/thiếu tệp</w:t>
-            </w:r>
-          </w:p>
-        </w:tc>
-        <w:tc>
-          <w:tcPr>
-            <w:tcW w:w="0" w:type="auto"/>
-            <w:hideMark/>
-          </w:tcPr>
-          <w:p>
-            <w:r>
-              <w:lastRenderedPageBreak/>
-              <w:t xml:space="preserve">Ưu tiên hồ sơ điện tử; scan tự động, nhận </w:t>
-            </w:r>
-            <w:r>
-              <w:lastRenderedPageBreak/>
-              <w:t>dạng và gắn tệp với đúng thành phần</w:t>
+              <w:t>Tốn thời gian, có thể sai tên/thiếu tệp</w:t>
+            </w:r>
+          </w:p>
+        </w:tc>
+        <w:tc>
+          <w:tcPr>
+            <w:tcW w:w="0" w:type="auto"/>
+            <w:hideMark/>
+          </w:tcPr>
+          <w:p>
+            <w:r>
+              <w:t>Ưu tiên hồ sơ điện tử; scan tự động, nhận dạng và gắn tệp với đúng thành phần</w:t>
             </w:r>
           </w:p>
         </w:tc>
@@ -11815,7 +11967,6 @@
           </w:tcPr>
           <w:p>
             <w:r>
-              <w:lastRenderedPageBreak/>
               <w:t>17</w:t>
             </w:r>
           </w:p>
@@ -12171,6 +12322,7 @@
           </w:tcPr>
           <w:p>
             <w:r>
+              <w:lastRenderedPageBreak/>
               <w:t>22</w:t>
             </w:r>
           </w:p>
@@ -12468,7 +12620,7 @@
           <w:numId w:val="6"/>
         </w:numPr>
       </w:pPr>
-      <w:hyperlink r:id="rId15" w:anchor="ID0EBBF=Getting_started" w:history="1">
+      <w:hyperlink r:id="rId17" w:anchor="ID0EBBF=Getting_started" w:history="1">
         <w:r>
           <w:rPr>
             <w:rStyle w:val="Hyperlink"/>
@@ -12540,8 +12692,8 @@
     <w:p/>
     <w:p/>
     <w:sectPr>
-      <w:headerReference w:type="default" r:id="rId16"/>
-      <w:footerReference w:type="default" r:id="rId17"/>
+      <w:headerReference w:type="default" r:id="rId18"/>
+      <w:footerReference w:type="default" r:id="rId19"/>
       <w:pgSz w:w="11906" w:h="16838" w:code="9"/>
       <w:pgMar w:top="1440" w:right="1440" w:bottom="1440" w:left="1440" w:header="720" w:footer="720" w:gutter="0"/>
       <w:pgBorders w:display="firstPage" w:offsetFrom="page">
@@ -12560,7 +12712,7 @@
 </file>
 
 <file path=word/endnotes.xml><?xml version="1.0" encoding="utf-8"?>
-<w:endnotes xmlns:wpc="http://schemas.microsoft.com/office/word/2010/wordprocessingCanvas" xmlns:cx="http://schemas.microsoft.com/office/drawing/2014/chartex" xmlns:cx1="http://schemas.microsoft.com/office/drawing/2015/9/8/chartex" xmlns:cx2="http://schemas.microsoft.com/office/drawing/2015/10/21/chartex" xmlns:cx3="http://schemas.microsoft.com/office/drawing/2016/5/9/chartex" xmlns:cx4="http://schemas.microsoft.com/office/drawing/2016/5/10/chartex" xmlns:cx5="http://schemas.microsoft.com/office/drawing/2016/5/11/chartex" xmlns:cx6="http://schemas.microsoft.com/office/drawing/2016/5/12/chartex" xmlns:cx7="http://schemas.microsoft.com/office/drawing/2016/5/13/chartex" xmlns:cx8="http://schemas.microsoft.com/office/drawing/2016/5/14/chartex" xmlns:mc="http://schemas.openxmlformats.org/markup-compatibility/2006" xmlns:aink="http://schemas.microsoft.com/office/drawing/2016/ink" xmlns:am3d="http://schemas.microsoft.com/office/drawing/2017/model3d" xmlns:o="urn:schemas-microsoft-com:office:office" xmlns:oel="http://schemas.microsoft.com/office/2019/extlst" xmlns:r="http://schemas.openxmlformats.org/officeDocument/2006/relationships" xmlns:m="http://schemas.openxmlformats.org/officeDocument/2006/math" xmlns:v="urn:schemas-microsoft-com:vml" xmlns:wp14="http://schemas.microsoft.com/office/word/2010/wordprocessingDrawing" xmlns:wp="http://schemas.openxmlformats.org/drawingml/2006/wordprocessingDrawing" xmlns:w10="urn:schemas-microsoft-com:office:word" xmlns:w="http://schemas.openxmlformats.org/wordprocessingml/2006/main" xmlns:w14="http://schemas.microsoft.com/office/word/2010/wordml" xmlns:w15="http://schemas.microsoft.com/office/word/2012/wordml" xmlns:w16cei="http://schemas.microsoft.com/office/word/2026/wordml/cei" xmlns:w16cex="http://schemas.microsoft.com/office/word/2018/wordml/cex" xmlns:w16cid="http://schemas.microsoft.com/office/word/2016/wordml/cid" xmlns:w16="http://schemas.microsoft.com/office/word/2018/wordml" xmlns:w16du="http://schemas.microsoft.com/office/word/2023/wordml/word16du" xmlns:w16sdtdh="http://schemas.microsoft.com/office/word/2020/wordml/sdtdatahash" xmlns:w16sdtfl="http://schemas.microsoft.com/office/word/2024/wordml/sdtformatlock" xmlns:w16se="http://schemas.microsoft.com/office/word/2015/wordml/symex" xmlns:wpg="http://schemas.microsoft.com/office/word/2010/wordprocessingGroup" xmlns:wpi="http://schemas.microsoft.com/office/word/2010/wordprocessingInk" xmlns:wne="http://schemas.microsoft.com/office/word/2006/wordml" xmlns:wps="http://schemas.microsoft.com/office/word/2010/wordprocessingShape" mc:Ignorable="w14 w15 w16se w16cid w16 w16cex w16sdtdh w16sdtfl w16du wp14">
+<w:endnotes xmlns:wpc="http://schemas.microsoft.com/office/word/2010/wordprocessingCanvas" xmlns:cx="http://schemas.microsoft.com/office/drawing/2014/chartex" xmlns:cx1="http://schemas.microsoft.com/office/drawing/2015/9/8/chartex" xmlns:cx2="http://schemas.microsoft.com/office/drawing/2015/10/21/chartex" xmlns:cx3="http://schemas.microsoft.com/office/drawing/2016/5/9/chartex" xmlns:cx4="http://schemas.microsoft.com/office/drawing/2016/5/10/chartex" xmlns:cx5="http://schemas.microsoft.com/office/drawing/2016/5/11/chartex" xmlns:cx6="http://schemas.microsoft.com/office/drawing/2016/5/12/chartex" xmlns:cx7="http://schemas.microsoft.com/office/drawing/2016/5/13/chartex" xmlns:cx8="http://schemas.microsoft.com/office/drawing/2016/5/14/chartex" xmlns:mc="http://schemas.openxmlformats.org/markup-compatibility/2006" xmlns:aink="http://schemas.microsoft.com/office/drawing/2016/ink" xmlns:am3d="http://schemas.microsoft.com/office/drawing/2017/model3d" xmlns:o="urn:schemas-microsoft-com:office:office" xmlns:oel="http://schemas.microsoft.com/office/2019/extlst" xmlns:r="http://schemas.openxmlformats.org/officeDocument/2006/relationships" xmlns:m="http://schemas.openxmlformats.org/officeDocument/2006/math" xmlns:v="urn:schemas-microsoft-com:vml" xmlns:wp14="http://schemas.microsoft.com/office/word/2010/wordprocessingDrawing" xmlns:wp="http://schemas.openxmlformats.org/drawingml/2006/wordprocessingDrawing" xmlns:w10="urn:schemas-microsoft-com:office:word" xmlns:w="http://schemas.openxmlformats.org/wordprocessingml/2006/main" xmlns:w14="http://schemas.microsoft.com/office/word/2010/wordml" xmlns:w15="http://schemas.microsoft.com/office/word/2012/wordml" xmlns:w16cex="http://schemas.microsoft.com/office/word/2018/wordml/cex" xmlns:w16cid="http://schemas.microsoft.com/office/word/2016/wordml/cid" xmlns:w16="http://schemas.microsoft.com/office/word/2018/wordml" xmlns:w16du="http://schemas.microsoft.com/office/word/2023/wordml/word16du" xmlns:w16sdtdh="http://schemas.microsoft.com/office/word/2020/wordml/sdtdatahash" xmlns:w16sdtfl="http://schemas.microsoft.com/office/word/2024/wordml/sdtformatlock" xmlns:w16se="http://schemas.microsoft.com/office/word/2015/wordml/symex" xmlns:wpg="http://schemas.microsoft.com/office/word/2010/wordprocessingGroup" xmlns:wpi="http://schemas.microsoft.com/office/word/2010/wordprocessingInk" xmlns:wne="http://schemas.microsoft.com/office/word/2006/wordml" xmlns:wps="http://schemas.microsoft.com/office/word/2010/wordprocessingShape" mc:Ignorable="w14 w15 w16se w16cid w16 w16cex w16sdtdh w16sdtfl w16du wp14">
   <w:endnote w:type="separator" w:id="-1">
     <w:p>
       <w:pPr>
@@ -12585,7 +12737,7 @@
 </file>
 
 <file path=word/footer1.xml><?xml version="1.0" encoding="utf-8"?>
-<w:ftr xmlns:wpc="http://schemas.microsoft.com/office/word/2010/wordprocessingCanvas" xmlns:cx="http://schemas.microsoft.com/office/drawing/2014/chartex" xmlns:cx1="http://schemas.microsoft.com/office/drawing/2015/9/8/chartex" xmlns:cx2="http://schemas.microsoft.com/office/drawing/2015/10/21/chartex" xmlns:cx3="http://schemas.microsoft.com/office/drawing/2016/5/9/chartex" xmlns:cx4="http://schemas.microsoft.com/office/drawing/2016/5/10/chartex" xmlns:cx5="http://schemas.microsoft.com/office/drawing/2016/5/11/chartex" xmlns:cx6="http://schemas.microsoft.com/office/drawing/2016/5/12/chartex" xmlns:cx7="http://schemas.microsoft.com/office/drawing/2016/5/13/chartex" xmlns:cx8="http://schemas.microsoft.com/office/drawing/2016/5/14/chartex" xmlns:mc="http://schemas.openxmlformats.org/markup-compatibility/2006" xmlns:aink="http://schemas.microsoft.com/office/drawing/2016/ink" xmlns:am3d="http://schemas.microsoft.com/office/drawing/2017/model3d" xmlns:o="urn:schemas-microsoft-com:office:office" xmlns:oel="http://schemas.microsoft.com/office/2019/extlst" xmlns:r="http://schemas.openxmlformats.org/officeDocument/2006/relationships" xmlns:m="http://schemas.openxmlformats.org/officeDocument/2006/math" xmlns:v="urn:schemas-microsoft-com:vml" xmlns:wp14="http://schemas.microsoft.com/office/word/2010/wordprocessingDrawing" xmlns:wp="http://schemas.openxmlformats.org/drawingml/2006/wordprocessingDrawing" xmlns:w10="urn:schemas-microsoft-com:office:word" xmlns:w="http://schemas.openxmlformats.org/wordprocessingml/2006/main" xmlns:w14="http://schemas.microsoft.com/office/word/2010/wordml" xmlns:w15="http://schemas.microsoft.com/office/word/2012/wordml" xmlns:w16cei="http://schemas.microsoft.com/office/word/2026/wordml/cei" xmlns:w16cex="http://schemas.microsoft.com/office/word/2018/wordml/cex" xmlns:w16cid="http://schemas.microsoft.com/office/word/2016/wordml/cid" xmlns:w16="http://schemas.microsoft.com/office/word/2018/wordml" xmlns:w16du="http://schemas.microsoft.com/office/word/2023/wordml/word16du" xmlns:w16sdtdh="http://schemas.microsoft.com/office/word/2020/wordml/sdtdatahash" xmlns:w16sdtfl="http://schemas.microsoft.com/office/word/2024/wordml/sdtformatlock" xmlns:w16se="http://schemas.microsoft.com/office/word/2015/wordml/symex" xmlns:wpg="http://schemas.microsoft.com/office/word/2010/wordprocessingGroup" xmlns:wpi="http://schemas.microsoft.com/office/word/2010/wordprocessingInk" xmlns:wne="http://schemas.microsoft.com/office/word/2006/wordml" xmlns:wps="http://schemas.microsoft.com/office/word/2010/wordprocessingShape" mc:Ignorable="w14 w15 w16se w16cid w16 w16cex w16sdtdh w16sdtfl w16du wp14">
+<w:ftr xmlns:wpc="http://schemas.microsoft.com/office/word/2010/wordprocessingCanvas" xmlns:cx="http://schemas.microsoft.com/office/drawing/2014/chartex" xmlns:cx1="http://schemas.microsoft.com/office/drawing/2015/9/8/chartex" xmlns:cx2="http://schemas.microsoft.com/office/drawing/2015/10/21/chartex" xmlns:cx3="http://schemas.microsoft.com/office/drawing/2016/5/9/chartex" xmlns:cx4="http://schemas.microsoft.com/office/drawing/2016/5/10/chartex" xmlns:cx5="http://schemas.microsoft.com/office/drawing/2016/5/11/chartex" xmlns:cx6="http://schemas.microsoft.com/office/drawing/2016/5/12/chartex" xmlns:cx7="http://schemas.microsoft.com/office/drawing/2016/5/13/chartex" xmlns:cx8="http://schemas.microsoft.com/office/drawing/2016/5/14/chartex" xmlns:mc="http://schemas.openxmlformats.org/markup-compatibility/2006" xmlns:aink="http://schemas.microsoft.com/office/drawing/2016/ink" xmlns:am3d="http://schemas.microsoft.com/office/drawing/2017/model3d" xmlns:o="urn:schemas-microsoft-com:office:office" xmlns:oel="http://schemas.microsoft.com/office/2019/extlst" xmlns:r="http://schemas.openxmlformats.org/officeDocument/2006/relationships" xmlns:m="http://schemas.openxmlformats.org/officeDocument/2006/math" xmlns:v="urn:schemas-microsoft-com:vml" xmlns:wp14="http://schemas.microsoft.com/office/word/2010/wordprocessingDrawing" xmlns:wp="http://schemas.openxmlformats.org/drawingml/2006/wordprocessingDrawing" xmlns:w10="urn:schemas-microsoft-com:office:word" xmlns:w="http://schemas.openxmlformats.org/wordprocessingml/2006/main" xmlns:w14="http://schemas.microsoft.com/office/word/2010/wordml" xmlns:w15="http://schemas.microsoft.com/office/word/2012/wordml" xmlns:w16cex="http://schemas.microsoft.com/office/word/2018/wordml/cex" xmlns:w16cid="http://schemas.microsoft.com/office/word/2016/wordml/cid" xmlns:w16="http://schemas.microsoft.com/office/word/2018/wordml" xmlns:w16du="http://schemas.microsoft.com/office/word/2023/wordml/word16du" xmlns:w16sdtdh="http://schemas.microsoft.com/office/word/2020/wordml/sdtdatahash" xmlns:w16sdtfl="http://schemas.microsoft.com/office/word/2024/wordml/sdtformatlock" xmlns:w16se="http://schemas.microsoft.com/office/word/2015/wordml/symex" xmlns:wpg="http://schemas.microsoft.com/office/word/2010/wordprocessingGroup" xmlns:wpi="http://schemas.microsoft.com/office/word/2010/wordprocessingInk" xmlns:wne="http://schemas.microsoft.com/office/word/2006/wordml" xmlns:wps="http://schemas.microsoft.com/office/word/2010/wordprocessingShape" mc:Ignorable="w14 w15 w16se w16cid w16 w16cex w16sdtdh w16sdtfl w16du wp14">
   <w:sdt>
     <w:sdtPr>
       <w:id w:val="365795399"/>
@@ -12653,7 +12805,7 @@
 </file>
 
 <file path=word/footnotes.xml><?xml version="1.0" encoding="utf-8"?>
-<w:footnotes xmlns:wpc="http://schemas.microsoft.com/office/word/2010/wordprocessingCanvas" xmlns:cx="http://schemas.microsoft.com/office/drawing/2014/chartex" xmlns:cx1="http://schemas.microsoft.com/office/drawing/2015/9/8/chartex" xmlns:cx2="http://schemas.microsoft.com/office/drawing/2015/10/21/chartex" xmlns:cx3="http://schemas.microsoft.com/office/drawing/2016/5/9/chartex" xmlns:cx4="http://schemas.microsoft.com/office/drawing/2016/5/10/chartex" xmlns:cx5="http://schemas.microsoft.com/office/drawing/2016/5/11/chartex" xmlns:cx6="http://schemas.microsoft.com/office/drawing/2016/5/12/chartex" xmlns:cx7="http://schemas.microsoft.com/office/drawing/2016/5/13/chartex" xmlns:cx8="http://schemas.microsoft.com/office/drawing/2016/5/14/chartex" xmlns:mc="http://schemas.openxmlformats.org/markup-compatibility/2006" xmlns:aink="http://schemas.microsoft.com/office/drawing/2016/ink" xmlns:am3d="http://schemas.microsoft.com/office/drawing/2017/model3d" xmlns:o="urn:schemas-microsoft-com:office:office" xmlns:oel="http://schemas.microsoft.com/office/2019/extlst" xmlns:r="http://schemas.openxmlformats.org/officeDocument/2006/relationships" xmlns:m="http://schemas.openxmlformats.org/officeDocument/2006/math" xmlns:v="urn:schemas-microsoft-com:vml" xmlns:wp14="http://schemas.microsoft.com/office/word/2010/wordprocessingDrawing" xmlns:wp="http://schemas.openxmlformats.org/drawingml/2006/wordprocessingDrawing" xmlns:w10="urn:schemas-microsoft-com:office:word" xmlns:w="http://schemas.openxmlformats.org/wordprocessingml/2006/main" xmlns:w14="http://schemas.microsoft.com/office/word/2010/wordml" xmlns:w15="http://schemas.microsoft.com/office/word/2012/wordml" xmlns:w16cei="http://schemas.microsoft.com/office/word/2026/wordml/cei" xmlns:w16cex="http://schemas.microsoft.com/office/word/2018/wordml/cex" xmlns:w16cid="http://schemas.microsoft.com/office/word/2016/wordml/cid" xmlns:w16="http://schemas.microsoft.com/office/word/2018/wordml" xmlns:w16du="http://schemas.microsoft.com/office/word/2023/wordml/word16du" xmlns:w16sdtdh="http://schemas.microsoft.com/office/word/2020/wordml/sdtdatahash" xmlns:w16sdtfl="http://schemas.microsoft.com/office/word/2024/wordml/sdtformatlock" xmlns:w16se="http://schemas.microsoft.com/office/word/2015/wordml/symex" xmlns:wpg="http://schemas.microsoft.com/office/word/2010/wordprocessingGroup" xmlns:wpi="http://schemas.microsoft.com/office/word/2010/wordprocessingInk" xmlns:wne="http://schemas.microsoft.com/office/word/2006/wordml" xmlns:wps="http://schemas.microsoft.com/office/word/2010/wordprocessingShape" mc:Ignorable="w14 w15 w16se w16cid w16 w16cex w16sdtdh w16sdtfl w16du wp14">
+<w:footnotes xmlns:wpc="http://schemas.microsoft.com/office/word/2010/wordprocessingCanvas" xmlns:cx="http://schemas.microsoft.com/office/drawing/2014/chartex" xmlns:cx1="http://schemas.microsoft.com/office/drawing/2015/9/8/chartex" xmlns:cx2="http://schemas.microsoft.com/office/drawing/2015/10/21/chartex" xmlns:cx3="http://schemas.microsoft.com/office/drawing/2016/5/9/chartex" xmlns:cx4="http://schemas.microsoft.com/office/drawing/2016/5/10/chartex" xmlns:cx5="http://schemas.microsoft.com/office/drawing/2016/5/11/chartex" xmlns:cx6="http://schemas.microsoft.com/office/drawing/2016/5/12/chartex" xmlns:cx7="http://schemas.microsoft.com/office/drawing/2016/5/13/chartex" xmlns:cx8="http://schemas.microsoft.com/office/drawing/2016/5/14/chartex" xmlns:mc="http://schemas.openxmlformats.org/markup-compatibility/2006" xmlns:aink="http://schemas.microsoft.com/office/drawing/2016/ink" xmlns:am3d="http://schemas.microsoft.com/office/drawing/2017/model3d" xmlns:o="urn:schemas-microsoft-com:office:office" xmlns:oel="http://schemas.microsoft.com/office/2019/extlst" xmlns:r="http://schemas.openxmlformats.org/officeDocument/2006/relationships" xmlns:m="http://schemas.openxmlformats.org/officeDocument/2006/math" xmlns:v="urn:schemas-microsoft-com:vml" xmlns:wp14="http://schemas.microsoft.com/office/word/2010/wordprocessingDrawing" xmlns:wp="http://schemas.openxmlformats.org/drawingml/2006/wordprocessingDrawing" xmlns:w10="urn:schemas-microsoft-com:office:word" xmlns:w="http://schemas.openxmlformats.org/wordprocessingml/2006/main" xmlns:w14="http://schemas.microsoft.com/office/word/2010/wordml" xmlns:w15="http://schemas.microsoft.com/office/word/2012/wordml" xmlns:w16cex="http://schemas.microsoft.com/office/word/2018/wordml/cex" xmlns:w16cid="http://schemas.microsoft.com/office/word/2016/wordml/cid" xmlns:w16="http://schemas.microsoft.com/office/word/2018/wordml" xmlns:w16du="http://schemas.microsoft.com/office/word/2023/wordml/word16du" xmlns:w16sdtdh="http://schemas.microsoft.com/office/word/2020/wordml/sdtdatahash" xmlns:w16sdtfl="http://schemas.microsoft.com/office/word/2024/wordml/sdtformatlock" xmlns:w16se="http://schemas.microsoft.com/office/word/2015/wordml/symex" xmlns:wpg="http://schemas.microsoft.com/office/word/2010/wordprocessingGroup" xmlns:wpi="http://schemas.microsoft.com/office/word/2010/wordprocessingInk" xmlns:wne="http://schemas.microsoft.com/office/word/2006/wordml" xmlns:wps="http://schemas.microsoft.com/office/word/2010/wordprocessingShape" mc:Ignorable="w14 w15 w16se w16cid w16 w16cex w16sdtdh w16sdtfl w16du wp14">
   <w:footnote w:type="separator" w:id="-1">
     <w:p>
       <w:pPr>
@@ -12678,7 +12830,7 @@
 </file>
 
 <file path=word/header1.xml><?xml version="1.0" encoding="utf-8"?>
-<w:hdr xmlns:wpc="http://schemas.microsoft.com/office/word/2010/wordprocessingCanvas" xmlns:cx="http://schemas.microsoft.com/office/drawing/2014/chartex" xmlns:cx1="http://schemas.microsoft.com/office/drawing/2015/9/8/chartex" xmlns:cx2="http://schemas.microsoft.com/office/drawing/2015/10/21/chartex" xmlns:cx3="http://schemas.microsoft.com/office/drawing/2016/5/9/chartex" xmlns:cx4="http://schemas.microsoft.com/office/drawing/2016/5/10/chartex" xmlns:cx5="http://schemas.microsoft.com/office/drawing/2016/5/11/chartex" xmlns:cx6="http://schemas.microsoft.com/office/drawing/2016/5/12/chartex" xmlns:cx7="http://schemas.microsoft.com/office/drawing/2016/5/13/chartex" xmlns:cx8="http://schemas.microsoft.com/office/drawing/2016/5/14/chartex" xmlns:mc="http://schemas.openxmlformats.org/markup-compatibility/2006" xmlns:aink="http://schemas.microsoft.com/office/drawing/2016/ink" xmlns:am3d="http://schemas.microsoft.com/office/drawing/2017/model3d" xmlns:o="urn:schemas-microsoft-com:office:office" xmlns:oel="http://schemas.microsoft.com/office/2019/extlst" xmlns:r="http://schemas.openxmlformats.org/officeDocument/2006/relationships" xmlns:m="http://schemas.openxmlformats.org/officeDocument/2006/math" xmlns:v="urn:schemas-microsoft-com:vml" xmlns:wp14="http://schemas.microsoft.com/office/word/2010/wordprocessingDrawing" xmlns:wp="http://schemas.openxmlformats.org/drawingml/2006/wordprocessingDrawing" xmlns:w10="urn:schemas-microsoft-com:office:word" xmlns:w="http://schemas.openxmlformats.org/wordprocessingml/2006/main" xmlns:w14="http://schemas.microsoft.com/office/word/2010/wordml" xmlns:w15="http://schemas.microsoft.com/office/word/2012/wordml" xmlns:w16cei="http://schemas.microsoft.com/office/word/2026/wordml/cei" xmlns:w16cex="http://schemas.microsoft.com/office/word/2018/wordml/cex" xmlns:w16cid="http://schemas.microsoft.com/office/word/2016/wordml/cid" xmlns:w16="http://schemas.microsoft.com/office/word/2018/wordml" xmlns:w16du="http://schemas.microsoft.com/office/word/2023/wordml/word16du" xmlns:w16sdtdh="http://schemas.microsoft.com/office/word/2020/wordml/sdtdatahash" xmlns:w16sdtfl="http://schemas.microsoft.com/office/word/2024/wordml/sdtformatlock" xmlns:w16se="http://schemas.microsoft.com/office/word/2015/wordml/symex" xmlns:wpg="http://schemas.microsoft.com/office/word/2010/wordprocessingGroup" xmlns:wpi="http://schemas.microsoft.com/office/word/2010/wordprocessingInk" xmlns:wne="http://schemas.microsoft.com/office/word/2006/wordml" xmlns:wps="http://schemas.microsoft.com/office/word/2010/wordprocessingShape" mc:Ignorable="w14 w15 w16se w16cid w16 w16cex w16sdtdh w16sdtfl w16du wp14">
+<w:hdr xmlns:wpc="http://schemas.microsoft.com/office/word/2010/wordprocessingCanvas" xmlns:cx="http://schemas.microsoft.com/office/drawing/2014/chartex" xmlns:cx1="http://schemas.microsoft.com/office/drawing/2015/9/8/chartex" xmlns:cx2="http://schemas.microsoft.com/office/drawing/2015/10/21/chartex" xmlns:cx3="http://schemas.microsoft.com/office/drawing/2016/5/9/chartex" xmlns:cx4="http://schemas.microsoft.com/office/drawing/2016/5/10/chartex" xmlns:cx5="http://schemas.microsoft.com/office/drawing/2016/5/11/chartex" xmlns:cx6="http://schemas.microsoft.com/office/drawing/2016/5/12/chartex" xmlns:cx7="http://schemas.microsoft.com/office/drawing/2016/5/13/chartex" xmlns:cx8="http://schemas.microsoft.com/office/drawing/2016/5/14/chartex" xmlns:mc="http://schemas.openxmlformats.org/markup-compatibility/2006" xmlns:aink="http://schemas.microsoft.com/office/drawing/2016/ink" xmlns:am3d="http://schemas.microsoft.com/office/drawing/2017/model3d" xmlns:o="urn:schemas-microsoft-com:office:office" xmlns:oel="http://schemas.microsoft.com/office/2019/extlst" xmlns:r="http://schemas.openxmlformats.org/officeDocument/2006/relationships" xmlns:m="http://schemas.openxmlformats.org/officeDocument/2006/math" xmlns:v="urn:schemas-microsoft-com:vml" xmlns:wp14="http://schemas.microsoft.com/office/word/2010/wordprocessingDrawing" xmlns:wp="http://schemas.openxmlformats.org/drawingml/2006/wordprocessingDrawing" xmlns:w10="urn:schemas-microsoft-com:office:word" xmlns:w="http://schemas.openxmlformats.org/wordprocessingml/2006/main" xmlns:w14="http://schemas.microsoft.com/office/word/2010/wordml" xmlns:w15="http://schemas.microsoft.com/office/word/2012/wordml" xmlns:w16cex="http://schemas.microsoft.com/office/word/2018/wordml/cex" xmlns:w16cid="http://schemas.microsoft.com/office/word/2016/wordml/cid" xmlns:w16="http://schemas.microsoft.com/office/word/2018/wordml" xmlns:w16du="http://schemas.microsoft.com/office/word/2023/wordml/word16du" xmlns:w16sdtdh="http://schemas.microsoft.com/office/word/2020/wordml/sdtdatahash" xmlns:w16sdtfl="http://schemas.microsoft.com/office/word/2024/wordml/sdtformatlock" xmlns:w16se="http://schemas.microsoft.com/office/word/2015/wordml/symex" xmlns:wpg="http://schemas.microsoft.com/office/word/2010/wordprocessingGroup" xmlns:wpi="http://schemas.microsoft.com/office/word/2010/wordprocessingInk" xmlns:wne="http://schemas.microsoft.com/office/word/2006/wordml" xmlns:wps="http://schemas.microsoft.com/office/word/2010/wordprocessingShape" mc:Ignorable="w14 w15 w16se w16cid w16 w16cex w16sdtdh w16sdtfl w16du wp14">
   <w:p>
     <w:pPr>
       <w:pStyle w:val="Header"/>
@@ -12727,7 +12879,7 @@
 </file>
 
 <file path=word/numbering.xml><?xml version="1.0" encoding="utf-8"?>
-<w:numbering xmlns:wpc="http://schemas.microsoft.com/office/word/2010/wordprocessingCanvas" xmlns:cx="http://schemas.microsoft.com/office/drawing/2014/chartex" xmlns:cx1="http://schemas.microsoft.com/office/drawing/2015/9/8/chartex" xmlns:cx2="http://schemas.microsoft.com/office/drawing/2015/10/21/chartex" xmlns:cx3="http://schemas.microsoft.com/office/drawing/2016/5/9/chartex" xmlns:cx4="http://schemas.microsoft.com/office/drawing/2016/5/10/chartex" xmlns:cx5="http://schemas.microsoft.com/office/drawing/2016/5/11/chartex" xmlns:cx6="http://schemas.microsoft.com/office/drawing/2016/5/12/chartex" xmlns:cx7="http://schemas.microsoft.com/office/drawing/2016/5/13/chartex" xmlns:cx8="http://schemas.microsoft.com/office/drawing/2016/5/14/chartex" xmlns:mc="http://schemas.openxmlformats.org/markup-compatibility/2006" xmlns:aink="http://schemas.microsoft.com/office/drawing/2016/ink" xmlns:am3d="http://schemas.microsoft.com/office/drawing/2017/model3d" xmlns:o="urn:schemas-microsoft-com:office:office" xmlns:oel="http://schemas.microsoft.com/office/2019/extlst" xmlns:r="http://schemas.openxmlformats.org/officeDocument/2006/relationships" xmlns:m="http://schemas.openxmlformats.org/officeDocument/2006/math" xmlns:v="urn:schemas-microsoft-com:vml" xmlns:wp14="http://schemas.microsoft.com/office/word/2010/wordprocessingDrawing" xmlns:wp="http://schemas.openxmlformats.org/drawingml/2006/wordprocessingDrawing" xmlns:w10="urn:schemas-microsoft-com:office:word" xmlns:w="http://schemas.openxmlformats.org/wordprocessingml/2006/main" xmlns:w14="http://schemas.microsoft.com/office/word/2010/wordml" xmlns:w15="http://schemas.microsoft.com/office/word/2012/wordml" xmlns:w16cei="http://schemas.microsoft.com/office/word/2026/wordml/cei" xmlns:w16cex="http://schemas.microsoft.com/office/word/2018/wordml/cex" xmlns:w16cid="http://schemas.microsoft.com/office/word/2016/wordml/cid" xmlns:w16="http://schemas.microsoft.com/office/word/2018/wordml" xmlns:w16du="http://schemas.microsoft.com/office/word/2023/wordml/word16du" xmlns:w16sdtdh="http://schemas.microsoft.com/office/word/2020/wordml/sdtdatahash" xmlns:w16sdtfl="http://schemas.microsoft.com/office/word/2024/wordml/sdtformatlock" xmlns:w16se="http://schemas.microsoft.com/office/word/2015/wordml/symex" xmlns:wpg="http://schemas.microsoft.com/office/word/2010/wordprocessingGroup" xmlns:wpi="http://schemas.microsoft.com/office/word/2010/wordprocessingInk" xmlns:wne="http://schemas.microsoft.com/office/word/2006/wordml" xmlns:wps="http://schemas.microsoft.com/office/word/2010/wordprocessingShape" mc:Ignorable="w14 w15 w16se w16cid w16 w16cex w16sdtdh w16sdtfl w16du wp14">
+<w:numbering xmlns:wpc="http://schemas.microsoft.com/office/word/2010/wordprocessingCanvas" xmlns:cx="http://schemas.microsoft.com/office/drawing/2014/chartex" xmlns:cx1="http://schemas.microsoft.com/office/drawing/2015/9/8/chartex" xmlns:cx2="http://schemas.microsoft.com/office/drawing/2015/10/21/chartex" xmlns:cx3="http://schemas.microsoft.com/office/drawing/2016/5/9/chartex" xmlns:cx4="http://schemas.microsoft.com/office/drawing/2016/5/10/chartex" xmlns:cx5="http://schemas.microsoft.com/office/drawing/2016/5/11/chartex" xmlns:cx6="http://schemas.microsoft.com/office/drawing/2016/5/12/chartex" xmlns:cx7="http://schemas.microsoft.com/office/drawing/2016/5/13/chartex" xmlns:cx8="http://schemas.microsoft.com/office/drawing/2016/5/14/chartex" xmlns:mc="http://schemas.openxmlformats.org/markup-compatibility/2006" xmlns:aink="http://schemas.microsoft.com/office/drawing/2016/ink" xmlns:am3d="http://schemas.microsoft.com/office/drawing/2017/model3d" xmlns:o="urn:schemas-microsoft-com:office:office" xmlns:oel="http://schemas.microsoft.com/office/2019/extlst" xmlns:r="http://schemas.openxmlformats.org/officeDocument/2006/relationships" xmlns:m="http://schemas.openxmlformats.org/officeDocument/2006/math" xmlns:v="urn:schemas-microsoft-com:vml" xmlns:wp14="http://schemas.microsoft.com/office/word/2010/wordprocessingDrawing" xmlns:wp="http://schemas.openxmlformats.org/drawingml/2006/wordprocessingDrawing" xmlns:w10="urn:schemas-microsoft-com:office:word" xmlns:w="http://schemas.openxmlformats.org/wordprocessingml/2006/main" xmlns:w14="http://schemas.microsoft.com/office/word/2010/wordml" xmlns:w15="http://schemas.microsoft.com/office/word/2012/wordml" xmlns:w16cex="http://schemas.microsoft.com/office/word/2018/wordml/cex" xmlns:w16cid="http://schemas.microsoft.com/office/word/2016/wordml/cid" xmlns:w16="http://schemas.microsoft.com/office/word/2018/wordml" xmlns:w16du="http://schemas.microsoft.com/office/word/2023/wordml/word16du" xmlns:w16sdtdh="http://schemas.microsoft.com/office/word/2020/wordml/sdtdatahash" xmlns:w16sdtfl="http://schemas.microsoft.com/office/word/2024/wordml/sdtformatlock" xmlns:w16se="http://schemas.microsoft.com/office/word/2015/wordml/symex" xmlns:wpg="http://schemas.microsoft.com/office/word/2010/wordprocessingGroup" xmlns:wpi="http://schemas.microsoft.com/office/word/2010/wordprocessingInk" xmlns:wne="http://schemas.microsoft.com/office/word/2006/wordml" xmlns:wps="http://schemas.microsoft.com/office/word/2010/wordprocessingShape" mc:Ignorable="w14 w15 w16se w16cid w16 w16cex w16sdtdh w16sdtfl w16du wp14">
   <w:abstractNum w:abstractNumId="0" w15:restartNumberingAfterBreak="0">
     <w:nsid w:val="00A97EFF"/>
     <w:multiLevelType w:val="multilevel"/>
@@ -17808,6 +17960,7 @@
   <w:style w:type="character" w:default="1" w:styleId="DefaultParagraphFont">
     <w:name w:val="Default Paragraph Font"/>
     <w:uiPriority w:val="1"/>
+    <w:semiHidden/>
     <w:unhideWhenUsed/>
   </w:style>
   <w:style w:type="table" w:default="1" w:styleId="TableNormal">

</xml_diff>

<commit_message>
sửa mô tả quy trình txử lý hồ sơ
</commit_message>
<xml_diff>
--- a/He_thong_thong_tin_giai_quyet_hanh_chinh/NGUYEN TRUONG PHI_25410281/25410281_NguyenTruongPhi.docx
+++ b/He_thong_thong_tin_giai_quyet_hanh_chinh/NGUYEN TRUONG PHI_25410281/25410281_NguyenTruongPhi.docx
@@ -79,7 +79,7 @@
           <w:szCs w:val="26"/>
         </w:rPr>
         <w:drawing>
-          <wp:inline distT="0" distB="0" distL="0" distR="0" wp14:anchorId="61AA30EF" wp14:editId="03CC91B4">
+          <wp:inline distT="0" distB="0" distL="0" distR="0" wp14:anchorId="61AA30EF" wp14:editId="56870874">
             <wp:extent cx="1948539" cy="1606164"/>
             <wp:effectExtent l="0" t="0" r="0" b="0"/>
             <wp:docPr id="990850389" name="Picture 1"/>
@@ -7375,18 +7375,10 @@
         <w:ind w:left="720" w:firstLine="720"/>
       </w:pPr>
       <w:r>
-        <w:t xml:space="preserve">Kết quả sau khi được ký được ghi nhận chính thức trên hệ thống, cập nhật trạng thái và chuyển sang quy trình trả kết quả cho người nộp hồ </w:t>
-      </w:r>
-      <w:proofErr w:type="gramStart"/>
-      <w:r>
-        <w:t>sơ.</w:t>
-      </w:r>
-      <w:r>
-        <w:t>ĐỐI</w:t>
-      </w:r>
-      <w:proofErr w:type="gramEnd"/>
-      <w:r>
-        <w:t xml:space="preserve"> TƯỢNG KHÁCH HÀNG</w:t>
+        <w:t>Kết quả sau khi được ký được ghi nhận chính thức trên hệ thống, cập nhật trạng thái và chuyển sang quy trình trả kết quả cho người nộp hồ sơ.</w:t>
+      </w:r>
+      <w:r>
+        <w:t>ĐỐI TƯỢNG KHÁCH HÀNG</w:t>
       </w:r>
     </w:p>
     <w:p>
@@ -9969,15 +9961,7 @@
         <w:ind w:left="1440"/>
       </w:pPr>
       <w:r>
-        <w:t xml:space="preserve">Tham gia xem xét, </w:t>
-      </w:r>
-      <w:proofErr w:type="gramStart"/>
-      <w:r>
-        <w:t>xử lý các hồ sơ cần ý kiến chỉ đạo</w:t>
-      </w:r>
-      <w:proofErr w:type="gramEnd"/>
-      <w:r>
-        <w:t>.</w:t>
+        <w:t>Tham gia xem xét, xử lý các hồ sơ cần ý kiến chỉ đạo.</w:t>
       </w:r>
     </w:p>
     <w:p>
@@ -10533,6 +10517,14 @@
         <w:t>. Mô hình hóa quy trình kiểm tra, thẩm định, xử lý hồ sơ.</w:t>
       </w:r>
     </w:p>
+    <w:p>
+      <w:pPr>
+        <w:pStyle w:val="Heading5"/>
+      </w:pPr>
+      <w:r>
+        <w:t>2.3.2.1 m</w:t>
+      </w:r>
+    </w:p>
     <w:p/>
     <w:p>
       <w:pPr>
@@ -10620,7 +10612,7 @@
           <w:szCs w:val="26"/>
         </w:rPr>
         <w:drawing>
-          <wp:inline distT="0" distB="0" distL="0" distR="0" wp14:anchorId="41A495D2" wp14:editId="692848CF">
+          <wp:inline distT="0" distB="0" distL="0" distR="0" wp14:anchorId="41A495D2" wp14:editId="0A0AAC77">
             <wp:extent cx="5725795" cy="2461260"/>
             <wp:effectExtent l="0" t="0" r="8255" b="0"/>
             <wp:docPr id="1702479062" name="Picture 21"/>

</xml_diff>

<commit_message>
cập nhật sơ đồ tổ chức quy trình xử lý hồ sơ
</commit_message>
<xml_diff>
--- a/He_thong_thong_tin_giai_quyet_hanh_chinh/NGUYEN TRUONG PHI_25410281/25410281_NguyenTruongPhi.docx
+++ b/He_thong_thong_tin_giai_quyet_hanh_chinh/NGUYEN TRUONG PHI_25410281/25410281_NguyenTruongPhi.docx
@@ -79,7 +79,7 @@
           <w:szCs w:val="26"/>
         </w:rPr>
         <w:drawing>
-          <wp:inline distT="0" distB="0" distL="0" distR="0" wp14:anchorId="61AA30EF" wp14:editId="56870874">
+          <wp:inline distT="0" distB="0" distL="0" distR="0" wp14:anchorId="61AA30EF" wp14:editId="54E99915">
             <wp:extent cx="1948539" cy="1606164"/>
             <wp:effectExtent l="0" t="0" r="0" b="0"/>
             <wp:docPr id="990850389" name="Picture 1"/>
@@ -5860,14 +5860,27 @@
       <w:r>
         <w:t xml:space="preserve">Hình </w:t>
       </w:r>
-      <w:fldSimple w:instr=" SEQ Hình \* ARABIC ">
-        <w:r>
-          <w:rPr>
-            <w:noProof/>
-          </w:rPr>
-          <w:t>1</w:t>
-        </w:r>
-      </w:fldSimple>
+      <w:r>
+        <w:fldChar w:fldCharType="begin"/>
+      </w:r>
+      <w:r>
+        <w:instrText xml:space="preserve"> SEQ Hình \* ARABIC </w:instrText>
+      </w:r>
+      <w:r>
+        <w:fldChar w:fldCharType="separate"/>
+      </w:r>
+      <w:r>
+        <w:rPr>
+          <w:noProof/>
+        </w:rPr>
+        <w:t>1</w:t>
+      </w:r>
+      <w:r>
+        <w:rPr>
+          <w:noProof/>
+        </w:rPr>
+        <w:fldChar w:fldCharType="end"/>
+      </w:r>
       <w:r>
         <w:t>. Quy trình tiếp nhận hồ sơ</w:t>
       </w:r>
@@ -6382,14 +6395,27 @@
       <w:r>
         <w:t xml:space="preserve">Hình </w:t>
       </w:r>
-      <w:fldSimple w:instr=" SEQ Hình \* ARABIC ">
-        <w:r>
-          <w:rPr>
-            <w:noProof/>
-          </w:rPr>
-          <w:t>2</w:t>
-        </w:r>
-      </w:fldSimple>
+      <w:r>
+        <w:fldChar w:fldCharType="begin"/>
+      </w:r>
+      <w:r>
+        <w:instrText xml:space="preserve"> SEQ Hình \* ARABIC </w:instrText>
+      </w:r>
+      <w:r>
+        <w:fldChar w:fldCharType="separate"/>
+      </w:r>
+      <w:r>
+        <w:rPr>
+          <w:noProof/>
+        </w:rPr>
+        <w:t>2</w:t>
+      </w:r>
+      <w:r>
+        <w:rPr>
+          <w:noProof/>
+        </w:rPr>
+        <w:fldChar w:fldCharType="end"/>
+      </w:r>
       <w:r>
         <w:t>. Quy trình kiểm tra, thẩm định và xử lý hồ sơ</w:t>
       </w:r>
@@ -7216,14 +7242,27 @@
       <w:r>
         <w:t xml:space="preserve">Hình </w:t>
       </w:r>
-      <w:fldSimple w:instr=" SEQ Hình \* ARABIC ">
-        <w:r>
-          <w:rPr>
-            <w:noProof/>
-          </w:rPr>
-          <w:t>3</w:t>
-        </w:r>
-      </w:fldSimple>
+      <w:r>
+        <w:fldChar w:fldCharType="begin"/>
+      </w:r>
+      <w:r>
+        <w:instrText xml:space="preserve"> SEQ Hình \* ARABIC </w:instrText>
+      </w:r>
+      <w:r>
+        <w:fldChar w:fldCharType="separate"/>
+      </w:r>
+      <w:r>
+        <w:rPr>
+          <w:noProof/>
+        </w:rPr>
+        <w:t>3</w:t>
+      </w:r>
+      <w:r>
+        <w:rPr>
+          <w:noProof/>
+        </w:rPr>
+        <w:fldChar w:fldCharType="end"/>
+      </w:r>
       <w:r>
         <w:t>. Quy trình trả kết</w:t>
       </w:r>
@@ -7375,10 +7414,18 @@
         <w:ind w:left="720" w:firstLine="720"/>
       </w:pPr>
       <w:r>
-        <w:t>Kết quả sau khi được ký được ghi nhận chính thức trên hệ thống, cập nhật trạng thái và chuyển sang quy trình trả kết quả cho người nộp hồ sơ.</w:t>
-      </w:r>
-      <w:r>
-        <w:t>ĐỐI TƯỢNG KHÁCH HÀNG</w:t>
+        <w:t xml:space="preserve">Kết quả sau khi được ký được ghi nhận chính thức trên hệ thống, cập nhật trạng thái và chuyển sang quy trình trả kết quả cho người nộp hồ </w:t>
+      </w:r>
+      <w:proofErr w:type="gramStart"/>
+      <w:r>
+        <w:t>sơ.</w:t>
+      </w:r>
+      <w:r>
+        <w:t>ĐỐI</w:t>
+      </w:r>
+      <w:proofErr w:type="gramEnd"/>
+      <w:r>
+        <w:t xml:space="preserve"> TƯỢNG KHÁCH HÀNG</w:t>
       </w:r>
     </w:p>
     <w:p>
@@ -7517,14 +7564,27 @@
       <w:r>
         <w:t xml:space="preserve">Hình </w:t>
       </w:r>
-      <w:fldSimple w:instr=" SEQ Hình \* ARABIC ">
-        <w:r>
-          <w:rPr>
-            <w:noProof/>
-          </w:rPr>
-          <w:t>4</w:t>
-        </w:r>
-      </w:fldSimple>
+      <w:r>
+        <w:fldChar w:fldCharType="begin"/>
+      </w:r>
+      <w:r>
+        <w:instrText xml:space="preserve"> SEQ Hình \* ARABIC </w:instrText>
+      </w:r>
+      <w:r>
+        <w:fldChar w:fldCharType="separate"/>
+      </w:r>
+      <w:r>
+        <w:rPr>
+          <w:noProof/>
+        </w:rPr>
+        <w:t>4</w:t>
+      </w:r>
+      <w:r>
+        <w:rPr>
+          <w:noProof/>
+        </w:rPr>
+        <w:fldChar w:fldCharType="end"/>
+      </w:r>
       <w:r>
         <w:t xml:space="preserve">. </w:t>
       </w:r>
@@ -9727,16 +9787,35 @@
       <w:r>
         <w:t xml:space="preserve">Hình </w:t>
       </w:r>
-      <w:fldSimple w:instr=" SEQ Hình \* ARABIC ">
-        <w:r>
-          <w:rPr>
-            <w:noProof/>
-          </w:rPr>
-          <w:t>5</w:t>
-        </w:r>
-      </w:fldSimple>
-      <w:r>
-        <w:t xml:space="preserve"> Sơ tổ chức tiếp nhận hồ sơ</w:t>
+      <w:r>
+        <w:fldChar w:fldCharType="begin"/>
+      </w:r>
+      <w:r>
+        <w:instrText xml:space="preserve"> SEQ Hình \* ARABIC </w:instrText>
+      </w:r>
+      <w:r>
+        <w:fldChar w:fldCharType="separate"/>
+      </w:r>
+      <w:r>
+        <w:rPr>
+          <w:noProof/>
+        </w:rPr>
+        <w:t>5</w:t>
+      </w:r>
+      <w:r>
+        <w:rPr>
+          <w:noProof/>
+        </w:rPr>
+        <w:fldChar w:fldCharType="end"/>
+      </w:r>
+      <w:r>
+        <w:t xml:space="preserve"> Sơ tổ chức </w:t>
+      </w:r>
+      <w:r>
+        <w:t xml:space="preserve">quy trình </w:t>
+      </w:r>
+      <w:r>
+        <w:t>tiếp nhận hồ sơ</w:t>
       </w:r>
     </w:p>
     <w:p>
@@ -9961,7 +10040,15 @@
         <w:ind w:left="1440"/>
       </w:pPr>
       <w:r>
-        <w:t>Tham gia xem xét, xử lý các hồ sơ cần ý kiến chỉ đạo.</w:t>
+        <w:t xml:space="preserve">Tham gia xem xét, </w:t>
+      </w:r>
+      <w:proofErr w:type="gramStart"/>
+      <w:r>
+        <w:t>xử lý các hồ sơ cần ý kiến chỉ đạo</w:t>
+      </w:r>
+      <w:proofErr w:type="gramEnd"/>
+      <w:r>
+        <w:t>.</w:t>
       </w:r>
     </w:p>
     <w:p>
@@ -10505,14 +10592,27 @@
       <w:r>
         <w:t xml:space="preserve">Hình </w:t>
       </w:r>
-      <w:fldSimple w:instr=" SEQ Hình \* ARABIC ">
-        <w:r>
-          <w:rPr>
-            <w:noProof/>
-          </w:rPr>
-          <w:t>6</w:t>
-        </w:r>
-      </w:fldSimple>
+      <w:r>
+        <w:fldChar w:fldCharType="begin"/>
+      </w:r>
+      <w:r>
+        <w:instrText xml:space="preserve"> SEQ Hình \* ARABIC </w:instrText>
+      </w:r>
+      <w:r>
+        <w:fldChar w:fldCharType="separate"/>
+      </w:r>
+      <w:r>
+        <w:rPr>
+          <w:noProof/>
+        </w:rPr>
+        <w:t>6</w:t>
+      </w:r>
+      <w:r>
+        <w:rPr>
+          <w:noProof/>
+        </w:rPr>
+        <w:fldChar w:fldCharType="end"/>
+      </w:r>
       <w:r>
         <w:t>. Mô hình hóa quy trình kiểm tra, thẩm định, xử lý hồ sơ.</w:t>
       </w:r>
@@ -10522,83 +10622,2531 @@
         <w:pStyle w:val="Heading5"/>
       </w:pPr>
       <w:r>
-        <w:t>2.3.2.1 m</w:t>
-      </w:r>
-    </w:p>
-    <w:p/>
-    <w:p>
-      <w:pPr>
-        <w:pStyle w:val="Heading3"/>
-      </w:pPr>
-      <w:bookmarkStart w:id="26" w:name="_Toc236264131"/>
-      <w:r>
-        <w:t>2.4 Mô hình hóa quy trình hỗ trợ (Processs Support)</w:t>
-      </w:r>
-      <w:bookmarkEnd w:id="26"/>
-    </w:p>
-    <w:p/>
-    <w:p/>
-    <w:p>
-      <w:pPr>
-        <w:rPr>
-          <w:rFonts w:cs="Times New Roman"/>
-          <w:szCs w:val="26"/>
-        </w:rPr>
-      </w:pPr>
-      <w:r>
-        <w:rPr>
-          <w:rFonts w:cs="Times New Roman"/>
-          <w:szCs w:val="26"/>
-        </w:rPr>
-        <w:br w:type="page"/>
-      </w:r>
-    </w:p>
-    <w:p>
-      <w:pPr>
-        <w:pStyle w:val="Heading1"/>
-      </w:pPr>
-      <w:bookmarkStart w:id="27" w:name="_Toc236264132"/>
-      <w:r>
-        <w:lastRenderedPageBreak/>
-        <w:t xml:space="preserve">Chương III. </w:t>
-      </w:r>
-      <w:r>
-        <w:t>PHÂN TÍCH QUY TRÌNH</w:t>
-      </w:r>
-      <w:r>
-        <w:t>.</w:t>
-      </w:r>
-      <w:bookmarkEnd w:id="27"/>
-    </w:p>
-    <w:p>
-      <w:pPr>
-        <w:pStyle w:val="Heading3"/>
-      </w:pPr>
-      <w:r>
-        <w:t xml:space="preserve">3.1 Phân tích </w:t>
-      </w:r>
-      <w:r>
-        <w:t>quy trình tiếp nhận hồ sơ</w:t>
-      </w:r>
-    </w:p>
-    <w:p>
-      <w:pPr>
-        <w:pStyle w:val="Heading3"/>
-        <w:numPr>
-          <w:ilvl w:val="2"/>
-          <w:numId w:val="37"/>
-        </w:numPr>
-      </w:pPr>
-      <w:r>
-        <w:t>Phân tích định tính</w:t>
-      </w:r>
-    </w:p>
-    <w:p>
-      <w:pPr>
-        <w:pStyle w:val="Heading3"/>
-      </w:pPr>
-      <w:r>
-        <w:t xml:space="preserve">3.1.1.1 Phân tích giá trị gia tăng </w:t>
+        <w:t xml:space="preserve">2.3.2.1 </w:t>
+      </w:r>
+      <w:r>
+        <w:t>Mô tả quy trình</w:t>
+      </w:r>
+    </w:p>
+    <w:p>
+      <w:pPr>
+        <w:ind w:firstLine="720"/>
+      </w:pPr>
+      <w:r>
+        <w:t xml:space="preserve">Bảng 5. Mô quy trình trình </w:t>
+      </w:r>
+      <w:r>
+        <w:t>trình kiểm tra, thẩm định, xử lý hồ sơ.</w:t>
+      </w:r>
+    </w:p>
+    <w:tbl>
+      <w:tblPr>
+        <w:tblW w:w="0" w:type="auto"/>
+        <w:tblCellMar>
+          <w:top w:w="15" w:type="dxa"/>
+          <w:left w:w="15" w:type="dxa"/>
+          <w:bottom w:w="15" w:type="dxa"/>
+          <w:right w:w="15" w:type="dxa"/>
+        </w:tblCellMar>
+        <w:tblLook w:val="04A0" w:firstRow="1" w:lastRow="0" w:firstColumn="1" w:lastColumn="0" w:noHBand="0" w:noVBand="1"/>
+      </w:tblPr>
+      <w:tblGrid>
+        <w:gridCol w:w="663"/>
+        <w:gridCol w:w="2405"/>
+        <w:gridCol w:w="2382"/>
+        <w:gridCol w:w="3566"/>
+      </w:tblGrid>
+      <w:tr>
+        <w:trPr>
+          <w:trHeight w:val="315"/>
+        </w:trPr>
+        <w:tc>
+          <w:tcPr>
+            <w:tcW w:w="0" w:type="auto"/>
+            <w:tcBorders>
+              <w:top w:val="single" w:sz="4" w:space="0" w:color="000000"/>
+              <w:left w:val="single" w:sz="4" w:space="0" w:color="000000"/>
+              <w:bottom w:val="single" w:sz="4" w:space="0" w:color="000000"/>
+              <w:right w:val="single" w:sz="4" w:space="0" w:color="000000"/>
+            </w:tcBorders>
+            <w:tcMar>
+              <w:top w:w="0" w:type="dxa"/>
+              <w:left w:w="100" w:type="dxa"/>
+              <w:bottom w:w="0" w:type="dxa"/>
+              <w:right w:w="100" w:type="dxa"/>
+            </w:tcMar>
+            <w:hideMark/>
+          </w:tcPr>
+          <w:p>
+            <w:r>
+              <w:t>STT</w:t>
+            </w:r>
+          </w:p>
+        </w:tc>
+        <w:tc>
+          <w:tcPr>
+            <w:tcW w:w="0" w:type="auto"/>
+            <w:tcBorders>
+              <w:top w:val="single" w:sz="4" w:space="0" w:color="000000"/>
+              <w:left w:val="single" w:sz="4" w:space="0" w:color="000000"/>
+              <w:bottom w:val="single" w:sz="4" w:space="0" w:color="000000"/>
+              <w:right w:val="single" w:sz="4" w:space="0" w:color="000000"/>
+            </w:tcBorders>
+            <w:tcMar>
+              <w:top w:w="0" w:type="dxa"/>
+              <w:left w:w="100" w:type="dxa"/>
+              <w:bottom w:w="0" w:type="dxa"/>
+              <w:right w:w="100" w:type="dxa"/>
+            </w:tcMar>
+            <w:hideMark/>
+          </w:tcPr>
+          <w:p>
+            <w:r>
+              <w:t>Các hoạt động</w:t>
+            </w:r>
+          </w:p>
+        </w:tc>
+        <w:tc>
+          <w:tcPr>
+            <w:tcW w:w="0" w:type="auto"/>
+            <w:tcBorders>
+              <w:top w:val="single" w:sz="4" w:space="0" w:color="000000"/>
+              <w:left w:val="single" w:sz="4" w:space="0" w:color="000000"/>
+              <w:bottom w:val="single" w:sz="4" w:space="0" w:color="000000"/>
+              <w:right w:val="single" w:sz="4" w:space="0" w:color="000000"/>
+            </w:tcBorders>
+            <w:tcMar>
+              <w:top w:w="0" w:type="dxa"/>
+              <w:left w:w="100" w:type="dxa"/>
+              <w:bottom w:w="0" w:type="dxa"/>
+              <w:right w:w="100" w:type="dxa"/>
+            </w:tcMar>
+            <w:hideMark/>
+          </w:tcPr>
+          <w:p>
+            <w:r>
+              <w:t>Các bước thực hiện</w:t>
+            </w:r>
+          </w:p>
+        </w:tc>
+        <w:tc>
+          <w:tcPr>
+            <w:tcW w:w="0" w:type="auto"/>
+            <w:tcBorders>
+              <w:top w:val="single" w:sz="4" w:space="0" w:color="000000"/>
+              <w:left w:val="single" w:sz="4" w:space="0" w:color="000000"/>
+              <w:bottom w:val="single" w:sz="4" w:space="0" w:color="000000"/>
+              <w:right w:val="single" w:sz="4" w:space="0" w:color="000000"/>
+            </w:tcBorders>
+            <w:tcMar>
+              <w:top w:w="0" w:type="dxa"/>
+              <w:left w:w="100" w:type="dxa"/>
+              <w:bottom w:w="0" w:type="dxa"/>
+              <w:right w:w="100" w:type="dxa"/>
+            </w:tcMar>
+            <w:hideMark/>
+          </w:tcPr>
+          <w:p>
+            <w:r>
+              <w:t>Mô tả</w:t>
+            </w:r>
+          </w:p>
+        </w:tc>
+      </w:tr>
+      <w:tr>
+        <w:trPr>
+          <w:trHeight w:val="1515"/>
+        </w:trPr>
+        <w:tc>
+          <w:tcPr>
+            <w:tcW w:w="0" w:type="auto"/>
+            <w:tcBorders>
+              <w:top w:val="single" w:sz="4" w:space="0" w:color="000000"/>
+              <w:left w:val="single" w:sz="4" w:space="0" w:color="000000"/>
+              <w:bottom w:val="single" w:sz="4" w:space="0" w:color="000000"/>
+              <w:right w:val="single" w:sz="4" w:space="0" w:color="000000"/>
+            </w:tcBorders>
+            <w:tcMar>
+              <w:top w:w="0" w:type="dxa"/>
+              <w:left w:w="100" w:type="dxa"/>
+              <w:bottom w:w="0" w:type="dxa"/>
+              <w:right w:w="100" w:type="dxa"/>
+            </w:tcMar>
+            <w:hideMark/>
+          </w:tcPr>
+          <w:p>
+            <w:r>
+              <w:t>1</w:t>
+            </w:r>
+          </w:p>
+        </w:tc>
+        <w:tc>
+          <w:tcPr>
+            <w:tcW w:w="0" w:type="auto"/>
+            <w:tcBorders>
+              <w:top w:val="single" w:sz="4" w:space="0" w:color="000000"/>
+              <w:left w:val="single" w:sz="4" w:space="0" w:color="000000"/>
+              <w:bottom w:val="single" w:sz="4" w:space="0" w:color="000000"/>
+              <w:right w:val="single" w:sz="4" w:space="0" w:color="000000"/>
+            </w:tcBorders>
+            <w:tcMar>
+              <w:top w:w="0" w:type="dxa"/>
+              <w:left w:w="100" w:type="dxa"/>
+              <w:bottom w:w="0" w:type="dxa"/>
+              <w:right w:w="100" w:type="dxa"/>
+            </w:tcMar>
+            <w:hideMark/>
+          </w:tcPr>
+          <w:p>
+            <w:r>
+              <w:t>Tiếp nhận hồ sơ</w:t>
+            </w:r>
+          </w:p>
+        </w:tc>
+        <w:tc>
+          <w:tcPr>
+            <w:tcW w:w="0" w:type="auto"/>
+            <w:tcBorders>
+              <w:top w:val="single" w:sz="4" w:space="0" w:color="000000"/>
+              <w:left w:val="single" w:sz="4" w:space="0" w:color="000000"/>
+              <w:bottom w:val="single" w:sz="4" w:space="0" w:color="000000"/>
+              <w:right w:val="single" w:sz="4" w:space="0" w:color="000000"/>
+            </w:tcBorders>
+            <w:tcMar>
+              <w:top w:w="0" w:type="dxa"/>
+              <w:left w:w="100" w:type="dxa"/>
+              <w:bottom w:w="0" w:type="dxa"/>
+              <w:right w:w="100" w:type="dxa"/>
+            </w:tcMar>
+            <w:hideMark/>
+          </w:tcPr>
+          <w:p>
+            <w:r>
+              <w:t>1) Nhận hồ sơ được chuyển đến</w:t>
+            </w:r>
+          </w:p>
+          <w:p>
+            <w:r>
+              <w:t>2) Ghi nhận thông tin hồ sơ</w:t>
+            </w:r>
+          </w:p>
+          <w:p>
+            <w:r>
+              <w:t>3) Xác nhận hồ sơ đã được tiếp nhận</w:t>
+            </w:r>
+          </w:p>
+        </w:tc>
+        <w:tc>
+          <w:tcPr>
+            <w:tcW w:w="0" w:type="auto"/>
+            <w:tcBorders>
+              <w:top w:val="single" w:sz="4" w:space="0" w:color="000000"/>
+              <w:left w:val="single" w:sz="4" w:space="0" w:color="000000"/>
+              <w:bottom w:val="single" w:sz="4" w:space="0" w:color="000000"/>
+              <w:right w:val="single" w:sz="4" w:space="0" w:color="000000"/>
+            </w:tcBorders>
+            <w:tcMar>
+              <w:top w:w="0" w:type="dxa"/>
+              <w:left w:w="100" w:type="dxa"/>
+              <w:bottom w:w="0" w:type="dxa"/>
+              <w:right w:w="100" w:type="dxa"/>
+            </w:tcMar>
+            <w:hideMark/>
+          </w:tcPr>
+          <w:p>
+            <w:r>
+              <w:t>Tiếp nhận hồ sơ được chuyển đến và ghi nhận thông tin ban đầu để bắt đầu xử lý.</w:t>
+            </w:r>
+          </w:p>
+        </w:tc>
+      </w:tr>
+      <w:tr>
+        <w:trPr>
+          <w:trHeight w:val="1815"/>
+        </w:trPr>
+        <w:tc>
+          <w:tcPr>
+            <w:tcW w:w="0" w:type="auto"/>
+            <w:tcBorders>
+              <w:top w:val="single" w:sz="4" w:space="0" w:color="000000"/>
+              <w:left w:val="single" w:sz="4" w:space="0" w:color="000000"/>
+              <w:bottom w:val="single" w:sz="4" w:space="0" w:color="000000"/>
+              <w:right w:val="single" w:sz="4" w:space="0" w:color="000000"/>
+            </w:tcBorders>
+            <w:tcMar>
+              <w:top w:w="0" w:type="dxa"/>
+              <w:left w:w="100" w:type="dxa"/>
+              <w:bottom w:w="0" w:type="dxa"/>
+              <w:right w:w="100" w:type="dxa"/>
+            </w:tcMar>
+            <w:hideMark/>
+          </w:tcPr>
+          <w:p>
+            <w:r>
+              <w:t>2</w:t>
+            </w:r>
+          </w:p>
+        </w:tc>
+        <w:tc>
+          <w:tcPr>
+            <w:tcW w:w="0" w:type="auto"/>
+            <w:tcBorders>
+              <w:top w:val="single" w:sz="4" w:space="0" w:color="000000"/>
+              <w:left w:val="single" w:sz="4" w:space="0" w:color="000000"/>
+              <w:bottom w:val="single" w:sz="4" w:space="0" w:color="000000"/>
+              <w:right w:val="single" w:sz="4" w:space="0" w:color="000000"/>
+            </w:tcBorders>
+            <w:tcMar>
+              <w:top w:w="0" w:type="dxa"/>
+              <w:left w:w="100" w:type="dxa"/>
+              <w:bottom w:w="0" w:type="dxa"/>
+              <w:right w:w="100" w:type="dxa"/>
+            </w:tcMar>
+            <w:hideMark/>
+          </w:tcPr>
+          <w:p>
+            <w:r>
+              <w:t>Rà soát hồ sơ</w:t>
+            </w:r>
+          </w:p>
+        </w:tc>
+        <w:tc>
+          <w:tcPr>
+            <w:tcW w:w="0" w:type="auto"/>
+            <w:tcBorders>
+              <w:top w:val="single" w:sz="4" w:space="0" w:color="000000"/>
+              <w:left w:val="single" w:sz="4" w:space="0" w:color="000000"/>
+              <w:bottom w:val="single" w:sz="4" w:space="0" w:color="000000"/>
+              <w:right w:val="single" w:sz="4" w:space="0" w:color="000000"/>
+            </w:tcBorders>
+            <w:tcMar>
+              <w:top w:w="0" w:type="dxa"/>
+              <w:left w:w="100" w:type="dxa"/>
+              <w:bottom w:w="0" w:type="dxa"/>
+              <w:right w:w="100" w:type="dxa"/>
+            </w:tcMar>
+            <w:hideMark/>
+          </w:tcPr>
+          <w:p>
+            <w:r>
+              <w:t>1) Kiểm tra thành phần hồ sơ</w:t>
+            </w:r>
+          </w:p>
+          <w:p>
+            <w:r>
+              <w:t>2) Kiểm tra thông tin hồ sơ</w:t>
+            </w:r>
+          </w:p>
+          <w:p>
+            <w:r>
+              <w:lastRenderedPageBreak/>
+              <w:t>3) Kiểm tra điều kiện giải quyết</w:t>
+            </w:r>
+          </w:p>
+        </w:tc>
+        <w:tc>
+          <w:tcPr>
+            <w:tcW w:w="0" w:type="auto"/>
+            <w:tcBorders>
+              <w:top w:val="single" w:sz="4" w:space="0" w:color="000000"/>
+              <w:left w:val="single" w:sz="4" w:space="0" w:color="000000"/>
+              <w:bottom w:val="single" w:sz="4" w:space="0" w:color="000000"/>
+              <w:right w:val="single" w:sz="4" w:space="0" w:color="000000"/>
+            </w:tcBorders>
+            <w:tcMar>
+              <w:top w:w="0" w:type="dxa"/>
+              <w:left w:w="100" w:type="dxa"/>
+              <w:bottom w:w="0" w:type="dxa"/>
+              <w:right w:w="100" w:type="dxa"/>
+            </w:tcMar>
+            <w:hideMark/>
+          </w:tcPr>
+          <w:p>
+            <w:r>
+              <w:lastRenderedPageBreak/>
+              <w:t>Kiểm tra thành phần, thông tin và điều kiện của hồ sơ để xác định hướng xử lý tiếp theo.</w:t>
+            </w:r>
+          </w:p>
+        </w:tc>
+      </w:tr>
+      <w:tr>
+        <w:trPr>
+          <w:trHeight w:val="1815"/>
+        </w:trPr>
+        <w:tc>
+          <w:tcPr>
+            <w:tcW w:w="0" w:type="auto"/>
+            <w:tcBorders>
+              <w:top w:val="single" w:sz="4" w:space="0" w:color="000000"/>
+              <w:left w:val="single" w:sz="4" w:space="0" w:color="000000"/>
+              <w:bottom w:val="single" w:sz="4" w:space="0" w:color="000000"/>
+              <w:right w:val="single" w:sz="4" w:space="0" w:color="000000"/>
+            </w:tcBorders>
+            <w:tcMar>
+              <w:top w:w="0" w:type="dxa"/>
+              <w:left w:w="100" w:type="dxa"/>
+              <w:bottom w:w="0" w:type="dxa"/>
+              <w:right w:w="100" w:type="dxa"/>
+            </w:tcMar>
+            <w:hideMark/>
+          </w:tcPr>
+          <w:p>
+            <w:r>
+              <w:t>3</w:t>
+            </w:r>
+          </w:p>
+        </w:tc>
+        <w:tc>
+          <w:tcPr>
+            <w:tcW w:w="0" w:type="auto"/>
+            <w:tcBorders>
+              <w:top w:val="single" w:sz="4" w:space="0" w:color="000000"/>
+              <w:left w:val="single" w:sz="4" w:space="0" w:color="000000"/>
+              <w:bottom w:val="single" w:sz="4" w:space="0" w:color="000000"/>
+              <w:right w:val="single" w:sz="4" w:space="0" w:color="000000"/>
+            </w:tcBorders>
+            <w:tcMar>
+              <w:top w:w="0" w:type="dxa"/>
+              <w:left w:w="100" w:type="dxa"/>
+              <w:bottom w:w="0" w:type="dxa"/>
+              <w:right w:w="100" w:type="dxa"/>
+            </w:tcMar>
+            <w:hideMark/>
+          </w:tcPr>
+          <w:p>
+            <w:r>
+              <w:t>Yêu cầu bổ sung hồ sơ</w:t>
+            </w:r>
+          </w:p>
+        </w:tc>
+        <w:tc>
+          <w:tcPr>
+            <w:tcW w:w="0" w:type="auto"/>
+            <w:tcBorders>
+              <w:top w:val="single" w:sz="4" w:space="0" w:color="000000"/>
+              <w:left w:val="single" w:sz="4" w:space="0" w:color="000000"/>
+              <w:bottom w:val="single" w:sz="4" w:space="0" w:color="000000"/>
+              <w:right w:val="single" w:sz="4" w:space="0" w:color="000000"/>
+            </w:tcBorders>
+            <w:tcMar>
+              <w:top w:w="0" w:type="dxa"/>
+              <w:left w:w="100" w:type="dxa"/>
+              <w:bottom w:w="0" w:type="dxa"/>
+              <w:right w:w="100" w:type="dxa"/>
+            </w:tcMar>
+            <w:hideMark/>
+          </w:tcPr>
+          <w:p>
+            <w:r>
+              <w:t>1) Xác định nội dung còn thiếu</w:t>
+            </w:r>
+          </w:p>
+          <w:p>
+            <w:r>
+              <w:t>2) Lập yêu cầu bổ sung</w:t>
+            </w:r>
+          </w:p>
+          <w:p>
+            <w:r>
+              <w:t>3) Gửi yêu cầu bổ sung</w:t>
+            </w:r>
+          </w:p>
+        </w:tc>
+        <w:tc>
+          <w:tcPr>
+            <w:tcW w:w="0" w:type="auto"/>
+            <w:tcBorders>
+              <w:top w:val="single" w:sz="4" w:space="0" w:color="000000"/>
+              <w:left w:val="single" w:sz="4" w:space="0" w:color="000000"/>
+              <w:bottom w:val="single" w:sz="4" w:space="0" w:color="000000"/>
+              <w:right w:val="single" w:sz="4" w:space="0" w:color="000000"/>
+            </w:tcBorders>
+            <w:tcMar>
+              <w:top w:w="0" w:type="dxa"/>
+              <w:left w:w="100" w:type="dxa"/>
+              <w:bottom w:w="0" w:type="dxa"/>
+              <w:right w:w="100" w:type="dxa"/>
+            </w:tcMar>
+            <w:hideMark/>
+          </w:tcPr>
+          <w:p>
+            <w:r>
+              <w:t>Xác định nội dung còn thiếu hoặc chưa phù hợp và gửi yêu cầu bổ sung cho người nộp.</w:t>
+            </w:r>
+          </w:p>
+        </w:tc>
+      </w:tr>
+      <w:tr>
+        <w:trPr>
+          <w:trHeight w:val="1515"/>
+        </w:trPr>
+        <w:tc>
+          <w:tcPr>
+            <w:tcW w:w="0" w:type="auto"/>
+            <w:tcBorders>
+              <w:top w:val="single" w:sz="4" w:space="0" w:color="000000"/>
+              <w:left w:val="single" w:sz="4" w:space="0" w:color="000000"/>
+              <w:bottom w:val="single" w:sz="4" w:space="0" w:color="000000"/>
+              <w:right w:val="single" w:sz="4" w:space="0" w:color="000000"/>
+            </w:tcBorders>
+            <w:tcMar>
+              <w:top w:w="0" w:type="dxa"/>
+              <w:left w:w="100" w:type="dxa"/>
+              <w:bottom w:w="0" w:type="dxa"/>
+              <w:right w:w="100" w:type="dxa"/>
+            </w:tcMar>
+            <w:hideMark/>
+          </w:tcPr>
+          <w:p>
+            <w:r>
+              <w:t>4</w:t>
+            </w:r>
+          </w:p>
+        </w:tc>
+        <w:tc>
+          <w:tcPr>
+            <w:tcW w:w="0" w:type="auto"/>
+            <w:tcBorders>
+              <w:top w:val="single" w:sz="4" w:space="0" w:color="000000"/>
+              <w:left w:val="single" w:sz="4" w:space="0" w:color="000000"/>
+              <w:bottom w:val="single" w:sz="4" w:space="0" w:color="000000"/>
+              <w:right w:val="single" w:sz="4" w:space="0" w:color="000000"/>
+            </w:tcBorders>
+            <w:tcMar>
+              <w:top w:w="0" w:type="dxa"/>
+              <w:left w:w="100" w:type="dxa"/>
+              <w:bottom w:w="0" w:type="dxa"/>
+              <w:right w:w="100" w:type="dxa"/>
+            </w:tcMar>
+            <w:hideMark/>
+          </w:tcPr>
+          <w:p>
+            <w:r>
+              <w:t>Bổ sung hồ sơ theo yêu cầu của chuyên viên</w:t>
+            </w:r>
+          </w:p>
+        </w:tc>
+        <w:tc>
+          <w:tcPr>
+            <w:tcW w:w="0" w:type="auto"/>
+            <w:tcBorders>
+              <w:top w:val="single" w:sz="4" w:space="0" w:color="000000"/>
+              <w:left w:val="single" w:sz="4" w:space="0" w:color="000000"/>
+              <w:bottom w:val="single" w:sz="4" w:space="0" w:color="000000"/>
+              <w:right w:val="single" w:sz="4" w:space="0" w:color="000000"/>
+            </w:tcBorders>
+            <w:tcMar>
+              <w:top w:w="0" w:type="dxa"/>
+              <w:left w:w="100" w:type="dxa"/>
+              <w:bottom w:w="0" w:type="dxa"/>
+              <w:right w:w="100" w:type="dxa"/>
+            </w:tcMar>
+            <w:hideMark/>
+          </w:tcPr>
+          <w:p>
+            <w:r>
+              <w:t>1) Tiếp nhận yêu cầu bổ sung</w:t>
+            </w:r>
+          </w:p>
+          <w:p>
+            <w:r>
+              <w:t>2) Chuẩn bị tài liệu bổ sung</w:t>
+            </w:r>
+          </w:p>
+          <w:p>
+            <w:r>
+              <w:t>3) Gửi lại hồ sơ bổ sung</w:t>
+            </w:r>
+          </w:p>
+        </w:tc>
+        <w:tc>
+          <w:tcPr>
+            <w:tcW w:w="0" w:type="auto"/>
+            <w:tcBorders>
+              <w:top w:val="single" w:sz="4" w:space="0" w:color="000000"/>
+              <w:left w:val="single" w:sz="4" w:space="0" w:color="000000"/>
+              <w:bottom w:val="single" w:sz="4" w:space="0" w:color="000000"/>
+              <w:right w:val="single" w:sz="4" w:space="0" w:color="000000"/>
+            </w:tcBorders>
+            <w:tcMar>
+              <w:top w:w="0" w:type="dxa"/>
+              <w:left w:w="100" w:type="dxa"/>
+              <w:bottom w:w="0" w:type="dxa"/>
+              <w:right w:w="100" w:type="dxa"/>
+            </w:tcMar>
+            <w:hideMark/>
+          </w:tcPr>
+          <w:p>
+            <w:r>
+              <w:t>Người nộp hoàn thiện các thông tin, giấy tờ còn thiếu và gửi lại hồ sơ theo yêu cầu.</w:t>
+            </w:r>
+          </w:p>
+        </w:tc>
+      </w:tr>
+      <w:tr>
+        <w:trPr>
+          <w:trHeight w:val="1815"/>
+        </w:trPr>
+        <w:tc>
+          <w:tcPr>
+            <w:tcW w:w="0" w:type="auto"/>
+            <w:tcBorders>
+              <w:top w:val="single" w:sz="4" w:space="0" w:color="000000"/>
+              <w:left w:val="single" w:sz="4" w:space="0" w:color="000000"/>
+              <w:bottom w:val="single" w:sz="4" w:space="0" w:color="000000"/>
+              <w:right w:val="single" w:sz="4" w:space="0" w:color="000000"/>
+            </w:tcBorders>
+            <w:tcMar>
+              <w:top w:w="0" w:type="dxa"/>
+              <w:left w:w="100" w:type="dxa"/>
+              <w:bottom w:w="0" w:type="dxa"/>
+              <w:right w:w="100" w:type="dxa"/>
+            </w:tcMar>
+            <w:hideMark/>
+          </w:tcPr>
+          <w:p>
+            <w:r>
+              <w:t>5</w:t>
+            </w:r>
+          </w:p>
+        </w:tc>
+        <w:tc>
+          <w:tcPr>
+            <w:tcW w:w="0" w:type="auto"/>
+            <w:tcBorders>
+              <w:top w:val="single" w:sz="4" w:space="0" w:color="000000"/>
+              <w:left w:val="single" w:sz="4" w:space="0" w:color="000000"/>
+              <w:bottom w:val="single" w:sz="4" w:space="0" w:color="000000"/>
+              <w:right w:val="single" w:sz="4" w:space="0" w:color="000000"/>
+            </w:tcBorders>
+            <w:tcMar>
+              <w:top w:w="0" w:type="dxa"/>
+              <w:left w:w="100" w:type="dxa"/>
+              <w:bottom w:w="0" w:type="dxa"/>
+              <w:right w:w="100" w:type="dxa"/>
+            </w:tcMar>
+            <w:hideMark/>
+          </w:tcPr>
+          <w:p>
+            <w:r>
+              <w:t>Từ chối xử lý hồ sơ</w:t>
+            </w:r>
+          </w:p>
+        </w:tc>
+        <w:tc>
+          <w:tcPr>
+            <w:tcW w:w="0" w:type="auto"/>
+            <w:tcBorders>
+              <w:top w:val="single" w:sz="4" w:space="0" w:color="000000"/>
+              <w:left w:val="single" w:sz="4" w:space="0" w:color="000000"/>
+              <w:bottom w:val="single" w:sz="4" w:space="0" w:color="000000"/>
+              <w:right w:val="single" w:sz="4" w:space="0" w:color="000000"/>
+            </w:tcBorders>
+            <w:tcMar>
+              <w:top w:w="0" w:type="dxa"/>
+              <w:left w:w="100" w:type="dxa"/>
+              <w:bottom w:w="0" w:type="dxa"/>
+              <w:right w:w="100" w:type="dxa"/>
+            </w:tcMar>
+            <w:hideMark/>
+          </w:tcPr>
+          <w:p>
+            <w:r>
+              <w:t>1) Xác định lý do từ chối</w:t>
+            </w:r>
+          </w:p>
+          <w:p>
+            <w:r>
+              <w:t>2) Lập nội dung từ chối</w:t>
+            </w:r>
+          </w:p>
+          <w:p>
+            <w:r>
+              <w:t>3) Thông báo kết quả từ chối</w:t>
+            </w:r>
+          </w:p>
+        </w:tc>
+        <w:tc>
+          <w:tcPr>
+            <w:tcW w:w="0" w:type="auto"/>
+            <w:tcBorders>
+              <w:top w:val="single" w:sz="4" w:space="0" w:color="000000"/>
+              <w:left w:val="single" w:sz="4" w:space="0" w:color="000000"/>
+              <w:bottom w:val="single" w:sz="4" w:space="0" w:color="000000"/>
+              <w:right w:val="single" w:sz="4" w:space="0" w:color="000000"/>
+            </w:tcBorders>
+            <w:tcMar>
+              <w:top w:w="0" w:type="dxa"/>
+              <w:left w:w="100" w:type="dxa"/>
+              <w:bottom w:w="0" w:type="dxa"/>
+              <w:right w:w="100" w:type="dxa"/>
+            </w:tcMar>
+            <w:hideMark/>
+          </w:tcPr>
+          <w:p>
+            <w:r>
+              <w:t>Thực hiện từ chối khi hồ sơ không đáp ứng điều kiện giải quyết và thông báo lý do cho người nộp.</w:t>
+            </w:r>
+          </w:p>
+        </w:tc>
+      </w:tr>
+      <w:tr>
+        <w:trPr>
+          <w:trHeight w:val="1815"/>
+        </w:trPr>
+        <w:tc>
+          <w:tcPr>
+            <w:tcW w:w="0" w:type="auto"/>
+            <w:tcBorders>
+              <w:top w:val="single" w:sz="4" w:space="0" w:color="000000"/>
+              <w:left w:val="single" w:sz="4" w:space="0" w:color="000000"/>
+              <w:bottom w:val="single" w:sz="4" w:space="0" w:color="000000"/>
+              <w:right w:val="single" w:sz="4" w:space="0" w:color="000000"/>
+            </w:tcBorders>
+            <w:tcMar>
+              <w:top w:w="0" w:type="dxa"/>
+              <w:left w:w="100" w:type="dxa"/>
+              <w:bottom w:w="0" w:type="dxa"/>
+              <w:right w:w="100" w:type="dxa"/>
+            </w:tcMar>
+            <w:hideMark/>
+          </w:tcPr>
+          <w:p>
+            <w:r>
+              <w:t>6</w:t>
+            </w:r>
+          </w:p>
+        </w:tc>
+        <w:tc>
+          <w:tcPr>
+            <w:tcW w:w="0" w:type="auto"/>
+            <w:tcBorders>
+              <w:top w:val="single" w:sz="4" w:space="0" w:color="000000"/>
+              <w:left w:val="single" w:sz="4" w:space="0" w:color="000000"/>
+              <w:bottom w:val="single" w:sz="4" w:space="0" w:color="000000"/>
+              <w:right w:val="single" w:sz="4" w:space="0" w:color="000000"/>
+            </w:tcBorders>
+            <w:tcMar>
+              <w:top w:w="0" w:type="dxa"/>
+              <w:left w:w="100" w:type="dxa"/>
+              <w:bottom w:w="0" w:type="dxa"/>
+              <w:right w:w="100" w:type="dxa"/>
+            </w:tcMar>
+            <w:hideMark/>
+          </w:tcPr>
+          <w:p>
+            <w:r>
+              <w:t>Thẩm định hồ sơ</w:t>
+            </w:r>
+          </w:p>
+        </w:tc>
+        <w:tc>
+          <w:tcPr>
+            <w:tcW w:w="0" w:type="auto"/>
+            <w:tcBorders>
+              <w:top w:val="single" w:sz="4" w:space="0" w:color="000000"/>
+              <w:left w:val="single" w:sz="4" w:space="0" w:color="000000"/>
+              <w:bottom w:val="single" w:sz="4" w:space="0" w:color="000000"/>
+              <w:right w:val="single" w:sz="4" w:space="0" w:color="000000"/>
+            </w:tcBorders>
+            <w:tcMar>
+              <w:top w:w="0" w:type="dxa"/>
+              <w:left w:w="100" w:type="dxa"/>
+              <w:bottom w:w="0" w:type="dxa"/>
+              <w:right w:w="100" w:type="dxa"/>
+            </w:tcMar>
+            <w:hideMark/>
+          </w:tcPr>
+          <w:p>
+            <w:r>
+              <w:t>1) Đối chiếu hồ sơ với quy định</w:t>
+            </w:r>
+          </w:p>
+          <w:p>
+            <w:r>
+              <w:t>2) Thẩm định nội dung chuyên môn</w:t>
+            </w:r>
+          </w:p>
+          <w:p>
+            <w:r>
+              <w:t>3) Ghi nhận kết quả thẩm định</w:t>
+            </w:r>
+          </w:p>
+        </w:tc>
+        <w:tc>
+          <w:tcPr>
+            <w:tcW w:w="0" w:type="auto"/>
+            <w:tcBorders>
+              <w:top w:val="single" w:sz="4" w:space="0" w:color="000000"/>
+              <w:left w:val="single" w:sz="4" w:space="0" w:color="000000"/>
+              <w:bottom w:val="single" w:sz="4" w:space="0" w:color="000000"/>
+              <w:right w:val="single" w:sz="4" w:space="0" w:color="000000"/>
+            </w:tcBorders>
+            <w:tcMar>
+              <w:top w:w="0" w:type="dxa"/>
+              <w:left w:w="100" w:type="dxa"/>
+              <w:bottom w:w="0" w:type="dxa"/>
+              <w:right w:w="100" w:type="dxa"/>
+            </w:tcMar>
+            <w:hideMark/>
+          </w:tcPr>
+          <w:p>
+            <w:r>
+              <w:t>Kiểm tra, đánh giá nội dung chuyên môn và tính phù hợp của hồ sơ theo quy định.</w:t>
+            </w:r>
+          </w:p>
+        </w:tc>
+      </w:tr>
+      <w:tr>
+        <w:trPr>
+          <w:trHeight w:val="1515"/>
+        </w:trPr>
+        <w:tc>
+          <w:tcPr>
+            <w:tcW w:w="0" w:type="auto"/>
+            <w:tcBorders>
+              <w:top w:val="single" w:sz="4" w:space="0" w:color="000000"/>
+              <w:left w:val="single" w:sz="4" w:space="0" w:color="000000"/>
+              <w:bottom w:val="single" w:sz="4" w:space="0" w:color="000000"/>
+              <w:right w:val="single" w:sz="4" w:space="0" w:color="000000"/>
+            </w:tcBorders>
+            <w:tcMar>
+              <w:top w:w="0" w:type="dxa"/>
+              <w:left w:w="100" w:type="dxa"/>
+              <w:bottom w:w="0" w:type="dxa"/>
+              <w:right w:w="100" w:type="dxa"/>
+            </w:tcMar>
+            <w:hideMark/>
+          </w:tcPr>
+          <w:p>
+            <w:r>
+              <w:lastRenderedPageBreak/>
+              <w:t>7</w:t>
+            </w:r>
+          </w:p>
+        </w:tc>
+        <w:tc>
+          <w:tcPr>
+            <w:tcW w:w="0" w:type="auto"/>
+            <w:tcBorders>
+              <w:top w:val="single" w:sz="4" w:space="0" w:color="000000"/>
+              <w:left w:val="single" w:sz="4" w:space="0" w:color="000000"/>
+              <w:bottom w:val="single" w:sz="4" w:space="0" w:color="000000"/>
+              <w:right w:val="single" w:sz="4" w:space="0" w:color="000000"/>
+            </w:tcBorders>
+            <w:tcMar>
+              <w:top w:w="0" w:type="dxa"/>
+              <w:left w:w="100" w:type="dxa"/>
+              <w:bottom w:w="0" w:type="dxa"/>
+              <w:right w:w="100" w:type="dxa"/>
+            </w:tcMar>
+            <w:hideMark/>
+          </w:tcPr>
+          <w:p>
+            <w:r>
+              <w:t>Chuyển hồ sơ sang phần mềm chuyên ngành</w:t>
+            </w:r>
+          </w:p>
+        </w:tc>
+        <w:tc>
+          <w:tcPr>
+            <w:tcW w:w="0" w:type="auto"/>
+            <w:tcBorders>
+              <w:top w:val="single" w:sz="4" w:space="0" w:color="000000"/>
+              <w:left w:val="single" w:sz="4" w:space="0" w:color="000000"/>
+              <w:bottom w:val="single" w:sz="4" w:space="0" w:color="000000"/>
+              <w:right w:val="single" w:sz="4" w:space="0" w:color="000000"/>
+            </w:tcBorders>
+            <w:tcMar>
+              <w:top w:w="0" w:type="dxa"/>
+              <w:left w:w="100" w:type="dxa"/>
+              <w:bottom w:w="0" w:type="dxa"/>
+              <w:right w:w="100" w:type="dxa"/>
+            </w:tcMar>
+            <w:hideMark/>
+          </w:tcPr>
+          <w:p>
+            <w:r>
+              <w:t>1) Chuẩn bị dữ liệu chuyển</w:t>
+            </w:r>
+          </w:p>
+          <w:p>
+            <w:r>
+              <w:t>2) Gửi hồ sơ sang hệ thống chuyên ngành</w:t>
+            </w:r>
+          </w:p>
+          <w:p>
+            <w:r>
+              <w:t>3) Ghi nhận việc chuyển hồ sơ</w:t>
+            </w:r>
+          </w:p>
+        </w:tc>
+        <w:tc>
+          <w:tcPr>
+            <w:tcW w:w="0" w:type="auto"/>
+            <w:tcBorders>
+              <w:top w:val="single" w:sz="4" w:space="0" w:color="000000"/>
+              <w:left w:val="single" w:sz="4" w:space="0" w:color="000000"/>
+              <w:bottom w:val="single" w:sz="4" w:space="0" w:color="000000"/>
+              <w:right w:val="single" w:sz="4" w:space="0" w:color="000000"/>
+            </w:tcBorders>
+            <w:tcMar>
+              <w:top w:w="0" w:type="dxa"/>
+              <w:left w:w="100" w:type="dxa"/>
+              <w:bottom w:w="0" w:type="dxa"/>
+              <w:right w:w="100" w:type="dxa"/>
+            </w:tcMar>
+            <w:hideMark/>
+          </w:tcPr>
+          <w:p>
+            <w:r>
+              <w:t>Chuyển thông tin và dữ liệu hồ sơ sang hệ thống chuyên ngành để tiếp tục xử lý.</w:t>
+            </w:r>
+          </w:p>
+        </w:tc>
+      </w:tr>
+      <w:tr>
+        <w:trPr>
+          <w:trHeight w:val="1815"/>
+        </w:trPr>
+        <w:tc>
+          <w:tcPr>
+            <w:tcW w:w="0" w:type="auto"/>
+            <w:tcBorders>
+              <w:top w:val="single" w:sz="4" w:space="0" w:color="000000"/>
+              <w:left w:val="single" w:sz="4" w:space="0" w:color="000000"/>
+              <w:bottom w:val="single" w:sz="4" w:space="0" w:color="000000"/>
+              <w:right w:val="single" w:sz="4" w:space="0" w:color="000000"/>
+            </w:tcBorders>
+            <w:tcMar>
+              <w:top w:w="0" w:type="dxa"/>
+              <w:left w:w="100" w:type="dxa"/>
+              <w:bottom w:w="0" w:type="dxa"/>
+              <w:right w:w="100" w:type="dxa"/>
+            </w:tcMar>
+            <w:hideMark/>
+          </w:tcPr>
+          <w:p>
+            <w:r>
+              <w:t>8</w:t>
+            </w:r>
+          </w:p>
+        </w:tc>
+        <w:tc>
+          <w:tcPr>
+            <w:tcW w:w="0" w:type="auto"/>
+            <w:tcBorders>
+              <w:top w:val="single" w:sz="4" w:space="0" w:color="000000"/>
+              <w:left w:val="single" w:sz="4" w:space="0" w:color="000000"/>
+              <w:bottom w:val="single" w:sz="4" w:space="0" w:color="000000"/>
+              <w:right w:val="single" w:sz="4" w:space="0" w:color="000000"/>
+            </w:tcBorders>
+            <w:tcMar>
+              <w:top w:w="0" w:type="dxa"/>
+              <w:left w:w="100" w:type="dxa"/>
+              <w:bottom w:w="0" w:type="dxa"/>
+              <w:right w:w="100" w:type="dxa"/>
+            </w:tcMar>
+            <w:hideMark/>
+          </w:tcPr>
+          <w:p>
+            <w:r>
+              <w:t>Bóc tách dữ liệu hồ sơ</w:t>
+            </w:r>
+          </w:p>
+        </w:tc>
+        <w:tc>
+          <w:tcPr>
+            <w:tcW w:w="0" w:type="auto"/>
+            <w:tcBorders>
+              <w:top w:val="single" w:sz="4" w:space="0" w:color="000000"/>
+              <w:left w:val="single" w:sz="4" w:space="0" w:color="000000"/>
+              <w:bottom w:val="single" w:sz="4" w:space="0" w:color="000000"/>
+              <w:right w:val="single" w:sz="4" w:space="0" w:color="000000"/>
+            </w:tcBorders>
+            <w:tcMar>
+              <w:top w:w="0" w:type="dxa"/>
+              <w:left w:w="100" w:type="dxa"/>
+              <w:bottom w:w="0" w:type="dxa"/>
+              <w:right w:w="100" w:type="dxa"/>
+            </w:tcMar>
+            <w:hideMark/>
+          </w:tcPr>
+          <w:p>
+            <w:r>
+              <w:t>1) Đọc dữ liệu hồ sơ</w:t>
+            </w:r>
+          </w:p>
+          <w:p>
+            <w:r>
+              <w:t>2) Trích xuất thông tin cần thiết</w:t>
+            </w:r>
+          </w:p>
+          <w:p>
+            <w:r>
+              <w:t>3) Chuẩn hóa dữ liệu</w:t>
+            </w:r>
+          </w:p>
+        </w:tc>
+        <w:tc>
+          <w:tcPr>
+            <w:tcW w:w="0" w:type="auto"/>
+            <w:tcBorders>
+              <w:top w:val="single" w:sz="4" w:space="0" w:color="000000"/>
+              <w:left w:val="single" w:sz="4" w:space="0" w:color="000000"/>
+              <w:bottom w:val="single" w:sz="4" w:space="0" w:color="000000"/>
+              <w:right w:val="single" w:sz="4" w:space="0" w:color="000000"/>
+            </w:tcBorders>
+            <w:tcMar>
+              <w:top w:w="0" w:type="dxa"/>
+              <w:left w:w="100" w:type="dxa"/>
+              <w:bottom w:w="0" w:type="dxa"/>
+              <w:right w:w="100" w:type="dxa"/>
+            </w:tcMar>
+            <w:hideMark/>
+          </w:tcPr>
+          <w:p>
+            <w:r>
+              <w:t>Trích xuất và chuẩn hóa các thông tin cần thiết từ hồ sơ phục vụ xử lý chuyên ngành.</w:t>
+            </w:r>
+          </w:p>
+        </w:tc>
+      </w:tr>
+      <w:tr>
+        <w:trPr>
+          <w:trHeight w:val="1815"/>
+        </w:trPr>
+        <w:tc>
+          <w:tcPr>
+            <w:tcW w:w="0" w:type="auto"/>
+            <w:tcBorders>
+              <w:top w:val="single" w:sz="4" w:space="0" w:color="000000"/>
+              <w:left w:val="single" w:sz="4" w:space="0" w:color="000000"/>
+              <w:bottom w:val="single" w:sz="4" w:space="0" w:color="000000"/>
+              <w:right w:val="single" w:sz="4" w:space="0" w:color="000000"/>
+            </w:tcBorders>
+            <w:tcMar>
+              <w:top w:w="0" w:type="dxa"/>
+              <w:left w:w="100" w:type="dxa"/>
+              <w:bottom w:w="0" w:type="dxa"/>
+              <w:right w:w="100" w:type="dxa"/>
+            </w:tcMar>
+            <w:hideMark/>
+          </w:tcPr>
+          <w:p>
+            <w:r>
+              <w:t>9</w:t>
+            </w:r>
+          </w:p>
+        </w:tc>
+        <w:tc>
+          <w:tcPr>
+            <w:tcW w:w="0" w:type="auto"/>
+            <w:tcBorders>
+              <w:top w:val="single" w:sz="4" w:space="0" w:color="000000"/>
+              <w:left w:val="single" w:sz="4" w:space="0" w:color="000000"/>
+              <w:bottom w:val="single" w:sz="4" w:space="0" w:color="000000"/>
+              <w:right w:val="single" w:sz="4" w:space="0" w:color="000000"/>
+            </w:tcBorders>
+            <w:tcMar>
+              <w:top w:w="0" w:type="dxa"/>
+              <w:left w:w="100" w:type="dxa"/>
+              <w:bottom w:w="0" w:type="dxa"/>
+              <w:right w:w="100" w:type="dxa"/>
+            </w:tcMar>
+            <w:hideMark/>
+          </w:tcPr>
+          <w:p>
+            <w:r>
+              <w:t>Tiếp nhận hồ sơ tại Bộ/ngành</w:t>
+            </w:r>
+          </w:p>
+        </w:tc>
+        <w:tc>
+          <w:tcPr>
+            <w:tcW w:w="0" w:type="auto"/>
+            <w:tcBorders>
+              <w:top w:val="single" w:sz="4" w:space="0" w:color="000000"/>
+              <w:left w:val="single" w:sz="4" w:space="0" w:color="000000"/>
+              <w:bottom w:val="single" w:sz="4" w:space="0" w:color="000000"/>
+              <w:right w:val="single" w:sz="4" w:space="0" w:color="000000"/>
+            </w:tcBorders>
+            <w:tcMar>
+              <w:top w:w="0" w:type="dxa"/>
+              <w:left w:w="100" w:type="dxa"/>
+              <w:bottom w:w="0" w:type="dxa"/>
+              <w:right w:w="100" w:type="dxa"/>
+            </w:tcMar>
+            <w:hideMark/>
+          </w:tcPr>
+          <w:p>
+            <w:r>
+              <w:t>1) Nhận hồ sơ điện tử</w:t>
+            </w:r>
+          </w:p>
+          <w:p>
+            <w:r>
+              <w:t>2) Ghi nhận hồ sơ trên hệ thống</w:t>
+            </w:r>
+          </w:p>
+          <w:p>
+            <w:r>
+              <w:t>3) Kiểm tra dữ liệu tiếp nhận</w:t>
+            </w:r>
+          </w:p>
+        </w:tc>
+        <w:tc>
+          <w:tcPr>
+            <w:tcW w:w="0" w:type="auto"/>
+            <w:tcBorders>
+              <w:top w:val="single" w:sz="4" w:space="0" w:color="000000"/>
+              <w:left w:val="single" w:sz="4" w:space="0" w:color="000000"/>
+              <w:bottom w:val="single" w:sz="4" w:space="0" w:color="000000"/>
+              <w:right w:val="single" w:sz="4" w:space="0" w:color="000000"/>
+            </w:tcBorders>
+            <w:tcMar>
+              <w:top w:w="0" w:type="dxa"/>
+              <w:left w:w="100" w:type="dxa"/>
+              <w:bottom w:w="0" w:type="dxa"/>
+              <w:right w:w="100" w:type="dxa"/>
+            </w:tcMar>
+            <w:hideMark/>
+          </w:tcPr>
+          <w:p>
+            <w:r>
+              <w:t>Hệ thống hoặc cơ quan chuyên ngành tiếp nhận hồ sơ được chuyển đến và ghi nhận để xử lý.</w:t>
+            </w:r>
+          </w:p>
+        </w:tc>
+      </w:tr>
+      <w:tr>
+        <w:trPr>
+          <w:trHeight w:val="1815"/>
+        </w:trPr>
+        <w:tc>
+          <w:tcPr>
+            <w:tcW w:w="0" w:type="auto"/>
+            <w:tcBorders>
+              <w:top w:val="single" w:sz="4" w:space="0" w:color="000000"/>
+              <w:left w:val="single" w:sz="4" w:space="0" w:color="000000"/>
+              <w:bottom w:val="single" w:sz="4" w:space="0" w:color="000000"/>
+              <w:right w:val="single" w:sz="4" w:space="0" w:color="000000"/>
+            </w:tcBorders>
+            <w:tcMar>
+              <w:top w:w="0" w:type="dxa"/>
+              <w:left w:w="100" w:type="dxa"/>
+              <w:bottom w:w="0" w:type="dxa"/>
+              <w:right w:w="100" w:type="dxa"/>
+            </w:tcMar>
+            <w:hideMark/>
+          </w:tcPr>
+          <w:p>
+            <w:r>
+              <w:t>10</w:t>
+            </w:r>
+          </w:p>
+        </w:tc>
+        <w:tc>
+          <w:tcPr>
+            <w:tcW w:w="0" w:type="auto"/>
+            <w:tcBorders>
+              <w:top w:val="single" w:sz="4" w:space="0" w:color="000000"/>
+              <w:left w:val="single" w:sz="4" w:space="0" w:color="000000"/>
+              <w:bottom w:val="single" w:sz="4" w:space="0" w:color="000000"/>
+              <w:right w:val="single" w:sz="4" w:space="0" w:color="000000"/>
+            </w:tcBorders>
+            <w:tcMar>
+              <w:top w:w="0" w:type="dxa"/>
+              <w:left w:w="100" w:type="dxa"/>
+              <w:bottom w:w="0" w:type="dxa"/>
+              <w:right w:w="100" w:type="dxa"/>
+            </w:tcMar>
+            <w:hideMark/>
+          </w:tcPr>
+          <w:p>
+            <w:r>
+              <w:t>Yêu cầu bổ sung hồ sơ chuyên ngành</w:t>
+            </w:r>
+          </w:p>
+        </w:tc>
+        <w:tc>
+          <w:tcPr>
+            <w:tcW w:w="0" w:type="auto"/>
+            <w:tcBorders>
+              <w:top w:val="single" w:sz="4" w:space="0" w:color="000000"/>
+              <w:left w:val="single" w:sz="4" w:space="0" w:color="000000"/>
+              <w:bottom w:val="single" w:sz="4" w:space="0" w:color="000000"/>
+              <w:right w:val="single" w:sz="4" w:space="0" w:color="000000"/>
+            </w:tcBorders>
+            <w:tcMar>
+              <w:top w:w="0" w:type="dxa"/>
+              <w:left w:w="100" w:type="dxa"/>
+              <w:bottom w:w="0" w:type="dxa"/>
+              <w:right w:w="100" w:type="dxa"/>
+            </w:tcMar>
+            <w:hideMark/>
+          </w:tcPr>
+          <w:p>
+            <w:r>
+              <w:t>1) Xác định thông tin còn thiếu</w:t>
+            </w:r>
+          </w:p>
+          <w:p>
+            <w:r>
+              <w:t>2) Tạo yêu cầu bổ sung</w:t>
+            </w:r>
+          </w:p>
+          <w:p>
+            <w:r>
+              <w:t>3) Gửi yêu cầu bổ sung</w:t>
+            </w:r>
+          </w:p>
+        </w:tc>
+        <w:tc>
+          <w:tcPr>
+            <w:tcW w:w="0" w:type="auto"/>
+            <w:tcBorders>
+              <w:top w:val="single" w:sz="4" w:space="0" w:color="000000"/>
+              <w:left w:val="single" w:sz="4" w:space="0" w:color="000000"/>
+              <w:bottom w:val="single" w:sz="4" w:space="0" w:color="000000"/>
+              <w:right w:val="single" w:sz="4" w:space="0" w:color="000000"/>
+            </w:tcBorders>
+            <w:tcMar>
+              <w:top w:w="0" w:type="dxa"/>
+              <w:left w:w="100" w:type="dxa"/>
+              <w:bottom w:w="0" w:type="dxa"/>
+              <w:right w:w="100" w:type="dxa"/>
+            </w:tcMar>
+            <w:hideMark/>
+          </w:tcPr>
+          <w:p>
+            <w:r>
+              <w:t>Xác định các thông tin còn thiếu theo yêu cầu chuyên ngành và gửi yêu cầu bổ sung.</w:t>
+            </w:r>
+          </w:p>
+        </w:tc>
+      </w:tr>
+      <w:tr>
+        <w:trPr>
+          <w:trHeight w:val="1815"/>
+        </w:trPr>
+        <w:tc>
+          <w:tcPr>
+            <w:tcW w:w="0" w:type="auto"/>
+            <w:tcBorders>
+              <w:top w:val="single" w:sz="4" w:space="0" w:color="000000"/>
+              <w:left w:val="single" w:sz="4" w:space="0" w:color="000000"/>
+              <w:bottom w:val="single" w:sz="4" w:space="0" w:color="000000"/>
+              <w:right w:val="single" w:sz="4" w:space="0" w:color="000000"/>
+            </w:tcBorders>
+            <w:tcMar>
+              <w:top w:w="0" w:type="dxa"/>
+              <w:left w:w="100" w:type="dxa"/>
+              <w:bottom w:w="0" w:type="dxa"/>
+              <w:right w:w="100" w:type="dxa"/>
+            </w:tcMar>
+            <w:hideMark/>
+          </w:tcPr>
+          <w:p>
+            <w:r>
+              <w:t>11</w:t>
+            </w:r>
+          </w:p>
+        </w:tc>
+        <w:tc>
+          <w:tcPr>
+            <w:tcW w:w="0" w:type="auto"/>
+            <w:tcBorders>
+              <w:top w:val="single" w:sz="4" w:space="0" w:color="000000"/>
+              <w:left w:val="single" w:sz="4" w:space="0" w:color="000000"/>
+              <w:bottom w:val="single" w:sz="4" w:space="0" w:color="000000"/>
+              <w:right w:val="single" w:sz="4" w:space="0" w:color="000000"/>
+            </w:tcBorders>
+            <w:tcMar>
+              <w:top w:w="0" w:type="dxa"/>
+              <w:left w:w="100" w:type="dxa"/>
+              <w:bottom w:w="0" w:type="dxa"/>
+              <w:right w:w="100" w:type="dxa"/>
+            </w:tcMar>
+            <w:hideMark/>
+          </w:tcPr>
+          <w:p>
+            <w:r>
+              <w:t>Bổ sung hồ sơ theo yêu cầu phần mềm chuyên ngành</w:t>
+            </w:r>
+          </w:p>
+        </w:tc>
+        <w:tc>
+          <w:tcPr>
+            <w:tcW w:w="0" w:type="auto"/>
+            <w:tcBorders>
+              <w:top w:val="single" w:sz="4" w:space="0" w:color="000000"/>
+              <w:left w:val="single" w:sz="4" w:space="0" w:color="000000"/>
+              <w:bottom w:val="single" w:sz="4" w:space="0" w:color="000000"/>
+              <w:right w:val="single" w:sz="4" w:space="0" w:color="000000"/>
+            </w:tcBorders>
+            <w:tcMar>
+              <w:top w:w="0" w:type="dxa"/>
+              <w:left w:w="100" w:type="dxa"/>
+              <w:bottom w:w="0" w:type="dxa"/>
+              <w:right w:w="100" w:type="dxa"/>
+            </w:tcMar>
+            <w:hideMark/>
+          </w:tcPr>
+          <w:p>
+            <w:r>
+              <w:t>1) Tiếp nhận yêu cầu</w:t>
+            </w:r>
+          </w:p>
+          <w:p>
+            <w:r>
+              <w:t>2) Bổ sung thông tin/tài liệu</w:t>
+            </w:r>
+          </w:p>
+          <w:p>
+            <w:r>
+              <w:t>3) Gửi lại hồ sơ</w:t>
+            </w:r>
+          </w:p>
+        </w:tc>
+        <w:tc>
+          <w:tcPr>
+            <w:tcW w:w="0" w:type="auto"/>
+            <w:tcBorders>
+              <w:top w:val="single" w:sz="4" w:space="0" w:color="000000"/>
+              <w:left w:val="single" w:sz="4" w:space="0" w:color="000000"/>
+              <w:bottom w:val="single" w:sz="4" w:space="0" w:color="000000"/>
+              <w:right w:val="single" w:sz="4" w:space="0" w:color="000000"/>
+            </w:tcBorders>
+            <w:tcMar>
+              <w:top w:w="0" w:type="dxa"/>
+              <w:left w:w="100" w:type="dxa"/>
+              <w:bottom w:w="0" w:type="dxa"/>
+              <w:right w:w="100" w:type="dxa"/>
+            </w:tcMar>
+            <w:hideMark/>
+          </w:tcPr>
+          <w:p>
+            <w:r>
+              <w:t>Người nộp bổ sung thông tin hoặc tài liệu theo yêu cầu của hệ thống chuyên ngành.</w:t>
+            </w:r>
+          </w:p>
+        </w:tc>
+      </w:tr>
+      <w:tr>
+        <w:trPr>
+          <w:trHeight w:val="1515"/>
+        </w:trPr>
+        <w:tc>
+          <w:tcPr>
+            <w:tcW w:w="0" w:type="auto"/>
+            <w:tcBorders>
+              <w:top w:val="single" w:sz="4" w:space="0" w:color="000000"/>
+              <w:left w:val="single" w:sz="4" w:space="0" w:color="000000"/>
+              <w:bottom w:val="single" w:sz="4" w:space="0" w:color="000000"/>
+              <w:right w:val="single" w:sz="4" w:space="0" w:color="000000"/>
+            </w:tcBorders>
+            <w:tcMar>
+              <w:top w:w="0" w:type="dxa"/>
+              <w:left w:w="100" w:type="dxa"/>
+              <w:bottom w:w="0" w:type="dxa"/>
+              <w:right w:w="100" w:type="dxa"/>
+            </w:tcMar>
+            <w:hideMark/>
+          </w:tcPr>
+          <w:p>
+            <w:r>
+              <w:t> </w:t>
+            </w:r>
+          </w:p>
+        </w:tc>
+        <w:tc>
+          <w:tcPr>
+            <w:tcW w:w="0" w:type="auto"/>
+            <w:tcBorders>
+              <w:top w:val="single" w:sz="4" w:space="0" w:color="000000"/>
+              <w:left w:val="single" w:sz="4" w:space="0" w:color="000000"/>
+              <w:bottom w:val="single" w:sz="4" w:space="0" w:color="000000"/>
+              <w:right w:val="single" w:sz="4" w:space="0" w:color="000000"/>
+            </w:tcBorders>
+            <w:tcMar>
+              <w:top w:w="0" w:type="dxa"/>
+              <w:left w:w="100" w:type="dxa"/>
+              <w:bottom w:w="0" w:type="dxa"/>
+              <w:right w:w="100" w:type="dxa"/>
+            </w:tcMar>
+            <w:hideMark/>
+          </w:tcPr>
+          <w:p>
+            <w:r>
+              <w:t>Xử lý hồ sơ</w:t>
+            </w:r>
+          </w:p>
+        </w:tc>
+        <w:tc>
+          <w:tcPr>
+            <w:tcW w:w="0" w:type="auto"/>
+            <w:tcBorders>
+              <w:top w:val="single" w:sz="4" w:space="0" w:color="000000"/>
+              <w:left w:val="single" w:sz="4" w:space="0" w:color="000000"/>
+              <w:bottom w:val="single" w:sz="4" w:space="0" w:color="000000"/>
+              <w:right w:val="single" w:sz="4" w:space="0" w:color="000000"/>
+            </w:tcBorders>
+            <w:tcMar>
+              <w:top w:w="0" w:type="dxa"/>
+              <w:left w:w="100" w:type="dxa"/>
+              <w:bottom w:w="0" w:type="dxa"/>
+              <w:right w:w="100" w:type="dxa"/>
+            </w:tcMar>
+            <w:hideMark/>
+          </w:tcPr>
+          <w:p>
+            <w:r>
+              <w:t>1) Thực hiện nghiệp vụ chuyên ngành</w:t>
+            </w:r>
+          </w:p>
+          <w:p>
+            <w:r>
+              <w:t>2) Cập nhật dữ liệu xử lý</w:t>
+            </w:r>
+          </w:p>
+          <w:p>
+            <w:r>
+              <w:lastRenderedPageBreak/>
+              <w:t>3) Ghi nhận kết quả xử lý</w:t>
+            </w:r>
+          </w:p>
+        </w:tc>
+        <w:tc>
+          <w:tcPr>
+            <w:tcW w:w="0" w:type="auto"/>
+            <w:tcBorders>
+              <w:top w:val="single" w:sz="4" w:space="0" w:color="000000"/>
+              <w:left w:val="single" w:sz="4" w:space="0" w:color="000000"/>
+              <w:bottom w:val="single" w:sz="4" w:space="0" w:color="000000"/>
+              <w:right w:val="single" w:sz="4" w:space="0" w:color="000000"/>
+            </w:tcBorders>
+            <w:tcMar>
+              <w:top w:w="0" w:type="dxa"/>
+              <w:left w:w="100" w:type="dxa"/>
+              <w:bottom w:w="0" w:type="dxa"/>
+              <w:right w:w="100" w:type="dxa"/>
+            </w:tcMar>
+            <w:hideMark/>
+          </w:tcPr>
+          <w:p>
+            <w:r>
+              <w:lastRenderedPageBreak/>
+              <w:t>Thực hiện các nghiệp vụ chuyên ngành đối với hồ sơ và ghi nhận kết quả xử lý.</w:t>
+            </w:r>
+          </w:p>
+        </w:tc>
+      </w:tr>
+      <w:tr>
+        <w:trPr>
+          <w:trHeight w:val="3015"/>
+        </w:trPr>
+        <w:tc>
+          <w:tcPr>
+            <w:tcW w:w="0" w:type="auto"/>
+            <w:tcBorders>
+              <w:top w:val="single" w:sz="4" w:space="0" w:color="000000"/>
+              <w:left w:val="single" w:sz="4" w:space="0" w:color="000000"/>
+              <w:bottom w:val="single" w:sz="4" w:space="0" w:color="000000"/>
+              <w:right w:val="single" w:sz="4" w:space="0" w:color="000000"/>
+            </w:tcBorders>
+            <w:tcMar>
+              <w:top w:w="0" w:type="dxa"/>
+              <w:left w:w="100" w:type="dxa"/>
+              <w:bottom w:w="0" w:type="dxa"/>
+              <w:right w:w="100" w:type="dxa"/>
+            </w:tcMar>
+            <w:hideMark/>
+          </w:tcPr>
+          <w:p>
+            <w:r>
+              <w:t>12</w:t>
+            </w:r>
+          </w:p>
+        </w:tc>
+        <w:tc>
+          <w:tcPr>
+            <w:tcW w:w="0" w:type="auto"/>
+            <w:tcBorders>
+              <w:top w:val="single" w:sz="4" w:space="0" w:color="000000"/>
+              <w:left w:val="single" w:sz="4" w:space="0" w:color="000000"/>
+              <w:bottom w:val="single" w:sz="4" w:space="0" w:color="000000"/>
+              <w:right w:val="single" w:sz="4" w:space="0" w:color="000000"/>
+            </w:tcBorders>
+            <w:tcMar>
+              <w:top w:w="0" w:type="dxa"/>
+              <w:left w:w="100" w:type="dxa"/>
+              <w:bottom w:w="0" w:type="dxa"/>
+              <w:right w:w="100" w:type="dxa"/>
+            </w:tcMar>
+            <w:hideMark/>
+          </w:tcPr>
+          <w:p>
+            <w:r>
+              <w:t>Kiểm tra dữ liệu đã tồn tại</w:t>
+            </w:r>
+          </w:p>
+        </w:tc>
+        <w:tc>
+          <w:tcPr>
+            <w:tcW w:w="0" w:type="auto"/>
+            <w:tcBorders>
+              <w:top w:val="single" w:sz="4" w:space="0" w:color="000000"/>
+              <w:left w:val="single" w:sz="4" w:space="0" w:color="000000"/>
+              <w:bottom w:val="single" w:sz="4" w:space="0" w:color="000000"/>
+              <w:right w:val="single" w:sz="4" w:space="0" w:color="000000"/>
+            </w:tcBorders>
+            <w:tcMar>
+              <w:top w:w="0" w:type="dxa"/>
+              <w:left w:w="100" w:type="dxa"/>
+              <w:bottom w:w="0" w:type="dxa"/>
+              <w:right w:w="100" w:type="dxa"/>
+            </w:tcMar>
+            <w:hideMark/>
+          </w:tcPr>
+          <w:p>
+            <w:r>
+              <w:t>1) Tra cứu dữ liệu hiện có</w:t>
+            </w:r>
+          </w:p>
+          <w:p>
+            <w:r>
+              <w:t>2) Đối chiếu dữ liệu</w:t>
+            </w:r>
+          </w:p>
+          <w:p>
+            <w:r>
+              <w:t>3) Xác định dữ liệu trùng/khớp</w:t>
+            </w:r>
+          </w:p>
+          <w:p>
+            <w:r>
+              <w:t>4) Xác định dữ liệu còn thiếu</w:t>
+            </w:r>
+          </w:p>
+          <w:p>
+            <w:r>
+              <w:t>5) Xác định nguồn dữ liệu cần khai thác</w:t>
+            </w:r>
+          </w:p>
+          <w:p>
+            <w:r>
+              <w:t>6) Chuyển yêu cầu sang bước xác minh</w:t>
+            </w:r>
+          </w:p>
+        </w:tc>
+        <w:tc>
+          <w:tcPr>
+            <w:tcW w:w="0" w:type="auto"/>
+            <w:tcBorders>
+              <w:top w:val="single" w:sz="4" w:space="0" w:color="000000"/>
+              <w:left w:val="single" w:sz="4" w:space="0" w:color="000000"/>
+              <w:bottom w:val="single" w:sz="4" w:space="0" w:color="000000"/>
+              <w:right w:val="single" w:sz="4" w:space="0" w:color="000000"/>
+            </w:tcBorders>
+            <w:tcMar>
+              <w:top w:w="0" w:type="dxa"/>
+              <w:left w:w="100" w:type="dxa"/>
+              <w:bottom w:w="0" w:type="dxa"/>
+              <w:right w:w="100" w:type="dxa"/>
+            </w:tcMar>
+            <w:hideMark/>
+          </w:tcPr>
+          <w:p>
+            <w:r>
+              <w:t>Tra cứu và đối chiếu dữ liệu hiện có để xác định thông tin đã tồn tại, trùng hoặc phù hợp.</w:t>
+            </w:r>
+          </w:p>
+        </w:tc>
+      </w:tr>
+      <w:tr>
+        <w:trPr>
+          <w:trHeight w:val="1515"/>
+        </w:trPr>
+        <w:tc>
+          <w:tcPr>
+            <w:tcW w:w="0" w:type="auto"/>
+            <w:tcBorders>
+              <w:top w:val="single" w:sz="4" w:space="0" w:color="000000"/>
+              <w:left w:val="single" w:sz="4" w:space="0" w:color="000000"/>
+              <w:bottom w:val="single" w:sz="4" w:space="0" w:color="000000"/>
+              <w:right w:val="single" w:sz="4" w:space="0" w:color="000000"/>
+            </w:tcBorders>
+            <w:tcMar>
+              <w:top w:w="0" w:type="dxa"/>
+              <w:left w:w="100" w:type="dxa"/>
+              <w:bottom w:w="0" w:type="dxa"/>
+              <w:right w:w="100" w:type="dxa"/>
+            </w:tcMar>
+            <w:hideMark/>
+          </w:tcPr>
+          <w:p>
+            <w:r>
+              <w:t>13</w:t>
+            </w:r>
+          </w:p>
+        </w:tc>
+        <w:tc>
+          <w:tcPr>
+            <w:tcW w:w="0" w:type="auto"/>
+            <w:tcBorders>
+              <w:top w:val="single" w:sz="4" w:space="0" w:color="000000"/>
+              <w:left w:val="single" w:sz="4" w:space="0" w:color="000000"/>
+              <w:bottom w:val="single" w:sz="4" w:space="0" w:color="000000"/>
+              <w:right w:val="single" w:sz="4" w:space="0" w:color="000000"/>
+            </w:tcBorders>
+            <w:tcMar>
+              <w:top w:w="0" w:type="dxa"/>
+              <w:left w:w="100" w:type="dxa"/>
+              <w:bottom w:w="0" w:type="dxa"/>
+              <w:right w:w="100" w:type="dxa"/>
+            </w:tcMar>
+            <w:hideMark/>
+          </w:tcPr>
+          <w:p>
+            <w:r>
+              <w:t>Thực hiện kiểm tra bổ sung</w:t>
+            </w:r>
+          </w:p>
+        </w:tc>
+        <w:tc>
+          <w:tcPr>
+            <w:tcW w:w="0" w:type="auto"/>
+            <w:tcBorders>
+              <w:top w:val="single" w:sz="4" w:space="0" w:color="000000"/>
+              <w:left w:val="single" w:sz="4" w:space="0" w:color="000000"/>
+              <w:bottom w:val="single" w:sz="4" w:space="0" w:color="000000"/>
+              <w:right w:val="single" w:sz="4" w:space="0" w:color="000000"/>
+            </w:tcBorders>
+            <w:tcMar>
+              <w:top w:w="0" w:type="dxa"/>
+              <w:left w:w="100" w:type="dxa"/>
+              <w:bottom w:w="0" w:type="dxa"/>
+              <w:right w:w="100" w:type="dxa"/>
+            </w:tcMar>
+            <w:hideMark/>
+          </w:tcPr>
+          <w:p>
+            <w:r>
+              <w:t>1) Kiểm tra thêm thông tin</w:t>
+            </w:r>
+          </w:p>
+          <w:p>
+            <w:r>
+              <w:t>2) Đối chiếu điều kiện chuyên ngành</w:t>
+            </w:r>
+          </w:p>
+          <w:p>
+            <w:r>
+              <w:t>3) Ghi nhận kết quả kiểm tra</w:t>
+            </w:r>
+          </w:p>
+        </w:tc>
+        <w:tc>
+          <w:tcPr>
+            <w:tcW w:w="0" w:type="auto"/>
+            <w:tcBorders>
+              <w:top w:val="single" w:sz="4" w:space="0" w:color="000000"/>
+              <w:left w:val="single" w:sz="4" w:space="0" w:color="000000"/>
+              <w:bottom w:val="single" w:sz="4" w:space="0" w:color="000000"/>
+              <w:right w:val="single" w:sz="4" w:space="0" w:color="000000"/>
+            </w:tcBorders>
+            <w:tcMar>
+              <w:top w:w="0" w:type="dxa"/>
+              <w:left w:w="100" w:type="dxa"/>
+              <w:bottom w:w="0" w:type="dxa"/>
+              <w:right w:w="100" w:type="dxa"/>
+            </w:tcMar>
+            <w:hideMark/>
+          </w:tcPr>
+          <w:p>
+            <w:r>
+              <w:t>Kiểm tra thêm các thông tin cần thiết khi dữ liệu hiện có chưa đủ để đưa ra kết quả.</w:t>
+            </w:r>
+          </w:p>
+        </w:tc>
+      </w:tr>
+      <w:tr>
+        <w:trPr>
+          <w:trHeight w:val="1515"/>
+        </w:trPr>
+        <w:tc>
+          <w:tcPr>
+            <w:tcW w:w="0" w:type="auto"/>
+            <w:tcBorders>
+              <w:top w:val="single" w:sz="4" w:space="0" w:color="000000"/>
+              <w:left w:val="single" w:sz="4" w:space="0" w:color="000000"/>
+              <w:bottom w:val="single" w:sz="4" w:space="0" w:color="000000"/>
+              <w:right w:val="single" w:sz="4" w:space="0" w:color="000000"/>
+            </w:tcBorders>
+            <w:tcMar>
+              <w:top w:w="0" w:type="dxa"/>
+              <w:left w:w="100" w:type="dxa"/>
+              <w:bottom w:w="0" w:type="dxa"/>
+              <w:right w:w="100" w:type="dxa"/>
+            </w:tcMar>
+            <w:hideMark/>
+          </w:tcPr>
+          <w:p>
+            <w:r>
+              <w:t>14</w:t>
+            </w:r>
+          </w:p>
+        </w:tc>
+        <w:tc>
+          <w:tcPr>
+            <w:tcW w:w="0" w:type="auto"/>
+            <w:tcBorders>
+              <w:top w:val="single" w:sz="4" w:space="0" w:color="000000"/>
+              <w:left w:val="single" w:sz="4" w:space="0" w:color="000000"/>
+              <w:bottom w:val="single" w:sz="4" w:space="0" w:color="000000"/>
+              <w:right w:val="single" w:sz="4" w:space="0" w:color="000000"/>
+            </w:tcBorders>
+            <w:tcMar>
+              <w:top w:w="0" w:type="dxa"/>
+              <w:left w:w="100" w:type="dxa"/>
+              <w:bottom w:w="0" w:type="dxa"/>
+              <w:right w:w="100" w:type="dxa"/>
+            </w:tcMar>
+            <w:hideMark/>
+          </w:tcPr>
+          <w:p>
+            <w:r>
+              <w:t>Tra cứu và bổ sung dữ liệu chuyên ngành</w:t>
+            </w:r>
+          </w:p>
+        </w:tc>
+        <w:tc>
+          <w:tcPr>
+            <w:tcW w:w="0" w:type="auto"/>
+            <w:tcBorders>
+              <w:top w:val="single" w:sz="4" w:space="0" w:color="000000"/>
+              <w:left w:val="single" w:sz="4" w:space="0" w:color="000000"/>
+              <w:bottom w:val="single" w:sz="4" w:space="0" w:color="000000"/>
+              <w:right w:val="single" w:sz="4" w:space="0" w:color="000000"/>
+            </w:tcBorders>
+            <w:tcMar>
+              <w:top w:w="0" w:type="dxa"/>
+              <w:left w:w="100" w:type="dxa"/>
+              <w:bottom w:w="0" w:type="dxa"/>
+              <w:right w:w="100" w:type="dxa"/>
+            </w:tcMar>
+            <w:hideMark/>
+          </w:tcPr>
+          <w:p>
+            <w:r>
+              <w:t>1) Tra cứu CSDL chuyên ngành</w:t>
+            </w:r>
+          </w:p>
+          <w:p>
+            <w:r>
+              <w:t>2) Lấy dữ liệu phù hợp</w:t>
+            </w:r>
+          </w:p>
+          <w:p>
+            <w:r>
+              <w:t>3) Bổ sung dữ liệu vào hồ sơ</w:t>
+            </w:r>
+          </w:p>
+        </w:tc>
+        <w:tc>
+          <w:tcPr>
+            <w:tcW w:w="0" w:type="auto"/>
+            <w:tcBorders>
+              <w:top w:val="single" w:sz="4" w:space="0" w:color="000000"/>
+              <w:left w:val="single" w:sz="4" w:space="0" w:color="000000"/>
+              <w:bottom w:val="single" w:sz="4" w:space="0" w:color="000000"/>
+              <w:right w:val="single" w:sz="4" w:space="0" w:color="000000"/>
+            </w:tcBorders>
+            <w:tcMar>
+              <w:top w:w="0" w:type="dxa"/>
+              <w:left w:w="100" w:type="dxa"/>
+              <w:bottom w:w="0" w:type="dxa"/>
+              <w:right w:w="100" w:type="dxa"/>
+            </w:tcMar>
+            <w:hideMark/>
+          </w:tcPr>
+          <w:p>
+            <w:r>
+              <w:t>Tra cứu cơ sở dữ liệu chuyên ngành và bổ sung các thông tin cần thiết vào hồ sơ.</w:t>
+            </w:r>
+          </w:p>
+        </w:tc>
+      </w:tr>
+      <w:tr>
+        <w:trPr>
+          <w:trHeight w:val="1815"/>
+        </w:trPr>
+        <w:tc>
+          <w:tcPr>
+            <w:tcW w:w="0" w:type="auto"/>
+            <w:tcBorders>
+              <w:top w:val="single" w:sz="4" w:space="0" w:color="000000"/>
+              <w:left w:val="single" w:sz="4" w:space="0" w:color="000000"/>
+              <w:bottom w:val="single" w:sz="4" w:space="0" w:color="000000"/>
+              <w:right w:val="single" w:sz="4" w:space="0" w:color="000000"/>
+            </w:tcBorders>
+            <w:tcMar>
+              <w:top w:w="0" w:type="dxa"/>
+              <w:left w:w="100" w:type="dxa"/>
+              <w:bottom w:w="0" w:type="dxa"/>
+              <w:right w:w="100" w:type="dxa"/>
+            </w:tcMar>
+            <w:hideMark/>
+          </w:tcPr>
+          <w:p>
+            <w:r>
+              <w:t>15</w:t>
+            </w:r>
+          </w:p>
+        </w:tc>
+        <w:tc>
+          <w:tcPr>
+            <w:tcW w:w="0" w:type="auto"/>
+            <w:tcBorders>
+              <w:top w:val="single" w:sz="4" w:space="0" w:color="000000"/>
+              <w:left w:val="single" w:sz="4" w:space="0" w:color="000000"/>
+              <w:bottom w:val="single" w:sz="4" w:space="0" w:color="000000"/>
+              <w:right w:val="single" w:sz="4" w:space="0" w:color="000000"/>
+            </w:tcBorders>
+            <w:tcMar>
+              <w:top w:w="0" w:type="dxa"/>
+              <w:left w:w="100" w:type="dxa"/>
+              <w:bottom w:w="0" w:type="dxa"/>
+              <w:right w:w="100" w:type="dxa"/>
+            </w:tcMar>
+            <w:hideMark/>
+          </w:tcPr>
+          <w:p>
+            <w:r>
+              <w:t>Xác minh thông tin với đơn vị liên quan</w:t>
+            </w:r>
+          </w:p>
+        </w:tc>
+        <w:tc>
+          <w:tcPr>
+            <w:tcW w:w="0" w:type="auto"/>
+            <w:tcBorders>
+              <w:top w:val="single" w:sz="4" w:space="0" w:color="000000"/>
+              <w:left w:val="single" w:sz="4" w:space="0" w:color="000000"/>
+              <w:bottom w:val="single" w:sz="4" w:space="0" w:color="000000"/>
+              <w:right w:val="single" w:sz="4" w:space="0" w:color="000000"/>
+            </w:tcBorders>
+            <w:tcMar>
+              <w:top w:w="0" w:type="dxa"/>
+              <w:left w:w="100" w:type="dxa"/>
+              <w:bottom w:w="0" w:type="dxa"/>
+              <w:right w:w="100" w:type="dxa"/>
+            </w:tcMar>
+            <w:hideMark/>
+          </w:tcPr>
+          <w:p>
+            <w:r>
+              <w:t>1) Gửi yêu cầu xác minh</w:t>
+            </w:r>
+          </w:p>
+          <w:p>
+            <w:r>
+              <w:t>2) Chờ/nhận phản hồi xác minh</w:t>
+            </w:r>
+          </w:p>
+          <w:p>
+            <w:r>
+              <w:lastRenderedPageBreak/>
+              <w:t>3) Đối chiếu kết quả xác minh</w:t>
+            </w:r>
+          </w:p>
+        </w:tc>
+        <w:tc>
+          <w:tcPr>
+            <w:tcW w:w="0" w:type="auto"/>
+            <w:tcBorders>
+              <w:top w:val="single" w:sz="4" w:space="0" w:color="000000"/>
+              <w:left w:val="single" w:sz="4" w:space="0" w:color="000000"/>
+              <w:bottom w:val="single" w:sz="4" w:space="0" w:color="000000"/>
+              <w:right w:val="single" w:sz="4" w:space="0" w:color="000000"/>
+            </w:tcBorders>
+            <w:tcMar>
+              <w:top w:w="0" w:type="dxa"/>
+              <w:left w:w="100" w:type="dxa"/>
+              <w:bottom w:w="0" w:type="dxa"/>
+              <w:right w:w="100" w:type="dxa"/>
+            </w:tcMar>
+            <w:hideMark/>
+          </w:tcPr>
+          <w:p>
+            <w:r>
+              <w:lastRenderedPageBreak/>
+              <w:t>Gửi yêu cầu và phối hợp với đơn vị liên quan để xác minh tính chính xác của thông tin.</w:t>
+            </w:r>
+          </w:p>
+        </w:tc>
+      </w:tr>
+      <w:tr>
+        <w:trPr>
+          <w:trHeight w:val="1515"/>
+        </w:trPr>
+        <w:tc>
+          <w:tcPr>
+            <w:tcW w:w="0" w:type="auto"/>
+            <w:tcBorders>
+              <w:top w:val="single" w:sz="4" w:space="0" w:color="000000"/>
+              <w:left w:val="single" w:sz="4" w:space="0" w:color="000000"/>
+              <w:bottom w:val="single" w:sz="4" w:space="0" w:color="000000"/>
+              <w:right w:val="single" w:sz="4" w:space="0" w:color="000000"/>
+            </w:tcBorders>
+            <w:tcMar>
+              <w:top w:w="0" w:type="dxa"/>
+              <w:left w:w="100" w:type="dxa"/>
+              <w:bottom w:w="0" w:type="dxa"/>
+              <w:right w:w="100" w:type="dxa"/>
+            </w:tcMar>
+            <w:hideMark/>
+          </w:tcPr>
+          <w:p>
+            <w:r>
+              <w:t>16</w:t>
+            </w:r>
+          </w:p>
+        </w:tc>
+        <w:tc>
+          <w:tcPr>
+            <w:tcW w:w="0" w:type="auto"/>
+            <w:tcBorders>
+              <w:top w:val="single" w:sz="4" w:space="0" w:color="000000"/>
+              <w:left w:val="single" w:sz="4" w:space="0" w:color="000000"/>
+              <w:bottom w:val="single" w:sz="4" w:space="0" w:color="000000"/>
+              <w:right w:val="single" w:sz="4" w:space="0" w:color="000000"/>
+            </w:tcBorders>
+            <w:tcMar>
+              <w:top w:w="0" w:type="dxa"/>
+              <w:left w:w="100" w:type="dxa"/>
+              <w:bottom w:w="0" w:type="dxa"/>
+              <w:right w:w="100" w:type="dxa"/>
+            </w:tcMar>
+            <w:hideMark/>
+          </w:tcPr>
+          <w:p>
+            <w:r>
+              <w:t>Cấp số định danh cá nhân</w:t>
+            </w:r>
+          </w:p>
+        </w:tc>
+        <w:tc>
+          <w:tcPr>
+            <w:tcW w:w="0" w:type="auto"/>
+            <w:tcBorders>
+              <w:top w:val="single" w:sz="4" w:space="0" w:color="000000"/>
+              <w:left w:val="single" w:sz="4" w:space="0" w:color="000000"/>
+              <w:bottom w:val="single" w:sz="4" w:space="0" w:color="000000"/>
+              <w:right w:val="single" w:sz="4" w:space="0" w:color="000000"/>
+            </w:tcBorders>
+            <w:tcMar>
+              <w:top w:w="0" w:type="dxa"/>
+              <w:left w:w="100" w:type="dxa"/>
+              <w:bottom w:w="0" w:type="dxa"/>
+              <w:right w:w="100" w:type="dxa"/>
+            </w:tcMar>
+            <w:hideMark/>
+          </w:tcPr>
+          <w:p>
+            <w:r>
+              <w:t>1) Kiểm tra điều kiện cấp</w:t>
+            </w:r>
+          </w:p>
+          <w:p>
+            <w:r>
+              <w:t>2) Tạo số định danh cá nhân</w:t>
+            </w:r>
+          </w:p>
+          <w:p>
+            <w:r>
+              <w:t>3) Ghi nhận số định danh vào hồ sơ</w:t>
+            </w:r>
+          </w:p>
+        </w:tc>
+        <w:tc>
+          <w:tcPr>
+            <w:tcW w:w="0" w:type="auto"/>
+            <w:tcBorders>
+              <w:top w:val="single" w:sz="4" w:space="0" w:color="000000"/>
+              <w:left w:val="single" w:sz="4" w:space="0" w:color="000000"/>
+              <w:bottom w:val="single" w:sz="4" w:space="0" w:color="000000"/>
+              <w:right w:val="single" w:sz="4" w:space="0" w:color="000000"/>
+            </w:tcBorders>
+            <w:tcMar>
+              <w:top w:w="0" w:type="dxa"/>
+              <w:left w:w="100" w:type="dxa"/>
+              <w:bottom w:w="0" w:type="dxa"/>
+              <w:right w:w="100" w:type="dxa"/>
+            </w:tcMar>
+            <w:hideMark/>
+          </w:tcPr>
+          <w:p>
+            <w:r>
+              <w:t>Thực hiện cấp và ghi nhận số định danh cá nhân khi hồ sơ đáp ứng đầy đủ điều kiện.</w:t>
+            </w:r>
+          </w:p>
+        </w:tc>
+      </w:tr>
+      <w:tr>
+        <w:trPr>
+          <w:trHeight w:val="1515"/>
+        </w:trPr>
+        <w:tc>
+          <w:tcPr>
+            <w:tcW w:w="0" w:type="auto"/>
+            <w:tcBorders>
+              <w:top w:val="single" w:sz="4" w:space="0" w:color="000000"/>
+              <w:left w:val="single" w:sz="4" w:space="0" w:color="000000"/>
+              <w:bottom w:val="single" w:sz="4" w:space="0" w:color="000000"/>
+              <w:right w:val="single" w:sz="4" w:space="0" w:color="000000"/>
+            </w:tcBorders>
+            <w:tcMar>
+              <w:top w:w="0" w:type="dxa"/>
+              <w:left w:w="100" w:type="dxa"/>
+              <w:bottom w:w="0" w:type="dxa"/>
+              <w:right w:w="100" w:type="dxa"/>
+            </w:tcMar>
+            <w:hideMark/>
+          </w:tcPr>
+          <w:p>
+            <w:r>
+              <w:t>17</w:t>
+            </w:r>
+          </w:p>
+        </w:tc>
+        <w:tc>
+          <w:tcPr>
+            <w:tcW w:w="0" w:type="auto"/>
+            <w:tcBorders>
+              <w:top w:val="single" w:sz="4" w:space="0" w:color="000000"/>
+              <w:left w:val="single" w:sz="4" w:space="0" w:color="000000"/>
+              <w:bottom w:val="single" w:sz="4" w:space="0" w:color="000000"/>
+              <w:right w:val="single" w:sz="4" w:space="0" w:color="000000"/>
+            </w:tcBorders>
+            <w:tcMar>
+              <w:top w:w="0" w:type="dxa"/>
+              <w:left w:w="100" w:type="dxa"/>
+              <w:bottom w:w="0" w:type="dxa"/>
+              <w:right w:w="100" w:type="dxa"/>
+            </w:tcMar>
+            <w:hideMark/>
+          </w:tcPr>
+          <w:p>
+            <w:r>
+              <w:t>Cấp hồ sơ điện tử</w:t>
+            </w:r>
+          </w:p>
+        </w:tc>
+        <w:tc>
+          <w:tcPr>
+            <w:tcW w:w="0" w:type="auto"/>
+            <w:tcBorders>
+              <w:top w:val="single" w:sz="4" w:space="0" w:color="000000"/>
+              <w:left w:val="single" w:sz="4" w:space="0" w:color="000000"/>
+              <w:bottom w:val="single" w:sz="4" w:space="0" w:color="000000"/>
+              <w:right w:val="single" w:sz="4" w:space="0" w:color="000000"/>
+            </w:tcBorders>
+            <w:tcMar>
+              <w:top w:w="0" w:type="dxa"/>
+              <w:left w:w="100" w:type="dxa"/>
+              <w:bottom w:w="0" w:type="dxa"/>
+              <w:right w:w="100" w:type="dxa"/>
+            </w:tcMar>
+            <w:hideMark/>
+          </w:tcPr>
+          <w:p>
+            <w:r>
+              <w:t>1) Tạo dữ liệu hồ sơ</w:t>
+            </w:r>
+          </w:p>
+          <w:p>
+            <w:r>
+              <w:t>2) Phát hành hồ sơ điện tử</w:t>
+            </w:r>
+          </w:p>
+          <w:p>
+            <w:r>
+              <w:t>3) Ghi nhận kết quả phát hành</w:t>
+            </w:r>
+          </w:p>
+        </w:tc>
+        <w:tc>
+          <w:tcPr>
+            <w:tcW w:w="0" w:type="auto"/>
+            <w:tcBorders>
+              <w:top w:val="single" w:sz="4" w:space="0" w:color="000000"/>
+              <w:left w:val="single" w:sz="4" w:space="0" w:color="000000"/>
+              <w:bottom w:val="single" w:sz="4" w:space="0" w:color="000000"/>
+              <w:right w:val="single" w:sz="4" w:space="0" w:color="000000"/>
+            </w:tcBorders>
+            <w:tcMar>
+              <w:top w:w="0" w:type="dxa"/>
+              <w:left w:w="100" w:type="dxa"/>
+              <w:bottom w:w="0" w:type="dxa"/>
+              <w:right w:w="100" w:type="dxa"/>
+            </w:tcMar>
+            <w:hideMark/>
+          </w:tcPr>
+          <w:p>
+            <w:r>
+              <w:t>Tạo và phát hành kết quả hoặc hồ sơ điện tử sau khi hoàn thành xử lý chuyên ngành.</w:t>
+            </w:r>
+          </w:p>
+        </w:tc>
+      </w:tr>
+      <w:tr>
+        <w:trPr>
+          <w:trHeight w:val="1815"/>
+        </w:trPr>
+        <w:tc>
+          <w:tcPr>
+            <w:tcW w:w="0" w:type="auto"/>
+            <w:tcBorders>
+              <w:top w:val="single" w:sz="4" w:space="0" w:color="000000"/>
+              <w:left w:val="single" w:sz="4" w:space="0" w:color="000000"/>
+              <w:bottom w:val="single" w:sz="4" w:space="0" w:color="000000"/>
+              <w:right w:val="single" w:sz="4" w:space="0" w:color="000000"/>
+            </w:tcBorders>
+            <w:tcMar>
+              <w:top w:w="0" w:type="dxa"/>
+              <w:left w:w="100" w:type="dxa"/>
+              <w:bottom w:w="0" w:type="dxa"/>
+              <w:right w:w="100" w:type="dxa"/>
+            </w:tcMar>
+            <w:hideMark/>
+          </w:tcPr>
+          <w:p>
+            <w:r>
+              <w:t>18</w:t>
+            </w:r>
+          </w:p>
+        </w:tc>
+        <w:tc>
+          <w:tcPr>
+            <w:tcW w:w="0" w:type="auto"/>
+            <w:tcBorders>
+              <w:top w:val="single" w:sz="4" w:space="0" w:color="000000"/>
+              <w:left w:val="single" w:sz="4" w:space="0" w:color="000000"/>
+              <w:bottom w:val="single" w:sz="4" w:space="0" w:color="000000"/>
+              <w:right w:val="single" w:sz="4" w:space="0" w:color="000000"/>
+            </w:tcBorders>
+            <w:tcMar>
+              <w:top w:w="0" w:type="dxa"/>
+              <w:left w:w="100" w:type="dxa"/>
+              <w:bottom w:w="0" w:type="dxa"/>
+              <w:right w:w="100" w:type="dxa"/>
+            </w:tcMar>
+            <w:hideMark/>
+          </w:tcPr>
+          <w:p>
+            <w:r>
+              <w:t>Cập nhật phí/lệ phí hồ sơ</w:t>
+            </w:r>
+          </w:p>
+        </w:tc>
+        <w:tc>
+          <w:tcPr>
+            <w:tcW w:w="0" w:type="auto"/>
+            <w:tcBorders>
+              <w:top w:val="single" w:sz="4" w:space="0" w:color="000000"/>
+              <w:left w:val="single" w:sz="4" w:space="0" w:color="000000"/>
+              <w:bottom w:val="single" w:sz="4" w:space="0" w:color="000000"/>
+              <w:right w:val="single" w:sz="4" w:space="0" w:color="000000"/>
+            </w:tcBorders>
+            <w:tcMar>
+              <w:top w:w="0" w:type="dxa"/>
+              <w:left w:w="100" w:type="dxa"/>
+              <w:bottom w:w="0" w:type="dxa"/>
+              <w:right w:w="100" w:type="dxa"/>
+            </w:tcMar>
+            <w:hideMark/>
+          </w:tcPr>
+          <w:p>
+            <w:r>
+              <w:t>1) Xác định khoản phí/lệ phí</w:t>
+            </w:r>
+          </w:p>
+          <w:p>
+            <w:r>
+              <w:t>2) Cập nhật mức phí/lệ phí</w:t>
+            </w:r>
+          </w:p>
+          <w:p>
+            <w:r>
+              <w:t>3) Ghi nhận nghĩa vụ tài chính</w:t>
+            </w:r>
+          </w:p>
+        </w:tc>
+        <w:tc>
+          <w:tcPr>
+            <w:tcW w:w="0" w:type="auto"/>
+            <w:tcBorders>
+              <w:top w:val="single" w:sz="4" w:space="0" w:color="000000"/>
+              <w:left w:val="single" w:sz="4" w:space="0" w:color="000000"/>
+              <w:bottom w:val="single" w:sz="4" w:space="0" w:color="000000"/>
+              <w:right w:val="single" w:sz="4" w:space="0" w:color="000000"/>
+            </w:tcBorders>
+            <w:tcMar>
+              <w:top w:w="0" w:type="dxa"/>
+              <w:left w:w="100" w:type="dxa"/>
+              <w:bottom w:w="0" w:type="dxa"/>
+              <w:right w:w="100" w:type="dxa"/>
+            </w:tcMar>
+            <w:hideMark/>
+          </w:tcPr>
+          <w:p>
+            <w:r>
+              <w:t>Xác định và cập nhật thông tin phí, lệ phí hoặc nghĩa vụ tài chính phát sinh của hồ sơ.</w:t>
+            </w:r>
+          </w:p>
+        </w:tc>
+      </w:tr>
+      <w:tr>
+        <w:trPr>
+          <w:trHeight w:val="1515"/>
+        </w:trPr>
+        <w:tc>
+          <w:tcPr>
+            <w:tcW w:w="0" w:type="auto"/>
+            <w:tcBorders>
+              <w:top w:val="single" w:sz="4" w:space="0" w:color="000000"/>
+              <w:left w:val="single" w:sz="4" w:space="0" w:color="000000"/>
+              <w:bottom w:val="single" w:sz="4" w:space="0" w:color="000000"/>
+              <w:right w:val="single" w:sz="4" w:space="0" w:color="000000"/>
+            </w:tcBorders>
+            <w:tcMar>
+              <w:top w:w="0" w:type="dxa"/>
+              <w:left w:w="100" w:type="dxa"/>
+              <w:bottom w:w="0" w:type="dxa"/>
+              <w:right w:w="100" w:type="dxa"/>
+            </w:tcMar>
+            <w:hideMark/>
+          </w:tcPr>
+          <w:p>
+            <w:r>
+              <w:t>19</w:t>
+            </w:r>
+          </w:p>
+        </w:tc>
+        <w:tc>
+          <w:tcPr>
+            <w:tcW w:w="0" w:type="auto"/>
+            <w:tcBorders>
+              <w:top w:val="single" w:sz="4" w:space="0" w:color="000000"/>
+              <w:left w:val="single" w:sz="4" w:space="0" w:color="000000"/>
+              <w:bottom w:val="single" w:sz="4" w:space="0" w:color="000000"/>
+              <w:right w:val="single" w:sz="4" w:space="0" w:color="000000"/>
+            </w:tcBorders>
+            <w:tcMar>
+              <w:top w:w="0" w:type="dxa"/>
+              <w:left w:w="100" w:type="dxa"/>
+              <w:bottom w:w="0" w:type="dxa"/>
+              <w:right w:w="100" w:type="dxa"/>
+            </w:tcMar>
+            <w:hideMark/>
+          </w:tcPr>
+          <w:p>
+            <w:r>
+              <w:t>Yêu cầu thanh toán nghĩa vụ tài chính</w:t>
+            </w:r>
+          </w:p>
+        </w:tc>
+        <w:tc>
+          <w:tcPr>
+            <w:tcW w:w="0" w:type="auto"/>
+            <w:tcBorders>
+              <w:top w:val="single" w:sz="4" w:space="0" w:color="000000"/>
+              <w:left w:val="single" w:sz="4" w:space="0" w:color="000000"/>
+              <w:bottom w:val="single" w:sz="4" w:space="0" w:color="000000"/>
+              <w:right w:val="single" w:sz="4" w:space="0" w:color="000000"/>
+            </w:tcBorders>
+            <w:tcMar>
+              <w:top w:w="0" w:type="dxa"/>
+              <w:left w:w="100" w:type="dxa"/>
+              <w:bottom w:w="0" w:type="dxa"/>
+              <w:right w:w="100" w:type="dxa"/>
+            </w:tcMar>
+            <w:hideMark/>
+          </w:tcPr>
+          <w:p>
+            <w:r>
+              <w:t>1) Tạo yêu cầu thanh toán</w:t>
+            </w:r>
+          </w:p>
+          <w:p>
+            <w:r>
+              <w:t>2) Gửi thông báo thanh toán</w:t>
+            </w:r>
+          </w:p>
+          <w:p>
+            <w:r>
+              <w:t>3) Ghi nhận trạng thái chờ thanh toán</w:t>
+            </w:r>
+          </w:p>
+        </w:tc>
+        <w:tc>
+          <w:tcPr>
+            <w:tcW w:w="0" w:type="auto"/>
+            <w:tcBorders>
+              <w:top w:val="single" w:sz="4" w:space="0" w:color="000000"/>
+              <w:left w:val="single" w:sz="4" w:space="0" w:color="000000"/>
+              <w:bottom w:val="single" w:sz="4" w:space="0" w:color="000000"/>
+              <w:right w:val="single" w:sz="4" w:space="0" w:color="000000"/>
+            </w:tcBorders>
+            <w:tcMar>
+              <w:top w:w="0" w:type="dxa"/>
+              <w:left w:w="100" w:type="dxa"/>
+              <w:bottom w:w="0" w:type="dxa"/>
+              <w:right w:w="100" w:type="dxa"/>
+            </w:tcMar>
+            <w:hideMark/>
+          </w:tcPr>
+          <w:p>
+            <w:r>
+              <w:t>Thông báo và yêu cầu người nộp thực hiện khoản phí, lệ phí cần thanh toán.</w:t>
+            </w:r>
+          </w:p>
+        </w:tc>
+      </w:tr>
+      <w:tr>
+        <w:trPr>
+          <w:trHeight w:val="1515"/>
+        </w:trPr>
+        <w:tc>
+          <w:tcPr>
+            <w:tcW w:w="0" w:type="auto"/>
+            <w:tcBorders>
+              <w:top w:val="single" w:sz="4" w:space="0" w:color="000000"/>
+              <w:left w:val="single" w:sz="4" w:space="0" w:color="000000"/>
+              <w:bottom w:val="single" w:sz="4" w:space="0" w:color="000000"/>
+              <w:right w:val="single" w:sz="4" w:space="0" w:color="000000"/>
+            </w:tcBorders>
+            <w:tcMar>
+              <w:top w:w="0" w:type="dxa"/>
+              <w:left w:w="100" w:type="dxa"/>
+              <w:bottom w:w="0" w:type="dxa"/>
+              <w:right w:w="100" w:type="dxa"/>
+            </w:tcMar>
+            <w:hideMark/>
+          </w:tcPr>
+          <w:p>
+            <w:r>
+              <w:t>20</w:t>
+            </w:r>
+          </w:p>
+        </w:tc>
+        <w:tc>
+          <w:tcPr>
+            <w:tcW w:w="0" w:type="auto"/>
+            <w:tcBorders>
+              <w:top w:val="single" w:sz="4" w:space="0" w:color="000000"/>
+              <w:left w:val="single" w:sz="4" w:space="0" w:color="000000"/>
+              <w:bottom w:val="single" w:sz="4" w:space="0" w:color="000000"/>
+              <w:right w:val="single" w:sz="4" w:space="0" w:color="000000"/>
+            </w:tcBorders>
+            <w:tcMar>
+              <w:top w:w="0" w:type="dxa"/>
+              <w:left w:w="100" w:type="dxa"/>
+              <w:bottom w:w="0" w:type="dxa"/>
+              <w:right w:w="100" w:type="dxa"/>
+            </w:tcMar>
+            <w:hideMark/>
+          </w:tcPr>
+          <w:p>
+            <w:r>
+              <w:t>Thẩm định lại hồ sơ</w:t>
+            </w:r>
+          </w:p>
+        </w:tc>
+        <w:tc>
+          <w:tcPr>
+            <w:tcW w:w="0" w:type="auto"/>
+            <w:tcBorders>
+              <w:top w:val="single" w:sz="4" w:space="0" w:color="000000"/>
+              <w:left w:val="single" w:sz="4" w:space="0" w:color="000000"/>
+              <w:bottom w:val="single" w:sz="4" w:space="0" w:color="000000"/>
+              <w:right w:val="single" w:sz="4" w:space="0" w:color="000000"/>
+            </w:tcBorders>
+            <w:tcMar>
+              <w:top w:w="0" w:type="dxa"/>
+              <w:left w:w="100" w:type="dxa"/>
+              <w:bottom w:w="0" w:type="dxa"/>
+              <w:right w:w="100" w:type="dxa"/>
+            </w:tcMar>
+            <w:hideMark/>
+          </w:tcPr>
+          <w:p>
+            <w:r>
+              <w:t>1) Kiểm tra lại nội dung đã hiệu chỉnh</w:t>
+            </w:r>
+          </w:p>
+          <w:p>
+            <w:r>
+              <w:lastRenderedPageBreak/>
+              <w:t>2) Thẩm định lại hồ sơ</w:t>
+            </w:r>
+          </w:p>
+          <w:p>
+            <w:r>
+              <w:t>3) Cập nhật lại kết quả</w:t>
+            </w:r>
+          </w:p>
+        </w:tc>
+        <w:tc>
+          <w:tcPr>
+            <w:tcW w:w="0" w:type="auto"/>
+            <w:tcBorders>
+              <w:top w:val="single" w:sz="4" w:space="0" w:color="000000"/>
+              <w:left w:val="single" w:sz="4" w:space="0" w:color="000000"/>
+              <w:bottom w:val="single" w:sz="4" w:space="0" w:color="000000"/>
+              <w:right w:val="single" w:sz="4" w:space="0" w:color="000000"/>
+            </w:tcBorders>
+            <w:tcMar>
+              <w:top w:w="0" w:type="dxa"/>
+              <w:left w:w="100" w:type="dxa"/>
+              <w:bottom w:w="0" w:type="dxa"/>
+              <w:right w:w="100" w:type="dxa"/>
+            </w:tcMar>
+            <w:hideMark/>
+          </w:tcPr>
+          <w:p>
+            <w:r>
+              <w:lastRenderedPageBreak/>
+              <w:t>Kiểm tra và thẩm định lại hồ sơ sau khi đã được bổ sung, hiệu chỉnh hoặc xử lý lại.</w:t>
+            </w:r>
+          </w:p>
+        </w:tc>
+      </w:tr>
+      <w:tr>
+        <w:trPr>
+          <w:trHeight w:val="2115"/>
+        </w:trPr>
+        <w:tc>
+          <w:tcPr>
+            <w:tcW w:w="0" w:type="auto"/>
+            <w:tcBorders>
+              <w:top w:val="single" w:sz="4" w:space="0" w:color="000000"/>
+              <w:left w:val="single" w:sz="4" w:space="0" w:color="000000"/>
+              <w:bottom w:val="single" w:sz="4" w:space="0" w:color="000000"/>
+              <w:right w:val="single" w:sz="4" w:space="0" w:color="000000"/>
+            </w:tcBorders>
+            <w:tcMar>
+              <w:top w:w="0" w:type="dxa"/>
+              <w:left w:w="100" w:type="dxa"/>
+              <w:bottom w:w="0" w:type="dxa"/>
+              <w:right w:w="100" w:type="dxa"/>
+            </w:tcMar>
+            <w:hideMark/>
+          </w:tcPr>
+          <w:p>
+            <w:r>
+              <w:t>21</w:t>
+            </w:r>
+          </w:p>
+        </w:tc>
+        <w:tc>
+          <w:tcPr>
+            <w:tcW w:w="0" w:type="auto"/>
+            <w:tcBorders>
+              <w:top w:val="single" w:sz="4" w:space="0" w:color="000000"/>
+              <w:left w:val="single" w:sz="4" w:space="0" w:color="000000"/>
+              <w:bottom w:val="single" w:sz="4" w:space="0" w:color="000000"/>
+              <w:right w:val="single" w:sz="4" w:space="0" w:color="000000"/>
+            </w:tcBorders>
+            <w:tcMar>
+              <w:top w:w="0" w:type="dxa"/>
+              <w:left w:w="100" w:type="dxa"/>
+              <w:bottom w:w="0" w:type="dxa"/>
+              <w:right w:w="100" w:type="dxa"/>
+            </w:tcMar>
+            <w:hideMark/>
+          </w:tcPr>
+          <w:p>
+            <w:r>
+              <w:t>Hoàn tất xử lý hồ sơ</w:t>
+            </w:r>
+          </w:p>
+        </w:tc>
+        <w:tc>
+          <w:tcPr>
+            <w:tcW w:w="0" w:type="auto"/>
+            <w:tcBorders>
+              <w:top w:val="single" w:sz="4" w:space="0" w:color="000000"/>
+              <w:left w:val="single" w:sz="4" w:space="0" w:color="000000"/>
+              <w:bottom w:val="single" w:sz="4" w:space="0" w:color="000000"/>
+              <w:right w:val="single" w:sz="4" w:space="0" w:color="000000"/>
+            </w:tcBorders>
+            <w:tcMar>
+              <w:top w:w="0" w:type="dxa"/>
+              <w:left w:w="100" w:type="dxa"/>
+              <w:bottom w:w="0" w:type="dxa"/>
+              <w:right w:w="100" w:type="dxa"/>
+            </w:tcMar>
+            <w:hideMark/>
+          </w:tcPr>
+          <w:p>
+            <w:r>
+              <w:t>1) Kiểm tra các yêu cầu đã hoàn thành</w:t>
+            </w:r>
+          </w:p>
+          <w:p>
+            <w:r>
+              <w:t>2) Cập nhật trạng thái hoàn tất</w:t>
+            </w:r>
+          </w:p>
+          <w:p>
+            <w:r>
+              <w:t>3) Chuyển hồ sơ/kết quả sang quy trình tiếp theo</w:t>
+            </w:r>
+          </w:p>
+        </w:tc>
+        <w:tc>
+          <w:tcPr>
+            <w:tcW w:w="0" w:type="auto"/>
+            <w:tcBorders>
+              <w:top w:val="single" w:sz="4" w:space="0" w:color="000000"/>
+              <w:left w:val="single" w:sz="4" w:space="0" w:color="000000"/>
+              <w:bottom w:val="single" w:sz="4" w:space="0" w:color="000000"/>
+              <w:right w:val="single" w:sz="4" w:space="0" w:color="000000"/>
+            </w:tcBorders>
+            <w:tcMar>
+              <w:top w:w="0" w:type="dxa"/>
+              <w:left w:w="100" w:type="dxa"/>
+              <w:bottom w:w="0" w:type="dxa"/>
+              <w:right w:w="100" w:type="dxa"/>
+            </w:tcMar>
+            <w:hideMark/>
+          </w:tcPr>
+          <w:p>
+            <w:r>
+              <w:t>Xác nhận các bước xử lý đã hoàn thành, cập nhật trạng thái và chuyển hồ sơ sang quy trình tiếp theo.</w:t>
+            </w:r>
+          </w:p>
+        </w:tc>
+      </w:tr>
+    </w:tbl>
+    <w:p>
+      <w:pPr>
+        <w:pStyle w:val="Heading5"/>
+      </w:pPr>
+      <w:r>
+        <w:t>2.3.</w:t>
+      </w:r>
+      <w:r>
+        <w:t>2</w:t>
+      </w:r>
+      <w:r>
+        <w:t xml:space="preserve">.2 </w:t>
+      </w:r>
+      <w:r>
+        <w:t>Sơ đồ tổ chức</w:t>
       </w:r>
     </w:p>
     <w:p>
@@ -10612,7 +13160,568 @@
           <w:szCs w:val="26"/>
         </w:rPr>
         <w:drawing>
-          <wp:inline distT="0" distB="0" distL="0" distR="0" wp14:anchorId="41A495D2" wp14:editId="0A0AAC77">
+          <wp:inline distT="0" distB="0" distL="0" distR="0" wp14:anchorId="20538787" wp14:editId="44320248">
+            <wp:extent cx="5731510" cy="1294130"/>
+            <wp:effectExtent l="0" t="0" r="2540" b="1270"/>
+            <wp:docPr id="1483127785" name="Picture 20"/>
+            <wp:cNvGraphicFramePr>
+              <a:graphicFrameLocks xmlns:a="http://schemas.openxmlformats.org/drawingml/2006/main" noChangeAspect="1"/>
+            </wp:cNvGraphicFramePr>
+            <a:graphic xmlns:a="http://schemas.openxmlformats.org/drawingml/2006/main">
+              <a:graphicData uri="http://schemas.openxmlformats.org/drawingml/2006/picture">
+                <pic:pic xmlns:pic="http://schemas.openxmlformats.org/drawingml/2006/picture">
+                  <pic:nvPicPr>
+                    <pic:cNvPr id="0" name="Picture 1"/>
+                    <pic:cNvPicPr>
+                      <a:picLocks noChangeAspect="1" noChangeArrowheads="1"/>
+                    </pic:cNvPicPr>
+                  </pic:nvPicPr>
+                  <pic:blipFill>
+                    <a:blip r:embed="rId16">
+                      <a:extLst>
+                        <a:ext uri="{28A0092B-C50C-407E-A947-70E740481C1C}">
+                          <a14:useLocalDpi xmlns:a14="http://schemas.microsoft.com/office/drawing/2010/main" val="0"/>
+                        </a:ext>
+                      </a:extLst>
+                    </a:blip>
+                    <a:srcRect/>
+                    <a:stretch>
+                      <a:fillRect/>
+                    </a:stretch>
+                  </pic:blipFill>
+                  <pic:spPr bwMode="auto">
+                    <a:xfrm>
+                      <a:off x="0" y="0"/>
+                      <a:ext cx="5731510" cy="1294130"/>
+                    </a:xfrm>
+                    <a:prstGeom prst="rect">
+                      <a:avLst/>
+                    </a:prstGeom>
+                    <a:noFill/>
+                    <a:ln>
+                      <a:noFill/>
+                    </a:ln>
+                  </pic:spPr>
+                </pic:pic>
+              </a:graphicData>
+            </a:graphic>
+          </wp:inline>
+        </w:drawing>
+      </w:r>
+    </w:p>
+    <w:p>
+      <w:pPr>
+        <w:pStyle w:val="Caption"/>
+      </w:pPr>
+      <w:r>
+        <w:t xml:space="preserve">Hình </w:t>
+      </w:r>
+      <w:r>
+        <w:fldChar w:fldCharType="begin"/>
+      </w:r>
+      <w:r>
+        <w:instrText xml:space="preserve"> SEQ Hình \* ARABIC </w:instrText>
+      </w:r>
+      <w:r>
+        <w:fldChar w:fldCharType="separate"/>
+      </w:r>
+      <w:r>
+        <w:rPr>
+          <w:noProof/>
+        </w:rPr>
+        <w:t>7</w:t>
+      </w:r>
+      <w:r>
+        <w:fldChar w:fldCharType="end"/>
+      </w:r>
+      <w:r>
+        <w:t>. Sơ đồ tổ chức quy trình xử lý hồ sơ.</w:t>
+      </w:r>
+    </w:p>
+    <w:p>
+      <w:pPr>
+        <w:pStyle w:val="ListParagraph"/>
+        <w:numPr>
+          <w:ilvl w:val="1"/>
+          <w:numId w:val="26"/>
+        </w:numPr>
+        <w:rPr>
+          <w:b/>
+          <w:bCs/>
+        </w:rPr>
+      </w:pPr>
+      <w:r>
+        <w:rPr>
+          <w:b/>
+          <w:bCs/>
+        </w:rPr>
+        <w:t>Cán bộ Một cửa</w:t>
+      </w:r>
+    </w:p>
+    <w:p>
+      <w:pPr>
+        <w:pStyle w:val="ListParagraph"/>
+        <w:numPr>
+          <w:ilvl w:val="0"/>
+          <w:numId w:val="38"/>
+        </w:numPr>
+      </w:pPr>
+      <w:r>
+        <w:t>Tiếp nhận hồ sơ được chuyển đến.</w:t>
+      </w:r>
+    </w:p>
+    <w:p>
+      <w:pPr>
+        <w:pStyle w:val="ListParagraph"/>
+        <w:numPr>
+          <w:ilvl w:val="0"/>
+          <w:numId w:val="38"/>
+        </w:numPr>
+      </w:pPr>
+      <w:r>
+        <w:t>Ghi nhận thông tin ban đầu của hồ sơ.</w:t>
+      </w:r>
+    </w:p>
+    <w:p>
+      <w:pPr>
+        <w:pStyle w:val="ListParagraph"/>
+        <w:numPr>
+          <w:ilvl w:val="0"/>
+          <w:numId w:val="38"/>
+        </w:numPr>
+      </w:pPr>
+      <w:r>
+        <w:t>Xác nhận hồ sơ đã được tiếp nhận để chuyển sang bước xử lý tiếp theo.</w:t>
+      </w:r>
+    </w:p>
+    <w:p>
+      <w:pPr>
+        <w:pStyle w:val="ListParagraph"/>
+        <w:numPr>
+          <w:ilvl w:val="1"/>
+          <w:numId w:val="26"/>
+        </w:numPr>
+        <w:rPr>
+          <w:b/>
+          <w:bCs/>
+        </w:rPr>
+      </w:pPr>
+      <w:r>
+        <w:rPr>
+          <w:b/>
+          <w:bCs/>
+        </w:rPr>
+        <w:t>Chuyên viên xử lý hồ sơ BNĐP</w:t>
+      </w:r>
+    </w:p>
+    <w:p>
+      <w:pPr>
+        <w:pStyle w:val="ListParagraph"/>
+        <w:numPr>
+          <w:ilvl w:val="0"/>
+          <w:numId w:val="39"/>
+        </w:numPr>
+      </w:pPr>
+      <w:r>
+        <w:t>Rà soát thành phần, thông tin và điều kiện giải quyết hồ sơ.</w:t>
+      </w:r>
+    </w:p>
+    <w:p>
+      <w:pPr>
+        <w:pStyle w:val="ListParagraph"/>
+        <w:numPr>
+          <w:ilvl w:val="0"/>
+          <w:numId w:val="39"/>
+        </w:numPr>
+      </w:pPr>
+      <w:r>
+        <w:t>Yêu cầu bổ sung hoặc từ chối xử lý khi hồ sơ chưa đáp ứng yêu cầu.</w:t>
+      </w:r>
+    </w:p>
+    <w:p>
+      <w:pPr>
+        <w:pStyle w:val="ListParagraph"/>
+        <w:numPr>
+          <w:ilvl w:val="0"/>
+          <w:numId w:val="39"/>
+        </w:numPr>
+      </w:pPr>
+      <w:r>
+        <w:t>Thẩm định hồ sơ và ghi nhận kết quả thẩm định.</w:t>
+      </w:r>
+    </w:p>
+    <w:p>
+      <w:pPr>
+        <w:pStyle w:val="ListParagraph"/>
+        <w:numPr>
+          <w:ilvl w:val="0"/>
+          <w:numId w:val="39"/>
+        </w:numPr>
+      </w:pPr>
+      <w:r>
+        <w:t>Chuyển hồ sơ sang phần mềm chuyên ngành và thực hiện bóc tách dữ liệu.</w:t>
+      </w:r>
+    </w:p>
+    <w:p>
+      <w:pPr>
+        <w:pStyle w:val="ListParagraph"/>
+        <w:numPr>
+          <w:ilvl w:val="0"/>
+          <w:numId w:val="39"/>
+        </w:numPr>
+      </w:pPr>
+      <w:r>
+        <w:t>Cập nhật phí/lệ phí, thẩm định lại và hoàn tất xử lý hồ sơ.</w:t>
+      </w:r>
+    </w:p>
+    <w:p>
+      <w:pPr>
+        <w:pStyle w:val="ListParagraph"/>
+        <w:numPr>
+          <w:ilvl w:val="1"/>
+          <w:numId w:val="26"/>
+        </w:numPr>
+        <w:rPr>
+          <w:b/>
+          <w:bCs/>
+        </w:rPr>
+      </w:pPr>
+      <w:r>
+        <w:rPr>
+          <w:b/>
+          <w:bCs/>
+        </w:rPr>
+        <w:t>Cá nhân/Tổ chức</w:t>
+      </w:r>
+    </w:p>
+    <w:p>
+      <w:pPr>
+        <w:pStyle w:val="ListParagraph"/>
+        <w:numPr>
+          <w:ilvl w:val="0"/>
+          <w:numId w:val="40"/>
+        </w:numPr>
+      </w:pPr>
+      <w:r>
+        <w:t>Tiếp nhận yêu cầu bổ sung hồ sơ.</w:t>
+      </w:r>
+    </w:p>
+    <w:p>
+      <w:pPr>
+        <w:pStyle w:val="ListParagraph"/>
+        <w:numPr>
+          <w:ilvl w:val="0"/>
+          <w:numId w:val="40"/>
+        </w:numPr>
+      </w:pPr>
+      <w:r>
+        <w:t>Chuẩn bị và gửi lại các thông tin, tài liệu còn thiếu.</w:t>
+      </w:r>
+    </w:p>
+    <w:p>
+      <w:pPr>
+        <w:pStyle w:val="ListParagraph"/>
+        <w:numPr>
+          <w:ilvl w:val="0"/>
+          <w:numId w:val="40"/>
+        </w:numPr>
+      </w:pPr>
+      <w:r>
+        <w:lastRenderedPageBreak/>
+        <w:t>Bổ sung hồ sơ theo yêu cầu của hệ thống chuyên ngành.</w:t>
+      </w:r>
+    </w:p>
+    <w:p>
+      <w:pPr>
+        <w:pStyle w:val="ListParagraph"/>
+        <w:numPr>
+          <w:ilvl w:val="0"/>
+          <w:numId w:val="40"/>
+        </w:numPr>
+      </w:pPr>
+      <w:r>
+        <w:t>Thực hiện nghĩa vụ tài chính khi có yêu cầu.</w:t>
+      </w:r>
+    </w:p>
+    <w:p>
+      <w:pPr>
+        <w:pStyle w:val="ListParagraph"/>
+        <w:numPr>
+          <w:ilvl w:val="1"/>
+          <w:numId w:val="26"/>
+        </w:numPr>
+        <w:rPr>
+          <w:b/>
+          <w:bCs/>
+        </w:rPr>
+      </w:pPr>
+      <w:r>
+        <w:rPr>
+          <w:b/>
+          <w:bCs/>
+        </w:rPr>
+        <w:t>Phần mềm/Cơ quan chuyên ngành</w:t>
+      </w:r>
+    </w:p>
+    <w:p>
+      <w:pPr>
+        <w:pStyle w:val="ListParagraph"/>
+        <w:numPr>
+          <w:ilvl w:val="0"/>
+          <w:numId w:val="41"/>
+        </w:numPr>
+      </w:pPr>
+      <w:r>
+        <w:t>Thực hiện nghĩa vụ tài chính khi có yêu cầu.</w:t>
+      </w:r>
+    </w:p>
+    <w:p>
+      <w:pPr>
+        <w:pStyle w:val="ListParagraph"/>
+        <w:numPr>
+          <w:ilvl w:val="0"/>
+          <w:numId w:val="41"/>
+        </w:numPr>
+      </w:pPr>
+      <w:r>
+        <w:t>Kiểm tra và xử lý hồ sơ theo nghiệp vụ chuyên ngành.</w:t>
+      </w:r>
+    </w:p>
+    <w:p>
+      <w:pPr>
+        <w:pStyle w:val="ListParagraph"/>
+        <w:numPr>
+          <w:ilvl w:val="0"/>
+          <w:numId w:val="41"/>
+        </w:numPr>
+      </w:pPr>
+      <w:r>
+        <w:t>Tra cứu, đối chiếu và bổ sung dữ liệu chuyên ngành.</w:t>
+      </w:r>
+    </w:p>
+    <w:p>
+      <w:pPr>
+        <w:pStyle w:val="ListParagraph"/>
+        <w:numPr>
+          <w:ilvl w:val="0"/>
+          <w:numId w:val="41"/>
+        </w:numPr>
+      </w:pPr>
+      <w:r>
+        <w:t>Thực hiện kiểm tra bổ sung và xác minh thông tin khi cần.</w:t>
+      </w:r>
+    </w:p>
+    <w:p>
+      <w:pPr>
+        <w:pStyle w:val="ListParagraph"/>
+        <w:numPr>
+          <w:ilvl w:val="0"/>
+          <w:numId w:val="41"/>
+        </w:numPr>
+      </w:pPr>
+      <w:r>
+        <w:t>Cấp số định danh cá nhân và phát hành hồ sơ điện tử khi đủ điều kiện.</w:t>
+      </w:r>
+    </w:p>
+    <w:p>
+      <w:pPr>
+        <w:pStyle w:val="ListParagraph"/>
+        <w:numPr>
+          <w:ilvl w:val="1"/>
+          <w:numId w:val="26"/>
+        </w:numPr>
+        <w:rPr>
+          <w:b/>
+          <w:bCs/>
+        </w:rPr>
+      </w:pPr>
+      <w:r>
+        <w:rPr>
+          <w:b/>
+          <w:bCs/>
+        </w:rPr>
+        <w:t>Cơ quan/Đơn vị liên quan</w:t>
+      </w:r>
+    </w:p>
+    <w:p>
+      <w:pPr>
+        <w:pStyle w:val="ListParagraph"/>
+        <w:numPr>
+          <w:ilvl w:val="0"/>
+          <w:numId w:val="42"/>
+        </w:numPr>
+      </w:pPr>
+      <w:r>
+        <w:t>Tiếp nhận yêu cầu xác minh thông tin.</w:t>
+      </w:r>
+    </w:p>
+    <w:p>
+      <w:pPr>
+        <w:pStyle w:val="ListParagraph"/>
+        <w:numPr>
+          <w:ilvl w:val="0"/>
+          <w:numId w:val="42"/>
+        </w:numPr>
+      </w:pPr>
+      <w:r>
+        <w:t>Phối hợp kiểm tra và cung cấp thông tin cần thiết.</w:t>
+      </w:r>
+    </w:p>
+    <w:p>
+      <w:pPr>
+        <w:pStyle w:val="ListParagraph"/>
+        <w:numPr>
+          <w:ilvl w:val="0"/>
+          <w:numId w:val="42"/>
+        </w:numPr>
+      </w:pPr>
+      <w:r>
+        <w:t>Phản hồi kết quả xác minh để phục vụ xử lý hồ sơ.</w:t>
+      </w:r>
+    </w:p>
+    <w:p>
+      <w:pPr>
+        <w:pStyle w:val="ListParagraph"/>
+        <w:numPr>
+          <w:ilvl w:val="1"/>
+          <w:numId w:val="26"/>
+        </w:numPr>
+        <w:rPr>
+          <w:b/>
+          <w:bCs/>
+        </w:rPr>
+      </w:pPr>
+      <w:r>
+        <w:rPr>
+          <w:b/>
+          <w:bCs/>
+        </w:rPr>
+        <w:t>Hệ thống BNĐP</w:t>
+      </w:r>
+    </w:p>
+    <w:p>
+      <w:pPr>
+        <w:pStyle w:val="ListParagraph"/>
+        <w:numPr>
+          <w:ilvl w:val="0"/>
+          <w:numId w:val="43"/>
+        </w:numPr>
+      </w:pPr>
+      <w:r>
+        <w:t>Hỗ trợ chuyển và ghi nhận trạng thái hồ sơ.</w:t>
+      </w:r>
+    </w:p>
+    <w:p>
+      <w:pPr>
+        <w:pStyle w:val="ListParagraph"/>
+        <w:numPr>
+          <w:ilvl w:val="0"/>
+          <w:numId w:val="43"/>
+        </w:numPr>
+      </w:pPr>
+      <w:r>
+        <w:t>Cập nhật thông tin phí/lệ phí và nghĩa vụ tài chính.</w:t>
+      </w:r>
+    </w:p>
+    <w:p>
+      <w:pPr>
+        <w:pStyle w:val="ListParagraph"/>
+        <w:numPr>
+          <w:ilvl w:val="0"/>
+          <w:numId w:val="43"/>
+        </w:numPr>
+      </w:pPr>
+      <w:r>
+        <w:t>Ghi nhận trạng thái hoàn tất và chuyển kết quả sang quy trình tiếp theo.</w:t>
+      </w:r>
+    </w:p>
+    <w:p>
+      <w:pPr>
+        <w:pStyle w:val="Heading3"/>
+      </w:pPr>
+      <w:bookmarkStart w:id="26" w:name="_Toc236264131"/>
+      <w:r>
+        <w:t>2.4 Mô hình hóa quy trình hỗ trợ (Processs Support)</w:t>
+      </w:r>
+      <w:bookmarkEnd w:id="26"/>
+    </w:p>
+    <w:p/>
+    <w:p/>
+    <w:p>
+      <w:pPr>
+        <w:rPr>
+          <w:rFonts w:cs="Times New Roman"/>
+          <w:szCs w:val="26"/>
+        </w:rPr>
+      </w:pPr>
+      <w:r>
+        <w:rPr>
+          <w:rFonts w:cs="Times New Roman"/>
+          <w:szCs w:val="26"/>
+        </w:rPr>
+        <w:br w:type="page"/>
+      </w:r>
+    </w:p>
+    <w:p>
+      <w:pPr>
+        <w:pStyle w:val="Heading1"/>
+      </w:pPr>
+      <w:bookmarkStart w:id="27" w:name="_Toc236264132"/>
+      <w:r>
+        <w:lastRenderedPageBreak/>
+        <w:t xml:space="preserve">Chương III. </w:t>
+      </w:r>
+      <w:r>
+        <w:t>PHÂN TÍCH QUY TRÌNH</w:t>
+      </w:r>
+      <w:r>
+        <w:t>.</w:t>
+      </w:r>
+      <w:bookmarkEnd w:id="27"/>
+    </w:p>
+    <w:p>
+      <w:pPr>
+        <w:pStyle w:val="Heading3"/>
+      </w:pPr>
+      <w:r>
+        <w:t xml:space="preserve">3.1 Phân tích </w:t>
+      </w:r>
+      <w:r>
+        <w:t>quy trình tiếp nhận hồ sơ</w:t>
+      </w:r>
+    </w:p>
+    <w:p>
+      <w:pPr>
+        <w:pStyle w:val="Heading3"/>
+        <w:numPr>
+          <w:ilvl w:val="2"/>
+          <w:numId w:val="37"/>
+        </w:numPr>
+      </w:pPr>
+      <w:r>
+        <w:t>Phân tích định tính</w:t>
+      </w:r>
+    </w:p>
+    <w:p>
+      <w:pPr>
+        <w:pStyle w:val="Heading3"/>
+      </w:pPr>
+      <w:r>
+        <w:t xml:space="preserve">3.1.1.1 Phân tích giá trị gia tăng </w:t>
+      </w:r>
+    </w:p>
+    <w:p>
+      <w:pPr>
+        <w:keepNext/>
+      </w:pPr>
+      <w:r>
+        <w:rPr>
+          <w:noProof/>
+          <w:color w:val="000000"/>
+          <w:szCs w:val="26"/>
+        </w:rPr>
+        <w:drawing>
+          <wp:inline distT="0" distB="0" distL="0" distR="0" wp14:anchorId="41A495D2" wp14:editId="79127A45">
             <wp:extent cx="5725795" cy="2461260"/>
             <wp:effectExtent l="0" t="0" r="8255" b="0"/>
             <wp:docPr id="1702479062" name="Picture 21"/>
@@ -10629,7 +13738,7 @@
                     </pic:cNvPicPr>
                   </pic:nvPicPr>
                   <pic:blipFill>
-                    <a:blip r:embed="rId16" cstate="print">
+                    <a:blip r:embed="rId17" cstate="print">
                       <a:extLst>
                         <a:ext uri="{28A0092B-C50C-407E-A947-70E740481C1C}">
                           <a14:useLocalDpi xmlns:a14="http://schemas.microsoft.com/office/drawing/2010/main" val="0"/>
@@ -10668,14 +13777,27 @@
       <w:r>
         <w:t xml:space="preserve">Hình </w:t>
       </w:r>
-      <w:fldSimple w:instr=" SEQ Hình \* ARABIC ">
-        <w:r>
-          <w:rPr>
-            <w:noProof/>
-          </w:rPr>
-          <w:t>7</w:t>
-        </w:r>
-      </w:fldSimple>
+      <w:r>
+        <w:fldChar w:fldCharType="begin"/>
+      </w:r>
+      <w:r>
+        <w:instrText xml:space="preserve"> SEQ Hình \* ARABIC </w:instrText>
+      </w:r>
+      <w:r>
+        <w:fldChar w:fldCharType="separate"/>
+      </w:r>
+      <w:r>
+        <w:rPr>
+          <w:noProof/>
+        </w:rPr>
+        <w:t>8</w:t>
+      </w:r>
+      <w:r>
+        <w:rPr>
+          <w:noProof/>
+        </w:rPr>
+        <w:fldChar w:fldCharType="end"/>
+      </w:r>
       <w:r>
         <w:t>. Phân tích giá trị gia tăng trên quy trình tiếp nhận</w:t>
       </w:r>
@@ -12447,18 +15569,7 @@
         </w:tc>
       </w:tr>
     </w:tbl>
-    <w:p>
-      <w:pPr>
-        <w:pStyle w:val="ListParagraph"/>
-        <w:ind w:left="780"/>
-      </w:pPr>
-    </w:p>
-    <w:p>
-      <w:pPr>
-        <w:pStyle w:val="ListParagraph"/>
-        <w:ind w:left="780"/>
-      </w:pPr>
-    </w:p>
+    <w:p/>
     <w:p>
       <w:pPr>
         <w:pStyle w:val="Heading2"/>
@@ -12612,7 +15723,7 @@
           <w:numId w:val="6"/>
         </w:numPr>
       </w:pPr>
-      <w:hyperlink r:id="rId17" w:anchor="ID0EBBF=Getting_started" w:history="1">
+      <w:hyperlink r:id="rId18" w:anchor="ID0EBBF=Getting_started" w:history="1">
         <w:r>
           <w:rPr>
             <w:rStyle w:val="Hyperlink"/>
@@ -12684,8 +15795,8 @@
     <w:p/>
     <w:p/>
     <w:sectPr>
-      <w:headerReference w:type="default" r:id="rId18"/>
-      <w:footerReference w:type="default" r:id="rId19"/>
+      <w:headerReference w:type="default" r:id="rId19"/>
+      <w:footerReference w:type="default" r:id="rId20"/>
       <w:pgSz w:w="11906" w:h="16838" w:code="9"/>
       <w:pgMar w:top="1440" w:right="1440" w:bottom="1440" w:left="1440" w:header="720" w:footer="720" w:gutter="0"/>
       <w:pgBorders w:display="firstPage" w:offsetFrom="page">
@@ -13024,7 +16135,7 @@
   <w:abstractNum w:abstractNumId="1" w15:restartNumberingAfterBreak="0">
     <w:nsid w:val="03353454"/>
     <w:multiLevelType w:val="multilevel"/>
-    <w:tmpl w:val="53380A36"/>
+    <w:tmpl w:val="CA500B9E"/>
     <w:lvl w:ilvl="0">
       <w:start w:val="1"/>
       <w:numFmt w:val="bullet"/>
@@ -13041,23 +16152,19 @@
         <w:sz w:val="20"/>
       </w:rPr>
     </w:lvl>
-    <w:lvl w:ilvl="1" w:tentative="1">
-      <w:start w:val="1"/>
-      <w:numFmt w:val="bullet"/>
-      <w:lvlText w:val="o"/>
-      <w:lvlJc w:val="left"/>
-      <w:pPr>
-        <w:tabs>
-          <w:tab w:val="num" w:pos="1440"/>
-        </w:tabs>
+    <w:lvl w:ilvl="1">
+      <w:start w:val="1"/>
+      <w:numFmt w:val="decimal"/>
+      <w:lvlText w:val="%2."/>
+      <w:lvlJc w:val="left"/>
+      <w:pPr>
         <w:ind w:left="1440" w:hanging="360"/>
       </w:pPr>
       <w:rPr>
-        <w:rFonts w:ascii="Courier New" w:hAnsi="Courier New" w:hint="default"/>
-        <w:sz w:val="20"/>
-      </w:rPr>
-    </w:lvl>
-    <w:lvl w:ilvl="2" w:tentative="1">
+        <w:rFonts w:hint="default"/>
+      </w:rPr>
+    </w:lvl>
+    <w:lvl w:ilvl="2">
       <w:start w:val="1"/>
       <w:numFmt w:val="bullet"/>
       <w:lvlText w:val=""/>
@@ -13695,6 +16802,232 @@
     </w:lvl>
   </w:abstractNum>
   <w:abstractNum w:abstractNumId="6" w15:restartNumberingAfterBreak="0">
+    <w:nsid w:val="119A6A7F"/>
+    <w:multiLevelType w:val="hybridMultilevel"/>
+    <w:tmpl w:val="C0F27774"/>
+    <w:lvl w:ilvl="0" w:tplc="04090001">
+      <w:start w:val="1"/>
+      <w:numFmt w:val="bullet"/>
+      <w:lvlText w:val=""/>
+      <w:lvlJc w:val="left"/>
+      <w:pPr>
+        <w:ind w:left="2160" w:hanging="360"/>
+      </w:pPr>
+      <w:rPr>
+        <w:rFonts w:ascii="Symbol" w:hAnsi="Symbol" w:hint="default"/>
+      </w:rPr>
+    </w:lvl>
+    <w:lvl w:ilvl="1" w:tplc="04090003" w:tentative="1">
+      <w:start w:val="1"/>
+      <w:numFmt w:val="bullet"/>
+      <w:lvlText w:val="o"/>
+      <w:lvlJc w:val="left"/>
+      <w:pPr>
+        <w:ind w:left="2880" w:hanging="360"/>
+      </w:pPr>
+      <w:rPr>
+        <w:rFonts w:ascii="Courier New" w:hAnsi="Courier New" w:cs="Courier New" w:hint="default"/>
+      </w:rPr>
+    </w:lvl>
+    <w:lvl w:ilvl="2" w:tplc="04090005" w:tentative="1">
+      <w:start w:val="1"/>
+      <w:numFmt w:val="bullet"/>
+      <w:lvlText w:val=""/>
+      <w:lvlJc w:val="left"/>
+      <w:pPr>
+        <w:ind w:left="3600" w:hanging="360"/>
+      </w:pPr>
+      <w:rPr>
+        <w:rFonts w:ascii="Wingdings" w:hAnsi="Wingdings" w:hint="default"/>
+      </w:rPr>
+    </w:lvl>
+    <w:lvl w:ilvl="3" w:tplc="04090001" w:tentative="1">
+      <w:start w:val="1"/>
+      <w:numFmt w:val="bullet"/>
+      <w:lvlText w:val=""/>
+      <w:lvlJc w:val="left"/>
+      <w:pPr>
+        <w:ind w:left="4320" w:hanging="360"/>
+      </w:pPr>
+      <w:rPr>
+        <w:rFonts w:ascii="Symbol" w:hAnsi="Symbol" w:hint="default"/>
+      </w:rPr>
+    </w:lvl>
+    <w:lvl w:ilvl="4" w:tplc="04090003" w:tentative="1">
+      <w:start w:val="1"/>
+      <w:numFmt w:val="bullet"/>
+      <w:lvlText w:val="o"/>
+      <w:lvlJc w:val="left"/>
+      <w:pPr>
+        <w:ind w:left="5040" w:hanging="360"/>
+      </w:pPr>
+      <w:rPr>
+        <w:rFonts w:ascii="Courier New" w:hAnsi="Courier New" w:cs="Courier New" w:hint="default"/>
+      </w:rPr>
+    </w:lvl>
+    <w:lvl w:ilvl="5" w:tplc="04090005" w:tentative="1">
+      <w:start w:val="1"/>
+      <w:numFmt w:val="bullet"/>
+      <w:lvlText w:val=""/>
+      <w:lvlJc w:val="left"/>
+      <w:pPr>
+        <w:ind w:left="5760" w:hanging="360"/>
+      </w:pPr>
+      <w:rPr>
+        <w:rFonts w:ascii="Wingdings" w:hAnsi="Wingdings" w:hint="default"/>
+      </w:rPr>
+    </w:lvl>
+    <w:lvl w:ilvl="6" w:tplc="04090001" w:tentative="1">
+      <w:start w:val="1"/>
+      <w:numFmt w:val="bullet"/>
+      <w:lvlText w:val=""/>
+      <w:lvlJc w:val="left"/>
+      <w:pPr>
+        <w:ind w:left="6480" w:hanging="360"/>
+      </w:pPr>
+      <w:rPr>
+        <w:rFonts w:ascii="Symbol" w:hAnsi="Symbol" w:hint="default"/>
+      </w:rPr>
+    </w:lvl>
+    <w:lvl w:ilvl="7" w:tplc="04090003" w:tentative="1">
+      <w:start w:val="1"/>
+      <w:numFmt w:val="bullet"/>
+      <w:lvlText w:val="o"/>
+      <w:lvlJc w:val="left"/>
+      <w:pPr>
+        <w:ind w:left="7200" w:hanging="360"/>
+      </w:pPr>
+      <w:rPr>
+        <w:rFonts w:ascii="Courier New" w:hAnsi="Courier New" w:cs="Courier New" w:hint="default"/>
+      </w:rPr>
+    </w:lvl>
+    <w:lvl w:ilvl="8" w:tplc="04090005" w:tentative="1">
+      <w:start w:val="1"/>
+      <w:numFmt w:val="bullet"/>
+      <w:lvlText w:val=""/>
+      <w:lvlJc w:val="left"/>
+      <w:pPr>
+        <w:ind w:left="7920" w:hanging="360"/>
+      </w:pPr>
+      <w:rPr>
+        <w:rFonts w:ascii="Wingdings" w:hAnsi="Wingdings" w:hint="default"/>
+      </w:rPr>
+    </w:lvl>
+  </w:abstractNum>
+  <w:abstractNum w:abstractNumId="7" w15:restartNumberingAfterBreak="0">
+    <w:nsid w:val="13DF1620"/>
+    <w:multiLevelType w:val="hybridMultilevel"/>
+    <w:tmpl w:val="113A4A80"/>
+    <w:lvl w:ilvl="0" w:tplc="04090001">
+      <w:start w:val="1"/>
+      <w:numFmt w:val="bullet"/>
+      <w:lvlText w:val=""/>
+      <w:lvlJc w:val="left"/>
+      <w:pPr>
+        <w:ind w:left="2160" w:hanging="360"/>
+      </w:pPr>
+      <w:rPr>
+        <w:rFonts w:ascii="Symbol" w:hAnsi="Symbol" w:hint="default"/>
+      </w:rPr>
+    </w:lvl>
+    <w:lvl w:ilvl="1" w:tplc="04090003" w:tentative="1">
+      <w:start w:val="1"/>
+      <w:numFmt w:val="bullet"/>
+      <w:lvlText w:val="o"/>
+      <w:lvlJc w:val="left"/>
+      <w:pPr>
+        <w:ind w:left="2880" w:hanging="360"/>
+      </w:pPr>
+      <w:rPr>
+        <w:rFonts w:ascii="Courier New" w:hAnsi="Courier New" w:cs="Courier New" w:hint="default"/>
+      </w:rPr>
+    </w:lvl>
+    <w:lvl w:ilvl="2" w:tplc="04090005" w:tentative="1">
+      <w:start w:val="1"/>
+      <w:numFmt w:val="bullet"/>
+      <w:lvlText w:val=""/>
+      <w:lvlJc w:val="left"/>
+      <w:pPr>
+        <w:ind w:left="3600" w:hanging="360"/>
+      </w:pPr>
+      <w:rPr>
+        <w:rFonts w:ascii="Wingdings" w:hAnsi="Wingdings" w:hint="default"/>
+      </w:rPr>
+    </w:lvl>
+    <w:lvl w:ilvl="3" w:tplc="04090001" w:tentative="1">
+      <w:start w:val="1"/>
+      <w:numFmt w:val="bullet"/>
+      <w:lvlText w:val=""/>
+      <w:lvlJc w:val="left"/>
+      <w:pPr>
+        <w:ind w:left="4320" w:hanging="360"/>
+      </w:pPr>
+      <w:rPr>
+        <w:rFonts w:ascii="Symbol" w:hAnsi="Symbol" w:hint="default"/>
+      </w:rPr>
+    </w:lvl>
+    <w:lvl w:ilvl="4" w:tplc="04090003" w:tentative="1">
+      <w:start w:val="1"/>
+      <w:numFmt w:val="bullet"/>
+      <w:lvlText w:val="o"/>
+      <w:lvlJc w:val="left"/>
+      <w:pPr>
+        <w:ind w:left="5040" w:hanging="360"/>
+      </w:pPr>
+      <w:rPr>
+        <w:rFonts w:ascii="Courier New" w:hAnsi="Courier New" w:cs="Courier New" w:hint="default"/>
+      </w:rPr>
+    </w:lvl>
+    <w:lvl w:ilvl="5" w:tplc="04090005" w:tentative="1">
+      <w:start w:val="1"/>
+      <w:numFmt w:val="bullet"/>
+      <w:lvlText w:val=""/>
+      <w:lvlJc w:val="left"/>
+      <w:pPr>
+        <w:ind w:left="5760" w:hanging="360"/>
+      </w:pPr>
+      <w:rPr>
+        <w:rFonts w:ascii="Wingdings" w:hAnsi="Wingdings" w:hint="default"/>
+      </w:rPr>
+    </w:lvl>
+    <w:lvl w:ilvl="6" w:tplc="04090001" w:tentative="1">
+      <w:start w:val="1"/>
+      <w:numFmt w:val="bullet"/>
+      <w:lvlText w:val=""/>
+      <w:lvlJc w:val="left"/>
+      <w:pPr>
+        <w:ind w:left="6480" w:hanging="360"/>
+      </w:pPr>
+      <w:rPr>
+        <w:rFonts w:ascii="Symbol" w:hAnsi="Symbol" w:hint="default"/>
+      </w:rPr>
+    </w:lvl>
+    <w:lvl w:ilvl="7" w:tplc="04090003" w:tentative="1">
+      <w:start w:val="1"/>
+      <w:numFmt w:val="bullet"/>
+      <w:lvlText w:val="o"/>
+      <w:lvlJc w:val="left"/>
+      <w:pPr>
+        <w:ind w:left="7200" w:hanging="360"/>
+      </w:pPr>
+      <w:rPr>
+        <w:rFonts w:ascii="Courier New" w:hAnsi="Courier New" w:cs="Courier New" w:hint="default"/>
+      </w:rPr>
+    </w:lvl>
+    <w:lvl w:ilvl="8" w:tplc="04090005" w:tentative="1">
+      <w:start w:val="1"/>
+      <w:numFmt w:val="bullet"/>
+      <w:lvlText w:val=""/>
+      <w:lvlJc w:val="left"/>
+      <w:pPr>
+        <w:ind w:left="7920" w:hanging="360"/>
+      </w:pPr>
+      <w:rPr>
+        <w:rFonts w:ascii="Wingdings" w:hAnsi="Wingdings" w:hint="default"/>
+      </w:rPr>
+    </w:lvl>
+  </w:abstractNum>
+  <w:abstractNum w:abstractNumId="8" w15:restartNumberingAfterBreak="0">
     <w:nsid w:val="15B91047"/>
     <w:multiLevelType w:val="multilevel"/>
     <w:tmpl w:val="35E4E3CE"/>
@@ -13843,7 +17176,7 @@
       </w:rPr>
     </w:lvl>
   </w:abstractNum>
-  <w:abstractNum w:abstractNumId="7" w15:restartNumberingAfterBreak="0">
+  <w:abstractNum w:abstractNumId="9" w15:restartNumberingAfterBreak="0">
     <w:nsid w:val="16EC1016"/>
     <w:multiLevelType w:val="multilevel"/>
     <w:tmpl w:val="AE6CE97E"/>
@@ -13992,7 +17325,7 @@
       </w:rPr>
     </w:lvl>
   </w:abstractNum>
-  <w:abstractNum w:abstractNumId="8" w15:restartNumberingAfterBreak="0">
+  <w:abstractNum w:abstractNumId="10" w15:restartNumberingAfterBreak="0">
     <w:nsid w:val="17734325"/>
     <w:multiLevelType w:val="hybridMultilevel"/>
     <w:tmpl w:val="1FD45FEA"/>
@@ -14081,7 +17414,233 @@
       </w:pPr>
     </w:lvl>
   </w:abstractNum>
-  <w:abstractNum w:abstractNumId="9" w15:restartNumberingAfterBreak="0">
+  <w:abstractNum w:abstractNumId="11" w15:restartNumberingAfterBreak="0">
+    <w:nsid w:val="1B6946D9"/>
+    <w:multiLevelType w:val="hybridMultilevel"/>
+    <w:tmpl w:val="91CCDDC0"/>
+    <w:lvl w:ilvl="0" w:tplc="04090001">
+      <w:start w:val="1"/>
+      <w:numFmt w:val="bullet"/>
+      <w:lvlText w:val=""/>
+      <w:lvlJc w:val="left"/>
+      <w:pPr>
+        <w:ind w:left="2160" w:hanging="360"/>
+      </w:pPr>
+      <w:rPr>
+        <w:rFonts w:ascii="Symbol" w:hAnsi="Symbol" w:hint="default"/>
+      </w:rPr>
+    </w:lvl>
+    <w:lvl w:ilvl="1" w:tplc="04090003" w:tentative="1">
+      <w:start w:val="1"/>
+      <w:numFmt w:val="bullet"/>
+      <w:lvlText w:val="o"/>
+      <w:lvlJc w:val="left"/>
+      <w:pPr>
+        <w:ind w:left="2880" w:hanging="360"/>
+      </w:pPr>
+      <w:rPr>
+        <w:rFonts w:ascii="Courier New" w:hAnsi="Courier New" w:cs="Courier New" w:hint="default"/>
+      </w:rPr>
+    </w:lvl>
+    <w:lvl w:ilvl="2" w:tplc="04090005" w:tentative="1">
+      <w:start w:val="1"/>
+      <w:numFmt w:val="bullet"/>
+      <w:lvlText w:val=""/>
+      <w:lvlJc w:val="left"/>
+      <w:pPr>
+        <w:ind w:left="3600" w:hanging="360"/>
+      </w:pPr>
+      <w:rPr>
+        <w:rFonts w:ascii="Wingdings" w:hAnsi="Wingdings" w:hint="default"/>
+      </w:rPr>
+    </w:lvl>
+    <w:lvl w:ilvl="3" w:tplc="04090001" w:tentative="1">
+      <w:start w:val="1"/>
+      <w:numFmt w:val="bullet"/>
+      <w:lvlText w:val=""/>
+      <w:lvlJc w:val="left"/>
+      <w:pPr>
+        <w:ind w:left="4320" w:hanging="360"/>
+      </w:pPr>
+      <w:rPr>
+        <w:rFonts w:ascii="Symbol" w:hAnsi="Symbol" w:hint="default"/>
+      </w:rPr>
+    </w:lvl>
+    <w:lvl w:ilvl="4" w:tplc="04090003" w:tentative="1">
+      <w:start w:val="1"/>
+      <w:numFmt w:val="bullet"/>
+      <w:lvlText w:val="o"/>
+      <w:lvlJc w:val="left"/>
+      <w:pPr>
+        <w:ind w:left="5040" w:hanging="360"/>
+      </w:pPr>
+      <w:rPr>
+        <w:rFonts w:ascii="Courier New" w:hAnsi="Courier New" w:cs="Courier New" w:hint="default"/>
+      </w:rPr>
+    </w:lvl>
+    <w:lvl w:ilvl="5" w:tplc="04090005" w:tentative="1">
+      <w:start w:val="1"/>
+      <w:numFmt w:val="bullet"/>
+      <w:lvlText w:val=""/>
+      <w:lvlJc w:val="left"/>
+      <w:pPr>
+        <w:ind w:left="5760" w:hanging="360"/>
+      </w:pPr>
+      <w:rPr>
+        <w:rFonts w:ascii="Wingdings" w:hAnsi="Wingdings" w:hint="default"/>
+      </w:rPr>
+    </w:lvl>
+    <w:lvl w:ilvl="6" w:tplc="04090001" w:tentative="1">
+      <w:start w:val="1"/>
+      <w:numFmt w:val="bullet"/>
+      <w:lvlText w:val=""/>
+      <w:lvlJc w:val="left"/>
+      <w:pPr>
+        <w:ind w:left="6480" w:hanging="360"/>
+      </w:pPr>
+      <w:rPr>
+        <w:rFonts w:ascii="Symbol" w:hAnsi="Symbol" w:hint="default"/>
+      </w:rPr>
+    </w:lvl>
+    <w:lvl w:ilvl="7" w:tplc="04090003" w:tentative="1">
+      <w:start w:val="1"/>
+      <w:numFmt w:val="bullet"/>
+      <w:lvlText w:val="o"/>
+      <w:lvlJc w:val="left"/>
+      <w:pPr>
+        <w:ind w:left="7200" w:hanging="360"/>
+      </w:pPr>
+      <w:rPr>
+        <w:rFonts w:ascii="Courier New" w:hAnsi="Courier New" w:cs="Courier New" w:hint="default"/>
+      </w:rPr>
+    </w:lvl>
+    <w:lvl w:ilvl="8" w:tplc="04090005" w:tentative="1">
+      <w:start w:val="1"/>
+      <w:numFmt w:val="bullet"/>
+      <w:lvlText w:val=""/>
+      <w:lvlJc w:val="left"/>
+      <w:pPr>
+        <w:ind w:left="7920" w:hanging="360"/>
+      </w:pPr>
+      <w:rPr>
+        <w:rFonts w:ascii="Wingdings" w:hAnsi="Wingdings" w:hint="default"/>
+      </w:rPr>
+    </w:lvl>
+  </w:abstractNum>
+  <w:abstractNum w:abstractNumId="12" w15:restartNumberingAfterBreak="0">
+    <w:nsid w:val="1EE8611B"/>
+    <w:multiLevelType w:val="hybridMultilevel"/>
+    <w:tmpl w:val="3D4850E2"/>
+    <w:lvl w:ilvl="0" w:tplc="04090001">
+      <w:start w:val="1"/>
+      <w:numFmt w:val="bullet"/>
+      <w:lvlText w:val=""/>
+      <w:lvlJc w:val="left"/>
+      <w:pPr>
+        <w:ind w:left="2160" w:hanging="360"/>
+      </w:pPr>
+      <w:rPr>
+        <w:rFonts w:ascii="Symbol" w:hAnsi="Symbol" w:hint="default"/>
+      </w:rPr>
+    </w:lvl>
+    <w:lvl w:ilvl="1" w:tplc="04090003" w:tentative="1">
+      <w:start w:val="1"/>
+      <w:numFmt w:val="bullet"/>
+      <w:lvlText w:val="o"/>
+      <w:lvlJc w:val="left"/>
+      <w:pPr>
+        <w:ind w:left="2880" w:hanging="360"/>
+      </w:pPr>
+      <w:rPr>
+        <w:rFonts w:ascii="Courier New" w:hAnsi="Courier New" w:cs="Courier New" w:hint="default"/>
+      </w:rPr>
+    </w:lvl>
+    <w:lvl w:ilvl="2" w:tplc="04090005" w:tentative="1">
+      <w:start w:val="1"/>
+      <w:numFmt w:val="bullet"/>
+      <w:lvlText w:val=""/>
+      <w:lvlJc w:val="left"/>
+      <w:pPr>
+        <w:ind w:left="3600" w:hanging="360"/>
+      </w:pPr>
+      <w:rPr>
+        <w:rFonts w:ascii="Wingdings" w:hAnsi="Wingdings" w:hint="default"/>
+      </w:rPr>
+    </w:lvl>
+    <w:lvl w:ilvl="3" w:tplc="04090001" w:tentative="1">
+      <w:start w:val="1"/>
+      <w:numFmt w:val="bullet"/>
+      <w:lvlText w:val=""/>
+      <w:lvlJc w:val="left"/>
+      <w:pPr>
+        <w:ind w:left="4320" w:hanging="360"/>
+      </w:pPr>
+      <w:rPr>
+        <w:rFonts w:ascii="Symbol" w:hAnsi="Symbol" w:hint="default"/>
+      </w:rPr>
+    </w:lvl>
+    <w:lvl w:ilvl="4" w:tplc="04090003" w:tentative="1">
+      <w:start w:val="1"/>
+      <w:numFmt w:val="bullet"/>
+      <w:lvlText w:val="o"/>
+      <w:lvlJc w:val="left"/>
+      <w:pPr>
+        <w:ind w:left="5040" w:hanging="360"/>
+      </w:pPr>
+      <w:rPr>
+        <w:rFonts w:ascii="Courier New" w:hAnsi="Courier New" w:cs="Courier New" w:hint="default"/>
+      </w:rPr>
+    </w:lvl>
+    <w:lvl w:ilvl="5" w:tplc="04090005" w:tentative="1">
+      <w:start w:val="1"/>
+      <w:numFmt w:val="bullet"/>
+      <w:lvlText w:val=""/>
+      <w:lvlJc w:val="left"/>
+      <w:pPr>
+        <w:ind w:left="5760" w:hanging="360"/>
+      </w:pPr>
+      <w:rPr>
+        <w:rFonts w:ascii="Wingdings" w:hAnsi="Wingdings" w:hint="default"/>
+      </w:rPr>
+    </w:lvl>
+    <w:lvl w:ilvl="6" w:tplc="04090001" w:tentative="1">
+      <w:start w:val="1"/>
+      <w:numFmt w:val="bullet"/>
+      <w:lvlText w:val=""/>
+      <w:lvlJc w:val="left"/>
+      <w:pPr>
+        <w:ind w:left="6480" w:hanging="360"/>
+      </w:pPr>
+      <w:rPr>
+        <w:rFonts w:ascii="Symbol" w:hAnsi="Symbol" w:hint="default"/>
+      </w:rPr>
+    </w:lvl>
+    <w:lvl w:ilvl="7" w:tplc="04090003" w:tentative="1">
+      <w:start w:val="1"/>
+      <w:numFmt w:val="bullet"/>
+      <w:lvlText w:val="o"/>
+      <w:lvlJc w:val="left"/>
+      <w:pPr>
+        <w:ind w:left="7200" w:hanging="360"/>
+      </w:pPr>
+      <w:rPr>
+        <w:rFonts w:ascii="Courier New" w:hAnsi="Courier New" w:cs="Courier New" w:hint="default"/>
+      </w:rPr>
+    </w:lvl>
+    <w:lvl w:ilvl="8" w:tplc="04090005" w:tentative="1">
+      <w:start w:val="1"/>
+      <w:numFmt w:val="bullet"/>
+      <w:lvlText w:val=""/>
+      <w:lvlJc w:val="left"/>
+      <w:pPr>
+        <w:ind w:left="7920" w:hanging="360"/>
+      </w:pPr>
+      <w:rPr>
+        <w:rFonts w:ascii="Wingdings" w:hAnsi="Wingdings" w:hint="default"/>
+      </w:rPr>
+    </w:lvl>
+  </w:abstractNum>
+  <w:abstractNum w:abstractNumId="13" w15:restartNumberingAfterBreak="0">
     <w:nsid w:val="230E01F4"/>
     <w:multiLevelType w:val="multilevel"/>
     <w:tmpl w:val="1292C18C"/>
@@ -14230,7 +17789,7 @@
       </w:rPr>
     </w:lvl>
   </w:abstractNum>
-  <w:abstractNum w:abstractNumId="10" w15:restartNumberingAfterBreak="0">
+  <w:abstractNum w:abstractNumId="14" w15:restartNumberingAfterBreak="0">
     <w:nsid w:val="258A6B72"/>
     <w:multiLevelType w:val="hybridMultilevel"/>
     <w:tmpl w:val="93EEA88E"/>
@@ -14319,7 +17878,7 @@
       </w:pPr>
     </w:lvl>
   </w:abstractNum>
-  <w:abstractNum w:abstractNumId="11" w15:restartNumberingAfterBreak="0">
+  <w:abstractNum w:abstractNumId="15" w15:restartNumberingAfterBreak="0">
     <w:nsid w:val="284D3CE7"/>
     <w:multiLevelType w:val="hybridMultilevel"/>
     <w:tmpl w:val="616A90C8"/>
@@ -14411,7 +17970,120 @@
       </w:pPr>
     </w:lvl>
   </w:abstractNum>
-  <w:abstractNum w:abstractNumId="12" w15:restartNumberingAfterBreak="0">
+  <w:abstractNum w:abstractNumId="16" w15:restartNumberingAfterBreak="0">
+    <w:nsid w:val="2CA2097A"/>
+    <w:multiLevelType w:val="hybridMultilevel"/>
+    <w:tmpl w:val="5F76B8D2"/>
+    <w:lvl w:ilvl="0" w:tplc="04090001">
+      <w:start w:val="1"/>
+      <w:numFmt w:val="bullet"/>
+      <w:lvlText w:val=""/>
+      <w:lvlJc w:val="left"/>
+      <w:pPr>
+        <w:ind w:left="2160" w:hanging="360"/>
+      </w:pPr>
+      <w:rPr>
+        <w:rFonts w:ascii="Symbol" w:hAnsi="Symbol" w:hint="default"/>
+      </w:rPr>
+    </w:lvl>
+    <w:lvl w:ilvl="1" w:tplc="04090003" w:tentative="1">
+      <w:start w:val="1"/>
+      <w:numFmt w:val="bullet"/>
+      <w:lvlText w:val="o"/>
+      <w:lvlJc w:val="left"/>
+      <w:pPr>
+        <w:ind w:left="2880" w:hanging="360"/>
+      </w:pPr>
+      <w:rPr>
+        <w:rFonts w:ascii="Courier New" w:hAnsi="Courier New" w:cs="Courier New" w:hint="default"/>
+      </w:rPr>
+    </w:lvl>
+    <w:lvl w:ilvl="2" w:tplc="04090005" w:tentative="1">
+      <w:start w:val="1"/>
+      <w:numFmt w:val="bullet"/>
+      <w:lvlText w:val=""/>
+      <w:lvlJc w:val="left"/>
+      <w:pPr>
+        <w:ind w:left="3600" w:hanging="360"/>
+      </w:pPr>
+      <w:rPr>
+        <w:rFonts w:ascii="Wingdings" w:hAnsi="Wingdings" w:hint="default"/>
+      </w:rPr>
+    </w:lvl>
+    <w:lvl w:ilvl="3" w:tplc="04090001" w:tentative="1">
+      <w:start w:val="1"/>
+      <w:numFmt w:val="bullet"/>
+      <w:lvlText w:val=""/>
+      <w:lvlJc w:val="left"/>
+      <w:pPr>
+        <w:ind w:left="4320" w:hanging="360"/>
+      </w:pPr>
+      <w:rPr>
+        <w:rFonts w:ascii="Symbol" w:hAnsi="Symbol" w:hint="default"/>
+      </w:rPr>
+    </w:lvl>
+    <w:lvl w:ilvl="4" w:tplc="04090003" w:tentative="1">
+      <w:start w:val="1"/>
+      <w:numFmt w:val="bullet"/>
+      <w:lvlText w:val="o"/>
+      <w:lvlJc w:val="left"/>
+      <w:pPr>
+        <w:ind w:left="5040" w:hanging="360"/>
+      </w:pPr>
+      <w:rPr>
+        <w:rFonts w:ascii="Courier New" w:hAnsi="Courier New" w:cs="Courier New" w:hint="default"/>
+      </w:rPr>
+    </w:lvl>
+    <w:lvl w:ilvl="5" w:tplc="04090005" w:tentative="1">
+      <w:start w:val="1"/>
+      <w:numFmt w:val="bullet"/>
+      <w:lvlText w:val=""/>
+      <w:lvlJc w:val="left"/>
+      <w:pPr>
+        <w:ind w:left="5760" w:hanging="360"/>
+      </w:pPr>
+      <w:rPr>
+        <w:rFonts w:ascii="Wingdings" w:hAnsi="Wingdings" w:hint="default"/>
+      </w:rPr>
+    </w:lvl>
+    <w:lvl w:ilvl="6" w:tplc="04090001" w:tentative="1">
+      <w:start w:val="1"/>
+      <w:numFmt w:val="bullet"/>
+      <w:lvlText w:val=""/>
+      <w:lvlJc w:val="left"/>
+      <w:pPr>
+        <w:ind w:left="6480" w:hanging="360"/>
+      </w:pPr>
+      <w:rPr>
+        <w:rFonts w:ascii="Symbol" w:hAnsi="Symbol" w:hint="default"/>
+      </w:rPr>
+    </w:lvl>
+    <w:lvl w:ilvl="7" w:tplc="04090003" w:tentative="1">
+      <w:start w:val="1"/>
+      <w:numFmt w:val="bullet"/>
+      <w:lvlText w:val="o"/>
+      <w:lvlJc w:val="left"/>
+      <w:pPr>
+        <w:ind w:left="7200" w:hanging="360"/>
+      </w:pPr>
+      <w:rPr>
+        <w:rFonts w:ascii="Courier New" w:hAnsi="Courier New" w:cs="Courier New" w:hint="default"/>
+      </w:rPr>
+    </w:lvl>
+    <w:lvl w:ilvl="8" w:tplc="04090005" w:tentative="1">
+      <w:start w:val="1"/>
+      <w:numFmt w:val="bullet"/>
+      <w:lvlText w:val=""/>
+      <w:lvlJc w:val="left"/>
+      <w:pPr>
+        <w:ind w:left="7920" w:hanging="360"/>
+      </w:pPr>
+      <w:rPr>
+        <w:rFonts w:ascii="Wingdings" w:hAnsi="Wingdings" w:hint="default"/>
+      </w:rPr>
+    </w:lvl>
+  </w:abstractNum>
+  <w:abstractNum w:abstractNumId="17" w15:restartNumberingAfterBreak="0">
     <w:nsid w:val="3B0A358A"/>
     <w:multiLevelType w:val="multilevel"/>
     <w:tmpl w:val="39B8C2D8"/>
@@ -14560,7 +18232,7 @@
       </w:rPr>
     </w:lvl>
   </w:abstractNum>
-  <w:abstractNum w:abstractNumId="13" w15:restartNumberingAfterBreak="0">
+  <w:abstractNum w:abstractNumId="18" w15:restartNumberingAfterBreak="0">
     <w:nsid w:val="40D8608A"/>
     <w:multiLevelType w:val="hybridMultilevel"/>
     <w:tmpl w:val="979CD868"/>
@@ -14649,7 +18321,7 @@
       </w:pPr>
     </w:lvl>
   </w:abstractNum>
-  <w:abstractNum w:abstractNumId="14" w15:restartNumberingAfterBreak="0">
+  <w:abstractNum w:abstractNumId="19" w15:restartNumberingAfterBreak="0">
     <w:nsid w:val="41B9237C"/>
     <w:multiLevelType w:val="hybridMultilevel"/>
     <w:tmpl w:val="192E8286"/>
@@ -14762,7 +18434,7 @@
       </w:rPr>
     </w:lvl>
   </w:abstractNum>
-  <w:abstractNum w:abstractNumId="15" w15:restartNumberingAfterBreak="0">
+  <w:abstractNum w:abstractNumId="20" w15:restartNumberingAfterBreak="0">
     <w:nsid w:val="46A44212"/>
     <w:multiLevelType w:val="hybridMultilevel"/>
     <w:tmpl w:val="B42A62EC"/>
@@ -14874,7 +18546,7 @@
       </w:rPr>
     </w:lvl>
   </w:abstractNum>
-  <w:abstractNum w:abstractNumId="16" w15:restartNumberingAfterBreak="0">
+  <w:abstractNum w:abstractNumId="21" w15:restartNumberingAfterBreak="0">
     <w:nsid w:val="46EB5F37"/>
     <w:multiLevelType w:val="hybridMultilevel"/>
     <w:tmpl w:val="FC529674"/>
@@ -14960,7 +18632,7 @@
       </w:pPr>
     </w:lvl>
   </w:abstractNum>
-  <w:abstractNum w:abstractNumId="17" w15:restartNumberingAfterBreak="0">
+  <w:abstractNum w:abstractNumId="22" w15:restartNumberingAfterBreak="0">
     <w:nsid w:val="49481468"/>
     <w:multiLevelType w:val="multilevel"/>
     <w:tmpl w:val="161484C8"/>
@@ -15109,7 +18781,7 @@
       </w:rPr>
     </w:lvl>
   </w:abstractNum>
-  <w:abstractNum w:abstractNumId="18" w15:restartNumberingAfterBreak="0">
+  <w:abstractNum w:abstractNumId="23" w15:restartNumberingAfterBreak="0">
     <w:nsid w:val="495041CA"/>
     <w:multiLevelType w:val="hybridMultilevel"/>
     <w:tmpl w:val="692C1A52"/>
@@ -15222,7 +18894,7 @@
       </w:rPr>
     </w:lvl>
   </w:abstractNum>
-  <w:abstractNum w:abstractNumId="19" w15:restartNumberingAfterBreak="0">
+  <w:abstractNum w:abstractNumId="24" w15:restartNumberingAfterBreak="0">
     <w:nsid w:val="4B775142"/>
     <w:multiLevelType w:val="hybridMultilevel"/>
     <w:tmpl w:val="86AE5CE4"/>
@@ -15335,7 +19007,7 @@
       </w:rPr>
     </w:lvl>
   </w:abstractNum>
-  <w:abstractNum w:abstractNumId="20" w15:restartNumberingAfterBreak="0">
+  <w:abstractNum w:abstractNumId="25" w15:restartNumberingAfterBreak="0">
     <w:nsid w:val="4D7C63B1"/>
     <w:multiLevelType w:val="multilevel"/>
     <w:tmpl w:val="B1964CE6"/>
@@ -15484,7 +19156,7 @@
       </w:rPr>
     </w:lvl>
   </w:abstractNum>
-  <w:abstractNum w:abstractNumId="21" w15:restartNumberingAfterBreak="0">
+  <w:abstractNum w:abstractNumId="26" w15:restartNumberingAfterBreak="0">
     <w:nsid w:val="4DCF32C6"/>
     <w:multiLevelType w:val="multilevel"/>
     <w:tmpl w:val="4BEE554E"/>
@@ -15633,7 +19305,7 @@
       </w:rPr>
     </w:lvl>
   </w:abstractNum>
-  <w:abstractNum w:abstractNumId="22" w15:restartNumberingAfterBreak="0">
+  <w:abstractNum w:abstractNumId="27" w15:restartNumberingAfterBreak="0">
     <w:nsid w:val="5B226599"/>
     <w:multiLevelType w:val="hybridMultilevel"/>
     <w:tmpl w:val="C89A6CD0"/>
@@ -15719,7 +19391,120 @@
       </w:pPr>
     </w:lvl>
   </w:abstractNum>
-  <w:abstractNum w:abstractNumId="23" w15:restartNumberingAfterBreak="0">
+  <w:abstractNum w:abstractNumId="28" w15:restartNumberingAfterBreak="0">
+    <w:nsid w:val="5E245592"/>
+    <w:multiLevelType w:val="hybridMultilevel"/>
+    <w:tmpl w:val="1C92649E"/>
+    <w:lvl w:ilvl="0" w:tplc="04090001">
+      <w:start w:val="1"/>
+      <w:numFmt w:val="bullet"/>
+      <w:lvlText w:val=""/>
+      <w:lvlJc w:val="left"/>
+      <w:pPr>
+        <w:ind w:left="2160" w:hanging="360"/>
+      </w:pPr>
+      <w:rPr>
+        <w:rFonts w:ascii="Symbol" w:hAnsi="Symbol" w:hint="default"/>
+      </w:rPr>
+    </w:lvl>
+    <w:lvl w:ilvl="1" w:tplc="04090003" w:tentative="1">
+      <w:start w:val="1"/>
+      <w:numFmt w:val="bullet"/>
+      <w:lvlText w:val="o"/>
+      <w:lvlJc w:val="left"/>
+      <w:pPr>
+        <w:ind w:left="2880" w:hanging="360"/>
+      </w:pPr>
+      <w:rPr>
+        <w:rFonts w:ascii="Courier New" w:hAnsi="Courier New" w:cs="Courier New" w:hint="default"/>
+      </w:rPr>
+    </w:lvl>
+    <w:lvl w:ilvl="2" w:tplc="04090005" w:tentative="1">
+      <w:start w:val="1"/>
+      <w:numFmt w:val="bullet"/>
+      <w:lvlText w:val=""/>
+      <w:lvlJc w:val="left"/>
+      <w:pPr>
+        <w:ind w:left="3600" w:hanging="360"/>
+      </w:pPr>
+      <w:rPr>
+        <w:rFonts w:ascii="Wingdings" w:hAnsi="Wingdings" w:hint="default"/>
+      </w:rPr>
+    </w:lvl>
+    <w:lvl w:ilvl="3" w:tplc="04090001" w:tentative="1">
+      <w:start w:val="1"/>
+      <w:numFmt w:val="bullet"/>
+      <w:lvlText w:val=""/>
+      <w:lvlJc w:val="left"/>
+      <w:pPr>
+        <w:ind w:left="4320" w:hanging="360"/>
+      </w:pPr>
+      <w:rPr>
+        <w:rFonts w:ascii="Symbol" w:hAnsi="Symbol" w:hint="default"/>
+      </w:rPr>
+    </w:lvl>
+    <w:lvl w:ilvl="4" w:tplc="04090003" w:tentative="1">
+      <w:start w:val="1"/>
+      <w:numFmt w:val="bullet"/>
+      <w:lvlText w:val="o"/>
+      <w:lvlJc w:val="left"/>
+      <w:pPr>
+        <w:ind w:left="5040" w:hanging="360"/>
+      </w:pPr>
+      <w:rPr>
+        <w:rFonts w:ascii="Courier New" w:hAnsi="Courier New" w:cs="Courier New" w:hint="default"/>
+      </w:rPr>
+    </w:lvl>
+    <w:lvl w:ilvl="5" w:tplc="04090005" w:tentative="1">
+      <w:start w:val="1"/>
+      <w:numFmt w:val="bullet"/>
+      <w:lvlText w:val=""/>
+      <w:lvlJc w:val="left"/>
+      <w:pPr>
+        <w:ind w:left="5760" w:hanging="360"/>
+      </w:pPr>
+      <w:rPr>
+        <w:rFonts w:ascii="Wingdings" w:hAnsi="Wingdings" w:hint="default"/>
+      </w:rPr>
+    </w:lvl>
+    <w:lvl w:ilvl="6" w:tplc="04090001" w:tentative="1">
+      <w:start w:val="1"/>
+      <w:numFmt w:val="bullet"/>
+      <w:lvlText w:val=""/>
+      <w:lvlJc w:val="left"/>
+      <w:pPr>
+        <w:ind w:left="6480" w:hanging="360"/>
+      </w:pPr>
+      <w:rPr>
+        <w:rFonts w:ascii="Symbol" w:hAnsi="Symbol" w:hint="default"/>
+      </w:rPr>
+    </w:lvl>
+    <w:lvl w:ilvl="7" w:tplc="04090003" w:tentative="1">
+      <w:start w:val="1"/>
+      <w:numFmt w:val="bullet"/>
+      <w:lvlText w:val="o"/>
+      <w:lvlJc w:val="left"/>
+      <w:pPr>
+        <w:ind w:left="7200" w:hanging="360"/>
+      </w:pPr>
+      <w:rPr>
+        <w:rFonts w:ascii="Courier New" w:hAnsi="Courier New" w:cs="Courier New" w:hint="default"/>
+      </w:rPr>
+    </w:lvl>
+    <w:lvl w:ilvl="8" w:tplc="04090005" w:tentative="1">
+      <w:start w:val="1"/>
+      <w:numFmt w:val="bullet"/>
+      <w:lvlText w:val=""/>
+      <w:lvlJc w:val="left"/>
+      <w:pPr>
+        <w:ind w:left="7920" w:hanging="360"/>
+      </w:pPr>
+      <w:rPr>
+        <w:rFonts w:ascii="Wingdings" w:hAnsi="Wingdings" w:hint="default"/>
+      </w:rPr>
+    </w:lvl>
+  </w:abstractNum>
+  <w:abstractNum w:abstractNumId="29" w15:restartNumberingAfterBreak="0">
     <w:nsid w:val="5ED84B0F"/>
     <w:multiLevelType w:val="hybridMultilevel"/>
     <w:tmpl w:val="74FECAAE"/>
@@ -15832,7 +19617,7 @@
       </w:rPr>
     </w:lvl>
   </w:abstractNum>
-  <w:abstractNum w:abstractNumId="24" w15:restartNumberingAfterBreak="0">
+  <w:abstractNum w:abstractNumId="30" w15:restartNumberingAfterBreak="0">
     <w:nsid w:val="60893970"/>
     <w:multiLevelType w:val="hybridMultilevel"/>
     <w:tmpl w:val="90464F62"/>
@@ -15945,7 +19730,7 @@
       </w:rPr>
     </w:lvl>
   </w:abstractNum>
-  <w:abstractNum w:abstractNumId="25" w15:restartNumberingAfterBreak="0">
+  <w:abstractNum w:abstractNumId="31" w15:restartNumberingAfterBreak="0">
     <w:nsid w:val="60DA4BDD"/>
     <w:multiLevelType w:val="hybridMultilevel"/>
     <w:tmpl w:val="3E7C9FF8"/>
@@ -16058,7 +19843,7 @@
       </w:rPr>
     </w:lvl>
   </w:abstractNum>
-  <w:abstractNum w:abstractNumId="26" w15:restartNumberingAfterBreak="0">
+  <w:abstractNum w:abstractNumId="32" w15:restartNumberingAfterBreak="0">
     <w:nsid w:val="63B60C33"/>
     <w:multiLevelType w:val="hybridMultilevel"/>
     <w:tmpl w:val="635C44DE"/>
@@ -16171,7 +19956,7 @@
       </w:rPr>
     </w:lvl>
   </w:abstractNum>
-  <w:abstractNum w:abstractNumId="27" w15:restartNumberingAfterBreak="0">
+  <w:abstractNum w:abstractNumId="33" w15:restartNumberingAfterBreak="0">
     <w:nsid w:val="66D2450A"/>
     <w:multiLevelType w:val="hybridMultilevel"/>
     <w:tmpl w:val="A278871C"/>
@@ -16284,7 +20069,7 @@
       </w:rPr>
     </w:lvl>
   </w:abstractNum>
-  <w:abstractNum w:abstractNumId="28" w15:restartNumberingAfterBreak="0">
+  <w:abstractNum w:abstractNumId="34" w15:restartNumberingAfterBreak="0">
     <w:nsid w:val="686F2D3F"/>
     <w:multiLevelType w:val="hybridMultilevel"/>
     <w:tmpl w:val="DFEA9C70"/>
@@ -16373,7 +20158,7 @@
       </w:pPr>
     </w:lvl>
   </w:abstractNum>
-  <w:abstractNum w:abstractNumId="29" w15:restartNumberingAfterBreak="0">
+  <w:abstractNum w:abstractNumId="35" w15:restartNumberingAfterBreak="0">
     <w:nsid w:val="6A0B05E3"/>
     <w:multiLevelType w:val="hybridMultilevel"/>
     <w:tmpl w:val="0EB0BBC2"/>
@@ -16486,7 +20271,7 @@
       </w:rPr>
     </w:lvl>
   </w:abstractNum>
-  <w:abstractNum w:abstractNumId="30" w15:restartNumberingAfterBreak="0">
+  <w:abstractNum w:abstractNumId="36" w15:restartNumberingAfterBreak="0">
     <w:nsid w:val="6B3C3847"/>
     <w:multiLevelType w:val="hybridMultilevel"/>
     <w:tmpl w:val="564E730E"/>
@@ -16599,7 +20384,7 @@
       </w:rPr>
     </w:lvl>
   </w:abstractNum>
-  <w:abstractNum w:abstractNumId="31" w15:restartNumberingAfterBreak="0">
+  <w:abstractNum w:abstractNumId="37" w15:restartNumberingAfterBreak="0">
     <w:nsid w:val="6C833018"/>
     <w:multiLevelType w:val="hybridMultilevel"/>
     <w:tmpl w:val="1FD45FEA"/>
@@ -16688,7 +20473,7 @@
       </w:pPr>
     </w:lvl>
   </w:abstractNum>
-  <w:abstractNum w:abstractNumId="32" w15:restartNumberingAfterBreak="0">
+  <w:abstractNum w:abstractNumId="38" w15:restartNumberingAfterBreak="0">
     <w:nsid w:val="71D30917"/>
     <w:multiLevelType w:val="hybridMultilevel"/>
     <w:tmpl w:val="D44CE134"/>
@@ -16801,7 +20586,7 @@
       </w:rPr>
     </w:lvl>
   </w:abstractNum>
-  <w:abstractNum w:abstractNumId="33" w15:restartNumberingAfterBreak="0">
+  <w:abstractNum w:abstractNumId="39" w15:restartNumberingAfterBreak="0">
     <w:nsid w:val="7577240C"/>
     <w:multiLevelType w:val="hybridMultilevel"/>
     <w:tmpl w:val="4B768118"/>
@@ -16914,7 +20699,7 @@
       </w:rPr>
     </w:lvl>
   </w:abstractNum>
-  <w:abstractNum w:abstractNumId="34" w15:restartNumberingAfterBreak="0">
+  <w:abstractNum w:abstractNumId="40" w15:restartNumberingAfterBreak="0">
     <w:nsid w:val="76932F7E"/>
     <w:multiLevelType w:val="hybridMultilevel"/>
     <w:tmpl w:val="BC2EA5F8"/>
@@ -17003,7 +20788,7 @@
       </w:pPr>
     </w:lvl>
   </w:abstractNum>
-  <w:abstractNum w:abstractNumId="35" w15:restartNumberingAfterBreak="0">
+  <w:abstractNum w:abstractNumId="41" w15:restartNumberingAfterBreak="0">
     <w:nsid w:val="77EF6E4A"/>
     <w:multiLevelType w:val="hybridMultilevel"/>
     <w:tmpl w:val="C6089EA6"/>
@@ -17116,7 +20901,7 @@
       </w:rPr>
     </w:lvl>
   </w:abstractNum>
-  <w:abstractNum w:abstractNumId="36" w15:restartNumberingAfterBreak="0">
+  <w:abstractNum w:abstractNumId="42" w15:restartNumberingAfterBreak="0">
     <w:nsid w:val="7E6B179C"/>
     <w:multiLevelType w:val="hybridMultilevel"/>
     <w:tmpl w:val="1D828BC2"/>
@@ -17230,70 +21015,70 @@
     </w:lvl>
   </w:abstractNum>
   <w:num w:numId="1" w16cid:durableId="1521703667">
+    <w:abstractNumId w:val="20"/>
+  </w:num>
+  <w:num w:numId="2" w16cid:durableId="1192451426">
+    <w:abstractNumId w:val="21"/>
+  </w:num>
+  <w:num w:numId="3" w16cid:durableId="1769034931">
+    <w:abstractNumId w:val="10"/>
+  </w:num>
+  <w:num w:numId="4" w16cid:durableId="959531810">
+    <w:abstractNumId w:val="37"/>
+  </w:num>
+  <w:num w:numId="5" w16cid:durableId="893854713">
+    <w:abstractNumId w:val="18"/>
+  </w:num>
+  <w:num w:numId="6" w16cid:durableId="985860105">
+    <w:abstractNumId w:val="34"/>
+  </w:num>
+  <w:num w:numId="7" w16cid:durableId="504787989">
+    <w:abstractNumId w:val="39"/>
+  </w:num>
+  <w:num w:numId="8" w16cid:durableId="1805653140">
+    <w:abstractNumId w:val="42"/>
+  </w:num>
+  <w:num w:numId="9" w16cid:durableId="1366711880">
+    <w:abstractNumId w:val="29"/>
+  </w:num>
+  <w:num w:numId="10" w16cid:durableId="1389844745">
+    <w:abstractNumId w:val="36"/>
+  </w:num>
+  <w:num w:numId="11" w16cid:durableId="275254084">
+    <w:abstractNumId w:val="32"/>
+  </w:num>
+  <w:num w:numId="12" w16cid:durableId="423577270">
+    <w:abstractNumId w:val="9"/>
+  </w:num>
+  <w:num w:numId="13" w16cid:durableId="1209799539">
+    <w:abstractNumId w:val="27"/>
+  </w:num>
+  <w:num w:numId="14" w16cid:durableId="1172064986">
+    <w:abstractNumId w:val="14"/>
+  </w:num>
+  <w:num w:numId="15" w16cid:durableId="458647446">
     <w:abstractNumId w:val="15"/>
   </w:num>
-  <w:num w:numId="2" w16cid:durableId="1192451426">
-    <w:abstractNumId w:val="16"/>
+  <w:num w:numId="16" w16cid:durableId="1661427877">
+    <w:abstractNumId w:val="30"/>
   </w:num>
-  <w:num w:numId="3" w16cid:durableId="1769034931">
-    <w:abstractNumId w:val="8"/>
-  </w:num>
-  <w:num w:numId="4" w16cid:durableId="959531810">
-    <w:abstractNumId w:val="31"/>
-  </w:num>
-  <w:num w:numId="5" w16cid:durableId="893854713">
-    <w:abstractNumId w:val="13"/>
-  </w:num>
-  <w:num w:numId="6" w16cid:durableId="985860105">
-    <w:abstractNumId w:val="28"/>
-  </w:num>
-  <w:num w:numId="7" w16cid:durableId="504787989">
+  <w:num w:numId="17" w16cid:durableId="1556114144">
     <w:abstractNumId w:val="33"/>
   </w:num>
-  <w:num w:numId="8" w16cid:durableId="1805653140">
-    <w:abstractNumId w:val="36"/>
+  <w:num w:numId="18" w16cid:durableId="1816797135">
+    <w:abstractNumId w:val="24"/>
   </w:num>
-  <w:num w:numId="9" w16cid:durableId="1366711880">
-    <w:abstractNumId w:val="23"/>
+  <w:num w:numId="19" w16cid:durableId="707801841">
+    <w:abstractNumId w:val="40"/>
   </w:num>
-  <w:num w:numId="10" w16cid:durableId="1389844745">
-    <w:abstractNumId w:val="30"/>
+  <w:num w:numId="20" w16cid:durableId="816800813">
+    <w:abstractNumId w:val="17"/>
   </w:num>
-  <w:num w:numId="11" w16cid:durableId="275254084">
+  <w:num w:numId="21" w16cid:durableId="332143602">
     <w:abstractNumId w:val="26"/>
   </w:num>
-  <w:num w:numId="12" w16cid:durableId="423577270">
-    <w:abstractNumId w:val="7"/>
-  </w:num>
-  <w:num w:numId="13" w16cid:durableId="1209799539">
+  <w:num w:numId="22" w16cid:durableId="933788029">
     <w:abstractNumId w:val="22"/>
-  </w:num>
-  <w:num w:numId="14" w16cid:durableId="1172064986">
-    <w:abstractNumId w:val="10"/>
-  </w:num>
-  <w:num w:numId="15" w16cid:durableId="458647446">
-    <w:abstractNumId w:val="11"/>
-  </w:num>
-  <w:num w:numId="16" w16cid:durableId="1661427877">
-    <w:abstractNumId w:val="24"/>
-  </w:num>
-  <w:num w:numId="17" w16cid:durableId="1556114144">
-    <w:abstractNumId w:val="27"/>
-  </w:num>
-  <w:num w:numId="18" w16cid:durableId="1816797135">
-    <w:abstractNumId w:val="19"/>
-  </w:num>
-  <w:num w:numId="19" w16cid:durableId="707801841">
-    <w:abstractNumId w:val="34"/>
-  </w:num>
-  <w:num w:numId="20" w16cid:durableId="816800813">
-    <w:abstractNumId w:val="12"/>
-  </w:num>
-  <w:num w:numId="21" w16cid:durableId="332143602">
-    <w:abstractNumId w:val="21"/>
-  </w:num>
-  <w:num w:numId="22" w16cid:durableId="933788029">
-    <w:abstractNumId w:val="17"/>
   </w:num>
   <w:num w:numId="23" w16cid:durableId="1132290454">
     <w:abstractNumId w:val="0"/>
@@ -17302,7 +21087,7 @@
     <w:abstractNumId w:val="5"/>
   </w:num>
   <w:num w:numId="25" w16cid:durableId="1896160003">
-    <w:abstractNumId w:val="6"/>
+    <w:abstractNumId w:val="8"/>
   </w:num>
   <w:num w:numId="26" w16cid:durableId="13925971">
     <w:abstractNumId w:val="1"/>
@@ -17311,34 +21096,52 @@
     <w:abstractNumId w:val="3"/>
   </w:num>
   <w:num w:numId="28" w16cid:durableId="1318454072">
-    <w:abstractNumId w:val="9"/>
+    <w:abstractNumId w:val="13"/>
   </w:num>
   <w:num w:numId="29" w16cid:durableId="1235049470">
-    <w:abstractNumId w:val="20"/>
+    <w:abstractNumId w:val="25"/>
   </w:num>
   <w:num w:numId="30" w16cid:durableId="1039862789">
-    <w:abstractNumId w:val="18"/>
+    <w:abstractNumId w:val="23"/>
   </w:num>
   <w:num w:numId="31" w16cid:durableId="1567834612">
-    <w:abstractNumId w:val="25"/>
+    <w:abstractNumId w:val="31"/>
   </w:num>
   <w:num w:numId="32" w16cid:durableId="1456562084">
-    <w:abstractNumId w:val="32"/>
+    <w:abstractNumId w:val="38"/>
   </w:num>
   <w:num w:numId="33" w16cid:durableId="393355011">
-    <w:abstractNumId w:val="35"/>
+    <w:abstractNumId w:val="41"/>
   </w:num>
   <w:num w:numId="34" w16cid:durableId="1397044333">
     <w:abstractNumId w:val="2"/>
   </w:num>
   <w:num w:numId="35" w16cid:durableId="1886017260">
-    <w:abstractNumId w:val="29"/>
+    <w:abstractNumId w:val="35"/>
   </w:num>
   <w:num w:numId="36" w16cid:durableId="909778036">
-    <w:abstractNumId w:val="14"/>
+    <w:abstractNumId w:val="19"/>
   </w:num>
   <w:num w:numId="37" w16cid:durableId="2019961552">
     <w:abstractNumId w:val="4"/>
+  </w:num>
+  <w:num w:numId="38" w16cid:durableId="1487432037">
+    <w:abstractNumId w:val="6"/>
+  </w:num>
+  <w:num w:numId="39" w16cid:durableId="921764979">
+    <w:abstractNumId w:val="28"/>
+  </w:num>
+  <w:num w:numId="40" w16cid:durableId="1011492433">
+    <w:abstractNumId w:val="11"/>
+  </w:num>
+  <w:num w:numId="41" w16cid:durableId="2008943199">
+    <w:abstractNumId w:val="7"/>
+  </w:num>
+  <w:num w:numId="42" w16cid:durableId="1991783674">
+    <w:abstractNumId w:val="12"/>
+  </w:num>
+  <w:num w:numId="43" w16cid:durableId="935939488">
+    <w:abstractNumId w:val="16"/>
   </w:num>
 </w:numbering>
 </file>
@@ -17952,7 +21755,6 @@
   <w:style w:type="character" w:default="1" w:styleId="DefaultParagraphFont">
     <w:name w:val="Default Paragraph Font"/>
     <w:uiPriority w:val="1"/>
-    <w:semiHidden/>
     <w:unhideWhenUsed/>
   </w:style>
   <w:style w:type="table" w:default="1" w:styleId="TableNormal">

</xml_diff>